<commit_message>
Revisión final: regalos sueltos repetidos, cambios de código renombrados y documentación
- Rastreador: si el mismo regalo vuelve a llegar con una cantidad ya contada, es un
  regalo nuevo (dos capibaras seguidos de la misma persona contaban como uno).
- Catálogo: buscarPorNombre compara también el nombre de TikTok, así renombrar un
  regalo no impide detectar su código nuevo.
- Eventos en vivo muestra el nombre del Buscador de regalos.
- Comentarios, README y Word al día ("no siempre" llega giftDetails, referencia 9.4).

Co-Authored-By: Claude Opus 5.5 (1M context) <noreply@anthropic.com>
</commit_message>
<xml_diff>
--- a/Documentacion-Live-Tools.docx
+++ b/Documentacion-Live-Tools.docx
@@ -164,7 +164,7 @@
           <w:r>
             <w:fldChar w:fldCharType="separate"/>
           </w:r>
-          <w:hyperlink w:anchor="_Toc242705294" w:history="1">
+          <w:hyperlink w:anchor="_Toc242720496" w:history="1">
             <w:r>
               <w:rPr>
                 <w:rStyle w:val="Hyperlink"/>
@@ -188,7 +188,7 @@
               <w:rPr>
                 <w:noProof/>
               </w:rPr>
-              <w:instrText xml:space="preserve"> PAGEREF _Toc242705294 \h </w:instrText>
+              <w:instrText xml:space="preserve"> PAGEREF _Toc242720496 \h </w:instrText>
             </w:r>
             <w:r>
               <w:rPr>
@@ -230,7 +230,7 @@
               <w14:ligatures w14:val="standardContextual"/>
             </w:rPr>
           </w:pPr>
-          <w:hyperlink w:anchor="_Toc242705295" w:history="1">
+          <w:hyperlink w:anchor="_Toc242720497" w:history="1">
             <w:r>
               <w:rPr>
                 <w:rStyle w:val="Hyperlink"/>
@@ -254,7 +254,7 @@
               <w:rPr>
                 <w:noProof/>
               </w:rPr>
-              <w:instrText xml:space="preserve"> PAGEREF _Toc242705295 \h </w:instrText>
+              <w:instrText xml:space="preserve"> PAGEREF _Toc242720497 \h </w:instrText>
             </w:r>
             <w:r>
               <w:rPr>
@@ -296,7 +296,7 @@
               <w14:ligatures w14:val="standardContextual"/>
             </w:rPr>
           </w:pPr>
-          <w:hyperlink w:anchor="_Toc242705296" w:history="1">
+          <w:hyperlink w:anchor="_Toc242720498" w:history="1">
             <w:r>
               <w:rPr>
                 <w:rStyle w:val="Hyperlink"/>
@@ -320,7 +320,7 @@
               <w:rPr>
                 <w:noProof/>
               </w:rPr>
-              <w:instrText xml:space="preserve"> PAGEREF _Toc242705296 \h </w:instrText>
+              <w:instrText xml:space="preserve"> PAGEREF _Toc242720498 \h </w:instrText>
             </w:r>
             <w:r>
               <w:rPr>
@@ -362,7 +362,7 @@
               <w14:ligatures w14:val="standardContextual"/>
             </w:rPr>
           </w:pPr>
-          <w:hyperlink w:anchor="_Toc242705297" w:history="1">
+          <w:hyperlink w:anchor="_Toc242720499" w:history="1">
             <w:r>
               <w:rPr>
                 <w:rStyle w:val="Hyperlink"/>
@@ -386,7 +386,7 @@
               <w:rPr>
                 <w:noProof/>
               </w:rPr>
-              <w:instrText xml:space="preserve"> PAGEREF _Toc242705297 \h </w:instrText>
+              <w:instrText xml:space="preserve"> PAGEREF _Toc242720499 \h </w:instrText>
             </w:r>
             <w:r>
               <w:rPr>
@@ -428,7 +428,7 @@
               <w14:ligatures w14:val="standardContextual"/>
             </w:rPr>
           </w:pPr>
-          <w:hyperlink w:anchor="_Toc242705298" w:history="1">
+          <w:hyperlink w:anchor="_Toc242720500" w:history="1">
             <w:r>
               <w:rPr>
                 <w:rStyle w:val="Hyperlink"/>
@@ -452,7 +452,7 @@
               <w:rPr>
                 <w:noProof/>
               </w:rPr>
-              <w:instrText xml:space="preserve"> PAGEREF _Toc242705298 \h </w:instrText>
+              <w:instrText xml:space="preserve"> PAGEREF _Toc242720500 \h </w:instrText>
             </w:r>
             <w:r>
               <w:rPr>
@@ -494,7 +494,7 @@
               <w14:ligatures w14:val="standardContextual"/>
             </w:rPr>
           </w:pPr>
-          <w:hyperlink w:anchor="_Toc242705299" w:history="1">
+          <w:hyperlink w:anchor="_Toc242720501" w:history="1">
             <w:r>
               <w:rPr>
                 <w:rStyle w:val="Hyperlink"/>
@@ -518,7 +518,7 @@
               <w:rPr>
                 <w:noProof/>
               </w:rPr>
-              <w:instrText xml:space="preserve"> PAGEREF _Toc242705299 \h </w:instrText>
+              <w:instrText xml:space="preserve"> PAGEREF _Toc242720501 \h </w:instrText>
             </w:r>
             <w:r>
               <w:rPr>
@@ -560,7 +560,7 @@
               <w14:ligatures w14:val="standardContextual"/>
             </w:rPr>
           </w:pPr>
-          <w:hyperlink w:anchor="_Toc242705300" w:history="1">
+          <w:hyperlink w:anchor="_Toc242720502" w:history="1">
             <w:r>
               <w:rPr>
                 <w:rStyle w:val="Hyperlink"/>
@@ -584,7 +584,7 @@
               <w:rPr>
                 <w:noProof/>
               </w:rPr>
-              <w:instrText xml:space="preserve"> PAGEREF _Toc242705300 \h </w:instrText>
+              <w:instrText xml:space="preserve"> PAGEREF _Toc242720502 \h </w:instrText>
             </w:r>
             <w:r>
               <w:rPr>
@@ -626,7 +626,7 @@
               <w14:ligatures w14:val="standardContextual"/>
             </w:rPr>
           </w:pPr>
-          <w:hyperlink w:anchor="_Toc242705301" w:history="1">
+          <w:hyperlink w:anchor="_Toc242720503" w:history="1">
             <w:r>
               <w:rPr>
                 <w:rStyle w:val="Hyperlink"/>
@@ -650,7 +650,7 @@
               <w:rPr>
                 <w:noProof/>
               </w:rPr>
-              <w:instrText xml:space="preserve"> PAGEREF _Toc242705301 \h </w:instrText>
+              <w:instrText xml:space="preserve"> PAGEREF _Toc242720503 \h </w:instrText>
             </w:r>
             <w:r>
               <w:rPr>
@@ -692,7 +692,7 @@
               <w14:ligatures w14:val="standardContextual"/>
             </w:rPr>
           </w:pPr>
-          <w:hyperlink w:anchor="_Toc242705302" w:history="1">
+          <w:hyperlink w:anchor="_Toc242720504" w:history="1">
             <w:r>
               <w:rPr>
                 <w:rStyle w:val="Hyperlink"/>
@@ -716,7 +716,7 @@
               <w:rPr>
                 <w:noProof/>
               </w:rPr>
-              <w:instrText xml:space="preserve"> PAGEREF _Toc242705302 \h </w:instrText>
+              <w:instrText xml:space="preserve"> PAGEREF _Toc242720504 \h </w:instrText>
             </w:r>
             <w:r>
               <w:rPr>
@@ -758,7 +758,7 @@
               <w14:ligatures w14:val="standardContextual"/>
             </w:rPr>
           </w:pPr>
-          <w:hyperlink w:anchor="_Toc242705303" w:history="1">
+          <w:hyperlink w:anchor="_Toc242720505" w:history="1">
             <w:r>
               <w:rPr>
                 <w:rStyle w:val="Hyperlink"/>
@@ -782,7 +782,7 @@
               <w:rPr>
                 <w:noProof/>
               </w:rPr>
-              <w:instrText xml:space="preserve"> PAGEREF _Toc242705303 \h </w:instrText>
+              <w:instrText xml:space="preserve"> PAGEREF _Toc242720505 \h </w:instrText>
             </w:r>
             <w:r>
               <w:rPr>
@@ -824,7 +824,7 @@
               <w14:ligatures w14:val="standardContextual"/>
             </w:rPr>
           </w:pPr>
-          <w:hyperlink w:anchor="_Toc242705304" w:history="1">
+          <w:hyperlink w:anchor="_Toc242720506" w:history="1">
             <w:r>
               <w:rPr>
                 <w:rStyle w:val="Hyperlink"/>
@@ -848,7 +848,7 @@
               <w:rPr>
                 <w:noProof/>
               </w:rPr>
-              <w:instrText xml:space="preserve"> PAGEREF _Toc242705304 \h </w:instrText>
+              <w:instrText xml:space="preserve"> PAGEREF _Toc242720506 \h </w:instrText>
             </w:r>
             <w:r>
               <w:rPr>
@@ -890,7 +890,7 @@
               <w14:ligatures w14:val="standardContextual"/>
             </w:rPr>
           </w:pPr>
-          <w:hyperlink w:anchor="_Toc242705305" w:history="1">
+          <w:hyperlink w:anchor="_Toc242720507" w:history="1">
             <w:r>
               <w:rPr>
                 <w:rStyle w:val="Hyperlink"/>
@@ -914,7 +914,7 @@
               <w:rPr>
                 <w:noProof/>
               </w:rPr>
-              <w:instrText xml:space="preserve"> PAGEREF _Toc242705305 \h </w:instrText>
+              <w:instrText xml:space="preserve"> PAGEREF _Toc242720507 \h </w:instrText>
             </w:r>
             <w:r>
               <w:rPr>
@@ -956,7 +956,7 @@
               <w14:ligatures w14:val="standardContextual"/>
             </w:rPr>
           </w:pPr>
-          <w:hyperlink w:anchor="_Toc242705306" w:history="1">
+          <w:hyperlink w:anchor="_Toc242720508" w:history="1">
             <w:r>
               <w:rPr>
                 <w:rStyle w:val="Hyperlink"/>
@@ -980,7 +980,7 @@
               <w:rPr>
                 <w:noProof/>
               </w:rPr>
-              <w:instrText xml:space="preserve"> PAGEREF _Toc242705306 \h </w:instrText>
+              <w:instrText xml:space="preserve"> PAGEREF _Toc242720508 \h </w:instrText>
             </w:r>
             <w:r>
               <w:rPr>
@@ -1022,7 +1022,7 @@
               <w14:ligatures w14:val="standardContextual"/>
             </w:rPr>
           </w:pPr>
-          <w:hyperlink w:anchor="_Toc242705307" w:history="1">
+          <w:hyperlink w:anchor="_Toc242720509" w:history="1">
             <w:r>
               <w:rPr>
                 <w:rStyle w:val="Hyperlink"/>
@@ -1046,7 +1046,7 @@
               <w:rPr>
                 <w:noProof/>
               </w:rPr>
-              <w:instrText xml:space="preserve"> PAGEREF _Toc242705307 \h </w:instrText>
+              <w:instrText xml:space="preserve"> PAGEREF _Toc242720509 \h </w:instrText>
             </w:r>
             <w:r>
               <w:rPr>
@@ -1088,7 +1088,7 @@
               <w14:ligatures w14:val="standardContextual"/>
             </w:rPr>
           </w:pPr>
-          <w:hyperlink w:anchor="_Toc242705308" w:history="1">
+          <w:hyperlink w:anchor="_Toc242720510" w:history="1">
             <w:r>
               <w:rPr>
                 <w:rStyle w:val="Hyperlink"/>
@@ -1112,7 +1112,7 @@
               <w:rPr>
                 <w:noProof/>
               </w:rPr>
-              <w:instrText xml:space="preserve"> PAGEREF _Toc242705308 \h </w:instrText>
+              <w:instrText xml:space="preserve"> PAGEREF _Toc242720510 \h </w:instrText>
             </w:r>
             <w:r>
               <w:rPr>
@@ -1154,7 +1154,7 @@
               <w14:ligatures w14:val="standardContextual"/>
             </w:rPr>
           </w:pPr>
-          <w:hyperlink w:anchor="_Toc242705309" w:history="1">
+          <w:hyperlink w:anchor="_Toc242720511" w:history="1">
             <w:r>
               <w:rPr>
                 <w:rStyle w:val="Hyperlink"/>
@@ -1178,7 +1178,7 @@
               <w:rPr>
                 <w:noProof/>
               </w:rPr>
-              <w:instrText xml:space="preserve"> PAGEREF _Toc242705309 \h </w:instrText>
+              <w:instrText xml:space="preserve"> PAGEREF _Toc242720511 \h </w:instrText>
             </w:r>
             <w:r>
               <w:rPr>
@@ -1220,7 +1220,7 @@
               <w14:ligatures w14:val="standardContextual"/>
             </w:rPr>
           </w:pPr>
-          <w:hyperlink w:anchor="_Toc242705310" w:history="1">
+          <w:hyperlink w:anchor="_Toc242720512" w:history="1">
             <w:r>
               <w:rPr>
                 <w:rStyle w:val="Hyperlink"/>
@@ -1244,7 +1244,7 @@
               <w:rPr>
                 <w:noProof/>
               </w:rPr>
-              <w:instrText xml:space="preserve"> PAGEREF _Toc242705310 \h </w:instrText>
+              <w:instrText xml:space="preserve"> PAGEREF _Toc242720512 \h </w:instrText>
             </w:r>
             <w:r>
               <w:rPr>
@@ -1261,7 +1261,7 @@
               <w:rPr>
                 <w:noProof/>
               </w:rPr>
-              <w:t>16</w:t>
+              <w:t>17</w:t>
             </w:r>
             <w:r>
               <w:rPr>
@@ -1286,7 +1286,7 @@
               <w14:ligatures w14:val="standardContextual"/>
             </w:rPr>
           </w:pPr>
-          <w:hyperlink w:anchor="_Toc242705311" w:history="1">
+          <w:hyperlink w:anchor="_Toc242720513" w:history="1">
             <w:r>
               <w:rPr>
                 <w:rStyle w:val="Hyperlink"/>
@@ -1310,7 +1310,7 @@
               <w:rPr>
                 <w:noProof/>
               </w:rPr>
-              <w:instrText xml:space="preserve"> PAGEREF _Toc242705311 \h </w:instrText>
+              <w:instrText xml:space="preserve"> PAGEREF _Toc242720513 \h </w:instrText>
             </w:r>
             <w:r>
               <w:rPr>
@@ -1352,7 +1352,7 @@
               <w14:ligatures w14:val="standardContextual"/>
             </w:rPr>
           </w:pPr>
-          <w:hyperlink w:anchor="_Toc242705312" w:history="1">
+          <w:hyperlink w:anchor="_Toc242720514" w:history="1">
             <w:r>
               <w:rPr>
                 <w:rStyle w:val="Hyperlink"/>
@@ -1376,7 +1376,7 @@
               <w:rPr>
                 <w:noProof/>
               </w:rPr>
-              <w:instrText xml:space="preserve"> PAGEREF _Toc242705312 \h </w:instrText>
+              <w:instrText xml:space="preserve"> PAGEREF _Toc242720514 \h </w:instrText>
             </w:r>
             <w:r>
               <w:rPr>
@@ -1418,7 +1418,7 @@
               <w14:ligatures w14:val="standardContextual"/>
             </w:rPr>
           </w:pPr>
-          <w:hyperlink w:anchor="_Toc242705313" w:history="1">
+          <w:hyperlink w:anchor="_Toc242720515" w:history="1">
             <w:r>
               <w:rPr>
                 <w:rStyle w:val="Hyperlink"/>
@@ -1442,7 +1442,7 @@
               <w:rPr>
                 <w:noProof/>
               </w:rPr>
-              <w:instrText xml:space="preserve"> PAGEREF _Toc242705313 \h </w:instrText>
+              <w:instrText xml:space="preserve"> PAGEREF _Toc242720515 \h </w:instrText>
             </w:r>
             <w:r>
               <w:rPr>
@@ -1484,7 +1484,7 @@
               <w14:ligatures w14:val="standardContextual"/>
             </w:rPr>
           </w:pPr>
-          <w:hyperlink w:anchor="_Toc242705314" w:history="1">
+          <w:hyperlink w:anchor="_Toc242720516" w:history="1">
             <w:r>
               <w:rPr>
                 <w:rStyle w:val="Hyperlink"/>
@@ -1508,7 +1508,7 @@
               <w:rPr>
                 <w:noProof/>
               </w:rPr>
-              <w:instrText xml:space="preserve"> PAGEREF _Toc242705314 \h </w:instrText>
+              <w:instrText xml:space="preserve"> PAGEREF _Toc242720516 \h </w:instrText>
             </w:r>
             <w:r>
               <w:rPr>
@@ -1550,7 +1550,7 @@
               <w14:ligatures w14:val="standardContextual"/>
             </w:rPr>
           </w:pPr>
-          <w:hyperlink w:anchor="_Toc242705315" w:history="1">
+          <w:hyperlink w:anchor="_Toc242720517" w:history="1">
             <w:r>
               <w:rPr>
                 <w:rStyle w:val="Hyperlink"/>
@@ -1574,7 +1574,7 @@
               <w:rPr>
                 <w:noProof/>
               </w:rPr>
-              <w:instrText xml:space="preserve"> PAGEREF _Toc242705315 \h </w:instrText>
+              <w:instrText xml:space="preserve"> PAGEREF _Toc242720517 \h </w:instrText>
             </w:r>
             <w:r>
               <w:rPr>
@@ -1616,7 +1616,7 @@
               <w14:ligatures w14:val="standardContextual"/>
             </w:rPr>
           </w:pPr>
-          <w:hyperlink w:anchor="_Toc242705316" w:history="1">
+          <w:hyperlink w:anchor="_Toc242720518" w:history="1">
             <w:r>
               <w:rPr>
                 <w:rStyle w:val="Hyperlink"/>
@@ -1640,7 +1640,7 @@
               <w:rPr>
                 <w:noProof/>
               </w:rPr>
-              <w:instrText xml:space="preserve"> PAGEREF _Toc242705316 \h </w:instrText>
+              <w:instrText xml:space="preserve"> PAGEREF _Toc242720518 \h </w:instrText>
             </w:r>
             <w:r>
               <w:rPr>
@@ -1682,7 +1682,7 @@
               <w14:ligatures w14:val="standardContextual"/>
             </w:rPr>
           </w:pPr>
-          <w:hyperlink w:anchor="_Toc242705317" w:history="1">
+          <w:hyperlink w:anchor="_Toc242720519" w:history="1">
             <w:r>
               <w:rPr>
                 <w:rStyle w:val="Hyperlink"/>
@@ -1706,7 +1706,7 @@
               <w:rPr>
                 <w:noProof/>
               </w:rPr>
-              <w:instrText xml:space="preserve"> PAGEREF _Toc242705317 \h </w:instrText>
+              <w:instrText xml:space="preserve"> PAGEREF _Toc242720519 \h </w:instrText>
             </w:r>
             <w:r>
               <w:rPr>
@@ -1748,7 +1748,7 @@
               <w14:ligatures w14:val="standardContextual"/>
             </w:rPr>
           </w:pPr>
-          <w:hyperlink w:anchor="_Toc242705318" w:history="1">
+          <w:hyperlink w:anchor="_Toc242720520" w:history="1">
             <w:r>
               <w:rPr>
                 <w:rStyle w:val="Hyperlink"/>
@@ -1772,7 +1772,7 @@
               <w:rPr>
                 <w:noProof/>
               </w:rPr>
-              <w:instrText xml:space="preserve"> PAGEREF _Toc242705318 \h </w:instrText>
+              <w:instrText xml:space="preserve"> PAGEREF _Toc242720520 \h </w:instrText>
             </w:r>
             <w:r>
               <w:rPr>
@@ -1814,7 +1814,7 @@
               <w14:ligatures w14:val="standardContextual"/>
             </w:rPr>
           </w:pPr>
-          <w:hyperlink w:anchor="_Toc242705319" w:history="1">
+          <w:hyperlink w:anchor="_Toc242720521" w:history="1">
             <w:r>
               <w:rPr>
                 <w:rStyle w:val="Hyperlink"/>
@@ -1838,7 +1838,7 @@
               <w:rPr>
                 <w:noProof/>
               </w:rPr>
-              <w:instrText xml:space="preserve"> PAGEREF _Toc242705319 \h </w:instrText>
+              <w:instrText xml:space="preserve"> PAGEREF _Toc242720521 \h </w:instrText>
             </w:r>
             <w:r>
               <w:rPr>
@@ -1880,7 +1880,7 @@
               <w14:ligatures w14:val="standardContextual"/>
             </w:rPr>
           </w:pPr>
-          <w:hyperlink w:anchor="_Toc242705320" w:history="1">
+          <w:hyperlink w:anchor="_Toc242720522" w:history="1">
             <w:r>
               <w:rPr>
                 <w:rStyle w:val="Hyperlink"/>
@@ -1904,7 +1904,7 @@
               <w:rPr>
                 <w:noProof/>
               </w:rPr>
-              <w:instrText xml:space="preserve"> PAGEREF _Toc242705320 \h </w:instrText>
+              <w:instrText xml:space="preserve"> PAGEREF _Toc242720522 \h </w:instrText>
             </w:r>
             <w:r>
               <w:rPr>
@@ -1946,7 +1946,7 @@
               <w14:ligatures w14:val="standardContextual"/>
             </w:rPr>
           </w:pPr>
-          <w:hyperlink w:anchor="_Toc242705321" w:history="1">
+          <w:hyperlink w:anchor="_Toc242720523" w:history="1">
             <w:r>
               <w:rPr>
                 <w:rStyle w:val="Hyperlink"/>
@@ -1970,7 +1970,7 @@
               <w:rPr>
                 <w:noProof/>
               </w:rPr>
-              <w:instrText xml:space="preserve"> PAGEREF _Toc242705321 \h </w:instrText>
+              <w:instrText xml:space="preserve"> PAGEREF _Toc242720523 \h </w:instrText>
             </w:r>
             <w:r>
               <w:rPr>
@@ -2012,7 +2012,7 @@
               <w14:ligatures w14:val="standardContextual"/>
             </w:rPr>
           </w:pPr>
-          <w:hyperlink w:anchor="_Toc242705322" w:history="1">
+          <w:hyperlink w:anchor="_Toc242720524" w:history="1">
             <w:r>
               <w:rPr>
                 <w:rStyle w:val="Hyperlink"/>
@@ -2036,7 +2036,7 @@
               <w:rPr>
                 <w:noProof/>
               </w:rPr>
-              <w:instrText xml:space="preserve"> PAGEREF _Toc242705322 \h </w:instrText>
+              <w:instrText xml:space="preserve"> PAGEREF _Toc242720524 \h </w:instrText>
             </w:r>
             <w:r>
               <w:rPr>
@@ -2078,7 +2078,7 @@
               <w14:ligatures w14:val="standardContextual"/>
             </w:rPr>
           </w:pPr>
-          <w:hyperlink w:anchor="_Toc242705323" w:history="1">
+          <w:hyperlink w:anchor="_Toc242720525" w:history="1">
             <w:r>
               <w:rPr>
                 <w:rStyle w:val="Hyperlink"/>
@@ -2102,7 +2102,7 @@
               <w:rPr>
                 <w:noProof/>
               </w:rPr>
-              <w:instrText xml:space="preserve"> PAGEREF _Toc242705323 \h </w:instrText>
+              <w:instrText xml:space="preserve"> PAGEREF _Toc242720525 \h </w:instrText>
             </w:r>
             <w:r>
               <w:rPr>
@@ -2144,7 +2144,7 @@
               <w14:ligatures w14:val="standardContextual"/>
             </w:rPr>
           </w:pPr>
-          <w:hyperlink w:anchor="_Toc242705324" w:history="1">
+          <w:hyperlink w:anchor="_Toc242720526" w:history="1">
             <w:r>
               <w:rPr>
                 <w:rStyle w:val="Hyperlink"/>
@@ -2168,7 +2168,7 @@
               <w:rPr>
                 <w:noProof/>
               </w:rPr>
-              <w:instrText xml:space="preserve"> PAGEREF _Toc242705324 \h </w:instrText>
+              <w:instrText xml:space="preserve"> PAGEREF _Toc242720526 \h </w:instrText>
             </w:r>
             <w:r>
               <w:rPr>
@@ -2210,7 +2210,7 @@
               <w14:ligatures w14:val="standardContextual"/>
             </w:rPr>
           </w:pPr>
-          <w:hyperlink w:anchor="_Toc242705325" w:history="1">
+          <w:hyperlink w:anchor="_Toc242720527" w:history="1">
             <w:r>
               <w:rPr>
                 <w:rStyle w:val="Hyperlink"/>
@@ -2234,7 +2234,7 @@
               <w:rPr>
                 <w:noProof/>
               </w:rPr>
-              <w:instrText xml:space="preserve"> PAGEREF _Toc242705325 \h </w:instrText>
+              <w:instrText xml:space="preserve"> PAGEREF _Toc242720527 \h </w:instrText>
             </w:r>
             <w:r>
               <w:rPr>
@@ -2276,7 +2276,7 @@
               <w14:ligatures w14:val="standardContextual"/>
             </w:rPr>
           </w:pPr>
-          <w:hyperlink w:anchor="_Toc242705326" w:history="1">
+          <w:hyperlink w:anchor="_Toc242720528" w:history="1">
             <w:r>
               <w:rPr>
                 <w:rStyle w:val="Hyperlink"/>
@@ -2300,7 +2300,7 @@
               <w:rPr>
                 <w:noProof/>
               </w:rPr>
-              <w:instrText xml:space="preserve"> PAGEREF _Toc242705326 \h </w:instrText>
+              <w:instrText xml:space="preserve"> PAGEREF _Toc242720528 \h </w:instrText>
             </w:r>
             <w:r>
               <w:rPr>
@@ -2342,7 +2342,7 @@
               <w14:ligatures w14:val="standardContextual"/>
             </w:rPr>
           </w:pPr>
-          <w:hyperlink w:anchor="_Toc242705327" w:history="1">
+          <w:hyperlink w:anchor="_Toc242720529" w:history="1">
             <w:r>
               <w:rPr>
                 <w:rStyle w:val="Hyperlink"/>
@@ -2366,7 +2366,7 @@
               <w:rPr>
                 <w:noProof/>
               </w:rPr>
-              <w:instrText xml:space="preserve"> PAGEREF _Toc242705327 \h </w:instrText>
+              <w:instrText xml:space="preserve"> PAGEREF _Toc242720529 \h </w:instrText>
             </w:r>
             <w:r>
               <w:rPr>
@@ -2408,7 +2408,7 @@
               <w14:ligatures w14:val="standardContextual"/>
             </w:rPr>
           </w:pPr>
-          <w:hyperlink w:anchor="_Toc242705328" w:history="1">
+          <w:hyperlink w:anchor="_Toc242720530" w:history="1">
             <w:r>
               <w:rPr>
                 <w:rStyle w:val="Hyperlink"/>
@@ -2432,7 +2432,7 @@
               <w:rPr>
                 <w:noProof/>
               </w:rPr>
-              <w:instrText xml:space="preserve"> PAGEREF _Toc242705328 \h </w:instrText>
+              <w:instrText xml:space="preserve"> PAGEREF _Toc242720530 \h </w:instrText>
             </w:r>
             <w:r>
               <w:rPr>
@@ -2474,7 +2474,7 @@
               <w14:ligatures w14:val="standardContextual"/>
             </w:rPr>
           </w:pPr>
-          <w:hyperlink w:anchor="_Toc242705329" w:history="1">
+          <w:hyperlink w:anchor="_Toc242720531" w:history="1">
             <w:r>
               <w:rPr>
                 <w:rStyle w:val="Hyperlink"/>
@@ -2498,7 +2498,7 @@
               <w:rPr>
                 <w:noProof/>
               </w:rPr>
-              <w:instrText xml:space="preserve"> PAGEREF _Toc242705329 \h </w:instrText>
+              <w:instrText xml:space="preserve"> PAGEREF _Toc242720531 \h </w:instrText>
             </w:r>
             <w:r>
               <w:rPr>
@@ -2540,7 +2540,7 @@
               <w14:ligatures w14:val="standardContextual"/>
             </w:rPr>
           </w:pPr>
-          <w:hyperlink w:anchor="_Toc242705330" w:history="1">
+          <w:hyperlink w:anchor="_Toc242720532" w:history="1">
             <w:r>
               <w:rPr>
                 <w:rStyle w:val="Hyperlink"/>
@@ -2564,7 +2564,7 @@
               <w:rPr>
                 <w:noProof/>
               </w:rPr>
-              <w:instrText xml:space="preserve"> PAGEREF _Toc242705330 \h </w:instrText>
+              <w:instrText xml:space="preserve"> PAGEREF _Toc242720532 \h </w:instrText>
             </w:r>
             <w:r>
               <w:rPr>
@@ -2606,7 +2606,7 @@
               <w14:ligatures w14:val="standardContextual"/>
             </w:rPr>
           </w:pPr>
-          <w:hyperlink w:anchor="_Toc242705331" w:history="1">
+          <w:hyperlink w:anchor="_Toc242720533" w:history="1">
             <w:r>
               <w:rPr>
                 <w:rStyle w:val="Hyperlink"/>
@@ -2630,7 +2630,7 @@
               <w:rPr>
                 <w:noProof/>
               </w:rPr>
-              <w:instrText xml:space="preserve"> PAGEREF _Toc242705331 \h </w:instrText>
+              <w:instrText xml:space="preserve"> PAGEREF _Toc242720533 \h </w:instrText>
             </w:r>
             <w:r>
               <w:rPr>
@@ -2672,7 +2672,7 @@
               <w14:ligatures w14:val="standardContextual"/>
             </w:rPr>
           </w:pPr>
-          <w:hyperlink w:anchor="_Toc242705332" w:history="1">
+          <w:hyperlink w:anchor="_Toc242720534" w:history="1">
             <w:r>
               <w:rPr>
                 <w:rStyle w:val="Hyperlink"/>
@@ -2696,7 +2696,7 @@
               <w:rPr>
                 <w:noProof/>
               </w:rPr>
-              <w:instrText xml:space="preserve"> PAGEREF _Toc242705332 \h </w:instrText>
+              <w:instrText xml:space="preserve"> PAGEREF _Toc242720534 \h </w:instrText>
             </w:r>
             <w:r>
               <w:rPr>
@@ -2738,7 +2738,7 @@
               <w14:ligatures w14:val="standardContextual"/>
             </w:rPr>
           </w:pPr>
-          <w:hyperlink w:anchor="_Toc242705333" w:history="1">
+          <w:hyperlink w:anchor="_Toc242720535" w:history="1">
             <w:r>
               <w:rPr>
                 <w:rStyle w:val="Hyperlink"/>
@@ -2762,7 +2762,7 @@
               <w:rPr>
                 <w:noProof/>
               </w:rPr>
-              <w:instrText xml:space="preserve"> PAGEREF _Toc242705333 \h </w:instrText>
+              <w:instrText xml:space="preserve"> PAGEREF _Toc242720535 \h </w:instrText>
             </w:r>
             <w:r>
               <w:rPr>
@@ -2804,7 +2804,7 @@
               <w14:ligatures w14:val="standardContextual"/>
             </w:rPr>
           </w:pPr>
-          <w:hyperlink w:anchor="_Toc242705334" w:history="1">
+          <w:hyperlink w:anchor="_Toc242720536" w:history="1">
             <w:r>
               <w:rPr>
                 <w:rStyle w:val="Hyperlink"/>
@@ -2828,7 +2828,7 @@
               <w:rPr>
                 <w:noProof/>
               </w:rPr>
-              <w:instrText xml:space="preserve"> PAGEREF _Toc242705334 \h </w:instrText>
+              <w:instrText xml:space="preserve"> PAGEREF _Toc242720536 \h </w:instrText>
             </w:r>
             <w:r>
               <w:rPr>
@@ -2870,7 +2870,7 @@
               <w14:ligatures w14:val="standardContextual"/>
             </w:rPr>
           </w:pPr>
-          <w:hyperlink w:anchor="_Toc242705335" w:history="1">
+          <w:hyperlink w:anchor="_Toc242720537" w:history="1">
             <w:r>
               <w:rPr>
                 <w:rStyle w:val="Hyperlink"/>
@@ -2894,7 +2894,7 @@
               <w:rPr>
                 <w:noProof/>
               </w:rPr>
-              <w:instrText xml:space="preserve"> PAGEREF _Toc242705335 \h </w:instrText>
+              <w:instrText xml:space="preserve"> PAGEREF _Toc242720537 \h </w:instrText>
             </w:r>
             <w:r>
               <w:rPr>
@@ -2936,7 +2936,7 @@
               <w14:ligatures w14:val="standardContextual"/>
             </w:rPr>
           </w:pPr>
-          <w:hyperlink w:anchor="_Toc242705336" w:history="1">
+          <w:hyperlink w:anchor="_Toc242720538" w:history="1">
             <w:r>
               <w:rPr>
                 <w:rStyle w:val="Hyperlink"/>
@@ -2960,7 +2960,7 @@
               <w:rPr>
                 <w:noProof/>
               </w:rPr>
-              <w:instrText xml:space="preserve"> PAGEREF _Toc242705336 \h </w:instrText>
+              <w:instrText xml:space="preserve"> PAGEREF _Toc242720538 \h </w:instrText>
             </w:r>
             <w:r>
               <w:rPr>
@@ -3002,7 +3002,7 @@
               <w14:ligatures w14:val="standardContextual"/>
             </w:rPr>
           </w:pPr>
-          <w:hyperlink w:anchor="_Toc242705337" w:history="1">
+          <w:hyperlink w:anchor="_Toc242720539" w:history="1">
             <w:r>
               <w:rPr>
                 <w:rStyle w:val="Hyperlink"/>
@@ -3026,7 +3026,7 @@
               <w:rPr>
                 <w:noProof/>
               </w:rPr>
-              <w:instrText xml:space="preserve"> PAGEREF _Toc242705337 \h </w:instrText>
+              <w:instrText xml:space="preserve"> PAGEREF _Toc242720539 \h </w:instrText>
             </w:r>
             <w:r>
               <w:rPr>
@@ -3068,7 +3068,7 @@
               <w14:ligatures w14:val="standardContextual"/>
             </w:rPr>
           </w:pPr>
-          <w:hyperlink w:anchor="_Toc242705338" w:history="1">
+          <w:hyperlink w:anchor="_Toc242720540" w:history="1">
             <w:r>
               <w:rPr>
                 <w:rStyle w:val="Hyperlink"/>
@@ -3092,7 +3092,7 @@
               <w:rPr>
                 <w:noProof/>
               </w:rPr>
-              <w:instrText xml:space="preserve"> PAGEREF _Toc242705338 \h </w:instrText>
+              <w:instrText xml:space="preserve"> PAGEREF _Toc242720540 \h </w:instrText>
             </w:r>
             <w:r>
               <w:rPr>
@@ -3134,7 +3134,7 @@
               <w14:ligatures w14:val="standardContextual"/>
             </w:rPr>
           </w:pPr>
-          <w:hyperlink w:anchor="_Toc242705339" w:history="1">
+          <w:hyperlink w:anchor="_Toc242720541" w:history="1">
             <w:r>
               <w:rPr>
                 <w:rStyle w:val="Hyperlink"/>
@@ -3158,7 +3158,7 @@
               <w:rPr>
                 <w:noProof/>
               </w:rPr>
-              <w:instrText xml:space="preserve"> PAGEREF _Toc242705339 \h </w:instrText>
+              <w:instrText xml:space="preserve"> PAGEREF _Toc242720541 \h </w:instrText>
             </w:r>
             <w:r>
               <w:rPr>
@@ -3200,7 +3200,7 @@
               <w14:ligatures w14:val="standardContextual"/>
             </w:rPr>
           </w:pPr>
-          <w:hyperlink w:anchor="_Toc242705340" w:history="1">
+          <w:hyperlink w:anchor="_Toc242720542" w:history="1">
             <w:r>
               <w:rPr>
                 <w:rStyle w:val="Hyperlink"/>
@@ -3224,7 +3224,7 @@
               <w:rPr>
                 <w:noProof/>
               </w:rPr>
-              <w:instrText xml:space="preserve"> PAGEREF _Toc242705340 \h </w:instrText>
+              <w:instrText xml:space="preserve"> PAGEREF _Toc242720542 \h </w:instrText>
             </w:r>
             <w:r>
               <w:rPr>
@@ -3266,7 +3266,7 @@
               <w14:ligatures w14:val="standardContextual"/>
             </w:rPr>
           </w:pPr>
-          <w:hyperlink w:anchor="_Toc242705341" w:history="1">
+          <w:hyperlink w:anchor="_Toc242720543" w:history="1">
             <w:r>
               <w:rPr>
                 <w:rStyle w:val="Hyperlink"/>
@@ -3290,7 +3290,7 @@
               <w:rPr>
                 <w:noProof/>
               </w:rPr>
-              <w:instrText xml:space="preserve"> PAGEREF _Toc242705341 \h </w:instrText>
+              <w:instrText xml:space="preserve"> PAGEREF _Toc242720543 \h </w:instrText>
             </w:r>
             <w:r>
               <w:rPr>
@@ -3332,7 +3332,7 @@
               <w14:ligatures w14:val="standardContextual"/>
             </w:rPr>
           </w:pPr>
-          <w:hyperlink w:anchor="_Toc242705342" w:history="1">
+          <w:hyperlink w:anchor="_Toc242720544" w:history="1">
             <w:r>
               <w:rPr>
                 <w:rStyle w:val="Hyperlink"/>
@@ -3356,7 +3356,7 @@
               <w:rPr>
                 <w:noProof/>
               </w:rPr>
-              <w:instrText xml:space="preserve"> PAGEREF _Toc242705342 \h </w:instrText>
+              <w:instrText xml:space="preserve"> PAGEREF _Toc242720544 \h </w:instrText>
             </w:r>
             <w:r>
               <w:rPr>
@@ -3398,7 +3398,7 @@
               <w14:ligatures w14:val="standardContextual"/>
             </w:rPr>
           </w:pPr>
-          <w:hyperlink w:anchor="_Toc242705343" w:history="1">
+          <w:hyperlink w:anchor="_Toc242720545" w:history="1">
             <w:r>
               <w:rPr>
                 <w:rStyle w:val="Hyperlink"/>
@@ -3422,7 +3422,7 @@
               <w:rPr>
                 <w:noProof/>
               </w:rPr>
-              <w:instrText xml:space="preserve"> PAGEREF _Toc242705343 \h </w:instrText>
+              <w:instrText xml:space="preserve"> PAGEREF _Toc242720545 \h </w:instrText>
             </w:r>
             <w:r>
               <w:rPr>
@@ -3464,7 +3464,7 @@
               <w14:ligatures w14:val="standardContextual"/>
             </w:rPr>
           </w:pPr>
-          <w:hyperlink w:anchor="_Toc242705344" w:history="1">
+          <w:hyperlink w:anchor="_Toc242720546" w:history="1">
             <w:r>
               <w:rPr>
                 <w:rStyle w:val="Hyperlink"/>
@@ -3488,7 +3488,7 @@
               <w:rPr>
                 <w:noProof/>
               </w:rPr>
-              <w:instrText xml:space="preserve"> PAGEREF _Toc242705344 \h </w:instrText>
+              <w:instrText xml:space="preserve"> PAGEREF _Toc242720546 \h </w:instrText>
             </w:r>
             <w:r>
               <w:rPr>
@@ -3530,7 +3530,7 @@
               <w14:ligatures w14:val="standardContextual"/>
             </w:rPr>
           </w:pPr>
-          <w:hyperlink w:anchor="_Toc242705345" w:history="1">
+          <w:hyperlink w:anchor="_Toc242720547" w:history="1">
             <w:r>
               <w:rPr>
                 <w:rStyle w:val="Hyperlink"/>
@@ -3554,7 +3554,7 @@
               <w:rPr>
                 <w:noProof/>
               </w:rPr>
-              <w:instrText xml:space="preserve"> PAGEREF _Toc242705345 \h </w:instrText>
+              <w:instrText xml:space="preserve"> PAGEREF _Toc242720547 \h </w:instrText>
             </w:r>
             <w:r>
               <w:rPr>
@@ -3596,7 +3596,7 @@
               <w14:ligatures w14:val="standardContextual"/>
             </w:rPr>
           </w:pPr>
-          <w:hyperlink w:anchor="_Toc242705346" w:history="1">
+          <w:hyperlink w:anchor="_Toc242720548" w:history="1">
             <w:r>
               <w:rPr>
                 <w:rStyle w:val="Hyperlink"/>
@@ -3620,7 +3620,7 @@
               <w:rPr>
                 <w:noProof/>
               </w:rPr>
-              <w:instrText xml:space="preserve"> PAGEREF _Toc242705346 \h </w:instrText>
+              <w:instrText xml:space="preserve"> PAGEREF _Toc242720548 \h </w:instrText>
             </w:r>
             <w:r>
               <w:rPr>
@@ -3662,7 +3662,7 @@
               <w14:ligatures w14:val="standardContextual"/>
             </w:rPr>
           </w:pPr>
-          <w:hyperlink w:anchor="_Toc242705347" w:history="1">
+          <w:hyperlink w:anchor="_Toc242720549" w:history="1">
             <w:r>
               <w:rPr>
                 <w:rStyle w:val="Hyperlink"/>
@@ -3686,7 +3686,7 @@
               <w:rPr>
                 <w:noProof/>
               </w:rPr>
-              <w:instrText xml:space="preserve"> PAGEREF _Toc242705347 \h </w:instrText>
+              <w:instrText xml:space="preserve"> PAGEREF _Toc242720549 \h </w:instrText>
             </w:r>
             <w:r>
               <w:rPr>
@@ -3728,7 +3728,7 @@
               <w14:ligatures w14:val="standardContextual"/>
             </w:rPr>
           </w:pPr>
-          <w:hyperlink w:anchor="_Toc242705348" w:history="1">
+          <w:hyperlink w:anchor="_Toc242720550" w:history="1">
             <w:r>
               <w:rPr>
                 <w:rStyle w:val="Hyperlink"/>
@@ -3752,7 +3752,7 @@
               <w:rPr>
                 <w:noProof/>
               </w:rPr>
-              <w:instrText xml:space="preserve"> PAGEREF _Toc242705348 \h </w:instrText>
+              <w:instrText xml:space="preserve"> PAGEREF _Toc242720550 \h </w:instrText>
             </w:r>
             <w:r>
               <w:rPr>
@@ -3794,7 +3794,7 @@
               <w14:ligatures w14:val="standardContextual"/>
             </w:rPr>
           </w:pPr>
-          <w:hyperlink w:anchor="_Toc242705349" w:history="1">
+          <w:hyperlink w:anchor="_Toc242720551" w:history="1">
             <w:r>
               <w:rPr>
                 <w:rStyle w:val="Hyperlink"/>
@@ -3818,7 +3818,7 @@
               <w:rPr>
                 <w:noProof/>
               </w:rPr>
-              <w:instrText xml:space="preserve"> PAGEREF _Toc242705349 \h </w:instrText>
+              <w:instrText xml:space="preserve"> PAGEREF _Toc242720551 \h </w:instrText>
             </w:r>
             <w:r>
               <w:rPr>
@@ -3860,7 +3860,7 @@
               <w14:ligatures w14:val="standardContextual"/>
             </w:rPr>
           </w:pPr>
-          <w:hyperlink w:anchor="_Toc242705350" w:history="1">
+          <w:hyperlink w:anchor="_Toc242720552" w:history="1">
             <w:r>
               <w:rPr>
                 <w:rStyle w:val="Hyperlink"/>
@@ -3884,7 +3884,7 @@
               <w:rPr>
                 <w:noProof/>
               </w:rPr>
-              <w:instrText xml:space="preserve"> PAGEREF _Toc242705350 \h </w:instrText>
+              <w:instrText xml:space="preserve"> PAGEREF _Toc242720552 \h </w:instrText>
             </w:r>
             <w:r>
               <w:rPr>
@@ -3926,7 +3926,7 @@
               <w14:ligatures w14:val="standardContextual"/>
             </w:rPr>
           </w:pPr>
-          <w:hyperlink w:anchor="_Toc242705351" w:history="1">
+          <w:hyperlink w:anchor="_Toc242720553" w:history="1">
             <w:r>
               <w:rPr>
                 <w:rStyle w:val="Hyperlink"/>
@@ -3950,7 +3950,7 @@
               <w:rPr>
                 <w:noProof/>
               </w:rPr>
-              <w:instrText xml:space="preserve"> PAGEREF _Toc242705351 \h </w:instrText>
+              <w:instrText xml:space="preserve"> PAGEREF _Toc242720553 \h </w:instrText>
             </w:r>
             <w:r>
               <w:rPr>
@@ -3992,7 +3992,7 @@
               <w14:ligatures w14:val="standardContextual"/>
             </w:rPr>
           </w:pPr>
-          <w:hyperlink w:anchor="_Toc242705352" w:history="1">
+          <w:hyperlink w:anchor="_Toc242720554" w:history="1">
             <w:r>
               <w:rPr>
                 <w:rStyle w:val="Hyperlink"/>
@@ -4016,7 +4016,7 @@
               <w:rPr>
                 <w:noProof/>
               </w:rPr>
-              <w:instrText xml:space="preserve"> PAGEREF _Toc242705352 \h </w:instrText>
+              <w:instrText xml:space="preserve"> PAGEREF _Toc242720554 \h </w:instrText>
             </w:r>
             <w:r>
               <w:rPr>
@@ -4058,7 +4058,7 @@
               <w14:ligatures w14:val="standardContextual"/>
             </w:rPr>
           </w:pPr>
-          <w:hyperlink w:anchor="_Toc242705353" w:history="1">
+          <w:hyperlink w:anchor="_Toc242720555" w:history="1">
             <w:r>
               <w:rPr>
                 <w:rStyle w:val="Hyperlink"/>
@@ -4082,7 +4082,7 @@
               <w:rPr>
                 <w:noProof/>
               </w:rPr>
-              <w:instrText xml:space="preserve"> PAGEREF _Toc242705353 \h </w:instrText>
+              <w:instrText xml:space="preserve"> PAGEREF _Toc242720555 \h </w:instrText>
             </w:r>
             <w:r>
               <w:rPr>
@@ -4124,7 +4124,7 @@
               <w14:ligatures w14:val="standardContextual"/>
             </w:rPr>
           </w:pPr>
-          <w:hyperlink w:anchor="_Toc242705354" w:history="1">
+          <w:hyperlink w:anchor="_Toc242720556" w:history="1">
             <w:r>
               <w:rPr>
                 <w:rStyle w:val="Hyperlink"/>
@@ -4148,7 +4148,7 @@
               <w:rPr>
                 <w:noProof/>
               </w:rPr>
-              <w:instrText xml:space="preserve"> PAGEREF _Toc242705354 \h </w:instrText>
+              <w:instrText xml:space="preserve"> PAGEREF _Toc242720556 \h </w:instrText>
             </w:r>
             <w:r>
               <w:rPr>
@@ -4199,7 +4199,7 @@
         <w:pStyle w:val="Heading1"/>
         <w:pageBreakBefore/>
       </w:pPr>
-      <w:bookmarkStart w:id="0" w:name="_Toc242705294"/>
+      <w:bookmarkStart w:id="0" w:name="_Toc242720496"/>
       <w:r>
         <w:lastRenderedPageBreak/>
         <w:t>1. Resumen ejecutivo</w:t>
@@ -4303,7 +4303,7 @@
         <w:pStyle w:val="Heading1"/>
         <w:pageBreakBefore/>
       </w:pPr>
-      <w:bookmarkStart w:id="1" w:name="_Toc242705295"/>
+      <w:bookmarkStart w:id="1" w:name="_Toc242720497"/>
       <w:r>
         <w:lastRenderedPageBreak/>
         <w:t>2. Conceptos y glosario</w:t>
@@ -5646,7 +5646,7 @@
         <w:pStyle w:val="Heading1"/>
         <w:pageBreakBefore/>
       </w:pPr>
-      <w:bookmarkStart w:id="2" w:name="_Toc242705296"/>
+      <w:bookmarkStart w:id="2" w:name="_Toc242720498"/>
       <w:r>
         <w:lastRenderedPageBreak/>
         <w:t>3. Arquitectura general</w:t>
@@ -5657,7 +5657,7 @@
       <w:pPr>
         <w:pStyle w:val="Heading2"/>
       </w:pPr>
-      <w:bookmarkStart w:id="3" w:name="_Toc242705297"/>
+      <w:bookmarkStart w:id="3" w:name="_Toc242720499"/>
       <w:r>
         <w:t>3.1 Piezas del sistema</w:t>
       </w:r>
@@ -6319,7 +6319,7 @@
       <w:pPr>
         <w:pStyle w:val="Heading2"/>
       </w:pPr>
-      <w:bookmarkStart w:id="4" w:name="_Toc242705298"/>
+      <w:bookmarkStart w:id="4" w:name="_Toc242720500"/>
       <w:r>
         <w:t>3.2 Flujo de datos</w:t>
       </w:r>
@@ -6614,7 +6614,7 @@
         <w:pStyle w:val="Heading1"/>
         <w:pageBreakBefore/>
       </w:pPr>
-      <w:bookmarkStart w:id="5" w:name="_Toc242705299"/>
+      <w:bookmarkStart w:id="5" w:name="_Toc242720501"/>
       <w:r>
         <w:lastRenderedPageBreak/>
         <w:t>4. Servicios externos</w:t>
@@ -6625,7 +6625,7 @@
       <w:pPr>
         <w:pStyle w:val="Heading2"/>
       </w:pPr>
-      <w:bookmarkStart w:id="6" w:name="_Toc242705300"/>
+      <w:bookmarkStart w:id="6" w:name="_Toc242720502"/>
       <w:r>
         <w:t>4.1 TikTok LIVE</w:t>
       </w:r>
@@ -6920,7 +6920,7 @@
               <w:t>giftDetails</w:t>
             </w:r>
             <w:r>
-              <w:t xml:space="preserve"> (casi nunca llega)</w:t>
+              <w:t xml:space="preserve"> (no siempre llega)</w:t>
             </w:r>
           </w:p>
         </w:tc>
@@ -7353,7 +7353,7 @@
         <w:t xml:space="preserve">Limitación importante: </w:t>
       </w:r>
       <w:r>
-        <w:t xml:space="preserve">En las pruebas reales se comprobó que TikTok casi nunca envía </w:t>
+        <w:t xml:space="preserve">En las pruebas reales se comprobó que TikTok no siempre envía </w:t>
       </w:r>
       <w:r>
         <w:rPr>
@@ -7377,14 +7377,14 @@
         <w:t>giftId</w:t>
       </w:r>
       <w:r>
-        <w:t>. Por eso todo el proyecto identifica los regalos por su ID, y el nombre lo pone la persona en el Buscador de regalos.</w:t>
+        <w:t>. Por eso todo el proyecto identifica los regalos por su ID, Cuando sí llega, el nombre viene en inglés (“Rose”) y queda puesto en el Buscador de regalos, donde la persona puede cambiarlo; si no llega, lo escribe ella.</w:t>
       </w:r>
     </w:p>
     <w:p>
       <w:pPr>
         <w:pStyle w:val="Heading2"/>
       </w:pPr>
-      <w:bookmarkStart w:id="7" w:name="_Toc242705301"/>
+      <w:bookmarkStart w:id="7" w:name="_Toc242720503"/>
       <w:r>
         <w:t>4.2 Euler Stream</w:t>
       </w:r>
@@ -8676,7 +8676,7 @@
       <w:pPr>
         <w:pStyle w:val="Heading2"/>
       </w:pPr>
-      <w:bookmarkStart w:id="8" w:name="_Toc242705302"/>
+      <w:bookmarkStart w:id="8" w:name="_Toc242720504"/>
       <w:r>
         <w:t>4.3 GitHub, GitHub Actions y GitHub Pages</w:t>
       </w:r>
@@ -8880,7 +8880,7 @@
       <w:pPr>
         <w:pStyle w:val="Heading2"/>
       </w:pPr>
-      <w:bookmarkStart w:id="9" w:name="_Toc242705303"/>
+      <w:bookmarkStart w:id="9" w:name="_Toc242720505"/>
       <w:r>
         <w:t>4.4 Google Fonts</w:t>
       </w:r>
@@ -8930,7 +8930,7 @@
       <w:pPr>
         <w:pStyle w:val="Heading2"/>
       </w:pPr>
-      <w:bookmarkStart w:id="10" w:name="_Toc242705304"/>
+      <w:bookmarkStart w:id="10" w:name="_Toc242720506"/>
       <w:r>
         <w:lastRenderedPageBreak/>
         <w:t>4.5 Supabase (cambios en vivo)</w:t>
@@ -9186,7 +9186,7 @@
         <w:pStyle w:val="Heading1"/>
         <w:pageBreakBefore/>
       </w:pPr>
-      <w:bookmarkStart w:id="11" w:name="_Toc242705305"/>
+      <w:bookmarkStart w:id="11" w:name="_Toc242720507"/>
       <w:r>
         <w:lastRenderedPageBreak/>
         <w:t>5. Estructura de archivos</w:t>
@@ -9696,7 +9696,7 @@
         <w:pStyle w:val="Heading1"/>
         <w:pageBreakBefore/>
       </w:pPr>
-      <w:bookmarkStart w:id="12" w:name="_Toc242705306"/>
+      <w:bookmarkStart w:id="12" w:name="_Toc242720508"/>
       <w:r>
         <w:lastRenderedPageBreak/>
         <w:t>6. Frontend: el módulo compartido comun.js</w:t>
@@ -9724,7 +9724,7 @@
       <w:pPr>
         <w:pStyle w:val="Heading2"/>
       </w:pPr>
-      <w:bookmarkStart w:id="13" w:name="_Toc242705307"/>
+      <w:bookmarkStart w:id="13" w:name="_Toc242720509"/>
       <w:r>
         <w:t>6.1 Configuración en la URL</w:t>
       </w:r>
@@ -10195,7 +10195,7 @@
       <w:pPr>
         <w:pStyle w:val="Heading2"/>
       </w:pPr>
-      <w:bookmarkStart w:id="14" w:name="_Toc242705308"/>
+      <w:bookmarkStart w:id="14" w:name="_Toc242720510"/>
       <w:r>
         <w:t>6.2 Eventos normalizados</w:t>
       </w:r>
@@ -10981,7 +10981,7 @@
       <w:pPr>
         <w:pStyle w:val="Heading2"/>
       </w:pPr>
-      <w:bookmarkStart w:id="15" w:name="_Toc242705309"/>
+      <w:bookmarkStart w:id="15" w:name="_Toc242720511"/>
       <w:r>
         <w:t>6.3 Rastreador de regalos (combos y regalos sueltos)</w:t>
       </w:r>
@@ -11129,7 +11129,7 @@
         <w:t>giftDetails.giftType</w:t>
       </w:r>
       <w:r>
-        <w:t xml:space="preserve"> (1 = combo), pero casi nunca lo hace. El código original trataba todo regalo como combo y esperaba un fin de racha que el capibara nunca enviaba.</w:t>
+        <w:t xml:space="preserve"> (1 = combo), pero no siempre lo hace. El código original trataba todo regalo como combo y esperaba un fin de racha que el capibara nunca enviaba.</w:t>
       </w:r>
     </w:p>
     <w:p>
@@ -11249,6 +11249,19 @@
       </w:r>
       <w:r>
         <w:t>), solo se suma la diferencia entre el total y lo ya contado. Un combo nunca se cuenta doble.</w:t>
+      </w:r>
+    </w:p>
+    <w:p>
+      <w:pPr>
+        <w:pStyle w:val="ListParagraph"/>
+        <w:numPr>
+          <w:ilvl w:val="0"/>
+          <w:numId w:val="5"/>
+        </w:numPr>
+        <w:spacing w:after="60"/>
+      </w:pPr>
+      <w:r>
+        <w:t>En una racha la cantidad solo crece. Si el mismo regalo vuelve a llegar con una cantidad que ya se contó (por ejemplo, la misma persona envía dos capibaras seguidos y TikTok no los separa con un groupId distinto), es un regalo nuevo y se cuenta aparte. Este caso se corrigió en la revisión final: antes el segundo capibara no se contaba.</w:t>
       </w:r>
     </w:p>
     <w:p>
@@ -11628,6 +11641,58 @@
           </w:p>
         </w:tc>
       </w:tr>
+      <w:tr>
+        <w:tc>
+          <w:tcPr>
+            <w:tcW w:w="4212" w:type="dxa"/>
+            <w:tcBorders>
+              <w:top w:val="single" w:sz="4" w:space="0" w:color="BFBFBF"/>
+              <w:left w:val="single" w:sz="4" w:space="0" w:color="BFBFBF"/>
+              <w:bottom w:val="single" w:sz="4" w:space="0" w:color="BFBFBF"/>
+              <w:right w:val="single" w:sz="4" w:space="0" w:color="BFBFBF"/>
+            </w:tcBorders>
+            <w:tcMar>
+              <w:top w:w="60" w:type="dxa"/>
+              <w:left w:w="100" w:type="dxa"/>
+              <w:bottom w:w="60" w:type="dxa"/>
+              <w:right w:w="100" w:type="dxa"/>
+            </w:tcMar>
+          </w:tcPr>
+          <w:p>
+            <w:pPr>
+              <w:spacing w:after="20"/>
+            </w:pPr>
+            <w:r>
+              <w:t>Dos capibaras seguidos de la misma persona, sin groupId</w:t>
+            </w:r>
+          </w:p>
+        </w:tc>
+        <w:tc>
+          <w:tcPr>
+            <w:tcW w:w="5148" w:type="dxa"/>
+            <w:tcBorders>
+              <w:top w:val="single" w:sz="4" w:space="0" w:color="BFBFBF"/>
+              <w:left w:val="single" w:sz="4" w:space="0" w:color="BFBFBF"/>
+              <w:bottom w:val="single" w:sz="4" w:space="0" w:color="BFBFBF"/>
+              <w:right w:val="single" w:sz="4" w:space="0" w:color="BFBFBF"/>
+            </w:tcBorders>
+            <w:tcMar>
+              <w:top w:w="60" w:type="dxa"/>
+              <w:left w:w="100" w:type="dxa"/>
+              <w:bottom w:w="60" w:type="dxa"/>
+              <w:right w:w="100" w:type="dxa"/>
+            </w:tcMar>
+          </w:tcPr>
+          <w:p>
+            <w:pPr>
+              <w:spacing w:after="20"/>
+            </w:pPr>
+            <w:r>
+              <w:t>2 eventos de 1 capibara (corregido en la revisión final)</w:t>
+            </w:r>
+          </w:p>
+        </w:tc>
+      </w:tr>
     </w:tbl>
     <w:p>
       <w:pPr>
@@ -11646,7 +11711,7 @@
       <w:pPr>
         <w:pStyle w:val="Heading2"/>
       </w:pPr>
-      <w:bookmarkStart w:id="16" w:name="_Toc242705310"/>
+      <w:bookmarkStart w:id="16" w:name="_Toc242720512"/>
       <w:r>
         <w:t>6.4 Conexión con TikTok (conectarTikTok)</w:t>
       </w:r>
@@ -11685,7 +11750,6 @@
           <w:sz w:val="19"/>
           <w:szCs w:val="19"/>
         </w:rPr>
-        <w:lastRenderedPageBreak/>
         <w:t>alEvento(evento)</w:t>
       </w:r>
       <w:r>
@@ -11768,7 +11832,7 @@
       <w:pPr>
         <w:pStyle w:val="Heading2"/>
       </w:pPr>
-      <w:bookmarkStart w:id="17" w:name="_Toc242705311"/>
+      <w:bookmarkStart w:id="17" w:name="_Toc242720513"/>
       <w:r>
         <w:t>6.5 Arranque de widgets (iniciarWidget)</w:t>
       </w:r>
@@ -11969,7 +12033,7 @@
       <w:pPr>
         <w:pStyle w:val="Heading2"/>
       </w:pPr>
-      <w:bookmarkStart w:id="18" w:name="_Toc242705312"/>
+      <w:bookmarkStart w:id="18" w:name="_Toc242720514"/>
       <w:r>
         <w:t>6.6 Utilidades</w:t>
       </w:r>
@@ -12035,7 +12099,7 @@
       <w:pPr>
         <w:pStyle w:val="Heading2"/>
       </w:pPr>
-      <w:bookmarkStart w:id="19" w:name="_Toc242705313"/>
+      <w:bookmarkStart w:id="19" w:name="_Toc242720515"/>
       <w:r>
         <w:t>6.7 Cambios en vivo (nube.js)</w:t>
       </w:r>
@@ -12059,6 +12123,7 @@
         <w:spacing w:after="60"/>
       </w:pPr>
       <w:r>
+        <w:lastRenderedPageBreak/>
         <w:t>nubeActiva(): indica si hay proyecto configurado. Si SUPABASE_URL o SUPABASE_CLAVE están vacíos, todo funciona como antes, con la configuración completa en la URL.</w:t>
       </w:r>
     </w:p>
@@ -12098,7 +12163,6 @@
         <w:spacing w:after="60"/>
       </w:pPr>
       <w:r>
-        <w:lastRenderedPageBreak/>
         <w:t>escucharConfigNube(id, alRecibir, alEstado): se suscribe al canal widget-&lt;id&gt; y, cada vez que se conecta (o se reconecta tras un corte), vuelve a leer la configuración por si cambió mientras no escuchaba.</w:t>
       </w:r>
     </w:p>
@@ -12115,7 +12179,7 @@
         <w:pStyle w:val="Heading1"/>
         <w:pageBreakBefore/>
       </w:pPr>
-      <w:bookmarkStart w:id="20" w:name="_Toc242705314"/>
+      <w:bookmarkStart w:id="20" w:name="_Toc242720516"/>
       <w:r>
         <w:lastRenderedPageBreak/>
         <w:t>7. Frontend: los widgets</w:t>
@@ -12146,7 +12210,7 @@
       <w:pPr>
         <w:pStyle w:val="Heading2"/>
       </w:pPr>
-      <w:bookmarkStart w:id="21" w:name="_Toc242705315"/>
+      <w:bookmarkStart w:id="21" w:name="_Toc242720517"/>
       <w:r>
         <w:t>7.1 Ruleta de regalos (ruleta.html)</w:t>
       </w:r>
@@ -13241,7 +13305,7 @@
       <w:pPr>
         <w:pStyle w:val="Heading2"/>
       </w:pPr>
-      <w:bookmarkStart w:id="22" w:name="_Toc242705316"/>
+      <w:bookmarkStart w:id="22" w:name="_Toc242720518"/>
       <w:r>
         <w:t>7.2 Meta (meta.html)</w:t>
       </w:r>
@@ -13844,14 +13908,14 @@
         <w:t xml:space="preserve">Limitación: </w:t>
       </w:r>
       <w:r>
-        <w:t>Como TikTok casi nunca envía el precio de los regalos, la meta de monedas solo suma los regalos que llegan con precio.</w:t>
+        <w:t>Como TikTok no siempre envía el precio de los regalos, la meta de monedas solo suma los regalos que llegan con precio.</w:t>
       </w:r>
     </w:p>
     <w:p>
       <w:pPr>
         <w:pStyle w:val="Heading2"/>
       </w:pPr>
-      <w:bookmarkStart w:id="23" w:name="_Toc242705317"/>
+      <w:bookmarkStart w:id="23" w:name="_Toc242720519"/>
       <w:r>
         <w:t>7.3 Alertas (alertas.html)</w:t>
       </w:r>
@@ -14220,7 +14284,7 @@
         <w:pStyle w:val="Heading1"/>
         <w:pageBreakBefore/>
       </w:pPr>
-      <w:bookmarkStart w:id="24" w:name="_Toc242705318"/>
+      <w:bookmarkStart w:id="24" w:name="_Toc242720520"/>
       <w:r>
         <w:lastRenderedPageBreak/>
         <w:t>8. Frontend: el panel</w:t>
@@ -14231,7 +14295,7 @@
       <w:pPr>
         <w:pStyle w:val="Heading2"/>
       </w:pPr>
-      <w:bookmarkStart w:id="25" w:name="_Toc242705319"/>
+      <w:bookmarkStart w:id="25" w:name="_Toc242720521"/>
       <w:r>
         <w:t>8.1 Estructura de la página (index.html)</w:t>
       </w:r>
@@ -14724,7 +14788,7 @@
       <w:pPr>
         <w:pStyle w:val="Heading2"/>
       </w:pPr>
-      <w:bookmarkStart w:id="26" w:name="_Toc242705320"/>
+      <w:bookmarkStart w:id="26" w:name="_Toc242720522"/>
       <w:r>
         <w:t>8.2 Navegación y ciclo de vida (app.js)</w:t>
       </w:r>
@@ -14905,7 +14969,7 @@
       <w:pPr>
         <w:pStyle w:val="Heading2"/>
       </w:pPr>
-      <w:bookmarkStart w:id="27" w:name="_Toc242705321"/>
+      <w:bookmarkStart w:id="27" w:name="_Toc242720523"/>
       <w:r>
         <w:t>8.3 Mapa del panel (registro.js)</w:t>
       </w:r>
@@ -15629,7 +15693,7 @@
       <w:pPr>
         <w:pStyle w:val="Heading2"/>
       </w:pPr>
-      <w:bookmarkStart w:id="28" w:name="_Toc242705322"/>
+      <w:bookmarkStart w:id="28" w:name="_Toc242720524"/>
       <w:r>
         <w:t>8.4 Datos guardados (almacen.js)</w:t>
       </w:r>
@@ -16428,7 +16492,7 @@
       <w:pPr>
         <w:pStyle w:val="Heading2"/>
       </w:pPr>
-      <w:bookmarkStart w:id="29" w:name="_Toc242705323"/>
+      <w:bookmarkStart w:id="29" w:name="_Toc242720525"/>
       <w:r>
         <w:t>8.5 Conexión del panel al LIVE (envivo.js)</w:t>
       </w:r>
@@ -16493,7 +16557,7 @@
       <w:pPr>
         <w:pStyle w:val="Heading2"/>
       </w:pPr>
-      <w:bookmarkStart w:id="30" w:name="_Toc242705324"/>
+      <w:bookmarkStart w:id="30" w:name="_Toc242720526"/>
       <w:r>
         <w:lastRenderedPageBreak/>
         <w:t>8.6 Componentes de interfaz (ui.js)</w:t>
@@ -16978,7 +17042,7 @@
       <w:pPr>
         <w:pStyle w:val="Heading2"/>
       </w:pPr>
-      <w:bookmarkStart w:id="31" w:name="_Toc242705325"/>
+      <w:bookmarkStart w:id="31" w:name="_Toc242720527"/>
       <w:r>
         <w:t>8.7 Las vistas</w:t>
       </w:r>
@@ -17057,7 +17121,7 @@
         <w:t>requestAnimationFrame</w:t>
       </w:r>
       <w:r>
-        <w:t>, porque este último se congela cuando la pestaña está en segundo plano (problema detectado y corregido durante el desarrollo).</w:t>
+        <w:t>, porque este último se congela cuando la pestaña está en segundo plano (problema detectado y corregido durante el desarrollo). Los regalos se muestran con el nombre del Buscador de regalos: el propio, si la persona le puso uno, o el de TikTok.</w:t>
       </w:r>
     </w:p>
     <w:p>
@@ -17124,7 +17188,7 @@
         <w:t>conexión automática</w:t>
       </w:r>
       <w:r>
-        <w:t>. Muestra arriba las preguntas y avisos de cambios de código (ver 10.4). Si TikTok manda el nombre del regalo (en inglés), el campo de nombre lo muestra desde que llega; la persona puede escribir otro (debajo se recuerda el de TikTok) y, si borra el campo, vuelve el de TikTok.</w:t>
+        <w:t>. Muestra arriba las preguntas y avisos de cambios de código (ver 9.4). Si TikTok manda el nombre del regalo (en inglés), el campo de nombre lo muestra desde que llega; la persona puede escribir otro (debajo se recuerda el de TikTok) y, si borra el campo, vuelve el de TikTok.</w:t>
       </w:r>
     </w:p>
     <w:p>
@@ -17147,7 +17211,7 @@
       <w:pPr>
         <w:pStyle w:val="Heading2"/>
       </w:pPr>
-      <w:bookmarkStart w:id="32" w:name="_Toc242705326"/>
+      <w:bookmarkStart w:id="32" w:name="_Toc242720528"/>
       <w:r>
         <w:t>8.8 Vista previa y pruebas</w:t>
       </w:r>
@@ -17211,7 +17275,7 @@
       <w:pPr>
         <w:pStyle w:val="Heading2"/>
       </w:pPr>
-      <w:bookmarkStart w:id="33" w:name="_Toc242705327"/>
+      <w:bookmarkStart w:id="33" w:name="_Toc242720529"/>
       <w:r>
         <w:t>8.9 Cambios en vivo en el panel (sincronizar.js)</w:t>
       </w:r>
@@ -17287,7 +17351,7 @@
         <w:pStyle w:val="Heading1"/>
         <w:pageBreakBefore/>
       </w:pPr>
-      <w:bookmarkStart w:id="34" w:name="_Toc242705328"/>
+      <w:bookmarkStart w:id="34" w:name="_Toc242720530"/>
       <w:r>
         <w:lastRenderedPageBreak/>
         <w:t>9. Flujos completos paso a paso</w:t>
@@ -17298,7 +17362,7 @@
       <w:pPr>
         <w:pStyle w:val="Heading2"/>
       </w:pPr>
-      <w:bookmarkStart w:id="35" w:name="_Toc242705329"/>
+      <w:bookmarkStart w:id="35" w:name="_Toc242720531"/>
       <w:r>
         <w:t>9.1 Configurar un widget y ponerlo en OBS</w:t>
       </w:r>
@@ -17481,7 +17545,7 @@
       <w:pPr>
         <w:pStyle w:val="Heading2"/>
       </w:pPr>
-      <w:bookmarkStart w:id="36" w:name="_Toc242705330"/>
+      <w:bookmarkStart w:id="36" w:name="_Toc242720532"/>
       <w:r>
         <w:t>9.2 Llega un regalo y gira la ruleta</w:t>
       </w:r>
@@ -17622,7 +17686,7 @@
       <w:pPr>
         <w:pStyle w:val="Heading2"/>
       </w:pPr>
-      <w:bookmarkStart w:id="37" w:name="_Toc242705331"/>
+      <w:bookmarkStart w:id="37" w:name="_Toc242720533"/>
       <w:r>
         <w:t>9.3 Probar sin estar en vivo</w:t>
       </w:r>
@@ -17717,7 +17781,7 @@
       <w:pPr>
         <w:pStyle w:val="Heading2"/>
       </w:pPr>
-      <w:bookmarkStart w:id="38" w:name="_Toc242705332"/>
+      <w:bookmarkStart w:id="38" w:name="_Toc242720534"/>
       <w:r>
         <w:lastRenderedPageBreak/>
         <w:t>9.4 Un regalo cambia de código</w:t>
@@ -17838,7 +17902,7 @@
               <w:spacing w:after="20"/>
             </w:pPr>
             <w:r>
-              <w:t>Llega un regalo con nombre y precio iguales a uno guardado con otro ID</w:t>
+              <w:t>Llega un regalo con nombre y precio iguales a uno guardado con otro ID (el nombre se compara con el de TikTok y con el propio, así que renombrar el regalo no lo impide)</w:t>
             </w:r>
           </w:p>
         </w:tc>
@@ -18086,7 +18150,7 @@
       <w:pPr>
         <w:pStyle w:val="Heading2"/>
       </w:pPr>
-      <w:bookmarkStart w:id="39" w:name="_Toc242705333"/>
+      <w:bookmarkStart w:id="39" w:name="_Toc242720535"/>
       <w:r>
         <w:t>9.5 Cambiar la configuración durante el LIVE</w:t>
       </w:r>
@@ -18149,7 +18213,7 @@
         <w:pStyle w:val="Heading1"/>
         <w:pageBreakBefore/>
       </w:pPr>
-      <w:bookmarkStart w:id="40" w:name="_Toc242705334"/>
+      <w:bookmarkStart w:id="40" w:name="_Toc242720536"/>
       <w:r>
         <w:lastRenderedPageBreak/>
         <w:t>10. Diseño visual</w:t>
@@ -18160,7 +18224,7 @@
       <w:pPr>
         <w:pStyle w:val="Heading2"/>
       </w:pPr>
-      <w:bookmarkStart w:id="41" w:name="_Toc242705335"/>
+      <w:bookmarkStart w:id="41" w:name="_Toc242720537"/>
       <w:r>
         <w:t>10.1 Panel</w:t>
       </w:r>
@@ -19076,7 +19140,7 @@
       <w:pPr>
         <w:pStyle w:val="Heading2"/>
       </w:pPr>
-      <w:bookmarkStart w:id="42" w:name="_Toc242705336"/>
+      <w:bookmarkStart w:id="42" w:name="_Toc242720538"/>
       <w:r>
         <w:t>10.2 Widgets</w:t>
       </w:r>
@@ -19804,7 +19868,7 @@
         <w:pStyle w:val="Heading1"/>
         <w:pageBreakBefore/>
       </w:pPr>
-      <w:bookmarkStart w:id="43" w:name="_Toc242705337"/>
+      <w:bookmarkStart w:id="43" w:name="_Toc242720539"/>
       <w:r>
         <w:lastRenderedPageBreak/>
         <w:t>11. Seguridad y privacidad</w:t>
@@ -20322,7 +20386,7 @@
         <w:pStyle w:val="Heading1"/>
         <w:pageBreakBefore/>
       </w:pPr>
-      <w:bookmarkStart w:id="44" w:name="_Toc242705338"/>
+      <w:bookmarkStart w:id="44" w:name="_Toc242720540"/>
       <w:r>
         <w:lastRenderedPageBreak/>
         <w:t>12. Limitaciones actuales</w:t>
@@ -20544,7 +20608,7 @@
               <w:spacing w:after="20"/>
             </w:pPr>
             <w:r>
-              <w:t>Nombre, precio e imagen del regalo casi nunca llegan</w:t>
+              <w:t>Nombre, precio e imagen del regalo no siempre llegan</w:t>
             </w:r>
           </w:p>
         </w:tc>
@@ -20569,7 +20633,7 @@
               <w:spacing w:after="20"/>
             </w:pPr>
             <w:r>
-              <w:t xml:space="preserve">TikTok no envía </w:t>
+              <w:t xml:space="preserve">TikTok no siempre envía </w:t>
             </w:r>
             <w:r>
               <w:rPr>
@@ -20603,7 +20667,7 @@
               <w:spacing w:after="20"/>
             </w:pPr>
             <w:r>
-              <w:t>Meta de monedas incompleta; alertas dicen “un regalo”; el nombre se escribe a mano</w:t>
+              <w:t>Meta de monedas incompleta; alertas dicen “un regalo”; sin nombre de TikTok, el nombre se escribe a mano</w:t>
             </w:r>
           </w:p>
         </w:tc>
@@ -21475,7 +21539,7 @@
         <w:pStyle w:val="Heading1"/>
         <w:pageBreakBefore/>
       </w:pPr>
-      <w:bookmarkStart w:id="45" w:name="_Toc242705339"/>
+      <w:bookmarkStart w:id="45" w:name="_Toc242720541"/>
       <w:r>
         <w:lastRenderedPageBreak/>
         <w:t>13. Hacia una versión final montada en un servidor</w:t>
@@ -21504,7 +21568,7 @@
       <w:pPr>
         <w:pStyle w:val="Heading2"/>
       </w:pPr>
-      <w:bookmarkStart w:id="46" w:name="_Toc242705340"/>
+      <w:bookmarkStart w:id="46" w:name="_Toc242720542"/>
       <w:r>
         <w:t>13.1 Objetivos de la versión final</w:t>
       </w:r>
@@ -21666,7 +21730,7 @@
       <w:pPr>
         <w:pStyle w:val="Heading2"/>
       </w:pPr>
-      <w:bookmarkStart w:id="47" w:name="_Toc242705341"/>
+      <w:bookmarkStart w:id="47" w:name="_Toc242720543"/>
       <w:r>
         <w:t>13.2 Arquitectura propuesta</w:t>
       </w:r>
@@ -22499,7 +22563,7 @@
       <w:pPr>
         <w:pStyle w:val="Heading2"/>
       </w:pPr>
-      <w:bookmarkStart w:id="48" w:name="_Toc242705342"/>
+      <w:bookmarkStart w:id="48" w:name="_Toc242720544"/>
       <w:r>
         <w:t>13.3 Modelo de datos sugerido</w:t>
       </w:r>
@@ -23210,7 +23274,7 @@
       <w:pPr>
         <w:pStyle w:val="Heading2"/>
       </w:pPr>
-      <w:bookmarkStart w:id="49" w:name="_Toc242705343"/>
+      <w:bookmarkStart w:id="49" w:name="_Toc242720545"/>
       <w:r>
         <w:lastRenderedPageBreak/>
         <w:t>13.4 Seguridad en la versión final</w:t>
@@ -23449,7 +23513,7 @@
       <w:pPr>
         <w:pStyle w:val="Heading2"/>
       </w:pPr>
-      <w:bookmarkStart w:id="50" w:name="_Toc242705344"/>
+      <w:bookmarkStart w:id="50" w:name="_Toc242720546"/>
       <w:r>
         <w:t>13.5 Dónde alojarlo</w:t>
       </w:r>
@@ -24058,7 +24122,7 @@
       <w:pPr>
         <w:pStyle w:val="Heading2"/>
       </w:pPr>
-      <w:bookmarkStart w:id="51" w:name="_Toc242705345"/>
+      <w:bookmarkStart w:id="51" w:name="_Toc242720547"/>
       <w:r>
         <w:t>13.6 Qué se reutiliza y qué cambia del código actual</w:t>
       </w:r>
@@ -24906,7 +24970,7 @@
       <w:pPr>
         <w:pStyle w:val="Heading2"/>
       </w:pPr>
-      <w:bookmarkStart w:id="52" w:name="_Toc242705346"/>
+      <w:bookmarkStart w:id="52" w:name="_Toc242720548"/>
       <w:r>
         <w:lastRenderedPageBreak/>
         <w:t>13.7 Mejoras técnicas recomendadas</w:t>
@@ -25097,7 +25161,7 @@
       <w:pPr>
         <w:pStyle w:val="Heading2"/>
       </w:pPr>
-      <w:bookmarkStart w:id="53" w:name="_Toc242705347"/>
+      <w:bookmarkStart w:id="53" w:name="_Toc242720549"/>
       <w:r>
         <w:t>13.8 Nuevas funciones que habilita un servidor</w:t>
       </w:r>
@@ -25198,7 +25262,7 @@
       <w:pPr>
         <w:pStyle w:val="Heading2"/>
       </w:pPr>
-      <w:bookmarkStart w:id="54" w:name="_Toc242705348"/>
+      <w:bookmarkStart w:id="54" w:name="_Toc242720550"/>
       <w:r>
         <w:t>13.9 Hoja de ruta por fases</w:t>
       </w:r>
@@ -25682,7 +25746,7 @@
         <w:pStyle w:val="Heading1"/>
         <w:pageBreakBefore/>
       </w:pPr>
-      <w:bookmarkStart w:id="55" w:name="_Toc242705349"/>
+      <w:bookmarkStart w:id="55" w:name="_Toc242720551"/>
       <w:r>
         <w:lastRenderedPageBreak/>
         <w:t>14. Operación y mantenimiento actual</w:t>
@@ -25693,7 +25757,7 @@
       <w:pPr>
         <w:pStyle w:val="Heading2"/>
       </w:pPr>
-      <w:bookmarkStart w:id="56" w:name="_Toc242705350"/>
+      <w:bookmarkStart w:id="56" w:name="_Toc242720552"/>
       <w:r>
         <w:t>14.1 Publicar un cambio</w:t>
       </w:r>
@@ -25759,7 +25823,7 @@
       <w:pPr>
         <w:pStyle w:val="Heading2"/>
       </w:pPr>
-      <w:bookmarkStart w:id="57" w:name="_Toc242705351"/>
+      <w:bookmarkStart w:id="57" w:name="_Toc242720553"/>
       <w:r>
         <w:t>14.2 Agregar una función nueva</w:t>
       </w:r>
@@ -25820,7 +25884,7 @@
       <w:pPr>
         <w:pStyle w:val="Heading2"/>
       </w:pPr>
-      <w:bookmarkStart w:id="58" w:name="_Toc242705352"/>
+      <w:bookmarkStart w:id="58" w:name="_Toc242720554"/>
       <w:r>
         <w:t>14.3 Probar</w:t>
       </w:r>
@@ -25907,7 +25971,7 @@
       <w:pPr>
         <w:pStyle w:val="Heading2"/>
       </w:pPr>
-      <w:bookmarkStart w:id="59" w:name="_Toc242705353"/>
+      <w:bookmarkStart w:id="59" w:name="_Toc242720555"/>
       <w:r>
         <w:t>14.4 Solución de problemas</w:t>
       </w:r>
@@ -26580,7 +26644,7 @@
         <w:pStyle w:val="Heading1"/>
         <w:pageBreakBefore/>
       </w:pPr>
-      <w:bookmarkStart w:id="60" w:name="_Toc242705354"/>
+      <w:bookmarkStart w:id="60" w:name="_Toc242720556"/>
       <w:r>
         <w:lastRenderedPageBreak/>
         <w:t>15. Anexo: historial de decisiones y correcciones</w:t>
@@ -27006,7 +27070,7 @@
               <w:spacing w:after="20"/>
             </w:pPr>
             <w:r>
-              <w:t>TikTok casi nunca envía nombre ni precio</w:t>
+              <w:t>TikTok no siempre envía nombre ni precio</w:t>
             </w:r>
           </w:p>
         </w:tc>
@@ -27931,6 +27995,238 @@
             </w:pPr>
             <w:r>
               <w:t>No recopiar la URL tras cada cambio; primer acercamiento a Supabase</w:t>
+            </w:r>
+          </w:p>
+        </w:tc>
+      </w:tr>
+      <w:tr>
+        <w:tc>
+          <w:tcPr>
+            <w:tcW w:w="2246" w:type="dxa"/>
+            <w:tcBorders>
+              <w:top w:val="single" w:sz="4" w:space="0" w:color="BFBFBF"/>
+              <w:left w:val="single" w:sz="4" w:space="0" w:color="BFBFBF"/>
+              <w:bottom w:val="single" w:sz="4" w:space="0" w:color="BFBFBF"/>
+              <w:right w:val="single" w:sz="4" w:space="0" w:color="BFBFBF"/>
+            </w:tcBorders>
+            <w:tcMar>
+              <w:top w:w="60" w:type="dxa"/>
+              <w:left w:w="100" w:type="dxa"/>
+              <w:bottom w:w="60" w:type="dxa"/>
+              <w:right w:w="100" w:type="dxa"/>
+            </w:tcMar>
+          </w:tcPr>
+          <w:p>
+            <w:pPr>
+              <w:spacing w:after="20"/>
+            </w:pPr>
+            <w:r>
+              <w:t>Nombres de regalos</w:t>
+            </w:r>
+          </w:p>
+        </w:tc>
+        <w:tc>
+          <w:tcPr>
+            <w:tcW w:w="3744" w:type="dxa"/>
+            <w:tcBorders>
+              <w:top w:val="single" w:sz="4" w:space="0" w:color="BFBFBF"/>
+              <w:left w:val="single" w:sz="4" w:space="0" w:color="BFBFBF"/>
+              <w:bottom w:val="single" w:sz="4" w:space="0" w:color="BFBFBF"/>
+              <w:right w:val="single" w:sz="4" w:space="0" w:color="BFBFBF"/>
+            </w:tcBorders>
+            <w:tcMar>
+              <w:top w:w="60" w:type="dxa"/>
+              <w:left w:w="100" w:type="dxa"/>
+              <w:bottom w:w="60" w:type="dxa"/>
+              <w:right w:w="100" w:type="dxa"/>
+            </w:tcMar>
+          </w:tcPr>
+          <w:p>
+            <w:pPr>
+              <w:spacing w:after="20"/>
+            </w:pPr>
+            <w:r>
+              <w:t>El nombre en inglés de TikTok queda puesto por defecto y se puede cambiar</w:t>
+            </w:r>
+          </w:p>
+        </w:tc>
+        <w:tc>
+          <w:tcPr>
+            <w:tcW w:w="3370" w:type="dxa"/>
+            <w:tcBorders>
+              <w:top w:val="single" w:sz="4" w:space="0" w:color="BFBFBF"/>
+              <w:left w:val="single" w:sz="4" w:space="0" w:color="BFBFBF"/>
+              <w:bottom w:val="single" w:sz="4" w:space="0" w:color="BFBFBF"/>
+              <w:right w:val="single" w:sz="4" w:space="0" w:color="BFBFBF"/>
+            </w:tcBorders>
+            <w:tcMar>
+              <w:top w:w="60" w:type="dxa"/>
+              <w:left w:w="100" w:type="dxa"/>
+              <w:bottom w:w="60" w:type="dxa"/>
+              <w:right w:w="100" w:type="dxa"/>
+            </w:tcMar>
+          </w:tcPr>
+          <w:p>
+            <w:pPr>
+              <w:spacing w:after="20"/>
+            </w:pPr>
+            <w:r>
+              <w:t>Que el catálogo quede nombrado sin escribir cada regalo</w:t>
+            </w:r>
+          </w:p>
+        </w:tc>
+      </w:tr>
+      <w:tr>
+        <w:tc>
+          <w:tcPr>
+            <w:tcW w:w="2246" w:type="dxa"/>
+            <w:tcBorders>
+              <w:top w:val="single" w:sz="4" w:space="0" w:color="BFBFBF"/>
+              <w:left w:val="single" w:sz="4" w:space="0" w:color="BFBFBF"/>
+              <w:bottom w:val="single" w:sz="4" w:space="0" w:color="BFBFBF"/>
+              <w:right w:val="single" w:sz="4" w:space="0" w:color="BFBFBF"/>
+            </w:tcBorders>
+            <w:tcMar>
+              <w:top w:w="60" w:type="dxa"/>
+              <w:left w:w="100" w:type="dxa"/>
+              <w:bottom w:w="60" w:type="dxa"/>
+              <w:right w:w="100" w:type="dxa"/>
+            </w:tcMar>
+          </w:tcPr>
+          <w:p>
+            <w:pPr>
+              <w:spacing w:after="20"/>
+            </w:pPr>
+            <w:r>
+              <w:lastRenderedPageBreak/>
+              <w:t>Regalos sueltos repetidos</w:t>
+            </w:r>
+          </w:p>
+        </w:tc>
+        <w:tc>
+          <w:tcPr>
+            <w:tcW w:w="3744" w:type="dxa"/>
+            <w:tcBorders>
+              <w:top w:val="single" w:sz="4" w:space="0" w:color="BFBFBF"/>
+              <w:left w:val="single" w:sz="4" w:space="0" w:color="BFBFBF"/>
+              <w:bottom w:val="single" w:sz="4" w:space="0" w:color="BFBFBF"/>
+              <w:right w:val="single" w:sz="4" w:space="0" w:color="BFBFBF"/>
+            </w:tcBorders>
+            <w:tcMar>
+              <w:top w:w="60" w:type="dxa"/>
+              <w:left w:w="100" w:type="dxa"/>
+              <w:bottom w:w="60" w:type="dxa"/>
+              <w:right w:w="100" w:type="dxa"/>
+            </w:tcMar>
+          </w:tcPr>
+          <w:p>
+            <w:pPr>
+              <w:spacing w:after="20"/>
+            </w:pPr>
+            <w:r>
+              <w:t>Una cantidad ya contada se toma como un regalo nuevo</w:t>
+            </w:r>
+          </w:p>
+        </w:tc>
+        <w:tc>
+          <w:tcPr>
+            <w:tcW w:w="3370" w:type="dxa"/>
+            <w:tcBorders>
+              <w:top w:val="single" w:sz="4" w:space="0" w:color="BFBFBF"/>
+              <w:left w:val="single" w:sz="4" w:space="0" w:color="BFBFBF"/>
+              <w:bottom w:val="single" w:sz="4" w:space="0" w:color="BFBFBF"/>
+              <w:right w:val="single" w:sz="4" w:space="0" w:color="BFBFBF"/>
+            </w:tcBorders>
+            <w:tcMar>
+              <w:top w:w="60" w:type="dxa"/>
+              <w:left w:w="100" w:type="dxa"/>
+              <w:bottom w:w="60" w:type="dxa"/>
+              <w:right w:w="100" w:type="dxa"/>
+            </w:tcMar>
+          </w:tcPr>
+          <w:p>
+            <w:pPr>
+              <w:spacing w:after="20"/>
+            </w:pPr>
+            <w:r>
+              <w:t>Dos capibaras seguidos de la misma persona contaban como uno</w:t>
+            </w:r>
+          </w:p>
+        </w:tc>
+      </w:tr>
+      <w:tr>
+        <w:tc>
+          <w:tcPr>
+            <w:tcW w:w="2246" w:type="dxa"/>
+            <w:tcBorders>
+              <w:top w:val="single" w:sz="4" w:space="0" w:color="BFBFBF"/>
+              <w:left w:val="single" w:sz="4" w:space="0" w:color="BFBFBF"/>
+              <w:bottom w:val="single" w:sz="4" w:space="0" w:color="BFBFBF"/>
+              <w:right w:val="single" w:sz="4" w:space="0" w:color="BFBFBF"/>
+            </w:tcBorders>
+            <w:tcMar>
+              <w:top w:w="60" w:type="dxa"/>
+              <w:left w:w="100" w:type="dxa"/>
+              <w:bottom w:w="60" w:type="dxa"/>
+              <w:right w:w="100" w:type="dxa"/>
+            </w:tcMar>
+          </w:tcPr>
+          <w:p>
+            <w:pPr>
+              <w:spacing w:after="20"/>
+            </w:pPr>
+            <w:r>
+              <w:t>Cambios de código con nombre propio</w:t>
+            </w:r>
+          </w:p>
+        </w:tc>
+        <w:tc>
+          <w:tcPr>
+            <w:tcW w:w="3744" w:type="dxa"/>
+            <w:tcBorders>
+              <w:top w:val="single" w:sz="4" w:space="0" w:color="BFBFBF"/>
+              <w:left w:val="single" w:sz="4" w:space="0" w:color="BFBFBF"/>
+              <w:bottom w:val="single" w:sz="4" w:space="0" w:color="BFBFBF"/>
+              <w:right w:val="single" w:sz="4" w:space="0" w:color="BFBFBF"/>
+            </w:tcBorders>
+            <w:tcMar>
+              <w:top w:w="60" w:type="dxa"/>
+              <w:left w:w="100" w:type="dxa"/>
+              <w:bottom w:w="60" w:type="dxa"/>
+              <w:right w:w="100" w:type="dxa"/>
+            </w:tcMar>
+          </w:tcPr>
+          <w:p>
+            <w:pPr>
+              <w:spacing w:after="20"/>
+            </w:pPr>
+            <w:r>
+              <w:t>Comparar el nombre de TikTok además del propio</w:t>
+            </w:r>
+          </w:p>
+        </w:tc>
+        <w:tc>
+          <w:tcPr>
+            <w:tcW w:w="3370" w:type="dxa"/>
+            <w:tcBorders>
+              <w:top w:val="single" w:sz="4" w:space="0" w:color="BFBFBF"/>
+              <w:left w:val="single" w:sz="4" w:space="0" w:color="BFBFBF"/>
+              <w:bottom w:val="single" w:sz="4" w:space="0" w:color="BFBFBF"/>
+              <w:right w:val="single" w:sz="4" w:space="0" w:color="BFBFBF"/>
+            </w:tcBorders>
+            <w:tcMar>
+              <w:top w:w="60" w:type="dxa"/>
+              <w:left w:w="100" w:type="dxa"/>
+              <w:bottom w:w="60" w:type="dxa"/>
+              <w:right w:w="100" w:type="dxa"/>
+            </w:tcMar>
+          </w:tcPr>
+          <w:p>
+            <w:pPr>
+              <w:spacing w:after="20"/>
+            </w:pPr>
+            <w:r>
+              <w:t>Renombrar “Rose” a “Rosa” impedía detectar su código nuevo</w:t>
             </w:r>
           </w:p>
         </w:tc>

</xml_diff>

<commit_message>
Batalla de regalos: tira y afloja entre dos equipos
- batalla.html + js/widgets/batalla.js + css/widgets/batalla.css: placa de
  cristal con dos equipos, barra central desde 50 %, frente de oro (.filo-oro),
  aviso de ventaja y puntos guardados por ronda.
- Vista Superposiciones → Juegos → Batalla de regalos: equipos (nombre, regalo,
  monedas por regalo, color, foto) y Reiniciar batalla en vivo vía Supabase.
- README y documentación Word (sección 7.5 y menciones).

Co-Authored-By: Claude Opus 5.5 <noreply@anthropic.com>
</commit_message>
<xml_diff>
--- a/Documentacion-Live-Tools.docx
+++ b/Documentacion-Live-Tools.docx
@@ -42,7 +42,7 @@
         <w:jc w:val="center"/>
       </w:pPr>
       <w:r>
-        <w:t>Ruleta de regalos · Metas · Alertas · Carrera de regalos · Actividad · Buscador de regalos</w:t>
+        <w:t>Ruleta de regalos · Metas · Alertas · Carrera y Batalla de regalos · Actividad · Buscador de regalos</w:t>
       </w:r>
     </w:p>
     <w:p>
@@ -159,7 +159,7 @@
           <w:r>
             <w:fldChar w:fldCharType="separate"/>
           </w:r>
-          <w:hyperlink w:anchor="_Toc242786071" w:history="1">
+          <w:hyperlink w:anchor="_Toc242786932" w:history="1">
             <w:r>
               <w:rPr>
                 <w:rStyle w:val="Hyperlink"/>
@@ -183,7 +183,7 @@
               <w:rPr>
                 <w:noProof/>
               </w:rPr>
-              <w:instrText xml:space="preserve"> PAGEREF _Toc242786071 \h </w:instrText>
+              <w:instrText xml:space="preserve"> PAGEREF _Toc242786932 \h </w:instrText>
             </w:r>
             <w:r>
               <w:rPr>
@@ -225,7 +225,7 @@
               <w14:ligatures w14:val="standardContextual"/>
             </w:rPr>
           </w:pPr>
-          <w:hyperlink w:anchor="_Toc242786072" w:history="1">
+          <w:hyperlink w:anchor="_Toc242786933" w:history="1">
             <w:r>
               <w:rPr>
                 <w:rStyle w:val="Hyperlink"/>
@@ -249,7 +249,7 @@
               <w:rPr>
                 <w:noProof/>
               </w:rPr>
-              <w:instrText xml:space="preserve"> PAGEREF _Toc242786072 \h </w:instrText>
+              <w:instrText xml:space="preserve"> PAGEREF _Toc242786933 \h </w:instrText>
             </w:r>
             <w:r>
               <w:rPr>
@@ -291,7 +291,7 @@
               <w14:ligatures w14:val="standardContextual"/>
             </w:rPr>
           </w:pPr>
-          <w:hyperlink w:anchor="_Toc242786073" w:history="1">
+          <w:hyperlink w:anchor="_Toc242786934" w:history="1">
             <w:r>
               <w:rPr>
                 <w:rStyle w:val="Hyperlink"/>
@@ -315,7 +315,7 @@
               <w:rPr>
                 <w:noProof/>
               </w:rPr>
-              <w:instrText xml:space="preserve"> PAGEREF _Toc242786073 \h </w:instrText>
+              <w:instrText xml:space="preserve"> PAGEREF _Toc242786934 \h </w:instrText>
             </w:r>
             <w:r>
               <w:rPr>
@@ -357,7 +357,7 @@
               <w14:ligatures w14:val="standardContextual"/>
             </w:rPr>
           </w:pPr>
-          <w:hyperlink w:anchor="_Toc242786074" w:history="1">
+          <w:hyperlink w:anchor="_Toc242786935" w:history="1">
             <w:r>
               <w:rPr>
                 <w:rStyle w:val="Hyperlink"/>
@@ -381,7 +381,7 @@
               <w:rPr>
                 <w:noProof/>
               </w:rPr>
-              <w:instrText xml:space="preserve"> PAGEREF _Toc242786074 \h </w:instrText>
+              <w:instrText xml:space="preserve"> PAGEREF _Toc242786935 \h </w:instrText>
             </w:r>
             <w:r>
               <w:rPr>
@@ -423,7 +423,7 @@
               <w14:ligatures w14:val="standardContextual"/>
             </w:rPr>
           </w:pPr>
-          <w:hyperlink w:anchor="_Toc242786075" w:history="1">
+          <w:hyperlink w:anchor="_Toc242786936" w:history="1">
             <w:r>
               <w:rPr>
                 <w:rStyle w:val="Hyperlink"/>
@@ -447,7 +447,7 @@
               <w:rPr>
                 <w:noProof/>
               </w:rPr>
-              <w:instrText xml:space="preserve"> PAGEREF _Toc242786075 \h </w:instrText>
+              <w:instrText xml:space="preserve"> PAGEREF _Toc242786936 \h </w:instrText>
             </w:r>
             <w:r>
               <w:rPr>
@@ -489,7 +489,7 @@
               <w14:ligatures w14:val="standardContextual"/>
             </w:rPr>
           </w:pPr>
-          <w:hyperlink w:anchor="_Toc242786076" w:history="1">
+          <w:hyperlink w:anchor="_Toc242786937" w:history="1">
             <w:r>
               <w:rPr>
                 <w:rStyle w:val="Hyperlink"/>
@@ -513,7 +513,7 @@
               <w:rPr>
                 <w:noProof/>
               </w:rPr>
-              <w:instrText xml:space="preserve"> PAGEREF _Toc242786076 \h </w:instrText>
+              <w:instrText xml:space="preserve"> PAGEREF _Toc242786937 \h </w:instrText>
             </w:r>
             <w:r>
               <w:rPr>
@@ -555,7 +555,7 @@
               <w14:ligatures w14:val="standardContextual"/>
             </w:rPr>
           </w:pPr>
-          <w:hyperlink w:anchor="_Toc242786077" w:history="1">
+          <w:hyperlink w:anchor="_Toc242786938" w:history="1">
             <w:r>
               <w:rPr>
                 <w:rStyle w:val="Hyperlink"/>
@@ -579,7 +579,7 @@
               <w:rPr>
                 <w:noProof/>
               </w:rPr>
-              <w:instrText xml:space="preserve"> PAGEREF _Toc242786077 \h </w:instrText>
+              <w:instrText xml:space="preserve"> PAGEREF _Toc242786938 \h </w:instrText>
             </w:r>
             <w:r>
               <w:rPr>
@@ -621,7 +621,7 @@
               <w14:ligatures w14:val="standardContextual"/>
             </w:rPr>
           </w:pPr>
-          <w:hyperlink w:anchor="_Toc242786078" w:history="1">
+          <w:hyperlink w:anchor="_Toc242786939" w:history="1">
             <w:r>
               <w:rPr>
                 <w:rStyle w:val="Hyperlink"/>
@@ -645,7 +645,7 @@
               <w:rPr>
                 <w:noProof/>
               </w:rPr>
-              <w:instrText xml:space="preserve"> PAGEREF _Toc242786078 \h </w:instrText>
+              <w:instrText xml:space="preserve"> PAGEREF _Toc242786939 \h </w:instrText>
             </w:r>
             <w:r>
               <w:rPr>
@@ -687,7 +687,7 @@
               <w14:ligatures w14:val="standardContextual"/>
             </w:rPr>
           </w:pPr>
-          <w:hyperlink w:anchor="_Toc242786079" w:history="1">
+          <w:hyperlink w:anchor="_Toc242786940" w:history="1">
             <w:r>
               <w:rPr>
                 <w:rStyle w:val="Hyperlink"/>
@@ -711,7 +711,7 @@
               <w:rPr>
                 <w:noProof/>
               </w:rPr>
-              <w:instrText xml:space="preserve"> PAGEREF _Toc242786079 \h </w:instrText>
+              <w:instrText xml:space="preserve"> PAGEREF _Toc242786940 \h </w:instrText>
             </w:r>
             <w:r>
               <w:rPr>
@@ -753,7 +753,7 @@
               <w14:ligatures w14:val="standardContextual"/>
             </w:rPr>
           </w:pPr>
-          <w:hyperlink w:anchor="_Toc242786080" w:history="1">
+          <w:hyperlink w:anchor="_Toc242786941" w:history="1">
             <w:r>
               <w:rPr>
                 <w:rStyle w:val="Hyperlink"/>
@@ -777,7 +777,7 @@
               <w:rPr>
                 <w:noProof/>
               </w:rPr>
-              <w:instrText xml:space="preserve"> PAGEREF _Toc242786080 \h </w:instrText>
+              <w:instrText xml:space="preserve"> PAGEREF _Toc242786941 \h </w:instrText>
             </w:r>
             <w:r>
               <w:rPr>
@@ -819,7 +819,7 @@
               <w14:ligatures w14:val="standardContextual"/>
             </w:rPr>
           </w:pPr>
-          <w:hyperlink w:anchor="_Toc242786081" w:history="1">
+          <w:hyperlink w:anchor="_Toc242786942" w:history="1">
             <w:r>
               <w:rPr>
                 <w:rStyle w:val="Hyperlink"/>
@@ -843,7 +843,7 @@
               <w:rPr>
                 <w:noProof/>
               </w:rPr>
-              <w:instrText xml:space="preserve"> PAGEREF _Toc242786081 \h </w:instrText>
+              <w:instrText xml:space="preserve"> PAGEREF _Toc242786942 \h </w:instrText>
             </w:r>
             <w:r>
               <w:rPr>
@@ -885,7 +885,7 @@
               <w14:ligatures w14:val="standardContextual"/>
             </w:rPr>
           </w:pPr>
-          <w:hyperlink w:anchor="_Toc242786082" w:history="1">
+          <w:hyperlink w:anchor="_Toc242786943" w:history="1">
             <w:r>
               <w:rPr>
                 <w:rStyle w:val="Hyperlink"/>
@@ -909,7 +909,7 @@
               <w:rPr>
                 <w:noProof/>
               </w:rPr>
-              <w:instrText xml:space="preserve"> PAGEREF _Toc242786082 \h </w:instrText>
+              <w:instrText xml:space="preserve"> PAGEREF _Toc242786943 \h </w:instrText>
             </w:r>
             <w:r>
               <w:rPr>
@@ -951,7 +951,7 @@
               <w14:ligatures w14:val="standardContextual"/>
             </w:rPr>
           </w:pPr>
-          <w:hyperlink w:anchor="_Toc242786083" w:history="1">
+          <w:hyperlink w:anchor="_Toc242786944" w:history="1">
             <w:r>
               <w:rPr>
                 <w:rStyle w:val="Hyperlink"/>
@@ -975,7 +975,7 @@
               <w:rPr>
                 <w:noProof/>
               </w:rPr>
-              <w:instrText xml:space="preserve"> PAGEREF _Toc242786083 \h </w:instrText>
+              <w:instrText xml:space="preserve"> PAGEREF _Toc242786944 \h </w:instrText>
             </w:r>
             <w:r>
               <w:rPr>
@@ -1017,7 +1017,7 @@
               <w14:ligatures w14:val="standardContextual"/>
             </w:rPr>
           </w:pPr>
-          <w:hyperlink w:anchor="_Toc242786084" w:history="1">
+          <w:hyperlink w:anchor="_Toc242786945" w:history="1">
             <w:r>
               <w:rPr>
                 <w:rStyle w:val="Hyperlink"/>
@@ -1041,7 +1041,7 @@
               <w:rPr>
                 <w:noProof/>
               </w:rPr>
-              <w:instrText xml:space="preserve"> PAGEREF _Toc242786084 \h </w:instrText>
+              <w:instrText xml:space="preserve"> PAGEREF _Toc242786945 \h </w:instrText>
             </w:r>
             <w:r>
               <w:rPr>
@@ -1083,7 +1083,7 @@
               <w14:ligatures w14:val="standardContextual"/>
             </w:rPr>
           </w:pPr>
-          <w:hyperlink w:anchor="_Toc242786085" w:history="1">
+          <w:hyperlink w:anchor="_Toc242786946" w:history="1">
             <w:r>
               <w:rPr>
                 <w:rStyle w:val="Hyperlink"/>
@@ -1107,7 +1107,7 @@
               <w:rPr>
                 <w:noProof/>
               </w:rPr>
-              <w:instrText xml:space="preserve"> PAGEREF _Toc242786085 \h </w:instrText>
+              <w:instrText xml:space="preserve"> PAGEREF _Toc242786946 \h </w:instrText>
             </w:r>
             <w:r>
               <w:rPr>
@@ -1149,7 +1149,7 @@
               <w14:ligatures w14:val="standardContextual"/>
             </w:rPr>
           </w:pPr>
-          <w:hyperlink w:anchor="_Toc242786086" w:history="1">
+          <w:hyperlink w:anchor="_Toc242786947" w:history="1">
             <w:r>
               <w:rPr>
                 <w:rStyle w:val="Hyperlink"/>
@@ -1173,7 +1173,7 @@
               <w:rPr>
                 <w:noProof/>
               </w:rPr>
-              <w:instrText xml:space="preserve"> PAGEREF _Toc242786086 \h </w:instrText>
+              <w:instrText xml:space="preserve"> PAGEREF _Toc242786947 \h </w:instrText>
             </w:r>
             <w:r>
               <w:rPr>
@@ -1215,7 +1215,7 @@
               <w14:ligatures w14:val="standardContextual"/>
             </w:rPr>
           </w:pPr>
-          <w:hyperlink w:anchor="_Toc242786087" w:history="1">
+          <w:hyperlink w:anchor="_Toc242786948" w:history="1">
             <w:r>
               <w:rPr>
                 <w:rStyle w:val="Hyperlink"/>
@@ -1239,7 +1239,7 @@
               <w:rPr>
                 <w:noProof/>
               </w:rPr>
-              <w:instrText xml:space="preserve"> PAGEREF _Toc242786087 \h </w:instrText>
+              <w:instrText xml:space="preserve"> PAGEREF _Toc242786948 \h </w:instrText>
             </w:r>
             <w:r>
               <w:rPr>
@@ -1281,7 +1281,7 @@
               <w14:ligatures w14:val="standardContextual"/>
             </w:rPr>
           </w:pPr>
-          <w:hyperlink w:anchor="_Toc242786088" w:history="1">
+          <w:hyperlink w:anchor="_Toc242786949" w:history="1">
             <w:r>
               <w:rPr>
                 <w:rStyle w:val="Hyperlink"/>
@@ -1305,7 +1305,7 @@
               <w:rPr>
                 <w:noProof/>
               </w:rPr>
-              <w:instrText xml:space="preserve"> PAGEREF _Toc242786088 \h </w:instrText>
+              <w:instrText xml:space="preserve"> PAGEREF _Toc242786949 \h </w:instrText>
             </w:r>
             <w:r>
               <w:rPr>
@@ -1347,7 +1347,7 @@
               <w14:ligatures w14:val="standardContextual"/>
             </w:rPr>
           </w:pPr>
-          <w:hyperlink w:anchor="_Toc242786089" w:history="1">
+          <w:hyperlink w:anchor="_Toc242786950" w:history="1">
             <w:r>
               <w:rPr>
                 <w:rStyle w:val="Hyperlink"/>
@@ -1371,7 +1371,7 @@
               <w:rPr>
                 <w:noProof/>
               </w:rPr>
-              <w:instrText xml:space="preserve"> PAGEREF _Toc242786089 \h </w:instrText>
+              <w:instrText xml:space="preserve"> PAGEREF _Toc242786950 \h </w:instrText>
             </w:r>
             <w:r>
               <w:rPr>
@@ -1413,7 +1413,7 @@
               <w14:ligatures w14:val="standardContextual"/>
             </w:rPr>
           </w:pPr>
-          <w:hyperlink w:anchor="_Toc242786090" w:history="1">
+          <w:hyperlink w:anchor="_Toc242786951" w:history="1">
             <w:r>
               <w:rPr>
                 <w:rStyle w:val="Hyperlink"/>
@@ -1437,7 +1437,7 @@
               <w:rPr>
                 <w:noProof/>
               </w:rPr>
-              <w:instrText xml:space="preserve"> PAGEREF _Toc242786090 \h </w:instrText>
+              <w:instrText xml:space="preserve"> PAGEREF _Toc242786951 \h </w:instrText>
             </w:r>
             <w:r>
               <w:rPr>
@@ -1479,7 +1479,7 @@
               <w14:ligatures w14:val="standardContextual"/>
             </w:rPr>
           </w:pPr>
-          <w:hyperlink w:anchor="_Toc242786091" w:history="1">
+          <w:hyperlink w:anchor="_Toc242786952" w:history="1">
             <w:r>
               <w:rPr>
                 <w:rStyle w:val="Hyperlink"/>
@@ -1503,7 +1503,7 @@
               <w:rPr>
                 <w:noProof/>
               </w:rPr>
-              <w:instrText xml:space="preserve"> PAGEREF _Toc242786091 \h </w:instrText>
+              <w:instrText xml:space="preserve"> PAGEREF _Toc242786952 \h </w:instrText>
             </w:r>
             <w:r>
               <w:rPr>
@@ -1545,7 +1545,7 @@
               <w14:ligatures w14:val="standardContextual"/>
             </w:rPr>
           </w:pPr>
-          <w:hyperlink w:anchor="_Toc242786092" w:history="1">
+          <w:hyperlink w:anchor="_Toc242786953" w:history="1">
             <w:r>
               <w:rPr>
                 <w:rStyle w:val="Hyperlink"/>
@@ -1569,7 +1569,7 @@
               <w:rPr>
                 <w:noProof/>
               </w:rPr>
-              <w:instrText xml:space="preserve"> PAGEREF _Toc242786092 \h </w:instrText>
+              <w:instrText xml:space="preserve"> PAGEREF _Toc242786953 \h </w:instrText>
             </w:r>
             <w:r>
               <w:rPr>
@@ -1611,7 +1611,7 @@
               <w14:ligatures w14:val="standardContextual"/>
             </w:rPr>
           </w:pPr>
-          <w:hyperlink w:anchor="_Toc242786093" w:history="1">
+          <w:hyperlink w:anchor="_Toc242786954" w:history="1">
             <w:r>
               <w:rPr>
                 <w:rStyle w:val="Hyperlink"/>
@@ -1635,7 +1635,7 @@
               <w:rPr>
                 <w:noProof/>
               </w:rPr>
-              <w:instrText xml:space="preserve"> PAGEREF _Toc242786093 \h </w:instrText>
+              <w:instrText xml:space="preserve"> PAGEREF _Toc242786954 \h </w:instrText>
             </w:r>
             <w:r>
               <w:rPr>
@@ -1677,7 +1677,7 @@
               <w14:ligatures w14:val="standardContextual"/>
             </w:rPr>
           </w:pPr>
-          <w:hyperlink w:anchor="_Toc242786094" w:history="1">
+          <w:hyperlink w:anchor="_Toc242786955" w:history="1">
             <w:r>
               <w:rPr>
                 <w:rStyle w:val="Hyperlink"/>
@@ -1701,7 +1701,7 @@
               <w:rPr>
                 <w:noProof/>
               </w:rPr>
-              <w:instrText xml:space="preserve"> PAGEREF _Toc242786094 \h </w:instrText>
+              <w:instrText xml:space="preserve"> PAGEREF _Toc242786955 \h </w:instrText>
             </w:r>
             <w:r>
               <w:rPr>
@@ -1743,7 +1743,7 @@
               <w14:ligatures w14:val="standardContextual"/>
             </w:rPr>
           </w:pPr>
-          <w:hyperlink w:anchor="_Toc242786095" w:history="1">
+          <w:hyperlink w:anchor="_Toc242786956" w:history="1">
             <w:r>
               <w:rPr>
                 <w:rStyle w:val="Hyperlink"/>
@@ -1767,7 +1767,7 @@
               <w:rPr>
                 <w:noProof/>
               </w:rPr>
-              <w:instrText xml:space="preserve"> PAGEREF _Toc242786095 \h </w:instrText>
+              <w:instrText xml:space="preserve"> PAGEREF _Toc242786956 \h </w:instrText>
             </w:r>
             <w:r>
               <w:rPr>
@@ -1785,6 +1785,72 @@
                 <w:noProof/>
               </w:rPr>
               <w:t>21</w:t>
+            </w:r>
+            <w:r>
+              <w:rPr>
+                <w:noProof/>
+              </w:rPr>
+              <w:fldChar w:fldCharType="end"/>
+            </w:r>
+          </w:hyperlink>
+        </w:p>
+        <w:p>
+          <w:pPr>
+            <w:pStyle w:val="TOC2"/>
+            <w:tabs>
+              <w:tab w:val="right" w:leader="dot" w:pos="9350"/>
+            </w:tabs>
+            <w:rPr>
+              <w:rFonts w:asciiTheme="minorHAnsi" w:eastAsiaTheme="minorEastAsia" w:hAnsiTheme="minorHAnsi" w:cstheme="minorBidi"/>
+              <w:noProof/>
+              <w:kern w:val="2"/>
+              <w:sz w:val="24"/>
+              <w:szCs w:val="24"/>
+              <w14:ligatures w14:val="standardContextual"/>
+            </w:rPr>
+          </w:pPr>
+          <w:hyperlink w:anchor="_Toc242786957" w:history="1">
+            <w:r>
+              <w:rPr>
+                <w:rStyle w:val="Hyperlink"/>
+                <w:noProof/>
+              </w:rPr>
+              <w:t>7.5 Batalla de regalos (batalla.html)</w:t>
+            </w:r>
+            <w:r>
+              <w:rPr>
+                <w:noProof/>
+              </w:rPr>
+              <w:tab/>
+            </w:r>
+            <w:r>
+              <w:rPr>
+                <w:noProof/>
+              </w:rPr>
+              <w:fldChar w:fldCharType="begin"/>
+            </w:r>
+            <w:r>
+              <w:rPr>
+                <w:noProof/>
+              </w:rPr>
+              <w:instrText xml:space="preserve"> PAGEREF _Toc242786957 \h </w:instrText>
+            </w:r>
+            <w:r>
+              <w:rPr>
+                <w:noProof/>
+              </w:rPr>
+            </w:r>
+            <w:r>
+              <w:rPr>
+                <w:noProof/>
+              </w:rPr>
+              <w:fldChar w:fldCharType="separate"/>
+            </w:r>
+            <w:r>
+              <w:rPr>
+                <w:noProof/>
+              </w:rPr>
+              <w:t>22</w:t>
             </w:r>
             <w:r>
               <w:rPr>
@@ -1809,7 +1875,7 @@
               <w14:ligatures w14:val="standardContextual"/>
             </w:rPr>
           </w:pPr>
-          <w:hyperlink w:anchor="_Toc242786096" w:history="1">
+          <w:hyperlink w:anchor="_Toc242786958" w:history="1">
             <w:r>
               <w:rPr>
                 <w:rStyle w:val="Hyperlink"/>
@@ -1833,7 +1899,7 @@
               <w:rPr>
                 <w:noProof/>
               </w:rPr>
-              <w:instrText xml:space="preserve"> PAGEREF _Toc242786096 \h </w:instrText>
+              <w:instrText xml:space="preserve"> PAGEREF _Toc242786958 \h </w:instrText>
             </w:r>
             <w:r>
               <w:rPr>
@@ -1850,7 +1916,7 @@
               <w:rPr>
                 <w:noProof/>
               </w:rPr>
-              <w:t>23</w:t>
+              <w:t>24</w:t>
             </w:r>
             <w:r>
               <w:rPr>
@@ -1875,7 +1941,7 @@
               <w14:ligatures w14:val="standardContextual"/>
             </w:rPr>
           </w:pPr>
-          <w:hyperlink w:anchor="_Toc242786097" w:history="1">
+          <w:hyperlink w:anchor="_Toc242786959" w:history="1">
             <w:r>
               <w:rPr>
                 <w:rStyle w:val="Hyperlink"/>
@@ -1899,7 +1965,7 @@
               <w:rPr>
                 <w:noProof/>
               </w:rPr>
-              <w:instrText xml:space="preserve"> PAGEREF _Toc242786097 \h </w:instrText>
+              <w:instrText xml:space="preserve"> PAGEREF _Toc242786959 \h </w:instrText>
             </w:r>
             <w:r>
               <w:rPr>
@@ -1916,7 +1982,7 @@
               <w:rPr>
                 <w:noProof/>
               </w:rPr>
-              <w:t>23</w:t>
+              <w:t>24</w:t>
             </w:r>
             <w:r>
               <w:rPr>
@@ -1941,7 +2007,7 @@
               <w14:ligatures w14:val="standardContextual"/>
             </w:rPr>
           </w:pPr>
-          <w:hyperlink w:anchor="_Toc242786098" w:history="1">
+          <w:hyperlink w:anchor="_Toc242786960" w:history="1">
             <w:r>
               <w:rPr>
                 <w:rStyle w:val="Hyperlink"/>
@@ -1965,7 +2031,7 @@
               <w:rPr>
                 <w:noProof/>
               </w:rPr>
-              <w:instrText xml:space="preserve"> PAGEREF _Toc242786098 \h </w:instrText>
+              <w:instrText xml:space="preserve"> PAGEREF _Toc242786960 \h </w:instrText>
             </w:r>
             <w:r>
               <w:rPr>
@@ -1982,7 +2048,7 @@
               <w:rPr>
                 <w:noProof/>
               </w:rPr>
-              <w:t>23</w:t>
+              <w:t>24</w:t>
             </w:r>
             <w:r>
               <w:rPr>
@@ -2007,7 +2073,7 @@
               <w14:ligatures w14:val="standardContextual"/>
             </w:rPr>
           </w:pPr>
-          <w:hyperlink w:anchor="_Toc242786099" w:history="1">
+          <w:hyperlink w:anchor="_Toc242786961" w:history="1">
             <w:r>
               <w:rPr>
                 <w:rStyle w:val="Hyperlink"/>
@@ -2031,7 +2097,7 @@
               <w:rPr>
                 <w:noProof/>
               </w:rPr>
-              <w:instrText xml:space="preserve"> PAGEREF _Toc242786099 \h </w:instrText>
+              <w:instrText xml:space="preserve"> PAGEREF _Toc242786961 \h </w:instrText>
             </w:r>
             <w:r>
               <w:rPr>
@@ -2048,7 +2114,7 @@
               <w:rPr>
                 <w:noProof/>
               </w:rPr>
-              <w:t>23</w:t>
+              <w:t>24</w:t>
             </w:r>
             <w:r>
               <w:rPr>
@@ -2073,7 +2139,7 @@
               <w14:ligatures w14:val="standardContextual"/>
             </w:rPr>
           </w:pPr>
-          <w:hyperlink w:anchor="_Toc242786100" w:history="1">
+          <w:hyperlink w:anchor="_Toc242786962" w:history="1">
             <w:r>
               <w:rPr>
                 <w:rStyle w:val="Hyperlink"/>
@@ -2097,7 +2163,7 @@
               <w:rPr>
                 <w:noProof/>
               </w:rPr>
-              <w:instrText xml:space="preserve"> PAGEREF _Toc242786100 \h </w:instrText>
+              <w:instrText xml:space="preserve"> PAGEREF _Toc242786962 \h </w:instrText>
             </w:r>
             <w:r>
               <w:rPr>
@@ -2114,7 +2180,7 @@
               <w:rPr>
                 <w:noProof/>
               </w:rPr>
-              <w:t>24</w:t>
+              <w:t>25</w:t>
             </w:r>
             <w:r>
               <w:rPr>
@@ -2139,7 +2205,7 @@
               <w14:ligatures w14:val="standardContextual"/>
             </w:rPr>
           </w:pPr>
-          <w:hyperlink w:anchor="_Toc242786101" w:history="1">
+          <w:hyperlink w:anchor="_Toc242786963" w:history="1">
             <w:r>
               <w:rPr>
                 <w:rStyle w:val="Hyperlink"/>
@@ -2163,7 +2229,7 @@
               <w:rPr>
                 <w:noProof/>
               </w:rPr>
-              <w:instrText xml:space="preserve"> PAGEREF _Toc242786101 \h </w:instrText>
+              <w:instrText xml:space="preserve"> PAGEREF _Toc242786963 \h </w:instrText>
             </w:r>
             <w:r>
               <w:rPr>
@@ -2180,7 +2246,7 @@
               <w:rPr>
                 <w:noProof/>
               </w:rPr>
-              <w:t>24</w:t>
+              <w:t>25</w:t>
             </w:r>
             <w:r>
               <w:rPr>
@@ -2205,7 +2271,7 @@
               <w14:ligatures w14:val="standardContextual"/>
             </w:rPr>
           </w:pPr>
-          <w:hyperlink w:anchor="_Toc242786102" w:history="1">
+          <w:hyperlink w:anchor="_Toc242786964" w:history="1">
             <w:r>
               <w:rPr>
                 <w:rStyle w:val="Hyperlink"/>
@@ -2229,7 +2295,7 @@
               <w:rPr>
                 <w:noProof/>
               </w:rPr>
-              <w:instrText xml:space="preserve"> PAGEREF _Toc242786102 \h </w:instrText>
+              <w:instrText xml:space="preserve"> PAGEREF _Toc242786964 \h </w:instrText>
             </w:r>
             <w:r>
               <w:rPr>
@@ -2246,7 +2312,7 @@
               <w:rPr>
                 <w:noProof/>
               </w:rPr>
-              <w:t>25</w:t>
+              <w:t>26</w:t>
             </w:r>
             <w:r>
               <w:rPr>
@@ -2271,7 +2337,7 @@
               <w14:ligatures w14:val="standardContextual"/>
             </w:rPr>
           </w:pPr>
-          <w:hyperlink w:anchor="_Toc242786103" w:history="1">
+          <w:hyperlink w:anchor="_Toc242786965" w:history="1">
             <w:r>
               <w:rPr>
                 <w:rStyle w:val="Hyperlink"/>
@@ -2295,7 +2361,7 @@
               <w:rPr>
                 <w:noProof/>
               </w:rPr>
-              <w:instrText xml:space="preserve"> PAGEREF _Toc242786103 \h </w:instrText>
+              <w:instrText xml:space="preserve"> PAGEREF _Toc242786965 \h </w:instrText>
             </w:r>
             <w:r>
               <w:rPr>
@@ -2312,7 +2378,7 @@
               <w:rPr>
                 <w:noProof/>
               </w:rPr>
-              <w:t>25</w:t>
+              <w:t>26</w:t>
             </w:r>
             <w:r>
               <w:rPr>
@@ -2337,7 +2403,7 @@
               <w14:ligatures w14:val="standardContextual"/>
             </w:rPr>
           </w:pPr>
-          <w:hyperlink w:anchor="_Toc242786104" w:history="1">
+          <w:hyperlink w:anchor="_Toc242786966" w:history="1">
             <w:r>
               <w:rPr>
                 <w:rStyle w:val="Hyperlink"/>
@@ -2361,7 +2427,7 @@
               <w:rPr>
                 <w:noProof/>
               </w:rPr>
-              <w:instrText xml:space="preserve"> PAGEREF _Toc242786104 \h </w:instrText>
+              <w:instrText xml:space="preserve"> PAGEREF _Toc242786966 \h </w:instrText>
             </w:r>
             <w:r>
               <w:rPr>
@@ -2378,7 +2444,7 @@
               <w:rPr>
                 <w:noProof/>
               </w:rPr>
-              <w:t>26</w:t>
+              <w:t>27</w:t>
             </w:r>
             <w:r>
               <w:rPr>
@@ -2403,7 +2469,7 @@
               <w14:ligatures w14:val="standardContextual"/>
             </w:rPr>
           </w:pPr>
-          <w:hyperlink w:anchor="_Toc242786105" w:history="1">
+          <w:hyperlink w:anchor="_Toc242786967" w:history="1">
             <w:r>
               <w:rPr>
                 <w:rStyle w:val="Hyperlink"/>
@@ -2427,7 +2493,7 @@
               <w:rPr>
                 <w:noProof/>
               </w:rPr>
-              <w:instrText xml:space="preserve"> PAGEREF _Toc242786105 \h </w:instrText>
+              <w:instrText xml:space="preserve"> PAGEREF _Toc242786967 \h </w:instrText>
             </w:r>
             <w:r>
               <w:rPr>
@@ -2444,7 +2510,7 @@
               <w:rPr>
                 <w:noProof/>
               </w:rPr>
-              <w:t>26</w:t>
+              <w:t>27</w:t>
             </w:r>
             <w:r>
               <w:rPr>
@@ -2469,7 +2535,7 @@
               <w14:ligatures w14:val="standardContextual"/>
             </w:rPr>
           </w:pPr>
-          <w:hyperlink w:anchor="_Toc242786106" w:history="1">
+          <w:hyperlink w:anchor="_Toc242786968" w:history="1">
             <w:r>
               <w:rPr>
                 <w:rStyle w:val="Hyperlink"/>
@@ -2493,7 +2559,7 @@
               <w:rPr>
                 <w:noProof/>
               </w:rPr>
-              <w:instrText xml:space="preserve"> PAGEREF _Toc242786106 \h </w:instrText>
+              <w:instrText xml:space="preserve"> PAGEREF _Toc242786968 \h </w:instrText>
             </w:r>
             <w:r>
               <w:rPr>
@@ -2510,7 +2576,7 @@
               <w:rPr>
                 <w:noProof/>
               </w:rPr>
-              <w:t>27</w:t>
+              <w:t>29</w:t>
             </w:r>
             <w:r>
               <w:rPr>
@@ -2535,7 +2601,7 @@
               <w14:ligatures w14:val="standardContextual"/>
             </w:rPr>
           </w:pPr>
-          <w:hyperlink w:anchor="_Toc242786107" w:history="1">
+          <w:hyperlink w:anchor="_Toc242786969" w:history="1">
             <w:r>
               <w:rPr>
                 <w:rStyle w:val="Hyperlink"/>
@@ -2559,7 +2625,7 @@
               <w:rPr>
                 <w:noProof/>
               </w:rPr>
-              <w:instrText xml:space="preserve"> PAGEREF _Toc242786107 \h </w:instrText>
+              <w:instrText xml:space="preserve"> PAGEREF _Toc242786969 \h </w:instrText>
             </w:r>
             <w:r>
               <w:rPr>
@@ -2576,7 +2642,7 @@
               <w:rPr>
                 <w:noProof/>
               </w:rPr>
-              <w:t>27</w:t>
+              <w:t>29</w:t>
             </w:r>
             <w:r>
               <w:rPr>
@@ -2601,7 +2667,7 @@
               <w14:ligatures w14:val="standardContextual"/>
             </w:rPr>
           </w:pPr>
-          <w:hyperlink w:anchor="_Toc242786108" w:history="1">
+          <w:hyperlink w:anchor="_Toc242786970" w:history="1">
             <w:r>
               <w:rPr>
                 <w:rStyle w:val="Hyperlink"/>
@@ -2625,7 +2691,7 @@
               <w:rPr>
                 <w:noProof/>
               </w:rPr>
-              <w:instrText xml:space="preserve"> PAGEREF _Toc242786108 \h </w:instrText>
+              <w:instrText xml:space="preserve"> PAGEREF _Toc242786970 \h </w:instrText>
             </w:r>
             <w:r>
               <w:rPr>
@@ -2642,7 +2708,7 @@
               <w:rPr>
                 <w:noProof/>
               </w:rPr>
-              <w:t>27</w:t>
+              <w:t>29</w:t>
             </w:r>
             <w:r>
               <w:rPr>
@@ -2667,7 +2733,7 @@
               <w14:ligatures w14:val="standardContextual"/>
             </w:rPr>
           </w:pPr>
-          <w:hyperlink w:anchor="_Toc242786109" w:history="1">
+          <w:hyperlink w:anchor="_Toc242786971" w:history="1">
             <w:r>
               <w:rPr>
                 <w:rStyle w:val="Hyperlink"/>
@@ -2691,7 +2757,7 @@
               <w:rPr>
                 <w:noProof/>
               </w:rPr>
-              <w:instrText xml:space="preserve"> PAGEREF _Toc242786109 \h </w:instrText>
+              <w:instrText xml:space="preserve"> PAGEREF _Toc242786971 \h </w:instrText>
             </w:r>
             <w:r>
               <w:rPr>
@@ -2708,7 +2774,7 @@
               <w:rPr>
                 <w:noProof/>
               </w:rPr>
-              <w:t>27</w:t>
+              <w:t>29</w:t>
             </w:r>
             <w:r>
               <w:rPr>
@@ -2733,7 +2799,7 @@
               <w14:ligatures w14:val="standardContextual"/>
             </w:rPr>
           </w:pPr>
-          <w:hyperlink w:anchor="_Toc242786110" w:history="1">
+          <w:hyperlink w:anchor="_Toc242786972" w:history="1">
             <w:r>
               <w:rPr>
                 <w:rStyle w:val="Hyperlink"/>
@@ -2757,7 +2823,7 @@
               <w:rPr>
                 <w:noProof/>
               </w:rPr>
-              <w:instrText xml:space="preserve"> PAGEREF _Toc242786110 \h </w:instrText>
+              <w:instrText xml:space="preserve"> PAGEREF _Toc242786972 \h </w:instrText>
             </w:r>
             <w:r>
               <w:rPr>
@@ -2774,7 +2840,7 @@
               <w:rPr>
                 <w:noProof/>
               </w:rPr>
-              <w:t>28</w:t>
+              <w:t>30</w:t>
             </w:r>
             <w:r>
               <w:rPr>
@@ -2799,7 +2865,7 @@
               <w14:ligatures w14:val="standardContextual"/>
             </w:rPr>
           </w:pPr>
-          <w:hyperlink w:anchor="_Toc242786111" w:history="1">
+          <w:hyperlink w:anchor="_Toc242786973" w:history="1">
             <w:r>
               <w:rPr>
                 <w:rStyle w:val="Hyperlink"/>
@@ -2823,7 +2889,7 @@
               <w:rPr>
                 <w:noProof/>
               </w:rPr>
-              <w:instrText xml:space="preserve"> PAGEREF _Toc242786111 \h </w:instrText>
+              <w:instrText xml:space="preserve"> PAGEREF _Toc242786973 \h </w:instrText>
             </w:r>
             <w:r>
               <w:rPr>
@@ -2840,7 +2906,7 @@
               <w:rPr>
                 <w:noProof/>
               </w:rPr>
-              <w:t>28</w:t>
+              <w:t>30</w:t>
             </w:r>
             <w:r>
               <w:rPr>
@@ -2865,7 +2931,7 @@
               <w14:ligatures w14:val="standardContextual"/>
             </w:rPr>
           </w:pPr>
-          <w:hyperlink w:anchor="_Toc242786112" w:history="1">
+          <w:hyperlink w:anchor="_Toc242786974" w:history="1">
             <w:r>
               <w:rPr>
                 <w:rStyle w:val="Hyperlink"/>
@@ -2889,7 +2955,7 @@
               <w:rPr>
                 <w:noProof/>
               </w:rPr>
-              <w:instrText xml:space="preserve"> PAGEREF _Toc242786112 \h </w:instrText>
+              <w:instrText xml:space="preserve"> PAGEREF _Toc242786974 \h </w:instrText>
             </w:r>
             <w:r>
               <w:rPr>
@@ -2906,7 +2972,7 @@
               <w:rPr>
                 <w:noProof/>
               </w:rPr>
-              <w:t>28</w:t>
+              <w:t>30</w:t>
             </w:r>
             <w:r>
               <w:rPr>
@@ -2931,7 +2997,7 @@
               <w14:ligatures w14:val="standardContextual"/>
             </w:rPr>
           </w:pPr>
-          <w:hyperlink w:anchor="_Toc242786113" w:history="1">
+          <w:hyperlink w:anchor="_Toc242786975" w:history="1">
             <w:r>
               <w:rPr>
                 <w:rStyle w:val="Hyperlink"/>
@@ -2955,7 +3021,7 @@
               <w:rPr>
                 <w:noProof/>
               </w:rPr>
-              <w:instrText xml:space="preserve"> PAGEREF _Toc242786113 \h </w:instrText>
+              <w:instrText xml:space="preserve"> PAGEREF _Toc242786975 \h </w:instrText>
             </w:r>
             <w:r>
               <w:rPr>
@@ -2972,7 +3038,7 @@
               <w:rPr>
                 <w:noProof/>
               </w:rPr>
-              <w:t>30</w:t>
+              <w:t>32</w:t>
             </w:r>
             <w:r>
               <w:rPr>
@@ -2997,7 +3063,7 @@
               <w14:ligatures w14:val="standardContextual"/>
             </w:rPr>
           </w:pPr>
-          <w:hyperlink w:anchor="_Toc242786114" w:history="1">
+          <w:hyperlink w:anchor="_Toc242786976" w:history="1">
             <w:r>
               <w:rPr>
                 <w:rStyle w:val="Hyperlink"/>
@@ -3021,7 +3087,7 @@
               <w:rPr>
                 <w:noProof/>
               </w:rPr>
-              <w:instrText xml:space="preserve"> PAGEREF _Toc242786114 \h </w:instrText>
+              <w:instrText xml:space="preserve"> PAGEREF _Toc242786976 \h </w:instrText>
             </w:r>
             <w:r>
               <w:rPr>
@@ -3038,7 +3104,7 @@
               <w:rPr>
                 <w:noProof/>
               </w:rPr>
-              <w:t>30</w:t>
+              <w:t>32</w:t>
             </w:r>
             <w:r>
               <w:rPr>
@@ -3063,7 +3129,7 @@
               <w14:ligatures w14:val="standardContextual"/>
             </w:rPr>
           </w:pPr>
-          <w:hyperlink w:anchor="_Toc242786115" w:history="1">
+          <w:hyperlink w:anchor="_Toc242786977" w:history="1">
             <w:r>
               <w:rPr>
                 <w:rStyle w:val="Hyperlink"/>
@@ -3087,7 +3153,7 @@
               <w:rPr>
                 <w:noProof/>
               </w:rPr>
-              <w:instrText xml:space="preserve"> PAGEREF _Toc242786115 \h </w:instrText>
+              <w:instrText xml:space="preserve"> PAGEREF _Toc242786977 \h </w:instrText>
             </w:r>
             <w:r>
               <w:rPr>
@@ -3104,7 +3170,7 @@
               <w:rPr>
                 <w:noProof/>
               </w:rPr>
-              <w:t>30</w:t>
+              <w:t>32</w:t>
             </w:r>
             <w:r>
               <w:rPr>
@@ -3129,7 +3195,7 @@
               <w14:ligatures w14:val="standardContextual"/>
             </w:rPr>
           </w:pPr>
-          <w:hyperlink w:anchor="_Toc242786116" w:history="1">
+          <w:hyperlink w:anchor="_Toc242786978" w:history="1">
             <w:r>
               <w:rPr>
                 <w:rStyle w:val="Hyperlink"/>
@@ -3153,7 +3219,7 @@
               <w:rPr>
                 <w:noProof/>
               </w:rPr>
-              <w:instrText xml:space="preserve"> PAGEREF _Toc242786116 \h </w:instrText>
+              <w:instrText xml:space="preserve"> PAGEREF _Toc242786978 \h </w:instrText>
             </w:r>
             <w:r>
               <w:rPr>
@@ -3170,7 +3236,7 @@
               <w:rPr>
                 <w:noProof/>
               </w:rPr>
-              <w:t>32</w:t>
+              <w:t>34</w:t>
             </w:r>
             <w:r>
               <w:rPr>
@@ -3195,7 +3261,7 @@
               <w14:ligatures w14:val="standardContextual"/>
             </w:rPr>
           </w:pPr>
-          <w:hyperlink w:anchor="_Toc242786117" w:history="1">
+          <w:hyperlink w:anchor="_Toc242786979" w:history="1">
             <w:r>
               <w:rPr>
                 <w:rStyle w:val="Hyperlink"/>
@@ -3219,7 +3285,7 @@
               <w:rPr>
                 <w:noProof/>
               </w:rPr>
-              <w:instrText xml:space="preserve"> PAGEREF _Toc242786117 \h </w:instrText>
+              <w:instrText xml:space="preserve"> PAGEREF _Toc242786979 \h </w:instrText>
             </w:r>
             <w:r>
               <w:rPr>
@@ -3236,7 +3302,7 @@
               <w:rPr>
                 <w:noProof/>
               </w:rPr>
-              <w:t>33</w:t>
+              <w:t>35</w:t>
             </w:r>
             <w:r>
               <w:rPr>
@@ -3261,7 +3327,7 @@
               <w14:ligatures w14:val="standardContextual"/>
             </w:rPr>
           </w:pPr>
-          <w:hyperlink w:anchor="_Toc242786118" w:history="1">
+          <w:hyperlink w:anchor="_Toc242786980" w:history="1">
             <w:r>
               <w:rPr>
                 <w:rStyle w:val="Hyperlink"/>
@@ -3285,7 +3351,7 @@
               <w:rPr>
                 <w:noProof/>
               </w:rPr>
-              <w:instrText xml:space="preserve"> PAGEREF _Toc242786118 \h </w:instrText>
+              <w:instrText xml:space="preserve"> PAGEREF _Toc242786980 \h </w:instrText>
             </w:r>
             <w:r>
               <w:rPr>
@@ -3302,7 +3368,7 @@
               <w:rPr>
                 <w:noProof/>
               </w:rPr>
-              <w:t>35</w:t>
+              <w:t>37</w:t>
             </w:r>
             <w:r>
               <w:rPr>
@@ -3327,7 +3393,7 @@
               <w14:ligatures w14:val="standardContextual"/>
             </w:rPr>
           </w:pPr>
-          <w:hyperlink w:anchor="_Toc242786119" w:history="1">
+          <w:hyperlink w:anchor="_Toc242786981" w:history="1">
             <w:r>
               <w:rPr>
                 <w:rStyle w:val="Hyperlink"/>
@@ -3351,7 +3417,7 @@
               <w:rPr>
                 <w:noProof/>
               </w:rPr>
-              <w:instrText xml:space="preserve"> PAGEREF _Toc242786119 \h </w:instrText>
+              <w:instrText xml:space="preserve"> PAGEREF _Toc242786981 \h </w:instrText>
             </w:r>
             <w:r>
               <w:rPr>
@@ -3368,7 +3434,7 @@
               <w:rPr>
                 <w:noProof/>
               </w:rPr>
-              <w:t>35</w:t>
+              <w:t>37</w:t>
             </w:r>
             <w:r>
               <w:rPr>
@@ -3393,7 +3459,7 @@
               <w14:ligatures w14:val="standardContextual"/>
             </w:rPr>
           </w:pPr>
-          <w:hyperlink w:anchor="_Toc242786120" w:history="1">
+          <w:hyperlink w:anchor="_Toc242786982" w:history="1">
             <w:r>
               <w:rPr>
                 <w:rStyle w:val="Hyperlink"/>
@@ -3417,7 +3483,7 @@
               <w:rPr>
                 <w:noProof/>
               </w:rPr>
-              <w:instrText xml:space="preserve"> PAGEREF _Toc242786120 \h </w:instrText>
+              <w:instrText xml:space="preserve"> PAGEREF _Toc242786982 \h </w:instrText>
             </w:r>
             <w:r>
               <w:rPr>
@@ -3434,7 +3500,7 @@
               <w:rPr>
                 <w:noProof/>
               </w:rPr>
-              <w:t>35</w:t>
+              <w:t>37</w:t>
             </w:r>
             <w:r>
               <w:rPr>
@@ -3459,7 +3525,7 @@
               <w14:ligatures w14:val="standardContextual"/>
             </w:rPr>
           </w:pPr>
-          <w:hyperlink w:anchor="_Toc242786121" w:history="1">
+          <w:hyperlink w:anchor="_Toc242786983" w:history="1">
             <w:r>
               <w:rPr>
                 <w:rStyle w:val="Hyperlink"/>
@@ -3483,7 +3549,7 @@
               <w:rPr>
                 <w:noProof/>
               </w:rPr>
-              <w:instrText xml:space="preserve"> PAGEREF _Toc242786121 \h </w:instrText>
+              <w:instrText xml:space="preserve"> PAGEREF _Toc242786983 \h </w:instrText>
             </w:r>
             <w:r>
               <w:rPr>
@@ -3500,7 +3566,7 @@
               <w:rPr>
                 <w:noProof/>
               </w:rPr>
-              <w:t>36</w:t>
+              <w:t>38</w:t>
             </w:r>
             <w:r>
               <w:rPr>
@@ -3525,7 +3591,7 @@
               <w14:ligatures w14:val="standardContextual"/>
             </w:rPr>
           </w:pPr>
-          <w:hyperlink w:anchor="_Toc242786122" w:history="1">
+          <w:hyperlink w:anchor="_Toc242786984" w:history="1">
             <w:r>
               <w:rPr>
                 <w:rStyle w:val="Hyperlink"/>
@@ -3549,7 +3615,7 @@
               <w:rPr>
                 <w:noProof/>
               </w:rPr>
-              <w:instrText xml:space="preserve"> PAGEREF _Toc242786122 \h </w:instrText>
+              <w:instrText xml:space="preserve"> PAGEREF _Toc242786984 \h </w:instrText>
             </w:r>
             <w:r>
               <w:rPr>
@@ -3566,7 +3632,7 @@
               <w:rPr>
                 <w:noProof/>
               </w:rPr>
-              <w:t>37</w:t>
+              <w:t>39</w:t>
             </w:r>
             <w:r>
               <w:rPr>
@@ -3591,7 +3657,7 @@
               <w14:ligatures w14:val="standardContextual"/>
             </w:rPr>
           </w:pPr>
-          <w:hyperlink w:anchor="_Toc242786123" w:history="1">
+          <w:hyperlink w:anchor="_Toc242786985" w:history="1">
             <w:r>
               <w:rPr>
                 <w:rStyle w:val="Hyperlink"/>
@@ -3615,7 +3681,7 @@
               <w:rPr>
                 <w:noProof/>
               </w:rPr>
-              <w:instrText xml:space="preserve"> PAGEREF _Toc242786123 \h </w:instrText>
+              <w:instrText xml:space="preserve"> PAGEREF _Toc242786985 \h </w:instrText>
             </w:r>
             <w:r>
               <w:rPr>
@@ -3632,7 +3698,7 @@
               <w:rPr>
                 <w:noProof/>
               </w:rPr>
-              <w:t>37</w:t>
+              <w:t>39</w:t>
             </w:r>
             <w:r>
               <w:rPr>
@@ -3657,7 +3723,7 @@
               <w14:ligatures w14:val="standardContextual"/>
             </w:rPr>
           </w:pPr>
-          <w:hyperlink w:anchor="_Toc242786124" w:history="1">
+          <w:hyperlink w:anchor="_Toc242786986" w:history="1">
             <w:r>
               <w:rPr>
                 <w:rStyle w:val="Hyperlink"/>
@@ -3681,7 +3747,7 @@
               <w:rPr>
                 <w:noProof/>
               </w:rPr>
-              <w:instrText xml:space="preserve"> PAGEREF _Toc242786124 \h </w:instrText>
+              <w:instrText xml:space="preserve"> PAGEREF _Toc242786986 \h </w:instrText>
             </w:r>
             <w:r>
               <w:rPr>
@@ -3698,7 +3764,7 @@
               <w:rPr>
                 <w:noProof/>
               </w:rPr>
-              <w:t>38</w:t>
+              <w:t>40</w:t>
             </w:r>
             <w:r>
               <w:rPr>
@@ -3723,7 +3789,7 @@
               <w14:ligatures w14:val="standardContextual"/>
             </w:rPr>
           </w:pPr>
-          <w:hyperlink w:anchor="_Toc242786125" w:history="1">
+          <w:hyperlink w:anchor="_Toc242786987" w:history="1">
             <w:r>
               <w:rPr>
                 <w:rStyle w:val="Hyperlink"/>
@@ -3747,7 +3813,7 @@
               <w:rPr>
                 <w:noProof/>
               </w:rPr>
-              <w:instrText xml:space="preserve"> PAGEREF _Toc242786125 \h </w:instrText>
+              <w:instrText xml:space="preserve"> PAGEREF _Toc242786987 \h </w:instrText>
             </w:r>
             <w:r>
               <w:rPr>
@@ -3764,7 +3830,7 @@
               <w:rPr>
                 <w:noProof/>
               </w:rPr>
-              <w:t>39</w:t>
+              <w:t>41</w:t>
             </w:r>
             <w:r>
               <w:rPr>
@@ -3789,7 +3855,7 @@
               <w14:ligatures w14:val="standardContextual"/>
             </w:rPr>
           </w:pPr>
-          <w:hyperlink w:anchor="_Toc242786126" w:history="1">
+          <w:hyperlink w:anchor="_Toc242786988" w:history="1">
             <w:r>
               <w:rPr>
                 <w:rStyle w:val="Hyperlink"/>
@@ -3813,7 +3879,7 @@
               <w:rPr>
                 <w:noProof/>
               </w:rPr>
-              <w:instrText xml:space="preserve"> PAGEREF _Toc242786126 \h </w:instrText>
+              <w:instrText xml:space="preserve"> PAGEREF _Toc242786988 \h </w:instrText>
             </w:r>
             <w:r>
               <w:rPr>
@@ -3830,7 +3896,7 @@
               <w:rPr>
                 <w:noProof/>
               </w:rPr>
-              <w:t>39</w:t>
+              <w:t>41</w:t>
             </w:r>
             <w:r>
               <w:rPr>
@@ -3855,7 +3921,7 @@
               <w14:ligatures w14:val="standardContextual"/>
             </w:rPr>
           </w:pPr>
-          <w:hyperlink w:anchor="_Toc242786127" w:history="1">
+          <w:hyperlink w:anchor="_Toc242786989" w:history="1">
             <w:r>
               <w:rPr>
                 <w:rStyle w:val="Hyperlink"/>
@@ -3879,7 +3945,7 @@
               <w:rPr>
                 <w:noProof/>
               </w:rPr>
-              <w:instrText xml:space="preserve"> PAGEREF _Toc242786127 \h </w:instrText>
+              <w:instrText xml:space="preserve"> PAGEREF _Toc242786989 \h </w:instrText>
             </w:r>
             <w:r>
               <w:rPr>
@@ -3896,7 +3962,7 @@
               <w:rPr>
                 <w:noProof/>
               </w:rPr>
-              <w:t>39</w:t>
+              <w:t>41</w:t>
             </w:r>
             <w:r>
               <w:rPr>
@@ -3921,7 +3987,7 @@
               <w14:ligatures w14:val="standardContextual"/>
             </w:rPr>
           </w:pPr>
-          <w:hyperlink w:anchor="_Toc242786128" w:history="1">
+          <w:hyperlink w:anchor="_Toc242786990" w:history="1">
             <w:r>
               <w:rPr>
                 <w:rStyle w:val="Hyperlink"/>
@@ -3945,7 +4011,7 @@
               <w:rPr>
                 <w:noProof/>
               </w:rPr>
-              <w:instrText xml:space="preserve"> PAGEREF _Toc242786128 \h </w:instrText>
+              <w:instrText xml:space="preserve"> PAGEREF _Toc242786990 \h </w:instrText>
             </w:r>
             <w:r>
               <w:rPr>
@@ -3962,7 +4028,7 @@
               <w:rPr>
                 <w:noProof/>
               </w:rPr>
-              <w:t>41</w:t>
+              <w:t>43</w:t>
             </w:r>
             <w:r>
               <w:rPr>
@@ -3987,7 +4053,7 @@
               <w14:ligatures w14:val="standardContextual"/>
             </w:rPr>
           </w:pPr>
-          <w:hyperlink w:anchor="_Toc242786129" w:history="1">
+          <w:hyperlink w:anchor="_Toc242786991" w:history="1">
             <w:r>
               <w:rPr>
                 <w:rStyle w:val="Hyperlink"/>
@@ -4011,7 +4077,7 @@
               <w:rPr>
                 <w:noProof/>
               </w:rPr>
-              <w:instrText xml:space="preserve"> PAGEREF _Toc242786129 \h </w:instrText>
+              <w:instrText xml:space="preserve"> PAGEREF _Toc242786991 \h </w:instrText>
             </w:r>
             <w:r>
               <w:rPr>
@@ -4028,7 +4094,7 @@
               <w:rPr>
                 <w:noProof/>
               </w:rPr>
-              <w:t>41</w:t>
+              <w:t>43</w:t>
             </w:r>
             <w:r>
               <w:rPr>
@@ -4053,7 +4119,7 @@
               <w14:ligatures w14:val="standardContextual"/>
             </w:rPr>
           </w:pPr>
-          <w:hyperlink w:anchor="_Toc242786130" w:history="1">
+          <w:hyperlink w:anchor="_Toc242786992" w:history="1">
             <w:r>
               <w:rPr>
                 <w:rStyle w:val="Hyperlink"/>
@@ -4077,7 +4143,7 @@
               <w:rPr>
                 <w:noProof/>
               </w:rPr>
-              <w:instrText xml:space="preserve"> PAGEREF _Toc242786130 \h </w:instrText>
+              <w:instrText xml:space="preserve"> PAGEREF _Toc242786992 \h </w:instrText>
             </w:r>
             <w:r>
               <w:rPr>
@@ -4094,7 +4160,7 @@
               <w:rPr>
                 <w:noProof/>
               </w:rPr>
-              <w:t>41</w:t>
+              <w:t>43</w:t>
             </w:r>
             <w:r>
               <w:rPr>
@@ -4119,7 +4185,7 @@
               <w14:ligatures w14:val="standardContextual"/>
             </w:rPr>
           </w:pPr>
-          <w:hyperlink w:anchor="_Toc242786131" w:history="1">
+          <w:hyperlink w:anchor="_Toc242786993" w:history="1">
             <w:r>
               <w:rPr>
                 <w:rStyle w:val="Hyperlink"/>
@@ -4143,7 +4209,7 @@
               <w:rPr>
                 <w:noProof/>
               </w:rPr>
-              <w:instrText xml:space="preserve"> PAGEREF _Toc242786131 \h </w:instrText>
+              <w:instrText xml:space="preserve"> PAGEREF _Toc242786993 \h </w:instrText>
             </w:r>
             <w:r>
               <w:rPr>
@@ -4160,7 +4226,7 @@
               <w:rPr>
                 <w:noProof/>
               </w:rPr>
-              <w:t>41</w:t>
+              <w:t>43</w:t>
             </w:r>
             <w:r>
               <w:rPr>
@@ -4185,7 +4251,7 @@
               <w14:ligatures w14:val="standardContextual"/>
             </w:rPr>
           </w:pPr>
-          <w:hyperlink w:anchor="_Toc242786132" w:history="1">
+          <w:hyperlink w:anchor="_Toc242786994" w:history="1">
             <w:r>
               <w:rPr>
                 <w:rStyle w:val="Hyperlink"/>
@@ -4209,7 +4275,7 @@
               <w:rPr>
                 <w:noProof/>
               </w:rPr>
-              <w:instrText xml:space="preserve"> PAGEREF _Toc242786132 \h </w:instrText>
+              <w:instrText xml:space="preserve"> PAGEREF _Toc242786994 \h </w:instrText>
             </w:r>
             <w:r>
               <w:rPr>
@@ -4226,7 +4292,7 @@
               <w:rPr>
                 <w:noProof/>
               </w:rPr>
-              <w:t>41</w:t>
+              <w:t>43</w:t>
             </w:r>
             <w:r>
               <w:rPr>
@@ -4251,7 +4317,7 @@
               <w14:ligatures w14:val="standardContextual"/>
             </w:rPr>
           </w:pPr>
-          <w:hyperlink w:anchor="_Toc242786133" w:history="1">
+          <w:hyperlink w:anchor="_Toc242786995" w:history="1">
             <w:r>
               <w:rPr>
                 <w:rStyle w:val="Hyperlink"/>
@@ -4275,7 +4341,7 @@
               <w:rPr>
                 <w:noProof/>
               </w:rPr>
-              <w:instrText xml:space="preserve"> PAGEREF _Toc242786133 \h </w:instrText>
+              <w:instrText xml:space="preserve"> PAGEREF _Toc242786995 \h </w:instrText>
             </w:r>
             <w:r>
               <w:rPr>
@@ -4292,7 +4358,7 @@
               <w:rPr>
                 <w:noProof/>
               </w:rPr>
-              <w:t>43</w:t>
+              <w:t>45</w:t>
             </w:r>
             <w:r>
               <w:rPr>
@@ -4326,7 +4392,7 @@
         <w:pStyle w:val="Heading1"/>
         <w:pageBreakBefore/>
       </w:pPr>
-      <w:bookmarkStart w:id="0" w:name="_Toc242786071"/>
+      <w:bookmarkStart w:id="0" w:name="_Toc242786932"/>
       <w:r>
         <w:lastRenderedPageBreak/>
         <w:t>1. Resumen ejecutivo</w:t>
@@ -4338,7 +4404,7 @@
         <w:spacing w:after="120"/>
       </w:pPr>
       <w:r>
-        <w:t>Este proyecto es un conjunto de herramientas para transmisiones en vivo de TikTok, inspirado en TikFinity. Permite poner en pantalla, mediante OBS Studio o TikTok LIVE Studio, elementos que reaccionan a lo que hace el público durante el LIVE: una ruleta que gira cuando alguien envía un regalo (con una segunda ruleta premium), barras de meta que se llenan con likes, seguidores, compartidos o monedas, alertas animadas y una carrera de regalos entre integrantes con reloj por rondas. Además incluye un panel para ver la actividad del LIVE en tiempo real y un catálogo de regalos con su código (ID).</w:t>
+        <w:t>Este proyecto es un conjunto de herramientas para transmisiones en vivo de TikTok, inspirado en TikFinity. Permite poner en pantalla, mediante OBS Studio o TikTok LIVE Studio, elementos que reaccionan a lo que hace el público durante el LIVE: una ruleta que gira cuando alguien envía un regalo (con una segunda ruleta premium), barras de meta que se llenan con likes, seguidores, compartidos o monedas, alertas animadas, una carrera de regalos entre integrantes con reloj por rondas y una batalla de regalos (tira y afloja) entre dos equipos. Además incluye un panel para ver la actividad del LIVE en tiempo real y un catálogo de regalos con su código (ID).</w:t>
       </w:r>
     </w:p>
     <w:p>
@@ -4380,7 +4446,7 @@
         <w:pStyle w:val="Heading1"/>
         <w:pageBreakBefore/>
       </w:pPr>
-      <w:bookmarkStart w:id="1" w:name="_Toc242786072"/>
+      <w:bookmarkStart w:id="1" w:name="_Toc242786933"/>
       <w:r>
         <w:lastRenderedPageBreak/>
         <w:t>2. Conceptos y glosario</w:t>
@@ -4578,7 +4644,7 @@
               <w:spacing w:after="20"/>
             </w:pPr>
             <w:r>
-              <w:t>Una página web pequeña (por ejemplo ruleta.html) con fondo transparente que se pone encima de la cámara en OBS. En el proyecto hay cuatro: ruleta (normal y premium), meta, alertas y carrera de regalos.</w:t>
+              <w:t>Una página web pequeña (por ejemplo ruleta.html) con fondo transparente que se pone encima de la cámara en OBS. En el proyecto hay cinco: ruleta (normal y premium), meta, alertas, carrera de regalos y batalla de regalos.</w:t>
             </w:r>
           </w:p>
         </w:tc>
@@ -5125,7 +5191,7 @@
               <w:spacing w:after="20"/>
             </w:pPr>
             <w:r>
-              <w:t>Ronda (carrera de regalos)</w:t>
+              <w:t>Ronda (carrera y batalla)</w:t>
             </w:r>
           </w:p>
         </w:tc>
@@ -5150,7 +5216,7 @@
               <w:spacing w:after="20"/>
             </w:pPr>
             <w:r>
-              <w:t>Un periodo con reloj durante el cual los integrantes de la carrera suman puntos. Se inicia, pausa y reinicia desde el panel; al reiniciar, los puntos vuelven a 0.</w:t>
+              <w:t>Un periodo de juego en la carrera o la batalla de regalos. En la carrera tiene reloj (se inicia, pausa y reinicia desde el panel); en ambas, al reiniciar, los puntos vuelven a 0.</w:t>
             </w:r>
           </w:p>
         </w:tc>
@@ -5763,7 +5829,7 @@
         <w:pStyle w:val="Heading1"/>
         <w:pageBreakBefore/>
       </w:pPr>
-      <w:bookmarkStart w:id="2" w:name="_Toc242786073"/>
+      <w:bookmarkStart w:id="2" w:name="_Toc242786934"/>
       <w:r>
         <w:lastRenderedPageBreak/>
         <w:t>3. Arquitectura general</w:t>
@@ -5774,7 +5840,7 @@
       <w:pPr>
         <w:pStyle w:val="Heading2"/>
       </w:pPr>
-      <w:bookmarkStart w:id="3" w:name="_Toc242786074"/>
+      <w:bookmarkStart w:id="3" w:name="_Toc242786935"/>
       <w:r>
         <w:t>3.1 Piezas del sistema</w:t>
       </w:r>
@@ -6335,7 +6401,7 @@
               <w:spacing w:after="20"/>
             </w:pPr>
             <w:r>
-              <w:t>Widgets (ruleta.html, meta.html, alertas.html, carrera.html)</w:t>
+              <w:t>Widgets (ruleta.html, meta.html, alertas.html, carrera.html, batalla.html)</w:t>
             </w:r>
           </w:p>
         </w:tc>
@@ -6400,7 +6466,7 @@
       <w:pPr>
         <w:pStyle w:val="Heading2"/>
       </w:pPr>
-      <w:bookmarkStart w:id="4" w:name="_Toc242786075"/>
+      <w:bookmarkStart w:id="4" w:name="_Toc242786936"/>
       <w:r>
         <w:t>3.2 Flujo de datos</w:t>
       </w:r>
@@ -6600,6 +6666,7 @@
         <w:spacing w:after="60"/>
       </w:pPr>
       <w:r>
+        <w:lastRenderedPageBreak/>
         <w:t>La persona configura un widget en el panel. El panel guarda la configuración en Supabase y construye una URL fija con el usuario, la API key y el identificador del widget, codificados después de #c=.</w:t>
       </w:r>
     </w:p>
@@ -6613,7 +6680,6 @@
         <w:spacing w:after="60"/>
       </w:pPr>
       <w:r>
-        <w:lastRenderedPageBreak/>
         <w:t>Esa URL se pega en OBS una sola vez. OBS carga el widget desde GitHub Pages.</w:t>
       </w:r>
     </w:p>
@@ -6653,7 +6719,7 @@
         <w:spacing w:after="60"/>
       </w:pPr>
       <w:r>
-        <w:t>El widget convierte cada evento a un formato simple (evento normalizado) y reacciona: gira la ruleta, llena la barra, muestra una alerta o suma puntos a un integrante de la carrera.</w:t>
+        <w:t>El widget convierte cada evento a un formato simple (evento normalizado) y reacciona: gira la ruleta, llena la barra, muestra una alerta suma puntos a un integrante de la carrera o empuja la barra de la batalla.</w:t>
       </w:r>
     </w:p>
     <w:p>
@@ -6695,7 +6761,7 @@
         <w:pStyle w:val="Heading1"/>
         <w:pageBreakBefore/>
       </w:pPr>
-      <w:bookmarkStart w:id="5" w:name="_Toc242786076"/>
+      <w:bookmarkStart w:id="5" w:name="_Toc242786937"/>
       <w:r>
         <w:lastRenderedPageBreak/>
         <w:t>4. Servicios externos</w:t>
@@ -6706,7 +6772,7 @@
       <w:pPr>
         <w:pStyle w:val="Heading2"/>
       </w:pPr>
-      <w:bookmarkStart w:id="6" w:name="_Toc242786077"/>
+      <w:bookmarkStart w:id="6" w:name="_Toc242786938"/>
       <w:r>
         <w:t>4.1 TikTok LIVE</w:t>
       </w:r>
@@ -7465,7 +7531,7 @@
       <w:pPr>
         <w:pStyle w:val="Heading2"/>
       </w:pPr>
-      <w:bookmarkStart w:id="7" w:name="_Toc242786078"/>
+      <w:bookmarkStart w:id="7" w:name="_Toc242786939"/>
       <w:r>
         <w:t>4.2 Euler Stream</w:t>
       </w:r>
@@ -8757,7 +8823,7 @@
       <w:pPr>
         <w:pStyle w:val="Heading2"/>
       </w:pPr>
-      <w:bookmarkStart w:id="8" w:name="_Toc242786079"/>
+      <w:bookmarkStart w:id="8" w:name="_Toc242786940"/>
       <w:r>
         <w:t>4.3 GitHub, GitHub Actions y GitHub Pages</w:t>
       </w:r>
@@ -8961,7 +9027,7 @@
       <w:pPr>
         <w:pStyle w:val="Heading2"/>
       </w:pPr>
-      <w:bookmarkStart w:id="9" w:name="_Toc242786080"/>
+      <w:bookmarkStart w:id="9" w:name="_Toc242786941"/>
       <w:r>
         <w:t>4.4 Google Fonts</w:t>
       </w:r>
@@ -8991,7 +9057,7 @@
       <w:pPr>
         <w:pStyle w:val="Heading2"/>
       </w:pPr>
-      <w:bookmarkStart w:id="10" w:name="_Toc242786081"/>
+      <w:bookmarkStart w:id="10" w:name="_Toc242786942"/>
       <w:r>
         <w:lastRenderedPageBreak/>
         <w:t>4.5 Supabase (cambios en vivo)</w:t>
@@ -9247,7 +9313,7 @@
         <w:pStyle w:val="Heading1"/>
         <w:pageBreakBefore/>
       </w:pPr>
-      <w:bookmarkStart w:id="11" w:name="_Toc242786082"/>
+      <w:bookmarkStart w:id="11" w:name="_Toc242786943"/>
       <w:r>
         <w:lastRenderedPageBreak/>
         <w:t>5. Estructura de archivos</w:t>
@@ -9369,6 +9435,17 @@
         <w:ind w:left="200" w:right="200"/>
       </w:pPr>
       <w:r>
+        <w:t>│   ├── batalla.html                widget batalla de regalos (tira y afloja)</w:t>
+      </w:r>
+    </w:p>
+    <w:p>
+      <w:pPr>
+        <w:keepLines/>
+        <w:shd w:val="clear" w:color="auto" w:fill="F2F2F2"/>
+        <w:spacing w:line="260" w:lineRule="auto"/>
+        <w:ind w:left="200" w:right="200"/>
+      </w:pPr>
+      <w:r>
         <w:rPr>
           <w:rFonts w:ascii="Consolas" w:eastAsia="Consolas" w:hAnsi="Consolas" w:cs="Consolas"/>
           <w:sz w:val="18"/>
@@ -9433,7 +9510,7 @@
           <w:sz w:val="18"/>
           <w:szCs w:val="18"/>
         </w:rPr>
-        <w:t>│   │   └── widgets/ruleta.css · meta.css · alertas.css · carrera.css</w:t>
+        <w:t>│   │   └── widgets/ruleta.css · meta.css · alertas.css · carrera.css · batalla.css</w:t>
       </w:r>
     </w:p>
     <w:p>
@@ -9519,7 +9596,7 @@
           <w:sz w:val="18"/>
           <w:szCs w:val="18"/>
         </w:rPr>
-        <w:t>│       ├── widgets/ruleta.js · meta.js · alertas.js · carrera.js</w:t>
+        <w:t>│       ├── widgets/ruleta.js · meta.js · alertas.js · carrera.js · batalla.js</w:t>
       </w:r>
     </w:p>
     <w:p>
@@ -9658,7 +9735,7 @@
           <w:sz w:val="18"/>
           <w:szCs w:val="18"/>
         </w:rPr>
-        <w:t>│           └── vistas/ruleta.js · metas.js · alertas.js · carrera.js · actividad.js · regalos.js · conexion.js</w:t>
+        <w:t>│           └── vistas/ruleta.js · metas.js · alertas.js · carrera.js · batalla.js · actividad.js · regalos.js · conexion.js</w:t>
       </w:r>
     </w:p>
     <w:p>
@@ -9812,7 +9889,7 @@
         <w:pStyle w:val="Heading1"/>
         <w:pageBreakBefore/>
       </w:pPr>
-      <w:bookmarkStart w:id="12" w:name="_Toc242786083"/>
+      <w:bookmarkStart w:id="12" w:name="_Toc242786944"/>
       <w:r>
         <w:lastRenderedPageBreak/>
         <w:t>6. Frontend: el módulo compartido comun.js</w:t>
@@ -9840,7 +9917,7 @@
       <w:pPr>
         <w:pStyle w:val="Heading2"/>
       </w:pPr>
-      <w:bookmarkStart w:id="13" w:name="_Toc242786084"/>
+      <w:bookmarkStart w:id="13" w:name="_Toc242786945"/>
       <w:r>
         <w:t>6.1 Configuración en la URL</w:t>
       </w:r>
@@ -10311,7 +10388,7 @@
       <w:pPr>
         <w:pStyle w:val="Heading2"/>
       </w:pPr>
-      <w:bookmarkStart w:id="14" w:name="_Toc242786085"/>
+      <w:bookmarkStart w:id="14" w:name="_Toc242786946"/>
       <w:r>
         <w:t>6.2 Eventos normalizados</w:t>
       </w:r>
@@ -11097,7 +11174,7 @@
       <w:pPr>
         <w:pStyle w:val="Heading2"/>
       </w:pPr>
-      <w:bookmarkStart w:id="15" w:name="_Toc242786086"/>
+      <w:bookmarkStart w:id="15" w:name="_Toc242786947"/>
       <w:r>
         <w:t>6.3 Rastreador de regalos (combos y regalos sueltos)</w:t>
       </w:r>
@@ -11827,7 +11904,7 @@
       <w:pPr>
         <w:pStyle w:val="Heading2"/>
       </w:pPr>
-      <w:bookmarkStart w:id="16" w:name="_Toc242786087"/>
+      <w:bookmarkStart w:id="16" w:name="_Toc242786948"/>
       <w:r>
         <w:t>6.4 Conexión con TikTok (conectarTikTok)</w:t>
       </w:r>
@@ -11948,7 +12025,7 @@
       <w:pPr>
         <w:pStyle w:val="Heading2"/>
       </w:pPr>
-      <w:bookmarkStart w:id="17" w:name="_Toc242786088"/>
+      <w:bookmarkStart w:id="17" w:name="_Toc242786949"/>
       <w:r>
         <w:t>6.5 Arranque de widgets (iniciarWidget)</w:t>
       </w:r>
@@ -12174,7 +12251,7 @@
       <w:pPr>
         <w:pStyle w:val="Heading2"/>
       </w:pPr>
-      <w:bookmarkStart w:id="18" w:name="_Toc242786089"/>
+      <w:bookmarkStart w:id="18" w:name="_Toc242786950"/>
       <w:r>
         <w:t>6.6 Utilidades</w:t>
       </w:r>
@@ -12240,7 +12317,7 @@
       <w:pPr>
         <w:pStyle w:val="Heading2"/>
       </w:pPr>
-      <w:bookmarkStart w:id="19" w:name="_Toc242786090"/>
+      <w:bookmarkStart w:id="19" w:name="_Toc242786951"/>
       <w:r>
         <w:lastRenderedPageBreak/>
         <w:t>6.7 Cambios en vivo (nube.js)</w:t>
@@ -12320,7 +12397,7 @@
         <w:pStyle w:val="Heading1"/>
         <w:pageBreakBefore/>
       </w:pPr>
-      <w:bookmarkStart w:id="20" w:name="_Toc242786091"/>
+      <w:bookmarkStart w:id="20" w:name="_Toc242786952"/>
       <w:r>
         <w:lastRenderedPageBreak/>
         <w:t>7. Frontend: los widgets</w:t>
@@ -12363,7 +12440,7 @@
       <w:pPr>
         <w:pStyle w:val="Heading2"/>
       </w:pPr>
-      <w:bookmarkStart w:id="21" w:name="_Toc242786092"/>
+      <w:bookmarkStart w:id="21" w:name="_Toc242786953"/>
       <w:r>
         <w:t>7.1 Ruleta de regalos (ruleta.html)</w:t>
       </w:r>
@@ -13458,7 +13535,7 @@
       <w:pPr>
         <w:pStyle w:val="Heading2"/>
       </w:pPr>
-      <w:bookmarkStart w:id="22" w:name="_Toc242786093"/>
+      <w:bookmarkStart w:id="22" w:name="_Toc242786954"/>
       <w:r>
         <w:t>7.2 Meta (meta.html)</w:t>
       </w:r>
@@ -14068,7 +14145,7 @@
       <w:pPr>
         <w:pStyle w:val="Heading2"/>
       </w:pPr>
-      <w:bookmarkStart w:id="23" w:name="_Toc242786094"/>
+      <w:bookmarkStart w:id="23" w:name="_Toc242786955"/>
       <w:r>
         <w:t>7.3 Alertas (alertas.html)</w:t>
       </w:r>
@@ -14435,7 +14512,7 @@
       <w:pPr>
         <w:pStyle w:val="Heading2"/>
       </w:pPr>
-      <w:bookmarkStart w:id="24" w:name="_Toc242786095"/>
+      <w:bookmarkStart w:id="24" w:name="_Toc242786956"/>
       <w:r>
         <w:t>7.4 Carrera de regalos (carrera.html)</w:t>
       </w:r>
@@ -15811,25 +15888,681 @@
     </w:p>
     <w:p>
       <w:pPr>
+        <w:pStyle w:val="Heading2"/>
+      </w:pPr>
+      <w:bookmarkStart w:id="25" w:name="_Toc242786957"/>
+      <w:r>
+        <w:t>7.5 Batalla de regalos (batalla.html)</w:t>
+      </w:r>
+      <w:bookmarkEnd w:id="25"/>
+    </w:p>
+    <w:p>
+      <w:pPr>
+        <w:spacing w:after="120"/>
+      </w:pPr>
+      <w:r>
+        <w:t>Un tira y afloja entre dos equipos, en una placa de cristal horizontal (fuente de OBS de 1600 × 300, arriba de la escena). Cada equipo tiene su regalo: los regalos de un equipo empujan la barra central hacia su lado. La barra empieza en 50 % (empate) y muestra qué parte del total de monedas lleva cada equipo.</w:t>
+      </w:r>
+    </w:p>
+    <w:p>
+      <w:pPr>
+        <w:pStyle w:val="Heading3"/>
+      </w:pPr>
+      <w:r>
+        <w:t>Estructura</w:t>
+      </w:r>
+    </w:p>
+    <w:p>
+      <w:pPr>
+        <w:spacing w:after="120"/>
+      </w:pPr>
+      <w:r>
+        <w:t>Tres columnas: el equipo A a la izquierda (avatar, nombre y puntos), la barra en el centro y el equipo B a la derecha, en espejo. La barra es del color de B y el relleno de A (</w:t>
+      </w:r>
+      <w:r>
+        <w:rPr>
+          <w:rFonts w:ascii="Consolas" w:eastAsia="Consolas" w:hAnsi="Consolas" w:cs="Consolas"/>
+          <w:color w:val="7A1F33"/>
+          <w:sz w:val="19"/>
+          <w:szCs w:val="19"/>
+        </w:rPr>
+        <w:t>#lado-a</w:t>
+      </w:r>
+      <w:r>
+        <w:t xml:space="preserve">) avanza desde la izquierda; </w:t>
+      </w:r>
+      <w:r>
+        <w:lastRenderedPageBreak/>
+        <w:t>donde se encuentran está el frente (</w:t>
+      </w:r>
+      <w:r>
+        <w:rPr>
+          <w:rFonts w:ascii="Consolas" w:eastAsia="Consolas" w:hAnsi="Consolas" w:cs="Consolas"/>
+          <w:color w:val="7A1F33"/>
+          <w:sz w:val="19"/>
+          <w:szCs w:val="19"/>
+        </w:rPr>
+        <w:t>#frente</w:t>
+      </w:r>
+      <w:r>
+        <w:t xml:space="preserve">), una cuchilla de oro metálico con la clase </w:t>
+      </w:r>
+      <w:r>
+        <w:rPr>
+          <w:rFonts w:ascii="Consolas" w:eastAsia="Consolas" w:hAnsi="Consolas" w:cs="Consolas"/>
+          <w:color w:val="7A1F33"/>
+          <w:sz w:val="19"/>
+          <w:szCs w:val="19"/>
+        </w:rPr>
+        <w:t>.filo-oro</w:t>
+      </w:r>
+      <w:r>
+        <w:t>. Una marca fina fija señala el 50 %. Debajo, un aviso dice quién va ganando y por cuánto. El avatar es la foto del equipo si se puso una; si no, la imagen del regalo (si está en el Buscador de regalos); si no, la inicial del nombre. Con foto, el regalo aparece como insignia en la esquina.</w:t>
+      </w:r>
+    </w:p>
+    <w:p>
+      <w:pPr>
+        <w:pStyle w:val="Heading3"/>
+      </w:pPr>
+      <w:r>
+        <w:t>Configuración</w:t>
+      </w:r>
+    </w:p>
+    <w:tbl>
+      <w:tblPr>
+        <w:tblW w:w="9360" w:type="dxa"/>
+        <w:tblBorders>
+          <w:top w:val="single" w:sz="4" w:space="0" w:color="auto"/>
+          <w:left w:val="single" w:sz="4" w:space="0" w:color="auto"/>
+          <w:bottom w:val="single" w:sz="4" w:space="0" w:color="auto"/>
+          <w:right w:val="single" w:sz="4" w:space="0" w:color="auto"/>
+          <w:insideH w:val="single" w:sz="4" w:space="0" w:color="auto"/>
+          <w:insideV w:val="single" w:sz="4" w:space="0" w:color="auto"/>
+        </w:tblBorders>
+        <w:tblLook w:val="04A0" w:firstRow="1" w:lastRow="0" w:firstColumn="1" w:lastColumn="0" w:noHBand="0" w:noVBand="1"/>
+      </w:tblPr>
+      <w:tblGrid>
+        <w:gridCol w:w="1497"/>
+        <w:gridCol w:w="7863"/>
+      </w:tblGrid>
+      <w:tr>
+        <w:trPr>
+          <w:tblHeader/>
+        </w:trPr>
+        <w:tc>
+          <w:tcPr>
+            <w:tcW w:w="1497" w:type="dxa"/>
+            <w:tcBorders>
+              <w:top w:val="single" w:sz="4" w:space="0" w:color="BFBFBF"/>
+              <w:left w:val="single" w:sz="4" w:space="0" w:color="BFBFBF"/>
+              <w:bottom w:val="single" w:sz="4" w:space="0" w:color="BFBFBF"/>
+              <w:right w:val="single" w:sz="4" w:space="0" w:color="BFBFBF"/>
+            </w:tcBorders>
+            <w:shd w:val="clear" w:color="auto" w:fill="1F4E79"/>
+            <w:tcMar>
+              <w:top w:w="60" w:type="dxa"/>
+              <w:left w:w="100" w:type="dxa"/>
+              <w:bottom w:w="60" w:type="dxa"/>
+              <w:right w:w="100" w:type="dxa"/>
+            </w:tcMar>
+          </w:tcPr>
+          <w:p>
+            <w:pPr>
+              <w:spacing w:after="20"/>
+            </w:pPr>
+            <w:r>
+              <w:rPr>
+                <w:b/>
+                <w:bCs/>
+                <w:color w:val="FFFFFF"/>
+              </w:rPr>
+              <w:t>Clave</w:t>
+            </w:r>
+          </w:p>
+        </w:tc>
+        <w:tc>
+          <w:tcPr>
+            <w:tcW w:w="7863" w:type="dxa"/>
+            <w:tcBorders>
+              <w:top w:val="single" w:sz="4" w:space="0" w:color="BFBFBF"/>
+              <w:left w:val="single" w:sz="4" w:space="0" w:color="BFBFBF"/>
+              <w:bottom w:val="single" w:sz="4" w:space="0" w:color="BFBFBF"/>
+              <w:right w:val="single" w:sz="4" w:space="0" w:color="BFBFBF"/>
+            </w:tcBorders>
+            <w:shd w:val="clear" w:color="auto" w:fill="1F4E79"/>
+            <w:tcMar>
+              <w:top w:w="60" w:type="dxa"/>
+              <w:left w:w="100" w:type="dxa"/>
+              <w:bottom w:w="60" w:type="dxa"/>
+              <w:right w:w="100" w:type="dxa"/>
+            </w:tcMar>
+          </w:tcPr>
+          <w:p>
+            <w:pPr>
+              <w:spacing w:after="20"/>
+            </w:pPr>
+            <w:r>
+              <w:rPr>
+                <w:b/>
+                <w:bCs/>
+                <w:color w:val="FFFFFF"/>
+              </w:rPr>
+              <w:t>Significado</w:t>
+            </w:r>
+          </w:p>
+        </w:tc>
+      </w:tr>
+      <w:tr>
+        <w:tc>
+          <w:tcPr>
+            <w:tcW w:w="1497" w:type="dxa"/>
+            <w:tcBorders>
+              <w:top w:val="single" w:sz="4" w:space="0" w:color="BFBFBF"/>
+              <w:left w:val="single" w:sz="4" w:space="0" w:color="BFBFBF"/>
+              <w:bottom w:val="single" w:sz="4" w:space="0" w:color="BFBFBF"/>
+              <w:right w:val="single" w:sz="4" w:space="0" w:color="BFBFBF"/>
+            </w:tcBorders>
+            <w:tcMar>
+              <w:top w:w="60" w:type="dxa"/>
+              <w:left w:w="100" w:type="dxa"/>
+              <w:bottom w:w="60" w:type="dxa"/>
+              <w:right w:w="100" w:type="dxa"/>
+            </w:tcMar>
+          </w:tcPr>
+          <w:p>
+            <w:pPr>
+              <w:spacing w:after="20"/>
+            </w:pPr>
+            <w:r>
+              <w:rPr>
+                <w:rFonts w:ascii="Consolas" w:eastAsia="Consolas" w:hAnsi="Consolas" w:cs="Consolas"/>
+                <w:color w:val="7A1F33"/>
+                <w:sz w:val="19"/>
+                <w:szCs w:val="19"/>
+              </w:rPr>
+              <w:t>u, k, w</w:t>
+            </w:r>
+          </w:p>
+        </w:tc>
+        <w:tc>
+          <w:tcPr>
+            <w:tcW w:w="7863" w:type="dxa"/>
+            <w:tcBorders>
+              <w:top w:val="single" w:sz="4" w:space="0" w:color="BFBFBF"/>
+              <w:left w:val="single" w:sz="4" w:space="0" w:color="BFBFBF"/>
+              <w:bottom w:val="single" w:sz="4" w:space="0" w:color="BFBFBF"/>
+              <w:right w:val="single" w:sz="4" w:space="0" w:color="BFBFBF"/>
+            </w:tcBorders>
+            <w:tcMar>
+              <w:top w:w="60" w:type="dxa"/>
+              <w:left w:w="100" w:type="dxa"/>
+              <w:bottom w:w="60" w:type="dxa"/>
+              <w:right w:w="100" w:type="dxa"/>
+            </w:tcMar>
+          </w:tcPr>
+          <w:p>
+            <w:pPr>
+              <w:spacing w:after="20"/>
+            </w:pPr>
+            <w:r>
+              <w:t>Usuario de TikTok, API key e identificador del widget (van siempre en la URL)</w:t>
+            </w:r>
+          </w:p>
+        </w:tc>
+      </w:tr>
+      <w:tr>
+        <w:tc>
+          <w:tcPr>
+            <w:tcW w:w="1497" w:type="dxa"/>
+            <w:tcBorders>
+              <w:top w:val="single" w:sz="4" w:space="0" w:color="BFBFBF"/>
+              <w:left w:val="single" w:sz="4" w:space="0" w:color="BFBFBF"/>
+              <w:bottom w:val="single" w:sz="4" w:space="0" w:color="BFBFBF"/>
+              <w:right w:val="single" w:sz="4" w:space="0" w:color="BFBFBF"/>
+            </w:tcBorders>
+            <w:tcMar>
+              <w:top w:w="60" w:type="dxa"/>
+              <w:left w:w="100" w:type="dxa"/>
+              <w:bottom w:w="60" w:type="dxa"/>
+              <w:right w:w="100" w:type="dxa"/>
+            </w:tcMar>
+          </w:tcPr>
+          <w:p>
+            <w:pPr>
+              <w:spacing w:after="20"/>
+            </w:pPr>
+            <w:r>
+              <w:rPr>
+                <w:rFonts w:ascii="Consolas" w:eastAsia="Consolas" w:hAnsi="Consolas" w:cs="Consolas"/>
+                <w:color w:val="7A1F33"/>
+                <w:sz w:val="19"/>
+                <w:szCs w:val="19"/>
+              </w:rPr>
+              <w:t>a, b</w:t>
+            </w:r>
+          </w:p>
+        </w:tc>
+        <w:tc>
+          <w:tcPr>
+            <w:tcW w:w="7863" w:type="dxa"/>
+            <w:tcBorders>
+              <w:top w:val="single" w:sz="4" w:space="0" w:color="BFBFBF"/>
+              <w:left w:val="single" w:sz="4" w:space="0" w:color="BFBFBF"/>
+              <w:bottom w:val="single" w:sz="4" w:space="0" w:color="BFBFBF"/>
+              <w:right w:val="single" w:sz="4" w:space="0" w:color="BFBFBF"/>
+            </w:tcBorders>
+            <w:tcMar>
+              <w:top w:w="60" w:type="dxa"/>
+              <w:left w:w="100" w:type="dxa"/>
+              <w:bottom w:w="60" w:type="dxa"/>
+              <w:right w:w="100" w:type="dxa"/>
+            </w:tcMar>
+          </w:tcPr>
+          <w:p>
+            <w:pPr>
+              <w:spacing w:after="20"/>
+            </w:pPr>
+            <w:r>
+              <w:t xml:space="preserve">Equipos: </w:t>
+            </w:r>
+            <w:r>
+              <w:rPr>
+                <w:rFonts w:ascii="Consolas" w:eastAsia="Consolas" w:hAnsi="Consolas" w:cs="Consolas"/>
+                <w:color w:val="7A1F33"/>
+                <w:sz w:val="19"/>
+                <w:szCs w:val="19"/>
+              </w:rPr>
+              <w:t>{ n, g, v, c, av, img }</w:t>
+            </w:r>
+            <w:r>
+              <w:t xml:space="preserve"> = nombre, ID del regalo, monedas por regalo (si TikTok no manda el precio), color, foto (solo direcciones http o https) e imagen del regalo (sale del Buscador de regalos)</w:t>
+            </w:r>
+          </w:p>
+        </w:tc>
+      </w:tr>
+      <w:tr>
+        <w:tc>
+          <w:tcPr>
+            <w:tcW w:w="1497" w:type="dxa"/>
+            <w:tcBorders>
+              <w:top w:val="single" w:sz="4" w:space="0" w:color="BFBFBF"/>
+              <w:left w:val="single" w:sz="4" w:space="0" w:color="BFBFBF"/>
+              <w:bottom w:val="single" w:sz="4" w:space="0" w:color="BFBFBF"/>
+              <w:right w:val="single" w:sz="4" w:space="0" w:color="BFBFBF"/>
+            </w:tcBorders>
+            <w:tcMar>
+              <w:top w:w="60" w:type="dxa"/>
+              <w:left w:w="100" w:type="dxa"/>
+              <w:bottom w:w="60" w:type="dxa"/>
+              <w:right w:w="100" w:type="dxa"/>
+            </w:tcMar>
+          </w:tcPr>
+          <w:p>
+            <w:pPr>
+              <w:spacing w:after="20"/>
+            </w:pPr>
+            <w:r>
+              <w:rPr>
+                <w:rFonts w:ascii="Consolas" w:eastAsia="Consolas" w:hAnsi="Consolas" w:cs="Consolas"/>
+                <w:color w:val="7A1F33"/>
+                <w:sz w:val="19"/>
+                <w:szCs w:val="19"/>
+              </w:rPr>
+              <w:t>ro</w:t>
+            </w:r>
+          </w:p>
+        </w:tc>
+        <w:tc>
+          <w:tcPr>
+            <w:tcW w:w="7863" w:type="dxa"/>
+            <w:tcBorders>
+              <w:top w:val="single" w:sz="4" w:space="0" w:color="BFBFBF"/>
+              <w:left w:val="single" w:sz="4" w:space="0" w:color="BFBFBF"/>
+              <w:bottom w:val="single" w:sz="4" w:space="0" w:color="BFBFBF"/>
+              <w:right w:val="single" w:sz="4" w:space="0" w:color="BFBFBF"/>
+            </w:tcBorders>
+            <w:tcMar>
+              <w:top w:w="60" w:type="dxa"/>
+              <w:left w:w="100" w:type="dxa"/>
+              <w:bottom w:w="60" w:type="dxa"/>
+              <w:right w:w="100" w:type="dxa"/>
+            </w:tcMar>
+          </w:tcPr>
+          <w:p>
+            <w:pPr>
+              <w:spacing w:after="20"/>
+            </w:pPr>
+            <w:r>
+              <w:t>Ronda: un número que cambia con el botón Reiniciar batalla. Cuando cambia, los puntos vuelven a 0</w:t>
+            </w:r>
+          </w:p>
+        </w:tc>
+      </w:tr>
+      <w:tr>
+        <w:tc>
+          <w:tcPr>
+            <w:tcW w:w="1497" w:type="dxa"/>
+            <w:tcBorders>
+              <w:top w:val="single" w:sz="4" w:space="0" w:color="BFBFBF"/>
+              <w:left w:val="single" w:sz="4" w:space="0" w:color="BFBFBF"/>
+              <w:bottom w:val="single" w:sz="4" w:space="0" w:color="BFBFBF"/>
+              <w:right w:val="single" w:sz="4" w:space="0" w:color="BFBFBF"/>
+            </w:tcBorders>
+            <w:tcMar>
+              <w:top w:w="60" w:type="dxa"/>
+              <w:left w:w="100" w:type="dxa"/>
+              <w:bottom w:w="60" w:type="dxa"/>
+              <w:right w:w="100" w:type="dxa"/>
+            </w:tcMar>
+          </w:tcPr>
+          <w:p>
+            <w:pPr>
+              <w:spacing w:after="20"/>
+            </w:pPr>
+            <w:r>
+              <w:rPr>
+                <w:rFonts w:ascii="Consolas" w:eastAsia="Consolas" w:hAnsi="Consolas" w:cs="Consolas"/>
+                <w:color w:val="7A1F33"/>
+                <w:sz w:val="19"/>
+                <w:szCs w:val="19"/>
+              </w:rPr>
+              <w:t>s</w:t>
+            </w:r>
+          </w:p>
+        </w:tc>
+        <w:tc>
+          <w:tcPr>
+            <w:tcW w:w="7863" w:type="dxa"/>
+            <w:tcBorders>
+              <w:top w:val="single" w:sz="4" w:space="0" w:color="BFBFBF"/>
+              <w:left w:val="single" w:sz="4" w:space="0" w:color="BFBFBF"/>
+              <w:bottom w:val="single" w:sz="4" w:space="0" w:color="BFBFBF"/>
+              <w:right w:val="single" w:sz="4" w:space="0" w:color="BFBFBF"/>
+            </w:tcBorders>
+            <w:tcMar>
+              <w:top w:w="60" w:type="dxa"/>
+              <w:left w:w="100" w:type="dxa"/>
+              <w:bottom w:w="60" w:type="dxa"/>
+              <w:right w:w="100" w:type="dxa"/>
+            </w:tcMar>
+          </w:tcPr>
+          <w:p>
+            <w:pPr>
+              <w:spacing w:after="20"/>
+            </w:pPr>
+            <w:r>
+              <w:t>Sonido (1 o 0) cuando cambia quién va ganando</w:t>
+            </w:r>
+          </w:p>
+        </w:tc>
+      </w:tr>
+      <w:tr>
+        <w:tc>
+          <w:tcPr>
+            <w:tcW w:w="1497" w:type="dxa"/>
+            <w:tcBorders>
+              <w:top w:val="single" w:sz="4" w:space="0" w:color="BFBFBF"/>
+              <w:left w:val="single" w:sz="4" w:space="0" w:color="BFBFBF"/>
+              <w:bottom w:val="single" w:sz="4" w:space="0" w:color="BFBFBF"/>
+              <w:right w:val="single" w:sz="4" w:space="0" w:color="BFBFBF"/>
+            </w:tcBorders>
+            <w:tcMar>
+              <w:top w:w="60" w:type="dxa"/>
+              <w:left w:w="100" w:type="dxa"/>
+              <w:bottom w:w="60" w:type="dxa"/>
+              <w:right w:w="100" w:type="dxa"/>
+            </w:tcMar>
+          </w:tcPr>
+          <w:p>
+            <w:pPr>
+              <w:spacing w:after="20"/>
+            </w:pPr>
+            <w:r>
+              <w:rPr>
+                <w:rFonts w:ascii="Consolas" w:eastAsia="Consolas" w:hAnsi="Consolas" w:cs="Consolas"/>
+                <w:color w:val="7A1F33"/>
+                <w:sz w:val="19"/>
+                <w:szCs w:val="19"/>
+              </w:rPr>
+              <w:t>est</w:t>
+            </w:r>
+          </w:p>
+        </w:tc>
+        <w:tc>
+          <w:tcPr>
+            <w:tcW w:w="7863" w:type="dxa"/>
+            <w:tcBorders>
+              <w:top w:val="single" w:sz="4" w:space="0" w:color="BFBFBF"/>
+              <w:left w:val="single" w:sz="4" w:space="0" w:color="BFBFBF"/>
+              <w:bottom w:val="single" w:sz="4" w:space="0" w:color="BFBFBF"/>
+              <w:right w:val="single" w:sz="4" w:space="0" w:color="BFBFBF"/>
+            </w:tcBorders>
+            <w:tcMar>
+              <w:top w:w="60" w:type="dxa"/>
+              <w:left w:w="100" w:type="dxa"/>
+              <w:bottom w:w="60" w:type="dxa"/>
+              <w:right w:w="100" w:type="dxa"/>
+            </w:tcMar>
+          </w:tcPr>
+          <w:p>
+            <w:pPr>
+              <w:spacing w:after="20"/>
+            </w:pPr>
+            <w:r>
+              <w:t>Estilo visual (lo aplica comun.js, igual que en los demás widgets)</w:t>
+            </w:r>
+          </w:p>
+        </w:tc>
+      </w:tr>
+    </w:tbl>
+    <w:p>
+      <w:pPr>
+        <w:spacing w:after="120"/>
+      </w:pPr>
+    </w:p>
+    <w:p>
+      <w:pPr>
+        <w:pStyle w:val="Heading3"/>
+      </w:pPr>
+      <w:r>
+        <w:t>Funcionamiento</w:t>
+      </w:r>
+    </w:p>
+    <w:p>
+      <w:pPr>
+        <w:pStyle w:val="ListParagraph"/>
+        <w:numPr>
+          <w:ilvl w:val="0"/>
+          <w:numId w:val="3"/>
+        </w:numPr>
+        <w:spacing w:after="60"/>
+      </w:pPr>
+      <w:r>
+        <w:t xml:space="preserve">Al llegar un evento </w:t>
+      </w:r>
+      <w:r>
+        <w:rPr>
+          <w:rFonts w:ascii="Consolas" w:eastAsia="Consolas" w:hAnsi="Consolas" w:cs="Consolas"/>
+          <w:color w:val="7A1F33"/>
+          <w:sz w:val="19"/>
+          <w:szCs w:val="19"/>
+        </w:rPr>
+        <w:t>regalo</w:t>
+      </w:r>
+      <w:r>
+        <w:t xml:space="preserve">, busca el equipo cuyo </w:t>
+      </w:r>
+      <w:r>
+        <w:rPr>
+          <w:rFonts w:ascii="Consolas" w:eastAsia="Consolas" w:hAnsi="Consolas" w:cs="Consolas"/>
+          <w:color w:val="7A1F33"/>
+          <w:sz w:val="19"/>
+          <w:szCs w:val="19"/>
+        </w:rPr>
+        <w:t>giftId</w:t>
+      </w:r>
+      <w:r>
+        <w:t xml:space="preserve"> coincide (el ID se compara como texto: TikTok a veces lo manda como número). Si ninguno coincide, el regalo no cuenta.</w:t>
+      </w:r>
+    </w:p>
+    <w:p>
+      <w:pPr>
+        <w:pStyle w:val="ListParagraph"/>
+        <w:numPr>
+          <w:ilvl w:val="0"/>
+          <w:numId w:val="3"/>
+        </w:numPr>
+        <w:spacing w:after="60"/>
+      </w:pPr>
+      <w:r>
+        <w:t xml:space="preserve">Suma </w:t>
+      </w:r>
+      <w:r>
+        <w:rPr>
+          <w:rFonts w:ascii="Consolas" w:eastAsia="Consolas" w:hAnsi="Consolas" w:cs="Consolas"/>
+          <w:color w:val="7A1F33"/>
+          <w:sz w:val="19"/>
+          <w:szCs w:val="19"/>
+        </w:rPr>
+        <w:t>diamantes × cantidad</w:t>
+      </w:r>
+      <w:r>
+        <w:t>; si el precio llega en 0, usa las monedas por regalo del equipo (</w:t>
+      </w:r>
+      <w:r>
+        <w:rPr>
+          <w:rFonts w:ascii="Consolas" w:eastAsia="Consolas" w:hAnsi="Consolas" w:cs="Consolas"/>
+          <w:color w:val="7A1F33"/>
+          <w:sz w:val="19"/>
+          <w:szCs w:val="19"/>
+        </w:rPr>
+        <w:t>v</w:t>
+      </w:r>
+      <w:r>
+        <w:t>).</w:t>
+      </w:r>
+    </w:p>
+    <w:p>
+      <w:pPr>
+        <w:pStyle w:val="ListParagraph"/>
+        <w:numPr>
+          <w:ilvl w:val="0"/>
+          <w:numId w:val="3"/>
+        </w:numPr>
+        <w:spacing w:after="60"/>
+      </w:pPr>
+      <w:r>
+        <w:t xml:space="preserve">La parte del equipo A es </w:t>
+      </w:r>
+      <w:r>
+        <w:rPr>
+          <w:rFonts w:ascii="Consolas" w:eastAsia="Consolas" w:hAnsi="Consolas" w:cs="Consolas"/>
+          <w:color w:val="7A1F33"/>
+          <w:sz w:val="19"/>
+          <w:szCs w:val="19"/>
+        </w:rPr>
+        <w:t>A / (A + B)</w:t>
+      </w:r>
+      <w:r>
+        <w:t xml:space="preserve"> (50 % sin puntos). En pantalla la barra queda entre 4 % y 96 % para que los dos lados se vean siempre; el porcentaje escrito sí es el real (con “&lt;1%” en vez de “0%” si el equipo tiene puntos), y la etiqueta de un lado muy angosto se oculta para que el frente no la tape.</w:t>
+      </w:r>
+    </w:p>
+    <w:p>
+      <w:pPr>
+        <w:pStyle w:val="ListParagraph"/>
+        <w:numPr>
+          <w:ilvl w:val="0"/>
+          <w:numId w:val="3"/>
+        </w:numPr>
+        <w:spacing w:after="60"/>
+      </w:pPr>
+      <w:r>
+        <w:t xml:space="preserve">El relleno y el frente se mueven con </w:t>
+      </w:r>
+      <w:r>
+        <w:rPr>
+          <w:rFonts w:ascii="Consolas" w:eastAsia="Consolas" w:hAnsi="Consolas" w:cs="Consolas"/>
+          <w:color w:val="7A1F33"/>
+          <w:sz w:val="19"/>
+          <w:szCs w:val="19"/>
+        </w:rPr>
+        <w:t>transition: .3s ease</w:t>
+      </w:r>
+      <w:r>
+        <w:t>; los números suben poco a poco y aparece un “+25” sobre el equipo que recibió el regalo. El avatar del equipo que va ganando brilla más.</w:t>
+      </w:r>
+    </w:p>
+    <w:p>
+      <w:pPr>
+        <w:pStyle w:val="ListParagraph"/>
+        <w:numPr>
+          <w:ilvl w:val="0"/>
+          <w:numId w:val="3"/>
+        </w:numPr>
+        <w:spacing w:after="60"/>
+      </w:pPr>
+      <w:r>
+        <w:t>El sonido suena solo cuando cambia quién va ganando: una lluvia de rosas no suena cada vez.</w:t>
+      </w:r>
+    </w:p>
+    <w:p>
+      <w:pPr>
+        <w:pStyle w:val="ListParagraph"/>
+        <w:numPr>
+          <w:ilvl w:val="0"/>
+          <w:numId w:val="3"/>
+        </w:numPr>
+        <w:spacing w:after="60"/>
+      </w:pPr>
+      <w:r>
+        <w:t>Los puntos se guardan en el navegador de OBS (</w:t>
+      </w:r>
+      <w:r>
+        <w:rPr>
+          <w:rFonts w:ascii="Consolas" w:eastAsia="Consolas" w:hAnsi="Consolas" w:cs="Consolas"/>
+          <w:color w:val="7A1F33"/>
+          <w:sz w:val="19"/>
+          <w:szCs w:val="19"/>
+        </w:rPr>
+        <w:t>localStorage</w:t>
+      </w:r>
+      <w:r>
+        <w:t xml:space="preserve">, clave </w:t>
+      </w:r>
+      <w:r>
+        <w:rPr>
+          <w:rFonts w:ascii="Consolas" w:eastAsia="Consolas" w:hAnsi="Consolas" w:cs="Consolas"/>
+          <w:color w:val="7A1F33"/>
+          <w:sz w:val="19"/>
+          <w:szCs w:val="19"/>
+        </w:rPr>
+        <w:t>live-tools:batalla:&lt;w&gt;</w:t>
+      </w:r>
+      <w:r>
+        <w:t>) junto con la ronda: si OBS recarga la fuente, la batalla sigue donde iba.</w:t>
+      </w:r>
+    </w:p>
+    <w:p>
+      <w:pPr>
         <w:pStyle w:val="Heading1"/>
         <w:pageBreakBefore/>
       </w:pPr>
-      <w:bookmarkStart w:id="25" w:name="_Toc242786096"/>
+      <w:bookmarkStart w:id="26" w:name="_Toc242786958"/>
       <w:r>
         <w:lastRenderedPageBreak/>
         <w:t>8. Frontend: el panel</w:t>
       </w:r>
-      <w:bookmarkEnd w:id="25"/>
+      <w:bookmarkEnd w:id="26"/>
     </w:p>
     <w:p>
       <w:pPr>
         <w:pStyle w:val="Heading2"/>
       </w:pPr>
-      <w:bookmarkStart w:id="26" w:name="_Toc242786097"/>
+      <w:bookmarkStart w:id="27" w:name="_Toc242786959"/>
       <w:r>
         <w:t>8.1 Estructura de la página (index.html)</w:t>
       </w:r>
-      <w:bookmarkEnd w:id="26"/>
+      <w:bookmarkEnd w:id="27"/>
     </w:p>
     <w:p>
       <w:pPr>
@@ -16318,11 +17051,11 @@
       <w:pPr>
         <w:pStyle w:val="Heading2"/>
       </w:pPr>
-      <w:bookmarkStart w:id="27" w:name="_Toc242786098"/>
+      <w:bookmarkStart w:id="28" w:name="_Toc242786960"/>
       <w:r>
         <w:t>8.2 Navegación y ciclo de vida (app.js)</w:t>
       </w:r>
-      <w:bookmarkEnd w:id="27"/>
+      <w:bookmarkEnd w:id="28"/>
     </w:p>
     <w:p>
       <w:pPr>
@@ -16499,11 +17232,11 @@
       <w:pPr>
         <w:pStyle w:val="Heading2"/>
       </w:pPr>
-      <w:bookmarkStart w:id="28" w:name="_Toc242786099"/>
+      <w:bookmarkStart w:id="29" w:name="_Toc242786961"/>
       <w:r>
         <w:t>8.3 Mapa del panel (registro.js)</w:t>
       </w:r>
-      <w:bookmarkEnd w:id="28"/>
+      <w:bookmarkEnd w:id="29"/>
     </w:p>
     <w:p>
       <w:pPr>
@@ -17005,7 +17738,7 @@
               <w:spacing w:after="20"/>
             </w:pPr>
             <w:r>
-              <w:t>Carrera de regalos (carrera)</w:t>
+              <w:t>Carrera de regalos (carrera), Batalla de regalos (batalla)</w:t>
             </w:r>
           </w:p>
         </w:tc>
@@ -17284,11 +18017,11 @@
       <w:pPr>
         <w:pStyle w:val="Heading2"/>
       </w:pPr>
-      <w:bookmarkStart w:id="29" w:name="_Toc242786100"/>
+      <w:bookmarkStart w:id="30" w:name="_Toc242786962"/>
       <w:r>
         <w:t>8.4 Datos guardados (almacen.js)</w:t>
       </w:r>
-      <w:bookmarkEnd w:id="29"/>
+      <w:bookmarkEnd w:id="30"/>
     </w:p>
     <w:p>
       <w:pPr>
@@ -18083,11 +18816,11 @@
       <w:pPr>
         <w:pStyle w:val="Heading2"/>
       </w:pPr>
-      <w:bookmarkStart w:id="30" w:name="_Toc242786101"/>
+      <w:bookmarkStart w:id="31" w:name="_Toc242786963"/>
       <w:r>
         <w:t>8.5 Conexión del panel al LIVE (envivo.js)</w:t>
       </w:r>
-      <w:bookmarkEnd w:id="30"/>
+      <w:bookmarkEnd w:id="31"/>
     </w:p>
     <w:p>
       <w:pPr>
@@ -18148,12 +18881,12 @@
       <w:pPr>
         <w:pStyle w:val="Heading2"/>
       </w:pPr>
-      <w:bookmarkStart w:id="31" w:name="_Toc242786102"/>
+      <w:bookmarkStart w:id="32" w:name="_Toc242786964"/>
       <w:r>
         <w:lastRenderedPageBreak/>
         <w:t>8.6 Componentes de interfaz (ui.js)</w:t>
       </w:r>
-      <w:bookmarkEnd w:id="31"/>
+      <w:bookmarkEnd w:id="32"/>
     </w:p>
     <w:tbl>
       <w:tblPr>
@@ -18657,11 +19390,11 @@
       <w:pPr>
         <w:pStyle w:val="Heading2"/>
       </w:pPr>
-      <w:bookmarkStart w:id="32" w:name="_Toc242786103"/>
+      <w:bookmarkStart w:id="33" w:name="_Toc242786965"/>
       <w:r>
         <w:t>8.7 Las vistas</w:t>
       </w:r>
-      <w:bookmarkEnd w:id="32"/>
+      <w:bookmarkEnd w:id="33"/>
     </w:p>
     <w:p>
       <w:pPr>
@@ -18729,6 +19462,22 @@
       <w:r>
         <w:lastRenderedPageBreak/>
         <w:t>dos con el mismo regalo se avisan en rojo, pero no bloquean el envío: si bloquearan, el reloj tampoco llegaría a OBS.</w:t>
+      </w:r>
+    </w:p>
+    <w:p>
+      <w:pPr>
+        <w:pStyle w:val="Heading3"/>
+      </w:pPr>
+      <w:r>
+        <w:t>Batalla de regalos</w:t>
+      </w:r>
+    </w:p>
+    <w:p>
+      <w:pPr>
+        <w:spacing w:after="120"/>
+      </w:pPr>
+      <w:r>
+        <w:t>La tarjeta del widget tiene, en Personalizar, el sonido y el estilo visual; sus pruebas son “Regalo al equipo A”, “Regalo al equipo B” y combos de 10 para cada uno. La tarjeta Batalla tiene el botón Reiniciar batalla. Hay una tarjeta por equipo con nombre, ID del regalo (con sugerencias del Buscador de regalos: al escribir uno conocido se completan el nombre y el precio), monedas por regalo, color y foto opcional (URL). Un equipo sin regalo, los dos equipos con el mismo regalo o una foto que no empieza con https:// se avisan en rojo, sin bloquear el envío.</w:t>
       </w:r>
     </w:p>
     <w:p>
@@ -18845,11 +19594,11 @@
       <w:pPr>
         <w:pStyle w:val="Heading2"/>
       </w:pPr>
-      <w:bookmarkStart w:id="33" w:name="_Toc242786104"/>
+      <w:bookmarkStart w:id="34" w:name="_Toc242786966"/>
       <w:r>
         <w:t>8.8 Vista previa y pruebas</w:t>
       </w:r>
-      <w:bookmarkEnd w:id="33"/>
+      <w:bookmarkEnd w:id="34"/>
     </w:p>
     <w:p>
       <w:pPr>
@@ -18934,7 +19683,7 @@
         <w:t>sinRecargar</w:t>
       </w:r>
       <w:r>
-        <w:t xml:space="preserve">: la carrera manda el reloj y la ronda con </w:t>
+        <w:t xml:space="preserve">: la carrera manda el reloj y la ronda, y la batalla la ronda, con </w:t>
       </w:r>
       <w:r>
         <w:rPr>
@@ -18946,18 +19695,18 @@
         <w:t>{ tipo: "config" }</w:t>
       </w:r>
       <w:r>
-        <w:t>, así Iniciar o Pausar no borran los puntos de prueba.</w:t>
+        <w:t>, así Iniciar, Pausar o Reiniciar batalla no borran los puntos de prueba.</w:t>
       </w:r>
     </w:p>
     <w:p>
       <w:pPr>
         <w:pStyle w:val="Heading2"/>
       </w:pPr>
-      <w:bookmarkStart w:id="34" w:name="_Toc242786105"/>
+      <w:bookmarkStart w:id="35" w:name="_Toc242786967"/>
       <w:r>
         <w:t>8.9 Cambios en vivo en el panel (sincronizar.js)</w:t>
       </w:r>
-      <w:bookmarkEnd w:id="34"/>
+      <w:bookmarkEnd w:id="35"/>
     </w:p>
     <w:p>
       <w:pPr>
@@ -18995,6 +19744,7 @@
         <w:spacing w:after="60"/>
       </w:pPr>
       <w:r>
+        <w:lastRenderedPageBreak/>
         <w:t>Las subidas de un mismo widget van en fila, para que siempre gane la última.</w:t>
       </w:r>
     </w:p>
@@ -19021,7 +19771,7 @@
         <w:spacing w:after="60"/>
       </w:pPr>
       <w:r>
-        <w:t xml:space="preserve">Los botones del reloj de la carrera (Iniciar, Pausar, Reiniciar) guardan y llaman </w:t>
+        <w:t xml:space="preserve">Los botones del reloj de la carrera (Iniciar, Pausar, Reiniciar) y Reiniciar batalla guardan y llaman </w:t>
       </w:r>
       <w:r>
         <w:rPr>
@@ -19033,7 +19783,7 @@
         <w:t>sincronizar.subir(id)</w:t>
       </w:r>
       <w:r>
-        <w:t xml:space="preserve"> de inmediato, sin la espera de 0,6 s. La validación de la carrera solo bloquea si no hay integrantes.</w:t>
+        <w:t xml:space="preserve"> de inmediato, sin la espera de 0,6 s. La validación de la carrera solo bloquea si no hay integrantes; la de la batalla nunca bloquea.</w:t>
       </w:r>
     </w:p>
     <w:p>
@@ -19054,22 +19804,22 @@
         <w:pStyle w:val="Heading1"/>
         <w:pageBreakBefore/>
       </w:pPr>
-      <w:bookmarkStart w:id="35" w:name="_Toc242786106"/>
+      <w:bookmarkStart w:id="36" w:name="_Toc242786968"/>
       <w:r>
         <w:lastRenderedPageBreak/>
         <w:t>9. Flujos completos paso a paso</w:t>
       </w:r>
-      <w:bookmarkEnd w:id="35"/>
+      <w:bookmarkEnd w:id="36"/>
     </w:p>
     <w:p>
       <w:pPr>
         <w:pStyle w:val="Heading2"/>
       </w:pPr>
-      <w:bookmarkStart w:id="36" w:name="_Toc242786107"/>
+      <w:bookmarkStart w:id="37" w:name="_Toc242786969"/>
       <w:r>
         <w:t>9.1 Configurar un widget y ponerlo en OBS</w:t>
       </w:r>
-      <w:bookmarkEnd w:id="36"/>
+      <w:bookmarkEnd w:id="37"/>
     </w:p>
     <w:p>
       <w:pPr>
@@ -19248,11 +19998,11 @@
       <w:pPr>
         <w:pStyle w:val="Heading2"/>
       </w:pPr>
-      <w:bookmarkStart w:id="37" w:name="_Toc242786108"/>
+      <w:bookmarkStart w:id="38" w:name="_Toc242786970"/>
       <w:r>
         <w:t>9.2 Llega un regalo y gira la ruleta</w:t>
       </w:r>
-      <w:bookmarkEnd w:id="37"/>
+      <w:bookmarkEnd w:id="38"/>
     </w:p>
     <w:p>
       <w:pPr>
@@ -19389,11 +20139,11 @@
       <w:pPr>
         <w:pStyle w:val="Heading2"/>
       </w:pPr>
-      <w:bookmarkStart w:id="38" w:name="_Toc242786109"/>
+      <w:bookmarkStart w:id="39" w:name="_Toc242786971"/>
       <w:r>
         <w:t>9.3 Probar sin estar en vivo</w:t>
       </w:r>
-      <w:bookmarkEnd w:id="38"/>
+      <w:bookmarkEnd w:id="39"/>
     </w:p>
     <w:p>
       <w:pPr>
@@ -19484,12 +20234,12 @@
       <w:pPr>
         <w:pStyle w:val="Heading2"/>
       </w:pPr>
-      <w:bookmarkStart w:id="39" w:name="_Toc242786110"/>
+      <w:bookmarkStart w:id="40" w:name="_Toc242786972"/>
       <w:r>
         <w:lastRenderedPageBreak/>
         <w:t>9.4 Un regalo cambia de código</w:t>
       </w:r>
-      <w:bookmarkEnd w:id="39"/>
+      <w:bookmarkEnd w:id="40"/>
     </w:p>
     <w:p>
       <w:pPr>
@@ -19853,11 +20603,11 @@
       <w:pPr>
         <w:pStyle w:val="Heading2"/>
       </w:pPr>
-      <w:bookmarkStart w:id="40" w:name="_Toc242786111"/>
+      <w:bookmarkStart w:id="41" w:name="_Toc242786973"/>
       <w:r>
         <w:t>9.5 Cambiar la configuración durante el LIVE</w:t>
       </w:r>
-      <w:bookmarkEnd w:id="40"/>
+      <w:bookmarkEnd w:id="41"/>
     </w:p>
     <w:p>
       <w:pPr>
@@ -19915,11 +20665,11 @@
       <w:pPr>
         <w:pStyle w:val="Heading2"/>
       </w:pPr>
-      <w:bookmarkStart w:id="41" w:name="_Toc242786112"/>
+      <w:bookmarkStart w:id="42" w:name="_Toc242786974"/>
       <w:r>
         <w:t>9.6 Una ronda de la carrera de regalos</w:t>
       </w:r>
-      <w:bookmarkEnd w:id="41"/>
+      <w:bookmarkEnd w:id="42"/>
     </w:p>
     <w:p>
       <w:pPr>
@@ -20029,22 +20779,22 @@
         <w:pStyle w:val="Heading1"/>
         <w:pageBreakBefore/>
       </w:pPr>
-      <w:bookmarkStart w:id="42" w:name="_Toc242786113"/>
+      <w:bookmarkStart w:id="43" w:name="_Toc242786975"/>
       <w:r>
         <w:lastRenderedPageBreak/>
         <w:t>10. Diseño visual</w:t>
       </w:r>
-      <w:bookmarkEnd w:id="42"/>
+      <w:bookmarkEnd w:id="43"/>
     </w:p>
     <w:p>
       <w:pPr>
         <w:pStyle w:val="Heading2"/>
       </w:pPr>
-      <w:bookmarkStart w:id="43" w:name="_Toc242786114"/>
+      <w:bookmarkStart w:id="44" w:name="_Toc242786976"/>
       <w:r>
         <w:t>10.1 Panel</w:t>
       </w:r>
-      <w:bookmarkEnd w:id="43"/>
+      <w:bookmarkEnd w:id="44"/>
     </w:p>
     <w:p>
       <w:pPr>
@@ -20849,11 +21599,11 @@
       <w:pPr>
         <w:pStyle w:val="Heading2"/>
       </w:pPr>
-      <w:bookmarkStart w:id="44" w:name="_Toc242786115"/>
+      <w:bookmarkStart w:id="45" w:name="_Toc242786977"/>
       <w:r>
         <w:t>10.2 Widgets</w:t>
       </w:r>
-      <w:bookmarkEnd w:id="44"/>
+      <w:bookmarkEnd w:id="45"/>
     </w:p>
     <w:p>
       <w:pPr>
@@ -21411,12 +22161,12 @@
         <w:pStyle w:val="Heading1"/>
         <w:pageBreakBefore/>
       </w:pPr>
-      <w:bookmarkStart w:id="45" w:name="_Toc242786116"/>
+      <w:bookmarkStart w:id="46" w:name="_Toc242786978"/>
       <w:r>
         <w:lastRenderedPageBreak/>
         <w:t>11. Seguridad y privacidad</w:t>
       </w:r>
-      <w:bookmarkEnd w:id="45"/>
+      <w:bookmarkEnd w:id="46"/>
     </w:p>
     <w:tbl>
       <w:tblPr>
@@ -21929,12 +22679,12 @@
         <w:pStyle w:val="Heading1"/>
         <w:pageBreakBefore/>
       </w:pPr>
-      <w:bookmarkStart w:id="46" w:name="_Toc242786117"/>
+      <w:bookmarkStart w:id="47" w:name="_Toc242786979"/>
       <w:r>
         <w:lastRenderedPageBreak/>
         <w:t>12. Limitaciones actuales</w:t>
       </w:r>
-      <w:bookmarkEnd w:id="46"/>
+      <w:bookmarkEnd w:id="47"/>
     </w:p>
     <w:tbl>
       <w:tblPr>
@@ -22672,7 +23422,7 @@
               <w:spacing w:after="20"/>
             </w:pPr>
             <w:r>
-              <w:t>Si OBS recarga la fuente, se pierde el conteo (la carrera de regalos sí conserva sus puntos)</w:t>
+              <w:t>Si OBS recarga la fuente, se pierde el conteo (la carrera y la batalla sí conservan sus puntos)</w:t>
             </w:r>
           </w:p>
         </w:tc>
@@ -23237,12 +23987,12 @@
         <w:pStyle w:val="Heading1"/>
         <w:pageBreakBefore/>
       </w:pPr>
-      <w:bookmarkStart w:id="47" w:name="_Toc242786118"/>
+      <w:bookmarkStart w:id="48" w:name="_Toc242786980"/>
       <w:r>
         <w:lastRenderedPageBreak/>
         <w:t>13. Hacia una versión final montada en un servidor</w:t>
       </w:r>
-      <w:bookmarkEnd w:id="47"/>
+      <w:bookmarkEnd w:id="48"/>
     </w:p>
     <w:p>
       <w:pPr>
@@ -23266,11 +24016,11 @@
       <w:pPr>
         <w:pStyle w:val="Heading2"/>
       </w:pPr>
-      <w:bookmarkStart w:id="48" w:name="_Toc242786119"/>
+      <w:bookmarkStart w:id="49" w:name="_Toc242786981"/>
       <w:r>
         <w:t>13.1 Objetivos de la versión final</w:t>
       </w:r>
-      <w:bookmarkEnd w:id="48"/>
+      <w:bookmarkEnd w:id="49"/>
     </w:p>
     <w:p>
       <w:pPr>
@@ -23428,11 +24178,11 @@
       <w:pPr>
         <w:pStyle w:val="Heading2"/>
       </w:pPr>
-      <w:bookmarkStart w:id="49" w:name="_Toc242786120"/>
+      <w:bookmarkStart w:id="50" w:name="_Toc242786982"/>
       <w:r>
         <w:t>13.2 Arquitectura propuesta</w:t>
       </w:r>
-      <w:bookmarkEnd w:id="49"/>
+      <w:bookmarkEnd w:id="50"/>
     </w:p>
     <w:p>
       <w:pPr>
@@ -24261,11 +25011,11 @@
       <w:pPr>
         <w:pStyle w:val="Heading2"/>
       </w:pPr>
-      <w:bookmarkStart w:id="50" w:name="_Toc242786121"/>
+      <w:bookmarkStart w:id="51" w:name="_Toc242786983"/>
       <w:r>
         <w:t>13.3 Modelo de datos sugerido</w:t>
       </w:r>
-      <w:bookmarkEnd w:id="50"/>
+      <w:bookmarkEnd w:id="51"/>
     </w:p>
     <w:tbl>
       <w:tblPr>
@@ -24972,12 +25722,12 @@
       <w:pPr>
         <w:pStyle w:val="Heading2"/>
       </w:pPr>
-      <w:bookmarkStart w:id="51" w:name="_Toc242786122"/>
+      <w:bookmarkStart w:id="52" w:name="_Toc242786984"/>
       <w:r>
         <w:lastRenderedPageBreak/>
         <w:t>13.4 Seguridad en la versión final</w:t>
       </w:r>
-      <w:bookmarkEnd w:id="51"/>
+      <w:bookmarkEnd w:id="52"/>
     </w:p>
     <w:p>
       <w:pPr>
@@ -25211,11 +25961,11 @@
       <w:pPr>
         <w:pStyle w:val="Heading2"/>
       </w:pPr>
-      <w:bookmarkStart w:id="52" w:name="_Toc242786123"/>
+      <w:bookmarkStart w:id="53" w:name="_Toc242786985"/>
       <w:r>
         <w:t>13.5 Dónde alojarlo</w:t>
       </w:r>
-      <w:bookmarkEnd w:id="52"/>
+      <w:bookmarkEnd w:id="53"/>
     </w:p>
     <w:tbl>
       <w:tblPr>
@@ -25820,11 +26570,11 @@
       <w:pPr>
         <w:pStyle w:val="Heading2"/>
       </w:pPr>
-      <w:bookmarkStart w:id="53" w:name="_Toc242786124"/>
+      <w:bookmarkStart w:id="54" w:name="_Toc242786986"/>
       <w:r>
         <w:t>13.6 Qué se reutiliza y qué cambia del código actual</w:t>
       </w:r>
-      <w:bookmarkEnd w:id="53"/>
+      <w:bookmarkEnd w:id="54"/>
     </w:p>
     <w:tbl>
       <w:tblPr>
@@ -26190,7 +26940,7 @@
               <w:spacing w:after="20"/>
             </w:pPr>
             <w:r>
-              <w:t>Widgets (ruleta.js, meta.js, alertas.js, carrera.js)</w:t>
+              <w:t>Widgets (ruleta.js, meta.js, alertas.js, carrera.js, batalla.js)</w:t>
             </w:r>
           </w:p>
         </w:tc>
@@ -26632,12 +27382,12 @@
       <w:pPr>
         <w:pStyle w:val="Heading2"/>
       </w:pPr>
-      <w:bookmarkStart w:id="54" w:name="_Toc242786125"/>
+      <w:bookmarkStart w:id="55" w:name="_Toc242786987"/>
       <w:r>
         <w:lastRenderedPageBreak/>
         <w:t>13.7 Mejoras técnicas recomendadas</w:t>
       </w:r>
-      <w:bookmarkEnd w:id="54"/>
+      <w:bookmarkEnd w:id="55"/>
     </w:p>
     <w:p>
       <w:pPr>
@@ -26823,11 +27573,11 @@
       <w:pPr>
         <w:pStyle w:val="Heading2"/>
       </w:pPr>
-      <w:bookmarkStart w:id="55" w:name="_Toc242786126"/>
+      <w:bookmarkStart w:id="56" w:name="_Toc242786988"/>
       <w:r>
         <w:t>13.8 Nuevas funciones que habilita un servidor</w:t>
       </w:r>
-      <w:bookmarkEnd w:id="55"/>
+      <w:bookmarkEnd w:id="56"/>
     </w:p>
     <w:p>
       <w:pPr>
@@ -26924,11 +27674,11 @@
       <w:pPr>
         <w:pStyle w:val="Heading2"/>
       </w:pPr>
-      <w:bookmarkStart w:id="56" w:name="_Toc242786127"/>
+      <w:bookmarkStart w:id="57" w:name="_Toc242786989"/>
       <w:r>
         <w:t>13.9 Hoja de ruta por fases</w:t>
       </w:r>
-      <w:bookmarkEnd w:id="56"/>
+      <w:bookmarkEnd w:id="57"/>
     </w:p>
     <w:tbl>
       <w:tblPr>
@@ -27408,22 +28158,22 @@
         <w:pStyle w:val="Heading1"/>
         <w:pageBreakBefore/>
       </w:pPr>
-      <w:bookmarkStart w:id="57" w:name="_Toc242786128"/>
+      <w:bookmarkStart w:id="58" w:name="_Toc242786990"/>
       <w:r>
         <w:lastRenderedPageBreak/>
         <w:t>14. Operación y mantenimiento actual</w:t>
       </w:r>
-      <w:bookmarkEnd w:id="57"/>
+      <w:bookmarkEnd w:id="58"/>
     </w:p>
     <w:p>
       <w:pPr>
         <w:pStyle w:val="Heading2"/>
       </w:pPr>
-      <w:bookmarkStart w:id="58" w:name="_Toc242786129"/>
+      <w:bookmarkStart w:id="59" w:name="_Toc242786991"/>
       <w:r>
         <w:t>14.1 Publicar un cambio</w:t>
       </w:r>
-      <w:bookmarkEnd w:id="58"/>
+      <w:bookmarkEnd w:id="59"/>
     </w:p>
     <w:p>
       <w:pPr>
@@ -27485,11 +28235,11 @@
       <w:pPr>
         <w:pStyle w:val="Heading2"/>
       </w:pPr>
-      <w:bookmarkStart w:id="59" w:name="_Toc242786130"/>
+      <w:bookmarkStart w:id="60" w:name="_Toc242786992"/>
       <w:r>
         <w:t>14.2 Agregar una función nueva</w:t>
       </w:r>
-      <w:bookmarkEnd w:id="59"/>
+      <w:bookmarkEnd w:id="60"/>
     </w:p>
     <w:p>
       <w:pPr>
@@ -27546,11 +28296,11 @@
       <w:pPr>
         <w:pStyle w:val="Heading2"/>
       </w:pPr>
-      <w:bookmarkStart w:id="60" w:name="_Toc242786131"/>
+      <w:bookmarkStart w:id="61" w:name="_Toc242786993"/>
       <w:r>
         <w:t>14.3 Probar</w:t>
       </w:r>
-      <w:bookmarkEnd w:id="60"/>
+      <w:bookmarkEnd w:id="61"/>
     </w:p>
     <w:p>
       <w:pPr>
@@ -27639,6 +28389,19 @@
         <w:spacing w:after="60"/>
       </w:pPr>
       <w:r>
+        <w:t>Batalla de regalos: sumar puntos con las pruebas de la vista previa y pulsar Reiniciar batalla; los dos equipos vuelven a 0 sin recargar. Con la URL del widget abierta en otra pestaña, el reinicio llega en menos de un segundo.</w:t>
+      </w:r>
+    </w:p>
+    <w:p>
+      <w:pPr>
+        <w:pStyle w:val="ListParagraph"/>
+        <w:numPr>
+          <w:ilvl w:val="0"/>
+          <w:numId w:val="3"/>
+        </w:numPr>
+        <w:spacing w:after="60"/>
+      </w:pPr>
+      <w:r>
         <w:t>Servidor estático local: python -m http.server 8080 -d public y abrir http://localhost:8080 (con doble clic no funciona: los módulos JavaScript necesitan http://).</w:t>
       </w:r>
     </w:p>
@@ -27646,11 +28409,11 @@
       <w:pPr>
         <w:pStyle w:val="Heading2"/>
       </w:pPr>
-      <w:bookmarkStart w:id="61" w:name="_Toc242786132"/>
+      <w:bookmarkStart w:id="62" w:name="_Toc242786994"/>
       <w:r>
         <w:t>14.4 Solución de problemas</w:t>
       </w:r>
-      <w:bookmarkEnd w:id="61"/>
+      <w:bookmarkEnd w:id="62"/>
     </w:p>
     <w:tbl>
       <w:tblPr>
@@ -27944,6 +28707,7 @@
               <w:spacing w:after="20"/>
             </w:pPr>
             <w:r>
+              <w:lastRenderedPageBreak/>
               <w:t>La ruleta no gira con un regalo</w:t>
             </w:r>
           </w:p>
@@ -27994,11 +28758,7 @@
               <w:spacing w:after="20"/>
             </w:pPr>
             <w:r>
-              <w:t xml:space="preserve">Ver el ID real en el Buscador de regalos; si la URL de OBS es de antes </w:t>
-            </w:r>
-            <w:r>
-              <w:lastRenderedPageBreak/>
-              <w:t>de los cambios en vivo, copiarla de nuevo</w:t>
+              <w:t>Ver el ID real en el Buscador de regalos; si la URL de OBS es de antes de los cambios en vivo, copiarla de nuevo</w:t>
             </w:r>
           </w:p>
         </w:tc>
@@ -28025,7 +28785,6 @@
               <w:spacing w:after="20"/>
             </w:pPr>
             <w:r>
-              <w:lastRenderedPageBreak/>
               <w:t>☁ “No se pudo guardar en Supabase”</w:t>
             </w:r>
           </w:p>
@@ -28466,6 +29225,83 @@
           </w:p>
         </w:tc>
       </w:tr>
+      <w:tr>
+        <w:tc>
+          <w:tcPr>
+            <w:tcW w:w="2808" w:type="dxa"/>
+            <w:tcBorders>
+              <w:top w:val="single" w:sz="4" w:space="0" w:color="BFBFBF"/>
+              <w:left w:val="single" w:sz="4" w:space="0" w:color="BFBFBF"/>
+              <w:bottom w:val="single" w:sz="4" w:space="0" w:color="BFBFBF"/>
+              <w:right w:val="single" w:sz="4" w:space="0" w:color="BFBFBF"/>
+            </w:tcBorders>
+            <w:tcMar>
+              <w:top w:w="60" w:type="dxa"/>
+              <w:left w:w="100" w:type="dxa"/>
+              <w:bottom w:w="60" w:type="dxa"/>
+              <w:right w:w="100" w:type="dxa"/>
+            </w:tcMar>
+          </w:tcPr>
+          <w:p>
+            <w:pPr>
+              <w:spacing w:after="20"/>
+            </w:pPr>
+            <w:r>
+              <w:t>Un regalo no mueve la batalla</w:t>
+            </w:r>
+          </w:p>
+        </w:tc>
+        <w:tc>
+          <w:tcPr>
+            <w:tcW w:w="2995" w:type="dxa"/>
+            <w:tcBorders>
+              <w:top w:val="single" w:sz="4" w:space="0" w:color="BFBFBF"/>
+              <w:left w:val="single" w:sz="4" w:space="0" w:color="BFBFBF"/>
+              <w:bottom w:val="single" w:sz="4" w:space="0" w:color="BFBFBF"/>
+              <w:right w:val="single" w:sz="4" w:space="0" w:color="BFBFBF"/>
+            </w:tcBorders>
+            <w:tcMar>
+              <w:top w:w="60" w:type="dxa"/>
+              <w:left w:w="100" w:type="dxa"/>
+              <w:bottom w:w="60" w:type="dxa"/>
+              <w:right w:w="100" w:type="dxa"/>
+            </w:tcMar>
+          </w:tcPr>
+          <w:p>
+            <w:pPr>
+              <w:spacing w:after="20"/>
+            </w:pPr>
+            <w:r>
+              <w:t>Su ID no coincide con el de ningún equipo, o los dos equipos tienen el mismo regalo</w:t>
+            </w:r>
+          </w:p>
+        </w:tc>
+        <w:tc>
+          <w:tcPr>
+            <w:tcW w:w="3557" w:type="dxa"/>
+            <w:tcBorders>
+              <w:top w:val="single" w:sz="4" w:space="0" w:color="BFBFBF"/>
+              <w:left w:val="single" w:sz="4" w:space="0" w:color="BFBFBF"/>
+              <w:bottom w:val="single" w:sz="4" w:space="0" w:color="BFBFBF"/>
+              <w:right w:val="single" w:sz="4" w:space="0" w:color="BFBFBF"/>
+            </w:tcBorders>
+            <w:tcMar>
+              <w:top w:w="60" w:type="dxa"/>
+              <w:left w:w="100" w:type="dxa"/>
+              <w:bottom w:w="60" w:type="dxa"/>
+              <w:right w:w="100" w:type="dxa"/>
+            </w:tcMar>
+          </w:tcPr>
+          <w:p>
+            <w:pPr>
+              <w:spacing w:after="20"/>
+            </w:pPr>
+            <w:r>
+              <w:t>Revisar los IDs en el Buscador de regalos; cada equipo necesita uno distinto</w:t>
+            </w:r>
+          </w:p>
+        </w:tc>
+      </w:tr>
     </w:tbl>
     <w:p>
       <w:pPr>
@@ -28477,12 +29313,12 @@
         <w:pStyle w:val="Heading1"/>
         <w:pageBreakBefore/>
       </w:pPr>
-      <w:bookmarkStart w:id="62" w:name="_Toc242786133"/>
+      <w:bookmarkStart w:id="63" w:name="_Toc242786995"/>
       <w:r>
         <w:lastRenderedPageBreak/>
         <w:t>15. Anexo: historial de decisiones y correcciones</w:t>
       </w:r>
-      <w:bookmarkEnd w:id="62"/>
+      <w:bookmarkEnd w:id="63"/>
     </w:p>
     <w:tbl>
       <w:tblPr>
@@ -30368,6 +31204,160 @@
             </w:pPr>
             <w:r>
               <w:t>Iniciar o Pausar borraban los puntos de prueba</w:t>
+            </w:r>
+          </w:p>
+        </w:tc>
+      </w:tr>
+      <w:tr>
+        <w:tc>
+          <w:tcPr>
+            <w:tcW w:w="2246" w:type="dxa"/>
+            <w:tcBorders>
+              <w:top w:val="single" w:sz="4" w:space="0" w:color="BFBFBF"/>
+              <w:left w:val="single" w:sz="4" w:space="0" w:color="BFBFBF"/>
+              <w:bottom w:val="single" w:sz="4" w:space="0" w:color="BFBFBF"/>
+              <w:right w:val="single" w:sz="4" w:space="0" w:color="BFBFBF"/>
+            </w:tcBorders>
+            <w:tcMar>
+              <w:top w:w="60" w:type="dxa"/>
+              <w:left w:w="100" w:type="dxa"/>
+              <w:bottom w:w="60" w:type="dxa"/>
+              <w:right w:w="100" w:type="dxa"/>
+            </w:tcMar>
+          </w:tcPr>
+          <w:p>
+            <w:pPr>
+              <w:spacing w:after="20"/>
+            </w:pPr>
+            <w:r>
+              <w:t>Barra de la batalla</w:t>
+            </w:r>
+          </w:p>
+        </w:tc>
+        <w:tc>
+          <w:tcPr>
+            <w:tcW w:w="3744" w:type="dxa"/>
+            <w:tcBorders>
+              <w:top w:val="single" w:sz="4" w:space="0" w:color="BFBFBF"/>
+              <w:left w:val="single" w:sz="4" w:space="0" w:color="BFBFBF"/>
+              <w:bottom w:val="single" w:sz="4" w:space="0" w:color="BFBFBF"/>
+              <w:right w:val="single" w:sz="4" w:space="0" w:color="BFBFBF"/>
+            </w:tcBorders>
+            <w:tcMar>
+              <w:top w:w="60" w:type="dxa"/>
+              <w:left w:w="100" w:type="dxa"/>
+              <w:bottom w:w="60" w:type="dxa"/>
+              <w:right w:w="100" w:type="dxa"/>
+            </w:tcMar>
+          </w:tcPr>
+          <w:p>
+            <w:pPr>
+              <w:spacing w:after="20"/>
+            </w:pPr>
+            <w:r>
+              <w:t>En pantalla queda entre 4 % y 96 %; el porcentaje escrito es el real</w:t>
+            </w:r>
+          </w:p>
+        </w:tc>
+        <w:tc>
+          <w:tcPr>
+            <w:tcW w:w="3370" w:type="dxa"/>
+            <w:tcBorders>
+              <w:top w:val="single" w:sz="4" w:space="0" w:color="BFBFBF"/>
+              <w:left w:val="single" w:sz="4" w:space="0" w:color="BFBFBF"/>
+              <w:bottom w:val="single" w:sz="4" w:space="0" w:color="BFBFBF"/>
+              <w:right w:val="single" w:sz="4" w:space="0" w:color="BFBFBF"/>
+            </w:tcBorders>
+            <w:tcMar>
+              <w:top w:w="60" w:type="dxa"/>
+              <w:left w:w="100" w:type="dxa"/>
+              <w:bottom w:w="60" w:type="dxa"/>
+              <w:right w:w="100" w:type="dxa"/>
+            </w:tcMar>
+          </w:tcPr>
+          <w:p>
+            <w:pPr>
+              <w:spacing w:after="20"/>
+            </w:pPr>
+            <w:r>
+              <w:t>El primer regalo llevaba la barra al 100 % y el otro equipo desaparecía</w:t>
+            </w:r>
+          </w:p>
+        </w:tc>
+      </w:tr>
+      <w:tr>
+        <w:tc>
+          <w:tcPr>
+            <w:tcW w:w="2246" w:type="dxa"/>
+            <w:tcBorders>
+              <w:top w:val="single" w:sz="4" w:space="0" w:color="BFBFBF"/>
+              <w:left w:val="single" w:sz="4" w:space="0" w:color="BFBFBF"/>
+              <w:bottom w:val="single" w:sz="4" w:space="0" w:color="BFBFBF"/>
+              <w:right w:val="single" w:sz="4" w:space="0" w:color="BFBFBF"/>
+            </w:tcBorders>
+            <w:tcMar>
+              <w:top w:w="60" w:type="dxa"/>
+              <w:left w:w="100" w:type="dxa"/>
+              <w:bottom w:w="60" w:type="dxa"/>
+              <w:right w:w="100" w:type="dxa"/>
+            </w:tcMar>
+          </w:tcPr>
+          <w:p>
+            <w:pPr>
+              <w:spacing w:after="20"/>
+            </w:pPr>
+            <w:r>
+              <w:t>Sonido de la batalla</w:t>
+            </w:r>
+          </w:p>
+        </w:tc>
+        <w:tc>
+          <w:tcPr>
+            <w:tcW w:w="3744" w:type="dxa"/>
+            <w:tcBorders>
+              <w:top w:val="single" w:sz="4" w:space="0" w:color="BFBFBF"/>
+              <w:left w:val="single" w:sz="4" w:space="0" w:color="BFBFBF"/>
+              <w:bottom w:val="single" w:sz="4" w:space="0" w:color="BFBFBF"/>
+              <w:right w:val="single" w:sz="4" w:space="0" w:color="BFBFBF"/>
+            </w:tcBorders>
+            <w:tcMar>
+              <w:top w:w="60" w:type="dxa"/>
+              <w:left w:w="100" w:type="dxa"/>
+              <w:bottom w:w="60" w:type="dxa"/>
+              <w:right w:w="100" w:type="dxa"/>
+            </w:tcMar>
+          </w:tcPr>
+          <w:p>
+            <w:pPr>
+              <w:spacing w:after="20"/>
+            </w:pPr>
+            <w:r>
+              <w:t>Solo cuando cambia quién va ganando</w:t>
+            </w:r>
+          </w:p>
+        </w:tc>
+        <w:tc>
+          <w:tcPr>
+            <w:tcW w:w="3370" w:type="dxa"/>
+            <w:tcBorders>
+              <w:top w:val="single" w:sz="4" w:space="0" w:color="BFBFBF"/>
+              <w:left w:val="single" w:sz="4" w:space="0" w:color="BFBFBF"/>
+              <w:bottom w:val="single" w:sz="4" w:space="0" w:color="BFBFBF"/>
+              <w:right w:val="single" w:sz="4" w:space="0" w:color="BFBFBF"/>
+            </w:tcBorders>
+            <w:tcMar>
+              <w:top w:w="60" w:type="dxa"/>
+              <w:left w:w="100" w:type="dxa"/>
+              <w:bottom w:w="60" w:type="dxa"/>
+              <w:right w:w="100" w:type="dxa"/>
+            </w:tcMar>
+          </w:tcPr>
+          <w:p>
+            <w:pPr>
+              <w:spacing w:after="20"/>
+            </w:pPr>
+            <w:r>
+              <w:t>Con cada regalo, una lluvia de rosas sonaba sin parar</w:t>
             </w:r>
           </w:p>
         </w:tc>

</xml_diff>

<commit_message>
Jefe del LIVE: reto cooperativo con barra de vida (boss raid)
- jefe.html + js/widgets/jefe.js + css/widgets/jefe.css: barra de vida de oro
  con rastro de daño, cifra grande, reloj (js/reloj.js), victoria con brillo
  dorado y tiempo agotado; daño guardado por ronda.
- Vista Superposiciones → Juegos → Jefe del LIVE: nombre, vida, minutos, texto
  de victoria, daño por like y por moneda, y raid Iniciar/Pausar/Reiniciar.
- README y documentación Word (sección 7.6 y menciones; corrige una coma).

Co-Authored-By: Claude Opus 5.5 <noreply@anthropic.com>
</commit_message>
<xml_diff>
--- a/Documentacion-Live-Tools.docx
+++ b/Documentacion-Live-Tools.docx
@@ -42,7 +42,7 @@
         <w:jc w:val="center"/>
       </w:pPr>
       <w:r>
-        <w:t>Ruleta de regalos · Metas · Alertas · Carrera y Batalla de regalos · Actividad · Buscador de regalos</w:t>
+        <w:t>Ruleta · Metas · Alertas · Carrera, Batalla y Jefe del LIVE · Actividad · Buscador de regalos</w:t>
       </w:r>
     </w:p>
     <w:p>
@@ -159,7 +159,7 @@
           <w:r>
             <w:fldChar w:fldCharType="separate"/>
           </w:r>
-          <w:hyperlink w:anchor="_Toc242786932" w:history="1">
+          <w:hyperlink w:anchor="_Toc242787354" w:history="1">
             <w:r>
               <w:rPr>
                 <w:rStyle w:val="Hyperlink"/>
@@ -183,7 +183,7 @@
               <w:rPr>
                 <w:noProof/>
               </w:rPr>
-              <w:instrText xml:space="preserve"> PAGEREF _Toc242786932 \h </w:instrText>
+              <w:instrText xml:space="preserve"> PAGEREF _Toc242787354 \h </w:instrText>
             </w:r>
             <w:r>
               <w:rPr>
@@ -225,7 +225,7 @@
               <w14:ligatures w14:val="standardContextual"/>
             </w:rPr>
           </w:pPr>
-          <w:hyperlink w:anchor="_Toc242786933" w:history="1">
+          <w:hyperlink w:anchor="_Toc242787355" w:history="1">
             <w:r>
               <w:rPr>
                 <w:rStyle w:val="Hyperlink"/>
@@ -249,7 +249,7 @@
               <w:rPr>
                 <w:noProof/>
               </w:rPr>
-              <w:instrText xml:space="preserve"> PAGEREF _Toc242786933 \h </w:instrText>
+              <w:instrText xml:space="preserve"> PAGEREF _Toc242787355 \h </w:instrText>
             </w:r>
             <w:r>
               <w:rPr>
@@ -291,7 +291,7 @@
               <w14:ligatures w14:val="standardContextual"/>
             </w:rPr>
           </w:pPr>
-          <w:hyperlink w:anchor="_Toc242786934" w:history="1">
+          <w:hyperlink w:anchor="_Toc242787356" w:history="1">
             <w:r>
               <w:rPr>
                 <w:rStyle w:val="Hyperlink"/>
@@ -315,7 +315,7 @@
               <w:rPr>
                 <w:noProof/>
               </w:rPr>
-              <w:instrText xml:space="preserve"> PAGEREF _Toc242786934 \h </w:instrText>
+              <w:instrText xml:space="preserve"> PAGEREF _Toc242787356 \h </w:instrText>
             </w:r>
             <w:r>
               <w:rPr>
@@ -357,7 +357,7 @@
               <w14:ligatures w14:val="standardContextual"/>
             </w:rPr>
           </w:pPr>
-          <w:hyperlink w:anchor="_Toc242786935" w:history="1">
+          <w:hyperlink w:anchor="_Toc242787357" w:history="1">
             <w:r>
               <w:rPr>
                 <w:rStyle w:val="Hyperlink"/>
@@ -381,7 +381,7 @@
               <w:rPr>
                 <w:noProof/>
               </w:rPr>
-              <w:instrText xml:space="preserve"> PAGEREF _Toc242786935 \h </w:instrText>
+              <w:instrText xml:space="preserve"> PAGEREF _Toc242787357 \h </w:instrText>
             </w:r>
             <w:r>
               <w:rPr>
@@ -423,7 +423,7 @@
               <w14:ligatures w14:val="standardContextual"/>
             </w:rPr>
           </w:pPr>
-          <w:hyperlink w:anchor="_Toc242786936" w:history="1">
+          <w:hyperlink w:anchor="_Toc242787358" w:history="1">
             <w:r>
               <w:rPr>
                 <w:rStyle w:val="Hyperlink"/>
@@ -447,7 +447,7 @@
               <w:rPr>
                 <w:noProof/>
               </w:rPr>
-              <w:instrText xml:space="preserve"> PAGEREF _Toc242786936 \h </w:instrText>
+              <w:instrText xml:space="preserve"> PAGEREF _Toc242787358 \h </w:instrText>
             </w:r>
             <w:r>
               <w:rPr>
@@ -489,7 +489,7 @@
               <w14:ligatures w14:val="standardContextual"/>
             </w:rPr>
           </w:pPr>
-          <w:hyperlink w:anchor="_Toc242786937" w:history="1">
+          <w:hyperlink w:anchor="_Toc242787359" w:history="1">
             <w:r>
               <w:rPr>
                 <w:rStyle w:val="Hyperlink"/>
@@ -513,7 +513,7 @@
               <w:rPr>
                 <w:noProof/>
               </w:rPr>
-              <w:instrText xml:space="preserve"> PAGEREF _Toc242786937 \h </w:instrText>
+              <w:instrText xml:space="preserve"> PAGEREF _Toc242787359 \h </w:instrText>
             </w:r>
             <w:r>
               <w:rPr>
@@ -555,7 +555,7 @@
               <w14:ligatures w14:val="standardContextual"/>
             </w:rPr>
           </w:pPr>
-          <w:hyperlink w:anchor="_Toc242786938" w:history="1">
+          <w:hyperlink w:anchor="_Toc242787360" w:history="1">
             <w:r>
               <w:rPr>
                 <w:rStyle w:val="Hyperlink"/>
@@ -579,7 +579,7 @@
               <w:rPr>
                 <w:noProof/>
               </w:rPr>
-              <w:instrText xml:space="preserve"> PAGEREF _Toc242786938 \h </w:instrText>
+              <w:instrText xml:space="preserve"> PAGEREF _Toc242787360 \h </w:instrText>
             </w:r>
             <w:r>
               <w:rPr>
@@ -621,7 +621,7 @@
               <w14:ligatures w14:val="standardContextual"/>
             </w:rPr>
           </w:pPr>
-          <w:hyperlink w:anchor="_Toc242786939" w:history="1">
+          <w:hyperlink w:anchor="_Toc242787361" w:history="1">
             <w:r>
               <w:rPr>
                 <w:rStyle w:val="Hyperlink"/>
@@ -645,7 +645,7 @@
               <w:rPr>
                 <w:noProof/>
               </w:rPr>
-              <w:instrText xml:space="preserve"> PAGEREF _Toc242786939 \h </w:instrText>
+              <w:instrText xml:space="preserve"> PAGEREF _Toc242787361 \h </w:instrText>
             </w:r>
             <w:r>
               <w:rPr>
@@ -687,7 +687,7 @@
               <w14:ligatures w14:val="standardContextual"/>
             </w:rPr>
           </w:pPr>
-          <w:hyperlink w:anchor="_Toc242786940" w:history="1">
+          <w:hyperlink w:anchor="_Toc242787362" w:history="1">
             <w:r>
               <w:rPr>
                 <w:rStyle w:val="Hyperlink"/>
@@ -711,7 +711,7 @@
               <w:rPr>
                 <w:noProof/>
               </w:rPr>
-              <w:instrText xml:space="preserve"> PAGEREF _Toc242786940 \h </w:instrText>
+              <w:instrText xml:space="preserve"> PAGEREF _Toc242787362 \h </w:instrText>
             </w:r>
             <w:r>
               <w:rPr>
@@ -753,7 +753,7 @@
               <w14:ligatures w14:val="standardContextual"/>
             </w:rPr>
           </w:pPr>
-          <w:hyperlink w:anchor="_Toc242786941" w:history="1">
+          <w:hyperlink w:anchor="_Toc242787363" w:history="1">
             <w:r>
               <w:rPr>
                 <w:rStyle w:val="Hyperlink"/>
@@ -777,7 +777,7 @@
               <w:rPr>
                 <w:noProof/>
               </w:rPr>
-              <w:instrText xml:space="preserve"> PAGEREF _Toc242786941 \h </w:instrText>
+              <w:instrText xml:space="preserve"> PAGEREF _Toc242787363 \h </w:instrText>
             </w:r>
             <w:r>
               <w:rPr>
@@ -819,7 +819,7 @@
               <w14:ligatures w14:val="standardContextual"/>
             </w:rPr>
           </w:pPr>
-          <w:hyperlink w:anchor="_Toc242786942" w:history="1">
+          <w:hyperlink w:anchor="_Toc242787364" w:history="1">
             <w:r>
               <w:rPr>
                 <w:rStyle w:val="Hyperlink"/>
@@ -843,7 +843,7 @@
               <w:rPr>
                 <w:noProof/>
               </w:rPr>
-              <w:instrText xml:space="preserve"> PAGEREF _Toc242786942 \h </w:instrText>
+              <w:instrText xml:space="preserve"> PAGEREF _Toc242787364 \h </w:instrText>
             </w:r>
             <w:r>
               <w:rPr>
@@ -885,7 +885,7 @@
               <w14:ligatures w14:val="standardContextual"/>
             </w:rPr>
           </w:pPr>
-          <w:hyperlink w:anchor="_Toc242786943" w:history="1">
+          <w:hyperlink w:anchor="_Toc242787365" w:history="1">
             <w:r>
               <w:rPr>
                 <w:rStyle w:val="Hyperlink"/>
@@ -909,7 +909,7 @@
               <w:rPr>
                 <w:noProof/>
               </w:rPr>
-              <w:instrText xml:space="preserve"> PAGEREF _Toc242786943 \h </w:instrText>
+              <w:instrText xml:space="preserve"> PAGEREF _Toc242787365 \h </w:instrText>
             </w:r>
             <w:r>
               <w:rPr>
@@ -951,7 +951,7 @@
               <w14:ligatures w14:val="standardContextual"/>
             </w:rPr>
           </w:pPr>
-          <w:hyperlink w:anchor="_Toc242786944" w:history="1">
+          <w:hyperlink w:anchor="_Toc242787366" w:history="1">
             <w:r>
               <w:rPr>
                 <w:rStyle w:val="Hyperlink"/>
@@ -975,7 +975,7 @@
               <w:rPr>
                 <w:noProof/>
               </w:rPr>
-              <w:instrText xml:space="preserve"> PAGEREF _Toc242786944 \h </w:instrText>
+              <w:instrText xml:space="preserve"> PAGEREF _Toc242787366 \h </w:instrText>
             </w:r>
             <w:r>
               <w:rPr>
@@ -1017,7 +1017,7 @@
               <w14:ligatures w14:val="standardContextual"/>
             </w:rPr>
           </w:pPr>
-          <w:hyperlink w:anchor="_Toc242786945" w:history="1">
+          <w:hyperlink w:anchor="_Toc242787367" w:history="1">
             <w:r>
               <w:rPr>
                 <w:rStyle w:val="Hyperlink"/>
@@ -1041,7 +1041,7 @@
               <w:rPr>
                 <w:noProof/>
               </w:rPr>
-              <w:instrText xml:space="preserve"> PAGEREF _Toc242786945 \h </w:instrText>
+              <w:instrText xml:space="preserve"> PAGEREF _Toc242787367 \h </w:instrText>
             </w:r>
             <w:r>
               <w:rPr>
@@ -1083,7 +1083,7 @@
               <w14:ligatures w14:val="standardContextual"/>
             </w:rPr>
           </w:pPr>
-          <w:hyperlink w:anchor="_Toc242786946" w:history="1">
+          <w:hyperlink w:anchor="_Toc242787368" w:history="1">
             <w:r>
               <w:rPr>
                 <w:rStyle w:val="Hyperlink"/>
@@ -1107,7 +1107,7 @@
               <w:rPr>
                 <w:noProof/>
               </w:rPr>
-              <w:instrText xml:space="preserve"> PAGEREF _Toc242786946 \h </w:instrText>
+              <w:instrText xml:space="preserve"> PAGEREF _Toc242787368 \h </w:instrText>
             </w:r>
             <w:r>
               <w:rPr>
@@ -1149,7 +1149,7 @@
               <w14:ligatures w14:val="standardContextual"/>
             </w:rPr>
           </w:pPr>
-          <w:hyperlink w:anchor="_Toc242786947" w:history="1">
+          <w:hyperlink w:anchor="_Toc242787369" w:history="1">
             <w:r>
               <w:rPr>
                 <w:rStyle w:val="Hyperlink"/>
@@ -1173,7 +1173,7 @@
               <w:rPr>
                 <w:noProof/>
               </w:rPr>
-              <w:instrText xml:space="preserve"> PAGEREF _Toc242786947 \h </w:instrText>
+              <w:instrText xml:space="preserve"> PAGEREF _Toc242787369 \h </w:instrText>
             </w:r>
             <w:r>
               <w:rPr>
@@ -1215,7 +1215,7 @@
               <w14:ligatures w14:val="standardContextual"/>
             </w:rPr>
           </w:pPr>
-          <w:hyperlink w:anchor="_Toc242786948" w:history="1">
+          <w:hyperlink w:anchor="_Toc242787370" w:history="1">
             <w:r>
               <w:rPr>
                 <w:rStyle w:val="Hyperlink"/>
@@ -1239,7 +1239,7 @@
               <w:rPr>
                 <w:noProof/>
               </w:rPr>
-              <w:instrText xml:space="preserve"> PAGEREF _Toc242786948 \h </w:instrText>
+              <w:instrText xml:space="preserve"> PAGEREF _Toc242787370 \h </w:instrText>
             </w:r>
             <w:r>
               <w:rPr>
@@ -1281,7 +1281,7 @@
               <w14:ligatures w14:val="standardContextual"/>
             </w:rPr>
           </w:pPr>
-          <w:hyperlink w:anchor="_Toc242786949" w:history="1">
+          <w:hyperlink w:anchor="_Toc242787371" w:history="1">
             <w:r>
               <w:rPr>
                 <w:rStyle w:val="Hyperlink"/>
@@ -1305,7 +1305,7 @@
               <w:rPr>
                 <w:noProof/>
               </w:rPr>
-              <w:instrText xml:space="preserve"> PAGEREF _Toc242786949 \h </w:instrText>
+              <w:instrText xml:space="preserve"> PAGEREF _Toc242787371 \h </w:instrText>
             </w:r>
             <w:r>
               <w:rPr>
@@ -1347,7 +1347,7 @@
               <w14:ligatures w14:val="standardContextual"/>
             </w:rPr>
           </w:pPr>
-          <w:hyperlink w:anchor="_Toc242786950" w:history="1">
+          <w:hyperlink w:anchor="_Toc242787372" w:history="1">
             <w:r>
               <w:rPr>
                 <w:rStyle w:val="Hyperlink"/>
@@ -1371,7 +1371,7 @@
               <w:rPr>
                 <w:noProof/>
               </w:rPr>
-              <w:instrText xml:space="preserve"> PAGEREF _Toc242786950 \h </w:instrText>
+              <w:instrText xml:space="preserve"> PAGEREF _Toc242787372 \h </w:instrText>
             </w:r>
             <w:r>
               <w:rPr>
@@ -1413,7 +1413,7 @@
               <w14:ligatures w14:val="standardContextual"/>
             </w:rPr>
           </w:pPr>
-          <w:hyperlink w:anchor="_Toc242786951" w:history="1">
+          <w:hyperlink w:anchor="_Toc242787373" w:history="1">
             <w:r>
               <w:rPr>
                 <w:rStyle w:val="Hyperlink"/>
@@ -1437,7 +1437,7 @@
               <w:rPr>
                 <w:noProof/>
               </w:rPr>
-              <w:instrText xml:space="preserve"> PAGEREF _Toc242786951 \h </w:instrText>
+              <w:instrText xml:space="preserve"> PAGEREF _Toc242787373 \h </w:instrText>
             </w:r>
             <w:r>
               <w:rPr>
@@ -1479,7 +1479,7 @@
               <w14:ligatures w14:val="standardContextual"/>
             </w:rPr>
           </w:pPr>
-          <w:hyperlink w:anchor="_Toc242786952" w:history="1">
+          <w:hyperlink w:anchor="_Toc242787374" w:history="1">
             <w:r>
               <w:rPr>
                 <w:rStyle w:val="Hyperlink"/>
@@ -1503,7 +1503,7 @@
               <w:rPr>
                 <w:noProof/>
               </w:rPr>
-              <w:instrText xml:space="preserve"> PAGEREF _Toc242786952 \h </w:instrText>
+              <w:instrText xml:space="preserve"> PAGEREF _Toc242787374 \h </w:instrText>
             </w:r>
             <w:r>
               <w:rPr>
@@ -1545,7 +1545,7 @@
               <w14:ligatures w14:val="standardContextual"/>
             </w:rPr>
           </w:pPr>
-          <w:hyperlink w:anchor="_Toc242786953" w:history="1">
+          <w:hyperlink w:anchor="_Toc242787375" w:history="1">
             <w:r>
               <w:rPr>
                 <w:rStyle w:val="Hyperlink"/>
@@ -1569,7 +1569,7 @@
               <w:rPr>
                 <w:noProof/>
               </w:rPr>
-              <w:instrText xml:space="preserve"> PAGEREF _Toc242786953 \h </w:instrText>
+              <w:instrText xml:space="preserve"> PAGEREF _Toc242787375 \h </w:instrText>
             </w:r>
             <w:r>
               <w:rPr>
@@ -1611,7 +1611,7 @@
               <w14:ligatures w14:val="standardContextual"/>
             </w:rPr>
           </w:pPr>
-          <w:hyperlink w:anchor="_Toc242786954" w:history="1">
+          <w:hyperlink w:anchor="_Toc242787376" w:history="1">
             <w:r>
               <w:rPr>
                 <w:rStyle w:val="Hyperlink"/>
@@ -1635,7 +1635,7 @@
               <w:rPr>
                 <w:noProof/>
               </w:rPr>
-              <w:instrText xml:space="preserve"> PAGEREF _Toc242786954 \h </w:instrText>
+              <w:instrText xml:space="preserve"> PAGEREF _Toc242787376 \h </w:instrText>
             </w:r>
             <w:r>
               <w:rPr>
@@ -1677,7 +1677,7 @@
               <w14:ligatures w14:val="standardContextual"/>
             </w:rPr>
           </w:pPr>
-          <w:hyperlink w:anchor="_Toc242786955" w:history="1">
+          <w:hyperlink w:anchor="_Toc242787377" w:history="1">
             <w:r>
               <w:rPr>
                 <w:rStyle w:val="Hyperlink"/>
@@ -1701,7 +1701,7 @@
               <w:rPr>
                 <w:noProof/>
               </w:rPr>
-              <w:instrText xml:space="preserve"> PAGEREF _Toc242786955 \h </w:instrText>
+              <w:instrText xml:space="preserve"> PAGEREF _Toc242787377 \h </w:instrText>
             </w:r>
             <w:r>
               <w:rPr>
@@ -1743,7 +1743,7 @@
               <w14:ligatures w14:val="standardContextual"/>
             </w:rPr>
           </w:pPr>
-          <w:hyperlink w:anchor="_Toc242786956" w:history="1">
+          <w:hyperlink w:anchor="_Toc242787378" w:history="1">
             <w:r>
               <w:rPr>
                 <w:rStyle w:val="Hyperlink"/>
@@ -1767,7 +1767,7 @@
               <w:rPr>
                 <w:noProof/>
               </w:rPr>
-              <w:instrText xml:space="preserve"> PAGEREF _Toc242786956 \h </w:instrText>
+              <w:instrText xml:space="preserve"> PAGEREF _Toc242787378 \h </w:instrText>
             </w:r>
             <w:r>
               <w:rPr>
@@ -1809,7 +1809,7 @@
               <w14:ligatures w14:val="standardContextual"/>
             </w:rPr>
           </w:pPr>
-          <w:hyperlink w:anchor="_Toc242786957" w:history="1">
+          <w:hyperlink w:anchor="_Toc242787379" w:history="1">
             <w:r>
               <w:rPr>
                 <w:rStyle w:val="Hyperlink"/>
@@ -1833,7 +1833,7 @@
               <w:rPr>
                 <w:noProof/>
               </w:rPr>
-              <w:instrText xml:space="preserve"> PAGEREF _Toc242786957 \h </w:instrText>
+              <w:instrText xml:space="preserve"> PAGEREF _Toc242787379 \h </w:instrText>
             </w:r>
             <w:r>
               <w:rPr>
@@ -1851,6 +1851,72 @@
                 <w:noProof/>
               </w:rPr>
               <w:t>22</w:t>
+            </w:r>
+            <w:r>
+              <w:rPr>
+                <w:noProof/>
+              </w:rPr>
+              <w:fldChar w:fldCharType="end"/>
+            </w:r>
+          </w:hyperlink>
+        </w:p>
+        <w:p>
+          <w:pPr>
+            <w:pStyle w:val="TOC2"/>
+            <w:tabs>
+              <w:tab w:val="right" w:leader="dot" w:pos="9350"/>
+            </w:tabs>
+            <w:rPr>
+              <w:rFonts w:asciiTheme="minorHAnsi" w:eastAsiaTheme="minorEastAsia" w:hAnsiTheme="minorHAnsi" w:cstheme="minorBidi"/>
+              <w:noProof/>
+              <w:kern w:val="2"/>
+              <w:sz w:val="24"/>
+              <w:szCs w:val="24"/>
+              <w14:ligatures w14:val="standardContextual"/>
+            </w:rPr>
+          </w:pPr>
+          <w:hyperlink w:anchor="_Toc242787380" w:history="1">
+            <w:r>
+              <w:rPr>
+                <w:rStyle w:val="Hyperlink"/>
+                <w:noProof/>
+              </w:rPr>
+              <w:t>7.6 Jefe del LIVE (jefe.html)</w:t>
+            </w:r>
+            <w:r>
+              <w:rPr>
+                <w:noProof/>
+              </w:rPr>
+              <w:tab/>
+            </w:r>
+            <w:r>
+              <w:rPr>
+                <w:noProof/>
+              </w:rPr>
+              <w:fldChar w:fldCharType="begin"/>
+            </w:r>
+            <w:r>
+              <w:rPr>
+                <w:noProof/>
+              </w:rPr>
+              <w:instrText xml:space="preserve"> PAGEREF _Toc242787380 \h </w:instrText>
+            </w:r>
+            <w:r>
+              <w:rPr>
+                <w:noProof/>
+              </w:rPr>
+            </w:r>
+            <w:r>
+              <w:rPr>
+                <w:noProof/>
+              </w:rPr>
+              <w:fldChar w:fldCharType="separate"/>
+            </w:r>
+            <w:r>
+              <w:rPr>
+                <w:noProof/>
+              </w:rPr>
+              <w:t>23</w:t>
             </w:r>
             <w:r>
               <w:rPr>
@@ -1875,7 +1941,7 @@
               <w14:ligatures w14:val="standardContextual"/>
             </w:rPr>
           </w:pPr>
-          <w:hyperlink w:anchor="_Toc242786958" w:history="1">
+          <w:hyperlink w:anchor="_Toc242787381" w:history="1">
             <w:r>
               <w:rPr>
                 <w:rStyle w:val="Hyperlink"/>
@@ -1899,7 +1965,7 @@
               <w:rPr>
                 <w:noProof/>
               </w:rPr>
-              <w:instrText xml:space="preserve"> PAGEREF _Toc242786958 \h </w:instrText>
+              <w:instrText xml:space="preserve"> PAGEREF _Toc242787381 \h </w:instrText>
             </w:r>
             <w:r>
               <w:rPr>
@@ -1916,7 +1982,7 @@
               <w:rPr>
                 <w:noProof/>
               </w:rPr>
-              <w:t>24</w:t>
+              <w:t>25</w:t>
             </w:r>
             <w:r>
               <w:rPr>
@@ -1941,7 +2007,7 @@
               <w14:ligatures w14:val="standardContextual"/>
             </w:rPr>
           </w:pPr>
-          <w:hyperlink w:anchor="_Toc242786959" w:history="1">
+          <w:hyperlink w:anchor="_Toc242787382" w:history="1">
             <w:r>
               <w:rPr>
                 <w:rStyle w:val="Hyperlink"/>
@@ -1965,7 +2031,7 @@
               <w:rPr>
                 <w:noProof/>
               </w:rPr>
-              <w:instrText xml:space="preserve"> PAGEREF _Toc242786959 \h </w:instrText>
+              <w:instrText xml:space="preserve"> PAGEREF _Toc242787382 \h </w:instrText>
             </w:r>
             <w:r>
               <w:rPr>
@@ -1982,7 +2048,7 @@
               <w:rPr>
                 <w:noProof/>
               </w:rPr>
-              <w:t>24</w:t>
+              <w:t>25</w:t>
             </w:r>
             <w:r>
               <w:rPr>
@@ -2007,7 +2073,7 @@
               <w14:ligatures w14:val="standardContextual"/>
             </w:rPr>
           </w:pPr>
-          <w:hyperlink w:anchor="_Toc242786960" w:history="1">
+          <w:hyperlink w:anchor="_Toc242787383" w:history="1">
             <w:r>
               <w:rPr>
                 <w:rStyle w:val="Hyperlink"/>
@@ -2031,7 +2097,7 @@
               <w:rPr>
                 <w:noProof/>
               </w:rPr>
-              <w:instrText xml:space="preserve"> PAGEREF _Toc242786960 \h </w:instrText>
+              <w:instrText xml:space="preserve"> PAGEREF _Toc242787383 \h </w:instrText>
             </w:r>
             <w:r>
               <w:rPr>
@@ -2048,7 +2114,7 @@
               <w:rPr>
                 <w:noProof/>
               </w:rPr>
-              <w:t>24</w:t>
+              <w:t>25</w:t>
             </w:r>
             <w:r>
               <w:rPr>
@@ -2073,7 +2139,7 @@
               <w14:ligatures w14:val="standardContextual"/>
             </w:rPr>
           </w:pPr>
-          <w:hyperlink w:anchor="_Toc242786961" w:history="1">
+          <w:hyperlink w:anchor="_Toc242787384" w:history="1">
             <w:r>
               <w:rPr>
                 <w:rStyle w:val="Hyperlink"/>
@@ -2097,7 +2163,7 @@
               <w:rPr>
                 <w:noProof/>
               </w:rPr>
-              <w:instrText xml:space="preserve"> PAGEREF _Toc242786961 \h </w:instrText>
+              <w:instrText xml:space="preserve"> PAGEREF _Toc242787384 \h </w:instrText>
             </w:r>
             <w:r>
               <w:rPr>
@@ -2114,7 +2180,7 @@
               <w:rPr>
                 <w:noProof/>
               </w:rPr>
-              <w:t>24</w:t>
+              <w:t>25</w:t>
             </w:r>
             <w:r>
               <w:rPr>
@@ -2139,7 +2205,7 @@
               <w14:ligatures w14:val="standardContextual"/>
             </w:rPr>
           </w:pPr>
-          <w:hyperlink w:anchor="_Toc242786962" w:history="1">
+          <w:hyperlink w:anchor="_Toc242787385" w:history="1">
             <w:r>
               <w:rPr>
                 <w:rStyle w:val="Hyperlink"/>
@@ -2163,7 +2229,7 @@
               <w:rPr>
                 <w:noProof/>
               </w:rPr>
-              <w:instrText xml:space="preserve"> PAGEREF _Toc242786962 \h </w:instrText>
+              <w:instrText xml:space="preserve"> PAGEREF _Toc242787385 \h </w:instrText>
             </w:r>
             <w:r>
               <w:rPr>
@@ -2180,7 +2246,7 @@
               <w:rPr>
                 <w:noProof/>
               </w:rPr>
-              <w:t>25</w:t>
+              <w:t>26</w:t>
             </w:r>
             <w:r>
               <w:rPr>
@@ -2205,7 +2271,7 @@
               <w14:ligatures w14:val="standardContextual"/>
             </w:rPr>
           </w:pPr>
-          <w:hyperlink w:anchor="_Toc242786963" w:history="1">
+          <w:hyperlink w:anchor="_Toc242787386" w:history="1">
             <w:r>
               <w:rPr>
                 <w:rStyle w:val="Hyperlink"/>
@@ -2229,7 +2295,7 @@
               <w:rPr>
                 <w:noProof/>
               </w:rPr>
-              <w:instrText xml:space="preserve"> PAGEREF _Toc242786963 \h </w:instrText>
+              <w:instrText xml:space="preserve"> PAGEREF _Toc242787386 \h </w:instrText>
             </w:r>
             <w:r>
               <w:rPr>
@@ -2246,7 +2312,7 @@
               <w:rPr>
                 <w:noProof/>
               </w:rPr>
-              <w:t>25</w:t>
+              <w:t>26</w:t>
             </w:r>
             <w:r>
               <w:rPr>
@@ -2271,7 +2337,7 @@
               <w14:ligatures w14:val="standardContextual"/>
             </w:rPr>
           </w:pPr>
-          <w:hyperlink w:anchor="_Toc242786964" w:history="1">
+          <w:hyperlink w:anchor="_Toc242787387" w:history="1">
             <w:r>
               <w:rPr>
                 <w:rStyle w:val="Hyperlink"/>
@@ -2295,7 +2361,7 @@
               <w:rPr>
                 <w:noProof/>
               </w:rPr>
-              <w:instrText xml:space="preserve"> PAGEREF _Toc242786964 \h </w:instrText>
+              <w:instrText xml:space="preserve"> PAGEREF _Toc242787387 \h </w:instrText>
             </w:r>
             <w:r>
               <w:rPr>
@@ -2312,7 +2378,7 @@
               <w:rPr>
                 <w:noProof/>
               </w:rPr>
-              <w:t>26</w:t>
+              <w:t>27</w:t>
             </w:r>
             <w:r>
               <w:rPr>
@@ -2337,7 +2403,7 @@
               <w14:ligatures w14:val="standardContextual"/>
             </w:rPr>
           </w:pPr>
-          <w:hyperlink w:anchor="_Toc242786965" w:history="1">
+          <w:hyperlink w:anchor="_Toc242787388" w:history="1">
             <w:r>
               <w:rPr>
                 <w:rStyle w:val="Hyperlink"/>
@@ -2361,7 +2427,7 @@
               <w:rPr>
                 <w:noProof/>
               </w:rPr>
-              <w:instrText xml:space="preserve"> PAGEREF _Toc242786965 \h </w:instrText>
+              <w:instrText xml:space="preserve"> PAGEREF _Toc242787388 \h </w:instrText>
             </w:r>
             <w:r>
               <w:rPr>
@@ -2378,7 +2444,7 @@
               <w:rPr>
                 <w:noProof/>
               </w:rPr>
-              <w:t>26</w:t>
+              <w:t>27</w:t>
             </w:r>
             <w:r>
               <w:rPr>
@@ -2403,7 +2469,7 @@
               <w14:ligatures w14:val="standardContextual"/>
             </w:rPr>
           </w:pPr>
-          <w:hyperlink w:anchor="_Toc242786966" w:history="1">
+          <w:hyperlink w:anchor="_Toc242787389" w:history="1">
             <w:r>
               <w:rPr>
                 <w:rStyle w:val="Hyperlink"/>
@@ -2427,7 +2493,7 @@
               <w:rPr>
                 <w:noProof/>
               </w:rPr>
-              <w:instrText xml:space="preserve"> PAGEREF _Toc242786966 \h </w:instrText>
+              <w:instrText xml:space="preserve"> PAGEREF _Toc242787389 \h </w:instrText>
             </w:r>
             <w:r>
               <w:rPr>
@@ -2444,7 +2510,7 @@
               <w:rPr>
                 <w:noProof/>
               </w:rPr>
-              <w:t>27</w:t>
+              <w:t>28</w:t>
             </w:r>
             <w:r>
               <w:rPr>
@@ -2469,7 +2535,7 @@
               <w14:ligatures w14:val="standardContextual"/>
             </w:rPr>
           </w:pPr>
-          <w:hyperlink w:anchor="_Toc242786967" w:history="1">
+          <w:hyperlink w:anchor="_Toc242787390" w:history="1">
             <w:r>
               <w:rPr>
                 <w:rStyle w:val="Hyperlink"/>
@@ -2493,7 +2559,7 @@
               <w:rPr>
                 <w:noProof/>
               </w:rPr>
-              <w:instrText xml:space="preserve"> PAGEREF _Toc242786967 \h </w:instrText>
+              <w:instrText xml:space="preserve"> PAGEREF _Toc242787390 \h </w:instrText>
             </w:r>
             <w:r>
               <w:rPr>
@@ -2510,7 +2576,7 @@
               <w:rPr>
                 <w:noProof/>
               </w:rPr>
-              <w:t>27</w:t>
+              <w:t>29</w:t>
             </w:r>
             <w:r>
               <w:rPr>
@@ -2535,7 +2601,7 @@
               <w14:ligatures w14:val="standardContextual"/>
             </w:rPr>
           </w:pPr>
-          <w:hyperlink w:anchor="_Toc242786968" w:history="1">
+          <w:hyperlink w:anchor="_Toc242787391" w:history="1">
             <w:r>
               <w:rPr>
                 <w:rStyle w:val="Hyperlink"/>
@@ -2559,7 +2625,7 @@
               <w:rPr>
                 <w:noProof/>
               </w:rPr>
-              <w:instrText xml:space="preserve"> PAGEREF _Toc242786968 \h </w:instrText>
+              <w:instrText xml:space="preserve"> PAGEREF _Toc242787391 \h </w:instrText>
             </w:r>
             <w:r>
               <w:rPr>
@@ -2576,7 +2642,7 @@
               <w:rPr>
                 <w:noProof/>
               </w:rPr>
-              <w:t>29</w:t>
+              <w:t>30</w:t>
             </w:r>
             <w:r>
               <w:rPr>
@@ -2601,7 +2667,7 @@
               <w14:ligatures w14:val="standardContextual"/>
             </w:rPr>
           </w:pPr>
-          <w:hyperlink w:anchor="_Toc242786969" w:history="1">
+          <w:hyperlink w:anchor="_Toc242787392" w:history="1">
             <w:r>
               <w:rPr>
                 <w:rStyle w:val="Hyperlink"/>
@@ -2625,7 +2691,7 @@
               <w:rPr>
                 <w:noProof/>
               </w:rPr>
-              <w:instrText xml:space="preserve"> PAGEREF _Toc242786969 \h </w:instrText>
+              <w:instrText xml:space="preserve"> PAGEREF _Toc242787392 \h </w:instrText>
             </w:r>
             <w:r>
               <w:rPr>
@@ -2642,7 +2708,7 @@
               <w:rPr>
                 <w:noProof/>
               </w:rPr>
-              <w:t>29</w:t>
+              <w:t>30</w:t>
             </w:r>
             <w:r>
               <w:rPr>
@@ -2667,7 +2733,7 @@
               <w14:ligatures w14:val="standardContextual"/>
             </w:rPr>
           </w:pPr>
-          <w:hyperlink w:anchor="_Toc242786970" w:history="1">
+          <w:hyperlink w:anchor="_Toc242787393" w:history="1">
             <w:r>
               <w:rPr>
                 <w:rStyle w:val="Hyperlink"/>
@@ -2691,7 +2757,7 @@
               <w:rPr>
                 <w:noProof/>
               </w:rPr>
-              <w:instrText xml:space="preserve"> PAGEREF _Toc242786970 \h </w:instrText>
+              <w:instrText xml:space="preserve"> PAGEREF _Toc242787393 \h </w:instrText>
             </w:r>
             <w:r>
               <w:rPr>
@@ -2708,7 +2774,7 @@
               <w:rPr>
                 <w:noProof/>
               </w:rPr>
-              <w:t>29</w:t>
+              <w:t>30</w:t>
             </w:r>
             <w:r>
               <w:rPr>
@@ -2733,7 +2799,7 @@
               <w14:ligatures w14:val="standardContextual"/>
             </w:rPr>
           </w:pPr>
-          <w:hyperlink w:anchor="_Toc242786971" w:history="1">
+          <w:hyperlink w:anchor="_Toc242787394" w:history="1">
             <w:r>
               <w:rPr>
                 <w:rStyle w:val="Hyperlink"/>
@@ -2757,7 +2823,7 @@
               <w:rPr>
                 <w:noProof/>
               </w:rPr>
-              <w:instrText xml:space="preserve"> PAGEREF _Toc242786971 \h </w:instrText>
+              <w:instrText xml:space="preserve"> PAGEREF _Toc242787394 \h </w:instrText>
             </w:r>
             <w:r>
               <w:rPr>
@@ -2774,7 +2840,7 @@
               <w:rPr>
                 <w:noProof/>
               </w:rPr>
-              <w:t>29</w:t>
+              <w:t>30</w:t>
             </w:r>
             <w:r>
               <w:rPr>
@@ -2799,7 +2865,7 @@
               <w14:ligatures w14:val="standardContextual"/>
             </w:rPr>
           </w:pPr>
-          <w:hyperlink w:anchor="_Toc242786972" w:history="1">
+          <w:hyperlink w:anchor="_Toc242787395" w:history="1">
             <w:r>
               <w:rPr>
                 <w:rStyle w:val="Hyperlink"/>
@@ -2823,7 +2889,7 @@
               <w:rPr>
                 <w:noProof/>
               </w:rPr>
-              <w:instrText xml:space="preserve"> PAGEREF _Toc242786972 \h </w:instrText>
+              <w:instrText xml:space="preserve"> PAGEREF _Toc242787395 \h </w:instrText>
             </w:r>
             <w:r>
               <w:rPr>
@@ -2840,7 +2906,7 @@
               <w:rPr>
                 <w:noProof/>
               </w:rPr>
-              <w:t>30</w:t>
+              <w:t>31</w:t>
             </w:r>
             <w:r>
               <w:rPr>
@@ -2865,7 +2931,7 @@
               <w14:ligatures w14:val="standardContextual"/>
             </w:rPr>
           </w:pPr>
-          <w:hyperlink w:anchor="_Toc242786973" w:history="1">
+          <w:hyperlink w:anchor="_Toc242787396" w:history="1">
             <w:r>
               <w:rPr>
                 <w:rStyle w:val="Hyperlink"/>
@@ -2889,7 +2955,7 @@
               <w:rPr>
                 <w:noProof/>
               </w:rPr>
-              <w:instrText xml:space="preserve"> PAGEREF _Toc242786973 \h </w:instrText>
+              <w:instrText xml:space="preserve"> PAGEREF _Toc242787396 \h </w:instrText>
             </w:r>
             <w:r>
               <w:rPr>
@@ -2906,7 +2972,7 @@
               <w:rPr>
                 <w:noProof/>
               </w:rPr>
-              <w:t>30</w:t>
+              <w:t>31</w:t>
             </w:r>
             <w:r>
               <w:rPr>
@@ -2931,7 +2997,7 @@
               <w14:ligatures w14:val="standardContextual"/>
             </w:rPr>
           </w:pPr>
-          <w:hyperlink w:anchor="_Toc242786974" w:history="1">
+          <w:hyperlink w:anchor="_Toc242787397" w:history="1">
             <w:r>
               <w:rPr>
                 <w:rStyle w:val="Hyperlink"/>
@@ -2955,7 +3021,7 @@
               <w:rPr>
                 <w:noProof/>
               </w:rPr>
-              <w:instrText xml:space="preserve"> PAGEREF _Toc242786974 \h </w:instrText>
+              <w:instrText xml:space="preserve"> PAGEREF _Toc242787397 \h </w:instrText>
             </w:r>
             <w:r>
               <w:rPr>
@@ -2972,7 +3038,7 @@
               <w:rPr>
                 <w:noProof/>
               </w:rPr>
-              <w:t>30</w:t>
+              <w:t>31</w:t>
             </w:r>
             <w:r>
               <w:rPr>
@@ -2997,7 +3063,7 @@
               <w14:ligatures w14:val="standardContextual"/>
             </w:rPr>
           </w:pPr>
-          <w:hyperlink w:anchor="_Toc242786975" w:history="1">
+          <w:hyperlink w:anchor="_Toc242787398" w:history="1">
             <w:r>
               <w:rPr>
                 <w:rStyle w:val="Hyperlink"/>
@@ -3021,7 +3087,7 @@
               <w:rPr>
                 <w:noProof/>
               </w:rPr>
-              <w:instrText xml:space="preserve"> PAGEREF _Toc242786975 \h </w:instrText>
+              <w:instrText xml:space="preserve"> PAGEREF _Toc242787398 \h </w:instrText>
             </w:r>
             <w:r>
               <w:rPr>
@@ -3038,7 +3104,7 @@
               <w:rPr>
                 <w:noProof/>
               </w:rPr>
-              <w:t>32</w:t>
+              <w:t>33</w:t>
             </w:r>
             <w:r>
               <w:rPr>
@@ -3063,7 +3129,7 @@
               <w14:ligatures w14:val="standardContextual"/>
             </w:rPr>
           </w:pPr>
-          <w:hyperlink w:anchor="_Toc242786976" w:history="1">
+          <w:hyperlink w:anchor="_Toc242787399" w:history="1">
             <w:r>
               <w:rPr>
                 <w:rStyle w:val="Hyperlink"/>
@@ -3087,7 +3153,7 @@
               <w:rPr>
                 <w:noProof/>
               </w:rPr>
-              <w:instrText xml:space="preserve"> PAGEREF _Toc242786976 \h </w:instrText>
+              <w:instrText xml:space="preserve"> PAGEREF _Toc242787399 \h </w:instrText>
             </w:r>
             <w:r>
               <w:rPr>
@@ -3104,7 +3170,7 @@
               <w:rPr>
                 <w:noProof/>
               </w:rPr>
-              <w:t>32</w:t>
+              <w:t>33</w:t>
             </w:r>
             <w:r>
               <w:rPr>
@@ -3129,7 +3195,7 @@
               <w14:ligatures w14:val="standardContextual"/>
             </w:rPr>
           </w:pPr>
-          <w:hyperlink w:anchor="_Toc242786977" w:history="1">
+          <w:hyperlink w:anchor="_Toc242787400" w:history="1">
             <w:r>
               <w:rPr>
                 <w:rStyle w:val="Hyperlink"/>
@@ -3153,7 +3219,7 @@
               <w:rPr>
                 <w:noProof/>
               </w:rPr>
-              <w:instrText xml:space="preserve"> PAGEREF _Toc242786977 \h </w:instrText>
+              <w:instrText xml:space="preserve"> PAGEREF _Toc242787400 \h </w:instrText>
             </w:r>
             <w:r>
               <w:rPr>
@@ -3170,7 +3236,7 @@
               <w:rPr>
                 <w:noProof/>
               </w:rPr>
-              <w:t>32</w:t>
+              <w:t>33</w:t>
             </w:r>
             <w:r>
               <w:rPr>
@@ -3195,7 +3261,7 @@
               <w14:ligatures w14:val="standardContextual"/>
             </w:rPr>
           </w:pPr>
-          <w:hyperlink w:anchor="_Toc242786978" w:history="1">
+          <w:hyperlink w:anchor="_Toc242787401" w:history="1">
             <w:r>
               <w:rPr>
                 <w:rStyle w:val="Hyperlink"/>
@@ -3219,7 +3285,7 @@
               <w:rPr>
                 <w:noProof/>
               </w:rPr>
-              <w:instrText xml:space="preserve"> PAGEREF _Toc242786978 \h </w:instrText>
+              <w:instrText xml:space="preserve"> PAGEREF _Toc242787401 \h </w:instrText>
             </w:r>
             <w:r>
               <w:rPr>
@@ -3236,7 +3302,7 @@
               <w:rPr>
                 <w:noProof/>
               </w:rPr>
-              <w:t>34</w:t>
+              <w:t>35</w:t>
             </w:r>
             <w:r>
               <w:rPr>
@@ -3261,7 +3327,7 @@
               <w14:ligatures w14:val="standardContextual"/>
             </w:rPr>
           </w:pPr>
-          <w:hyperlink w:anchor="_Toc242786979" w:history="1">
+          <w:hyperlink w:anchor="_Toc242787402" w:history="1">
             <w:r>
               <w:rPr>
                 <w:rStyle w:val="Hyperlink"/>
@@ -3285,7 +3351,7 @@
               <w:rPr>
                 <w:noProof/>
               </w:rPr>
-              <w:instrText xml:space="preserve"> PAGEREF _Toc242786979 \h </w:instrText>
+              <w:instrText xml:space="preserve"> PAGEREF _Toc242787402 \h </w:instrText>
             </w:r>
             <w:r>
               <w:rPr>
@@ -3302,7 +3368,7 @@
               <w:rPr>
                 <w:noProof/>
               </w:rPr>
-              <w:t>35</w:t>
+              <w:t>36</w:t>
             </w:r>
             <w:r>
               <w:rPr>
@@ -3327,7 +3393,7 @@
               <w14:ligatures w14:val="standardContextual"/>
             </w:rPr>
           </w:pPr>
-          <w:hyperlink w:anchor="_Toc242786980" w:history="1">
+          <w:hyperlink w:anchor="_Toc242787403" w:history="1">
             <w:r>
               <w:rPr>
                 <w:rStyle w:val="Hyperlink"/>
@@ -3351,7 +3417,7 @@
               <w:rPr>
                 <w:noProof/>
               </w:rPr>
-              <w:instrText xml:space="preserve"> PAGEREF _Toc242786980 \h </w:instrText>
+              <w:instrText xml:space="preserve"> PAGEREF _Toc242787403 \h </w:instrText>
             </w:r>
             <w:r>
               <w:rPr>
@@ -3368,7 +3434,7 @@
               <w:rPr>
                 <w:noProof/>
               </w:rPr>
-              <w:t>37</w:t>
+              <w:t>38</w:t>
             </w:r>
             <w:r>
               <w:rPr>
@@ -3393,7 +3459,7 @@
               <w14:ligatures w14:val="standardContextual"/>
             </w:rPr>
           </w:pPr>
-          <w:hyperlink w:anchor="_Toc242786981" w:history="1">
+          <w:hyperlink w:anchor="_Toc242787404" w:history="1">
             <w:r>
               <w:rPr>
                 <w:rStyle w:val="Hyperlink"/>
@@ -3417,7 +3483,7 @@
               <w:rPr>
                 <w:noProof/>
               </w:rPr>
-              <w:instrText xml:space="preserve"> PAGEREF _Toc242786981 \h </w:instrText>
+              <w:instrText xml:space="preserve"> PAGEREF _Toc242787404 \h </w:instrText>
             </w:r>
             <w:r>
               <w:rPr>
@@ -3434,7 +3500,7 @@
               <w:rPr>
                 <w:noProof/>
               </w:rPr>
-              <w:t>37</w:t>
+              <w:t>38</w:t>
             </w:r>
             <w:r>
               <w:rPr>
@@ -3459,7 +3525,7 @@
               <w14:ligatures w14:val="standardContextual"/>
             </w:rPr>
           </w:pPr>
-          <w:hyperlink w:anchor="_Toc242786982" w:history="1">
+          <w:hyperlink w:anchor="_Toc242787405" w:history="1">
             <w:r>
               <w:rPr>
                 <w:rStyle w:val="Hyperlink"/>
@@ -3483,7 +3549,7 @@
               <w:rPr>
                 <w:noProof/>
               </w:rPr>
-              <w:instrText xml:space="preserve"> PAGEREF _Toc242786982 \h </w:instrText>
+              <w:instrText xml:space="preserve"> PAGEREF _Toc242787405 \h </w:instrText>
             </w:r>
             <w:r>
               <w:rPr>
@@ -3500,7 +3566,7 @@
               <w:rPr>
                 <w:noProof/>
               </w:rPr>
-              <w:t>37</w:t>
+              <w:t>38</w:t>
             </w:r>
             <w:r>
               <w:rPr>
@@ -3525,7 +3591,7 @@
               <w14:ligatures w14:val="standardContextual"/>
             </w:rPr>
           </w:pPr>
-          <w:hyperlink w:anchor="_Toc242786983" w:history="1">
+          <w:hyperlink w:anchor="_Toc242787406" w:history="1">
             <w:r>
               <w:rPr>
                 <w:rStyle w:val="Hyperlink"/>
@@ -3549,7 +3615,7 @@
               <w:rPr>
                 <w:noProof/>
               </w:rPr>
-              <w:instrText xml:space="preserve"> PAGEREF _Toc242786983 \h </w:instrText>
+              <w:instrText xml:space="preserve"> PAGEREF _Toc242787406 \h </w:instrText>
             </w:r>
             <w:r>
               <w:rPr>
@@ -3566,7 +3632,7 @@
               <w:rPr>
                 <w:noProof/>
               </w:rPr>
-              <w:t>38</w:t>
+              <w:t>39</w:t>
             </w:r>
             <w:r>
               <w:rPr>
@@ -3591,7 +3657,7 @@
               <w14:ligatures w14:val="standardContextual"/>
             </w:rPr>
           </w:pPr>
-          <w:hyperlink w:anchor="_Toc242786984" w:history="1">
+          <w:hyperlink w:anchor="_Toc242787407" w:history="1">
             <w:r>
               <w:rPr>
                 <w:rStyle w:val="Hyperlink"/>
@@ -3615,7 +3681,7 @@
               <w:rPr>
                 <w:noProof/>
               </w:rPr>
-              <w:instrText xml:space="preserve"> PAGEREF _Toc242786984 \h </w:instrText>
+              <w:instrText xml:space="preserve"> PAGEREF _Toc242787407 \h </w:instrText>
             </w:r>
             <w:r>
               <w:rPr>
@@ -3632,7 +3698,7 @@
               <w:rPr>
                 <w:noProof/>
               </w:rPr>
-              <w:t>39</w:t>
+              <w:t>40</w:t>
             </w:r>
             <w:r>
               <w:rPr>
@@ -3657,7 +3723,7 @@
               <w14:ligatures w14:val="standardContextual"/>
             </w:rPr>
           </w:pPr>
-          <w:hyperlink w:anchor="_Toc242786985" w:history="1">
+          <w:hyperlink w:anchor="_Toc242787408" w:history="1">
             <w:r>
               <w:rPr>
                 <w:rStyle w:val="Hyperlink"/>
@@ -3681,7 +3747,7 @@
               <w:rPr>
                 <w:noProof/>
               </w:rPr>
-              <w:instrText xml:space="preserve"> PAGEREF _Toc242786985 \h </w:instrText>
+              <w:instrText xml:space="preserve"> PAGEREF _Toc242787408 \h </w:instrText>
             </w:r>
             <w:r>
               <w:rPr>
@@ -3698,7 +3764,7 @@
               <w:rPr>
                 <w:noProof/>
               </w:rPr>
-              <w:t>39</w:t>
+              <w:t>40</w:t>
             </w:r>
             <w:r>
               <w:rPr>
@@ -3723,7 +3789,7 @@
               <w14:ligatures w14:val="standardContextual"/>
             </w:rPr>
           </w:pPr>
-          <w:hyperlink w:anchor="_Toc242786986" w:history="1">
+          <w:hyperlink w:anchor="_Toc242787409" w:history="1">
             <w:r>
               <w:rPr>
                 <w:rStyle w:val="Hyperlink"/>
@@ -3747,7 +3813,7 @@
               <w:rPr>
                 <w:noProof/>
               </w:rPr>
-              <w:instrText xml:space="preserve"> PAGEREF _Toc242786986 \h </w:instrText>
+              <w:instrText xml:space="preserve"> PAGEREF _Toc242787409 \h </w:instrText>
             </w:r>
             <w:r>
               <w:rPr>
@@ -3764,7 +3830,7 @@
               <w:rPr>
                 <w:noProof/>
               </w:rPr>
-              <w:t>40</w:t>
+              <w:t>41</w:t>
             </w:r>
             <w:r>
               <w:rPr>
@@ -3789,7 +3855,7 @@
               <w14:ligatures w14:val="standardContextual"/>
             </w:rPr>
           </w:pPr>
-          <w:hyperlink w:anchor="_Toc242786987" w:history="1">
+          <w:hyperlink w:anchor="_Toc242787410" w:history="1">
             <w:r>
               <w:rPr>
                 <w:rStyle w:val="Hyperlink"/>
@@ -3813,7 +3879,7 @@
               <w:rPr>
                 <w:noProof/>
               </w:rPr>
-              <w:instrText xml:space="preserve"> PAGEREF _Toc242786987 \h </w:instrText>
+              <w:instrText xml:space="preserve"> PAGEREF _Toc242787410 \h </w:instrText>
             </w:r>
             <w:r>
               <w:rPr>
@@ -3830,7 +3896,7 @@
               <w:rPr>
                 <w:noProof/>
               </w:rPr>
-              <w:t>41</w:t>
+              <w:t>42</w:t>
             </w:r>
             <w:r>
               <w:rPr>
@@ -3855,7 +3921,7 @@
               <w14:ligatures w14:val="standardContextual"/>
             </w:rPr>
           </w:pPr>
-          <w:hyperlink w:anchor="_Toc242786988" w:history="1">
+          <w:hyperlink w:anchor="_Toc242787411" w:history="1">
             <w:r>
               <w:rPr>
                 <w:rStyle w:val="Hyperlink"/>
@@ -3879,7 +3945,7 @@
               <w:rPr>
                 <w:noProof/>
               </w:rPr>
-              <w:instrText xml:space="preserve"> PAGEREF _Toc242786988 \h </w:instrText>
+              <w:instrText xml:space="preserve"> PAGEREF _Toc242787411 \h </w:instrText>
             </w:r>
             <w:r>
               <w:rPr>
@@ -3896,7 +3962,7 @@
               <w:rPr>
                 <w:noProof/>
               </w:rPr>
-              <w:t>41</w:t>
+              <w:t>42</w:t>
             </w:r>
             <w:r>
               <w:rPr>
@@ -3921,7 +3987,7 @@
               <w14:ligatures w14:val="standardContextual"/>
             </w:rPr>
           </w:pPr>
-          <w:hyperlink w:anchor="_Toc242786989" w:history="1">
+          <w:hyperlink w:anchor="_Toc242787412" w:history="1">
             <w:r>
               <w:rPr>
                 <w:rStyle w:val="Hyperlink"/>
@@ -3945,7 +4011,7 @@
               <w:rPr>
                 <w:noProof/>
               </w:rPr>
-              <w:instrText xml:space="preserve"> PAGEREF _Toc242786989 \h </w:instrText>
+              <w:instrText xml:space="preserve"> PAGEREF _Toc242787412 \h </w:instrText>
             </w:r>
             <w:r>
               <w:rPr>
@@ -3962,7 +4028,7 @@
               <w:rPr>
                 <w:noProof/>
               </w:rPr>
-              <w:t>41</w:t>
+              <w:t>42</w:t>
             </w:r>
             <w:r>
               <w:rPr>
@@ -3987,7 +4053,7 @@
               <w14:ligatures w14:val="standardContextual"/>
             </w:rPr>
           </w:pPr>
-          <w:hyperlink w:anchor="_Toc242786990" w:history="1">
+          <w:hyperlink w:anchor="_Toc242787413" w:history="1">
             <w:r>
               <w:rPr>
                 <w:rStyle w:val="Hyperlink"/>
@@ -4011,7 +4077,7 @@
               <w:rPr>
                 <w:noProof/>
               </w:rPr>
-              <w:instrText xml:space="preserve"> PAGEREF _Toc242786990 \h </w:instrText>
+              <w:instrText xml:space="preserve"> PAGEREF _Toc242787413 \h </w:instrText>
             </w:r>
             <w:r>
               <w:rPr>
@@ -4028,7 +4094,7 @@
               <w:rPr>
                 <w:noProof/>
               </w:rPr>
-              <w:t>43</w:t>
+              <w:t>44</w:t>
             </w:r>
             <w:r>
               <w:rPr>
@@ -4053,7 +4119,7 @@
               <w14:ligatures w14:val="standardContextual"/>
             </w:rPr>
           </w:pPr>
-          <w:hyperlink w:anchor="_Toc242786991" w:history="1">
+          <w:hyperlink w:anchor="_Toc242787414" w:history="1">
             <w:r>
               <w:rPr>
                 <w:rStyle w:val="Hyperlink"/>
@@ -4077,7 +4143,7 @@
               <w:rPr>
                 <w:noProof/>
               </w:rPr>
-              <w:instrText xml:space="preserve"> PAGEREF _Toc242786991 \h </w:instrText>
+              <w:instrText xml:space="preserve"> PAGEREF _Toc242787414 \h </w:instrText>
             </w:r>
             <w:r>
               <w:rPr>
@@ -4094,7 +4160,7 @@
               <w:rPr>
                 <w:noProof/>
               </w:rPr>
-              <w:t>43</w:t>
+              <w:t>44</w:t>
             </w:r>
             <w:r>
               <w:rPr>
@@ -4119,7 +4185,7 @@
               <w14:ligatures w14:val="standardContextual"/>
             </w:rPr>
           </w:pPr>
-          <w:hyperlink w:anchor="_Toc242786992" w:history="1">
+          <w:hyperlink w:anchor="_Toc242787415" w:history="1">
             <w:r>
               <w:rPr>
                 <w:rStyle w:val="Hyperlink"/>
@@ -4143,7 +4209,7 @@
               <w:rPr>
                 <w:noProof/>
               </w:rPr>
-              <w:instrText xml:space="preserve"> PAGEREF _Toc242786992 \h </w:instrText>
+              <w:instrText xml:space="preserve"> PAGEREF _Toc242787415 \h </w:instrText>
             </w:r>
             <w:r>
               <w:rPr>
@@ -4160,7 +4226,7 @@
               <w:rPr>
                 <w:noProof/>
               </w:rPr>
-              <w:t>43</w:t>
+              <w:t>44</w:t>
             </w:r>
             <w:r>
               <w:rPr>
@@ -4185,7 +4251,7 @@
               <w14:ligatures w14:val="standardContextual"/>
             </w:rPr>
           </w:pPr>
-          <w:hyperlink w:anchor="_Toc242786993" w:history="1">
+          <w:hyperlink w:anchor="_Toc242787416" w:history="1">
             <w:r>
               <w:rPr>
                 <w:rStyle w:val="Hyperlink"/>
@@ -4209,7 +4275,7 @@
               <w:rPr>
                 <w:noProof/>
               </w:rPr>
-              <w:instrText xml:space="preserve"> PAGEREF _Toc242786993 \h </w:instrText>
+              <w:instrText xml:space="preserve"> PAGEREF _Toc242787416 \h </w:instrText>
             </w:r>
             <w:r>
               <w:rPr>
@@ -4226,7 +4292,7 @@
               <w:rPr>
                 <w:noProof/>
               </w:rPr>
-              <w:t>43</w:t>
+              <w:t>44</w:t>
             </w:r>
             <w:r>
               <w:rPr>
@@ -4251,7 +4317,7 @@
               <w14:ligatures w14:val="standardContextual"/>
             </w:rPr>
           </w:pPr>
-          <w:hyperlink w:anchor="_Toc242786994" w:history="1">
+          <w:hyperlink w:anchor="_Toc242787417" w:history="1">
             <w:r>
               <w:rPr>
                 <w:rStyle w:val="Hyperlink"/>
@@ -4275,7 +4341,7 @@
               <w:rPr>
                 <w:noProof/>
               </w:rPr>
-              <w:instrText xml:space="preserve"> PAGEREF _Toc242786994 \h </w:instrText>
+              <w:instrText xml:space="preserve"> PAGEREF _Toc242787417 \h </w:instrText>
             </w:r>
             <w:r>
               <w:rPr>
@@ -4292,7 +4358,7 @@
               <w:rPr>
                 <w:noProof/>
               </w:rPr>
-              <w:t>43</w:t>
+              <w:t>45</w:t>
             </w:r>
             <w:r>
               <w:rPr>
@@ -4317,7 +4383,7 @@
               <w14:ligatures w14:val="standardContextual"/>
             </w:rPr>
           </w:pPr>
-          <w:hyperlink w:anchor="_Toc242786995" w:history="1">
+          <w:hyperlink w:anchor="_Toc242787418" w:history="1">
             <w:r>
               <w:rPr>
                 <w:rStyle w:val="Hyperlink"/>
@@ -4341,7 +4407,7 @@
               <w:rPr>
                 <w:noProof/>
               </w:rPr>
-              <w:instrText xml:space="preserve"> PAGEREF _Toc242786995 \h </w:instrText>
+              <w:instrText xml:space="preserve"> PAGEREF _Toc242787418 \h </w:instrText>
             </w:r>
             <w:r>
               <w:rPr>
@@ -4358,7 +4424,7 @@
               <w:rPr>
                 <w:noProof/>
               </w:rPr>
-              <w:t>45</w:t>
+              <w:t>46</w:t>
             </w:r>
             <w:r>
               <w:rPr>
@@ -4392,7 +4458,7 @@
         <w:pStyle w:val="Heading1"/>
         <w:pageBreakBefore/>
       </w:pPr>
-      <w:bookmarkStart w:id="0" w:name="_Toc242786932"/>
+      <w:bookmarkStart w:id="0" w:name="_Toc242787354"/>
       <w:r>
         <w:lastRenderedPageBreak/>
         <w:t>1. Resumen ejecutivo</w:t>
@@ -4404,7 +4470,7 @@
         <w:spacing w:after="120"/>
       </w:pPr>
       <w:r>
-        <w:t>Este proyecto es un conjunto de herramientas para transmisiones en vivo de TikTok, inspirado en TikFinity. Permite poner en pantalla, mediante OBS Studio o TikTok LIVE Studio, elementos que reaccionan a lo que hace el público durante el LIVE: una ruleta que gira cuando alguien envía un regalo (con una segunda ruleta premium), barras de meta que se llenan con likes, seguidores, compartidos o monedas, alertas animadas, una carrera de regalos entre integrantes con reloj por rondas y una batalla de regalos (tira y afloja) entre dos equipos. Además incluye un panel para ver la actividad del LIVE en tiempo real y un catálogo de regalos con su código (ID).</w:t>
+        <w:t>Este proyecto es un conjunto de herramientas para transmisiones en vivo de TikTok, inspirado en TikFinity. Permite poner en pantalla, mediante OBS Studio o TikTok LIVE Studio, elementos que reaccionan a lo que hace el público durante el LIVE: una ruleta que gira cuando alguien envía un regalo (con una segunda ruleta premium), barras de meta que se llenan con likes, seguidores, compartidos o monedas, alertas animadas, una carrera de regalos entre integrantes con reloj por rondas , una batalla de regalos (tira y afloja) entre dos equipos y un jefe del LIVE, un reto cooperativo en el que el chat le quita vida a un jefe antes de que se acabe el tiempo. Además incluye un panel para ver la actividad del LIVE en tiempo real y un catálogo de regalos con su código (ID).</w:t>
       </w:r>
     </w:p>
     <w:p>
@@ -4446,7 +4512,7 @@
         <w:pStyle w:val="Heading1"/>
         <w:pageBreakBefore/>
       </w:pPr>
-      <w:bookmarkStart w:id="1" w:name="_Toc242786933"/>
+      <w:bookmarkStart w:id="1" w:name="_Toc242787355"/>
       <w:r>
         <w:lastRenderedPageBreak/>
         <w:t>2. Conceptos y glosario</w:t>
@@ -4644,7 +4710,7 @@
               <w:spacing w:after="20"/>
             </w:pPr>
             <w:r>
-              <w:t>Una página web pequeña (por ejemplo ruleta.html) con fondo transparente que se pone encima de la cámara en OBS. En el proyecto hay cinco: ruleta (normal y premium), meta, alertas, carrera de regalos y batalla de regalos.</w:t>
+              <w:t>Una página web pequeña (por ejemplo ruleta.html) con fondo transparente que se pone encima de la cámara en OBS. En el proyecto hay seis: ruleta (normal y premium), meta, alertas, carrera de regalos, batalla de regalos y jefe del LIVE.</w:t>
             </w:r>
           </w:p>
         </w:tc>
@@ -5191,7 +5257,7 @@
               <w:spacing w:after="20"/>
             </w:pPr>
             <w:r>
-              <w:t>Ronda (carrera y batalla)</w:t>
+              <w:t>Ronda (carrera, batalla y jefe)</w:t>
             </w:r>
           </w:p>
         </w:tc>
@@ -5216,7 +5282,7 @@
               <w:spacing w:after="20"/>
             </w:pPr>
             <w:r>
-              <w:t>Un periodo de juego en la carrera o la batalla de regalos. En la carrera tiene reloj (se inicia, pausa y reinicia desde el panel); en ambas, al reiniciar, los puntos vuelven a 0.</w:t>
+              <w:t>Un periodo de juego en la carrera, la batalla o el jefe del LIVE. La carrera y el jefe tienen reloj (se inicia, pausa y reinicia desde el panel); al reiniciar, los puntos vuelven a 0 y el jefe recupera toda su vida.</w:t>
             </w:r>
           </w:p>
         </w:tc>
@@ -5243,6 +5309,7 @@
               <w:spacing w:after="20"/>
             </w:pPr>
             <w:r>
+              <w:lastRenderedPageBreak/>
               <w:t>Diamantes / monedas</w:t>
             </w:r>
           </w:p>
@@ -5307,7 +5374,6 @@
               <w:spacing w:after="20"/>
             </w:pPr>
             <w:r>
-              <w:lastRenderedPageBreak/>
               <w:t>Frontend</w:t>
             </w:r>
           </w:p>
@@ -5829,7 +5895,7 @@
         <w:pStyle w:val="Heading1"/>
         <w:pageBreakBefore/>
       </w:pPr>
-      <w:bookmarkStart w:id="2" w:name="_Toc242786934"/>
+      <w:bookmarkStart w:id="2" w:name="_Toc242787356"/>
       <w:r>
         <w:lastRenderedPageBreak/>
         <w:t>3. Arquitectura general</w:t>
@@ -5840,7 +5906,7 @@
       <w:pPr>
         <w:pStyle w:val="Heading2"/>
       </w:pPr>
-      <w:bookmarkStart w:id="3" w:name="_Toc242786935"/>
+      <w:bookmarkStart w:id="3" w:name="_Toc242787357"/>
       <w:r>
         <w:t>3.1 Piezas del sistema</w:t>
       </w:r>
@@ -6401,7 +6467,7 @@
               <w:spacing w:after="20"/>
             </w:pPr>
             <w:r>
-              <w:t>Widgets (ruleta.html, meta.html, alertas.html, carrera.html, batalla.html)</w:t>
+              <w:t>Widgets (ruleta.html, meta.html, alertas.html, carrera.html, batalla.html, jefe.html)</w:t>
             </w:r>
           </w:p>
         </w:tc>
@@ -6466,7 +6532,7 @@
       <w:pPr>
         <w:pStyle w:val="Heading2"/>
       </w:pPr>
-      <w:bookmarkStart w:id="4" w:name="_Toc242786936"/>
+      <w:bookmarkStart w:id="4" w:name="_Toc242787358"/>
       <w:r>
         <w:t>3.2 Flujo de datos</w:t>
       </w:r>
@@ -6719,7 +6785,7 @@
         <w:spacing w:after="60"/>
       </w:pPr>
       <w:r>
-        <w:t>El widget convierte cada evento a un formato simple (evento normalizado) y reacciona: gira la ruleta, llena la barra, muestra una alerta suma puntos a un integrante de la carrera o empuja la barra de la batalla.</w:t>
+        <w:t>El widget convierte cada evento a un formato simple (evento normalizado) y reacciona: gira la ruleta, llena la barra, muestra una alerta, suma puntos a un integrante de la carrera, empuja la barra de la batalla o le quita vida al jefe.</w:t>
       </w:r>
     </w:p>
     <w:p>
@@ -6761,7 +6827,7 @@
         <w:pStyle w:val="Heading1"/>
         <w:pageBreakBefore/>
       </w:pPr>
-      <w:bookmarkStart w:id="5" w:name="_Toc242786937"/>
+      <w:bookmarkStart w:id="5" w:name="_Toc242787359"/>
       <w:r>
         <w:lastRenderedPageBreak/>
         <w:t>4. Servicios externos</w:t>
@@ -6772,7 +6838,7 @@
       <w:pPr>
         <w:pStyle w:val="Heading2"/>
       </w:pPr>
-      <w:bookmarkStart w:id="6" w:name="_Toc242786938"/>
+      <w:bookmarkStart w:id="6" w:name="_Toc242787360"/>
       <w:r>
         <w:t>4.1 TikTok LIVE</w:t>
       </w:r>
@@ -7531,7 +7597,7 @@
       <w:pPr>
         <w:pStyle w:val="Heading2"/>
       </w:pPr>
-      <w:bookmarkStart w:id="7" w:name="_Toc242786939"/>
+      <w:bookmarkStart w:id="7" w:name="_Toc242787361"/>
       <w:r>
         <w:t>4.2 Euler Stream</w:t>
       </w:r>
@@ -8823,7 +8889,7 @@
       <w:pPr>
         <w:pStyle w:val="Heading2"/>
       </w:pPr>
-      <w:bookmarkStart w:id="8" w:name="_Toc242786940"/>
+      <w:bookmarkStart w:id="8" w:name="_Toc242787362"/>
       <w:r>
         <w:t>4.3 GitHub, GitHub Actions y GitHub Pages</w:t>
       </w:r>
@@ -9027,7 +9093,7 @@
       <w:pPr>
         <w:pStyle w:val="Heading2"/>
       </w:pPr>
-      <w:bookmarkStart w:id="9" w:name="_Toc242786941"/>
+      <w:bookmarkStart w:id="9" w:name="_Toc242787363"/>
       <w:r>
         <w:t>4.4 Google Fonts</w:t>
       </w:r>
@@ -9057,7 +9123,7 @@
       <w:pPr>
         <w:pStyle w:val="Heading2"/>
       </w:pPr>
-      <w:bookmarkStart w:id="10" w:name="_Toc242786942"/>
+      <w:bookmarkStart w:id="10" w:name="_Toc242787364"/>
       <w:r>
         <w:lastRenderedPageBreak/>
         <w:t>4.5 Supabase (cambios en vivo)</w:t>
@@ -9313,7 +9379,7 @@
         <w:pStyle w:val="Heading1"/>
         <w:pageBreakBefore/>
       </w:pPr>
-      <w:bookmarkStart w:id="11" w:name="_Toc242786943"/>
+      <w:bookmarkStart w:id="11" w:name="_Toc242787365"/>
       <w:r>
         <w:lastRenderedPageBreak/>
         <w:t>5. Estructura de archivos</w:t>
@@ -9446,6 +9512,17 @@
         <w:ind w:left="200" w:right="200"/>
       </w:pPr>
       <w:r>
+        <w:t>│   ├── jefe.html                   widget jefe del LIVE (boss raid)</w:t>
+      </w:r>
+    </w:p>
+    <w:p>
+      <w:pPr>
+        <w:keepLines/>
+        <w:shd w:val="clear" w:color="auto" w:fill="F2F2F2"/>
+        <w:spacing w:line="260" w:lineRule="auto"/>
+        <w:ind w:left="200" w:right="200"/>
+      </w:pPr>
+      <w:r>
         <w:rPr>
           <w:rFonts w:ascii="Consolas" w:eastAsia="Consolas" w:hAnsi="Consolas" w:cs="Consolas"/>
           <w:sz w:val="18"/>
@@ -9510,7 +9587,7 @@
           <w:sz w:val="18"/>
           <w:szCs w:val="18"/>
         </w:rPr>
-        <w:t>│   │   └── widgets/ruleta.css · meta.css · alertas.css · carrera.css · batalla.css</w:t>
+        <w:t>│   │   └── widgets/ruleta.css · meta.css · alertas.css · carrera.css · batalla.css · jefe.css</w:t>
       </w:r>
     </w:p>
     <w:p>
@@ -9580,23 +9657,28 @@
         <w:ind w:left="200" w:right="200"/>
       </w:pPr>
       <w:r>
-        <w:t>│       ├── reloj.js                reloj por rondas de la carrera (hora de término)</w:t>
-      </w:r>
-    </w:p>
-    <w:p>
-      <w:pPr>
-        <w:keepLines/>
-        <w:shd w:val="clear" w:color="auto" w:fill="F2F2F2"/>
-        <w:spacing w:line="260" w:lineRule="auto"/>
-        <w:ind w:left="200" w:right="200"/>
-      </w:pPr>
-      <w:r>
         <w:rPr>
           <w:rFonts w:ascii="Consolas" w:eastAsia="Consolas" w:hAnsi="Consolas" w:cs="Consolas"/>
           <w:sz w:val="18"/>
           <w:szCs w:val="18"/>
         </w:rPr>
-        <w:t>│       ├── widgets/ruleta.js · meta.js · alertas.js · carrera.js · batalla.js</w:t>
+        <w:t>│       ├── reloj.js                reloj por rondas (hora de término): carrera y jefe</w:t>
+      </w:r>
+    </w:p>
+    <w:p>
+      <w:pPr>
+        <w:keepLines/>
+        <w:shd w:val="clear" w:color="auto" w:fill="F2F2F2"/>
+        <w:spacing w:line="260" w:lineRule="auto"/>
+        <w:ind w:left="200" w:right="200"/>
+      </w:pPr>
+      <w:r>
+        <w:rPr>
+          <w:rFonts w:ascii="Consolas" w:eastAsia="Consolas" w:hAnsi="Consolas" w:cs="Consolas"/>
+          <w:sz w:val="18"/>
+          <w:szCs w:val="18"/>
+        </w:rPr>
+        <w:t>│       ├── widgets/ruleta.js · meta.js · alertas.js · carrera.js · batalla.js · jefe.js</w:t>
       </w:r>
     </w:p>
     <w:p>
@@ -9735,7 +9817,7 @@
           <w:sz w:val="18"/>
           <w:szCs w:val="18"/>
         </w:rPr>
-        <w:t>│           └── vistas/ruleta.js · metas.js · alertas.js · carrera.js · batalla.js · actividad.js · regalos.js · conexion.js</w:t>
+        <w:t>│           └── vistas/ruleta.js · metas.js · alertas.js · carrera.js · batalla.js · jefe.js · actividad.js · regalos.js · conexion.js</w:t>
       </w:r>
     </w:p>
     <w:p>
@@ -9889,7 +9971,7 @@
         <w:pStyle w:val="Heading1"/>
         <w:pageBreakBefore/>
       </w:pPr>
-      <w:bookmarkStart w:id="12" w:name="_Toc242786944"/>
+      <w:bookmarkStart w:id="12" w:name="_Toc242787366"/>
       <w:r>
         <w:lastRenderedPageBreak/>
         <w:t>6. Frontend: el módulo compartido comun.js</w:t>
@@ -9917,7 +9999,7 @@
       <w:pPr>
         <w:pStyle w:val="Heading2"/>
       </w:pPr>
-      <w:bookmarkStart w:id="13" w:name="_Toc242786945"/>
+      <w:bookmarkStart w:id="13" w:name="_Toc242787367"/>
       <w:r>
         <w:t>6.1 Configuración en la URL</w:t>
       </w:r>
@@ -10388,7 +10470,7 @@
       <w:pPr>
         <w:pStyle w:val="Heading2"/>
       </w:pPr>
-      <w:bookmarkStart w:id="14" w:name="_Toc242786946"/>
+      <w:bookmarkStart w:id="14" w:name="_Toc242787368"/>
       <w:r>
         <w:t>6.2 Eventos normalizados</w:t>
       </w:r>
@@ -11174,7 +11256,7 @@
       <w:pPr>
         <w:pStyle w:val="Heading2"/>
       </w:pPr>
-      <w:bookmarkStart w:id="15" w:name="_Toc242786947"/>
+      <w:bookmarkStart w:id="15" w:name="_Toc242787369"/>
       <w:r>
         <w:t>6.3 Rastreador de regalos (combos y regalos sueltos)</w:t>
       </w:r>
@@ -11904,7 +11986,7 @@
       <w:pPr>
         <w:pStyle w:val="Heading2"/>
       </w:pPr>
-      <w:bookmarkStart w:id="16" w:name="_Toc242786948"/>
+      <w:bookmarkStart w:id="16" w:name="_Toc242787370"/>
       <w:r>
         <w:t>6.4 Conexión con TikTok (conectarTikTok)</w:t>
       </w:r>
@@ -12025,7 +12107,7 @@
       <w:pPr>
         <w:pStyle w:val="Heading2"/>
       </w:pPr>
-      <w:bookmarkStart w:id="17" w:name="_Toc242786949"/>
+      <w:bookmarkStart w:id="17" w:name="_Toc242787371"/>
       <w:r>
         <w:t>6.5 Arranque de widgets (iniciarWidget)</w:t>
       </w:r>
@@ -12251,7 +12333,7 @@
       <w:pPr>
         <w:pStyle w:val="Heading2"/>
       </w:pPr>
-      <w:bookmarkStart w:id="18" w:name="_Toc242786950"/>
+      <w:bookmarkStart w:id="18" w:name="_Toc242787372"/>
       <w:r>
         <w:t>6.6 Utilidades</w:t>
       </w:r>
@@ -12317,7 +12399,7 @@
       <w:pPr>
         <w:pStyle w:val="Heading2"/>
       </w:pPr>
-      <w:bookmarkStart w:id="19" w:name="_Toc242786951"/>
+      <w:bookmarkStart w:id="19" w:name="_Toc242787373"/>
       <w:r>
         <w:lastRenderedPageBreak/>
         <w:t>6.7 Cambios en vivo (nube.js)</w:t>
@@ -12397,7 +12479,7 @@
         <w:pStyle w:val="Heading1"/>
         <w:pageBreakBefore/>
       </w:pPr>
-      <w:bookmarkStart w:id="20" w:name="_Toc242786952"/>
+      <w:bookmarkStart w:id="20" w:name="_Toc242787374"/>
       <w:r>
         <w:lastRenderedPageBreak/>
         <w:t>7. Frontend: los widgets</w:t>
@@ -12440,7 +12522,7 @@
       <w:pPr>
         <w:pStyle w:val="Heading2"/>
       </w:pPr>
-      <w:bookmarkStart w:id="21" w:name="_Toc242786953"/>
+      <w:bookmarkStart w:id="21" w:name="_Toc242787375"/>
       <w:r>
         <w:t>7.1 Ruleta de regalos (ruleta.html)</w:t>
       </w:r>
@@ -13535,7 +13617,7 @@
       <w:pPr>
         <w:pStyle w:val="Heading2"/>
       </w:pPr>
-      <w:bookmarkStart w:id="22" w:name="_Toc242786954"/>
+      <w:bookmarkStart w:id="22" w:name="_Toc242787376"/>
       <w:r>
         <w:t>7.2 Meta (meta.html)</w:t>
       </w:r>
@@ -14145,7 +14227,7 @@
       <w:pPr>
         <w:pStyle w:val="Heading2"/>
       </w:pPr>
-      <w:bookmarkStart w:id="23" w:name="_Toc242786955"/>
+      <w:bookmarkStart w:id="23" w:name="_Toc242787377"/>
       <w:r>
         <w:t>7.3 Alertas (alertas.html)</w:t>
       </w:r>
@@ -14512,7 +14594,7 @@
       <w:pPr>
         <w:pStyle w:val="Heading2"/>
       </w:pPr>
-      <w:bookmarkStart w:id="24" w:name="_Toc242786956"/>
+      <w:bookmarkStart w:id="24" w:name="_Toc242787378"/>
       <w:r>
         <w:t>7.4 Carrera de regalos (carrera.html)</w:t>
       </w:r>
@@ -15446,19 +15528,7 @@
         <w:spacing w:after="120"/>
       </w:pPr>
       <w:r>
-        <w:t xml:space="preserve">El reloj no cuenta segundos: guarda la hora en que termina la ronda. Así el panel y OBS muestran lo mismo aunque el cambio tarde un momento en llegar por Supabase, y el widget puede recargarse sin perder la cuenta. </w:t>
-      </w:r>
-      <w:r>
-        <w:rPr>
-          <w:rFonts w:ascii="Consolas" w:eastAsia="Consolas" w:hAnsi="Consolas" w:cs="Consolas"/>
-          <w:color w:val="7A1F33"/>
-          <w:sz w:val="19"/>
-          <w:szCs w:val="19"/>
-        </w:rPr>
-        <w:t>js/reloj.js</w:t>
-      </w:r>
-      <w:r>
-        <w:t xml:space="preserve"> lo usan el panel y el widget:</w:t>
+        <w:t>El reloj no cuenta segundos: guarda la hora en que termina la ronda. Así el panel y OBS muestran lo mismo aunque el cambio tarde un momento en llegar por Supabase, y el widget puede recargarse sin perder la cuenta. js/reloj.js lo usan el panel y los widgets de la carrera y del jefe del LIVE:</w:t>
       </w:r>
     </w:p>
     <w:tbl>
@@ -15890,7 +15960,7 @@
       <w:pPr>
         <w:pStyle w:val="Heading2"/>
       </w:pPr>
-      <w:bookmarkStart w:id="25" w:name="_Toc242786957"/>
+      <w:bookmarkStart w:id="25" w:name="_Toc242787379"/>
       <w:r>
         <w:t>7.5 Batalla de regalos (batalla.html)</w:t>
       </w:r>
@@ -16544,25 +16614,1161 @@
     </w:p>
     <w:p>
       <w:pPr>
+        <w:pStyle w:val="Heading2"/>
+      </w:pPr>
+      <w:bookmarkStart w:id="26" w:name="_Toc242787380"/>
+      <w:r>
+        <w:t>7.6 Jefe del LIVE (jefe.html)</w:t>
+      </w:r>
+      <w:bookmarkEnd w:id="26"/>
+    </w:p>
+    <w:p>
+      <w:pPr>
+        <w:spacing w:after="120"/>
+      </w:pPr>
+      <w:r>
+        <w:t>Un reto cooperativo (boss raid): el chat ataca entre todos a un jefe con una barra de vida grande, en la parte de arriba de la escena (fuente de OBS de 1920 × 300). Los likes y los regalos le quitan vida. Si llega a 0 antes de que se acabe el tiempo, aparece “Reto desbloqueado” con brillo dorado; si se acaba el tiempo, el jefe escapa (“Tiempo agotado”).</w:t>
+      </w:r>
+    </w:p>
+    <w:p>
+      <w:pPr>
+        <w:pStyle w:val="Heading3"/>
+      </w:pPr>
+      <w:r>
+        <w:t>Estructura</w:t>
+      </w:r>
+    </w:p>
+    <w:p>
+      <w:pPr>
+        <w:spacing w:after="120"/>
+      </w:pPr>
+      <w:r>
+        <w:t>Una placa de cristal con tres filas: el nombre del jefe y su estado; la barra de vida (</w:t>
+      </w:r>
+      <w:r>
+        <w:rPr>
+          <w:rFonts w:ascii="Consolas" w:eastAsia="Consolas" w:hAnsi="Consolas" w:cs="Consolas"/>
+          <w:color w:val="7A1F33"/>
+          <w:sz w:val="19"/>
+          <w:szCs w:val="19"/>
+        </w:rPr>
+        <w:t>#barra</w:t>
+      </w:r>
+      <w:r>
+        <w:t xml:space="preserve">, con </w:t>
+      </w:r>
+      <w:r>
+        <w:rPr>
+          <w:rFonts w:ascii="Consolas" w:eastAsia="Consolas" w:hAnsi="Consolas" w:cs="Consolas"/>
+          <w:color w:val="7A1F33"/>
+          <w:sz w:val="19"/>
+          <w:szCs w:val="19"/>
+        </w:rPr>
+        <w:t>.filo-oro</w:t>
+      </w:r>
+      <w:r>
+        <w:t>) con la cifra “7.450 / 10.000” encima; y abajo el reloj y el último golpe (“Último golpe: Fulano −250”). La barra tiene dos capas: la vida (</w:t>
+      </w:r>
+      <w:r>
+        <w:rPr>
+          <w:rFonts w:ascii="Consolas" w:eastAsia="Consolas" w:hAnsi="Consolas" w:cs="Consolas"/>
+          <w:color w:val="7A1F33"/>
+          <w:sz w:val="19"/>
+          <w:szCs w:val="19"/>
+        </w:rPr>
+        <w:t>#vida</w:t>
+      </w:r>
+      <w:r>
+        <w:t xml:space="preserve">, relleno de oro con el degradado del acento del estilo, </w:t>
+      </w:r>
+      <w:r>
+        <w:rPr>
+          <w:rFonts w:ascii="Consolas" w:eastAsia="Consolas" w:hAnsi="Consolas" w:cs="Consolas"/>
+          <w:color w:val="7A1F33"/>
+          <w:sz w:val="19"/>
+          <w:szCs w:val="19"/>
+        </w:rPr>
+        <w:t>--</w:t>
+      </w:r>
+      <w:r>
+        <w:rPr>
+          <w:rFonts w:ascii="Consolas" w:eastAsia="Consolas" w:hAnsi="Consolas" w:cs="Consolas"/>
+          <w:color w:val="7A1F33"/>
+          <w:sz w:val="19"/>
+          <w:szCs w:val="19"/>
+        </w:rPr>
+        <w:lastRenderedPageBreak/>
+        <w:t>acento-relleno</w:t>
+      </w:r>
+      <w:r>
+        <w:t>) y el rastro (</w:t>
+      </w:r>
+      <w:r>
+        <w:rPr>
+          <w:rFonts w:ascii="Consolas" w:eastAsia="Consolas" w:hAnsi="Consolas" w:cs="Consolas"/>
+          <w:color w:val="7A1F33"/>
+          <w:sz w:val="19"/>
+          <w:szCs w:val="19"/>
+        </w:rPr>
+        <w:t>#rastro</w:t>
+      </w:r>
+      <w:r>
+        <w:t xml:space="preserve">), una franja clara que se queda atrás medio segundo al recibir daño, como en los videojuegos. El fondo de la barra es </w:t>
+      </w:r>
+      <w:r>
+        <w:rPr>
+          <w:rFonts w:ascii="Consolas" w:eastAsia="Consolas" w:hAnsi="Consolas" w:cs="Consolas"/>
+          <w:color w:val="7A1F33"/>
+          <w:sz w:val="19"/>
+          <w:szCs w:val="19"/>
+        </w:rPr>
+        <w:t>--cristal-oscuro</w:t>
+      </w:r>
+      <w:r>
+        <w:t xml:space="preserve">. La fase va en </w:t>
+      </w:r>
+      <w:r>
+        <w:rPr>
+          <w:rFonts w:ascii="Consolas" w:eastAsia="Consolas" w:hAnsi="Consolas" w:cs="Consolas"/>
+          <w:color w:val="7A1F33"/>
+          <w:sz w:val="19"/>
+          <w:szCs w:val="19"/>
+        </w:rPr>
+        <w:t>data-fase</w:t>
+      </w:r>
+      <w:r>
+        <w:t>: listo, corre, pausa, escapo o vencido.</w:t>
+      </w:r>
+    </w:p>
+    <w:p>
+      <w:pPr>
+        <w:pStyle w:val="Heading3"/>
+      </w:pPr>
+      <w:r>
+        <w:t>Configuración</w:t>
+      </w:r>
+    </w:p>
+    <w:tbl>
+      <w:tblPr>
+        <w:tblW w:w="9360" w:type="dxa"/>
+        <w:tblBorders>
+          <w:top w:val="single" w:sz="4" w:space="0" w:color="auto"/>
+          <w:left w:val="single" w:sz="4" w:space="0" w:color="auto"/>
+          <w:bottom w:val="single" w:sz="4" w:space="0" w:color="auto"/>
+          <w:right w:val="single" w:sz="4" w:space="0" w:color="auto"/>
+          <w:insideH w:val="single" w:sz="4" w:space="0" w:color="auto"/>
+          <w:insideV w:val="single" w:sz="4" w:space="0" w:color="auto"/>
+        </w:tblBorders>
+        <w:tblLook w:val="04A0" w:firstRow="1" w:lastRow="0" w:firstColumn="1" w:lastColumn="0" w:noHBand="0" w:noVBand="1"/>
+      </w:tblPr>
+      <w:tblGrid>
+        <w:gridCol w:w="1497"/>
+        <w:gridCol w:w="7863"/>
+      </w:tblGrid>
+      <w:tr>
+        <w:trPr>
+          <w:tblHeader/>
+        </w:trPr>
+        <w:tc>
+          <w:tcPr>
+            <w:tcW w:w="1497" w:type="dxa"/>
+            <w:tcBorders>
+              <w:top w:val="single" w:sz="4" w:space="0" w:color="BFBFBF"/>
+              <w:left w:val="single" w:sz="4" w:space="0" w:color="BFBFBF"/>
+              <w:bottom w:val="single" w:sz="4" w:space="0" w:color="BFBFBF"/>
+              <w:right w:val="single" w:sz="4" w:space="0" w:color="BFBFBF"/>
+            </w:tcBorders>
+            <w:shd w:val="clear" w:color="auto" w:fill="1F4E79"/>
+            <w:tcMar>
+              <w:top w:w="60" w:type="dxa"/>
+              <w:left w:w="100" w:type="dxa"/>
+              <w:bottom w:w="60" w:type="dxa"/>
+              <w:right w:w="100" w:type="dxa"/>
+            </w:tcMar>
+          </w:tcPr>
+          <w:p>
+            <w:pPr>
+              <w:spacing w:after="20"/>
+            </w:pPr>
+            <w:r>
+              <w:rPr>
+                <w:b/>
+                <w:bCs/>
+                <w:color w:val="FFFFFF"/>
+              </w:rPr>
+              <w:t>Clave</w:t>
+            </w:r>
+          </w:p>
+        </w:tc>
+        <w:tc>
+          <w:tcPr>
+            <w:tcW w:w="7863" w:type="dxa"/>
+            <w:tcBorders>
+              <w:top w:val="single" w:sz="4" w:space="0" w:color="BFBFBF"/>
+              <w:left w:val="single" w:sz="4" w:space="0" w:color="BFBFBF"/>
+              <w:bottom w:val="single" w:sz="4" w:space="0" w:color="BFBFBF"/>
+              <w:right w:val="single" w:sz="4" w:space="0" w:color="BFBFBF"/>
+            </w:tcBorders>
+            <w:shd w:val="clear" w:color="auto" w:fill="1F4E79"/>
+            <w:tcMar>
+              <w:top w:w="60" w:type="dxa"/>
+              <w:left w:w="100" w:type="dxa"/>
+              <w:bottom w:w="60" w:type="dxa"/>
+              <w:right w:w="100" w:type="dxa"/>
+            </w:tcMar>
+          </w:tcPr>
+          <w:p>
+            <w:pPr>
+              <w:spacing w:after="20"/>
+            </w:pPr>
+            <w:r>
+              <w:rPr>
+                <w:b/>
+                <w:bCs/>
+                <w:color w:val="FFFFFF"/>
+              </w:rPr>
+              <w:t>Significado</w:t>
+            </w:r>
+          </w:p>
+        </w:tc>
+      </w:tr>
+      <w:tr>
+        <w:tc>
+          <w:tcPr>
+            <w:tcW w:w="1497" w:type="dxa"/>
+            <w:tcBorders>
+              <w:top w:val="single" w:sz="4" w:space="0" w:color="BFBFBF"/>
+              <w:left w:val="single" w:sz="4" w:space="0" w:color="BFBFBF"/>
+              <w:bottom w:val="single" w:sz="4" w:space="0" w:color="BFBFBF"/>
+              <w:right w:val="single" w:sz="4" w:space="0" w:color="BFBFBF"/>
+            </w:tcBorders>
+            <w:tcMar>
+              <w:top w:w="60" w:type="dxa"/>
+              <w:left w:w="100" w:type="dxa"/>
+              <w:bottom w:w="60" w:type="dxa"/>
+              <w:right w:w="100" w:type="dxa"/>
+            </w:tcMar>
+          </w:tcPr>
+          <w:p>
+            <w:pPr>
+              <w:spacing w:after="20"/>
+            </w:pPr>
+            <w:r>
+              <w:rPr>
+                <w:rFonts w:ascii="Consolas" w:eastAsia="Consolas" w:hAnsi="Consolas" w:cs="Consolas"/>
+                <w:color w:val="7A1F33"/>
+                <w:sz w:val="19"/>
+                <w:szCs w:val="19"/>
+              </w:rPr>
+              <w:t>u, k, w</w:t>
+            </w:r>
+          </w:p>
+        </w:tc>
+        <w:tc>
+          <w:tcPr>
+            <w:tcW w:w="7863" w:type="dxa"/>
+            <w:tcBorders>
+              <w:top w:val="single" w:sz="4" w:space="0" w:color="BFBFBF"/>
+              <w:left w:val="single" w:sz="4" w:space="0" w:color="BFBFBF"/>
+              <w:bottom w:val="single" w:sz="4" w:space="0" w:color="BFBFBF"/>
+              <w:right w:val="single" w:sz="4" w:space="0" w:color="BFBFBF"/>
+            </w:tcBorders>
+            <w:tcMar>
+              <w:top w:w="60" w:type="dxa"/>
+              <w:left w:w="100" w:type="dxa"/>
+              <w:bottom w:w="60" w:type="dxa"/>
+              <w:right w:w="100" w:type="dxa"/>
+            </w:tcMar>
+          </w:tcPr>
+          <w:p>
+            <w:pPr>
+              <w:spacing w:after="20"/>
+            </w:pPr>
+            <w:r>
+              <w:t>Usuario de TikTok, API key e identificador del widget (van siempre en la URL)</w:t>
+            </w:r>
+          </w:p>
+        </w:tc>
+      </w:tr>
+      <w:tr>
+        <w:tc>
+          <w:tcPr>
+            <w:tcW w:w="1497" w:type="dxa"/>
+            <w:tcBorders>
+              <w:top w:val="single" w:sz="4" w:space="0" w:color="BFBFBF"/>
+              <w:left w:val="single" w:sz="4" w:space="0" w:color="BFBFBF"/>
+              <w:bottom w:val="single" w:sz="4" w:space="0" w:color="BFBFBF"/>
+              <w:right w:val="single" w:sz="4" w:space="0" w:color="BFBFBF"/>
+            </w:tcBorders>
+            <w:tcMar>
+              <w:top w:w="60" w:type="dxa"/>
+              <w:left w:w="100" w:type="dxa"/>
+              <w:bottom w:w="60" w:type="dxa"/>
+              <w:right w:w="100" w:type="dxa"/>
+            </w:tcMar>
+          </w:tcPr>
+          <w:p>
+            <w:pPr>
+              <w:spacing w:after="20"/>
+            </w:pPr>
+            <w:r>
+              <w:rPr>
+                <w:rFonts w:ascii="Consolas" w:eastAsia="Consolas" w:hAnsi="Consolas" w:cs="Consolas"/>
+                <w:color w:val="7A1F33"/>
+                <w:sz w:val="19"/>
+                <w:szCs w:val="19"/>
+              </w:rPr>
+              <w:t>ti</w:t>
+            </w:r>
+          </w:p>
+        </w:tc>
+        <w:tc>
+          <w:tcPr>
+            <w:tcW w:w="7863" w:type="dxa"/>
+            <w:tcBorders>
+              <w:top w:val="single" w:sz="4" w:space="0" w:color="BFBFBF"/>
+              <w:left w:val="single" w:sz="4" w:space="0" w:color="BFBFBF"/>
+              <w:bottom w:val="single" w:sz="4" w:space="0" w:color="BFBFBF"/>
+              <w:right w:val="single" w:sz="4" w:space="0" w:color="BFBFBF"/>
+            </w:tcBorders>
+            <w:tcMar>
+              <w:top w:w="60" w:type="dxa"/>
+              <w:left w:w="100" w:type="dxa"/>
+              <w:bottom w:w="60" w:type="dxa"/>
+              <w:right w:w="100" w:type="dxa"/>
+            </w:tcMar>
+          </w:tcPr>
+          <w:p>
+            <w:pPr>
+              <w:spacing w:after="20"/>
+            </w:pPr>
+            <w:r>
+              <w:t>Nombre del jefe</w:t>
+            </w:r>
+          </w:p>
+        </w:tc>
+      </w:tr>
+      <w:tr>
+        <w:tc>
+          <w:tcPr>
+            <w:tcW w:w="1497" w:type="dxa"/>
+            <w:tcBorders>
+              <w:top w:val="single" w:sz="4" w:space="0" w:color="BFBFBF"/>
+              <w:left w:val="single" w:sz="4" w:space="0" w:color="BFBFBF"/>
+              <w:bottom w:val="single" w:sz="4" w:space="0" w:color="BFBFBF"/>
+              <w:right w:val="single" w:sz="4" w:space="0" w:color="BFBFBF"/>
+            </w:tcBorders>
+            <w:tcMar>
+              <w:top w:w="60" w:type="dxa"/>
+              <w:left w:w="100" w:type="dxa"/>
+              <w:bottom w:w="60" w:type="dxa"/>
+              <w:right w:w="100" w:type="dxa"/>
+            </w:tcMar>
+          </w:tcPr>
+          <w:p>
+            <w:pPr>
+              <w:spacing w:after="20"/>
+            </w:pPr>
+            <w:r>
+              <w:rPr>
+                <w:rFonts w:ascii="Consolas" w:eastAsia="Consolas" w:hAnsi="Consolas" w:cs="Consolas"/>
+                <w:color w:val="7A1F33"/>
+                <w:sz w:val="19"/>
+                <w:szCs w:val="19"/>
+              </w:rPr>
+              <w:t>hp</w:t>
+            </w:r>
+          </w:p>
+        </w:tc>
+        <w:tc>
+          <w:tcPr>
+            <w:tcW w:w="7863" w:type="dxa"/>
+            <w:tcBorders>
+              <w:top w:val="single" w:sz="4" w:space="0" w:color="BFBFBF"/>
+              <w:left w:val="single" w:sz="4" w:space="0" w:color="BFBFBF"/>
+              <w:bottom w:val="single" w:sz="4" w:space="0" w:color="BFBFBF"/>
+              <w:right w:val="single" w:sz="4" w:space="0" w:color="BFBFBF"/>
+            </w:tcBorders>
+            <w:tcMar>
+              <w:top w:w="60" w:type="dxa"/>
+              <w:left w:w="100" w:type="dxa"/>
+              <w:bottom w:w="60" w:type="dxa"/>
+              <w:right w:w="100" w:type="dxa"/>
+            </w:tcMar>
+          </w:tcPr>
+          <w:p>
+            <w:pPr>
+              <w:spacing w:after="20"/>
+            </w:pPr>
+            <w:r>
+              <w:t>Vida total</w:t>
+            </w:r>
+          </w:p>
+        </w:tc>
+      </w:tr>
+      <w:tr>
+        <w:tc>
+          <w:tcPr>
+            <w:tcW w:w="1497" w:type="dxa"/>
+            <w:tcBorders>
+              <w:top w:val="single" w:sz="4" w:space="0" w:color="BFBFBF"/>
+              <w:left w:val="single" w:sz="4" w:space="0" w:color="BFBFBF"/>
+              <w:bottom w:val="single" w:sz="4" w:space="0" w:color="BFBFBF"/>
+              <w:right w:val="single" w:sz="4" w:space="0" w:color="BFBFBF"/>
+            </w:tcBorders>
+            <w:tcMar>
+              <w:top w:w="60" w:type="dxa"/>
+              <w:left w:w="100" w:type="dxa"/>
+              <w:bottom w:w="60" w:type="dxa"/>
+              <w:right w:w="100" w:type="dxa"/>
+            </w:tcMar>
+          </w:tcPr>
+          <w:p>
+            <w:pPr>
+              <w:spacing w:after="20"/>
+            </w:pPr>
+            <w:r>
+              <w:rPr>
+                <w:rFonts w:ascii="Consolas" w:eastAsia="Consolas" w:hAnsi="Consolas" w:cs="Consolas"/>
+                <w:color w:val="7A1F33"/>
+                <w:sz w:val="19"/>
+                <w:szCs w:val="19"/>
+              </w:rPr>
+              <w:t>t</w:t>
+            </w:r>
+          </w:p>
+        </w:tc>
+        <w:tc>
+          <w:tcPr>
+            <w:tcW w:w="7863" w:type="dxa"/>
+            <w:tcBorders>
+              <w:top w:val="single" w:sz="4" w:space="0" w:color="BFBFBF"/>
+              <w:left w:val="single" w:sz="4" w:space="0" w:color="BFBFBF"/>
+              <w:bottom w:val="single" w:sz="4" w:space="0" w:color="BFBFBF"/>
+              <w:right w:val="single" w:sz="4" w:space="0" w:color="BFBFBF"/>
+            </w:tcBorders>
+            <w:tcMar>
+              <w:top w:w="60" w:type="dxa"/>
+              <w:left w:w="100" w:type="dxa"/>
+              <w:bottom w:w="60" w:type="dxa"/>
+              <w:right w:w="100" w:type="dxa"/>
+            </w:tcMar>
+          </w:tcPr>
+          <w:p>
+            <w:pPr>
+              <w:spacing w:after="20"/>
+            </w:pPr>
+            <w:r>
+              <w:t xml:space="preserve">Reloj </w:t>
+            </w:r>
+            <w:r>
+              <w:rPr>
+                <w:rFonts w:ascii="Consolas" w:eastAsia="Consolas" w:hAnsi="Consolas" w:cs="Consolas"/>
+                <w:color w:val="7A1F33"/>
+                <w:sz w:val="19"/>
+                <w:szCs w:val="19"/>
+              </w:rPr>
+              <w:t>{ e, d, fin, r }</w:t>
+            </w:r>
+            <w:r>
+              <w:t xml:space="preserve"> (el mismo de la carrera, ver js/reloj.js). El panel pide el tiempo en minutos y lo guarda en segundos</w:t>
+            </w:r>
+          </w:p>
+        </w:tc>
+      </w:tr>
+      <w:tr>
+        <w:tc>
+          <w:tcPr>
+            <w:tcW w:w="1497" w:type="dxa"/>
+            <w:tcBorders>
+              <w:top w:val="single" w:sz="4" w:space="0" w:color="BFBFBF"/>
+              <w:left w:val="single" w:sz="4" w:space="0" w:color="BFBFBF"/>
+              <w:bottom w:val="single" w:sz="4" w:space="0" w:color="BFBFBF"/>
+              <w:right w:val="single" w:sz="4" w:space="0" w:color="BFBFBF"/>
+            </w:tcBorders>
+            <w:tcMar>
+              <w:top w:w="60" w:type="dxa"/>
+              <w:left w:w="100" w:type="dxa"/>
+              <w:bottom w:w="60" w:type="dxa"/>
+              <w:right w:w="100" w:type="dxa"/>
+            </w:tcMar>
+          </w:tcPr>
+          <w:p>
+            <w:pPr>
+              <w:spacing w:after="20"/>
+            </w:pPr>
+            <w:r>
+              <w:rPr>
+                <w:rFonts w:ascii="Consolas" w:eastAsia="Consolas" w:hAnsi="Consolas" w:cs="Consolas"/>
+                <w:color w:val="7A1F33"/>
+                <w:sz w:val="19"/>
+                <w:szCs w:val="19"/>
+              </w:rPr>
+              <w:t>ro</w:t>
+            </w:r>
+          </w:p>
+        </w:tc>
+        <w:tc>
+          <w:tcPr>
+            <w:tcW w:w="7863" w:type="dxa"/>
+            <w:tcBorders>
+              <w:top w:val="single" w:sz="4" w:space="0" w:color="BFBFBF"/>
+              <w:left w:val="single" w:sz="4" w:space="0" w:color="BFBFBF"/>
+              <w:bottom w:val="single" w:sz="4" w:space="0" w:color="BFBFBF"/>
+              <w:right w:val="single" w:sz="4" w:space="0" w:color="BFBFBF"/>
+            </w:tcBorders>
+            <w:tcMar>
+              <w:top w:w="60" w:type="dxa"/>
+              <w:left w:w="100" w:type="dxa"/>
+              <w:bottom w:w="60" w:type="dxa"/>
+              <w:right w:w="100" w:type="dxa"/>
+            </w:tcMar>
+          </w:tcPr>
+          <w:p>
+            <w:pPr>
+              <w:spacing w:after="20"/>
+            </w:pPr>
+            <w:r>
+              <w:t>Ronda: cambia al reiniciar o al empezar una raid nueva. Cuando cambia, el jefe recupera toda su vida</w:t>
+            </w:r>
+          </w:p>
+        </w:tc>
+      </w:tr>
+      <w:tr>
+        <w:tc>
+          <w:tcPr>
+            <w:tcW w:w="1497" w:type="dxa"/>
+            <w:tcBorders>
+              <w:top w:val="single" w:sz="4" w:space="0" w:color="BFBFBF"/>
+              <w:left w:val="single" w:sz="4" w:space="0" w:color="BFBFBF"/>
+              <w:bottom w:val="single" w:sz="4" w:space="0" w:color="BFBFBF"/>
+              <w:right w:val="single" w:sz="4" w:space="0" w:color="BFBFBF"/>
+            </w:tcBorders>
+            <w:tcMar>
+              <w:top w:w="60" w:type="dxa"/>
+              <w:left w:w="100" w:type="dxa"/>
+              <w:bottom w:w="60" w:type="dxa"/>
+              <w:right w:w="100" w:type="dxa"/>
+            </w:tcMar>
+          </w:tcPr>
+          <w:p>
+            <w:pPr>
+              <w:spacing w:after="20"/>
+            </w:pPr>
+            <w:r>
+              <w:rPr>
+                <w:rFonts w:ascii="Consolas" w:eastAsia="Consolas" w:hAnsi="Consolas" w:cs="Consolas"/>
+                <w:color w:val="7A1F33"/>
+                <w:sz w:val="19"/>
+                <w:szCs w:val="19"/>
+              </w:rPr>
+              <w:t>dl</w:t>
+            </w:r>
+          </w:p>
+        </w:tc>
+        <w:tc>
+          <w:tcPr>
+            <w:tcW w:w="7863" w:type="dxa"/>
+            <w:tcBorders>
+              <w:top w:val="single" w:sz="4" w:space="0" w:color="BFBFBF"/>
+              <w:left w:val="single" w:sz="4" w:space="0" w:color="BFBFBF"/>
+              <w:bottom w:val="single" w:sz="4" w:space="0" w:color="BFBFBF"/>
+              <w:right w:val="single" w:sz="4" w:space="0" w:color="BFBFBF"/>
+            </w:tcBorders>
+            <w:tcMar>
+              <w:top w:w="60" w:type="dxa"/>
+              <w:left w:w="100" w:type="dxa"/>
+              <w:bottom w:w="60" w:type="dxa"/>
+              <w:right w:w="100" w:type="dxa"/>
+            </w:tcMar>
+          </w:tcPr>
+          <w:p>
+            <w:pPr>
+              <w:spacing w:after="20"/>
+            </w:pPr>
+            <w:r>
+              <w:t>Vida que quita cada like (por defecto 1)</w:t>
+            </w:r>
+          </w:p>
+        </w:tc>
+      </w:tr>
+      <w:tr>
+        <w:tc>
+          <w:tcPr>
+            <w:tcW w:w="1497" w:type="dxa"/>
+            <w:tcBorders>
+              <w:top w:val="single" w:sz="4" w:space="0" w:color="BFBFBF"/>
+              <w:left w:val="single" w:sz="4" w:space="0" w:color="BFBFBF"/>
+              <w:bottom w:val="single" w:sz="4" w:space="0" w:color="BFBFBF"/>
+              <w:right w:val="single" w:sz="4" w:space="0" w:color="BFBFBF"/>
+            </w:tcBorders>
+            <w:tcMar>
+              <w:top w:w="60" w:type="dxa"/>
+              <w:left w:w="100" w:type="dxa"/>
+              <w:bottom w:w="60" w:type="dxa"/>
+              <w:right w:w="100" w:type="dxa"/>
+            </w:tcMar>
+          </w:tcPr>
+          <w:p>
+            <w:pPr>
+              <w:spacing w:after="20"/>
+            </w:pPr>
+            <w:r>
+              <w:rPr>
+                <w:rFonts w:ascii="Consolas" w:eastAsia="Consolas" w:hAnsi="Consolas" w:cs="Consolas"/>
+                <w:color w:val="7A1F33"/>
+                <w:sz w:val="19"/>
+                <w:szCs w:val="19"/>
+              </w:rPr>
+              <w:t>dr</w:t>
+            </w:r>
+          </w:p>
+        </w:tc>
+        <w:tc>
+          <w:tcPr>
+            <w:tcW w:w="7863" w:type="dxa"/>
+            <w:tcBorders>
+              <w:top w:val="single" w:sz="4" w:space="0" w:color="BFBFBF"/>
+              <w:left w:val="single" w:sz="4" w:space="0" w:color="BFBFBF"/>
+              <w:bottom w:val="single" w:sz="4" w:space="0" w:color="BFBFBF"/>
+              <w:right w:val="single" w:sz="4" w:space="0" w:color="BFBFBF"/>
+            </w:tcBorders>
+            <w:tcMar>
+              <w:top w:w="60" w:type="dxa"/>
+              <w:left w:w="100" w:type="dxa"/>
+              <w:bottom w:w="60" w:type="dxa"/>
+              <w:right w:w="100" w:type="dxa"/>
+            </w:tcMar>
+          </w:tcPr>
+          <w:p>
+            <w:pPr>
+              <w:spacing w:after="20"/>
+            </w:pPr>
+            <w:r>
+              <w:t>Vida que quita cada moneda de regalo (por defecto 10)</w:t>
+            </w:r>
+          </w:p>
+        </w:tc>
+      </w:tr>
+      <w:tr>
+        <w:tc>
+          <w:tcPr>
+            <w:tcW w:w="1497" w:type="dxa"/>
+            <w:tcBorders>
+              <w:top w:val="single" w:sz="4" w:space="0" w:color="BFBFBF"/>
+              <w:left w:val="single" w:sz="4" w:space="0" w:color="BFBFBF"/>
+              <w:bottom w:val="single" w:sz="4" w:space="0" w:color="BFBFBF"/>
+              <w:right w:val="single" w:sz="4" w:space="0" w:color="BFBFBF"/>
+            </w:tcBorders>
+            <w:tcMar>
+              <w:top w:w="60" w:type="dxa"/>
+              <w:left w:w="100" w:type="dxa"/>
+              <w:bottom w:w="60" w:type="dxa"/>
+              <w:right w:w="100" w:type="dxa"/>
+            </w:tcMar>
+          </w:tcPr>
+          <w:p>
+            <w:pPr>
+              <w:spacing w:after="20"/>
+            </w:pPr>
+            <w:r>
+              <w:rPr>
+                <w:rFonts w:ascii="Consolas" w:eastAsia="Consolas" w:hAnsi="Consolas" w:cs="Consolas"/>
+                <w:color w:val="7A1F33"/>
+                <w:sz w:val="19"/>
+                <w:szCs w:val="19"/>
+              </w:rPr>
+              <w:t>v</w:t>
+            </w:r>
+          </w:p>
+        </w:tc>
+        <w:tc>
+          <w:tcPr>
+            <w:tcW w:w="7863" w:type="dxa"/>
+            <w:tcBorders>
+              <w:top w:val="single" w:sz="4" w:space="0" w:color="BFBFBF"/>
+              <w:left w:val="single" w:sz="4" w:space="0" w:color="BFBFBF"/>
+              <w:bottom w:val="single" w:sz="4" w:space="0" w:color="BFBFBF"/>
+              <w:right w:val="single" w:sz="4" w:space="0" w:color="BFBFBF"/>
+            </w:tcBorders>
+            <w:tcMar>
+              <w:top w:w="60" w:type="dxa"/>
+              <w:left w:w="100" w:type="dxa"/>
+              <w:bottom w:w="60" w:type="dxa"/>
+              <w:right w:w="100" w:type="dxa"/>
+            </w:tcMar>
+          </w:tcPr>
+          <w:p>
+            <w:pPr>
+              <w:spacing w:after="20"/>
+            </w:pPr>
+            <w:r>
+              <w:t>Monedas de un regalo cuando TikTok no manda el precio (por defecto 1)</w:t>
+            </w:r>
+          </w:p>
+        </w:tc>
+      </w:tr>
+      <w:tr>
+        <w:tc>
+          <w:tcPr>
+            <w:tcW w:w="1497" w:type="dxa"/>
+            <w:tcBorders>
+              <w:top w:val="single" w:sz="4" w:space="0" w:color="BFBFBF"/>
+              <w:left w:val="single" w:sz="4" w:space="0" w:color="BFBFBF"/>
+              <w:bottom w:val="single" w:sz="4" w:space="0" w:color="BFBFBF"/>
+              <w:right w:val="single" w:sz="4" w:space="0" w:color="BFBFBF"/>
+            </w:tcBorders>
+            <w:tcMar>
+              <w:top w:w="60" w:type="dxa"/>
+              <w:left w:w="100" w:type="dxa"/>
+              <w:bottom w:w="60" w:type="dxa"/>
+              <w:right w:w="100" w:type="dxa"/>
+            </w:tcMar>
+          </w:tcPr>
+          <w:p>
+            <w:pPr>
+              <w:spacing w:after="20"/>
+            </w:pPr>
+            <w:r>
+              <w:rPr>
+                <w:rFonts w:ascii="Consolas" w:eastAsia="Consolas" w:hAnsi="Consolas" w:cs="Consolas"/>
+                <w:color w:val="7A1F33"/>
+                <w:sz w:val="19"/>
+                <w:szCs w:val="19"/>
+              </w:rPr>
+              <w:t>tv</w:t>
+            </w:r>
+          </w:p>
+        </w:tc>
+        <w:tc>
+          <w:tcPr>
+            <w:tcW w:w="7863" w:type="dxa"/>
+            <w:tcBorders>
+              <w:top w:val="single" w:sz="4" w:space="0" w:color="BFBFBF"/>
+              <w:left w:val="single" w:sz="4" w:space="0" w:color="BFBFBF"/>
+              <w:bottom w:val="single" w:sz="4" w:space="0" w:color="BFBFBF"/>
+              <w:right w:val="single" w:sz="4" w:space="0" w:color="BFBFBF"/>
+            </w:tcBorders>
+            <w:tcMar>
+              <w:top w:w="60" w:type="dxa"/>
+              <w:left w:w="100" w:type="dxa"/>
+              <w:bottom w:w="60" w:type="dxa"/>
+              <w:right w:w="100" w:type="dxa"/>
+            </w:tcMar>
+          </w:tcPr>
+          <w:p>
+            <w:pPr>
+              <w:spacing w:after="20"/>
+            </w:pPr>
+            <w:r>
+              <w:t>Texto de victoria (por defecto “Reto desbloqueado”)</w:t>
+            </w:r>
+          </w:p>
+        </w:tc>
+      </w:tr>
+      <w:tr>
+        <w:tc>
+          <w:tcPr>
+            <w:tcW w:w="1497" w:type="dxa"/>
+            <w:tcBorders>
+              <w:top w:val="single" w:sz="4" w:space="0" w:color="BFBFBF"/>
+              <w:left w:val="single" w:sz="4" w:space="0" w:color="BFBFBF"/>
+              <w:bottom w:val="single" w:sz="4" w:space="0" w:color="BFBFBF"/>
+              <w:right w:val="single" w:sz="4" w:space="0" w:color="BFBFBF"/>
+            </w:tcBorders>
+            <w:tcMar>
+              <w:top w:w="60" w:type="dxa"/>
+              <w:left w:w="100" w:type="dxa"/>
+              <w:bottom w:w="60" w:type="dxa"/>
+              <w:right w:w="100" w:type="dxa"/>
+            </w:tcMar>
+          </w:tcPr>
+          <w:p>
+            <w:pPr>
+              <w:spacing w:after="20"/>
+            </w:pPr>
+            <w:r>
+              <w:rPr>
+                <w:rFonts w:ascii="Consolas" w:eastAsia="Consolas" w:hAnsi="Consolas" w:cs="Consolas"/>
+                <w:color w:val="7A1F33"/>
+                <w:sz w:val="19"/>
+                <w:szCs w:val="19"/>
+              </w:rPr>
+              <w:t>sr</w:t>
+            </w:r>
+          </w:p>
+        </w:tc>
+        <w:tc>
+          <w:tcPr>
+            <w:tcW w:w="7863" w:type="dxa"/>
+            <w:tcBorders>
+              <w:top w:val="single" w:sz="4" w:space="0" w:color="BFBFBF"/>
+              <w:left w:val="single" w:sz="4" w:space="0" w:color="BFBFBF"/>
+              <w:bottom w:val="single" w:sz="4" w:space="0" w:color="BFBFBF"/>
+              <w:right w:val="single" w:sz="4" w:space="0" w:color="BFBFBF"/>
+            </w:tcBorders>
+            <w:tcMar>
+              <w:top w:w="60" w:type="dxa"/>
+              <w:left w:w="100" w:type="dxa"/>
+              <w:bottom w:w="60" w:type="dxa"/>
+              <w:right w:w="100" w:type="dxa"/>
+            </w:tcMar>
+          </w:tcPr>
+          <w:p>
+            <w:pPr>
+              <w:spacing w:after="20"/>
+            </w:pPr>
+            <w:r>
+              <w:t>Los ataques solo cuentan con el reloj en marcha (1 o 0)</w:t>
+            </w:r>
+          </w:p>
+        </w:tc>
+      </w:tr>
+      <w:tr>
+        <w:tc>
+          <w:tcPr>
+            <w:tcW w:w="1497" w:type="dxa"/>
+            <w:tcBorders>
+              <w:top w:val="single" w:sz="4" w:space="0" w:color="BFBFBF"/>
+              <w:left w:val="single" w:sz="4" w:space="0" w:color="BFBFBF"/>
+              <w:bottom w:val="single" w:sz="4" w:space="0" w:color="BFBFBF"/>
+              <w:right w:val="single" w:sz="4" w:space="0" w:color="BFBFBF"/>
+            </w:tcBorders>
+            <w:tcMar>
+              <w:top w:w="60" w:type="dxa"/>
+              <w:left w:w="100" w:type="dxa"/>
+              <w:bottom w:w="60" w:type="dxa"/>
+              <w:right w:w="100" w:type="dxa"/>
+            </w:tcMar>
+          </w:tcPr>
+          <w:p>
+            <w:pPr>
+              <w:spacing w:after="20"/>
+            </w:pPr>
+            <w:r>
+              <w:rPr>
+                <w:rFonts w:ascii="Consolas" w:eastAsia="Consolas" w:hAnsi="Consolas" w:cs="Consolas"/>
+                <w:color w:val="7A1F33"/>
+                <w:sz w:val="19"/>
+                <w:szCs w:val="19"/>
+              </w:rPr>
+              <w:t>s</w:t>
+            </w:r>
+          </w:p>
+        </w:tc>
+        <w:tc>
+          <w:tcPr>
+            <w:tcW w:w="7863" w:type="dxa"/>
+            <w:tcBorders>
+              <w:top w:val="single" w:sz="4" w:space="0" w:color="BFBFBF"/>
+              <w:left w:val="single" w:sz="4" w:space="0" w:color="BFBFBF"/>
+              <w:bottom w:val="single" w:sz="4" w:space="0" w:color="BFBFBF"/>
+              <w:right w:val="single" w:sz="4" w:space="0" w:color="BFBFBF"/>
+            </w:tcBorders>
+            <w:tcMar>
+              <w:top w:w="60" w:type="dxa"/>
+              <w:left w:w="100" w:type="dxa"/>
+              <w:bottom w:w="60" w:type="dxa"/>
+              <w:right w:w="100" w:type="dxa"/>
+            </w:tcMar>
+          </w:tcPr>
+          <w:p>
+            <w:pPr>
+              <w:spacing w:after="20"/>
+            </w:pPr>
+            <w:r>
+              <w:t>Sonidos (1 o 0): “tic” en los últimos 5 segundos, fanfarria de victoria y tono grave si se acaba el tiempo</w:t>
+            </w:r>
+          </w:p>
+        </w:tc>
+      </w:tr>
+      <w:tr>
+        <w:tc>
+          <w:tcPr>
+            <w:tcW w:w="1497" w:type="dxa"/>
+            <w:tcBorders>
+              <w:top w:val="single" w:sz="4" w:space="0" w:color="BFBFBF"/>
+              <w:left w:val="single" w:sz="4" w:space="0" w:color="BFBFBF"/>
+              <w:bottom w:val="single" w:sz="4" w:space="0" w:color="BFBFBF"/>
+              <w:right w:val="single" w:sz="4" w:space="0" w:color="BFBFBF"/>
+            </w:tcBorders>
+            <w:tcMar>
+              <w:top w:w="60" w:type="dxa"/>
+              <w:left w:w="100" w:type="dxa"/>
+              <w:bottom w:w="60" w:type="dxa"/>
+              <w:right w:w="100" w:type="dxa"/>
+            </w:tcMar>
+          </w:tcPr>
+          <w:p>
+            <w:pPr>
+              <w:spacing w:after="20"/>
+            </w:pPr>
+            <w:r>
+              <w:rPr>
+                <w:rFonts w:ascii="Consolas" w:eastAsia="Consolas" w:hAnsi="Consolas" w:cs="Consolas"/>
+                <w:color w:val="7A1F33"/>
+                <w:sz w:val="19"/>
+                <w:szCs w:val="19"/>
+              </w:rPr>
+              <w:t>est</w:t>
+            </w:r>
+          </w:p>
+        </w:tc>
+        <w:tc>
+          <w:tcPr>
+            <w:tcW w:w="7863" w:type="dxa"/>
+            <w:tcBorders>
+              <w:top w:val="single" w:sz="4" w:space="0" w:color="BFBFBF"/>
+              <w:left w:val="single" w:sz="4" w:space="0" w:color="BFBFBF"/>
+              <w:bottom w:val="single" w:sz="4" w:space="0" w:color="BFBFBF"/>
+              <w:right w:val="single" w:sz="4" w:space="0" w:color="BFBFBF"/>
+            </w:tcBorders>
+            <w:tcMar>
+              <w:top w:w="60" w:type="dxa"/>
+              <w:left w:w="100" w:type="dxa"/>
+              <w:bottom w:w="60" w:type="dxa"/>
+              <w:right w:w="100" w:type="dxa"/>
+            </w:tcMar>
+          </w:tcPr>
+          <w:p>
+            <w:pPr>
+              <w:spacing w:after="20"/>
+            </w:pPr>
+            <w:r>
+              <w:t>Estilo visual (lo aplica comun.js, igual que en los demás widgets)</w:t>
+            </w:r>
+          </w:p>
+        </w:tc>
+      </w:tr>
+    </w:tbl>
+    <w:p>
+      <w:pPr>
+        <w:spacing w:after="120"/>
+      </w:pPr>
+    </w:p>
+    <w:p>
+      <w:pPr>
+        <w:pStyle w:val="Heading3"/>
+      </w:pPr>
+      <w:r>
+        <w:t>Funcionamiento</w:t>
+      </w:r>
+    </w:p>
+    <w:p>
+      <w:pPr>
+        <w:pStyle w:val="ListParagraph"/>
+        <w:numPr>
+          <w:ilvl w:val="0"/>
+          <w:numId w:val="3"/>
+        </w:numPr>
+        <w:spacing w:after="60"/>
+      </w:pPr>
+      <w:r>
+        <w:t xml:space="preserve">Un evento </w:t>
+      </w:r>
+      <w:r>
+        <w:rPr>
+          <w:rFonts w:ascii="Consolas" w:eastAsia="Consolas" w:hAnsi="Consolas" w:cs="Consolas"/>
+          <w:color w:val="7A1F33"/>
+          <w:sz w:val="19"/>
+          <w:szCs w:val="19"/>
+        </w:rPr>
+        <w:t>like</w:t>
+      </w:r>
+      <w:r>
+        <w:t xml:space="preserve"> quita </w:t>
+      </w:r>
+      <w:r>
+        <w:rPr>
+          <w:rFonts w:ascii="Consolas" w:eastAsia="Consolas" w:hAnsi="Consolas" w:cs="Consolas"/>
+          <w:color w:val="7A1F33"/>
+          <w:sz w:val="19"/>
+          <w:szCs w:val="19"/>
+        </w:rPr>
+        <w:t>cantidad × dl</w:t>
+      </w:r>
+      <w:r>
+        <w:t xml:space="preserve">. Un evento </w:t>
+      </w:r>
+      <w:r>
+        <w:rPr>
+          <w:rFonts w:ascii="Consolas" w:eastAsia="Consolas" w:hAnsi="Consolas" w:cs="Consolas"/>
+          <w:color w:val="7A1F33"/>
+          <w:sz w:val="19"/>
+          <w:szCs w:val="19"/>
+        </w:rPr>
+        <w:t>regalo</w:t>
+      </w:r>
+      <w:r>
+        <w:t xml:space="preserve"> quita </w:t>
+      </w:r>
+      <w:r>
+        <w:rPr>
+          <w:rFonts w:ascii="Consolas" w:eastAsia="Consolas" w:hAnsi="Consolas" w:cs="Consolas"/>
+          <w:color w:val="7A1F33"/>
+          <w:sz w:val="19"/>
+          <w:szCs w:val="19"/>
+        </w:rPr>
+        <w:t>(diamantes × cantidad) × dr</w:t>
+      </w:r>
+      <w:r>
+        <w:t xml:space="preserve">; si el precio llega en 0, se usa </w:t>
+      </w:r>
+      <w:r>
+        <w:rPr>
+          <w:rFonts w:ascii="Consolas" w:eastAsia="Consolas" w:hAnsi="Consolas" w:cs="Consolas"/>
+          <w:color w:val="7A1F33"/>
+          <w:sz w:val="19"/>
+          <w:szCs w:val="19"/>
+        </w:rPr>
+        <w:t>v</w:t>
+      </w:r>
+      <w:r>
+        <w:t xml:space="preserve"> como precio. Los demás eventos no hacen daño.</w:t>
+      </w:r>
+    </w:p>
+    <w:p>
+      <w:pPr>
+        <w:pStyle w:val="ListParagraph"/>
+        <w:numPr>
+          <w:ilvl w:val="0"/>
+          <w:numId w:val="3"/>
+        </w:numPr>
+        <w:spacing w:after="60"/>
+      </w:pPr>
+      <w:r>
+        <w:t>La vida nunca baja de 0. Al llegar a 0 el jefe queda vencido: el reloj del widget se congela en el tiempo que sobró, suena la fanfarria y los ataques siguientes ya no cuentan.</w:t>
+      </w:r>
+    </w:p>
+    <w:p>
+      <w:pPr>
+        <w:pStyle w:val="ListParagraph"/>
+        <w:numPr>
+          <w:ilvl w:val="0"/>
+          <w:numId w:val="3"/>
+        </w:numPr>
+        <w:spacing w:after="60"/>
+      </w:pPr>
+      <w:r>
+        <w:t xml:space="preserve">Con </w:t>
+      </w:r>
+      <w:r>
+        <w:rPr>
+          <w:rFonts w:ascii="Consolas" w:eastAsia="Consolas" w:hAnsi="Consolas" w:cs="Consolas"/>
+          <w:color w:val="7A1F33"/>
+          <w:sz w:val="19"/>
+          <w:szCs w:val="19"/>
+        </w:rPr>
+        <w:t>sr</w:t>
+      </w:r>
+      <w:r>
+        <w:t xml:space="preserve"> activo, solo cuentan los ataques que llegan con el reloj en marcha, más 3 segundos de gracia tras el final. En la vista previa (</w:t>
+      </w:r>
+      <w:r>
+        <w:rPr>
+          <w:rFonts w:ascii="Consolas" w:eastAsia="Consolas" w:hAnsi="Consolas" w:cs="Consolas"/>
+          <w:color w:val="7A1F33"/>
+          <w:sz w:val="19"/>
+          <w:szCs w:val="19"/>
+        </w:rPr>
+        <w:t>prueba=1</w:t>
+      </w:r>
+      <w:r>
+        <w:t>) los ataques de prueba cuentan siempre.</w:t>
+      </w:r>
+    </w:p>
+    <w:p>
+      <w:pPr>
+        <w:pStyle w:val="ListParagraph"/>
+        <w:numPr>
+          <w:ilvl w:val="0"/>
+          <w:numId w:val="3"/>
+        </w:numPr>
+        <w:spacing w:after="60"/>
+      </w:pPr>
+      <w:r>
+        <w:t>Cada golpe hace temblar la barra y deja caer un “−250” junto al borde de la vida (un poco corrido al azar para que dos golpes seguidos no se encimen; los de regalos, más grandes y dorados). La cifra baja poco a poco.</w:t>
+      </w:r>
+    </w:p>
+    <w:p>
+      <w:pPr>
+        <w:pStyle w:val="ListParagraph"/>
+        <w:numPr>
+          <w:ilvl w:val="0"/>
+          <w:numId w:val="3"/>
+        </w:numPr>
+        <w:spacing w:after="60"/>
+      </w:pPr>
+      <w:r>
+        <w:t>El daño se guarda en el navegador de OBS (</w:t>
+      </w:r>
+      <w:r>
+        <w:rPr>
+          <w:rFonts w:ascii="Consolas" w:eastAsia="Consolas" w:hAnsi="Consolas" w:cs="Consolas"/>
+          <w:color w:val="7A1F33"/>
+          <w:sz w:val="19"/>
+          <w:szCs w:val="19"/>
+        </w:rPr>
+        <w:t>localStorage</w:t>
+      </w:r>
+      <w:r>
+        <w:t xml:space="preserve">, clave </w:t>
+      </w:r>
+      <w:r>
+        <w:rPr>
+          <w:rFonts w:ascii="Consolas" w:eastAsia="Consolas" w:hAnsi="Consolas" w:cs="Consolas"/>
+          <w:color w:val="7A1F33"/>
+          <w:sz w:val="19"/>
+          <w:szCs w:val="19"/>
+        </w:rPr>
+        <w:t>live-tools:jefe:&lt;w&gt;</w:t>
+      </w:r>
+      <w:r>
+        <w:t>) con la ronda y el tiempo de la victoria: si OBS recarga la fuente, el jefe no se cura.</w:t>
+      </w:r>
+    </w:p>
+    <w:p>
+      <w:pPr>
+        <w:pBdr>
+          <w:left w:val="single" w:sz="18" w:space="8" w:color="E5304F"/>
+        </w:pBdr>
+        <w:shd w:val="clear" w:color="auto" w:fill="FDECEF"/>
+        <w:spacing w:before="120" w:after="160"/>
+        <w:ind w:left="200" w:right="200"/>
+      </w:pPr>
+      <w:r>
+        <w:rPr>
+          <w:b/>
+          <w:bCs/>
+          <w:color w:val="E5304F"/>
+        </w:rPr>
+        <w:t xml:space="preserve">Limitación: </w:t>
+      </w:r>
+      <w:r>
+        <w:t>El panel no ve la vida del jefe: la lleva el widget en OBS. Si el chat lo vence antes de tiempo, OBS muestra la victoria aunque en el panel el reloj siga corriendo.</w:t>
+      </w:r>
+    </w:p>
+    <w:p>
+      <w:pPr>
         <w:pStyle w:val="Heading1"/>
         <w:pageBreakBefore/>
       </w:pPr>
-      <w:bookmarkStart w:id="26" w:name="_Toc242786958"/>
+      <w:bookmarkStart w:id="27" w:name="_Toc242787381"/>
       <w:r>
         <w:lastRenderedPageBreak/>
         <w:t>8. Frontend: el panel</w:t>
       </w:r>
-      <w:bookmarkEnd w:id="26"/>
+      <w:bookmarkEnd w:id="27"/>
     </w:p>
     <w:p>
       <w:pPr>
         <w:pStyle w:val="Heading2"/>
       </w:pPr>
-      <w:bookmarkStart w:id="27" w:name="_Toc242786959"/>
+      <w:bookmarkStart w:id="28" w:name="_Toc242787382"/>
       <w:r>
         <w:t>8.1 Estructura de la página (index.html)</w:t>
       </w:r>
-      <w:bookmarkEnd w:id="27"/>
+      <w:bookmarkEnd w:id="28"/>
     </w:p>
     <w:p>
       <w:pPr>
@@ -17051,11 +18257,11 @@
       <w:pPr>
         <w:pStyle w:val="Heading2"/>
       </w:pPr>
-      <w:bookmarkStart w:id="28" w:name="_Toc242786960"/>
+      <w:bookmarkStart w:id="29" w:name="_Toc242787383"/>
       <w:r>
         <w:t>8.2 Navegación y ciclo de vida (app.js)</w:t>
       </w:r>
-      <w:bookmarkEnd w:id="28"/>
+      <w:bookmarkEnd w:id="29"/>
     </w:p>
     <w:p>
       <w:pPr>
@@ -17232,11 +18438,11 @@
       <w:pPr>
         <w:pStyle w:val="Heading2"/>
       </w:pPr>
-      <w:bookmarkStart w:id="29" w:name="_Toc242786961"/>
+      <w:bookmarkStart w:id="30" w:name="_Toc242787384"/>
       <w:r>
         <w:t>8.3 Mapa del panel (registro.js)</w:t>
       </w:r>
-      <w:bookmarkEnd w:id="29"/>
+      <w:bookmarkEnd w:id="30"/>
     </w:p>
     <w:p>
       <w:pPr>
@@ -17738,7 +18944,7 @@
               <w:spacing w:after="20"/>
             </w:pPr>
             <w:r>
-              <w:t>Carrera de regalos (carrera), Batalla de regalos (batalla)</w:t>
+              <w:t>Carrera de regalos (carrera), Batalla de regalos (batalla), Jefe del LIVE (jefe)</w:t>
             </w:r>
           </w:p>
         </w:tc>
@@ -18017,11 +19223,11 @@
       <w:pPr>
         <w:pStyle w:val="Heading2"/>
       </w:pPr>
-      <w:bookmarkStart w:id="30" w:name="_Toc242786962"/>
+      <w:bookmarkStart w:id="31" w:name="_Toc242787385"/>
       <w:r>
         <w:t>8.4 Datos guardados (almacen.js)</w:t>
       </w:r>
-      <w:bookmarkEnd w:id="30"/>
+      <w:bookmarkEnd w:id="31"/>
     </w:p>
     <w:p>
       <w:pPr>
@@ -18816,11 +20022,11 @@
       <w:pPr>
         <w:pStyle w:val="Heading2"/>
       </w:pPr>
-      <w:bookmarkStart w:id="31" w:name="_Toc242786963"/>
+      <w:bookmarkStart w:id="32" w:name="_Toc242787386"/>
       <w:r>
         <w:t>8.5 Conexión del panel al LIVE (envivo.js)</w:t>
       </w:r>
-      <w:bookmarkEnd w:id="31"/>
+      <w:bookmarkEnd w:id="32"/>
     </w:p>
     <w:p>
       <w:pPr>
@@ -18881,12 +20087,12 @@
       <w:pPr>
         <w:pStyle w:val="Heading2"/>
       </w:pPr>
-      <w:bookmarkStart w:id="32" w:name="_Toc242786964"/>
+      <w:bookmarkStart w:id="33" w:name="_Toc242787387"/>
       <w:r>
         <w:lastRenderedPageBreak/>
         <w:t>8.6 Componentes de interfaz (ui.js)</w:t>
       </w:r>
-      <w:bookmarkEnd w:id="32"/>
+      <w:bookmarkEnd w:id="33"/>
     </w:p>
     <w:tbl>
       <w:tblPr>
@@ -19390,11 +20596,11 @@
       <w:pPr>
         <w:pStyle w:val="Heading2"/>
       </w:pPr>
-      <w:bookmarkStart w:id="33" w:name="_Toc242786965"/>
+      <w:bookmarkStart w:id="34" w:name="_Toc242787388"/>
       <w:r>
         <w:t>8.7 Las vistas</w:t>
       </w:r>
-      <w:bookmarkEnd w:id="33"/>
+      <w:bookmarkEnd w:id="34"/>
     </w:p>
     <w:p>
       <w:pPr>
@@ -19478,6 +20684,22 @@
       </w:pPr>
       <w:r>
         <w:t>La tarjeta del widget tiene, en Personalizar, el sonido y el estilo visual; sus pruebas son “Regalo al equipo A”, “Regalo al equipo B” y combos de 10 para cada uno. La tarjeta Batalla tiene el botón Reiniciar batalla. Hay una tarjeta por equipo con nombre, ID del regalo (con sugerencias del Buscador de regalos: al escribir uno conocido se completan el nombre y el precio), monedas por regalo, color y foto opcional (URL). Un equipo sin regalo, los dos equipos con el mismo regalo o una foto que no empieza con https:// se avisan en rojo, sin bloquear el envío.</w:t>
+      </w:r>
+    </w:p>
+    <w:p>
+      <w:pPr>
+        <w:pStyle w:val="Heading3"/>
+      </w:pPr>
+      <w:r>
+        <w:t>Jefe del LIVE</w:t>
+      </w:r>
+    </w:p>
+    <w:p>
+      <w:pPr>
+        <w:spacing w:after="120"/>
+      </w:pPr>
+      <w:r>
+        <w:t>La tarjeta del widget tiene el nombre del jefe, la vida total, el tiempo límite en minutos y el texto de victoria; en Personalizar, “Los ataques solo cuentan con el reloj en marcha”, los sonidos y el estilo visual. Sus pruebas: “+100 likes”, “Rosa”, “Regalo de 100” y “Golpe final”. La tarjeta Raid tiene el reloj en grande y los botones Iniciar raid (Reanudar en pausa, Nueva raid cuando se agotó el tiempo), Pausar y Reiniciar, que funcionan igual que en la carrera. La tarjeta Daño tiene la vida por like, la vida por moneda y las monedas de un regalo sin precio, y calcula cuánto hace falta para vencer al jefe (“10.000 likes o 1.000 monedas en regalos”), útil para elegir una vida acorde al público.</w:t>
       </w:r>
     </w:p>
     <w:p>
@@ -19594,11 +20816,11 @@
       <w:pPr>
         <w:pStyle w:val="Heading2"/>
       </w:pPr>
-      <w:bookmarkStart w:id="34" w:name="_Toc242786966"/>
+      <w:bookmarkStart w:id="35" w:name="_Toc242787389"/>
       <w:r>
         <w:t>8.8 Vista previa y pruebas</w:t>
       </w:r>
-      <w:bookmarkEnd w:id="34"/>
+      <w:bookmarkEnd w:id="35"/>
     </w:p>
     <w:p>
       <w:pPr>
@@ -19659,54 +20881,22 @@
         <w:spacing w:after="120"/>
       </w:pPr>
       <w:r>
-        <w:t>Un cambio de estilo se le pasa a la vista previa por mensaje (</w:t>
-      </w:r>
-      <w:r>
-        <w:rPr>
-          <w:rFonts w:ascii="Consolas" w:eastAsia="Consolas" w:hAnsi="Consolas" w:cs="Consolas"/>
-          <w:color w:val="7A1F33"/>
-          <w:sz w:val="19"/>
-          <w:szCs w:val="19"/>
-        </w:rPr>
-        <w:t>{ tipo: "tema" }</w:t>
-      </w:r>
-      <w:r>
-        <w:t xml:space="preserve">) sin recargarla; el resto de la configuración la reinicia 400 ms después. La excepción son las claves de </w:t>
-      </w:r>
-      <w:r>
-        <w:rPr>
-          <w:rFonts w:ascii="Consolas" w:eastAsia="Consolas" w:hAnsi="Consolas" w:cs="Consolas"/>
-          <w:color w:val="7A1F33"/>
-          <w:sz w:val="19"/>
-          <w:szCs w:val="19"/>
-        </w:rPr>
-        <w:t>sinRecargar</w:t>
-      </w:r>
-      <w:r>
-        <w:t xml:space="preserve">: la carrera manda el reloj y la ronda, y la batalla la ronda, con </w:t>
-      </w:r>
-      <w:r>
-        <w:rPr>
-          <w:rFonts w:ascii="Consolas" w:eastAsia="Consolas" w:hAnsi="Consolas" w:cs="Consolas"/>
-          <w:color w:val="7A1F33"/>
-          <w:sz w:val="19"/>
-          <w:szCs w:val="19"/>
-        </w:rPr>
-        <w:t>{ tipo: "config" }</w:t>
-      </w:r>
-      <w:r>
-        <w:t>, así Iniciar, Pausar o Reiniciar batalla no borran los puntos de prueba.</w:t>
+        <w:t xml:space="preserve">Un cambio de estilo se le pasa a la vista previa por mensaje ({ tipo: "tema" }) sin recargarla; el resto de la configuración la reinicia 400 ms después. La excepción son las claves de sinRecargar: la carrera y el jefe </w:t>
+      </w:r>
+      <w:r>
+        <w:lastRenderedPageBreak/>
+        <w:t>mandan el reloj y la ronda, y la batalla la ronda, con { tipo: "config" }, así Iniciar, Pausar o Reiniciar batalla no borran los puntos de prueba.</w:t>
       </w:r>
     </w:p>
     <w:p>
       <w:pPr>
         <w:pStyle w:val="Heading2"/>
       </w:pPr>
-      <w:bookmarkStart w:id="35" w:name="_Toc242786967"/>
+      <w:bookmarkStart w:id="36" w:name="_Toc242787390"/>
       <w:r>
         <w:t>8.9 Cambios en vivo en el panel (sincronizar.js)</w:t>
       </w:r>
-      <w:bookmarkEnd w:id="35"/>
+      <w:bookmarkEnd w:id="36"/>
     </w:p>
     <w:p>
       <w:pPr>
@@ -19744,7 +20934,6 @@
         <w:spacing w:after="60"/>
       </w:pPr>
       <w:r>
-        <w:lastRenderedPageBreak/>
         <w:t>Las subidas de un mismo widget van en fila, para que siempre gane la última.</w:t>
       </w:r>
     </w:p>
@@ -19771,19 +20960,7 @@
         <w:spacing w:after="60"/>
       </w:pPr>
       <w:r>
-        <w:t xml:space="preserve">Los botones del reloj de la carrera (Iniciar, Pausar, Reiniciar) y Reiniciar batalla guardan y llaman </w:t>
-      </w:r>
-      <w:r>
-        <w:rPr>
-          <w:rFonts w:ascii="Consolas" w:eastAsia="Consolas" w:hAnsi="Consolas" w:cs="Consolas"/>
-          <w:color w:val="7A1F33"/>
-          <w:sz w:val="19"/>
-          <w:szCs w:val="19"/>
-        </w:rPr>
-        <w:t>sincronizar.subir(id)</w:t>
-      </w:r>
-      <w:r>
-        <w:t xml:space="preserve"> de inmediato, sin la espera de 0,6 s. La validación de la carrera solo bloquea si no hay integrantes; la de la batalla nunca bloquea.</w:t>
+        <w:t>Los botones del reloj de la carrera y del jefe (Iniciar, Pausar, Reiniciar) y Reiniciar batalla guardan y llaman sincronizar.subir(id) de inmediato, sin la espera de 0,6 s. La validación de la carrera solo bloquea si no hay integrantes; la de la batalla nunca bloquea.</w:t>
       </w:r>
     </w:p>
     <w:p>
@@ -19804,22 +20981,22 @@
         <w:pStyle w:val="Heading1"/>
         <w:pageBreakBefore/>
       </w:pPr>
-      <w:bookmarkStart w:id="36" w:name="_Toc242786968"/>
+      <w:bookmarkStart w:id="37" w:name="_Toc242787391"/>
       <w:r>
         <w:lastRenderedPageBreak/>
         <w:t>9. Flujos completos paso a paso</w:t>
       </w:r>
-      <w:bookmarkEnd w:id="36"/>
+      <w:bookmarkEnd w:id="37"/>
     </w:p>
     <w:p>
       <w:pPr>
         <w:pStyle w:val="Heading2"/>
       </w:pPr>
-      <w:bookmarkStart w:id="37" w:name="_Toc242786969"/>
+      <w:bookmarkStart w:id="38" w:name="_Toc242787392"/>
       <w:r>
         <w:t>9.1 Configurar un widget y ponerlo en OBS</w:t>
       </w:r>
-      <w:bookmarkEnd w:id="37"/>
+      <w:bookmarkEnd w:id="38"/>
     </w:p>
     <w:p>
       <w:pPr>
@@ -19998,11 +21175,11 @@
       <w:pPr>
         <w:pStyle w:val="Heading2"/>
       </w:pPr>
-      <w:bookmarkStart w:id="38" w:name="_Toc242786970"/>
+      <w:bookmarkStart w:id="39" w:name="_Toc242787393"/>
       <w:r>
         <w:t>9.2 Llega un regalo y gira la ruleta</w:t>
       </w:r>
-      <w:bookmarkEnd w:id="38"/>
+      <w:bookmarkEnd w:id="39"/>
     </w:p>
     <w:p>
       <w:pPr>
@@ -20139,11 +21316,11 @@
       <w:pPr>
         <w:pStyle w:val="Heading2"/>
       </w:pPr>
-      <w:bookmarkStart w:id="39" w:name="_Toc242786971"/>
+      <w:bookmarkStart w:id="40" w:name="_Toc242787394"/>
       <w:r>
         <w:t>9.3 Probar sin estar en vivo</w:t>
       </w:r>
-      <w:bookmarkEnd w:id="39"/>
+      <w:bookmarkEnd w:id="40"/>
     </w:p>
     <w:p>
       <w:pPr>
@@ -20234,12 +21411,12 @@
       <w:pPr>
         <w:pStyle w:val="Heading2"/>
       </w:pPr>
-      <w:bookmarkStart w:id="40" w:name="_Toc242786972"/>
+      <w:bookmarkStart w:id="41" w:name="_Toc242787395"/>
       <w:r>
         <w:lastRenderedPageBreak/>
         <w:t>9.4 Un regalo cambia de código</w:t>
       </w:r>
-      <w:bookmarkEnd w:id="40"/>
+      <w:bookmarkEnd w:id="41"/>
     </w:p>
     <w:p>
       <w:pPr>
@@ -20603,11 +21780,11 @@
       <w:pPr>
         <w:pStyle w:val="Heading2"/>
       </w:pPr>
-      <w:bookmarkStart w:id="41" w:name="_Toc242786973"/>
+      <w:bookmarkStart w:id="42" w:name="_Toc242787396"/>
       <w:r>
         <w:t>9.5 Cambiar la configuración durante el LIVE</w:t>
       </w:r>
-      <w:bookmarkEnd w:id="41"/>
+      <w:bookmarkEnd w:id="42"/>
     </w:p>
     <w:p>
       <w:pPr>
@@ -20665,11 +21842,11 @@
       <w:pPr>
         <w:pStyle w:val="Heading2"/>
       </w:pPr>
-      <w:bookmarkStart w:id="42" w:name="_Toc242786974"/>
+      <w:bookmarkStart w:id="43" w:name="_Toc242787397"/>
       <w:r>
         <w:t>9.6 Una ronda de la carrera de regalos</w:t>
       </w:r>
-      <w:bookmarkEnd w:id="42"/>
+      <w:bookmarkEnd w:id="43"/>
     </w:p>
     <w:p>
       <w:pPr>
@@ -20779,22 +21956,22 @@
         <w:pStyle w:val="Heading1"/>
         <w:pageBreakBefore/>
       </w:pPr>
-      <w:bookmarkStart w:id="43" w:name="_Toc242786975"/>
+      <w:bookmarkStart w:id="44" w:name="_Toc242787398"/>
       <w:r>
         <w:lastRenderedPageBreak/>
         <w:t>10. Diseño visual</w:t>
       </w:r>
-      <w:bookmarkEnd w:id="43"/>
+      <w:bookmarkEnd w:id="44"/>
     </w:p>
     <w:p>
       <w:pPr>
         <w:pStyle w:val="Heading2"/>
       </w:pPr>
-      <w:bookmarkStart w:id="44" w:name="_Toc242786976"/>
+      <w:bookmarkStart w:id="45" w:name="_Toc242787399"/>
       <w:r>
         <w:t>10.1 Panel</w:t>
       </w:r>
-      <w:bookmarkEnd w:id="44"/>
+      <w:bookmarkEnd w:id="45"/>
     </w:p>
     <w:p>
       <w:pPr>
@@ -21599,11 +22776,11 @@
       <w:pPr>
         <w:pStyle w:val="Heading2"/>
       </w:pPr>
-      <w:bookmarkStart w:id="45" w:name="_Toc242786977"/>
+      <w:bookmarkStart w:id="46" w:name="_Toc242787400"/>
       <w:r>
         <w:t>10.2 Widgets</w:t>
       </w:r>
-      <w:bookmarkEnd w:id="45"/>
+      <w:bookmarkEnd w:id="46"/>
     </w:p>
     <w:p>
       <w:pPr>
@@ -22161,12 +23338,12 @@
         <w:pStyle w:val="Heading1"/>
         <w:pageBreakBefore/>
       </w:pPr>
-      <w:bookmarkStart w:id="46" w:name="_Toc242786978"/>
+      <w:bookmarkStart w:id="47" w:name="_Toc242787401"/>
       <w:r>
         <w:lastRenderedPageBreak/>
         <w:t>11. Seguridad y privacidad</w:t>
       </w:r>
-      <w:bookmarkEnd w:id="46"/>
+      <w:bookmarkEnd w:id="47"/>
     </w:p>
     <w:tbl>
       <w:tblPr>
@@ -22679,12 +23856,12 @@
         <w:pStyle w:val="Heading1"/>
         <w:pageBreakBefore/>
       </w:pPr>
-      <w:bookmarkStart w:id="47" w:name="_Toc242786979"/>
+      <w:bookmarkStart w:id="48" w:name="_Toc242787402"/>
       <w:r>
         <w:lastRenderedPageBreak/>
         <w:t>12. Limitaciones actuales</w:t>
       </w:r>
-      <w:bookmarkEnd w:id="47"/>
+      <w:bookmarkEnd w:id="48"/>
     </w:p>
     <w:tbl>
       <w:tblPr>
@@ -23422,7 +24599,7 @@
               <w:spacing w:after="20"/>
             </w:pPr>
             <w:r>
-              <w:t>Si OBS recarga la fuente, se pierde el conteo (la carrera y la batalla sí conservan sus puntos)</w:t>
+              <w:t>Si OBS recarga la fuente, se pierde el conteo (la carrera, la batalla y el jefe sí conservan su progreso)</w:t>
             </w:r>
           </w:p>
         </w:tc>
@@ -23843,7 +25020,7 @@
               <w:spacing w:after="20"/>
             </w:pPr>
             <w:r>
-              <w:t>El reloj de la carrera depende de la hora del computador</w:t>
+              <w:t>El reloj de la carrera y del jefe depende de la hora del computador</w:t>
             </w:r>
           </w:p>
         </w:tc>
@@ -23976,6 +25153,83 @@
           </w:p>
         </w:tc>
       </w:tr>
+      <w:tr>
+        <w:tc>
+          <w:tcPr>
+            <w:tcW w:w="2808" w:type="dxa"/>
+            <w:tcBorders>
+              <w:top w:val="single" w:sz="4" w:space="0" w:color="BFBFBF"/>
+              <w:left w:val="single" w:sz="4" w:space="0" w:color="BFBFBF"/>
+              <w:bottom w:val="single" w:sz="4" w:space="0" w:color="BFBFBF"/>
+              <w:right w:val="single" w:sz="4" w:space="0" w:color="BFBFBF"/>
+            </w:tcBorders>
+            <w:tcMar>
+              <w:top w:w="60" w:type="dxa"/>
+              <w:left w:w="100" w:type="dxa"/>
+              <w:bottom w:w="60" w:type="dxa"/>
+              <w:right w:w="100" w:type="dxa"/>
+            </w:tcMar>
+          </w:tcPr>
+          <w:p>
+            <w:pPr>
+              <w:spacing w:after="20"/>
+            </w:pPr>
+            <w:r>
+              <w:t>El panel no ve la vida del jefe</w:t>
+            </w:r>
+          </w:p>
+        </w:tc>
+        <w:tc>
+          <w:tcPr>
+            <w:tcW w:w="2808" w:type="dxa"/>
+            <w:tcBorders>
+              <w:top w:val="single" w:sz="4" w:space="0" w:color="BFBFBF"/>
+              <w:left w:val="single" w:sz="4" w:space="0" w:color="BFBFBF"/>
+              <w:bottom w:val="single" w:sz="4" w:space="0" w:color="BFBFBF"/>
+              <w:right w:val="single" w:sz="4" w:space="0" w:color="BFBFBF"/>
+            </w:tcBorders>
+            <w:tcMar>
+              <w:top w:w="60" w:type="dxa"/>
+              <w:left w:w="100" w:type="dxa"/>
+              <w:bottom w:w="60" w:type="dxa"/>
+              <w:right w:w="100" w:type="dxa"/>
+            </w:tcMar>
+          </w:tcPr>
+          <w:p>
+            <w:pPr>
+              <w:spacing w:after="20"/>
+            </w:pPr>
+            <w:r>
+              <w:t>El daño lo cuenta el widget en OBS</w:t>
+            </w:r>
+          </w:p>
+        </w:tc>
+        <w:tc>
+          <w:tcPr>
+            <w:tcW w:w="3744" w:type="dxa"/>
+            <w:tcBorders>
+              <w:top w:val="single" w:sz="4" w:space="0" w:color="BFBFBF"/>
+              <w:left w:val="single" w:sz="4" w:space="0" w:color="BFBFBF"/>
+              <w:bottom w:val="single" w:sz="4" w:space="0" w:color="BFBFBF"/>
+              <w:right w:val="single" w:sz="4" w:space="0" w:color="BFBFBF"/>
+            </w:tcBorders>
+            <w:tcMar>
+              <w:top w:w="60" w:type="dxa"/>
+              <w:left w:w="100" w:type="dxa"/>
+              <w:bottom w:w="60" w:type="dxa"/>
+              <w:right w:w="100" w:type="dxa"/>
+            </w:tcMar>
+          </w:tcPr>
+          <w:p>
+            <w:pPr>
+              <w:spacing w:after="20"/>
+            </w:pPr>
+            <w:r>
+              <w:t>Si el chat gana antes de tiempo, el reloj del panel sigue corriendo</w:t>
+            </w:r>
+          </w:p>
+        </w:tc>
+      </w:tr>
     </w:tbl>
     <w:p>
       <w:pPr>
@@ -23987,12 +25241,12 @@
         <w:pStyle w:val="Heading1"/>
         <w:pageBreakBefore/>
       </w:pPr>
-      <w:bookmarkStart w:id="48" w:name="_Toc242786980"/>
+      <w:bookmarkStart w:id="49" w:name="_Toc242787403"/>
       <w:r>
         <w:lastRenderedPageBreak/>
         <w:t>13. Hacia una versión final montada en un servidor</w:t>
       </w:r>
-      <w:bookmarkEnd w:id="48"/>
+      <w:bookmarkEnd w:id="49"/>
     </w:p>
     <w:p>
       <w:pPr>
@@ -24016,11 +25270,11 @@
       <w:pPr>
         <w:pStyle w:val="Heading2"/>
       </w:pPr>
-      <w:bookmarkStart w:id="49" w:name="_Toc242786981"/>
+      <w:bookmarkStart w:id="50" w:name="_Toc242787404"/>
       <w:r>
         <w:t>13.1 Objetivos de la versión final</w:t>
       </w:r>
-      <w:bookmarkEnd w:id="49"/>
+      <w:bookmarkEnd w:id="50"/>
     </w:p>
     <w:p>
       <w:pPr>
@@ -24178,11 +25432,11 @@
       <w:pPr>
         <w:pStyle w:val="Heading2"/>
       </w:pPr>
-      <w:bookmarkStart w:id="50" w:name="_Toc242786982"/>
+      <w:bookmarkStart w:id="51" w:name="_Toc242787405"/>
       <w:r>
         <w:t>13.2 Arquitectura propuesta</w:t>
       </w:r>
-      <w:bookmarkEnd w:id="50"/>
+      <w:bookmarkEnd w:id="51"/>
     </w:p>
     <w:p>
       <w:pPr>
@@ -25011,11 +26265,11 @@
       <w:pPr>
         <w:pStyle w:val="Heading2"/>
       </w:pPr>
-      <w:bookmarkStart w:id="51" w:name="_Toc242786983"/>
+      <w:bookmarkStart w:id="52" w:name="_Toc242787406"/>
       <w:r>
         <w:t>13.3 Modelo de datos sugerido</w:t>
       </w:r>
-      <w:bookmarkEnd w:id="51"/>
+      <w:bookmarkEnd w:id="52"/>
     </w:p>
     <w:tbl>
       <w:tblPr>
@@ -25722,12 +26976,12 @@
       <w:pPr>
         <w:pStyle w:val="Heading2"/>
       </w:pPr>
-      <w:bookmarkStart w:id="52" w:name="_Toc242786984"/>
+      <w:bookmarkStart w:id="53" w:name="_Toc242787407"/>
       <w:r>
         <w:lastRenderedPageBreak/>
         <w:t>13.4 Seguridad en la versión final</w:t>
       </w:r>
-      <w:bookmarkEnd w:id="52"/>
+      <w:bookmarkEnd w:id="53"/>
     </w:p>
     <w:p>
       <w:pPr>
@@ -25961,11 +27215,11 @@
       <w:pPr>
         <w:pStyle w:val="Heading2"/>
       </w:pPr>
-      <w:bookmarkStart w:id="53" w:name="_Toc242786985"/>
+      <w:bookmarkStart w:id="54" w:name="_Toc242787408"/>
       <w:r>
         <w:t>13.5 Dónde alojarlo</w:t>
       </w:r>
-      <w:bookmarkEnd w:id="53"/>
+      <w:bookmarkEnd w:id="54"/>
     </w:p>
     <w:tbl>
       <w:tblPr>
@@ -26570,11 +27824,11 @@
       <w:pPr>
         <w:pStyle w:val="Heading2"/>
       </w:pPr>
-      <w:bookmarkStart w:id="54" w:name="_Toc242786986"/>
+      <w:bookmarkStart w:id="55" w:name="_Toc242787409"/>
       <w:r>
         <w:t>13.6 Qué se reutiliza y qué cambia del código actual</w:t>
       </w:r>
-      <w:bookmarkEnd w:id="54"/>
+      <w:bookmarkEnd w:id="55"/>
     </w:p>
     <w:tbl>
       <w:tblPr>
@@ -26940,7 +28194,7 @@
               <w:spacing w:after="20"/>
             </w:pPr>
             <w:r>
-              <w:t>Widgets (ruleta.js, meta.js, alertas.js, carrera.js, batalla.js)</w:t>
+              <w:t>Widgets (ruleta.js, meta.js, alertas.js, carrera.js, batalla.js, jefe.js)</w:t>
             </w:r>
           </w:p>
         </w:tc>
@@ -27382,12 +28636,12 @@
       <w:pPr>
         <w:pStyle w:val="Heading2"/>
       </w:pPr>
-      <w:bookmarkStart w:id="55" w:name="_Toc242786987"/>
+      <w:bookmarkStart w:id="56" w:name="_Toc242787410"/>
       <w:r>
         <w:lastRenderedPageBreak/>
         <w:t>13.7 Mejoras técnicas recomendadas</w:t>
       </w:r>
-      <w:bookmarkEnd w:id="55"/>
+      <w:bookmarkEnd w:id="56"/>
     </w:p>
     <w:p>
       <w:pPr>
@@ -27573,11 +28827,11 @@
       <w:pPr>
         <w:pStyle w:val="Heading2"/>
       </w:pPr>
-      <w:bookmarkStart w:id="56" w:name="_Toc242786988"/>
+      <w:bookmarkStart w:id="57" w:name="_Toc242787411"/>
       <w:r>
         <w:t>13.8 Nuevas funciones que habilita un servidor</w:t>
       </w:r>
-      <w:bookmarkEnd w:id="56"/>
+      <w:bookmarkEnd w:id="57"/>
     </w:p>
     <w:p>
       <w:pPr>
@@ -27674,11 +28928,11 @@
       <w:pPr>
         <w:pStyle w:val="Heading2"/>
       </w:pPr>
-      <w:bookmarkStart w:id="57" w:name="_Toc242786989"/>
+      <w:bookmarkStart w:id="58" w:name="_Toc242787412"/>
       <w:r>
         <w:t>13.9 Hoja de ruta por fases</w:t>
       </w:r>
-      <w:bookmarkEnd w:id="57"/>
+      <w:bookmarkEnd w:id="58"/>
     </w:p>
     <w:tbl>
       <w:tblPr>
@@ -28158,22 +29412,22 @@
         <w:pStyle w:val="Heading1"/>
         <w:pageBreakBefore/>
       </w:pPr>
-      <w:bookmarkStart w:id="58" w:name="_Toc242786990"/>
+      <w:bookmarkStart w:id="59" w:name="_Toc242787413"/>
       <w:r>
         <w:lastRenderedPageBreak/>
         <w:t>14. Operación y mantenimiento actual</w:t>
       </w:r>
-      <w:bookmarkEnd w:id="58"/>
+      <w:bookmarkEnd w:id="59"/>
     </w:p>
     <w:p>
       <w:pPr>
         <w:pStyle w:val="Heading2"/>
       </w:pPr>
-      <w:bookmarkStart w:id="59" w:name="_Toc242786991"/>
+      <w:bookmarkStart w:id="60" w:name="_Toc242787414"/>
       <w:r>
         <w:t>14.1 Publicar un cambio</w:t>
       </w:r>
-      <w:bookmarkEnd w:id="59"/>
+      <w:bookmarkEnd w:id="60"/>
     </w:p>
     <w:p>
       <w:pPr>
@@ -28235,11 +29489,11 @@
       <w:pPr>
         <w:pStyle w:val="Heading2"/>
       </w:pPr>
-      <w:bookmarkStart w:id="60" w:name="_Toc242786992"/>
+      <w:bookmarkStart w:id="61" w:name="_Toc242787415"/>
       <w:r>
         <w:t>14.2 Agregar una función nueva</w:t>
       </w:r>
-      <w:bookmarkEnd w:id="60"/>
+      <w:bookmarkEnd w:id="61"/>
     </w:p>
     <w:p>
       <w:pPr>
@@ -28296,11 +29550,11 @@
       <w:pPr>
         <w:pStyle w:val="Heading2"/>
       </w:pPr>
-      <w:bookmarkStart w:id="61" w:name="_Toc242786993"/>
+      <w:bookmarkStart w:id="62" w:name="_Toc242787416"/>
       <w:r>
         <w:t>14.3 Probar</w:t>
       </w:r>
-      <w:bookmarkEnd w:id="61"/>
+      <w:bookmarkEnd w:id="62"/>
     </w:p>
     <w:p>
       <w:pPr>
@@ -28402,6 +29656,19 @@
         <w:spacing w:after="60"/>
       </w:pPr>
       <w:r>
+        <w:t>Jefe del LIVE: en la vista previa, “Golpe final” muestra la victoria; Iniciar raid, Pausar y Reiniciar cambian el reloj y Reiniciar le devuelve la vida, sin recargar. Con la URL del widget abierta en otra pestaña, Iniciar llega en menos de un segundo.</w:t>
+      </w:r>
+    </w:p>
+    <w:p>
+      <w:pPr>
+        <w:pStyle w:val="ListParagraph"/>
+        <w:numPr>
+          <w:ilvl w:val="0"/>
+          <w:numId w:val="3"/>
+        </w:numPr>
+        <w:spacing w:after="60"/>
+      </w:pPr>
+      <w:r>
         <w:t>Servidor estático local: python -m http.server 8080 -d public y abrir http://localhost:8080 (con doble clic no funciona: los módulos JavaScript necesitan http://).</w:t>
       </w:r>
     </w:p>
@@ -28409,11 +29676,12 @@
       <w:pPr>
         <w:pStyle w:val="Heading2"/>
       </w:pPr>
-      <w:bookmarkStart w:id="62" w:name="_Toc242786994"/>
-      <w:r>
+      <w:bookmarkStart w:id="63" w:name="_Toc242787417"/>
+      <w:r>
+        <w:lastRenderedPageBreak/>
         <w:t>14.4 Solución de problemas</w:t>
       </w:r>
-      <w:bookmarkEnd w:id="62"/>
+      <w:bookmarkEnd w:id="63"/>
     </w:p>
     <w:tbl>
       <w:tblPr>
@@ -28707,7 +29975,6 @@
               <w:spacing w:after="20"/>
             </w:pPr>
             <w:r>
-              <w:lastRenderedPageBreak/>
               <w:t>La ruleta no gira con un regalo</w:t>
             </w:r>
           </w:p>
@@ -29302,6 +30569,83 @@
           </w:p>
         </w:tc>
       </w:tr>
+      <w:tr>
+        <w:tc>
+          <w:tcPr>
+            <w:tcW w:w="2808" w:type="dxa"/>
+            <w:tcBorders>
+              <w:top w:val="single" w:sz="4" w:space="0" w:color="BFBFBF"/>
+              <w:left w:val="single" w:sz="4" w:space="0" w:color="BFBFBF"/>
+              <w:bottom w:val="single" w:sz="4" w:space="0" w:color="BFBFBF"/>
+              <w:right w:val="single" w:sz="4" w:space="0" w:color="BFBFBF"/>
+            </w:tcBorders>
+            <w:tcMar>
+              <w:top w:w="60" w:type="dxa"/>
+              <w:left w:w="100" w:type="dxa"/>
+              <w:bottom w:w="60" w:type="dxa"/>
+              <w:right w:w="100" w:type="dxa"/>
+            </w:tcMar>
+          </w:tcPr>
+          <w:p>
+            <w:pPr>
+              <w:spacing w:after="20"/>
+            </w:pPr>
+            <w:r>
+              <w:t>El jefe no pierde vida</w:t>
+            </w:r>
+          </w:p>
+        </w:tc>
+        <w:tc>
+          <w:tcPr>
+            <w:tcW w:w="2995" w:type="dxa"/>
+            <w:tcBorders>
+              <w:top w:val="single" w:sz="4" w:space="0" w:color="BFBFBF"/>
+              <w:left w:val="single" w:sz="4" w:space="0" w:color="BFBFBF"/>
+              <w:bottom w:val="single" w:sz="4" w:space="0" w:color="BFBFBF"/>
+              <w:right w:val="single" w:sz="4" w:space="0" w:color="BFBFBF"/>
+            </w:tcBorders>
+            <w:tcMar>
+              <w:top w:w="60" w:type="dxa"/>
+              <w:left w:w="100" w:type="dxa"/>
+              <w:bottom w:w="60" w:type="dxa"/>
+              <w:right w:w="100" w:type="dxa"/>
+            </w:tcMar>
+          </w:tcPr>
+          <w:p>
+            <w:pPr>
+              <w:spacing w:after="20"/>
+            </w:pPr>
+            <w:r>
+              <w:t>La raid no está iniciada (con “solo con el reloj en marcha”), ya fue vencido, o el daño está en 0</w:t>
+            </w:r>
+          </w:p>
+        </w:tc>
+        <w:tc>
+          <w:tcPr>
+            <w:tcW w:w="3557" w:type="dxa"/>
+            <w:tcBorders>
+              <w:top w:val="single" w:sz="4" w:space="0" w:color="BFBFBF"/>
+              <w:left w:val="single" w:sz="4" w:space="0" w:color="BFBFBF"/>
+              <w:bottom w:val="single" w:sz="4" w:space="0" w:color="BFBFBF"/>
+              <w:right w:val="single" w:sz="4" w:space="0" w:color="BFBFBF"/>
+            </w:tcBorders>
+            <w:tcMar>
+              <w:top w:w="60" w:type="dxa"/>
+              <w:left w:w="100" w:type="dxa"/>
+              <w:bottom w:w="60" w:type="dxa"/>
+              <w:right w:w="100" w:type="dxa"/>
+            </w:tcMar>
+          </w:tcPr>
+          <w:p>
+            <w:pPr>
+              <w:spacing w:after="20"/>
+            </w:pPr>
+            <w:r>
+              <w:t>Pulsar Iniciar raid (o Nueva raid) y revisar la tarjeta Daño</w:t>
+            </w:r>
+          </w:p>
+        </w:tc>
+      </w:tr>
     </w:tbl>
     <w:p>
       <w:pPr>
@@ -29313,12 +30657,12 @@
         <w:pStyle w:val="Heading1"/>
         <w:pageBreakBefore/>
       </w:pPr>
-      <w:bookmarkStart w:id="63" w:name="_Toc242786995"/>
+      <w:bookmarkStart w:id="64" w:name="_Toc242787418"/>
       <w:r>
         <w:lastRenderedPageBreak/>
         <w:t>15. Anexo: historial de decisiones y correcciones</w:t>
       </w:r>
-      <w:bookmarkEnd w:id="63"/>
+      <w:bookmarkEnd w:id="64"/>
     </w:p>
     <w:tbl>
       <w:tblPr>
@@ -31358,6 +32702,160 @@
             </w:pPr>
             <w:r>
               <w:t>Con cada regalo, una lluvia de rosas sonaba sin parar</w:t>
+            </w:r>
+          </w:p>
+        </w:tc>
+      </w:tr>
+      <w:tr>
+        <w:tc>
+          <w:tcPr>
+            <w:tcW w:w="2246" w:type="dxa"/>
+            <w:tcBorders>
+              <w:top w:val="single" w:sz="4" w:space="0" w:color="BFBFBF"/>
+              <w:left w:val="single" w:sz="4" w:space="0" w:color="BFBFBF"/>
+              <w:bottom w:val="single" w:sz="4" w:space="0" w:color="BFBFBF"/>
+              <w:right w:val="single" w:sz="4" w:space="0" w:color="BFBFBF"/>
+            </w:tcBorders>
+            <w:tcMar>
+              <w:top w:w="60" w:type="dxa"/>
+              <w:left w:w="100" w:type="dxa"/>
+              <w:bottom w:w="60" w:type="dxa"/>
+              <w:right w:w="100" w:type="dxa"/>
+            </w:tcMar>
+          </w:tcPr>
+          <w:p>
+            <w:pPr>
+              <w:spacing w:after="20"/>
+            </w:pPr>
+            <w:r>
+              <w:t>Jefe del LIVE</w:t>
+            </w:r>
+          </w:p>
+        </w:tc>
+        <w:tc>
+          <w:tcPr>
+            <w:tcW w:w="3744" w:type="dxa"/>
+            <w:tcBorders>
+              <w:top w:val="single" w:sz="4" w:space="0" w:color="BFBFBF"/>
+              <w:left w:val="single" w:sz="4" w:space="0" w:color="BFBFBF"/>
+              <w:bottom w:val="single" w:sz="4" w:space="0" w:color="BFBFBF"/>
+              <w:right w:val="single" w:sz="4" w:space="0" w:color="BFBFBF"/>
+            </w:tcBorders>
+            <w:tcMar>
+              <w:top w:w="60" w:type="dxa"/>
+              <w:left w:w="100" w:type="dxa"/>
+              <w:bottom w:w="60" w:type="dxa"/>
+              <w:right w:w="100" w:type="dxa"/>
+            </w:tcMar>
+          </w:tcPr>
+          <w:p>
+            <w:pPr>
+              <w:spacing w:after="20"/>
+            </w:pPr>
+            <w:r>
+              <w:t>Reusar el reloj de la carrera (js/reloj.js) y el reinicio por ronda</w:t>
+            </w:r>
+          </w:p>
+        </w:tc>
+        <w:tc>
+          <w:tcPr>
+            <w:tcW w:w="3370" w:type="dxa"/>
+            <w:tcBorders>
+              <w:top w:val="single" w:sz="4" w:space="0" w:color="BFBFBF"/>
+              <w:left w:val="single" w:sz="4" w:space="0" w:color="BFBFBF"/>
+              <w:bottom w:val="single" w:sz="4" w:space="0" w:color="BFBFBF"/>
+              <w:right w:val="single" w:sz="4" w:space="0" w:color="BFBFBF"/>
+            </w:tcBorders>
+            <w:tcMar>
+              <w:top w:w="60" w:type="dxa"/>
+              <w:left w:w="100" w:type="dxa"/>
+              <w:bottom w:w="60" w:type="dxa"/>
+              <w:right w:w="100" w:type="dxa"/>
+            </w:tcMar>
+          </w:tcPr>
+          <w:p>
+            <w:pPr>
+              <w:spacing w:after="20"/>
+            </w:pPr>
+            <w:r>
+              <w:t>Un solo reloj probado para todos los juegos con tiempo</w:t>
+            </w:r>
+          </w:p>
+        </w:tc>
+      </w:tr>
+      <w:tr>
+        <w:tc>
+          <w:tcPr>
+            <w:tcW w:w="2246" w:type="dxa"/>
+            <w:tcBorders>
+              <w:top w:val="single" w:sz="4" w:space="0" w:color="BFBFBF"/>
+              <w:left w:val="single" w:sz="4" w:space="0" w:color="BFBFBF"/>
+              <w:bottom w:val="single" w:sz="4" w:space="0" w:color="BFBFBF"/>
+              <w:right w:val="single" w:sz="4" w:space="0" w:color="BFBFBF"/>
+            </w:tcBorders>
+            <w:tcMar>
+              <w:top w:w="60" w:type="dxa"/>
+              <w:left w:w="100" w:type="dxa"/>
+              <w:bottom w:w="60" w:type="dxa"/>
+              <w:right w:w="100" w:type="dxa"/>
+            </w:tcMar>
+          </w:tcPr>
+          <w:p>
+            <w:pPr>
+              <w:spacing w:after="20"/>
+            </w:pPr>
+            <w:r>
+              <w:t>Daño flotante del jefe</w:t>
+            </w:r>
+          </w:p>
+        </w:tc>
+        <w:tc>
+          <w:tcPr>
+            <w:tcW w:w="3744" w:type="dxa"/>
+            <w:tcBorders>
+              <w:top w:val="single" w:sz="4" w:space="0" w:color="BFBFBF"/>
+              <w:left w:val="single" w:sz="4" w:space="0" w:color="BFBFBF"/>
+              <w:bottom w:val="single" w:sz="4" w:space="0" w:color="BFBFBF"/>
+              <w:right w:val="single" w:sz="4" w:space="0" w:color="BFBFBF"/>
+            </w:tcBorders>
+            <w:tcMar>
+              <w:top w:w="60" w:type="dxa"/>
+              <w:left w:w="100" w:type="dxa"/>
+              <w:bottom w:w="60" w:type="dxa"/>
+              <w:right w:w="100" w:type="dxa"/>
+            </w:tcMar>
+          </w:tcPr>
+          <w:p>
+            <w:pPr>
+              <w:spacing w:after="20"/>
+            </w:pPr>
+            <w:r>
+              <w:t>Junto al borde de la vida, corrido al azar</w:t>
+            </w:r>
+          </w:p>
+        </w:tc>
+        <w:tc>
+          <w:tcPr>
+            <w:tcW w:w="3370" w:type="dxa"/>
+            <w:tcBorders>
+              <w:top w:val="single" w:sz="4" w:space="0" w:color="BFBFBF"/>
+              <w:left w:val="single" w:sz="4" w:space="0" w:color="BFBFBF"/>
+              <w:bottom w:val="single" w:sz="4" w:space="0" w:color="BFBFBF"/>
+              <w:right w:val="single" w:sz="4" w:space="0" w:color="BFBFBF"/>
+            </w:tcBorders>
+            <w:tcMar>
+              <w:top w:w="60" w:type="dxa"/>
+              <w:left w:w="100" w:type="dxa"/>
+              <w:bottom w:w="60" w:type="dxa"/>
+              <w:right w:w="100" w:type="dxa"/>
+            </w:tcMar>
+          </w:tcPr>
+          <w:p>
+            <w:pPr>
+              <w:spacing w:after="20"/>
+            </w:pPr>
+            <w:r>
+              <w:t>Varios golpes seguidos se encimaban en el mismo lugar</w:t>
             </w:r>
           </w:p>
         </w:tc>

</xml_diff>

<commit_message>
Subathon: reloj al que el público le suma tiempo, con tope
- subathon.html + js/widgets/subathon.js + css/widgets/subathon.css: píldora de
  cristal con reloj grande, pulso dorado al sumar tiempo, color de alerta con
  menos de 1 minuto, tope y tiempo sumado guardado por ronda.
- Vista Superposiciones → Juegos → Subathon: tiempo inicial, tope, segundos por
  100 likes y por moneda, y reloj Iniciar/Pausar/+5 min/Reiniciar en vivo.
- README y documentación Word (sección 7.7 y menciones).

Co-Authored-By: Claude Opus 5.5 <noreply@anthropic.com>
</commit_message>
<xml_diff>
--- a/Documentacion-Live-Tools.docx
+++ b/Documentacion-Live-Tools.docx
@@ -42,7 +42,7 @@
         <w:jc w:val="center"/>
       </w:pPr>
       <w:r>
-        <w:t>Ruleta · Metas · Alertas · Carrera, Batalla y Jefe del LIVE · Actividad · Buscador de regalos</w:t>
+        <w:t>Ruleta · Metas · Alertas · Juegos (Carrera, Batalla, Jefe, Subathon) · Actividad · Buscador de regalos</w:t>
       </w:r>
     </w:p>
     <w:p>
@@ -159,7 +159,7 @@
           <w:r>
             <w:fldChar w:fldCharType="separate"/>
           </w:r>
-          <w:hyperlink w:anchor="_Toc242787354" w:history="1">
+          <w:hyperlink w:anchor="_Toc242787886" w:history="1">
             <w:r>
               <w:rPr>
                 <w:rStyle w:val="Hyperlink"/>
@@ -183,7 +183,7 @@
               <w:rPr>
                 <w:noProof/>
               </w:rPr>
-              <w:instrText xml:space="preserve"> PAGEREF _Toc242787354 \h </w:instrText>
+              <w:instrText xml:space="preserve"> PAGEREF _Toc242787886 \h </w:instrText>
             </w:r>
             <w:r>
               <w:rPr>
@@ -225,7 +225,7 @@
               <w14:ligatures w14:val="standardContextual"/>
             </w:rPr>
           </w:pPr>
-          <w:hyperlink w:anchor="_Toc242787355" w:history="1">
+          <w:hyperlink w:anchor="_Toc242787887" w:history="1">
             <w:r>
               <w:rPr>
                 <w:rStyle w:val="Hyperlink"/>
@@ -249,7 +249,7 @@
               <w:rPr>
                 <w:noProof/>
               </w:rPr>
-              <w:instrText xml:space="preserve"> PAGEREF _Toc242787355 \h </w:instrText>
+              <w:instrText xml:space="preserve"> PAGEREF _Toc242787887 \h </w:instrText>
             </w:r>
             <w:r>
               <w:rPr>
@@ -291,7 +291,7 @@
               <w14:ligatures w14:val="standardContextual"/>
             </w:rPr>
           </w:pPr>
-          <w:hyperlink w:anchor="_Toc242787356" w:history="1">
+          <w:hyperlink w:anchor="_Toc242787888" w:history="1">
             <w:r>
               <w:rPr>
                 <w:rStyle w:val="Hyperlink"/>
@@ -315,7 +315,7 @@
               <w:rPr>
                 <w:noProof/>
               </w:rPr>
-              <w:instrText xml:space="preserve"> PAGEREF _Toc242787356 \h </w:instrText>
+              <w:instrText xml:space="preserve"> PAGEREF _Toc242787888 \h </w:instrText>
             </w:r>
             <w:r>
               <w:rPr>
@@ -357,7 +357,7 @@
               <w14:ligatures w14:val="standardContextual"/>
             </w:rPr>
           </w:pPr>
-          <w:hyperlink w:anchor="_Toc242787357" w:history="1">
+          <w:hyperlink w:anchor="_Toc242787889" w:history="1">
             <w:r>
               <w:rPr>
                 <w:rStyle w:val="Hyperlink"/>
@@ -381,7 +381,7 @@
               <w:rPr>
                 <w:noProof/>
               </w:rPr>
-              <w:instrText xml:space="preserve"> PAGEREF _Toc242787357 \h </w:instrText>
+              <w:instrText xml:space="preserve"> PAGEREF _Toc242787889 \h </w:instrText>
             </w:r>
             <w:r>
               <w:rPr>
@@ -423,7 +423,7 @@
               <w14:ligatures w14:val="standardContextual"/>
             </w:rPr>
           </w:pPr>
-          <w:hyperlink w:anchor="_Toc242787358" w:history="1">
+          <w:hyperlink w:anchor="_Toc242787890" w:history="1">
             <w:r>
               <w:rPr>
                 <w:rStyle w:val="Hyperlink"/>
@@ -447,7 +447,7 @@
               <w:rPr>
                 <w:noProof/>
               </w:rPr>
-              <w:instrText xml:space="preserve"> PAGEREF _Toc242787358 \h </w:instrText>
+              <w:instrText xml:space="preserve"> PAGEREF _Toc242787890 \h </w:instrText>
             </w:r>
             <w:r>
               <w:rPr>
@@ -489,7 +489,7 @@
               <w14:ligatures w14:val="standardContextual"/>
             </w:rPr>
           </w:pPr>
-          <w:hyperlink w:anchor="_Toc242787359" w:history="1">
+          <w:hyperlink w:anchor="_Toc242787891" w:history="1">
             <w:r>
               <w:rPr>
                 <w:rStyle w:val="Hyperlink"/>
@@ -513,7 +513,7 @@
               <w:rPr>
                 <w:noProof/>
               </w:rPr>
-              <w:instrText xml:space="preserve"> PAGEREF _Toc242787359 \h </w:instrText>
+              <w:instrText xml:space="preserve"> PAGEREF _Toc242787891 \h </w:instrText>
             </w:r>
             <w:r>
               <w:rPr>
@@ -555,7 +555,7 @@
               <w14:ligatures w14:val="standardContextual"/>
             </w:rPr>
           </w:pPr>
-          <w:hyperlink w:anchor="_Toc242787360" w:history="1">
+          <w:hyperlink w:anchor="_Toc242787892" w:history="1">
             <w:r>
               <w:rPr>
                 <w:rStyle w:val="Hyperlink"/>
@@ -579,7 +579,7 @@
               <w:rPr>
                 <w:noProof/>
               </w:rPr>
-              <w:instrText xml:space="preserve"> PAGEREF _Toc242787360 \h </w:instrText>
+              <w:instrText xml:space="preserve"> PAGEREF _Toc242787892 \h </w:instrText>
             </w:r>
             <w:r>
               <w:rPr>
@@ -621,7 +621,7 @@
               <w14:ligatures w14:val="standardContextual"/>
             </w:rPr>
           </w:pPr>
-          <w:hyperlink w:anchor="_Toc242787361" w:history="1">
+          <w:hyperlink w:anchor="_Toc242787893" w:history="1">
             <w:r>
               <w:rPr>
                 <w:rStyle w:val="Hyperlink"/>
@@ -645,7 +645,7 @@
               <w:rPr>
                 <w:noProof/>
               </w:rPr>
-              <w:instrText xml:space="preserve"> PAGEREF _Toc242787361 \h </w:instrText>
+              <w:instrText xml:space="preserve"> PAGEREF _Toc242787893 \h </w:instrText>
             </w:r>
             <w:r>
               <w:rPr>
@@ -687,7 +687,7 @@
               <w14:ligatures w14:val="standardContextual"/>
             </w:rPr>
           </w:pPr>
-          <w:hyperlink w:anchor="_Toc242787362" w:history="1">
+          <w:hyperlink w:anchor="_Toc242787894" w:history="1">
             <w:r>
               <w:rPr>
                 <w:rStyle w:val="Hyperlink"/>
@@ -711,7 +711,7 @@
               <w:rPr>
                 <w:noProof/>
               </w:rPr>
-              <w:instrText xml:space="preserve"> PAGEREF _Toc242787362 \h </w:instrText>
+              <w:instrText xml:space="preserve"> PAGEREF _Toc242787894 \h </w:instrText>
             </w:r>
             <w:r>
               <w:rPr>
@@ -753,7 +753,7 @@
               <w14:ligatures w14:val="standardContextual"/>
             </w:rPr>
           </w:pPr>
-          <w:hyperlink w:anchor="_Toc242787363" w:history="1">
+          <w:hyperlink w:anchor="_Toc242787895" w:history="1">
             <w:r>
               <w:rPr>
                 <w:rStyle w:val="Hyperlink"/>
@@ -777,7 +777,7 @@
               <w:rPr>
                 <w:noProof/>
               </w:rPr>
-              <w:instrText xml:space="preserve"> PAGEREF _Toc242787363 \h </w:instrText>
+              <w:instrText xml:space="preserve"> PAGEREF _Toc242787895 \h </w:instrText>
             </w:r>
             <w:r>
               <w:rPr>
@@ -819,7 +819,7 @@
               <w14:ligatures w14:val="standardContextual"/>
             </w:rPr>
           </w:pPr>
-          <w:hyperlink w:anchor="_Toc242787364" w:history="1">
+          <w:hyperlink w:anchor="_Toc242787896" w:history="1">
             <w:r>
               <w:rPr>
                 <w:rStyle w:val="Hyperlink"/>
@@ -843,7 +843,7 @@
               <w:rPr>
                 <w:noProof/>
               </w:rPr>
-              <w:instrText xml:space="preserve"> PAGEREF _Toc242787364 \h </w:instrText>
+              <w:instrText xml:space="preserve"> PAGEREF _Toc242787896 \h </w:instrText>
             </w:r>
             <w:r>
               <w:rPr>
@@ -885,7 +885,7 @@
               <w14:ligatures w14:val="standardContextual"/>
             </w:rPr>
           </w:pPr>
-          <w:hyperlink w:anchor="_Toc242787365" w:history="1">
+          <w:hyperlink w:anchor="_Toc242787897" w:history="1">
             <w:r>
               <w:rPr>
                 <w:rStyle w:val="Hyperlink"/>
@@ -909,7 +909,7 @@
               <w:rPr>
                 <w:noProof/>
               </w:rPr>
-              <w:instrText xml:space="preserve"> PAGEREF _Toc242787365 \h </w:instrText>
+              <w:instrText xml:space="preserve"> PAGEREF _Toc242787897 \h </w:instrText>
             </w:r>
             <w:r>
               <w:rPr>
@@ -951,7 +951,7 @@
               <w14:ligatures w14:val="standardContextual"/>
             </w:rPr>
           </w:pPr>
-          <w:hyperlink w:anchor="_Toc242787366" w:history="1">
+          <w:hyperlink w:anchor="_Toc242787898" w:history="1">
             <w:r>
               <w:rPr>
                 <w:rStyle w:val="Hyperlink"/>
@@ -975,7 +975,7 @@
               <w:rPr>
                 <w:noProof/>
               </w:rPr>
-              <w:instrText xml:space="preserve"> PAGEREF _Toc242787366 \h </w:instrText>
+              <w:instrText xml:space="preserve"> PAGEREF _Toc242787898 \h </w:instrText>
             </w:r>
             <w:r>
               <w:rPr>
@@ -1017,7 +1017,7 @@
               <w14:ligatures w14:val="standardContextual"/>
             </w:rPr>
           </w:pPr>
-          <w:hyperlink w:anchor="_Toc242787367" w:history="1">
+          <w:hyperlink w:anchor="_Toc242787899" w:history="1">
             <w:r>
               <w:rPr>
                 <w:rStyle w:val="Hyperlink"/>
@@ -1041,7 +1041,7 @@
               <w:rPr>
                 <w:noProof/>
               </w:rPr>
-              <w:instrText xml:space="preserve"> PAGEREF _Toc242787367 \h </w:instrText>
+              <w:instrText xml:space="preserve"> PAGEREF _Toc242787899 \h </w:instrText>
             </w:r>
             <w:r>
               <w:rPr>
@@ -1083,7 +1083,7 @@
               <w14:ligatures w14:val="standardContextual"/>
             </w:rPr>
           </w:pPr>
-          <w:hyperlink w:anchor="_Toc242787368" w:history="1">
+          <w:hyperlink w:anchor="_Toc242787900" w:history="1">
             <w:r>
               <w:rPr>
                 <w:rStyle w:val="Hyperlink"/>
@@ -1107,7 +1107,7 @@
               <w:rPr>
                 <w:noProof/>
               </w:rPr>
-              <w:instrText xml:space="preserve"> PAGEREF _Toc242787368 \h </w:instrText>
+              <w:instrText xml:space="preserve"> PAGEREF _Toc242787900 \h </w:instrText>
             </w:r>
             <w:r>
               <w:rPr>
@@ -1149,7 +1149,7 @@
               <w14:ligatures w14:val="standardContextual"/>
             </w:rPr>
           </w:pPr>
-          <w:hyperlink w:anchor="_Toc242787369" w:history="1">
+          <w:hyperlink w:anchor="_Toc242787901" w:history="1">
             <w:r>
               <w:rPr>
                 <w:rStyle w:val="Hyperlink"/>
@@ -1173,7 +1173,7 @@
               <w:rPr>
                 <w:noProof/>
               </w:rPr>
-              <w:instrText xml:space="preserve"> PAGEREF _Toc242787369 \h </w:instrText>
+              <w:instrText xml:space="preserve"> PAGEREF _Toc242787901 \h </w:instrText>
             </w:r>
             <w:r>
               <w:rPr>
@@ -1215,7 +1215,7 @@
               <w14:ligatures w14:val="standardContextual"/>
             </w:rPr>
           </w:pPr>
-          <w:hyperlink w:anchor="_Toc242787370" w:history="1">
+          <w:hyperlink w:anchor="_Toc242787902" w:history="1">
             <w:r>
               <w:rPr>
                 <w:rStyle w:val="Hyperlink"/>
@@ -1239,7 +1239,7 @@
               <w:rPr>
                 <w:noProof/>
               </w:rPr>
-              <w:instrText xml:space="preserve"> PAGEREF _Toc242787370 \h </w:instrText>
+              <w:instrText xml:space="preserve"> PAGEREF _Toc242787902 \h </w:instrText>
             </w:r>
             <w:r>
               <w:rPr>
@@ -1281,7 +1281,7 @@
               <w14:ligatures w14:val="standardContextual"/>
             </w:rPr>
           </w:pPr>
-          <w:hyperlink w:anchor="_Toc242787371" w:history="1">
+          <w:hyperlink w:anchor="_Toc242787903" w:history="1">
             <w:r>
               <w:rPr>
                 <w:rStyle w:val="Hyperlink"/>
@@ -1305,7 +1305,7 @@
               <w:rPr>
                 <w:noProof/>
               </w:rPr>
-              <w:instrText xml:space="preserve"> PAGEREF _Toc242787371 \h </w:instrText>
+              <w:instrText xml:space="preserve"> PAGEREF _Toc242787903 \h </w:instrText>
             </w:r>
             <w:r>
               <w:rPr>
@@ -1347,7 +1347,7 @@
               <w14:ligatures w14:val="standardContextual"/>
             </w:rPr>
           </w:pPr>
-          <w:hyperlink w:anchor="_Toc242787372" w:history="1">
+          <w:hyperlink w:anchor="_Toc242787904" w:history="1">
             <w:r>
               <w:rPr>
                 <w:rStyle w:val="Hyperlink"/>
@@ -1371,7 +1371,7 @@
               <w:rPr>
                 <w:noProof/>
               </w:rPr>
-              <w:instrText xml:space="preserve"> PAGEREF _Toc242787372 \h </w:instrText>
+              <w:instrText xml:space="preserve"> PAGEREF _Toc242787904 \h </w:instrText>
             </w:r>
             <w:r>
               <w:rPr>
@@ -1413,7 +1413,7 @@
               <w14:ligatures w14:val="standardContextual"/>
             </w:rPr>
           </w:pPr>
-          <w:hyperlink w:anchor="_Toc242787373" w:history="1">
+          <w:hyperlink w:anchor="_Toc242787905" w:history="1">
             <w:r>
               <w:rPr>
                 <w:rStyle w:val="Hyperlink"/>
@@ -1437,7 +1437,7 @@
               <w:rPr>
                 <w:noProof/>
               </w:rPr>
-              <w:instrText xml:space="preserve"> PAGEREF _Toc242787373 \h </w:instrText>
+              <w:instrText xml:space="preserve"> PAGEREF _Toc242787905 \h </w:instrText>
             </w:r>
             <w:r>
               <w:rPr>
@@ -1479,7 +1479,7 @@
               <w14:ligatures w14:val="standardContextual"/>
             </w:rPr>
           </w:pPr>
-          <w:hyperlink w:anchor="_Toc242787374" w:history="1">
+          <w:hyperlink w:anchor="_Toc242787906" w:history="1">
             <w:r>
               <w:rPr>
                 <w:rStyle w:val="Hyperlink"/>
@@ -1503,7 +1503,7 @@
               <w:rPr>
                 <w:noProof/>
               </w:rPr>
-              <w:instrText xml:space="preserve"> PAGEREF _Toc242787374 \h </w:instrText>
+              <w:instrText xml:space="preserve"> PAGEREF _Toc242787906 \h </w:instrText>
             </w:r>
             <w:r>
               <w:rPr>
@@ -1545,7 +1545,7 @@
               <w14:ligatures w14:val="standardContextual"/>
             </w:rPr>
           </w:pPr>
-          <w:hyperlink w:anchor="_Toc242787375" w:history="1">
+          <w:hyperlink w:anchor="_Toc242787907" w:history="1">
             <w:r>
               <w:rPr>
                 <w:rStyle w:val="Hyperlink"/>
@@ -1569,7 +1569,7 @@
               <w:rPr>
                 <w:noProof/>
               </w:rPr>
-              <w:instrText xml:space="preserve"> PAGEREF _Toc242787375 \h </w:instrText>
+              <w:instrText xml:space="preserve"> PAGEREF _Toc242787907 \h </w:instrText>
             </w:r>
             <w:r>
               <w:rPr>
@@ -1611,7 +1611,7 @@
               <w14:ligatures w14:val="standardContextual"/>
             </w:rPr>
           </w:pPr>
-          <w:hyperlink w:anchor="_Toc242787376" w:history="1">
+          <w:hyperlink w:anchor="_Toc242787908" w:history="1">
             <w:r>
               <w:rPr>
                 <w:rStyle w:val="Hyperlink"/>
@@ -1635,7 +1635,7 @@
               <w:rPr>
                 <w:noProof/>
               </w:rPr>
-              <w:instrText xml:space="preserve"> PAGEREF _Toc242787376 \h </w:instrText>
+              <w:instrText xml:space="preserve"> PAGEREF _Toc242787908 \h </w:instrText>
             </w:r>
             <w:r>
               <w:rPr>
@@ -1677,7 +1677,7 @@
               <w14:ligatures w14:val="standardContextual"/>
             </w:rPr>
           </w:pPr>
-          <w:hyperlink w:anchor="_Toc242787377" w:history="1">
+          <w:hyperlink w:anchor="_Toc242787909" w:history="1">
             <w:r>
               <w:rPr>
                 <w:rStyle w:val="Hyperlink"/>
@@ -1701,7 +1701,7 @@
               <w:rPr>
                 <w:noProof/>
               </w:rPr>
-              <w:instrText xml:space="preserve"> PAGEREF _Toc242787377 \h </w:instrText>
+              <w:instrText xml:space="preserve"> PAGEREF _Toc242787909 \h </w:instrText>
             </w:r>
             <w:r>
               <w:rPr>
@@ -1743,7 +1743,7 @@
               <w14:ligatures w14:val="standardContextual"/>
             </w:rPr>
           </w:pPr>
-          <w:hyperlink w:anchor="_Toc242787378" w:history="1">
+          <w:hyperlink w:anchor="_Toc242787910" w:history="1">
             <w:r>
               <w:rPr>
                 <w:rStyle w:val="Hyperlink"/>
@@ -1767,7 +1767,7 @@
               <w:rPr>
                 <w:noProof/>
               </w:rPr>
-              <w:instrText xml:space="preserve"> PAGEREF _Toc242787378 \h </w:instrText>
+              <w:instrText xml:space="preserve"> PAGEREF _Toc242787910 \h </w:instrText>
             </w:r>
             <w:r>
               <w:rPr>
@@ -1809,7 +1809,7 @@
               <w14:ligatures w14:val="standardContextual"/>
             </w:rPr>
           </w:pPr>
-          <w:hyperlink w:anchor="_Toc242787379" w:history="1">
+          <w:hyperlink w:anchor="_Toc242787911" w:history="1">
             <w:r>
               <w:rPr>
                 <w:rStyle w:val="Hyperlink"/>
@@ -1833,7 +1833,7 @@
               <w:rPr>
                 <w:noProof/>
               </w:rPr>
-              <w:instrText xml:space="preserve"> PAGEREF _Toc242787379 \h </w:instrText>
+              <w:instrText xml:space="preserve"> PAGEREF _Toc242787911 \h </w:instrText>
             </w:r>
             <w:r>
               <w:rPr>
@@ -1875,7 +1875,7 @@
               <w14:ligatures w14:val="standardContextual"/>
             </w:rPr>
           </w:pPr>
-          <w:hyperlink w:anchor="_Toc242787380" w:history="1">
+          <w:hyperlink w:anchor="_Toc242787912" w:history="1">
             <w:r>
               <w:rPr>
                 <w:rStyle w:val="Hyperlink"/>
@@ -1899,7 +1899,7 @@
               <w:rPr>
                 <w:noProof/>
               </w:rPr>
-              <w:instrText xml:space="preserve"> PAGEREF _Toc242787380 \h </w:instrText>
+              <w:instrText xml:space="preserve"> PAGEREF _Toc242787912 \h </w:instrText>
             </w:r>
             <w:r>
               <w:rPr>
@@ -1917,6 +1917,72 @@
                 <w:noProof/>
               </w:rPr>
               <w:t>23</w:t>
+            </w:r>
+            <w:r>
+              <w:rPr>
+                <w:noProof/>
+              </w:rPr>
+              <w:fldChar w:fldCharType="end"/>
+            </w:r>
+          </w:hyperlink>
+        </w:p>
+        <w:p>
+          <w:pPr>
+            <w:pStyle w:val="TOC2"/>
+            <w:tabs>
+              <w:tab w:val="right" w:leader="dot" w:pos="9350"/>
+            </w:tabs>
+            <w:rPr>
+              <w:rFonts w:asciiTheme="minorHAnsi" w:eastAsiaTheme="minorEastAsia" w:hAnsiTheme="minorHAnsi" w:cstheme="minorBidi"/>
+              <w:noProof/>
+              <w:kern w:val="2"/>
+              <w:sz w:val="24"/>
+              <w:szCs w:val="24"/>
+              <w14:ligatures w14:val="standardContextual"/>
+            </w:rPr>
+          </w:pPr>
+          <w:hyperlink w:anchor="_Toc242787913" w:history="1">
+            <w:r>
+              <w:rPr>
+                <w:rStyle w:val="Hyperlink"/>
+                <w:noProof/>
+              </w:rPr>
+              <w:t>7.7 Subathon (subathon.html)</w:t>
+            </w:r>
+            <w:r>
+              <w:rPr>
+                <w:noProof/>
+              </w:rPr>
+              <w:tab/>
+            </w:r>
+            <w:r>
+              <w:rPr>
+                <w:noProof/>
+              </w:rPr>
+              <w:fldChar w:fldCharType="begin"/>
+            </w:r>
+            <w:r>
+              <w:rPr>
+                <w:noProof/>
+              </w:rPr>
+              <w:instrText xml:space="preserve"> PAGEREF _Toc242787913 \h </w:instrText>
+            </w:r>
+            <w:r>
+              <w:rPr>
+                <w:noProof/>
+              </w:rPr>
+            </w:r>
+            <w:r>
+              <w:rPr>
+                <w:noProof/>
+              </w:rPr>
+              <w:fldChar w:fldCharType="separate"/>
+            </w:r>
+            <w:r>
+              <w:rPr>
+                <w:noProof/>
+              </w:rPr>
+              <w:t>25</w:t>
             </w:r>
             <w:r>
               <w:rPr>
@@ -1941,7 +2007,7 @@
               <w14:ligatures w14:val="standardContextual"/>
             </w:rPr>
           </w:pPr>
-          <w:hyperlink w:anchor="_Toc242787381" w:history="1">
+          <w:hyperlink w:anchor="_Toc242787914" w:history="1">
             <w:r>
               <w:rPr>
                 <w:rStyle w:val="Hyperlink"/>
@@ -1965,7 +2031,7 @@
               <w:rPr>
                 <w:noProof/>
               </w:rPr>
-              <w:instrText xml:space="preserve"> PAGEREF _Toc242787381 \h </w:instrText>
+              <w:instrText xml:space="preserve"> PAGEREF _Toc242787914 \h </w:instrText>
             </w:r>
             <w:r>
               <w:rPr>
@@ -1982,7 +2048,7 @@
               <w:rPr>
                 <w:noProof/>
               </w:rPr>
-              <w:t>25</w:t>
+              <w:t>27</w:t>
             </w:r>
             <w:r>
               <w:rPr>
@@ -2007,7 +2073,7 @@
               <w14:ligatures w14:val="standardContextual"/>
             </w:rPr>
           </w:pPr>
-          <w:hyperlink w:anchor="_Toc242787382" w:history="1">
+          <w:hyperlink w:anchor="_Toc242787915" w:history="1">
             <w:r>
               <w:rPr>
                 <w:rStyle w:val="Hyperlink"/>
@@ -2031,7 +2097,7 @@
               <w:rPr>
                 <w:noProof/>
               </w:rPr>
-              <w:instrText xml:space="preserve"> PAGEREF _Toc242787382 \h </w:instrText>
+              <w:instrText xml:space="preserve"> PAGEREF _Toc242787915 \h </w:instrText>
             </w:r>
             <w:r>
               <w:rPr>
@@ -2048,7 +2114,7 @@
               <w:rPr>
                 <w:noProof/>
               </w:rPr>
-              <w:t>25</w:t>
+              <w:t>27</w:t>
             </w:r>
             <w:r>
               <w:rPr>
@@ -2073,7 +2139,7 @@
               <w14:ligatures w14:val="standardContextual"/>
             </w:rPr>
           </w:pPr>
-          <w:hyperlink w:anchor="_Toc242787383" w:history="1">
+          <w:hyperlink w:anchor="_Toc242787916" w:history="1">
             <w:r>
               <w:rPr>
                 <w:rStyle w:val="Hyperlink"/>
@@ -2097,7 +2163,7 @@
               <w:rPr>
                 <w:noProof/>
               </w:rPr>
-              <w:instrText xml:space="preserve"> PAGEREF _Toc242787383 \h </w:instrText>
+              <w:instrText xml:space="preserve"> PAGEREF _Toc242787916 \h </w:instrText>
             </w:r>
             <w:r>
               <w:rPr>
@@ -2114,7 +2180,7 @@
               <w:rPr>
                 <w:noProof/>
               </w:rPr>
-              <w:t>25</w:t>
+              <w:t>27</w:t>
             </w:r>
             <w:r>
               <w:rPr>
@@ -2139,7 +2205,7 @@
               <w14:ligatures w14:val="standardContextual"/>
             </w:rPr>
           </w:pPr>
-          <w:hyperlink w:anchor="_Toc242787384" w:history="1">
+          <w:hyperlink w:anchor="_Toc242787917" w:history="1">
             <w:r>
               <w:rPr>
                 <w:rStyle w:val="Hyperlink"/>
@@ -2163,7 +2229,7 @@
               <w:rPr>
                 <w:noProof/>
               </w:rPr>
-              <w:instrText xml:space="preserve"> PAGEREF _Toc242787384 \h </w:instrText>
+              <w:instrText xml:space="preserve"> PAGEREF _Toc242787917 \h </w:instrText>
             </w:r>
             <w:r>
               <w:rPr>
@@ -2180,7 +2246,7 @@
               <w:rPr>
                 <w:noProof/>
               </w:rPr>
-              <w:t>25</w:t>
+              <w:t>27</w:t>
             </w:r>
             <w:r>
               <w:rPr>
@@ -2205,7 +2271,7 @@
               <w14:ligatures w14:val="standardContextual"/>
             </w:rPr>
           </w:pPr>
-          <w:hyperlink w:anchor="_Toc242787385" w:history="1">
+          <w:hyperlink w:anchor="_Toc242787918" w:history="1">
             <w:r>
               <w:rPr>
                 <w:rStyle w:val="Hyperlink"/>
@@ -2229,7 +2295,7 @@
               <w:rPr>
                 <w:noProof/>
               </w:rPr>
-              <w:instrText xml:space="preserve"> PAGEREF _Toc242787385 \h </w:instrText>
+              <w:instrText xml:space="preserve"> PAGEREF _Toc242787918 \h </w:instrText>
             </w:r>
             <w:r>
               <w:rPr>
@@ -2246,7 +2312,7 @@
               <w:rPr>
                 <w:noProof/>
               </w:rPr>
-              <w:t>26</w:t>
+              <w:t>28</w:t>
             </w:r>
             <w:r>
               <w:rPr>
@@ -2271,7 +2337,7 @@
               <w14:ligatures w14:val="standardContextual"/>
             </w:rPr>
           </w:pPr>
-          <w:hyperlink w:anchor="_Toc242787386" w:history="1">
+          <w:hyperlink w:anchor="_Toc242787919" w:history="1">
             <w:r>
               <w:rPr>
                 <w:rStyle w:val="Hyperlink"/>
@@ -2295,7 +2361,7 @@
               <w:rPr>
                 <w:noProof/>
               </w:rPr>
-              <w:instrText xml:space="preserve"> PAGEREF _Toc242787386 \h </w:instrText>
+              <w:instrText xml:space="preserve"> PAGEREF _Toc242787919 \h </w:instrText>
             </w:r>
             <w:r>
               <w:rPr>
@@ -2312,7 +2378,7 @@
               <w:rPr>
                 <w:noProof/>
               </w:rPr>
-              <w:t>26</w:t>
+              <w:t>28</w:t>
             </w:r>
             <w:r>
               <w:rPr>
@@ -2337,7 +2403,7 @@
               <w14:ligatures w14:val="standardContextual"/>
             </w:rPr>
           </w:pPr>
-          <w:hyperlink w:anchor="_Toc242787387" w:history="1">
+          <w:hyperlink w:anchor="_Toc242787920" w:history="1">
             <w:r>
               <w:rPr>
                 <w:rStyle w:val="Hyperlink"/>
@@ -2361,7 +2427,7 @@
               <w:rPr>
                 <w:noProof/>
               </w:rPr>
-              <w:instrText xml:space="preserve"> PAGEREF _Toc242787387 \h </w:instrText>
+              <w:instrText xml:space="preserve"> PAGEREF _Toc242787920 \h </w:instrText>
             </w:r>
             <w:r>
               <w:rPr>
@@ -2378,7 +2444,7 @@
               <w:rPr>
                 <w:noProof/>
               </w:rPr>
-              <w:t>27</w:t>
+              <w:t>29</w:t>
             </w:r>
             <w:r>
               <w:rPr>
@@ -2403,7 +2469,7 @@
               <w14:ligatures w14:val="standardContextual"/>
             </w:rPr>
           </w:pPr>
-          <w:hyperlink w:anchor="_Toc242787388" w:history="1">
+          <w:hyperlink w:anchor="_Toc242787921" w:history="1">
             <w:r>
               <w:rPr>
                 <w:rStyle w:val="Hyperlink"/>
@@ -2427,7 +2493,7 @@
               <w:rPr>
                 <w:noProof/>
               </w:rPr>
-              <w:instrText xml:space="preserve"> PAGEREF _Toc242787388 \h </w:instrText>
+              <w:instrText xml:space="preserve"> PAGEREF _Toc242787921 \h </w:instrText>
             </w:r>
             <w:r>
               <w:rPr>
@@ -2444,7 +2510,7 @@
               <w:rPr>
                 <w:noProof/>
               </w:rPr>
-              <w:t>27</w:t>
+              <w:t>29</w:t>
             </w:r>
             <w:r>
               <w:rPr>
@@ -2469,7 +2535,7 @@
               <w14:ligatures w14:val="standardContextual"/>
             </w:rPr>
           </w:pPr>
-          <w:hyperlink w:anchor="_Toc242787389" w:history="1">
+          <w:hyperlink w:anchor="_Toc242787922" w:history="1">
             <w:r>
               <w:rPr>
                 <w:rStyle w:val="Hyperlink"/>
@@ -2493,7 +2559,7 @@
               <w:rPr>
                 <w:noProof/>
               </w:rPr>
-              <w:instrText xml:space="preserve"> PAGEREF _Toc242787389 \h </w:instrText>
+              <w:instrText xml:space="preserve"> PAGEREF _Toc242787922 \h </w:instrText>
             </w:r>
             <w:r>
               <w:rPr>
@@ -2510,7 +2576,7 @@
               <w:rPr>
                 <w:noProof/>
               </w:rPr>
-              <w:t>28</w:t>
+              <w:t>31</w:t>
             </w:r>
             <w:r>
               <w:rPr>
@@ -2535,7 +2601,7 @@
               <w14:ligatures w14:val="standardContextual"/>
             </w:rPr>
           </w:pPr>
-          <w:hyperlink w:anchor="_Toc242787390" w:history="1">
+          <w:hyperlink w:anchor="_Toc242787923" w:history="1">
             <w:r>
               <w:rPr>
                 <w:rStyle w:val="Hyperlink"/>
@@ -2559,7 +2625,7 @@
               <w:rPr>
                 <w:noProof/>
               </w:rPr>
-              <w:instrText xml:space="preserve"> PAGEREF _Toc242787390 \h </w:instrText>
+              <w:instrText xml:space="preserve"> PAGEREF _Toc242787923 \h </w:instrText>
             </w:r>
             <w:r>
               <w:rPr>
@@ -2576,7 +2642,7 @@
               <w:rPr>
                 <w:noProof/>
               </w:rPr>
-              <w:t>29</w:t>
+              <w:t>31</w:t>
             </w:r>
             <w:r>
               <w:rPr>
@@ -2601,7 +2667,7 @@
               <w14:ligatures w14:val="standardContextual"/>
             </w:rPr>
           </w:pPr>
-          <w:hyperlink w:anchor="_Toc242787391" w:history="1">
+          <w:hyperlink w:anchor="_Toc242787924" w:history="1">
             <w:r>
               <w:rPr>
                 <w:rStyle w:val="Hyperlink"/>
@@ -2625,7 +2691,7 @@
               <w:rPr>
                 <w:noProof/>
               </w:rPr>
-              <w:instrText xml:space="preserve"> PAGEREF _Toc242787391 \h </w:instrText>
+              <w:instrText xml:space="preserve"> PAGEREF _Toc242787924 \h </w:instrText>
             </w:r>
             <w:r>
               <w:rPr>
@@ -2642,7 +2708,7 @@
               <w:rPr>
                 <w:noProof/>
               </w:rPr>
-              <w:t>30</w:t>
+              <w:t>32</w:t>
             </w:r>
             <w:r>
               <w:rPr>
@@ -2667,7 +2733,7 @@
               <w14:ligatures w14:val="standardContextual"/>
             </w:rPr>
           </w:pPr>
-          <w:hyperlink w:anchor="_Toc242787392" w:history="1">
+          <w:hyperlink w:anchor="_Toc242787925" w:history="1">
             <w:r>
               <w:rPr>
                 <w:rStyle w:val="Hyperlink"/>
@@ -2691,7 +2757,7 @@
               <w:rPr>
                 <w:noProof/>
               </w:rPr>
-              <w:instrText xml:space="preserve"> PAGEREF _Toc242787392 \h </w:instrText>
+              <w:instrText xml:space="preserve"> PAGEREF _Toc242787925 \h </w:instrText>
             </w:r>
             <w:r>
               <w:rPr>
@@ -2708,7 +2774,7 @@
               <w:rPr>
                 <w:noProof/>
               </w:rPr>
-              <w:t>30</w:t>
+              <w:t>32</w:t>
             </w:r>
             <w:r>
               <w:rPr>
@@ -2733,7 +2799,7 @@
               <w14:ligatures w14:val="standardContextual"/>
             </w:rPr>
           </w:pPr>
-          <w:hyperlink w:anchor="_Toc242787393" w:history="1">
+          <w:hyperlink w:anchor="_Toc242787926" w:history="1">
             <w:r>
               <w:rPr>
                 <w:rStyle w:val="Hyperlink"/>
@@ -2757,7 +2823,7 @@
               <w:rPr>
                 <w:noProof/>
               </w:rPr>
-              <w:instrText xml:space="preserve"> PAGEREF _Toc242787393 \h </w:instrText>
+              <w:instrText xml:space="preserve"> PAGEREF _Toc242787926 \h </w:instrText>
             </w:r>
             <w:r>
               <w:rPr>
@@ -2774,7 +2840,7 @@
               <w:rPr>
                 <w:noProof/>
               </w:rPr>
-              <w:t>30</w:t>
+              <w:t>32</w:t>
             </w:r>
             <w:r>
               <w:rPr>
@@ -2799,7 +2865,7 @@
               <w14:ligatures w14:val="standardContextual"/>
             </w:rPr>
           </w:pPr>
-          <w:hyperlink w:anchor="_Toc242787394" w:history="1">
+          <w:hyperlink w:anchor="_Toc242787927" w:history="1">
             <w:r>
               <w:rPr>
                 <w:rStyle w:val="Hyperlink"/>
@@ -2823,7 +2889,7 @@
               <w:rPr>
                 <w:noProof/>
               </w:rPr>
-              <w:instrText xml:space="preserve"> PAGEREF _Toc242787394 \h </w:instrText>
+              <w:instrText xml:space="preserve"> PAGEREF _Toc242787927 \h </w:instrText>
             </w:r>
             <w:r>
               <w:rPr>
@@ -2840,7 +2906,7 @@
               <w:rPr>
                 <w:noProof/>
               </w:rPr>
-              <w:t>30</w:t>
+              <w:t>32</w:t>
             </w:r>
             <w:r>
               <w:rPr>
@@ -2865,7 +2931,7 @@
               <w14:ligatures w14:val="standardContextual"/>
             </w:rPr>
           </w:pPr>
-          <w:hyperlink w:anchor="_Toc242787395" w:history="1">
+          <w:hyperlink w:anchor="_Toc242787928" w:history="1">
             <w:r>
               <w:rPr>
                 <w:rStyle w:val="Hyperlink"/>
@@ -2889,7 +2955,7 @@
               <w:rPr>
                 <w:noProof/>
               </w:rPr>
-              <w:instrText xml:space="preserve"> PAGEREF _Toc242787395 \h </w:instrText>
+              <w:instrText xml:space="preserve"> PAGEREF _Toc242787928 \h </w:instrText>
             </w:r>
             <w:r>
               <w:rPr>
@@ -2906,7 +2972,7 @@
               <w:rPr>
                 <w:noProof/>
               </w:rPr>
-              <w:t>31</w:t>
+              <w:t>33</w:t>
             </w:r>
             <w:r>
               <w:rPr>
@@ -2931,7 +2997,7 @@
               <w14:ligatures w14:val="standardContextual"/>
             </w:rPr>
           </w:pPr>
-          <w:hyperlink w:anchor="_Toc242787396" w:history="1">
+          <w:hyperlink w:anchor="_Toc242787929" w:history="1">
             <w:r>
               <w:rPr>
                 <w:rStyle w:val="Hyperlink"/>
@@ -2955,7 +3021,7 @@
               <w:rPr>
                 <w:noProof/>
               </w:rPr>
-              <w:instrText xml:space="preserve"> PAGEREF _Toc242787396 \h </w:instrText>
+              <w:instrText xml:space="preserve"> PAGEREF _Toc242787929 \h </w:instrText>
             </w:r>
             <w:r>
               <w:rPr>
@@ -2972,7 +3038,7 @@
               <w:rPr>
                 <w:noProof/>
               </w:rPr>
-              <w:t>31</w:t>
+              <w:t>33</w:t>
             </w:r>
             <w:r>
               <w:rPr>
@@ -2997,7 +3063,7 @@
               <w14:ligatures w14:val="standardContextual"/>
             </w:rPr>
           </w:pPr>
-          <w:hyperlink w:anchor="_Toc242787397" w:history="1">
+          <w:hyperlink w:anchor="_Toc242787930" w:history="1">
             <w:r>
               <w:rPr>
                 <w:rStyle w:val="Hyperlink"/>
@@ -3021,7 +3087,7 @@
               <w:rPr>
                 <w:noProof/>
               </w:rPr>
-              <w:instrText xml:space="preserve"> PAGEREF _Toc242787397 \h </w:instrText>
+              <w:instrText xml:space="preserve"> PAGEREF _Toc242787930 \h </w:instrText>
             </w:r>
             <w:r>
               <w:rPr>
@@ -3038,7 +3104,7 @@
               <w:rPr>
                 <w:noProof/>
               </w:rPr>
-              <w:t>31</w:t>
+              <w:t>33</w:t>
             </w:r>
             <w:r>
               <w:rPr>
@@ -3063,7 +3129,7 @@
               <w14:ligatures w14:val="standardContextual"/>
             </w:rPr>
           </w:pPr>
-          <w:hyperlink w:anchor="_Toc242787398" w:history="1">
+          <w:hyperlink w:anchor="_Toc242787931" w:history="1">
             <w:r>
               <w:rPr>
                 <w:rStyle w:val="Hyperlink"/>
@@ -3087,7 +3153,7 @@
               <w:rPr>
                 <w:noProof/>
               </w:rPr>
-              <w:instrText xml:space="preserve"> PAGEREF _Toc242787398 \h </w:instrText>
+              <w:instrText xml:space="preserve"> PAGEREF _Toc242787931 \h </w:instrText>
             </w:r>
             <w:r>
               <w:rPr>
@@ -3104,7 +3170,7 @@
               <w:rPr>
                 <w:noProof/>
               </w:rPr>
-              <w:t>33</w:t>
+              <w:t>35</w:t>
             </w:r>
             <w:r>
               <w:rPr>
@@ -3129,7 +3195,7 @@
               <w14:ligatures w14:val="standardContextual"/>
             </w:rPr>
           </w:pPr>
-          <w:hyperlink w:anchor="_Toc242787399" w:history="1">
+          <w:hyperlink w:anchor="_Toc242787932" w:history="1">
             <w:r>
               <w:rPr>
                 <w:rStyle w:val="Hyperlink"/>
@@ -3153,7 +3219,7 @@
               <w:rPr>
                 <w:noProof/>
               </w:rPr>
-              <w:instrText xml:space="preserve"> PAGEREF _Toc242787399 \h </w:instrText>
+              <w:instrText xml:space="preserve"> PAGEREF _Toc242787932 \h </w:instrText>
             </w:r>
             <w:r>
               <w:rPr>
@@ -3170,7 +3236,7 @@
               <w:rPr>
                 <w:noProof/>
               </w:rPr>
-              <w:t>33</w:t>
+              <w:t>35</w:t>
             </w:r>
             <w:r>
               <w:rPr>
@@ -3195,7 +3261,7 @@
               <w14:ligatures w14:val="standardContextual"/>
             </w:rPr>
           </w:pPr>
-          <w:hyperlink w:anchor="_Toc242787400" w:history="1">
+          <w:hyperlink w:anchor="_Toc242787933" w:history="1">
             <w:r>
               <w:rPr>
                 <w:rStyle w:val="Hyperlink"/>
@@ -3219,7 +3285,7 @@
               <w:rPr>
                 <w:noProof/>
               </w:rPr>
-              <w:instrText xml:space="preserve"> PAGEREF _Toc242787400 \h </w:instrText>
+              <w:instrText xml:space="preserve"> PAGEREF _Toc242787933 \h </w:instrText>
             </w:r>
             <w:r>
               <w:rPr>
@@ -3236,7 +3302,7 @@
               <w:rPr>
                 <w:noProof/>
               </w:rPr>
-              <w:t>33</w:t>
+              <w:t>35</w:t>
             </w:r>
             <w:r>
               <w:rPr>
@@ -3261,7 +3327,7 @@
               <w14:ligatures w14:val="standardContextual"/>
             </w:rPr>
           </w:pPr>
-          <w:hyperlink w:anchor="_Toc242787401" w:history="1">
+          <w:hyperlink w:anchor="_Toc242787934" w:history="1">
             <w:r>
               <w:rPr>
                 <w:rStyle w:val="Hyperlink"/>
@@ -3285,7 +3351,7 @@
               <w:rPr>
                 <w:noProof/>
               </w:rPr>
-              <w:instrText xml:space="preserve"> PAGEREF _Toc242787401 \h </w:instrText>
+              <w:instrText xml:space="preserve"> PAGEREF _Toc242787934 \h </w:instrText>
             </w:r>
             <w:r>
               <w:rPr>
@@ -3302,7 +3368,7 @@
               <w:rPr>
                 <w:noProof/>
               </w:rPr>
-              <w:t>35</w:t>
+              <w:t>37</w:t>
             </w:r>
             <w:r>
               <w:rPr>
@@ -3327,7 +3393,7 @@
               <w14:ligatures w14:val="standardContextual"/>
             </w:rPr>
           </w:pPr>
-          <w:hyperlink w:anchor="_Toc242787402" w:history="1">
+          <w:hyperlink w:anchor="_Toc242787935" w:history="1">
             <w:r>
               <w:rPr>
                 <w:rStyle w:val="Hyperlink"/>
@@ -3351,7 +3417,7 @@
               <w:rPr>
                 <w:noProof/>
               </w:rPr>
-              <w:instrText xml:space="preserve"> PAGEREF _Toc242787402 \h </w:instrText>
+              <w:instrText xml:space="preserve"> PAGEREF _Toc242787935 \h </w:instrText>
             </w:r>
             <w:r>
               <w:rPr>
@@ -3368,7 +3434,7 @@
               <w:rPr>
                 <w:noProof/>
               </w:rPr>
-              <w:t>36</w:t>
+              <w:t>38</w:t>
             </w:r>
             <w:r>
               <w:rPr>
@@ -3393,7 +3459,7 @@
               <w14:ligatures w14:val="standardContextual"/>
             </w:rPr>
           </w:pPr>
-          <w:hyperlink w:anchor="_Toc242787403" w:history="1">
+          <w:hyperlink w:anchor="_Toc242787936" w:history="1">
             <w:r>
               <w:rPr>
                 <w:rStyle w:val="Hyperlink"/>
@@ -3417,7 +3483,7 @@
               <w:rPr>
                 <w:noProof/>
               </w:rPr>
-              <w:instrText xml:space="preserve"> PAGEREF _Toc242787403 \h </w:instrText>
+              <w:instrText xml:space="preserve"> PAGEREF _Toc242787936 \h </w:instrText>
             </w:r>
             <w:r>
               <w:rPr>
@@ -3434,7 +3500,7 @@
               <w:rPr>
                 <w:noProof/>
               </w:rPr>
-              <w:t>38</w:t>
+              <w:t>40</w:t>
             </w:r>
             <w:r>
               <w:rPr>
@@ -3459,7 +3525,7 @@
               <w14:ligatures w14:val="standardContextual"/>
             </w:rPr>
           </w:pPr>
-          <w:hyperlink w:anchor="_Toc242787404" w:history="1">
+          <w:hyperlink w:anchor="_Toc242787937" w:history="1">
             <w:r>
               <w:rPr>
                 <w:rStyle w:val="Hyperlink"/>
@@ -3483,7 +3549,7 @@
               <w:rPr>
                 <w:noProof/>
               </w:rPr>
-              <w:instrText xml:space="preserve"> PAGEREF _Toc242787404 \h </w:instrText>
+              <w:instrText xml:space="preserve"> PAGEREF _Toc242787937 \h </w:instrText>
             </w:r>
             <w:r>
               <w:rPr>
@@ -3500,7 +3566,7 @@
               <w:rPr>
                 <w:noProof/>
               </w:rPr>
-              <w:t>38</w:t>
+              <w:t>40</w:t>
             </w:r>
             <w:r>
               <w:rPr>
@@ -3525,7 +3591,7 @@
               <w14:ligatures w14:val="standardContextual"/>
             </w:rPr>
           </w:pPr>
-          <w:hyperlink w:anchor="_Toc242787405" w:history="1">
+          <w:hyperlink w:anchor="_Toc242787938" w:history="1">
             <w:r>
               <w:rPr>
                 <w:rStyle w:val="Hyperlink"/>
@@ -3549,7 +3615,7 @@
               <w:rPr>
                 <w:noProof/>
               </w:rPr>
-              <w:instrText xml:space="preserve"> PAGEREF _Toc242787405 \h </w:instrText>
+              <w:instrText xml:space="preserve"> PAGEREF _Toc242787938 \h </w:instrText>
             </w:r>
             <w:r>
               <w:rPr>
@@ -3566,7 +3632,7 @@
               <w:rPr>
                 <w:noProof/>
               </w:rPr>
-              <w:t>38</w:t>
+              <w:t>40</w:t>
             </w:r>
             <w:r>
               <w:rPr>
@@ -3591,7 +3657,7 @@
               <w14:ligatures w14:val="standardContextual"/>
             </w:rPr>
           </w:pPr>
-          <w:hyperlink w:anchor="_Toc242787406" w:history="1">
+          <w:hyperlink w:anchor="_Toc242787939" w:history="1">
             <w:r>
               <w:rPr>
                 <w:rStyle w:val="Hyperlink"/>
@@ -3615,7 +3681,7 @@
               <w:rPr>
                 <w:noProof/>
               </w:rPr>
-              <w:instrText xml:space="preserve"> PAGEREF _Toc242787406 \h </w:instrText>
+              <w:instrText xml:space="preserve"> PAGEREF _Toc242787939 \h </w:instrText>
             </w:r>
             <w:r>
               <w:rPr>
@@ -3632,7 +3698,7 @@
               <w:rPr>
                 <w:noProof/>
               </w:rPr>
-              <w:t>39</w:t>
+              <w:t>41</w:t>
             </w:r>
             <w:r>
               <w:rPr>
@@ -3657,7 +3723,7 @@
               <w14:ligatures w14:val="standardContextual"/>
             </w:rPr>
           </w:pPr>
-          <w:hyperlink w:anchor="_Toc242787407" w:history="1">
+          <w:hyperlink w:anchor="_Toc242787940" w:history="1">
             <w:r>
               <w:rPr>
                 <w:rStyle w:val="Hyperlink"/>
@@ -3681,7 +3747,7 @@
               <w:rPr>
                 <w:noProof/>
               </w:rPr>
-              <w:instrText xml:space="preserve"> PAGEREF _Toc242787407 \h </w:instrText>
+              <w:instrText xml:space="preserve"> PAGEREF _Toc242787940 \h </w:instrText>
             </w:r>
             <w:r>
               <w:rPr>
@@ -3698,7 +3764,7 @@
               <w:rPr>
                 <w:noProof/>
               </w:rPr>
-              <w:t>40</w:t>
+              <w:t>42</w:t>
             </w:r>
             <w:r>
               <w:rPr>
@@ -3723,7 +3789,7 @@
               <w14:ligatures w14:val="standardContextual"/>
             </w:rPr>
           </w:pPr>
-          <w:hyperlink w:anchor="_Toc242787408" w:history="1">
+          <w:hyperlink w:anchor="_Toc242787941" w:history="1">
             <w:r>
               <w:rPr>
                 <w:rStyle w:val="Hyperlink"/>
@@ -3747,7 +3813,7 @@
               <w:rPr>
                 <w:noProof/>
               </w:rPr>
-              <w:instrText xml:space="preserve"> PAGEREF _Toc242787408 \h </w:instrText>
+              <w:instrText xml:space="preserve"> PAGEREF _Toc242787941 \h </w:instrText>
             </w:r>
             <w:r>
               <w:rPr>
@@ -3764,7 +3830,7 @@
               <w:rPr>
                 <w:noProof/>
               </w:rPr>
-              <w:t>40</w:t>
+              <w:t>42</w:t>
             </w:r>
             <w:r>
               <w:rPr>
@@ -3789,7 +3855,7 @@
               <w14:ligatures w14:val="standardContextual"/>
             </w:rPr>
           </w:pPr>
-          <w:hyperlink w:anchor="_Toc242787409" w:history="1">
+          <w:hyperlink w:anchor="_Toc242787942" w:history="1">
             <w:r>
               <w:rPr>
                 <w:rStyle w:val="Hyperlink"/>
@@ -3813,7 +3879,7 @@
               <w:rPr>
                 <w:noProof/>
               </w:rPr>
-              <w:instrText xml:space="preserve"> PAGEREF _Toc242787409 \h </w:instrText>
+              <w:instrText xml:space="preserve"> PAGEREF _Toc242787942 \h </w:instrText>
             </w:r>
             <w:r>
               <w:rPr>
@@ -3830,7 +3896,7 @@
               <w:rPr>
                 <w:noProof/>
               </w:rPr>
-              <w:t>41</w:t>
+              <w:t>43</w:t>
             </w:r>
             <w:r>
               <w:rPr>
@@ -3855,7 +3921,7 @@
               <w14:ligatures w14:val="standardContextual"/>
             </w:rPr>
           </w:pPr>
-          <w:hyperlink w:anchor="_Toc242787410" w:history="1">
+          <w:hyperlink w:anchor="_Toc242787943" w:history="1">
             <w:r>
               <w:rPr>
                 <w:rStyle w:val="Hyperlink"/>
@@ -3879,7 +3945,7 @@
               <w:rPr>
                 <w:noProof/>
               </w:rPr>
-              <w:instrText xml:space="preserve"> PAGEREF _Toc242787410 \h </w:instrText>
+              <w:instrText xml:space="preserve"> PAGEREF _Toc242787943 \h </w:instrText>
             </w:r>
             <w:r>
               <w:rPr>
@@ -3896,7 +3962,7 @@
               <w:rPr>
                 <w:noProof/>
               </w:rPr>
-              <w:t>42</w:t>
+              <w:t>44</w:t>
             </w:r>
             <w:r>
               <w:rPr>
@@ -3921,7 +3987,7 @@
               <w14:ligatures w14:val="standardContextual"/>
             </w:rPr>
           </w:pPr>
-          <w:hyperlink w:anchor="_Toc242787411" w:history="1">
+          <w:hyperlink w:anchor="_Toc242787944" w:history="1">
             <w:r>
               <w:rPr>
                 <w:rStyle w:val="Hyperlink"/>
@@ -3945,7 +4011,7 @@
               <w:rPr>
                 <w:noProof/>
               </w:rPr>
-              <w:instrText xml:space="preserve"> PAGEREF _Toc242787411 \h </w:instrText>
+              <w:instrText xml:space="preserve"> PAGEREF _Toc242787944 \h </w:instrText>
             </w:r>
             <w:r>
               <w:rPr>
@@ -3962,7 +4028,7 @@
               <w:rPr>
                 <w:noProof/>
               </w:rPr>
-              <w:t>42</w:t>
+              <w:t>44</w:t>
             </w:r>
             <w:r>
               <w:rPr>
@@ -3987,7 +4053,7 @@
               <w14:ligatures w14:val="standardContextual"/>
             </w:rPr>
           </w:pPr>
-          <w:hyperlink w:anchor="_Toc242787412" w:history="1">
+          <w:hyperlink w:anchor="_Toc242787945" w:history="1">
             <w:r>
               <w:rPr>
                 <w:rStyle w:val="Hyperlink"/>
@@ -4011,7 +4077,7 @@
               <w:rPr>
                 <w:noProof/>
               </w:rPr>
-              <w:instrText xml:space="preserve"> PAGEREF _Toc242787412 \h </w:instrText>
+              <w:instrText xml:space="preserve"> PAGEREF _Toc242787945 \h </w:instrText>
             </w:r>
             <w:r>
               <w:rPr>
@@ -4028,7 +4094,7 @@
               <w:rPr>
                 <w:noProof/>
               </w:rPr>
-              <w:t>42</w:t>
+              <w:t>44</w:t>
             </w:r>
             <w:r>
               <w:rPr>
@@ -4053,7 +4119,7 @@
               <w14:ligatures w14:val="standardContextual"/>
             </w:rPr>
           </w:pPr>
-          <w:hyperlink w:anchor="_Toc242787413" w:history="1">
+          <w:hyperlink w:anchor="_Toc242787946" w:history="1">
             <w:r>
               <w:rPr>
                 <w:rStyle w:val="Hyperlink"/>
@@ -4077,7 +4143,7 @@
               <w:rPr>
                 <w:noProof/>
               </w:rPr>
-              <w:instrText xml:space="preserve"> PAGEREF _Toc242787413 \h </w:instrText>
+              <w:instrText xml:space="preserve"> PAGEREF _Toc242787946 \h </w:instrText>
             </w:r>
             <w:r>
               <w:rPr>
@@ -4094,7 +4160,7 @@
               <w:rPr>
                 <w:noProof/>
               </w:rPr>
-              <w:t>44</w:t>
+              <w:t>46</w:t>
             </w:r>
             <w:r>
               <w:rPr>
@@ -4119,7 +4185,7 @@
               <w14:ligatures w14:val="standardContextual"/>
             </w:rPr>
           </w:pPr>
-          <w:hyperlink w:anchor="_Toc242787414" w:history="1">
+          <w:hyperlink w:anchor="_Toc242787947" w:history="1">
             <w:r>
               <w:rPr>
                 <w:rStyle w:val="Hyperlink"/>
@@ -4143,7 +4209,7 @@
               <w:rPr>
                 <w:noProof/>
               </w:rPr>
-              <w:instrText xml:space="preserve"> PAGEREF _Toc242787414 \h </w:instrText>
+              <w:instrText xml:space="preserve"> PAGEREF _Toc242787947 \h </w:instrText>
             </w:r>
             <w:r>
               <w:rPr>
@@ -4160,7 +4226,7 @@
               <w:rPr>
                 <w:noProof/>
               </w:rPr>
-              <w:t>44</w:t>
+              <w:t>46</w:t>
             </w:r>
             <w:r>
               <w:rPr>
@@ -4185,7 +4251,7 @@
               <w14:ligatures w14:val="standardContextual"/>
             </w:rPr>
           </w:pPr>
-          <w:hyperlink w:anchor="_Toc242787415" w:history="1">
+          <w:hyperlink w:anchor="_Toc242787948" w:history="1">
             <w:r>
               <w:rPr>
                 <w:rStyle w:val="Hyperlink"/>
@@ -4209,7 +4275,7 @@
               <w:rPr>
                 <w:noProof/>
               </w:rPr>
-              <w:instrText xml:space="preserve"> PAGEREF _Toc242787415 \h </w:instrText>
+              <w:instrText xml:space="preserve"> PAGEREF _Toc242787948 \h </w:instrText>
             </w:r>
             <w:r>
               <w:rPr>
@@ -4226,7 +4292,7 @@
               <w:rPr>
                 <w:noProof/>
               </w:rPr>
-              <w:t>44</w:t>
+              <w:t>46</w:t>
             </w:r>
             <w:r>
               <w:rPr>
@@ -4251,7 +4317,7 @@
               <w14:ligatures w14:val="standardContextual"/>
             </w:rPr>
           </w:pPr>
-          <w:hyperlink w:anchor="_Toc242787416" w:history="1">
+          <w:hyperlink w:anchor="_Toc242787949" w:history="1">
             <w:r>
               <w:rPr>
                 <w:rStyle w:val="Hyperlink"/>
@@ -4275,7 +4341,7 @@
               <w:rPr>
                 <w:noProof/>
               </w:rPr>
-              <w:instrText xml:space="preserve"> PAGEREF _Toc242787416 \h </w:instrText>
+              <w:instrText xml:space="preserve"> PAGEREF _Toc242787949 \h </w:instrText>
             </w:r>
             <w:r>
               <w:rPr>
@@ -4292,7 +4358,7 @@
               <w:rPr>
                 <w:noProof/>
               </w:rPr>
-              <w:t>44</w:t>
+              <w:t>46</w:t>
             </w:r>
             <w:r>
               <w:rPr>
@@ -4317,7 +4383,7 @@
               <w14:ligatures w14:val="standardContextual"/>
             </w:rPr>
           </w:pPr>
-          <w:hyperlink w:anchor="_Toc242787417" w:history="1">
+          <w:hyperlink w:anchor="_Toc242787950" w:history="1">
             <w:r>
               <w:rPr>
                 <w:rStyle w:val="Hyperlink"/>
@@ -4341,7 +4407,7 @@
               <w:rPr>
                 <w:noProof/>
               </w:rPr>
-              <w:instrText xml:space="preserve"> PAGEREF _Toc242787417 \h </w:instrText>
+              <w:instrText xml:space="preserve"> PAGEREF _Toc242787950 \h </w:instrText>
             </w:r>
             <w:r>
               <w:rPr>
@@ -4358,7 +4424,7 @@
               <w:rPr>
                 <w:noProof/>
               </w:rPr>
-              <w:t>45</w:t>
+              <w:t>47</w:t>
             </w:r>
             <w:r>
               <w:rPr>
@@ -4383,7 +4449,7 @@
               <w14:ligatures w14:val="standardContextual"/>
             </w:rPr>
           </w:pPr>
-          <w:hyperlink w:anchor="_Toc242787418" w:history="1">
+          <w:hyperlink w:anchor="_Toc242787951" w:history="1">
             <w:r>
               <w:rPr>
                 <w:rStyle w:val="Hyperlink"/>
@@ -4407,7 +4473,7 @@
               <w:rPr>
                 <w:noProof/>
               </w:rPr>
-              <w:instrText xml:space="preserve"> PAGEREF _Toc242787418 \h </w:instrText>
+              <w:instrText xml:space="preserve"> PAGEREF _Toc242787951 \h </w:instrText>
             </w:r>
             <w:r>
               <w:rPr>
@@ -4424,7 +4490,7 @@
               <w:rPr>
                 <w:noProof/>
               </w:rPr>
-              <w:t>46</w:t>
+              <w:t>48</w:t>
             </w:r>
             <w:r>
               <w:rPr>
@@ -4458,7 +4524,7 @@
         <w:pStyle w:val="Heading1"/>
         <w:pageBreakBefore/>
       </w:pPr>
-      <w:bookmarkStart w:id="0" w:name="_Toc242787354"/>
+      <w:bookmarkStart w:id="0" w:name="_Toc242787886"/>
       <w:r>
         <w:lastRenderedPageBreak/>
         <w:t>1. Resumen ejecutivo</w:t>
@@ -4470,7 +4536,7 @@
         <w:spacing w:after="120"/>
       </w:pPr>
       <w:r>
-        <w:t>Este proyecto es un conjunto de herramientas para transmisiones en vivo de TikTok, inspirado en TikFinity. Permite poner en pantalla, mediante OBS Studio o TikTok LIVE Studio, elementos que reaccionan a lo que hace el público durante el LIVE: una ruleta que gira cuando alguien envía un regalo (con una segunda ruleta premium), barras de meta que se llenan con likes, seguidores, compartidos o monedas, alertas animadas, una carrera de regalos entre integrantes con reloj por rondas , una batalla de regalos (tira y afloja) entre dos equipos y un jefe del LIVE, un reto cooperativo en el que el chat le quita vida a un jefe antes de que se acabe el tiempo. Además incluye un panel para ver la actividad del LIVE en tiempo real y un catálogo de regalos con su código (ID).</w:t>
+        <w:t>Este proyecto es un conjunto de herramientas para transmisiones en vivo de TikTok, inspirado en TikFinity. Permite poner en pantalla, mediante OBS Studio o TikTok LIVE Studio, elementos que reaccionan a lo que hace el público durante el LIVE: una ruleta que gira cuando alguien envía un regalo (con una segunda ruleta premium), barras de meta que se llenan con likes, seguidores, compartidos o monedas, alertas animadas, una carrera de regalos entre integrantes con reloj por rondas , una batalla de regalos (tira y afloja) entre dos equipos, un jefe del LIVE (un reto cooperativo en el que el chat le quita vida a un jefe antes de que se acabe el tiempo) y un reloj de subathon al que el público le suma tiempo. Además incluye un panel para ver la actividad del LIVE en tiempo real y un catálogo de regalos con su código (ID).</w:t>
       </w:r>
     </w:p>
     <w:p>
@@ -4512,7 +4578,7 @@
         <w:pStyle w:val="Heading1"/>
         <w:pageBreakBefore/>
       </w:pPr>
-      <w:bookmarkStart w:id="1" w:name="_Toc242787355"/>
+      <w:bookmarkStart w:id="1" w:name="_Toc242787887"/>
       <w:r>
         <w:lastRenderedPageBreak/>
         <w:t>2. Conceptos y glosario</w:t>
@@ -4710,7 +4776,7 @@
               <w:spacing w:after="20"/>
             </w:pPr>
             <w:r>
-              <w:t>Una página web pequeña (por ejemplo ruleta.html) con fondo transparente que se pone encima de la cámara en OBS. En el proyecto hay seis: ruleta (normal y premium), meta, alertas, carrera de regalos, batalla de regalos y jefe del LIVE.</w:t>
+              <w:t>Una página web pequeña (por ejemplo ruleta.html) con fondo transparente que se pone encima de la cámara en OBS. En el proyecto hay siete: ruleta (normal y premium), meta, alertas, carrera de regalos, batalla de regalos, jefe del LIVE y subathon.</w:t>
             </w:r>
           </w:p>
         </w:tc>
@@ -5310,6 +5376,58 @@
             </w:pPr>
             <w:r>
               <w:lastRenderedPageBreak/>
+              <w:t>Subathon</w:t>
+            </w:r>
+          </w:p>
+        </w:tc>
+        <w:tc>
+          <w:tcPr>
+            <w:tcW w:w="7301" w:type="dxa"/>
+            <w:tcBorders>
+              <w:top w:val="single" w:sz="4" w:space="0" w:color="BFBFBF"/>
+              <w:left w:val="single" w:sz="4" w:space="0" w:color="BFBFBF"/>
+              <w:bottom w:val="single" w:sz="4" w:space="0" w:color="BFBFBF"/>
+              <w:right w:val="single" w:sz="4" w:space="0" w:color="BFBFBF"/>
+            </w:tcBorders>
+            <w:tcMar>
+              <w:top w:w="60" w:type="dxa"/>
+              <w:left w:w="100" w:type="dxa"/>
+              <w:bottom w:w="60" w:type="dxa"/>
+              <w:right w:w="100" w:type="dxa"/>
+            </w:tcMar>
+          </w:tcPr>
+          <w:p>
+            <w:pPr>
+              <w:spacing w:after="20"/>
+            </w:pPr>
+            <w:r>
+              <w:t>Transmisión que dura mientras el público le siga sumando tiempo a un reloj con likes y regalos. Aquí, un widget con ese reloj y un tope máximo.</w:t>
+            </w:r>
+          </w:p>
+        </w:tc>
+      </w:tr>
+      <w:tr>
+        <w:tc>
+          <w:tcPr>
+            <w:tcW w:w="2059" w:type="dxa"/>
+            <w:tcBorders>
+              <w:top w:val="single" w:sz="4" w:space="0" w:color="BFBFBF"/>
+              <w:left w:val="single" w:sz="4" w:space="0" w:color="BFBFBF"/>
+              <w:bottom w:val="single" w:sz="4" w:space="0" w:color="BFBFBF"/>
+              <w:right w:val="single" w:sz="4" w:space="0" w:color="BFBFBF"/>
+            </w:tcBorders>
+            <w:tcMar>
+              <w:top w:w="60" w:type="dxa"/>
+              <w:left w:w="100" w:type="dxa"/>
+              <w:bottom w:w="60" w:type="dxa"/>
+              <w:right w:w="100" w:type="dxa"/>
+            </w:tcMar>
+          </w:tcPr>
+          <w:p>
+            <w:pPr>
+              <w:spacing w:after="20"/>
+            </w:pPr>
+            <w:r>
               <w:t>Diamantes / monedas</w:t>
             </w:r>
           </w:p>
@@ -5895,7 +6013,7 @@
         <w:pStyle w:val="Heading1"/>
         <w:pageBreakBefore/>
       </w:pPr>
-      <w:bookmarkStart w:id="2" w:name="_Toc242787356"/>
+      <w:bookmarkStart w:id="2" w:name="_Toc242787888"/>
       <w:r>
         <w:lastRenderedPageBreak/>
         <w:t>3. Arquitectura general</w:t>
@@ -5906,7 +6024,7 @@
       <w:pPr>
         <w:pStyle w:val="Heading2"/>
       </w:pPr>
-      <w:bookmarkStart w:id="3" w:name="_Toc242787357"/>
+      <w:bookmarkStart w:id="3" w:name="_Toc242787889"/>
       <w:r>
         <w:t>3.1 Piezas del sistema</w:t>
       </w:r>
@@ -6467,7 +6585,7 @@
               <w:spacing w:after="20"/>
             </w:pPr>
             <w:r>
-              <w:t>Widgets (ruleta.html, meta.html, alertas.html, carrera.html, batalla.html, jefe.html)</w:t>
+              <w:t>Widgets (ruleta.html, meta.html, alertas.html, carrera.html, batalla.html, jefe.html, subathon.html)</w:t>
             </w:r>
           </w:p>
         </w:tc>
@@ -6532,7 +6650,7 @@
       <w:pPr>
         <w:pStyle w:val="Heading2"/>
       </w:pPr>
-      <w:bookmarkStart w:id="4" w:name="_Toc242787358"/>
+      <w:bookmarkStart w:id="4" w:name="_Toc242787890"/>
       <w:r>
         <w:t>3.2 Flujo de datos</w:t>
       </w:r>
@@ -6785,7 +6903,7 @@
         <w:spacing w:after="60"/>
       </w:pPr>
       <w:r>
-        <w:t>El widget convierte cada evento a un formato simple (evento normalizado) y reacciona: gira la ruleta, llena la barra, muestra una alerta, suma puntos a un integrante de la carrera, empuja la barra de la batalla o le quita vida al jefe.</w:t>
+        <w:t>El widget convierte cada evento a un formato simple (evento normalizado) y reacciona: gira la ruleta, llena la barra, muestra una alerta, suma puntos a un integrante de la carrera, empuja la barra de la batalla, le quita vida al jefe o le suma tiempo al subathon.</w:t>
       </w:r>
     </w:p>
     <w:p>
@@ -6827,7 +6945,7 @@
         <w:pStyle w:val="Heading1"/>
         <w:pageBreakBefore/>
       </w:pPr>
-      <w:bookmarkStart w:id="5" w:name="_Toc242787359"/>
+      <w:bookmarkStart w:id="5" w:name="_Toc242787891"/>
       <w:r>
         <w:lastRenderedPageBreak/>
         <w:t>4. Servicios externos</w:t>
@@ -6838,7 +6956,7 @@
       <w:pPr>
         <w:pStyle w:val="Heading2"/>
       </w:pPr>
-      <w:bookmarkStart w:id="6" w:name="_Toc242787360"/>
+      <w:bookmarkStart w:id="6" w:name="_Toc242787892"/>
       <w:r>
         <w:t>4.1 TikTok LIVE</w:t>
       </w:r>
@@ -7597,7 +7715,7 @@
       <w:pPr>
         <w:pStyle w:val="Heading2"/>
       </w:pPr>
-      <w:bookmarkStart w:id="7" w:name="_Toc242787361"/>
+      <w:bookmarkStart w:id="7" w:name="_Toc242787893"/>
       <w:r>
         <w:t>4.2 Euler Stream</w:t>
       </w:r>
@@ -8889,7 +9007,7 @@
       <w:pPr>
         <w:pStyle w:val="Heading2"/>
       </w:pPr>
-      <w:bookmarkStart w:id="8" w:name="_Toc242787362"/>
+      <w:bookmarkStart w:id="8" w:name="_Toc242787894"/>
       <w:r>
         <w:t>4.3 GitHub, GitHub Actions y GitHub Pages</w:t>
       </w:r>
@@ -9093,7 +9211,7 @@
       <w:pPr>
         <w:pStyle w:val="Heading2"/>
       </w:pPr>
-      <w:bookmarkStart w:id="9" w:name="_Toc242787363"/>
+      <w:bookmarkStart w:id="9" w:name="_Toc242787895"/>
       <w:r>
         <w:t>4.4 Google Fonts</w:t>
       </w:r>
@@ -9123,7 +9241,7 @@
       <w:pPr>
         <w:pStyle w:val="Heading2"/>
       </w:pPr>
-      <w:bookmarkStart w:id="10" w:name="_Toc242787364"/>
+      <w:bookmarkStart w:id="10" w:name="_Toc242787896"/>
       <w:r>
         <w:lastRenderedPageBreak/>
         <w:t>4.5 Supabase (cambios en vivo)</w:t>
@@ -9379,7 +9497,7 @@
         <w:pStyle w:val="Heading1"/>
         <w:pageBreakBefore/>
       </w:pPr>
-      <w:bookmarkStart w:id="11" w:name="_Toc242787365"/>
+      <w:bookmarkStart w:id="11" w:name="_Toc242787897"/>
       <w:r>
         <w:lastRenderedPageBreak/>
         <w:t>5. Estructura de archivos</w:t>
@@ -9523,6 +9641,17 @@
         <w:ind w:left="200" w:right="200"/>
       </w:pPr>
       <w:r>
+        <w:t>│   ├── subathon.html               widget subathon (reloj que suma tiempo)</w:t>
+      </w:r>
+    </w:p>
+    <w:p>
+      <w:pPr>
+        <w:keepLines/>
+        <w:shd w:val="clear" w:color="auto" w:fill="F2F2F2"/>
+        <w:spacing w:line="260" w:lineRule="auto"/>
+        <w:ind w:left="200" w:right="200"/>
+      </w:pPr>
+      <w:r>
         <w:rPr>
           <w:rFonts w:ascii="Consolas" w:eastAsia="Consolas" w:hAnsi="Consolas" w:cs="Consolas"/>
           <w:sz w:val="18"/>
@@ -9587,7 +9716,7 @@
           <w:sz w:val="18"/>
           <w:szCs w:val="18"/>
         </w:rPr>
-        <w:t>│   │   └── widgets/ruleta.css · meta.css · alertas.css · carrera.css · batalla.css · jefe.css</w:t>
+        <w:t>│   │   └── widgets/ruleta.css · meta.css · alertas.css · carrera.css · batalla.css · jefe.css · subathon.css</w:t>
       </w:r>
     </w:p>
     <w:p>
@@ -9678,7 +9807,7 @@
           <w:sz w:val="18"/>
           <w:szCs w:val="18"/>
         </w:rPr>
-        <w:t>│       ├── widgets/ruleta.js · meta.js · alertas.js · carrera.js · batalla.js · jefe.js</w:t>
+        <w:t>│       ├── widgets/ruleta.js · meta.js · alertas.js · carrera.js · batalla.js · jefe.js · subathon.js</w:t>
       </w:r>
     </w:p>
     <w:p>
@@ -9817,7 +9946,7 @@
           <w:sz w:val="18"/>
           <w:szCs w:val="18"/>
         </w:rPr>
-        <w:t>│           └── vistas/ruleta.js · metas.js · alertas.js · carrera.js · batalla.js · jefe.js · actividad.js · regalos.js · conexion.js</w:t>
+        <w:t>│           └── vistas/ruleta.js · metas.js · alertas.js · carrera.js · batalla.js · jefe.js · subathon.js · actividad.js · regalos.js · conexion.js</w:t>
       </w:r>
     </w:p>
     <w:p>
@@ -9971,7 +10100,7 @@
         <w:pStyle w:val="Heading1"/>
         <w:pageBreakBefore/>
       </w:pPr>
-      <w:bookmarkStart w:id="12" w:name="_Toc242787366"/>
+      <w:bookmarkStart w:id="12" w:name="_Toc242787898"/>
       <w:r>
         <w:lastRenderedPageBreak/>
         <w:t>6. Frontend: el módulo compartido comun.js</w:t>
@@ -9999,7 +10128,7 @@
       <w:pPr>
         <w:pStyle w:val="Heading2"/>
       </w:pPr>
-      <w:bookmarkStart w:id="13" w:name="_Toc242787367"/>
+      <w:bookmarkStart w:id="13" w:name="_Toc242787899"/>
       <w:r>
         <w:t>6.1 Configuración en la URL</w:t>
       </w:r>
@@ -10470,7 +10599,7 @@
       <w:pPr>
         <w:pStyle w:val="Heading2"/>
       </w:pPr>
-      <w:bookmarkStart w:id="14" w:name="_Toc242787368"/>
+      <w:bookmarkStart w:id="14" w:name="_Toc242787900"/>
       <w:r>
         <w:t>6.2 Eventos normalizados</w:t>
       </w:r>
@@ -11256,7 +11385,7 @@
       <w:pPr>
         <w:pStyle w:val="Heading2"/>
       </w:pPr>
-      <w:bookmarkStart w:id="15" w:name="_Toc242787369"/>
+      <w:bookmarkStart w:id="15" w:name="_Toc242787901"/>
       <w:r>
         <w:t>6.3 Rastreador de regalos (combos y regalos sueltos)</w:t>
       </w:r>
@@ -11986,7 +12115,7 @@
       <w:pPr>
         <w:pStyle w:val="Heading2"/>
       </w:pPr>
-      <w:bookmarkStart w:id="16" w:name="_Toc242787370"/>
+      <w:bookmarkStart w:id="16" w:name="_Toc242787902"/>
       <w:r>
         <w:t>6.4 Conexión con TikTok (conectarTikTok)</w:t>
       </w:r>
@@ -12107,7 +12236,7 @@
       <w:pPr>
         <w:pStyle w:val="Heading2"/>
       </w:pPr>
-      <w:bookmarkStart w:id="17" w:name="_Toc242787371"/>
+      <w:bookmarkStart w:id="17" w:name="_Toc242787903"/>
       <w:r>
         <w:t>6.5 Arranque de widgets (iniciarWidget)</w:t>
       </w:r>
@@ -12333,7 +12462,7 @@
       <w:pPr>
         <w:pStyle w:val="Heading2"/>
       </w:pPr>
-      <w:bookmarkStart w:id="18" w:name="_Toc242787372"/>
+      <w:bookmarkStart w:id="18" w:name="_Toc242787904"/>
       <w:r>
         <w:t>6.6 Utilidades</w:t>
       </w:r>
@@ -12399,7 +12528,7 @@
       <w:pPr>
         <w:pStyle w:val="Heading2"/>
       </w:pPr>
-      <w:bookmarkStart w:id="19" w:name="_Toc242787373"/>
+      <w:bookmarkStart w:id="19" w:name="_Toc242787905"/>
       <w:r>
         <w:lastRenderedPageBreak/>
         <w:t>6.7 Cambios en vivo (nube.js)</w:t>
@@ -12479,7 +12608,7 @@
         <w:pStyle w:val="Heading1"/>
         <w:pageBreakBefore/>
       </w:pPr>
-      <w:bookmarkStart w:id="20" w:name="_Toc242787374"/>
+      <w:bookmarkStart w:id="20" w:name="_Toc242787906"/>
       <w:r>
         <w:lastRenderedPageBreak/>
         <w:t>7. Frontend: los widgets</w:t>
@@ -12522,7 +12651,7 @@
       <w:pPr>
         <w:pStyle w:val="Heading2"/>
       </w:pPr>
-      <w:bookmarkStart w:id="21" w:name="_Toc242787375"/>
+      <w:bookmarkStart w:id="21" w:name="_Toc242787907"/>
       <w:r>
         <w:t>7.1 Ruleta de regalos (ruleta.html)</w:t>
       </w:r>
@@ -13617,7 +13746,7 @@
       <w:pPr>
         <w:pStyle w:val="Heading2"/>
       </w:pPr>
-      <w:bookmarkStart w:id="22" w:name="_Toc242787376"/>
+      <w:bookmarkStart w:id="22" w:name="_Toc242787908"/>
       <w:r>
         <w:t>7.2 Meta (meta.html)</w:t>
       </w:r>
@@ -14227,7 +14356,7 @@
       <w:pPr>
         <w:pStyle w:val="Heading2"/>
       </w:pPr>
-      <w:bookmarkStart w:id="23" w:name="_Toc242787377"/>
+      <w:bookmarkStart w:id="23" w:name="_Toc242787909"/>
       <w:r>
         <w:t>7.3 Alertas (alertas.html)</w:t>
       </w:r>
@@ -14594,7 +14723,7 @@
       <w:pPr>
         <w:pStyle w:val="Heading2"/>
       </w:pPr>
-      <w:bookmarkStart w:id="24" w:name="_Toc242787378"/>
+      <w:bookmarkStart w:id="24" w:name="_Toc242787910"/>
       <w:r>
         <w:t>7.4 Carrera de regalos (carrera.html)</w:t>
       </w:r>
@@ -15960,7 +16089,7 @@
       <w:pPr>
         <w:pStyle w:val="Heading2"/>
       </w:pPr>
-      <w:bookmarkStart w:id="25" w:name="_Toc242787379"/>
+      <w:bookmarkStart w:id="25" w:name="_Toc242787911"/>
       <w:r>
         <w:t>7.5 Batalla de regalos (batalla.html)</w:t>
       </w:r>
@@ -16616,7 +16745,7 @@
       <w:pPr>
         <w:pStyle w:val="Heading2"/>
       </w:pPr>
-      <w:bookmarkStart w:id="26" w:name="_Toc242787380"/>
+      <w:bookmarkStart w:id="26" w:name="_Toc242787912"/>
       <w:r>
         <w:t>7.6 Jefe del LIVE (jefe.html)</w:t>
       </w:r>
@@ -17750,25 +17879,1185 @@
     </w:p>
     <w:p>
       <w:pPr>
+        <w:pStyle w:val="Heading2"/>
+      </w:pPr>
+      <w:bookmarkStart w:id="27" w:name="_Toc242787913"/>
+      <w:r>
+        <w:lastRenderedPageBreak/>
+        <w:t>7.7 Subathon (subathon.html)</w:t>
+      </w:r>
+      <w:bookmarkEnd w:id="27"/>
+    </w:p>
+    <w:p>
+      <w:pPr>
+        <w:spacing w:after="120"/>
+      </w:pPr>
+      <w:r>
+        <w:t>Un reloj que cuenta hacia atrás y al que el público le suma tiempo con likes y regalos, sin pasar de un tope. Cuando llega a 0, se acaba. Va en una píldora de cristal que flota en el centro de la fuente (900 × 300 recomendado).</w:t>
+      </w:r>
+    </w:p>
+    <w:p>
+      <w:pPr>
+        <w:pStyle w:val="Heading3"/>
+      </w:pPr>
+      <w:r>
+        <w:t>Estructura</w:t>
+      </w:r>
+    </w:p>
+    <w:p>
+      <w:pPr>
+        <w:spacing w:after="120"/>
+      </w:pPr>
+      <w:r>
+        <w:t>La píldora (</w:t>
+      </w:r>
+      <w:r>
+        <w:rPr>
+          <w:rFonts w:ascii="Consolas" w:eastAsia="Consolas" w:hAnsi="Consolas" w:cs="Consolas"/>
+          <w:color w:val="7A1F33"/>
+          <w:sz w:val="19"/>
+          <w:szCs w:val="19"/>
+        </w:rPr>
+        <w:t>#subathon</w:t>
+      </w:r>
+      <w:r>
+        <w:t xml:space="preserve">, clase </w:t>
+      </w:r>
+      <w:r>
+        <w:rPr>
+          <w:rFonts w:ascii="Consolas" w:eastAsia="Consolas" w:hAnsi="Consolas" w:cs="Consolas"/>
+          <w:color w:val="7A1F33"/>
+          <w:sz w:val="19"/>
+          <w:szCs w:val="19"/>
+        </w:rPr>
+        <w:t>.cristal</w:t>
+      </w:r>
+      <w:r>
+        <w:t>, esquinas totalmente redondeadas) tiene el título, el reloj grande (</w:t>
+      </w:r>
+      <w:r>
+        <w:rPr>
+          <w:rFonts w:ascii="Consolas" w:eastAsia="Consolas" w:hAnsi="Consolas" w:cs="Consolas"/>
+          <w:color w:val="7A1F33"/>
+          <w:sz w:val="19"/>
+          <w:szCs w:val="19"/>
+        </w:rPr>
+        <w:t>#tiempo</w:t>
+      </w:r>
+      <w:r>
+        <w:t xml:space="preserve">, siempre con horas, “01:05:09”, con cifras de ancho fijo para que no “baile”) y el estado (“En pausa”, “Tope alcanzado”, “Terminó”). La fase va en </w:t>
+      </w:r>
+      <w:r>
+        <w:rPr>
+          <w:rFonts w:ascii="Consolas" w:eastAsia="Consolas" w:hAnsi="Consolas" w:cs="Consolas"/>
+          <w:color w:val="7A1F33"/>
+          <w:sz w:val="19"/>
+          <w:szCs w:val="19"/>
+        </w:rPr>
+        <w:t>data-fase</w:t>
+      </w:r>
+      <w:r>
+        <w:t xml:space="preserve">: listo, corre, pausa o fin. </w:t>
+      </w:r>
+      <w:r>
+        <w:rPr>
+          <w:rFonts w:ascii="Consolas" w:eastAsia="Consolas" w:hAnsi="Consolas" w:cs="Consolas"/>
+          <w:color w:val="7A1F33"/>
+          <w:sz w:val="19"/>
+          <w:szCs w:val="19"/>
+        </w:rPr>
+        <w:t>#sumas</w:t>
+      </w:r>
+      <w:r>
+        <w:t xml:space="preserve"> recibe los “+1:30” flotantes.</w:t>
+      </w:r>
+    </w:p>
+    <w:p>
+      <w:pPr>
+        <w:pStyle w:val="Heading3"/>
+      </w:pPr>
+      <w:r>
+        <w:t>Quién lleva qué</w:t>
+      </w:r>
+    </w:p>
+    <w:p>
+      <w:pPr>
+        <w:spacing w:after="120"/>
+      </w:pPr>
+      <w:r>
+        <w:t>El panel no recibe los likes ni los regalos (eso lo hace el widget en OBS), así que el tiempo se reparte en dos:</w:t>
+      </w:r>
+    </w:p>
+    <w:p>
+      <w:pPr>
+        <w:pStyle w:val="ListParagraph"/>
+        <w:numPr>
+          <w:ilvl w:val="0"/>
+          <w:numId w:val="3"/>
+        </w:numPr>
+        <w:spacing w:after="60"/>
+      </w:pPr>
+      <w:r>
+        <w:t xml:space="preserve">El panel lleva el reloj base </w:t>
+      </w:r>
+      <w:r>
+        <w:rPr>
+          <w:rFonts w:ascii="Consolas" w:eastAsia="Consolas" w:hAnsi="Consolas" w:cs="Consolas"/>
+          <w:color w:val="7A1F33"/>
+          <w:sz w:val="19"/>
+          <w:szCs w:val="19"/>
+        </w:rPr>
+        <w:t>t</w:t>
+      </w:r>
+      <w:r>
+        <w:t xml:space="preserve"> (hora de término si corre, lo que quedaba si está en pausa, como en </w:t>
+      </w:r>
+      <w:r>
+        <w:rPr>
+          <w:rFonts w:ascii="Consolas" w:eastAsia="Consolas" w:hAnsi="Consolas" w:cs="Consolas"/>
+          <w:color w:val="7A1F33"/>
+          <w:sz w:val="19"/>
+          <w:szCs w:val="19"/>
+        </w:rPr>
+        <w:t>js/reloj.js</w:t>
+      </w:r>
+      <w:r>
+        <w:t xml:space="preserve">) y </w:t>
+      </w:r>
+      <w:r>
+        <w:rPr>
+          <w:rFonts w:ascii="Consolas" w:eastAsia="Consolas" w:hAnsi="Consolas" w:cs="Consolas"/>
+          <w:color w:val="7A1F33"/>
+          <w:sz w:val="19"/>
+          <w:szCs w:val="19"/>
+        </w:rPr>
+        <w:t>ex</w:t>
+      </w:r>
+      <w:r>
+        <w:t>, el total en milisegundos que agregó con “+5 min” en la ronda.</w:t>
+      </w:r>
+    </w:p>
+    <w:p>
+      <w:pPr>
+        <w:pStyle w:val="ListParagraph"/>
+        <w:numPr>
+          <w:ilvl w:val="0"/>
+          <w:numId w:val="3"/>
+        </w:numPr>
+        <w:spacing w:after="60"/>
+      </w:pPr>
+      <w:r>
+        <w:t xml:space="preserve">El widget lleva lo que suma el público y aplica cada “+5 min” nuevo: la diferencia entre </w:t>
+      </w:r>
+      <w:r>
+        <w:rPr>
+          <w:rFonts w:ascii="Consolas" w:eastAsia="Consolas" w:hAnsi="Consolas" w:cs="Consolas"/>
+          <w:color w:val="7A1F33"/>
+          <w:sz w:val="19"/>
+          <w:szCs w:val="19"/>
+        </w:rPr>
+        <w:t>ex</w:t>
+      </w:r>
+      <w:r>
+        <w:t xml:space="preserve"> y lo que ya había visto. Así un “+5 min” se aplica una sola vez aunque la configuración llegue varias veces.</w:t>
+      </w:r>
+    </w:p>
+    <w:p>
+      <w:pPr>
+        <w:pStyle w:val="ListParagraph"/>
+        <w:numPr>
+          <w:ilvl w:val="0"/>
+          <w:numId w:val="3"/>
+        </w:numPr>
+        <w:spacing w:after="60"/>
+      </w:pPr>
+      <w:r>
+        <w:t xml:space="preserve">Tiempo que queda = reloj base + lo sumado. El reloj base puede quedar negativo (lo sostiene lo sumado), por eso el subathon no usa </w:t>
+      </w:r>
+      <w:r>
+        <w:rPr>
+          <w:rFonts w:ascii="Consolas" w:eastAsia="Consolas" w:hAnsi="Consolas" w:cs="Consolas"/>
+          <w:color w:val="7A1F33"/>
+          <w:sz w:val="19"/>
+          <w:szCs w:val="19"/>
+        </w:rPr>
+        <w:t>leerReloj</w:t>
+      </w:r>
+      <w:r>
+        <w:t xml:space="preserve"> (que lo daría por terminado) y pausa o reanuda con sus propias funciones.</w:t>
+      </w:r>
+    </w:p>
+    <w:p>
+      <w:pPr>
+        <w:pStyle w:val="Heading3"/>
+      </w:pPr>
+      <w:r>
+        <w:t>Configuración</w:t>
+      </w:r>
+    </w:p>
+    <w:tbl>
+      <w:tblPr>
+        <w:tblW w:w="9360" w:type="dxa"/>
+        <w:tblBorders>
+          <w:top w:val="single" w:sz="4" w:space="0" w:color="auto"/>
+          <w:left w:val="single" w:sz="4" w:space="0" w:color="auto"/>
+          <w:bottom w:val="single" w:sz="4" w:space="0" w:color="auto"/>
+          <w:right w:val="single" w:sz="4" w:space="0" w:color="auto"/>
+          <w:insideH w:val="single" w:sz="4" w:space="0" w:color="auto"/>
+          <w:insideV w:val="single" w:sz="4" w:space="0" w:color="auto"/>
+        </w:tblBorders>
+        <w:tblLook w:val="04A0" w:firstRow="1" w:lastRow="0" w:firstColumn="1" w:lastColumn="0" w:noHBand="0" w:noVBand="1"/>
+      </w:tblPr>
+      <w:tblGrid>
+        <w:gridCol w:w="1497"/>
+        <w:gridCol w:w="7863"/>
+      </w:tblGrid>
+      <w:tr>
+        <w:trPr>
+          <w:tblHeader/>
+        </w:trPr>
+        <w:tc>
+          <w:tcPr>
+            <w:tcW w:w="1497" w:type="dxa"/>
+            <w:tcBorders>
+              <w:top w:val="single" w:sz="4" w:space="0" w:color="BFBFBF"/>
+              <w:left w:val="single" w:sz="4" w:space="0" w:color="BFBFBF"/>
+              <w:bottom w:val="single" w:sz="4" w:space="0" w:color="BFBFBF"/>
+              <w:right w:val="single" w:sz="4" w:space="0" w:color="BFBFBF"/>
+            </w:tcBorders>
+            <w:shd w:val="clear" w:color="auto" w:fill="1F4E79"/>
+            <w:tcMar>
+              <w:top w:w="60" w:type="dxa"/>
+              <w:left w:w="100" w:type="dxa"/>
+              <w:bottom w:w="60" w:type="dxa"/>
+              <w:right w:w="100" w:type="dxa"/>
+            </w:tcMar>
+          </w:tcPr>
+          <w:p>
+            <w:pPr>
+              <w:spacing w:after="20"/>
+            </w:pPr>
+            <w:r>
+              <w:rPr>
+                <w:b/>
+                <w:bCs/>
+                <w:color w:val="FFFFFF"/>
+              </w:rPr>
+              <w:t>Clave</w:t>
+            </w:r>
+          </w:p>
+        </w:tc>
+        <w:tc>
+          <w:tcPr>
+            <w:tcW w:w="7863" w:type="dxa"/>
+            <w:tcBorders>
+              <w:top w:val="single" w:sz="4" w:space="0" w:color="BFBFBF"/>
+              <w:left w:val="single" w:sz="4" w:space="0" w:color="BFBFBF"/>
+              <w:bottom w:val="single" w:sz="4" w:space="0" w:color="BFBFBF"/>
+              <w:right w:val="single" w:sz="4" w:space="0" w:color="BFBFBF"/>
+            </w:tcBorders>
+            <w:shd w:val="clear" w:color="auto" w:fill="1F4E79"/>
+            <w:tcMar>
+              <w:top w:w="60" w:type="dxa"/>
+              <w:left w:w="100" w:type="dxa"/>
+              <w:bottom w:w="60" w:type="dxa"/>
+              <w:right w:w="100" w:type="dxa"/>
+            </w:tcMar>
+          </w:tcPr>
+          <w:p>
+            <w:pPr>
+              <w:spacing w:after="20"/>
+            </w:pPr>
+            <w:r>
+              <w:rPr>
+                <w:b/>
+                <w:bCs/>
+                <w:color w:val="FFFFFF"/>
+              </w:rPr>
+              <w:t>Significado</w:t>
+            </w:r>
+          </w:p>
+        </w:tc>
+      </w:tr>
+      <w:tr>
+        <w:tc>
+          <w:tcPr>
+            <w:tcW w:w="1497" w:type="dxa"/>
+            <w:tcBorders>
+              <w:top w:val="single" w:sz="4" w:space="0" w:color="BFBFBF"/>
+              <w:left w:val="single" w:sz="4" w:space="0" w:color="BFBFBF"/>
+              <w:bottom w:val="single" w:sz="4" w:space="0" w:color="BFBFBF"/>
+              <w:right w:val="single" w:sz="4" w:space="0" w:color="BFBFBF"/>
+            </w:tcBorders>
+            <w:tcMar>
+              <w:top w:w="60" w:type="dxa"/>
+              <w:left w:w="100" w:type="dxa"/>
+              <w:bottom w:w="60" w:type="dxa"/>
+              <w:right w:w="100" w:type="dxa"/>
+            </w:tcMar>
+          </w:tcPr>
+          <w:p>
+            <w:pPr>
+              <w:spacing w:after="20"/>
+            </w:pPr>
+            <w:r>
+              <w:rPr>
+                <w:rFonts w:ascii="Consolas" w:eastAsia="Consolas" w:hAnsi="Consolas" w:cs="Consolas"/>
+                <w:color w:val="7A1F33"/>
+                <w:sz w:val="19"/>
+                <w:szCs w:val="19"/>
+              </w:rPr>
+              <w:t>u, k, w</w:t>
+            </w:r>
+          </w:p>
+        </w:tc>
+        <w:tc>
+          <w:tcPr>
+            <w:tcW w:w="7863" w:type="dxa"/>
+            <w:tcBorders>
+              <w:top w:val="single" w:sz="4" w:space="0" w:color="BFBFBF"/>
+              <w:left w:val="single" w:sz="4" w:space="0" w:color="BFBFBF"/>
+              <w:bottom w:val="single" w:sz="4" w:space="0" w:color="BFBFBF"/>
+              <w:right w:val="single" w:sz="4" w:space="0" w:color="BFBFBF"/>
+            </w:tcBorders>
+            <w:tcMar>
+              <w:top w:w="60" w:type="dxa"/>
+              <w:left w:w="100" w:type="dxa"/>
+              <w:bottom w:w="60" w:type="dxa"/>
+              <w:right w:w="100" w:type="dxa"/>
+            </w:tcMar>
+          </w:tcPr>
+          <w:p>
+            <w:pPr>
+              <w:spacing w:after="20"/>
+            </w:pPr>
+            <w:r>
+              <w:t>Usuario de TikTok, API key e identificador del widget (van siempre en la URL)</w:t>
+            </w:r>
+          </w:p>
+        </w:tc>
+      </w:tr>
+      <w:tr>
+        <w:tc>
+          <w:tcPr>
+            <w:tcW w:w="1497" w:type="dxa"/>
+            <w:tcBorders>
+              <w:top w:val="single" w:sz="4" w:space="0" w:color="BFBFBF"/>
+              <w:left w:val="single" w:sz="4" w:space="0" w:color="BFBFBF"/>
+              <w:bottom w:val="single" w:sz="4" w:space="0" w:color="BFBFBF"/>
+              <w:right w:val="single" w:sz="4" w:space="0" w:color="BFBFBF"/>
+            </w:tcBorders>
+            <w:tcMar>
+              <w:top w:w="60" w:type="dxa"/>
+              <w:left w:w="100" w:type="dxa"/>
+              <w:bottom w:w="60" w:type="dxa"/>
+              <w:right w:w="100" w:type="dxa"/>
+            </w:tcMar>
+          </w:tcPr>
+          <w:p>
+            <w:pPr>
+              <w:spacing w:after="20"/>
+            </w:pPr>
+            <w:r>
+              <w:rPr>
+                <w:rFonts w:ascii="Consolas" w:eastAsia="Consolas" w:hAnsi="Consolas" w:cs="Consolas"/>
+                <w:color w:val="7A1F33"/>
+                <w:sz w:val="19"/>
+                <w:szCs w:val="19"/>
+              </w:rPr>
+              <w:t>ti</w:t>
+            </w:r>
+          </w:p>
+        </w:tc>
+        <w:tc>
+          <w:tcPr>
+            <w:tcW w:w="7863" w:type="dxa"/>
+            <w:tcBorders>
+              <w:top w:val="single" w:sz="4" w:space="0" w:color="BFBFBF"/>
+              <w:left w:val="single" w:sz="4" w:space="0" w:color="BFBFBF"/>
+              <w:bottom w:val="single" w:sz="4" w:space="0" w:color="BFBFBF"/>
+              <w:right w:val="single" w:sz="4" w:space="0" w:color="BFBFBF"/>
+            </w:tcBorders>
+            <w:tcMar>
+              <w:top w:w="60" w:type="dxa"/>
+              <w:left w:w="100" w:type="dxa"/>
+              <w:bottom w:w="60" w:type="dxa"/>
+              <w:right w:w="100" w:type="dxa"/>
+            </w:tcMar>
+          </w:tcPr>
+          <w:p>
+            <w:pPr>
+              <w:spacing w:after="20"/>
+            </w:pPr>
+            <w:r>
+              <w:t>Título sobre el reloj</w:t>
+            </w:r>
+          </w:p>
+        </w:tc>
+      </w:tr>
+      <w:tr>
+        <w:tc>
+          <w:tcPr>
+            <w:tcW w:w="1497" w:type="dxa"/>
+            <w:tcBorders>
+              <w:top w:val="single" w:sz="4" w:space="0" w:color="BFBFBF"/>
+              <w:left w:val="single" w:sz="4" w:space="0" w:color="BFBFBF"/>
+              <w:bottom w:val="single" w:sz="4" w:space="0" w:color="BFBFBF"/>
+              <w:right w:val="single" w:sz="4" w:space="0" w:color="BFBFBF"/>
+            </w:tcBorders>
+            <w:tcMar>
+              <w:top w:w="60" w:type="dxa"/>
+              <w:left w:w="100" w:type="dxa"/>
+              <w:bottom w:w="60" w:type="dxa"/>
+              <w:right w:w="100" w:type="dxa"/>
+            </w:tcMar>
+          </w:tcPr>
+          <w:p>
+            <w:pPr>
+              <w:spacing w:after="20"/>
+            </w:pPr>
+            <w:r>
+              <w:rPr>
+                <w:rFonts w:ascii="Consolas" w:eastAsia="Consolas" w:hAnsi="Consolas" w:cs="Consolas"/>
+                <w:color w:val="7A1F33"/>
+                <w:sz w:val="19"/>
+                <w:szCs w:val="19"/>
+              </w:rPr>
+              <w:t>t</w:t>
+            </w:r>
+          </w:p>
+        </w:tc>
+        <w:tc>
+          <w:tcPr>
+            <w:tcW w:w="7863" w:type="dxa"/>
+            <w:tcBorders>
+              <w:top w:val="single" w:sz="4" w:space="0" w:color="BFBFBF"/>
+              <w:left w:val="single" w:sz="4" w:space="0" w:color="BFBFBF"/>
+              <w:bottom w:val="single" w:sz="4" w:space="0" w:color="BFBFBF"/>
+              <w:right w:val="single" w:sz="4" w:space="0" w:color="BFBFBF"/>
+            </w:tcBorders>
+            <w:tcMar>
+              <w:top w:w="60" w:type="dxa"/>
+              <w:left w:w="100" w:type="dxa"/>
+              <w:bottom w:w="60" w:type="dxa"/>
+              <w:right w:w="100" w:type="dxa"/>
+            </w:tcMar>
+          </w:tcPr>
+          <w:p>
+            <w:pPr>
+              <w:spacing w:after="20"/>
+            </w:pPr>
+            <w:r>
+              <w:t xml:space="preserve">Reloj base </w:t>
+            </w:r>
+            <w:r>
+              <w:rPr>
+                <w:rFonts w:ascii="Consolas" w:eastAsia="Consolas" w:hAnsi="Consolas" w:cs="Consolas"/>
+                <w:color w:val="7A1F33"/>
+                <w:sz w:val="19"/>
+                <w:szCs w:val="19"/>
+              </w:rPr>
+              <w:t>{ e, d, fin, r }</w:t>
+            </w:r>
+            <w:r>
+              <w:t>. El panel pide el tiempo inicial en minutos y lo guarda en segundos</w:t>
+            </w:r>
+          </w:p>
+        </w:tc>
+      </w:tr>
+      <w:tr>
+        <w:tc>
+          <w:tcPr>
+            <w:tcW w:w="1497" w:type="dxa"/>
+            <w:tcBorders>
+              <w:top w:val="single" w:sz="4" w:space="0" w:color="BFBFBF"/>
+              <w:left w:val="single" w:sz="4" w:space="0" w:color="BFBFBF"/>
+              <w:bottom w:val="single" w:sz="4" w:space="0" w:color="BFBFBF"/>
+              <w:right w:val="single" w:sz="4" w:space="0" w:color="BFBFBF"/>
+            </w:tcBorders>
+            <w:tcMar>
+              <w:top w:w="60" w:type="dxa"/>
+              <w:left w:w="100" w:type="dxa"/>
+              <w:bottom w:w="60" w:type="dxa"/>
+              <w:right w:w="100" w:type="dxa"/>
+            </w:tcMar>
+          </w:tcPr>
+          <w:p>
+            <w:pPr>
+              <w:spacing w:after="20"/>
+            </w:pPr>
+            <w:r>
+              <w:rPr>
+                <w:rFonts w:ascii="Consolas" w:eastAsia="Consolas" w:hAnsi="Consolas" w:cs="Consolas"/>
+                <w:color w:val="7A1F33"/>
+                <w:sz w:val="19"/>
+                <w:szCs w:val="19"/>
+              </w:rPr>
+              <w:t>ro</w:t>
+            </w:r>
+          </w:p>
+        </w:tc>
+        <w:tc>
+          <w:tcPr>
+            <w:tcW w:w="7863" w:type="dxa"/>
+            <w:tcBorders>
+              <w:top w:val="single" w:sz="4" w:space="0" w:color="BFBFBF"/>
+              <w:left w:val="single" w:sz="4" w:space="0" w:color="BFBFBF"/>
+              <w:bottom w:val="single" w:sz="4" w:space="0" w:color="BFBFBF"/>
+              <w:right w:val="single" w:sz="4" w:space="0" w:color="BFBFBF"/>
+            </w:tcBorders>
+            <w:tcMar>
+              <w:top w:w="60" w:type="dxa"/>
+              <w:left w:w="100" w:type="dxa"/>
+              <w:bottom w:w="60" w:type="dxa"/>
+              <w:right w:w="100" w:type="dxa"/>
+            </w:tcMar>
+          </w:tcPr>
+          <w:p>
+            <w:pPr>
+              <w:spacing w:after="20"/>
+            </w:pPr>
+            <w:r>
+              <w:t>Ronda: cambia al reiniciar. Cuando cambia, se borra todo lo sumado</w:t>
+            </w:r>
+          </w:p>
+        </w:tc>
+      </w:tr>
+      <w:tr>
+        <w:tc>
+          <w:tcPr>
+            <w:tcW w:w="1497" w:type="dxa"/>
+            <w:tcBorders>
+              <w:top w:val="single" w:sz="4" w:space="0" w:color="BFBFBF"/>
+              <w:left w:val="single" w:sz="4" w:space="0" w:color="BFBFBF"/>
+              <w:bottom w:val="single" w:sz="4" w:space="0" w:color="BFBFBF"/>
+              <w:right w:val="single" w:sz="4" w:space="0" w:color="BFBFBF"/>
+            </w:tcBorders>
+            <w:tcMar>
+              <w:top w:w="60" w:type="dxa"/>
+              <w:left w:w="100" w:type="dxa"/>
+              <w:bottom w:w="60" w:type="dxa"/>
+              <w:right w:w="100" w:type="dxa"/>
+            </w:tcMar>
+          </w:tcPr>
+          <w:p>
+            <w:pPr>
+              <w:spacing w:after="20"/>
+            </w:pPr>
+            <w:r>
+              <w:rPr>
+                <w:rFonts w:ascii="Consolas" w:eastAsia="Consolas" w:hAnsi="Consolas" w:cs="Consolas"/>
+                <w:color w:val="7A1F33"/>
+                <w:sz w:val="19"/>
+                <w:szCs w:val="19"/>
+              </w:rPr>
+              <w:t>ex</w:t>
+            </w:r>
+          </w:p>
+        </w:tc>
+        <w:tc>
+          <w:tcPr>
+            <w:tcW w:w="7863" w:type="dxa"/>
+            <w:tcBorders>
+              <w:top w:val="single" w:sz="4" w:space="0" w:color="BFBFBF"/>
+              <w:left w:val="single" w:sz="4" w:space="0" w:color="BFBFBF"/>
+              <w:bottom w:val="single" w:sz="4" w:space="0" w:color="BFBFBF"/>
+              <w:right w:val="single" w:sz="4" w:space="0" w:color="BFBFBF"/>
+            </w:tcBorders>
+            <w:tcMar>
+              <w:top w:w="60" w:type="dxa"/>
+              <w:left w:w="100" w:type="dxa"/>
+              <w:bottom w:w="60" w:type="dxa"/>
+              <w:right w:w="100" w:type="dxa"/>
+            </w:tcMar>
+          </w:tcPr>
+          <w:p>
+            <w:pPr>
+              <w:spacing w:after="20"/>
+            </w:pPr>
+            <w:r>
+              <w:t>Milisegundos agregados con “+5 min” en la ronda (siempre crece; vuelve a 0 al reiniciar)</w:t>
+            </w:r>
+          </w:p>
+        </w:tc>
+      </w:tr>
+      <w:tr>
+        <w:tc>
+          <w:tcPr>
+            <w:tcW w:w="1497" w:type="dxa"/>
+            <w:tcBorders>
+              <w:top w:val="single" w:sz="4" w:space="0" w:color="BFBFBF"/>
+              <w:left w:val="single" w:sz="4" w:space="0" w:color="BFBFBF"/>
+              <w:bottom w:val="single" w:sz="4" w:space="0" w:color="BFBFBF"/>
+              <w:right w:val="single" w:sz="4" w:space="0" w:color="BFBFBF"/>
+            </w:tcBorders>
+            <w:tcMar>
+              <w:top w:w="60" w:type="dxa"/>
+              <w:left w:w="100" w:type="dxa"/>
+              <w:bottom w:w="60" w:type="dxa"/>
+              <w:right w:w="100" w:type="dxa"/>
+            </w:tcMar>
+          </w:tcPr>
+          <w:p>
+            <w:pPr>
+              <w:spacing w:after="20"/>
+            </w:pPr>
+            <w:r>
+              <w:rPr>
+                <w:rFonts w:ascii="Consolas" w:eastAsia="Consolas" w:hAnsi="Consolas" w:cs="Consolas"/>
+                <w:color w:val="7A1F33"/>
+                <w:sz w:val="19"/>
+                <w:szCs w:val="19"/>
+              </w:rPr>
+              <w:t>cap</w:t>
+            </w:r>
+          </w:p>
+        </w:tc>
+        <w:tc>
+          <w:tcPr>
+            <w:tcW w:w="7863" w:type="dxa"/>
+            <w:tcBorders>
+              <w:top w:val="single" w:sz="4" w:space="0" w:color="BFBFBF"/>
+              <w:left w:val="single" w:sz="4" w:space="0" w:color="BFBFBF"/>
+              <w:bottom w:val="single" w:sz="4" w:space="0" w:color="BFBFBF"/>
+              <w:right w:val="single" w:sz="4" w:space="0" w:color="BFBFBF"/>
+            </w:tcBorders>
+            <w:tcMar>
+              <w:top w:w="60" w:type="dxa"/>
+              <w:left w:w="100" w:type="dxa"/>
+              <w:bottom w:w="60" w:type="dxa"/>
+              <w:right w:w="100" w:type="dxa"/>
+            </w:tcMar>
+          </w:tcPr>
+          <w:p>
+            <w:pPr>
+              <w:spacing w:after="20"/>
+            </w:pPr>
+            <w:r>
+              <w:t>Tope en segundos: el reloj nunca marca más</w:t>
+            </w:r>
+          </w:p>
+        </w:tc>
+      </w:tr>
+      <w:tr>
+        <w:tc>
+          <w:tcPr>
+            <w:tcW w:w="1497" w:type="dxa"/>
+            <w:tcBorders>
+              <w:top w:val="single" w:sz="4" w:space="0" w:color="BFBFBF"/>
+              <w:left w:val="single" w:sz="4" w:space="0" w:color="BFBFBF"/>
+              <w:bottom w:val="single" w:sz="4" w:space="0" w:color="BFBFBF"/>
+              <w:right w:val="single" w:sz="4" w:space="0" w:color="BFBFBF"/>
+            </w:tcBorders>
+            <w:tcMar>
+              <w:top w:w="60" w:type="dxa"/>
+              <w:left w:w="100" w:type="dxa"/>
+              <w:bottom w:w="60" w:type="dxa"/>
+              <w:right w:w="100" w:type="dxa"/>
+            </w:tcMar>
+          </w:tcPr>
+          <w:p>
+            <w:pPr>
+              <w:spacing w:after="20"/>
+            </w:pPr>
+            <w:r>
+              <w:rPr>
+                <w:rFonts w:ascii="Consolas" w:eastAsia="Consolas" w:hAnsi="Consolas" w:cs="Consolas"/>
+                <w:color w:val="7A1F33"/>
+                <w:sz w:val="19"/>
+                <w:szCs w:val="19"/>
+              </w:rPr>
+              <w:t>sl</w:t>
+            </w:r>
+          </w:p>
+        </w:tc>
+        <w:tc>
+          <w:tcPr>
+            <w:tcW w:w="7863" w:type="dxa"/>
+            <w:tcBorders>
+              <w:top w:val="single" w:sz="4" w:space="0" w:color="BFBFBF"/>
+              <w:left w:val="single" w:sz="4" w:space="0" w:color="BFBFBF"/>
+              <w:bottom w:val="single" w:sz="4" w:space="0" w:color="BFBFBF"/>
+              <w:right w:val="single" w:sz="4" w:space="0" w:color="BFBFBF"/>
+            </w:tcBorders>
+            <w:tcMar>
+              <w:top w:w="60" w:type="dxa"/>
+              <w:left w:w="100" w:type="dxa"/>
+              <w:bottom w:w="60" w:type="dxa"/>
+              <w:right w:w="100" w:type="dxa"/>
+            </w:tcMar>
+          </w:tcPr>
+          <w:p>
+            <w:pPr>
+              <w:spacing w:after="20"/>
+            </w:pPr>
+            <w:r>
+              <w:t>Segundos que suma cada 100 likes (por defecto 5)</w:t>
+            </w:r>
+          </w:p>
+        </w:tc>
+      </w:tr>
+      <w:tr>
+        <w:tc>
+          <w:tcPr>
+            <w:tcW w:w="1497" w:type="dxa"/>
+            <w:tcBorders>
+              <w:top w:val="single" w:sz="4" w:space="0" w:color="BFBFBF"/>
+              <w:left w:val="single" w:sz="4" w:space="0" w:color="BFBFBF"/>
+              <w:bottom w:val="single" w:sz="4" w:space="0" w:color="BFBFBF"/>
+              <w:right w:val="single" w:sz="4" w:space="0" w:color="BFBFBF"/>
+            </w:tcBorders>
+            <w:tcMar>
+              <w:top w:w="60" w:type="dxa"/>
+              <w:left w:w="100" w:type="dxa"/>
+              <w:bottom w:w="60" w:type="dxa"/>
+              <w:right w:w="100" w:type="dxa"/>
+            </w:tcMar>
+          </w:tcPr>
+          <w:p>
+            <w:pPr>
+              <w:spacing w:after="20"/>
+            </w:pPr>
+            <w:r>
+              <w:rPr>
+                <w:rFonts w:ascii="Consolas" w:eastAsia="Consolas" w:hAnsi="Consolas" w:cs="Consolas"/>
+                <w:color w:val="7A1F33"/>
+                <w:sz w:val="19"/>
+                <w:szCs w:val="19"/>
+              </w:rPr>
+              <w:t>sd</w:t>
+            </w:r>
+          </w:p>
+        </w:tc>
+        <w:tc>
+          <w:tcPr>
+            <w:tcW w:w="7863" w:type="dxa"/>
+            <w:tcBorders>
+              <w:top w:val="single" w:sz="4" w:space="0" w:color="BFBFBF"/>
+              <w:left w:val="single" w:sz="4" w:space="0" w:color="BFBFBF"/>
+              <w:bottom w:val="single" w:sz="4" w:space="0" w:color="BFBFBF"/>
+              <w:right w:val="single" w:sz="4" w:space="0" w:color="BFBFBF"/>
+            </w:tcBorders>
+            <w:tcMar>
+              <w:top w:w="60" w:type="dxa"/>
+              <w:left w:w="100" w:type="dxa"/>
+              <w:bottom w:w="60" w:type="dxa"/>
+              <w:right w:w="100" w:type="dxa"/>
+            </w:tcMar>
+          </w:tcPr>
+          <w:p>
+            <w:pPr>
+              <w:spacing w:after="20"/>
+            </w:pPr>
+            <w:r>
+              <w:t>Segundos que suma cada moneda de regalo (por defecto 10)</w:t>
+            </w:r>
+          </w:p>
+        </w:tc>
+      </w:tr>
+      <w:tr>
+        <w:tc>
+          <w:tcPr>
+            <w:tcW w:w="1497" w:type="dxa"/>
+            <w:tcBorders>
+              <w:top w:val="single" w:sz="4" w:space="0" w:color="BFBFBF"/>
+              <w:left w:val="single" w:sz="4" w:space="0" w:color="BFBFBF"/>
+              <w:bottom w:val="single" w:sz="4" w:space="0" w:color="BFBFBF"/>
+              <w:right w:val="single" w:sz="4" w:space="0" w:color="BFBFBF"/>
+            </w:tcBorders>
+            <w:tcMar>
+              <w:top w:w="60" w:type="dxa"/>
+              <w:left w:w="100" w:type="dxa"/>
+              <w:bottom w:w="60" w:type="dxa"/>
+              <w:right w:w="100" w:type="dxa"/>
+            </w:tcMar>
+          </w:tcPr>
+          <w:p>
+            <w:pPr>
+              <w:spacing w:after="20"/>
+            </w:pPr>
+            <w:r>
+              <w:rPr>
+                <w:rFonts w:ascii="Consolas" w:eastAsia="Consolas" w:hAnsi="Consolas" w:cs="Consolas"/>
+                <w:color w:val="7A1F33"/>
+                <w:sz w:val="19"/>
+                <w:szCs w:val="19"/>
+              </w:rPr>
+              <w:t>v</w:t>
+            </w:r>
+          </w:p>
+        </w:tc>
+        <w:tc>
+          <w:tcPr>
+            <w:tcW w:w="7863" w:type="dxa"/>
+            <w:tcBorders>
+              <w:top w:val="single" w:sz="4" w:space="0" w:color="BFBFBF"/>
+              <w:left w:val="single" w:sz="4" w:space="0" w:color="BFBFBF"/>
+              <w:bottom w:val="single" w:sz="4" w:space="0" w:color="BFBFBF"/>
+              <w:right w:val="single" w:sz="4" w:space="0" w:color="BFBFBF"/>
+            </w:tcBorders>
+            <w:tcMar>
+              <w:top w:w="60" w:type="dxa"/>
+              <w:left w:w="100" w:type="dxa"/>
+              <w:bottom w:w="60" w:type="dxa"/>
+              <w:right w:w="100" w:type="dxa"/>
+            </w:tcMar>
+          </w:tcPr>
+          <w:p>
+            <w:pPr>
+              <w:spacing w:after="20"/>
+            </w:pPr>
+            <w:r>
+              <w:t>Monedas de un regalo cuando TikTok no manda el precio (por defecto 1)</w:t>
+            </w:r>
+          </w:p>
+        </w:tc>
+      </w:tr>
+      <w:tr>
+        <w:tc>
+          <w:tcPr>
+            <w:tcW w:w="1497" w:type="dxa"/>
+            <w:tcBorders>
+              <w:top w:val="single" w:sz="4" w:space="0" w:color="BFBFBF"/>
+              <w:left w:val="single" w:sz="4" w:space="0" w:color="BFBFBF"/>
+              <w:bottom w:val="single" w:sz="4" w:space="0" w:color="BFBFBF"/>
+              <w:right w:val="single" w:sz="4" w:space="0" w:color="BFBFBF"/>
+            </w:tcBorders>
+            <w:tcMar>
+              <w:top w:w="60" w:type="dxa"/>
+              <w:left w:w="100" w:type="dxa"/>
+              <w:bottom w:w="60" w:type="dxa"/>
+              <w:right w:w="100" w:type="dxa"/>
+            </w:tcMar>
+          </w:tcPr>
+          <w:p>
+            <w:pPr>
+              <w:spacing w:after="20"/>
+            </w:pPr>
+            <w:r>
+              <w:rPr>
+                <w:rFonts w:ascii="Consolas" w:eastAsia="Consolas" w:hAnsi="Consolas" w:cs="Consolas"/>
+                <w:color w:val="7A1F33"/>
+                <w:sz w:val="19"/>
+                <w:szCs w:val="19"/>
+              </w:rPr>
+              <w:t>s</w:t>
+            </w:r>
+          </w:p>
+        </w:tc>
+        <w:tc>
+          <w:tcPr>
+            <w:tcW w:w="7863" w:type="dxa"/>
+            <w:tcBorders>
+              <w:top w:val="single" w:sz="4" w:space="0" w:color="BFBFBF"/>
+              <w:left w:val="single" w:sz="4" w:space="0" w:color="BFBFBF"/>
+              <w:bottom w:val="single" w:sz="4" w:space="0" w:color="BFBFBF"/>
+              <w:right w:val="single" w:sz="4" w:space="0" w:color="BFBFBF"/>
+            </w:tcBorders>
+            <w:tcMar>
+              <w:top w:w="60" w:type="dxa"/>
+              <w:left w:w="100" w:type="dxa"/>
+              <w:bottom w:w="60" w:type="dxa"/>
+              <w:right w:w="100" w:type="dxa"/>
+            </w:tcMar>
+          </w:tcPr>
+          <w:p>
+            <w:pPr>
+              <w:spacing w:after="20"/>
+            </w:pPr>
+            <w:r>
+              <w:t>Sonidos (1 o 0): un toque suave al sumar tiempo con un regalo (como mucho uno por segundo) y un tono al terminar</w:t>
+            </w:r>
+          </w:p>
+        </w:tc>
+      </w:tr>
+      <w:tr>
+        <w:tc>
+          <w:tcPr>
+            <w:tcW w:w="1497" w:type="dxa"/>
+            <w:tcBorders>
+              <w:top w:val="single" w:sz="4" w:space="0" w:color="BFBFBF"/>
+              <w:left w:val="single" w:sz="4" w:space="0" w:color="BFBFBF"/>
+              <w:bottom w:val="single" w:sz="4" w:space="0" w:color="BFBFBF"/>
+              <w:right w:val="single" w:sz="4" w:space="0" w:color="BFBFBF"/>
+            </w:tcBorders>
+            <w:tcMar>
+              <w:top w:w="60" w:type="dxa"/>
+              <w:left w:w="100" w:type="dxa"/>
+              <w:bottom w:w="60" w:type="dxa"/>
+              <w:right w:w="100" w:type="dxa"/>
+            </w:tcMar>
+          </w:tcPr>
+          <w:p>
+            <w:pPr>
+              <w:spacing w:after="20"/>
+            </w:pPr>
+            <w:r>
+              <w:rPr>
+                <w:rFonts w:ascii="Consolas" w:eastAsia="Consolas" w:hAnsi="Consolas" w:cs="Consolas"/>
+                <w:color w:val="7A1F33"/>
+                <w:sz w:val="19"/>
+                <w:szCs w:val="19"/>
+              </w:rPr>
+              <w:t>est</w:t>
+            </w:r>
+          </w:p>
+        </w:tc>
+        <w:tc>
+          <w:tcPr>
+            <w:tcW w:w="7863" w:type="dxa"/>
+            <w:tcBorders>
+              <w:top w:val="single" w:sz="4" w:space="0" w:color="BFBFBF"/>
+              <w:left w:val="single" w:sz="4" w:space="0" w:color="BFBFBF"/>
+              <w:bottom w:val="single" w:sz="4" w:space="0" w:color="BFBFBF"/>
+              <w:right w:val="single" w:sz="4" w:space="0" w:color="BFBFBF"/>
+            </w:tcBorders>
+            <w:tcMar>
+              <w:top w:w="60" w:type="dxa"/>
+              <w:left w:w="100" w:type="dxa"/>
+              <w:bottom w:w="60" w:type="dxa"/>
+              <w:right w:w="100" w:type="dxa"/>
+            </w:tcMar>
+          </w:tcPr>
+          <w:p>
+            <w:pPr>
+              <w:spacing w:after="20"/>
+            </w:pPr>
+            <w:r>
+              <w:t>Estilo visual (lo aplica comun.js, igual que en los demás widgets)</w:t>
+            </w:r>
+          </w:p>
+        </w:tc>
+      </w:tr>
+    </w:tbl>
+    <w:p>
+      <w:pPr>
+        <w:spacing w:after="120"/>
+      </w:pPr>
+    </w:p>
+    <w:p>
+      <w:pPr>
+        <w:pStyle w:val="Heading3"/>
+      </w:pPr>
+      <w:r>
+        <w:t>Funcionamiento</w:t>
+      </w:r>
+    </w:p>
+    <w:p>
+      <w:pPr>
+        <w:pStyle w:val="ListParagraph"/>
+        <w:numPr>
+          <w:ilvl w:val="0"/>
+          <w:numId w:val="3"/>
+        </w:numPr>
+        <w:spacing w:after="60"/>
+      </w:pPr>
+      <w:r>
+        <w:t xml:space="preserve">Un </w:t>
+      </w:r>
+      <w:r>
+        <w:rPr>
+          <w:rFonts w:ascii="Consolas" w:eastAsia="Consolas" w:hAnsi="Consolas" w:cs="Consolas"/>
+          <w:color w:val="7A1F33"/>
+          <w:sz w:val="19"/>
+          <w:szCs w:val="19"/>
+        </w:rPr>
+        <w:t>like</w:t>
+      </w:r>
+      <w:r>
+        <w:t xml:space="preserve"> suma </w:t>
+      </w:r>
+      <w:r>
+        <w:rPr>
+          <w:rFonts w:ascii="Consolas" w:eastAsia="Consolas" w:hAnsi="Consolas" w:cs="Consolas"/>
+          <w:color w:val="7A1F33"/>
+          <w:sz w:val="19"/>
+          <w:szCs w:val="19"/>
+        </w:rPr>
+        <w:t>cantidad / 100 × sl</w:t>
+      </w:r>
+      <w:r>
+        <w:t xml:space="preserve"> segundos y un </w:t>
+      </w:r>
+      <w:r>
+        <w:rPr>
+          <w:rFonts w:ascii="Consolas" w:eastAsia="Consolas" w:hAnsi="Consolas" w:cs="Consolas"/>
+          <w:color w:val="7A1F33"/>
+          <w:sz w:val="19"/>
+          <w:szCs w:val="19"/>
+        </w:rPr>
+        <w:t>regalo</w:t>
+      </w:r>
+      <w:r>
+        <w:t xml:space="preserve"> suma </w:t>
+      </w:r>
+      <w:r>
+        <w:rPr>
+          <w:rFonts w:ascii="Consolas" w:eastAsia="Consolas" w:hAnsi="Consolas" w:cs="Consolas"/>
+          <w:color w:val="7A1F33"/>
+          <w:sz w:val="19"/>
+          <w:szCs w:val="19"/>
+        </w:rPr>
+        <w:t>(diamantes × cantidad) × sd</w:t>
+      </w:r>
+      <w:r>
+        <w:t xml:space="preserve"> (si el precio llega en 0, se usa </w:t>
+      </w:r>
+      <w:r>
+        <w:rPr>
+          <w:rFonts w:ascii="Consolas" w:eastAsia="Consolas" w:hAnsi="Consolas" w:cs="Consolas"/>
+          <w:color w:val="7A1F33"/>
+          <w:sz w:val="19"/>
+          <w:szCs w:val="19"/>
+        </w:rPr>
+        <w:t>v</w:t>
+      </w:r>
+      <w:r>
+        <w:t>).</w:t>
+      </w:r>
+    </w:p>
+    <w:p>
+      <w:pPr>
+        <w:pStyle w:val="ListParagraph"/>
+        <w:numPr>
+          <w:ilvl w:val="0"/>
+          <w:numId w:val="3"/>
+        </w:numPr>
+        <w:spacing w:after="60"/>
+      </w:pPr>
+      <w:r>
+        <w:t>Cada suma se recorta para no pasar del tope; si el reloj ya está en el tope, no suma nada y el estado dice “Tope alcanzado”.</w:t>
+      </w:r>
+    </w:p>
+    <w:p>
+      <w:pPr>
+        <w:pStyle w:val="ListParagraph"/>
+        <w:numPr>
+          <w:ilvl w:val="0"/>
+          <w:numId w:val="3"/>
+        </w:numPr>
+        <w:spacing w:after="60"/>
+      </w:pPr>
+      <w:r>
+        <w:t>El público suma con el reloj en marcha o en pausa, nunca antes de iniciar ni después de terminar. “+5 min” del panel suma siempre: antes de iniciar alarga el tiempo inicial y, si el reloj llegó a 0, lo revive.</w:t>
+      </w:r>
+    </w:p>
+    <w:p>
+      <w:pPr>
+        <w:pStyle w:val="ListParagraph"/>
+        <w:numPr>
+          <w:ilvl w:val="0"/>
+          <w:numId w:val="3"/>
+        </w:numPr>
+        <w:spacing w:after="60"/>
+      </w:pPr>
+      <w:r>
+        <w:t>Al sumarse tiempo, la píldora late con un pulso dorado, las cifras destellan y sube un “+1:30”. Si llegan varias sumas seguidas, se acumulan en el mismo “+”. Con menos de 1 minuto, las cifras toman el color de alerta (</w:t>
+      </w:r>
+      <w:r>
+        <w:rPr>
+          <w:rFonts w:ascii="Consolas" w:eastAsia="Consolas" w:hAnsi="Consolas" w:cs="Consolas"/>
+          <w:color w:val="7A1F33"/>
+          <w:sz w:val="19"/>
+          <w:szCs w:val="19"/>
+        </w:rPr>
+        <w:t>--mal</w:t>
+      </w:r>
+      <w:r>
+        <w:t>) con brillo y laten.</w:t>
+      </w:r>
+    </w:p>
+    <w:p>
+      <w:pPr>
+        <w:pStyle w:val="ListParagraph"/>
+        <w:numPr>
+          <w:ilvl w:val="0"/>
+          <w:numId w:val="3"/>
+        </w:numPr>
+        <w:spacing w:after="60"/>
+      </w:pPr>
+      <w:r>
+        <w:t>Lo sumado se guarda en el navegador de OBS (</w:t>
+      </w:r>
+      <w:r>
+        <w:rPr>
+          <w:rFonts w:ascii="Consolas" w:eastAsia="Consolas" w:hAnsi="Consolas" w:cs="Consolas"/>
+          <w:color w:val="7A1F33"/>
+          <w:sz w:val="19"/>
+          <w:szCs w:val="19"/>
+        </w:rPr>
+        <w:t>localStorage</w:t>
+      </w:r>
+      <w:r>
+        <w:t xml:space="preserve">, clave </w:t>
+      </w:r>
+      <w:r>
+        <w:rPr>
+          <w:rFonts w:ascii="Consolas" w:eastAsia="Consolas" w:hAnsi="Consolas" w:cs="Consolas"/>
+          <w:color w:val="7A1F33"/>
+          <w:sz w:val="19"/>
+          <w:szCs w:val="19"/>
+        </w:rPr>
+        <w:t>live-tools:subathon:&lt;w&gt;</w:t>
+      </w:r>
+      <w:r>
+        <w:t xml:space="preserve">) junto con la ronda y lo ya aplicado de </w:t>
+      </w:r>
+      <w:r>
+        <w:rPr>
+          <w:rFonts w:ascii="Consolas" w:eastAsia="Consolas" w:hAnsi="Consolas" w:cs="Consolas"/>
+          <w:color w:val="7A1F33"/>
+          <w:sz w:val="19"/>
+          <w:szCs w:val="19"/>
+        </w:rPr>
+        <w:t>ex</w:t>
+      </w:r>
+      <w:r>
+        <w:t>: si OBS recarga la fuente, el tiempo se conserva.</w:t>
+      </w:r>
+    </w:p>
+    <w:p>
+      <w:pPr>
+        <w:pBdr>
+          <w:left w:val="single" w:sz="18" w:space="8" w:color="E5304F"/>
+        </w:pBdr>
+        <w:shd w:val="clear" w:color="auto" w:fill="FDECEF"/>
+        <w:spacing w:before="120" w:after="160"/>
+        <w:ind w:left="200" w:right="200"/>
+      </w:pPr>
+      <w:r>
+        <w:rPr>
+          <w:b/>
+          <w:bCs/>
+          <w:color w:val="E5304F"/>
+        </w:rPr>
+        <w:t xml:space="preserve">Limitación: </w:t>
+      </w:r>
+      <w:r>
+        <w:t>El panel no ve lo que suma el chat: su reloj marca el tiempo base más los “+5 min”, así que el de OBS siempre marca igual o más. Si el widget en OBS se abre por primera vez a mitad de un subathon, no conoce lo que el chat sumó antes.</w:t>
+      </w:r>
+    </w:p>
+    <w:p>
+      <w:pPr>
         <w:pStyle w:val="Heading1"/>
         <w:pageBreakBefore/>
       </w:pPr>
-      <w:bookmarkStart w:id="27" w:name="_Toc242787381"/>
+      <w:bookmarkStart w:id="28" w:name="_Toc242787914"/>
       <w:r>
         <w:lastRenderedPageBreak/>
         <w:t>8. Frontend: el panel</w:t>
       </w:r>
-      <w:bookmarkEnd w:id="27"/>
+      <w:bookmarkEnd w:id="28"/>
     </w:p>
     <w:p>
       <w:pPr>
         <w:pStyle w:val="Heading2"/>
       </w:pPr>
-      <w:bookmarkStart w:id="28" w:name="_Toc242787382"/>
+      <w:bookmarkStart w:id="29" w:name="_Toc242787915"/>
       <w:r>
         <w:t>8.1 Estructura de la página (index.html)</w:t>
       </w:r>
-      <w:bookmarkEnd w:id="28"/>
+      <w:bookmarkEnd w:id="29"/>
     </w:p>
     <w:p>
       <w:pPr>
@@ -18257,11 +19546,11 @@
       <w:pPr>
         <w:pStyle w:val="Heading2"/>
       </w:pPr>
-      <w:bookmarkStart w:id="29" w:name="_Toc242787383"/>
+      <w:bookmarkStart w:id="30" w:name="_Toc242787916"/>
       <w:r>
         <w:t>8.2 Navegación y ciclo de vida (app.js)</w:t>
       </w:r>
-      <w:bookmarkEnd w:id="29"/>
+      <w:bookmarkEnd w:id="30"/>
     </w:p>
     <w:p>
       <w:pPr>
@@ -18438,11 +19727,11 @@
       <w:pPr>
         <w:pStyle w:val="Heading2"/>
       </w:pPr>
-      <w:bookmarkStart w:id="30" w:name="_Toc242787384"/>
+      <w:bookmarkStart w:id="31" w:name="_Toc242787917"/>
       <w:r>
         <w:t>8.3 Mapa del panel (registro.js)</w:t>
       </w:r>
-      <w:bookmarkEnd w:id="30"/>
+      <w:bookmarkEnd w:id="31"/>
     </w:p>
     <w:p>
       <w:pPr>
@@ -18944,7 +20233,7 @@
               <w:spacing w:after="20"/>
             </w:pPr>
             <w:r>
-              <w:t>Carrera de regalos (carrera), Batalla de regalos (batalla), Jefe del LIVE (jefe)</w:t>
+              <w:t>Carrera de regalos (carrera), Batalla de regalos (batalla), Jefe del LIVE (jefe), Subathon (subathon)</w:t>
             </w:r>
           </w:p>
         </w:tc>
@@ -19223,11 +20512,11 @@
       <w:pPr>
         <w:pStyle w:val="Heading2"/>
       </w:pPr>
-      <w:bookmarkStart w:id="31" w:name="_Toc242787385"/>
+      <w:bookmarkStart w:id="32" w:name="_Toc242787918"/>
       <w:r>
         <w:t>8.4 Datos guardados (almacen.js)</w:t>
       </w:r>
-      <w:bookmarkEnd w:id="31"/>
+      <w:bookmarkEnd w:id="32"/>
     </w:p>
     <w:p>
       <w:pPr>
@@ -20022,11 +21311,11 @@
       <w:pPr>
         <w:pStyle w:val="Heading2"/>
       </w:pPr>
-      <w:bookmarkStart w:id="32" w:name="_Toc242787386"/>
+      <w:bookmarkStart w:id="33" w:name="_Toc242787919"/>
       <w:r>
         <w:t>8.5 Conexión del panel al LIVE (envivo.js)</w:t>
       </w:r>
-      <w:bookmarkEnd w:id="32"/>
+      <w:bookmarkEnd w:id="33"/>
     </w:p>
     <w:p>
       <w:pPr>
@@ -20087,12 +21376,12 @@
       <w:pPr>
         <w:pStyle w:val="Heading2"/>
       </w:pPr>
-      <w:bookmarkStart w:id="33" w:name="_Toc242787387"/>
+      <w:bookmarkStart w:id="34" w:name="_Toc242787920"/>
       <w:r>
         <w:lastRenderedPageBreak/>
         <w:t>8.6 Componentes de interfaz (ui.js)</w:t>
       </w:r>
-      <w:bookmarkEnd w:id="33"/>
+      <w:bookmarkEnd w:id="34"/>
     </w:p>
     <w:tbl>
       <w:tblPr>
@@ -20596,11 +21885,11 @@
       <w:pPr>
         <w:pStyle w:val="Heading2"/>
       </w:pPr>
-      <w:bookmarkStart w:id="34" w:name="_Toc242787388"/>
+      <w:bookmarkStart w:id="35" w:name="_Toc242787921"/>
       <w:r>
         <w:t>8.7 Las vistas</w:t>
       </w:r>
-      <w:bookmarkEnd w:id="34"/>
+      <w:bookmarkEnd w:id="35"/>
     </w:p>
     <w:p>
       <w:pPr>
@@ -20700,6 +21989,22 @@
       </w:pPr>
       <w:r>
         <w:t>La tarjeta del widget tiene el nombre del jefe, la vida total, el tiempo límite en minutos y el texto de victoria; en Personalizar, “Los ataques solo cuentan con el reloj en marcha”, los sonidos y el estilo visual. Sus pruebas: “+100 likes”, “Rosa”, “Regalo de 100” y “Golpe final”. La tarjeta Raid tiene el reloj en grande y los botones Iniciar raid (Reanudar en pausa, Nueva raid cuando se agotó el tiempo), Pausar y Reiniciar, que funcionan igual que en la carrera. La tarjeta Daño tiene la vida por like, la vida por moneda y las monedas de un regalo sin precio, y calcula cuánto hace falta para vencer al jefe (“10.000 likes o 1.000 monedas en regalos”), útil para elegir una vida acorde al público.</w:t>
+      </w:r>
+    </w:p>
+    <w:p>
+      <w:pPr>
+        <w:pStyle w:val="Heading3"/>
+      </w:pPr>
+      <w:r>
+        <w:t>Subathon</w:t>
+      </w:r>
+    </w:p>
+    <w:p>
+      <w:pPr>
+        <w:spacing w:after="120"/>
+      </w:pPr>
+      <w:r>
+        <w:t>La tarjeta del widget tiene el título, el tiempo inicial y el tope en minutos; en Personalizar, los sonidos y el estilo. Sus pruebas: “+100 likes”, “Rosa”, “Regalo de 30” y “Regalo de 1.000”. La tarjeta Reloj muestra el tiempo base (con los “+5 min”, sin lo que sume el chat) y los botones Iniciar (Reanudar en pausa), Pausar, +5 min y Reiniciar, que se suben a Supabase al instante. La tarjeta Tiempo que suma el chat tiene los segundos por 100 likes, los segundos por moneda y las monedas de un regalo sin precio, y muestra ejemplos (“una rosa suma 0:10; un regalo de 100 monedas, 16:40”).</w:t>
       </w:r>
     </w:p>
     <w:p>
@@ -20816,11 +22121,12 @@
       <w:pPr>
         <w:pStyle w:val="Heading2"/>
       </w:pPr>
-      <w:bookmarkStart w:id="35" w:name="_Toc242787389"/>
-      <w:r>
+      <w:bookmarkStart w:id="36" w:name="_Toc242787922"/>
+      <w:r>
+        <w:lastRenderedPageBreak/>
         <w:t>8.8 Vista previa y pruebas</w:t>
       </w:r>
-      <w:bookmarkEnd w:id="35"/>
+      <w:bookmarkEnd w:id="36"/>
     </w:p>
     <w:p>
       <w:pPr>
@@ -20881,22 +22187,18 @@
         <w:spacing w:after="120"/>
       </w:pPr>
       <w:r>
-        <w:t xml:space="preserve">Un cambio de estilo se le pasa a la vista previa por mensaje ({ tipo: "tema" }) sin recargarla; el resto de la configuración la reinicia 400 ms después. La excepción son las claves de sinRecargar: la carrera y el jefe </w:t>
-      </w:r>
-      <w:r>
-        <w:lastRenderedPageBreak/>
-        <w:t>mandan el reloj y la ronda, y la batalla la ronda, con { tipo: "config" }, así Iniciar, Pausar o Reiniciar batalla no borran los puntos de prueba.</w:t>
+        <w:t>Un cambio de estilo se le pasa a la vista previa por mensaje ({ tipo: "tema" }) sin recargarla; el resto de la configuración la reinicia 400 ms después. La excepción son las claves de sinRecargar: la carrera y el jefe mandan el reloj y la ronda, la batalla la ronda y el subathon además los “+5 min”, con { tipo: "config" }, así Iniciar, Pausar o Reiniciar batalla no borran los puntos de prueba.</w:t>
       </w:r>
     </w:p>
     <w:p>
       <w:pPr>
         <w:pStyle w:val="Heading2"/>
       </w:pPr>
-      <w:bookmarkStart w:id="36" w:name="_Toc242787390"/>
+      <w:bookmarkStart w:id="37" w:name="_Toc242787923"/>
       <w:r>
         <w:t>8.9 Cambios en vivo en el panel (sincronizar.js)</w:t>
       </w:r>
-      <w:bookmarkEnd w:id="36"/>
+      <w:bookmarkEnd w:id="37"/>
     </w:p>
     <w:p>
       <w:pPr>
@@ -20960,7 +22262,7 @@
         <w:spacing w:after="60"/>
       </w:pPr>
       <w:r>
-        <w:t>Los botones del reloj de la carrera y del jefe (Iniciar, Pausar, Reiniciar) y Reiniciar batalla guardan y llaman sincronizar.subir(id) de inmediato, sin la espera de 0,6 s. La validación de la carrera solo bloquea si no hay integrantes; la de la batalla nunca bloquea.</w:t>
+        <w:t>Los botones del reloj de la carrera, del jefe y del subathon (Iniciar, Pausar, Reiniciar, +5 min) y Reiniciar batalla guardan y llaman sincronizar.subir(id) de inmediato, sin la espera de 0,6 s. La validación de la carrera solo bloquea si no hay integrantes; la de la batalla nunca bloquea.</w:t>
       </w:r>
     </w:p>
     <w:p>
@@ -20981,22 +22283,22 @@
         <w:pStyle w:val="Heading1"/>
         <w:pageBreakBefore/>
       </w:pPr>
-      <w:bookmarkStart w:id="37" w:name="_Toc242787391"/>
+      <w:bookmarkStart w:id="38" w:name="_Toc242787924"/>
       <w:r>
         <w:lastRenderedPageBreak/>
         <w:t>9. Flujos completos paso a paso</w:t>
       </w:r>
-      <w:bookmarkEnd w:id="37"/>
+      <w:bookmarkEnd w:id="38"/>
     </w:p>
     <w:p>
       <w:pPr>
         <w:pStyle w:val="Heading2"/>
       </w:pPr>
-      <w:bookmarkStart w:id="38" w:name="_Toc242787392"/>
+      <w:bookmarkStart w:id="39" w:name="_Toc242787925"/>
       <w:r>
         <w:t>9.1 Configurar un widget y ponerlo en OBS</w:t>
       </w:r>
-      <w:bookmarkEnd w:id="38"/>
+      <w:bookmarkEnd w:id="39"/>
     </w:p>
     <w:p>
       <w:pPr>
@@ -21175,11 +22477,11 @@
       <w:pPr>
         <w:pStyle w:val="Heading2"/>
       </w:pPr>
-      <w:bookmarkStart w:id="39" w:name="_Toc242787393"/>
+      <w:bookmarkStart w:id="40" w:name="_Toc242787926"/>
       <w:r>
         <w:t>9.2 Llega un regalo y gira la ruleta</w:t>
       </w:r>
-      <w:bookmarkEnd w:id="39"/>
+      <w:bookmarkEnd w:id="40"/>
     </w:p>
     <w:p>
       <w:pPr>
@@ -21316,11 +22618,11 @@
       <w:pPr>
         <w:pStyle w:val="Heading2"/>
       </w:pPr>
-      <w:bookmarkStart w:id="40" w:name="_Toc242787394"/>
+      <w:bookmarkStart w:id="41" w:name="_Toc242787927"/>
       <w:r>
         <w:t>9.3 Probar sin estar en vivo</w:t>
       </w:r>
-      <w:bookmarkEnd w:id="40"/>
+      <w:bookmarkEnd w:id="41"/>
     </w:p>
     <w:p>
       <w:pPr>
@@ -21411,12 +22713,12 @@
       <w:pPr>
         <w:pStyle w:val="Heading2"/>
       </w:pPr>
-      <w:bookmarkStart w:id="41" w:name="_Toc242787395"/>
+      <w:bookmarkStart w:id="42" w:name="_Toc242787928"/>
       <w:r>
         <w:lastRenderedPageBreak/>
         <w:t>9.4 Un regalo cambia de código</w:t>
       </w:r>
-      <w:bookmarkEnd w:id="41"/>
+      <w:bookmarkEnd w:id="42"/>
     </w:p>
     <w:p>
       <w:pPr>
@@ -21780,11 +23082,11 @@
       <w:pPr>
         <w:pStyle w:val="Heading2"/>
       </w:pPr>
-      <w:bookmarkStart w:id="42" w:name="_Toc242787396"/>
+      <w:bookmarkStart w:id="43" w:name="_Toc242787929"/>
       <w:r>
         <w:t>9.5 Cambiar la configuración durante el LIVE</w:t>
       </w:r>
-      <w:bookmarkEnd w:id="42"/>
+      <w:bookmarkEnd w:id="43"/>
     </w:p>
     <w:p>
       <w:pPr>
@@ -21842,11 +23144,11 @@
       <w:pPr>
         <w:pStyle w:val="Heading2"/>
       </w:pPr>
-      <w:bookmarkStart w:id="43" w:name="_Toc242787397"/>
+      <w:bookmarkStart w:id="44" w:name="_Toc242787930"/>
       <w:r>
         <w:t>9.6 Una ronda de la carrera de regalos</w:t>
       </w:r>
-      <w:bookmarkEnd w:id="43"/>
+      <w:bookmarkEnd w:id="44"/>
     </w:p>
     <w:p>
       <w:pPr>
@@ -21956,22 +23258,22 @@
         <w:pStyle w:val="Heading1"/>
         <w:pageBreakBefore/>
       </w:pPr>
-      <w:bookmarkStart w:id="44" w:name="_Toc242787398"/>
+      <w:bookmarkStart w:id="45" w:name="_Toc242787931"/>
       <w:r>
         <w:lastRenderedPageBreak/>
         <w:t>10. Diseño visual</w:t>
       </w:r>
-      <w:bookmarkEnd w:id="44"/>
+      <w:bookmarkEnd w:id="45"/>
     </w:p>
     <w:p>
       <w:pPr>
         <w:pStyle w:val="Heading2"/>
       </w:pPr>
-      <w:bookmarkStart w:id="45" w:name="_Toc242787399"/>
+      <w:bookmarkStart w:id="46" w:name="_Toc242787932"/>
       <w:r>
         <w:t>10.1 Panel</w:t>
       </w:r>
-      <w:bookmarkEnd w:id="45"/>
+      <w:bookmarkEnd w:id="46"/>
     </w:p>
     <w:p>
       <w:pPr>
@@ -22776,11 +24078,11 @@
       <w:pPr>
         <w:pStyle w:val="Heading2"/>
       </w:pPr>
-      <w:bookmarkStart w:id="46" w:name="_Toc242787400"/>
+      <w:bookmarkStart w:id="47" w:name="_Toc242787933"/>
       <w:r>
         <w:t>10.2 Widgets</w:t>
       </w:r>
-      <w:bookmarkEnd w:id="46"/>
+      <w:bookmarkEnd w:id="47"/>
     </w:p>
     <w:p>
       <w:pPr>
@@ -23338,12 +24640,12 @@
         <w:pStyle w:val="Heading1"/>
         <w:pageBreakBefore/>
       </w:pPr>
-      <w:bookmarkStart w:id="47" w:name="_Toc242787401"/>
+      <w:bookmarkStart w:id="48" w:name="_Toc242787934"/>
       <w:r>
         <w:lastRenderedPageBreak/>
         <w:t>11. Seguridad y privacidad</w:t>
       </w:r>
-      <w:bookmarkEnd w:id="47"/>
+      <w:bookmarkEnd w:id="48"/>
     </w:p>
     <w:tbl>
       <w:tblPr>
@@ -23856,12 +25158,12 @@
         <w:pStyle w:val="Heading1"/>
         <w:pageBreakBefore/>
       </w:pPr>
-      <w:bookmarkStart w:id="48" w:name="_Toc242787402"/>
+      <w:bookmarkStart w:id="49" w:name="_Toc242787935"/>
       <w:r>
         <w:lastRenderedPageBreak/>
         <w:t>12. Limitaciones actuales</w:t>
       </w:r>
-      <w:bookmarkEnd w:id="48"/>
+      <w:bookmarkEnd w:id="49"/>
     </w:p>
     <w:tbl>
       <w:tblPr>
@@ -24599,7 +25901,7 @@
               <w:spacing w:after="20"/>
             </w:pPr>
             <w:r>
-              <w:t>Si OBS recarga la fuente, se pierde el conteo (la carrera, la batalla y el jefe sí conservan su progreso)</w:t>
+              <w:t>Si OBS recarga la fuente, se pierde el conteo (la carrera, la batalla, el jefe y el subathon sí conservan su progreso)</w:t>
             </w:r>
           </w:p>
         </w:tc>
@@ -25020,7 +26322,7 @@
               <w:spacing w:after="20"/>
             </w:pPr>
             <w:r>
-              <w:t>El reloj de la carrera y del jefe depende de la hora del computador</w:t>
+              <w:t>Los relojes de la carrera, el jefe y el subathon dependen de la hora del computador</w:t>
             </w:r>
           </w:p>
         </w:tc>
@@ -25230,6 +26532,83 @@
           </w:p>
         </w:tc>
       </w:tr>
+      <w:tr>
+        <w:tc>
+          <w:tcPr>
+            <w:tcW w:w="2808" w:type="dxa"/>
+            <w:tcBorders>
+              <w:top w:val="single" w:sz="4" w:space="0" w:color="BFBFBF"/>
+              <w:left w:val="single" w:sz="4" w:space="0" w:color="BFBFBF"/>
+              <w:bottom w:val="single" w:sz="4" w:space="0" w:color="BFBFBF"/>
+              <w:right w:val="single" w:sz="4" w:space="0" w:color="BFBFBF"/>
+            </w:tcBorders>
+            <w:tcMar>
+              <w:top w:w="60" w:type="dxa"/>
+              <w:left w:w="100" w:type="dxa"/>
+              <w:bottom w:w="60" w:type="dxa"/>
+              <w:right w:w="100" w:type="dxa"/>
+            </w:tcMar>
+          </w:tcPr>
+          <w:p>
+            <w:pPr>
+              <w:spacing w:after="20"/>
+            </w:pPr>
+            <w:r>
+              <w:t>El panel no ve el tiempo que suma el chat al subathon</w:t>
+            </w:r>
+          </w:p>
+        </w:tc>
+        <w:tc>
+          <w:tcPr>
+            <w:tcW w:w="2808" w:type="dxa"/>
+            <w:tcBorders>
+              <w:top w:val="single" w:sz="4" w:space="0" w:color="BFBFBF"/>
+              <w:left w:val="single" w:sz="4" w:space="0" w:color="BFBFBF"/>
+              <w:bottom w:val="single" w:sz="4" w:space="0" w:color="BFBFBF"/>
+              <w:right w:val="single" w:sz="4" w:space="0" w:color="BFBFBF"/>
+            </w:tcBorders>
+            <w:tcMar>
+              <w:top w:w="60" w:type="dxa"/>
+              <w:left w:w="100" w:type="dxa"/>
+              <w:bottom w:w="60" w:type="dxa"/>
+              <w:right w:w="100" w:type="dxa"/>
+            </w:tcMar>
+          </w:tcPr>
+          <w:p>
+            <w:pPr>
+              <w:spacing w:after="20"/>
+            </w:pPr>
+            <w:r>
+              <w:t>Lo suma el widget en OBS</w:t>
+            </w:r>
+          </w:p>
+        </w:tc>
+        <w:tc>
+          <w:tcPr>
+            <w:tcW w:w="3744" w:type="dxa"/>
+            <w:tcBorders>
+              <w:top w:val="single" w:sz="4" w:space="0" w:color="BFBFBF"/>
+              <w:left w:val="single" w:sz="4" w:space="0" w:color="BFBFBF"/>
+              <w:bottom w:val="single" w:sz="4" w:space="0" w:color="BFBFBF"/>
+              <w:right w:val="single" w:sz="4" w:space="0" w:color="BFBFBF"/>
+            </w:tcBorders>
+            <w:tcMar>
+              <w:top w:w="60" w:type="dxa"/>
+              <w:left w:w="100" w:type="dxa"/>
+              <w:bottom w:w="60" w:type="dxa"/>
+              <w:right w:w="100" w:type="dxa"/>
+            </w:tcMar>
+          </w:tcPr>
+          <w:p>
+            <w:pPr>
+              <w:spacing w:after="20"/>
+            </w:pPr>
+            <w:r>
+              <w:t>El reloj del panel marca igual o menos que el de OBS</w:t>
+            </w:r>
+          </w:p>
+        </w:tc>
+      </w:tr>
     </w:tbl>
     <w:p>
       <w:pPr>
@@ -25241,12 +26620,12 @@
         <w:pStyle w:val="Heading1"/>
         <w:pageBreakBefore/>
       </w:pPr>
-      <w:bookmarkStart w:id="49" w:name="_Toc242787403"/>
+      <w:bookmarkStart w:id="50" w:name="_Toc242787936"/>
       <w:r>
         <w:lastRenderedPageBreak/>
         <w:t>13. Hacia una versión final montada en un servidor</w:t>
       </w:r>
-      <w:bookmarkEnd w:id="49"/>
+      <w:bookmarkEnd w:id="50"/>
     </w:p>
     <w:p>
       <w:pPr>
@@ -25270,11 +26649,11 @@
       <w:pPr>
         <w:pStyle w:val="Heading2"/>
       </w:pPr>
-      <w:bookmarkStart w:id="50" w:name="_Toc242787404"/>
+      <w:bookmarkStart w:id="51" w:name="_Toc242787937"/>
       <w:r>
         <w:t>13.1 Objetivos de la versión final</w:t>
       </w:r>
-      <w:bookmarkEnd w:id="50"/>
+      <w:bookmarkEnd w:id="51"/>
     </w:p>
     <w:p>
       <w:pPr>
@@ -25432,11 +26811,11 @@
       <w:pPr>
         <w:pStyle w:val="Heading2"/>
       </w:pPr>
-      <w:bookmarkStart w:id="51" w:name="_Toc242787405"/>
+      <w:bookmarkStart w:id="52" w:name="_Toc242787938"/>
       <w:r>
         <w:t>13.2 Arquitectura propuesta</w:t>
       </w:r>
-      <w:bookmarkEnd w:id="51"/>
+      <w:bookmarkEnd w:id="52"/>
     </w:p>
     <w:p>
       <w:pPr>
@@ -26265,11 +27644,11 @@
       <w:pPr>
         <w:pStyle w:val="Heading2"/>
       </w:pPr>
-      <w:bookmarkStart w:id="52" w:name="_Toc242787406"/>
+      <w:bookmarkStart w:id="53" w:name="_Toc242787939"/>
       <w:r>
         <w:t>13.3 Modelo de datos sugerido</w:t>
       </w:r>
-      <w:bookmarkEnd w:id="52"/>
+      <w:bookmarkEnd w:id="53"/>
     </w:p>
     <w:tbl>
       <w:tblPr>
@@ -26976,12 +28355,12 @@
       <w:pPr>
         <w:pStyle w:val="Heading2"/>
       </w:pPr>
-      <w:bookmarkStart w:id="53" w:name="_Toc242787407"/>
+      <w:bookmarkStart w:id="54" w:name="_Toc242787940"/>
       <w:r>
         <w:lastRenderedPageBreak/>
         <w:t>13.4 Seguridad en la versión final</w:t>
       </w:r>
-      <w:bookmarkEnd w:id="53"/>
+      <w:bookmarkEnd w:id="54"/>
     </w:p>
     <w:p>
       <w:pPr>
@@ -27215,11 +28594,11 @@
       <w:pPr>
         <w:pStyle w:val="Heading2"/>
       </w:pPr>
-      <w:bookmarkStart w:id="54" w:name="_Toc242787408"/>
+      <w:bookmarkStart w:id="55" w:name="_Toc242787941"/>
       <w:r>
         <w:t>13.5 Dónde alojarlo</w:t>
       </w:r>
-      <w:bookmarkEnd w:id="54"/>
+      <w:bookmarkEnd w:id="55"/>
     </w:p>
     <w:tbl>
       <w:tblPr>
@@ -27824,11 +29203,11 @@
       <w:pPr>
         <w:pStyle w:val="Heading2"/>
       </w:pPr>
-      <w:bookmarkStart w:id="55" w:name="_Toc242787409"/>
+      <w:bookmarkStart w:id="56" w:name="_Toc242787942"/>
       <w:r>
         <w:t>13.6 Qué se reutiliza y qué cambia del código actual</w:t>
       </w:r>
-      <w:bookmarkEnd w:id="55"/>
+      <w:bookmarkEnd w:id="56"/>
     </w:p>
     <w:tbl>
       <w:tblPr>
@@ -28194,7 +29573,7 @@
               <w:spacing w:after="20"/>
             </w:pPr>
             <w:r>
-              <w:t>Widgets (ruleta.js, meta.js, alertas.js, carrera.js, batalla.js, jefe.js)</w:t>
+              <w:t>Widgets (ruleta.js, meta.js, alertas.js, carrera.js, batalla.js, jefe.js, subathon.js)</w:t>
             </w:r>
           </w:p>
         </w:tc>
@@ -28636,12 +30015,12 @@
       <w:pPr>
         <w:pStyle w:val="Heading2"/>
       </w:pPr>
-      <w:bookmarkStart w:id="56" w:name="_Toc242787410"/>
+      <w:bookmarkStart w:id="57" w:name="_Toc242787943"/>
       <w:r>
         <w:lastRenderedPageBreak/>
         <w:t>13.7 Mejoras técnicas recomendadas</w:t>
       </w:r>
-      <w:bookmarkEnd w:id="56"/>
+      <w:bookmarkEnd w:id="57"/>
     </w:p>
     <w:p>
       <w:pPr>
@@ -28827,11 +30206,11 @@
       <w:pPr>
         <w:pStyle w:val="Heading2"/>
       </w:pPr>
-      <w:bookmarkStart w:id="57" w:name="_Toc242787411"/>
+      <w:bookmarkStart w:id="58" w:name="_Toc242787944"/>
       <w:r>
         <w:t>13.8 Nuevas funciones que habilita un servidor</w:t>
       </w:r>
-      <w:bookmarkEnd w:id="57"/>
+      <w:bookmarkEnd w:id="58"/>
     </w:p>
     <w:p>
       <w:pPr>
@@ -28928,11 +30307,11 @@
       <w:pPr>
         <w:pStyle w:val="Heading2"/>
       </w:pPr>
-      <w:bookmarkStart w:id="58" w:name="_Toc242787412"/>
+      <w:bookmarkStart w:id="59" w:name="_Toc242787945"/>
       <w:r>
         <w:t>13.9 Hoja de ruta por fases</w:t>
       </w:r>
-      <w:bookmarkEnd w:id="58"/>
+      <w:bookmarkEnd w:id="59"/>
     </w:p>
     <w:tbl>
       <w:tblPr>
@@ -29412,22 +30791,22 @@
         <w:pStyle w:val="Heading1"/>
         <w:pageBreakBefore/>
       </w:pPr>
-      <w:bookmarkStart w:id="59" w:name="_Toc242787413"/>
+      <w:bookmarkStart w:id="60" w:name="_Toc242787946"/>
       <w:r>
         <w:lastRenderedPageBreak/>
         <w:t>14. Operación y mantenimiento actual</w:t>
       </w:r>
-      <w:bookmarkEnd w:id="59"/>
+      <w:bookmarkEnd w:id="60"/>
     </w:p>
     <w:p>
       <w:pPr>
         <w:pStyle w:val="Heading2"/>
       </w:pPr>
-      <w:bookmarkStart w:id="60" w:name="_Toc242787414"/>
+      <w:bookmarkStart w:id="61" w:name="_Toc242787947"/>
       <w:r>
         <w:t>14.1 Publicar un cambio</w:t>
       </w:r>
-      <w:bookmarkEnd w:id="60"/>
+      <w:bookmarkEnd w:id="61"/>
     </w:p>
     <w:p>
       <w:pPr>
@@ -29489,11 +30868,11 @@
       <w:pPr>
         <w:pStyle w:val="Heading2"/>
       </w:pPr>
-      <w:bookmarkStart w:id="61" w:name="_Toc242787415"/>
+      <w:bookmarkStart w:id="62" w:name="_Toc242787948"/>
       <w:r>
         <w:t>14.2 Agregar una función nueva</w:t>
       </w:r>
-      <w:bookmarkEnd w:id="61"/>
+      <w:bookmarkEnd w:id="62"/>
     </w:p>
     <w:p>
       <w:pPr>
@@ -29550,11 +30929,11 @@
       <w:pPr>
         <w:pStyle w:val="Heading2"/>
       </w:pPr>
-      <w:bookmarkStart w:id="62" w:name="_Toc242787416"/>
+      <w:bookmarkStart w:id="63" w:name="_Toc242787949"/>
       <w:r>
         <w:t>14.3 Probar</w:t>
       </w:r>
-      <w:bookmarkEnd w:id="62"/>
+      <w:bookmarkEnd w:id="63"/>
     </w:p>
     <w:p>
       <w:pPr>
@@ -29669,6 +31048,19 @@
         <w:spacing w:after="60"/>
       </w:pPr>
       <w:r>
+        <w:t>Subathon: iniciar el reloj y usar las pruebas y +5 min; en la vista previa el tiempo sube sin recargarse. Con la URL del widget abierta en otra pestaña, Iniciar y +5 min llegan en menos de un segundo.</w:t>
+      </w:r>
+    </w:p>
+    <w:p>
+      <w:pPr>
+        <w:pStyle w:val="ListParagraph"/>
+        <w:numPr>
+          <w:ilvl w:val="0"/>
+          <w:numId w:val="3"/>
+        </w:numPr>
+        <w:spacing w:after="60"/>
+      </w:pPr>
+      <w:r>
         <w:t>Servidor estático local: python -m http.server 8080 -d public y abrir http://localhost:8080 (con doble clic no funciona: los módulos JavaScript necesitan http://).</w:t>
       </w:r>
     </w:p>
@@ -29676,12 +31068,12 @@
       <w:pPr>
         <w:pStyle w:val="Heading2"/>
       </w:pPr>
-      <w:bookmarkStart w:id="63" w:name="_Toc242787417"/>
+      <w:bookmarkStart w:id="64" w:name="_Toc242787950"/>
       <w:r>
         <w:lastRenderedPageBreak/>
         <w:t>14.4 Solución de problemas</w:t>
       </w:r>
-      <w:bookmarkEnd w:id="63"/>
+      <w:bookmarkEnd w:id="64"/>
     </w:p>
     <w:tbl>
       <w:tblPr>
@@ -30646,6 +32038,83 @@
           </w:p>
         </w:tc>
       </w:tr>
+      <w:tr>
+        <w:tc>
+          <w:tcPr>
+            <w:tcW w:w="2808" w:type="dxa"/>
+            <w:tcBorders>
+              <w:top w:val="single" w:sz="4" w:space="0" w:color="BFBFBF"/>
+              <w:left w:val="single" w:sz="4" w:space="0" w:color="BFBFBF"/>
+              <w:bottom w:val="single" w:sz="4" w:space="0" w:color="BFBFBF"/>
+              <w:right w:val="single" w:sz="4" w:space="0" w:color="BFBFBF"/>
+            </w:tcBorders>
+            <w:tcMar>
+              <w:top w:w="60" w:type="dxa"/>
+              <w:left w:w="100" w:type="dxa"/>
+              <w:bottom w:w="60" w:type="dxa"/>
+              <w:right w:w="100" w:type="dxa"/>
+            </w:tcMar>
+          </w:tcPr>
+          <w:p>
+            <w:pPr>
+              <w:spacing w:after="20"/>
+            </w:pPr>
+            <w:r>
+              <w:t>El subathon no suma tiempo</w:t>
+            </w:r>
+          </w:p>
+        </w:tc>
+        <w:tc>
+          <w:tcPr>
+            <w:tcW w:w="2995" w:type="dxa"/>
+            <w:tcBorders>
+              <w:top w:val="single" w:sz="4" w:space="0" w:color="BFBFBF"/>
+              <w:left w:val="single" w:sz="4" w:space="0" w:color="BFBFBF"/>
+              <w:bottom w:val="single" w:sz="4" w:space="0" w:color="BFBFBF"/>
+              <w:right w:val="single" w:sz="4" w:space="0" w:color="BFBFBF"/>
+            </w:tcBorders>
+            <w:tcMar>
+              <w:top w:w="60" w:type="dxa"/>
+              <w:left w:w="100" w:type="dxa"/>
+              <w:bottom w:w="60" w:type="dxa"/>
+              <w:right w:w="100" w:type="dxa"/>
+            </w:tcMar>
+          </w:tcPr>
+          <w:p>
+            <w:pPr>
+              <w:spacing w:after="20"/>
+            </w:pPr>
+            <w:r>
+              <w:t>El reloj no está iniciado o ya terminó, está en el tope, o los segundos por like o por moneda están en 0</w:t>
+            </w:r>
+          </w:p>
+        </w:tc>
+        <w:tc>
+          <w:tcPr>
+            <w:tcW w:w="3557" w:type="dxa"/>
+            <w:tcBorders>
+              <w:top w:val="single" w:sz="4" w:space="0" w:color="BFBFBF"/>
+              <w:left w:val="single" w:sz="4" w:space="0" w:color="BFBFBF"/>
+              <w:bottom w:val="single" w:sz="4" w:space="0" w:color="BFBFBF"/>
+              <w:right w:val="single" w:sz="4" w:space="0" w:color="BFBFBF"/>
+            </w:tcBorders>
+            <w:tcMar>
+              <w:top w:w="60" w:type="dxa"/>
+              <w:left w:w="100" w:type="dxa"/>
+              <w:bottom w:w="60" w:type="dxa"/>
+              <w:right w:w="100" w:type="dxa"/>
+            </w:tcMar>
+          </w:tcPr>
+          <w:p>
+            <w:pPr>
+              <w:spacing w:after="20"/>
+            </w:pPr>
+            <w:r>
+              <w:t>Pulsar Iniciar (o +5 min si llegó a 0) y revisar la tarjeta Tiempo que suma el chat</w:t>
+            </w:r>
+          </w:p>
+        </w:tc>
+      </w:tr>
     </w:tbl>
     <w:p>
       <w:pPr>
@@ -30657,12 +32126,12 @@
         <w:pStyle w:val="Heading1"/>
         <w:pageBreakBefore/>
       </w:pPr>
-      <w:bookmarkStart w:id="64" w:name="_Toc242787418"/>
+      <w:bookmarkStart w:id="65" w:name="_Toc242787951"/>
       <w:r>
         <w:lastRenderedPageBreak/>
         <w:t>15. Anexo: historial de decisiones y correcciones</w:t>
       </w:r>
-      <w:bookmarkEnd w:id="64"/>
+      <w:bookmarkEnd w:id="65"/>
     </w:p>
     <w:tbl>
       <w:tblPr>
@@ -32856,6 +34325,237 @@
             </w:pPr>
             <w:r>
               <w:t>Varios golpes seguidos se encimaban en el mismo lugar</w:t>
+            </w:r>
+          </w:p>
+        </w:tc>
+      </w:tr>
+      <w:tr>
+        <w:tc>
+          <w:tcPr>
+            <w:tcW w:w="2246" w:type="dxa"/>
+            <w:tcBorders>
+              <w:top w:val="single" w:sz="4" w:space="0" w:color="BFBFBF"/>
+              <w:left w:val="single" w:sz="4" w:space="0" w:color="BFBFBF"/>
+              <w:bottom w:val="single" w:sz="4" w:space="0" w:color="BFBFBF"/>
+              <w:right w:val="single" w:sz="4" w:space="0" w:color="BFBFBF"/>
+            </w:tcBorders>
+            <w:tcMar>
+              <w:top w:w="60" w:type="dxa"/>
+              <w:left w:w="100" w:type="dxa"/>
+              <w:bottom w:w="60" w:type="dxa"/>
+              <w:right w:w="100" w:type="dxa"/>
+            </w:tcMar>
+          </w:tcPr>
+          <w:p>
+            <w:pPr>
+              <w:spacing w:after="20"/>
+            </w:pPr>
+            <w:r>
+              <w:t>Subathon: +5 min</w:t>
+            </w:r>
+          </w:p>
+        </w:tc>
+        <w:tc>
+          <w:tcPr>
+            <w:tcW w:w="3744" w:type="dxa"/>
+            <w:tcBorders>
+              <w:top w:val="single" w:sz="4" w:space="0" w:color="BFBFBF"/>
+              <w:left w:val="single" w:sz="4" w:space="0" w:color="BFBFBF"/>
+              <w:bottom w:val="single" w:sz="4" w:space="0" w:color="BFBFBF"/>
+              <w:right w:val="single" w:sz="4" w:space="0" w:color="BFBFBF"/>
+            </w:tcBorders>
+            <w:tcMar>
+              <w:top w:w="60" w:type="dxa"/>
+              <w:left w:w="100" w:type="dxa"/>
+              <w:bottom w:w="60" w:type="dxa"/>
+              <w:right w:w="100" w:type="dxa"/>
+            </w:tcMar>
+          </w:tcPr>
+          <w:p>
+            <w:pPr>
+              <w:spacing w:after="20"/>
+            </w:pPr>
+            <w:r>
+              <w:t>El panel manda un total acumulado (ex) y el widget aplica solo la diferencia</w:t>
+            </w:r>
+          </w:p>
+        </w:tc>
+        <w:tc>
+          <w:tcPr>
+            <w:tcW w:w="3370" w:type="dxa"/>
+            <w:tcBorders>
+              <w:top w:val="single" w:sz="4" w:space="0" w:color="BFBFBF"/>
+              <w:left w:val="single" w:sz="4" w:space="0" w:color="BFBFBF"/>
+              <w:bottom w:val="single" w:sz="4" w:space="0" w:color="BFBFBF"/>
+              <w:right w:val="single" w:sz="4" w:space="0" w:color="BFBFBF"/>
+            </w:tcBorders>
+            <w:tcMar>
+              <w:top w:w="60" w:type="dxa"/>
+              <w:left w:w="100" w:type="dxa"/>
+              <w:bottom w:w="60" w:type="dxa"/>
+              <w:right w:w="100" w:type="dxa"/>
+            </w:tcMar>
+          </w:tcPr>
+          <w:p>
+            <w:pPr>
+              <w:spacing w:after="20"/>
+            </w:pPr>
+            <w:r>
+              <w:t>Que un +5 min se aplique una sola vez y respete el tope que solo conoce el widget</w:t>
+            </w:r>
+          </w:p>
+        </w:tc>
+      </w:tr>
+      <w:tr>
+        <w:tc>
+          <w:tcPr>
+            <w:tcW w:w="2246" w:type="dxa"/>
+            <w:tcBorders>
+              <w:top w:val="single" w:sz="4" w:space="0" w:color="BFBFBF"/>
+              <w:left w:val="single" w:sz="4" w:space="0" w:color="BFBFBF"/>
+              <w:bottom w:val="single" w:sz="4" w:space="0" w:color="BFBFBF"/>
+              <w:right w:val="single" w:sz="4" w:space="0" w:color="BFBFBF"/>
+            </w:tcBorders>
+            <w:tcMar>
+              <w:top w:w="60" w:type="dxa"/>
+              <w:left w:w="100" w:type="dxa"/>
+              <w:bottom w:w="60" w:type="dxa"/>
+              <w:right w:w="100" w:type="dxa"/>
+            </w:tcMar>
+          </w:tcPr>
+          <w:p>
+            <w:pPr>
+              <w:spacing w:after="20"/>
+            </w:pPr>
+            <w:r>
+              <w:t>Subathon: reloj base negativo</w:t>
+            </w:r>
+          </w:p>
+        </w:tc>
+        <w:tc>
+          <w:tcPr>
+            <w:tcW w:w="3744" w:type="dxa"/>
+            <w:tcBorders>
+              <w:top w:val="single" w:sz="4" w:space="0" w:color="BFBFBF"/>
+              <w:left w:val="single" w:sz="4" w:space="0" w:color="BFBFBF"/>
+              <w:bottom w:val="single" w:sz="4" w:space="0" w:color="BFBFBF"/>
+              <w:right w:val="single" w:sz="4" w:space="0" w:color="BFBFBF"/>
+            </w:tcBorders>
+            <w:tcMar>
+              <w:top w:w="60" w:type="dxa"/>
+              <w:left w:w="100" w:type="dxa"/>
+              <w:bottom w:w="60" w:type="dxa"/>
+              <w:right w:w="100" w:type="dxa"/>
+            </w:tcMar>
+          </w:tcPr>
+          <w:p>
+            <w:pPr>
+              <w:spacing w:after="20"/>
+            </w:pPr>
+            <w:r>
+              <w:t>No usar leerReloj; pausar y reanudar con el reloj base aunque sea negativo</w:t>
+            </w:r>
+          </w:p>
+        </w:tc>
+        <w:tc>
+          <w:tcPr>
+            <w:tcW w:w="3370" w:type="dxa"/>
+            <w:tcBorders>
+              <w:top w:val="single" w:sz="4" w:space="0" w:color="BFBFBF"/>
+              <w:left w:val="single" w:sz="4" w:space="0" w:color="BFBFBF"/>
+              <w:bottom w:val="single" w:sz="4" w:space="0" w:color="BFBFBF"/>
+              <w:right w:val="single" w:sz="4" w:space="0" w:color="BFBFBF"/>
+            </w:tcBorders>
+            <w:tcMar>
+              <w:top w:w="60" w:type="dxa"/>
+              <w:left w:w="100" w:type="dxa"/>
+              <w:bottom w:w="60" w:type="dxa"/>
+              <w:right w:w="100" w:type="dxa"/>
+            </w:tcMar>
+          </w:tcPr>
+          <w:p>
+            <w:pPr>
+              <w:spacing w:after="20"/>
+            </w:pPr>
+            <w:r>
+              <w:t>El tiempo sumado por el público lo sostiene; leerReloj lo daba por terminado</w:t>
+            </w:r>
+          </w:p>
+        </w:tc>
+      </w:tr>
+      <w:tr>
+        <w:tc>
+          <w:tcPr>
+            <w:tcW w:w="2246" w:type="dxa"/>
+            <w:tcBorders>
+              <w:top w:val="single" w:sz="4" w:space="0" w:color="BFBFBF"/>
+              <w:left w:val="single" w:sz="4" w:space="0" w:color="BFBFBF"/>
+              <w:bottom w:val="single" w:sz="4" w:space="0" w:color="BFBFBF"/>
+              <w:right w:val="single" w:sz="4" w:space="0" w:color="BFBFBF"/>
+            </w:tcBorders>
+            <w:tcMar>
+              <w:top w:w="60" w:type="dxa"/>
+              <w:left w:w="100" w:type="dxa"/>
+              <w:bottom w:w="60" w:type="dxa"/>
+              <w:right w:w="100" w:type="dxa"/>
+            </w:tcMar>
+          </w:tcPr>
+          <w:p>
+            <w:pPr>
+              <w:spacing w:after="20"/>
+            </w:pPr>
+            <w:r>
+              <w:t>Subathon: sumas visibles</w:t>
+            </w:r>
+          </w:p>
+        </w:tc>
+        <w:tc>
+          <w:tcPr>
+            <w:tcW w:w="3744" w:type="dxa"/>
+            <w:tcBorders>
+              <w:top w:val="single" w:sz="4" w:space="0" w:color="BFBFBF"/>
+              <w:left w:val="single" w:sz="4" w:space="0" w:color="BFBFBF"/>
+              <w:bottom w:val="single" w:sz="4" w:space="0" w:color="BFBFBF"/>
+              <w:right w:val="single" w:sz="4" w:space="0" w:color="BFBFBF"/>
+            </w:tcBorders>
+            <w:tcMar>
+              <w:top w:w="60" w:type="dxa"/>
+              <w:left w:w="100" w:type="dxa"/>
+              <w:bottom w:w="60" w:type="dxa"/>
+              <w:right w:w="100" w:type="dxa"/>
+            </w:tcMar>
+          </w:tcPr>
+          <w:p>
+            <w:pPr>
+              <w:spacing w:after="20"/>
+            </w:pPr>
+            <w:r>
+              <w:t>Varias sumas seguidas se acumulan en un solo “+”</w:t>
+            </w:r>
+          </w:p>
+        </w:tc>
+        <w:tc>
+          <w:tcPr>
+            <w:tcW w:w="3370" w:type="dxa"/>
+            <w:tcBorders>
+              <w:top w:val="single" w:sz="4" w:space="0" w:color="BFBFBF"/>
+              <w:left w:val="single" w:sz="4" w:space="0" w:color="BFBFBF"/>
+              <w:bottom w:val="single" w:sz="4" w:space="0" w:color="BFBFBF"/>
+              <w:right w:val="single" w:sz="4" w:space="0" w:color="BFBFBF"/>
+            </w:tcBorders>
+            <w:tcMar>
+              <w:top w:w="60" w:type="dxa"/>
+              <w:left w:w="100" w:type="dxa"/>
+              <w:bottom w:w="60" w:type="dxa"/>
+              <w:right w:w="100" w:type="dxa"/>
+            </w:tcMar>
+          </w:tcPr>
+          <w:p>
+            <w:pPr>
+              <w:spacing w:after="20"/>
+            </w:pPr>
+            <w:r>
+              <w:t>Los “+0:10” y “+0:30” se encimaban</w:t>
             </w:r>
           </w:p>
         </w:tc>

</xml_diff>

<commit_message>
Bóveda dorada: caja sorpresa que revela un texto secreto al llegar a la meta
- boveda.html + js/widgets/boveda.js + css/widgets/boveda.css: tarjeta de
  cristal con candado SVG (colores del estilo), barra con filo de oro y
  apertura con opacidad/desenfoque que revela el secreto en letras de oro.
  El secreto no se escribe en la página hasta abrirse; progreso guardado.
- Vista Superposiciones → Juegos → Bóveda dorada: meta, secreto, título, pista
  y órdenes en vivo (Cerrar y reiniciar / Abrir ahora).
- README y documentación Word (sección 7.8 y menciones).

Co-Authored-By: Claude Opus 5.5 <noreply@anthropic.com>
</commit_message>
<xml_diff>
--- a/Documentacion-Live-Tools.docx
+++ b/Documentacion-Live-Tools.docx
@@ -42,7 +42,7 @@
         <w:jc w:val="center"/>
       </w:pPr>
       <w:r>
-        <w:t>Ruleta · Metas · Alertas · Juegos (Carrera, Batalla, Jefe, Subathon) · Actividad · Buscador de regalos</w:t>
+        <w:t>Ruleta · Metas · Alertas · Juegos (Carrera, Batalla, Jefe, Subathon, Bóveda) · Actividad · Buscador de regalos</w:t>
       </w:r>
     </w:p>
     <w:p>
@@ -159,7 +159,7 @@
           <w:r>
             <w:fldChar w:fldCharType="separate"/>
           </w:r>
-          <w:hyperlink w:anchor="_Toc242787886" w:history="1">
+          <w:hyperlink w:anchor="_Toc242788214" w:history="1">
             <w:r>
               <w:rPr>
                 <w:rStyle w:val="Hyperlink"/>
@@ -183,7 +183,7 @@
               <w:rPr>
                 <w:noProof/>
               </w:rPr>
-              <w:instrText xml:space="preserve"> PAGEREF _Toc242787886 \h </w:instrText>
+              <w:instrText xml:space="preserve"> PAGEREF _Toc242788214 \h </w:instrText>
             </w:r>
             <w:r>
               <w:rPr>
@@ -200,7 +200,7 @@
               <w:rPr>
                 <w:noProof/>
               </w:rPr>
-              <w:t>4</w:t>
+              <w:t>5</w:t>
             </w:r>
             <w:r>
               <w:rPr>
@@ -225,7 +225,7 @@
               <w14:ligatures w14:val="standardContextual"/>
             </w:rPr>
           </w:pPr>
-          <w:hyperlink w:anchor="_Toc242787887" w:history="1">
+          <w:hyperlink w:anchor="_Toc242788215" w:history="1">
             <w:r>
               <w:rPr>
                 <w:rStyle w:val="Hyperlink"/>
@@ -249,7 +249,7 @@
               <w:rPr>
                 <w:noProof/>
               </w:rPr>
-              <w:instrText xml:space="preserve"> PAGEREF _Toc242787887 \h </w:instrText>
+              <w:instrText xml:space="preserve"> PAGEREF _Toc242788215 \h </w:instrText>
             </w:r>
             <w:r>
               <w:rPr>
@@ -266,7 +266,7 @@
               <w:rPr>
                 <w:noProof/>
               </w:rPr>
-              <w:t>5</w:t>
+              <w:t>6</w:t>
             </w:r>
             <w:r>
               <w:rPr>
@@ -291,7 +291,7 @@
               <w14:ligatures w14:val="standardContextual"/>
             </w:rPr>
           </w:pPr>
-          <w:hyperlink w:anchor="_Toc242787888" w:history="1">
+          <w:hyperlink w:anchor="_Toc242788216" w:history="1">
             <w:r>
               <w:rPr>
                 <w:rStyle w:val="Hyperlink"/>
@@ -315,7 +315,7 @@
               <w:rPr>
                 <w:noProof/>
               </w:rPr>
-              <w:instrText xml:space="preserve"> PAGEREF _Toc242787888 \h </w:instrText>
+              <w:instrText xml:space="preserve"> PAGEREF _Toc242788216 \h </w:instrText>
             </w:r>
             <w:r>
               <w:rPr>
@@ -332,7 +332,7 @@
               <w:rPr>
                 <w:noProof/>
               </w:rPr>
-              <w:t>7</w:t>
+              <w:t>8</w:t>
             </w:r>
             <w:r>
               <w:rPr>
@@ -357,7 +357,7 @@
               <w14:ligatures w14:val="standardContextual"/>
             </w:rPr>
           </w:pPr>
-          <w:hyperlink w:anchor="_Toc242787889" w:history="1">
+          <w:hyperlink w:anchor="_Toc242788217" w:history="1">
             <w:r>
               <w:rPr>
                 <w:rStyle w:val="Hyperlink"/>
@@ -381,7 +381,7 @@
               <w:rPr>
                 <w:noProof/>
               </w:rPr>
-              <w:instrText xml:space="preserve"> PAGEREF _Toc242787889 \h </w:instrText>
+              <w:instrText xml:space="preserve"> PAGEREF _Toc242788217 \h </w:instrText>
             </w:r>
             <w:r>
               <w:rPr>
@@ -398,7 +398,7 @@
               <w:rPr>
                 <w:noProof/>
               </w:rPr>
-              <w:t>7</w:t>
+              <w:t>8</w:t>
             </w:r>
             <w:r>
               <w:rPr>
@@ -423,7 +423,7 @@
               <w14:ligatures w14:val="standardContextual"/>
             </w:rPr>
           </w:pPr>
-          <w:hyperlink w:anchor="_Toc242787890" w:history="1">
+          <w:hyperlink w:anchor="_Toc242788218" w:history="1">
             <w:r>
               <w:rPr>
                 <w:rStyle w:val="Hyperlink"/>
@@ -447,7 +447,7 @@
               <w:rPr>
                 <w:noProof/>
               </w:rPr>
-              <w:instrText xml:space="preserve"> PAGEREF _Toc242787890 \h </w:instrText>
+              <w:instrText xml:space="preserve"> PAGEREF _Toc242788218 \h </w:instrText>
             </w:r>
             <w:r>
               <w:rPr>
@@ -464,7 +464,7 @@
               <w:rPr>
                 <w:noProof/>
               </w:rPr>
-              <w:t>7</w:t>
+              <w:t>8</w:t>
             </w:r>
             <w:r>
               <w:rPr>
@@ -489,7 +489,7 @@
               <w14:ligatures w14:val="standardContextual"/>
             </w:rPr>
           </w:pPr>
-          <w:hyperlink w:anchor="_Toc242787891" w:history="1">
+          <w:hyperlink w:anchor="_Toc242788219" w:history="1">
             <w:r>
               <w:rPr>
                 <w:rStyle w:val="Hyperlink"/>
@@ -513,7 +513,7 @@
               <w:rPr>
                 <w:noProof/>
               </w:rPr>
-              <w:instrText xml:space="preserve"> PAGEREF _Toc242787891 \h </w:instrText>
+              <w:instrText xml:space="preserve"> PAGEREF _Toc242788219 \h </w:instrText>
             </w:r>
             <w:r>
               <w:rPr>
@@ -530,7 +530,7 @@
               <w:rPr>
                 <w:noProof/>
               </w:rPr>
-              <w:t>9</w:t>
+              <w:t>10</w:t>
             </w:r>
             <w:r>
               <w:rPr>
@@ -555,7 +555,7 @@
               <w14:ligatures w14:val="standardContextual"/>
             </w:rPr>
           </w:pPr>
-          <w:hyperlink w:anchor="_Toc242787892" w:history="1">
+          <w:hyperlink w:anchor="_Toc242788220" w:history="1">
             <w:r>
               <w:rPr>
                 <w:rStyle w:val="Hyperlink"/>
@@ -579,7 +579,7 @@
               <w:rPr>
                 <w:noProof/>
               </w:rPr>
-              <w:instrText xml:space="preserve"> PAGEREF _Toc242787892 \h </w:instrText>
+              <w:instrText xml:space="preserve"> PAGEREF _Toc242788220 \h </w:instrText>
             </w:r>
             <w:r>
               <w:rPr>
@@ -596,7 +596,7 @@
               <w:rPr>
                 <w:noProof/>
               </w:rPr>
-              <w:t>9</w:t>
+              <w:t>10</w:t>
             </w:r>
             <w:r>
               <w:rPr>
@@ -621,7 +621,7 @@
               <w14:ligatures w14:val="standardContextual"/>
             </w:rPr>
           </w:pPr>
-          <w:hyperlink w:anchor="_Toc242787893" w:history="1">
+          <w:hyperlink w:anchor="_Toc242788221" w:history="1">
             <w:r>
               <w:rPr>
                 <w:rStyle w:val="Hyperlink"/>
@@ -645,7 +645,7 @@
               <w:rPr>
                 <w:noProof/>
               </w:rPr>
-              <w:instrText xml:space="preserve"> PAGEREF _Toc242787893 \h </w:instrText>
+              <w:instrText xml:space="preserve"> PAGEREF _Toc242788221 \h </w:instrText>
             </w:r>
             <w:r>
               <w:rPr>
@@ -662,7 +662,7 @@
               <w:rPr>
                 <w:noProof/>
               </w:rPr>
-              <w:t>9</w:t>
+              <w:t>10</w:t>
             </w:r>
             <w:r>
               <w:rPr>
@@ -687,7 +687,7 @@
               <w14:ligatures w14:val="standardContextual"/>
             </w:rPr>
           </w:pPr>
-          <w:hyperlink w:anchor="_Toc242787894" w:history="1">
+          <w:hyperlink w:anchor="_Toc242788222" w:history="1">
             <w:r>
               <w:rPr>
                 <w:rStyle w:val="Hyperlink"/>
@@ -711,7 +711,7 @@
               <w:rPr>
                 <w:noProof/>
               </w:rPr>
-              <w:instrText xml:space="preserve"> PAGEREF _Toc242787894 \h </w:instrText>
+              <w:instrText xml:space="preserve"> PAGEREF _Toc242788222 \h </w:instrText>
             </w:r>
             <w:r>
               <w:rPr>
@@ -728,7 +728,7 @@
               <w:rPr>
                 <w:noProof/>
               </w:rPr>
-              <w:t>11</w:t>
+              <w:t>12</w:t>
             </w:r>
             <w:r>
               <w:rPr>
@@ -753,7 +753,7 @@
               <w14:ligatures w14:val="standardContextual"/>
             </w:rPr>
           </w:pPr>
-          <w:hyperlink w:anchor="_Toc242787895" w:history="1">
+          <w:hyperlink w:anchor="_Toc242788223" w:history="1">
             <w:r>
               <w:rPr>
                 <w:rStyle w:val="Hyperlink"/>
@@ -777,7 +777,7 @@
               <w:rPr>
                 <w:noProof/>
               </w:rPr>
-              <w:instrText xml:space="preserve"> PAGEREF _Toc242787895 \h </w:instrText>
+              <w:instrText xml:space="preserve"> PAGEREF _Toc242788223 \h </w:instrText>
             </w:r>
             <w:r>
               <w:rPr>
@@ -794,7 +794,7 @@
               <w:rPr>
                 <w:noProof/>
               </w:rPr>
-              <w:t>11</w:t>
+              <w:t>12</w:t>
             </w:r>
             <w:r>
               <w:rPr>
@@ -819,7 +819,7 @@
               <w14:ligatures w14:val="standardContextual"/>
             </w:rPr>
           </w:pPr>
-          <w:hyperlink w:anchor="_Toc242787896" w:history="1">
+          <w:hyperlink w:anchor="_Toc242788224" w:history="1">
             <w:r>
               <w:rPr>
                 <w:rStyle w:val="Hyperlink"/>
@@ -843,7 +843,7 @@
               <w:rPr>
                 <w:noProof/>
               </w:rPr>
-              <w:instrText xml:space="preserve"> PAGEREF _Toc242787896 \h </w:instrText>
+              <w:instrText xml:space="preserve"> PAGEREF _Toc242788224 \h </w:instrText>
             </w:r>
             <w:r>
               <w:rPr>
@@ -860,7 +860,7 @@
               <w:rPr>
                 <w:noProof/>
               </w:rPr>
-              <w:t>12</w:t>
+              <w:t>13</w:t>
             </w:r>
             <w:r>
               <w:rPr>
@@ -885,7 +885,7 @@
               <w14:ligatures w14:val="standardContextual"/>
             </w:rPr>
           </w:pPr>
-          <w:hyperlink w:anchor="_Toc242787897" w:history="1">
+          <w:hyperlink w:anchor="_Toc242788225" w:history="1">
             <w:r>
               <w:rPr>
                 <w:rStyle w:val="Hyperlink"/>
@@ -909,7 +909,7 @@
               <w:rPr>
                 <w:noProof/>
               </w:rPr>
-              <w:instrText xml:space="preserve"> PAGEREF _Toc242787897 \h </w:instrText>
+              <w:instrText xml:space="preserve"> PAGEREF _Toc242788225 \h </w:instrText>
             </w:r>
             <w:r>
               <w:rPr>
@@ -926,7 +926,7 @@
               <w:rPr>
                 <w:noProof/>
               </w:rPr>
-              <w:t>14</w:t>
+              <w:t>15</w:t>
             </w:r>
             <w:r>
               <w:rPr>
@@ -951,7 +951,7 @@
               <w14:ligatures w14:val="standardContextual"/>
             </w:rPr>
           </w:pPr>
-          <w:hyperlink w:anchor="_Toc242787898" w:history="1">
+          <w:hyperlink w:anchor="_Toc242788226" w:history="1">
             <w:r>
               <w:rPr>
                 <w:rStyle w:val="Hyperlink"/>
@@ -975,7 +975,7 @@
               <w:rPr>
                 <w:noProof/>
               </w:rPr>
-              <w:instrText xml:space="preserve"> PAGEREF _Toc242787898 \h </w:instrText>
+              <w:instrText xml:space="preserve"> PAGEREF _Toc242788226 \h </w:instrText>
             </w:r>
             <w:r>
               <w:rPr>
@@ -992,7 +992,7 @@
               <w:rPr>
                 <w:noProof/>
               </w:rPr>
-              <w:t>15</w:t>
+              <w:t>16</w:t>
             </w:r>
             <w:r>
               <w:rPr>
@@ -1017,7 +1017,7 @@
               <w14:ligatures w14:val="standardContextual"/>
             </w:rPr>
           </w:pPr>
-          <w:hyperlink w:anchor="_Toc242787899" w:history="1">
+          <w:hyperlink w:anchor="_Toc242788227" w:history="1">
             <w:r>
               <w:rPr>
                 <w:rStyle w:val="Hyperlink"/>
@@ -1041,7 +1041,7 @@
               <w:rPr>
                 <w:noProof/>
               </w:rPr>
-              <w:instrText xml:space="preserve"> PAGEREF _Toc242787899 \h </w:instrText>
+              <w:instrText xml:space="preserve"> PAGEREF _Toc242788227 \h </w:instrText>
             </w:r>
             <w:r>
               <w:rPr>
@@ -1058,7 +1058,7 @@
               <w:rPr>
                 <w:noProof/>
               </w:rPr>
-              <w:t>15</w:t>
+              <w:t>16</w:t>
             </w:r>
             <w:r>
               <w:rPr>
@@ -1083,7 +1083,7 @@
               <w14:ligatures w14:val="standardContextual"/>
             </w:rPr>
           </w:pPr>
-          <w:hyperlink w:anchor="_Toc242787900" w:history="1">
+          <w:hyperlink w:anchor="_Toc242788228" w:history="1">
             <w:r>
               <w:rPr>
                 <w:rStyle w:val="Hyperlink"/>
@@ -1107,7 +1107,7 @@
               <w:rPr>
                 <w:noProof/>
               </w:rPr>
-              <w:instrText xml:space="preserve"> PAGEREF _Toc242787900 \h </w:instrText>
+              <w:instrText xml:space="preserve"> PAGEREF _Toc242788228 \h </w:instrText>
             </w:r>
             <w:r>
               <w:rPr>
@@ -1124,7 +1124,7 @@
               <w:rPr>
                 <w:noProof/>
               </w:rPr>
-              <w:t>15</w:t>
+              <w:t>16</w:t>
             </w:r>
             <w:r>
               <w:rPr>
@@ -1149,7 +1149,7 @@
               <w14:ligatures w14:val="standardContextual"/>
             </w:rPr>
           </w:pPr>
-          <w:hyperlink w:anchor="_Toc242787901" w:history="1">
+          <w:hyperlink w:anchor="_Toc242788229" w:history="1">
             <w:r>
               <w:rPr>
                 <w:rStyle w:val="Hyperlink"/>
@@ -1173,7 +1173,7 @@
               <w:rPr>
                 <w:noProof/>
               </w:rPr>
-              <w:instrText xml:space="preserve"> PAGEREF _Toc242787901 \h </w:instrText>
+              <w:instrText xml:space="preserve"> PAGEREF _Toc242788229 \h </w:instrText>
             </w:r>
             <w:r>
               <w:rPr>
@@ -1190,7 +1190,7 @@
               <w:rPr>
                 <w:noProof/>
               </w:rPr>
-              <w:t>16</w:t>
+              <w:t>17</w:t>
             </w:r>
             <w:r>
               <w:rPr>
@@ -1215,7 +1215,7 @@
               <w14:ligatures w14:val="standardContextual"/>
             </w:rPr>
           </w:pPr>
-          <w:hyperlink w:anchor="_Toc242787902" w:history="1">
+          <w:hyperlink w:anchor="_Toc242788230" w:history="1">
             <w:r>
               <w:rPr>
                 <w:rStyle w:val="Hyperlink"/>
@@ -1239,7 +1239,7 @@
               <w:rPr>
                 <w:noProof/>
               </w:rPr>
-              <w:instrText xml:space="preserve"> PAGEREF _Toc242787902 \h </w:instrText>
+              <w:instrText xml:space="preserve"> PAGEREF _Toc242788230 \h </w:instrText>
             </w:r>
             <w:r>
               <w:rPr>
@@ -1256,7 +1256,7 @@
               <w:rPr>
                 <w:noProof/>
               </w:rPr>
-              <w:t>17</w:t>
+              <w:t>18</w:t>
             </w:r>
             <w:r>
               <w:rPr>
@@ -1281,7 +1281,7 @@
               <w14:ligatures w14:val="standardContextual"/>
             </w:rPr>
           </w:pPr>
-          <w:hyperlink w:anchor="_Toc242787903" w:history="1">
+          <w:hyperlink w:anchor="_Toc242788231" w:history="1">
             <w:r>
               <w:rPr>
                 <w:rStyle w:val="Hyperlink"/>
@@ -1305,7 +1305,7 @@
               <w:rPr>
                 <w:noProof/>
               </w:rPr>
-              <w:instrText xml:space="preserve"> PAGEREF _Toc242787903 \h </w:instrText>
+              <w:instrText xml:space="preserve"> PAGEREF _Toc242788231 \h </w:instrText>
             </w:r>
             <w:r>
               <w:rPr>
@@ -1322,7 +1322,7 @@
               <w:rPr>
                 <w:noProof/>
               </w:rPr>
-              <w:t>17</w:t>
+              <w:t>18</w:t>
             </w:r>
             <w:r>
               <w:rPr>
@@ -1347,7 +1347,7 @@
               <w14:ligatures w14:val="standardContextual"/>
             </w:rPr>
           </w:pPr>
-          <w:hyperlink w:anchor="_Toc242787904" w:history="1">
+          <w:hyperlink w:anchor="_Toc242788232" w:history="1">
             <w:r>
               <w:rPr>
                 <w:rStyle w:val="Hyperlink"/>
@@ -1371,7 +1371,7 @@
               <w:rPr>
                 <w:noProof/>
               </w:rPr>
-              <w:instrText xml:space="preserve"> PAGEREF _Toc242787904 \h </w:instrText>
+              <w:instrText xml:space="preserve"> PAGEREF _Toc242788232 \h </w:instrText>
             </w:r>
             <w:r>
               <w:rPr>
@@ -1388,7 +1388,7 @@
               <w:rPr>
                 <w:noProof/>
               </w:rPr>
-              <w:t>17</w:t>
+              <w:t>18</w:t>
             </w:r>
             <w:r>
               <w:rPr>
@@ -1413,7 +1413,7 @@
               <w14:ligatures w14:val="standardContextual"/>
             </w:rPr>
           </w:pPr>
-          <w:hyperlink w:anchor="_Toc242787905" w:history="1">
+          <w:hyperlink w:anchor="_Toc242788233" w:history="1">
             <w:r>
               <w:rPr>
                 <w:rStyle w:val="Hyperlink"/>
@@ -1437,7 +1437,7 @@
               <w:rPr>
                 <w:noProof/>
               </w:rPr>
-              <w:instrText xml:space="preserve"> PAGEREF _Toc242787905 \h </w:instrText>
+              <w:instrText xml:space="preserve"> PAGEREF _Toc242788233 \h </w:instrText>
             </w:r>
             <w:r>
               <w:rPr>
@@ -1454,7 +1454,7 @@
               <w:rPr>
                 <w:noProof/>
               </w:rPr>
-              <w:t>18</w:t>
+              <w:t>19</w:t>
             </w:r>
             <w:r>
               <w:rPr>
@@ -1479,7 +1479,7 @@
               <w14:ligatures w14:val="standardContextual"/>
             </w:rPr>
           </w:pPr>
-          <w:hyperlink w:anchor="_Toc242787906" w:history="1">
+          <w:hyperlink w:anchor="_Toc242788234" w:history="1">
             <w:r>
               <w:rPr>
                 <w:rStyle w:val="Hyperlink"/>
@@ -1503,7 +1503,7 @@
               <w:rPr>
                 <w:noProof/>
               </w:rPr>
-              <w:instrText xml:space="preserve"> PAGEREF _Toc242787906 \h </w:instrText>
+              <w:instrText xml:space="preserve"> PAGEREF _Toc242788234 \h </w:instrText>
             </w:r>
             <w:r>
               <w:rPr>
@@ -1520,7 +1520,7 @@
               <w:rPr>
                 <w:noProof/>
               </w:rPr>
-              <w:t>19</w:t>
+              <w:t>20</w:t>
             </w:r>
             <w:r>
               <w:rPr>
@@ -1545,7 +1545,7 @@
               <w14:ligatures w14:val="standardContextual"/>
             </w:rPr>
           </w:pPr>
-          <w:hyperlink w:anchor="_Toc242787907" w:history="1">
+          <w:hyperlink w:anchor="_Toc242788235" w:history="1">
             <w:r>
               <w:rPr>
                 <w:rStyle w:val="Hyperlink"/>
@@ -1569,7 +1569,7 @@
               <w:rPr>
                 <w:noProof/>
               </w:rPr>
-              <w:instrText xml:space="preserve"> PAGEREF _Toc242787907 \h </w:instrText>
+              <w:instrText xml:space="preserve"> PAGEREF _Toc242788235 \h </w:instrText>
             </w:r>
             <w:r>
               <w:rPr>
@@ -1586,7 +1586,7 @@
               <w:rPr>
                 <w:noProof/>
               </w:rPr>
-              <w:t>19</w:t>
+              <w:t>20</w:t>
             </w:r>
             <w:r>
               <w:rPr>
@@ -1611,7 +1611,7 @@
               <w14:ligatures w14:val="standardContextual"/>
             </w:rPr>
           </w:pPr>
-          <w:hyperlink w:anchor="_Toc242787908" w:history="1">
+          <w:hyperlink w:anchor="_Toc242788236" w:history="1">
             <w:r>
               <w:rPr>
                 <w:rStyle w:val="Hyperlink"/>
@@ -1635,7 +1635,7 @@
               <w:rPr>
                 <w:noProof/>
               </w:rPr>
-              <w:instrText xml:space="preserve"> PAGEREF _Toc242787908 \h </w:instrText>
+              <w:instrText xml:space="preserve"> PAGEREF _Toc242788236 \h </w:instrText>
             </w:r>
             <w:r>
               <w:rPr>
@@ -1652,7 +1652,7 @@
               <w:rPr>
                 <w:noProof/>
               </w:rPr>
-              <w:t>20</w:t>
+              <w:t>21</w:t>
             </w:r>
             <w:r>
               <w:rPr>
@@ -1677,7 +1677,7 @@
               <w14:ligatures w14:val="standardContextual"/>
             </w:rPr>
           </w:pPr>
-          <w:hyperlink w:anchor="_Toc242787909" w:history="1">
+          <w:hyperlink w:anchor="_Toc242788237" w:history="1">
             <w:r>
               <w:rPr>
                 <w:rStyle w:val="Hyperlink"/>
@@ -1701,7 +1701,7 @@
               <w:rPr>
                 <w:noProof/>
               </w:rPr>
-              <w:instrText xml:space="preserve"> PAGEREF _Toc242787909 \h </w:instrText>
+              <w:instrText xml:space="preserve"> PAGEREF _Toc242788237 \h </w:instrText>
             </w:r>
             <w:r>
               <w:rPr>
@@ -1718,7 +1718,7 @@
               <w:rPr>
                 <w:noProof/>
               </w:rPr>
-              <w:t>20</w:t>
+              <w:t>21</w:t>
             </w:r>
             <w:r>
               <w:rPr>
@@ -1743,7 +1743,7 @@
               <w14:ligatures w14:val="standardContextual"/>
             </w:rPr>
           </w:pPr>
-          <w:hyperlink w:anchor="_Toc242787910" w:history="1">
+          <w:hyperlink w:anchor="_Toc242788238" w:history="1">
             <w:r>
               <w:rPr>
                 <w:rStyle w:val="Hyperlink"/>
@@ -1767,7 +1767,7 @@
               <w:rPr>
                 <w:noProof/>
               </w:rPr>
-              <w:instrText xml:space="preserve"> PAGEREF _Toc242787910 \h </w:instrText>
+              <w:instrText xml:space="preserve"> PAGEREF _Toc242788238 \h </w:instrText>
             </w:r>
             <w:r>
               <w:rPr>
@@ -1784,7 +1784,7 @@
               <w:rPr>
                 <w:noProof/>
               </w:rPr>
-              <w:t>21</w:t>
+              <w:t>22</w:t>
             </w:r>
             <w:r>
               <w:rPr>
@@ -1809,7 +1809,7 @@
               <w14:ligatures w14:val="standardContextual"/>
             </w:rPr>
           </w:pPr>
-          <w:hyperlink w:anchor="_Toc242787911" w:history="1">
+          <w:hyperlink w:anchor="_Toc242788239" w:history="1">
             <w:r>
               <w:rPr>
                 <w:rStyle w:val="Hyperlink"/>
@@ -1833,7 +1833,7 @@
               <w:rPr>
                 <w:noProof/>
               </w:rPr>
-              <w:instrText xml:space="preserve"> PAGEREF _Toc242787911 \h </w:instrText>
+              <w:instrText xml:space="preserve"> PAGEREF _Toc242788239 \h </w:instrText>
             </w:r>
             <w:r>
               <w:rPr>
@@ -1850,7 +1850,7 @@
               <w:rPr>
                 <w:noProof/>
               </w:rPr>
-              <w:t>22</w:t>
+              <w:t>23</w:t>
             </w:r>
             <w:r>
               <w:rPr>
@@ -1875,7 +1875,7 @@
               <w14:ligatures w14:val="standardContextual"/>
             </w:rPr>
           </w:pPr>
-          <w:hyperlink w:anchor="_Toc242787912" w:history="1">
+          <w:hyperlink w:anchor="_Toc242788240" w:history="1">
             <w:r>
               <w:rPr>
                 <w:rStyle w:val="Hyperlink"/>
@@ -1899,7 +1899,7 @@
               <w:rPr>
                 <w:noProof/>
               </w:rPr>
-              <w:instrText xml:space="preserve"> PAGEREF _Toc242787912 \h </w:instrText>
+              <w:instrText xml:space="preserve"> PAGEREF _Toc242788240 \h </w:instrText>
             </w:r>
             <w:r>
               <w:rPr>
@@ -1916,7 +1916,7 @@
               <w:rPr>
                 <w:noProof/>
               </w:rPr>
-              <w:t>23</w:t>
+              <w:t>24</w:t>
             </w:r>
             <w:r>
               <w:rPr>
@@ -1941,7 +1941,7 @@
               <w14:ligatures w14:val="standardContextual"/>
             </w:rPr>
           </w:pPr>
-          <w:hyperlink w:anchor="_Toc242787913" w:history="1">
+          <w:hyperlink w:anchor="_Toc242788241" w:history="1">
             <w:r>
               <w:rPr>
                 <w:rStyle w:val="Hyperlink"/>
@@ -1965,7 +1965,7 @@
               <w:rPr>
                 <w:noProof/>
               </w:rPr>
-              <w:instrText xml:space="preserve"> PAGEREF _Toc242787913 \h </w:instrText>
+              <w:instrText xml:space="preserve"> PAGEREF _Toc242788241 \h </w:instrText>
             </w:r>
             <w:r>
               <w:rPr>
@@ -1982,7 +1982,73 @@
               <w:rPr>
                 <w:noProof/>
               </w:rPr>
-              <w:t>25</w:t>
+              <w:t>26</w:t>
+            </w:r>
+            <w:r>
+              <w:rPr>
+                <w:noProof/>
+              </w:rPr>
+              <w:fldChar w:fldCharType="end"/>
+            </w:r>
+          </w:hyperlink>
+        </w:p>
+        <w:p>
+          <w:pPr>
+            <w:pStyle w:val="TOC2"/>
+            <w:tabs>
+              <w:tab w:val="right" w:leader="dot" w:pos="9350"/>
+            </w:tabs>
+            <w:rPr>
+              <w:rFonts w:asciiTheme="minorHAnsi" w:eastAsiaTheme="minorEastAsia" w:hAnsiTheme="minorHAnsi" w:cstheme="minorBidi"/>
+              <w:noProof/>
+              <w:kern w:val="2"/>
+              <w:sz w:val="24"/>
+              <w:szCs w:val="24"/>
+              <w14:ligatures w14:val="standardContextual"/>
+            </w:rPr>
+          </w:pPr>
+          <w:hyperlink w:anchor="_Toc242788242" w:history="1">
+            <w:r>
+              <w:rPr>
+                <w:rStyle w:val="Hyperlink"/>
+                <w:noProof/>
+              </w:rPr>
+              <w:t>7.8 Bóveda dorada (boveda.html)</w:t>
+            </w:r>
+            <w:r>
+              <w:rPr>
+                <w:noProof/>
+              </w:rPr>
+              <w:tab/>
+            </w:r>
+            <w:r>
+              <w:rPr>
+                <w:noProof/>
+              </w:rPr>
+              <w:fldChar w:fldCharType="begin"/>
+            </w:r>
+            <w:r>
+              <w:rPr>
+                <w:noProof/>
+              </w:rPr>
+              <w:instrText xml:space="preserve"> PAGEREF _Toc242788242 \h </w:instrText>
+            </w:r>
+            <w:r>
+              <w:rPr>
+                <w:noProof/>
+              </w:rPr>
+            </w:r>
+            <w:r>
+              <w:rPr>
+                <w:noProof/>
+              </w:rPr>
+              <w:fldChar w:fldCharType="separate"/>
+            </w:r>
+            <w:r>
+              <w:rPr>
+                <w:noProof/>
+              </w:rPr>
+              <w:t>27</w:t>
             </w:r>
             <w:r>
               <w:rPr>
@@ -2007,7 +2073,7 @@
               <w14:ligatures w14:val="standardContextual"/>
             </w:rPr>
           </w:pPr>
-          <w:hyperlink w:anchor="_Toc242787914" w:history="1">
+          <w:hyperlink w:anchor="_Toc242788243" w:history="1">
             <w:r>
               <w:rPr>
                 <w:rStyle w:val="Hyperlink"/>
@@ -2031,7 +2097,7 @@
               <w:rPr>
                 <w:noProof/>
               </w:rPr>
-              <w:instrText xml:space="preserve"> PAGEREF _Toc242787914 \h </w:instrText>
+              <w:instrText xml:space="preserve"> PAGEREF _Toc242788243 \h </w:instrText>
             </w:r>
             <w:r>
               <w:rPr>
@@ -2048,7 +2114,7 @@
               <w:rPr>
                 <w:noProof/>
               </w:rPr>
-              <w:t>27</w:t>
+              <w:t>29</w:t>
             </w:r>
             <w:r>
               <w:rPr>
@@ -2073,7 +2139,7 @@
               <w14:ligatures w14:val="standardContextual"/>
             </w:rPr>
           </w:pPr>
-          <w:hyperlink w:anchor="_Toc242787915" w:history="1">
+          <w:hyperlink w:anchor="_Toc242788244" w:history="1">
             <w:r>
               <w:rPr>
                 <w:rStyle w:val="Hyperlink"/>
@@ -2097,7 +2163,7 @@
               <w:rPr>
                 <w:noProof/>
               </w:rPr>
-              <w:instrText xml:space="preserve"> PAGEREF _Toc242787915 \h </w:instrText>
+              <w:instrText xml:space="preserve"> PAGEREF _Toc242788244 \h </w:instrText>
             </w:r>
             <w:r>
               <w:rPr>
@@ -2114,7 +2180,7 @@
               <w:rPr>
                 <w:noProof/>
               </w:rPr>
-              <w:t>27</w:t>
+              <w:t>29</w:t>
             </w:r>
             <w:r>
               <w:rPr>
@@ -2139,7 +2205,7 @@
               <w14:ligatures w14:val="standardContextual"/>
             </w:rPr>
           </w:pPr>
-          <w:hyperlink w:anchor="_Toc242787916" w:history="1">
+          <w:hyperlink w:anchor="_Toc242788245" w:history="1">
             <w:r>
               <w:rPr>
                 <w:rStyle w:val="Hyperlink"/>
@@ -2163,7 +2229,7 @@
               <w:rPr>
                 <w:noProof/>
               </w:rPr>
-              <w:instrText xml:space="preserve"> PAGEREF _Toc242787916 \h </w:instrText>
+              <w:instrText xml:space="preserve"> PAGEREF _Toc242788245 \h </w:instrText>
             </w:r>
             <w:r>
               <w:rPr>
@@ -2180,7 +2246,7 @@
               <w:rPr>
                 <w:noProof/>
               </w:rPr>
-              <w:t>27</w:t>
+              <w:t>29</w:t>
             </w:r>
             <w:r>
               <w:rPr>
@@ -2205,7 +2271,7 @@
               <w14:ligatures w14:val="standardContextual"/>
             </w:rPr>
           </w:pPr>
-          <w:hyperlink w:anchor="_Toc242787917" w:history="1">
+          <w:hyperlink w:anchor="_Toc242788246" w:history="1">
             <w:r>
               <w:rPr>
                 <w:rStyle w:val="Hyperlink"/>
@@ -2229,7 +2295,7 @@
               <w:rPr>
                 <w:noProof/>
               </w:rPr>
-              <w:instrText xml:space="preserve"> PAGEREF _Toc242787917 \h </w:instrText>
+              <w:instrText xml:space="preserve"> PAGEREF _Toc242788246 \h </w:instrText>
             </w:r>
             <w:r>
               <w:rPr>
@@ -2246,7 +2312,7 @@
               <w:rPr>
                 <w:noProof/>
               </w:rPr>
-              <w:t>27</w:t>
+              <w:t>29</w:t>
             </w:r>
             <w:r>
               <w:rPr>
@@ -2271,7 +2337,7 @@
               <w14:ligatures w14:val="standardContextual"/>
             </w:rPr>
           </w:pPr>
-          <w:hyperlink w:anchor="_Toc242787918" w:history="1">
+          <w:hyperlink w:anchor="_Toc242788247" w:history="1">
             <w:r>
               <w:rPr>
                 <w:rStyle w:val="Hyperlink"/>
@@ -2295,7 +2361,7 @@
               <w:rPr>
                 <w:noProof/>
               </w:rPr>
-              <w:instrText xml:space="preserve"> PAGEREF _Toc242787918 \h </w:instrText>
+              <w:instrText xml:space="preserve"> PAGEREF _Toc242788247 \h </w:instrText>
             </w:r>
             <w:r>
               <w:rPr>
@@ -2312,7 +2378,7 @@
               <w:rPr>
                 <w:noProof/>
               </w:rPr>
-              <w:t>28</w:t>
+              <w:t>30</w:t>
             </w:r>
             <w:r>
               <w:rPr>
@@ -2337,7 +2403,7 @@
               <w14:ligatures w14:val="standardContextual"/>
             </w:rPr>
           </w:pPr>
-          <w:hyperlink w:anchor="_Toc242787919" w:history="1">
+          <w:hyperlink w:anchor="_Toc242788248" w:history="1">
             <w:r>
               <w:rPr>
                 <w:rStyle w:val="Hyperlink"/>
@@ -2361,7 +2427,7 @@
               <w:rPr>
                 <w:noProof/>
               </w:rPr>
-              <w:instrText xml:space="preserve"> PAGEREF _Toc242787919 \h </w:instrText>
+              <w:instrText xml:space="preserve"> PAGEREF _Toc242788248 \h </w:instrText>
             </w:r>
             <w:r>
               <w:rPr>
@@ -2378,7 +2444,7 @@
               <w:rPr>
                 <w:noProof/>
               </w:rPr>
-              <w:t>28</w:t>
+              <w:t>30</w:t>
             </w:r>
             <w:r>
               <w:rPr>
@@ -2403,7 +2469,7 @@
               <w14:ligatures w14:val="standardContextual"/>
             </w:rPr>
           </w:pPr>
-          <w:hyperlink w:anchor="_Toc242787920" w:history="1">
+          <w:hyperlink w:anchor="_Toc242788249" w:history="1">
             <w:r>
               <w:rPr>
                 <w:rStyle w:val="Hyperlink"/>
@@ -2427,7 +2493,7 @@
               <w:rPr>
                 <w:noProof/>
               </w:rPr>
-              <w:instrText xml:space="preserve"> PAGEREF _Toc242787920 \h </w:instrText>
+              <w:instrText xml:space="preserve"> PAGEREF _Toc242788249 \h </w:instrText>
             </w:r>
             <w:r>
               <w:rPr>
@@ -2444,7 +2510,7 @@
               <w:rPr>
                 <w:noProof/>
               </w:rPr>
-              <w:t>29</w:t>
+              <w:t>31</w:t>
             </w:r>
             <w:r>
               <w:rPr>
@@ -2469,7 +2535,7 @@
               <w14:ligatures w14:val="standardContextual"/>
             </w:rPr>
           </w:pPr>
-          <w:hyperlink w:anchor="_Toc242787921" w:history="1">
+          <w:hyperlink w:anchor="_Toc242788250" w:history="1">
             <w:r>
               <w:rPr>
                 <w:rStyle w:val="Hyperlink"/>
@@ -2493,7 +2559,7 @@
               <w:rPr>
                 <w:noProof/>
               </w:rPr>
-              <w:instrText xml:space="preserve"> PAGEREF _Toc242787921 \h </w:instrText>
+              <w:instrText xml:space="preserve"> PAGEREF _Toc242788250 \h </w:instrText>
             </w:r>
             <w:r>
               <w:rPr>
@@ -2510,7 +2576,7 @@
               <w:rPr>
                 <w:noProof/>
               </w:rPr>
-              <w:t>29</w:t>
+              <w:t>31</w:t>
             </w:r>
             <w:r>
               <w:rPr>
@@ -2535,7 +2601,7 @@
               <w14:ligatures w14:val="standardContextual"/>
             </w:rPr>
           </w:pPr>
-          <w:hyperlink w:anchor="_Toc242787922" w:history="1">
+          <w:hyperlink w:anchor="_Toc242788251" w:history="1">
             <w:r>
               <w:rPr>
                 <w:rStyle w:val="Hyperlink"/>
@@ -2559,7 +2625,7 @@
               <w:rPr>
                 <w:noProof/>
               </w:rPr>
-              <w:instrText xml:space="preserve"> PAGEREF _Toc242787922 \h </w:instrText>
+              <w:instrText xml:space="preserve"> PAGEREF _Toc242788251 \h </w:instrText>
             </w:r>
             <w:r>
               <w:rPr>
@@ -2576,7 +2642,7 @@
               <w:rPr>
                 <w:noProof/>
               </w:rPr>
-              <w:t>31</w:t>
+              <w:t>33</w:t>
             </w:r>
             <w:r>
               <w:rPr>
@@ -2601,7 +2667,7 @@
               <w14:ligatures w14:val="standardContextual"/>
             </w:rPr>
           </w:pPr>
-          <w:hyperlink w:anchor="_Toc242787923" w:history="1">
+          <w:hyperlink w:anchor="_Toc242788252" w:history="1">
             <w:r>
               <w:rPr>
                 <w:rStyle w:val="Hyperlink"/>
@@ -2625,7 +2691,7 @@
               <w:rPr>
                 <w:noProof/>
               </w:rPr>
-              <w:instrText xml:space="preserve"> PAGEREF _Toc242787923 \h </w:instrText>
+              <w:instrText xml:space="preserve"> PAGEREF _Toc242788252 \h </w:instrText>
             </w:r>
             <w:r>
               <w:rPr>
@@ -2642,7 +2708,7 @@
               <w:rPr>
                 <w:noProof/>
               </w:rPr>
-              <w:t>31</w:t>
+              <w:t>33</w:t>
             </w:r>
             <w:r>
               <w:rPr>
@@ -2667,7 +2733,7 @@
               <w14:ligatures w14:val="standardContextual"/>
             </w:rPr>
           </w:pPr>
-          <w:hyperlink w:anchor="_Toc242787924" w:history="1">
+          <w:hyperlink w:anchor="_Toc242788253" w:history="1">
             <w:r>
               <w:rPr>
                 <w:rStyle w:val="Hyperlink"/>
@@ -2691,7 +2757,7 @@
               <w:rPr>
                 <w:noProof/>
               </w:rPr>
-              <w:instrText xml:space="preserve"> PAGEREF _Toc242787924 \h </w:instrText>
+              <w:instrText xml:space="preserve"> PAGEREF _Toc242788253 \h </w:instrText>
             </w:r>
             <w:r>
               <w:rPr>
@@ -2708,7 +2774,7 @@
               <w:rPr>
                 <w:noProof/>
               </w:rPr>
-              <w:t>32</w:t>
+              <w:t>34</w:t>
             </w:r>
             <w:r>
               <w:rPr>
@@ -2733,7 +2799,7 @@
               <w14:ligatures w14:val="standardContextual"/>
             </w:rPr>
           </w:pPr>
-          <w:hyperlink w:anchor="_Toc242787925" w:history="1">
+          <w:hyperlink w:anchor="_Toc242788254" w:history="1">
             <w:r>
               <w:rPr>
                 <w:rStyle w:val="Hyperlink"/>
@@ -2757,7 +2823,7 @@
               <w:rPr>
                 <w:noProof/>
               </w:rPr>
-              <w:instrText xml:space="preserve"> PAGEREF _Toc242787925 \h </w:instrText>
+              <w:instrText xml:space="preserve"> PAGEREF _Toc242788254 \h </w:instrText>
             </w:r>
             <w:r>
               <w:rPr>
@@ -2774,7 +2840,7 @@
               <w:rPr>
                 <w:noProof/>
               </w:rPr>
-              <w:t>32</w:t>
+              <w:t>34</w:t>
             </w:r>
             <w:r>
               <w:rPr>
@@ -2799,7 +2865,7 @@
               <w14:ligatures w14:val="standardContextual"/>
             </w:rPr>
           </w:pPr>
-          <w:hyperlink w:anchor="_Toc242787926" w:history="1">
+          <w:hyperlink w:anchor="_Toc242788255" w:history="1">
             <w:r>
               <w:rPr>
                 <w:rStyle w:val="Hyperlink"/>
@@ -2823,7 +2889,7 @@
               <w:rPr>
                 <w:noProof/>
               </w:rPr>
-              <w:instrText xml:space="preserve"> PAGEREF _Toc242787926 \h </w:instrText>
+              <w:instrText xml:space="preserve"> PAGEREF _Toc242788255 \h </w:instrText>
             </w:r>
             <w:r>
               <w:rPr>
@@ -2840,7 +2906,7 @@
               <w:rPr>
                 <w:noProof/>
               </w:rPr>
-              <w:t>32</w:t>
+              <w:t>34</w:t>
             </w:r>
             <w:r>
               <w:rPr>
@@ -2865,7 +2931,7 @@
               <w14:ligatures w14:val="standardContextual"/>
             </w:rPr>
           </w:pPr>
-          <w:hyperlink w:anchor="_Toc242787927" w:history="1">
+          <w:hyperlink w:anchor="_Toc242788256" w:history="1">
             <w:r>
               <w:rPr>
                 <w:rStyle w:val="Hyperlink"/>
@@ -2889,7 +2955,7 @@
               <w:rPr>
                 <w:noProof/>
               </w:rPr>
-              <w:instrText xml:space="preserve"> PAGEREF _Toc242787927 \h </w:instrText>
+              <w:instrText xml:space="preserve"> PAGEREF _Toc242788256 \h </w:instrText>
             </w:r>
             <w:r>
               <w:rPr>
@@ -2906,7 +2972,7 @@
               <w:rPr>
                 <w:noProof/>
               </w:rPr>
-              <w:t>32</w:t>
+              <w:t>34</w:t>
             </w:r>
             <w:r>
               <w:rPr>
@@ -2931,7 +2997,7 @@
               <w14:ligatures w14:val="standardContextual"/>
             </w:rPr>
           </w:pPr>
-          <w:hyperlink w:anchor="_Toc242787928" w:history="1">
+          <w:hyperlink w:anchor="_Toc242788257" w:history="1">
             <w:r>
               <w:rPr>
                 <w:rStyle w:val="Hyperlink"/>
@@ -2955,7 +3021,7 @@
               <w:rPr>
                 <w:noProof/>
               </w:rPr>
-              <w:instrText xml:space="preserve"> PAGEREF _Toc242787928 \h </w:instrText>
+              <w:instrText xml:space="preserve"> PAGEREF _Toc242788257 \h </w:instrText>
             </w:r>
             <w:r>
               <w:rPr>
@@ -2972,7 +3038,7 @@
               <w:rPr>
                 <w:noProof/>
               </w:rPr>
-              <w:t>33</w:t>
+              <w:t>35</w:t>
             </w:r>
             <w:r>
               <w:rPr>
@@ -2997,7 +3063,7 @@
               <w14:ligatures w14:val="standardContextual"/>
             </w:rPr>
           </w:pPr>
-          <w:hyperlink w:anchor="_Toc242787929" w:history="1">
+          <w:hyperlink w:anchor="_Toc242788258" w:history="1">
             <w:r>
               <w:rPr>
                 <w:rStyle w:val="Hyperlink"/>
@@ -3021,7 +3087,7 @@
               <w:rPr>
                 <w:noProof/>
               </w:rPr>
-              <w:instrText xml:space="preserve"> PAGEREF _Toc242787929 \h </w:instrText>
+              <w:instrText xml:space="preserve"> PAGEREF _Toc242788258 \h </w:instrText>
             </w:r>
             <w:r>
               <w:rPr>
@@ -3038,7 +3104,7 @@
               <w:rPr>
                 <w:noProof/>
               </w:rPr>
-              <w:t>33</w:t>
+              <w:t>35</w:t>
             </w:r>
             <w:r>
               <w:rPr>
@@ -3063,7 +3129,7 @@
               <w14:ligatures w14:val="standardContextual"/>
             </w:rPr>
           </w:pPr>
-          <w:hyperlink w:anchor="_Toc242787930" w:history="1">
+          <w:hyperlink w:anchor="_Toc242788259" w:history="1">
             <w:r>
               <w:rPr>
                 <w:rStyle w:val="Hyperlink"/>
@@ -3087,7 +3153,7 @@
               <w:rPr>
                 <w:noProof/>
               </w:rPr>
-              <w:instrText xml:space="preserve"> PAGEREF _Toc242787930 \h </w:instrText>
+              <w:instrText xml:space="preserve"> PAGEREF _Toc242788259 \h </w:instrText>
             </w:r>
             <w:r>
               <w:rPr>
@@ -3104,7 +3170,7 @@
               <w:rPr>
                 <w:noProof/>
               </w:rPr>
-              <w:t>33</w:t>
+              <w:t>35</w:t>
             </w:r>
             <w:r>
               <w:rPr>
@@ -3129,7 +3195,7 @@
               <w14:ligatures w14:val="standardContextual"/>
             </w:rPr>
           </w:pPr>
-          <w:hyperlink w:anchor="_Toc242787931" w:history="1">
+          <w:hyperlink w:anchor="_Toc242788260" w:history="1">
             <w:r>
               <w:rPr>
                 <w:rStyle w:val="Hyperlink"/>
@@ -3153,7 +3219,7 @@
               <w:rPr>
                 <w:noProof/>
               </w:rPr>
-              <w:instrText xml:space="preserve"> PAGEREF _Toc242787931 \h </w:instrText>
+              <w:instrText xml:space="preserve"> PAGEREF _Toc242788260 \h </w:instrText>
             </w:r>
             <w:r>
               <w:rPr>
@@ -3170,7 +3236,7 @@
               <w:rPr>
                 <w:noProof/>
               </w:rPr>
-              <w:t>35</w:t>
+              <w:t>37</w:t>
             </w:r>
             <w:r>
               <w:rPr>
@@ -3195,7 +3261,7 @@
               <w14:ligatures w14:val="standardContextual"/>
             </w:rPr>
           </w:pPr>
-          <w:hyperlink w:anchor="_Toc242787932" w:history="1">
+          <w:hyperlink w:anchor="_Toc242788261" w:history="1">
             <w:r>
               <w:rPr>
                 <w:rStyle w:val="Hyperlink"/>
@@ -3219,7 +3285,7 @@
               <w:rPr>
                 <w:noProof/>
               </w:rPr>
-              <w:instrText xml:space="preserve"> PAGEREF _Toc242787932 \h </w:instrText>
+              <w:instrText xml:space="preserve"> PAGEREF _Toc242788261 \h </w:instrText>
             </w:r>
             <w:r>
               <w:rPr>
@@ -3236,7 +3302,7 @@
               <w:rPr>
                 <w:noProof/>
               </w:rPr>
-              <w:t>35</w:t>
+              <w:t>37</w:t>
             </w:r>
             <w:r>
               <w:rPr>
@@ -3261,7 +3327,7 @@
               <w14:ligatures w14:val="standardContextual"/>
             </w:rPr>
           </w:pPr>
-          <w:hyperlink w:anchor="_Toc242787933" w:history="1">
+          <w:hyperlink w:anchor="_Toc242788262" w:history="1">
             <w:r>
               <w:rPr>
                 <w:rStyle w:val="Hyperlink"/>
@@ -3285,7 +3351,7 @@
               <w:rPr>
                 <w:noProof/>
               </w:rPr>
-              <w:instrText xml:space="preserve"> PAGEREF _Toc242787933 \h </w:instrText>
+              <w:instrText xml:space="preserve"> PAGEREF _Toc242788262 \h </w:instrText>
             </w:r>
             <w:r>
               <w:rPr>
@@ -3302,7 +3368,7 @@
               <w:rPr>
                 <w:noProof/>
               </w:rPr>
-              <w:t>35</w:t>
+              <w:t>37</w:t>
             </w:r>
             <w:r>
               <w:rPr>
@@ -3327,7 +3393,7 @@
               <w14:ligatures w14:val="standardContextual"/>
             </w:rPr>
           </w:pPr>
-          <w:hyperlink w:anchor="_Toc242787934" w:history="1">
+          <w:hyperlink w:anchor="_Toc242788263" w:history="1">
             <w:r>
               <w:rPr>
                 <w:rStyle w:val="Hyperlink"/>
@@ -3351,7 +3417,7 @@
               <w:rPr>
                 <w:noProof/>
               </w:rPr>
-              <w:instrText xml:space="preserve"> PAGEREF _Toc242787934 \h </w:instrText>
+              <w:instrText xml:space="preserve"> PAGEREF _Toc242788263 \h </w:instrText>
             </w:r>
             <w:r>
               <w:rPr>
@@ -3368,7 +3434,7 @@
               <w:rPr>
                 <w:noProof/>
               </w:rPr>
-              <w:t>37</w:t>
+              <w:t>39</w:t>
             </w:r>
             <w:r>
               <w:rPr>
@@ -3393,7 +3459,7 @@
               <w14:ligatures w14:val="standardContextual"/>
             </w:rPr>
           </w:pPr>
-          <w:hyperlink w:anchor="_Toc242787935" w:history="1">
+          <w:hyperlink w:anchor="_Toc242788264" w:history="1">
             <w:r>
               <w:rPr>
                 <w:rStyle w:val="Hyperlink"/>
@@ -3417,7 +3483,7 @@
               <w:rPr>
                 <w:noProof/>
               </w:rPr>
-              <w:instrText xml:space="preserve"> PAGEREF _Toc242787935 \h </w:instrText>
+              <w:instrText xml:space="preserve"> PAGEREF _Toc242788264 \h </w:instrText>
             </w:r>
             <w:r>
               <w:rPr>
@@ -3434,7 +3500,7 @@
               <w:rPr>
                 <w:noProof/>
               </w:rPr>
-              <w:t>38</w:t>
+              <w:t>40</w:t>
             </w:r>
             <w:r>
               <w:rPr>
@@ -3459,7 +3525,7 @@
               <w14:ligatures w14:val="standardContextual"/>
             </w:rPr>
           </w:pPr>
-          <w:hyperlink w:anchor="_Toc242787936" w:history="1">
+          <w:hyperlink w:anchor="_Toc242788265" w:history="1">
             <w:r>
               <w:rPr>
                 <w:rStyle w:val="Hyperlink"/>
@@ -3483,7 +3549,7 @@
               <w:rPr>
                 <w:noProof/>
               </w:rPr>
-              <w:instrText xml:space="preserve"> PAGEREF _Toc242787936 \h </w:instrText>
+              <w:instrText xml:space="preserve"> PAGEREF _Toc242788265 \h </w:instrText>
             </w:r>
             <w:r>
               <w:rPr>
@@ -3500,7 +3566,7 @@
               <w:rPr>
                 <w:noProof/>
               </w:rPr>
-              <w:t>40</w:t>
+              <w:t>42</w:t>
             </w:r>
             <w:r>
               <w:rPr>
@@ -3525,7 +3591,7 @@
               <w14:ligatures w14:val="standardContextual"/>
             </w:rPr>
           </w:pPr>
-          <w:hyperlink w:anchor="_Toc242787937" w:history="1">
+          <w:hyperlink w:anchor="_Toc242788266" w:history="1">
             <w:r>
               <w:rPr>
                 <w:rStyle w:val="Hyperlink"/>
@@ -3549,7 +3615,7 @@
               <w:rPr>
                 <w:noProof/>
               </w:rPr>
-              <w:instrText xml:space="preserve"> PAGEREF _Toc242787937 \h </w:instrText>
+              <w:instrText xml:space="preserve"> PAGEREF _Toc242788266 \h </w:instrText>
             </w:r>
             <w:r>
               <w:rPr>
@@ -3566,7 +3632,7 @@
               <w:rPr>
                 <w:noProof/>
               </w:rPr>
-              <w:t>40</w:t>
+              <w:t>42</w:t>
             </w:r>
             <w:r>
               <w:rPr>
@@ -3591,7 +3657,7 @@
               <w14:ligatures w14:val="standardContextual"/>
             </w:rPr>
           </w:pPr>
-          <w:hyperlink w:anchor="_Toc242787938" w:history="1">
+          <w:hyperlink w:anchor="_Toc242788267" w:history="1">
             <w:r>
               <w:rPr>
                 <w:rStyle w:val="Hyperlink"/>
@@ -3615,7 +3681,7 @@
               <w:rPr>
                 <w:noProof/>
               </w:rPr>
-              <w:instrText xml:space="preserve"> PAGEREF _Toc242787938 \h </w:instrText>
+              <w:instrText xml:space="preserve"> PAGEREF _Toc242788267 \h </w:instrText>
             </w:r>
             <w:r>
               <w:rPr>
@@ -3632,7 +3698,7 @@
               <w:rPr>
                 <w:noProof/>
               </w:rPr>
-              <w:t>40</w:t>
+              <w:t>42</w:t>
             </w:r>
             <w:r>
               <w:rPr>
@@ -3657,7 +3723,7 @@
               <w14:ligatures w14:val="standardContextual"/>
             </w:rPr>
           </w:pPr>
-          <w:hyperlink w:anchor="_Toc242787939" w:history="1">
+          <w:hyperlink w:anchor="_Toc242788268" w:history="1">
             <w:r>
               <w:rPr>
                 <w:rStyle w:val="Hyperlink"/>
@@ -3681,7 +3747,7 @@
               <w:rPr>
                 <w:noProof/>
               </w:rPr>
-              <w:instrText xml:space="preserve"> PAGEREF _Toc242787939 \h </w:instrText>
+              <w:instrText xml:space="preserve"> PAGEREF _Toc242788268 \h </w:instrText>
             </w:r>
             <w:r>
               <w:rPr>
@@ -3698,7 +3764,7 @@
               <w:rPr>
                 <w:noProof/>
               </w:rPr>
-              <w:t>41</w:t>
+              <w:t>43</w:t>
             </w:r>
             <w:r>
               <w:rPr>
@@ -3723,7 +3789,7 @@
               <w14:ligatures w14:val="standardContextual"/>
             </w:rPr>
           </w:pPr>
-          <w:hyperlink w:anchor="_Toc242787940" w:history="1">
+          <w:hyperlink w:anchor="_Toc242788269" w:history="1">
             <w:r>
               <w:rPr>
                 <w:rStyle w:val="Hyperlink"/>
@@ -3747,7 +3813,7 @@
               <w:rPr>
                 <w:noProof/>
               </w:rPr>
-              <w:instrText xml:space="preserve"> PAGEREF _Toc242787940 \h </w:instrText>
+              <w:instrText xml:space="preserve"> PAGEREF _Toc242788269 \h </w:instrText>
             </w:r>
             <w:r>
               <w:rPr>
@@ -3764,7 +3830,7 @@
               <w:rPr>
                 <w:noProof/>
               </w:rPr>
-              <w:t>42</w:t>
+              <w:t>44</w:t>
             </w:r>
             <w:r>
               <w:rPr>
@@ -3789,7 +3855,7 @@
               <w14:ligatures w14:val="standardContextual"/>
             </w:rPr>
           </w:pPr>
-          <w:hyperlink w:anchor="_Toc242787941" w:history="1">
+          <w:hyperlink w:anchor="_Toc242788270" w:history="1">
             <w:r>
               <w:rPr>
                 <w:rStyle w:val="Hyperlink"/>
@@ -3813,7 +3879,7 @@
               <w:rPr>
                 <w:noProof/>
               </w:rPr>
-              <w:instrText xml:space="preserve"> PAGEREF _Toc242787941 \h </w:instrText>
+              <w:instrText xml:space="preserve"> PAGEREF _Toc242788270 \h </w:instrText>
             </w:r>
             <w:r>
               <w:rPr>
@@ -3830,7 +3896,7 @@
               <w:rPr>
                 <w:noProof/>
               </w:rPr>
-              <w:t>42</w:t>
+              <w:t>44</w:t>
             </w:r>
             <w:r>
               <w:rPr>
@@ -3855,7 +3921,7 @@
               <w14:ligatures w14:val="standardContextual"/>
             </w:rPr>
           </w:pPr>
-          <w:hyperlink w:anchor="_Toc242787942" w:history="1">
+          <w:hyperlink w:anchor="_Toc242788271" w:history="1">
             <w:r>
               <w:rPr>
                 <w:rStyle w:val="Hyperlink"/>
@@ -3879,7 +3945,7 @@
               <w:rPr>
                 <w:noProof/>
               </w:rPr>
-              <w:instrText xml:space="preserve"> PAGEREF _Toc242787942 \h </w:instrText>
+              <w:instrText xml:space="preserve"> PAGEREF _Toc242788271 \h </w:instrText>
             </w:r>
             <w:r>
               <w:rPr>
@@ -3896,7 +3962,7 @@
               <w:rPr>
                 <w:noProof/>
               </w:rPr>
-              <w:t>43</w:t>
+              <w:t>45</w:t>
             </w:r>
             <w:r>
               <w:rPr>
@@ -3921,7 +3987,7 @@
               <w14:ligatures w14:val="standardContextual"/>
             </w:rPr>
           </w:pPr>
-          <w:hyperlink w:anchor="_Toc242787943" w:history="1">
+          <w:hyperlink w:anchor="_Toc242788272" w:history="1">
             <w:r>
               <w:rPr>
                 <w:rStyle w:val="Hyperlink"/>
@@ -3945,7 +4011,7 @@
               <w:rPr>
                 <w:noProof/>
               </w:rPr>
-              <w:instrText xml:space="preserve"> PAGEREF _Toc242787943 \h </w:instrText>
+              <w:instrText xml:space="preserve"> PAGEREF _Toc242788272 \h </w:instrText>
             </w:r>
             <w:r>
               <w:rPr>
@@ -3962,7 +4028,7 @@
               <w:rPr>
                 <w:noProof/>
               </w:rPr>
-              <w:t>44</w:t>
+              <w:t>46</w:t>
             </w:r>
             <w:r>
               <w:rPr>
@@ -3987,7 +4053,7 @@
               <w14:ligatures w14:val="standardContextual"/>
             </w:rPr>
           </w:pPr>
-          <w:hyperlink w:anchor="_Toc242787944" w:history="1">
+          <w:hyperlink w:anchor="_Toc242788273" w:history="1">
             <w:r>
               <w:rPr>
                 <w:rStyle w:val="Hyperlink"/>
@@ -4011,7 +4077,7 @@
               <w:rPr>
                 <w:noProof/>
               </w:rPr>
-              <w:instrText xml:space="preserve"> PAGEREF _Toc242787944 \h </w:instrText>
+              <w:instrText xml:space="preserve"> PAGEREF _Toc242788273 \h </w:instrText>
             </w:r>
             <w:r>
               <w:rPr>
@@ -4028,7 +4094,7 @@
               <w:rPr>
                 <w:noProof/>
               </w:rPr>
-              <w:t>44</w:t>
+              <w:t>46</w:t>
             </w:r>
             <w:r>
               <w:rPr>
@@ -4053,7 +4119,7 @@
               <w14:ligatures w14:val="standardContextual"/>
             </w:rPr>
           </w:pPr>
-          <w:hyperlink w:anchor="_Toc242787945" w:history="1">
+          <w:hyperlink w:anchor="_Toc242788274" w:history="1">
             <w:r>
               <w:rPr>
                 <w:rStyle w:val="Hyperlink"/>
@@ -4077,7 +4143,7 @@
               <w:rPr>
                 <w:noProof/>
               </w:rPr>
-              <w:instrText xml:space="preserve"> PAGEREF _Toc242787945 \h </w:instrText>
+              <w:instrText xml:space="preserve"> PAGEREF _Toc242788274 \h </w:instrText>
             </w:r>
             <w:r>
               <w:rPr>
@@ -4094,7 +4160,7 @@
               <w:rPr>
                 <w:noProof/>
               </w:rPr>
-              <w:t>44</w:t>
+              <w:t>46</w:t>
             </w:r>
             <w:r>
               <w:rPr>
@@ -4119,7 +4185,7 @@
               <w14:ligatures w14:val="standardContextual"/>
             </w:rPr>
           </w:pPr>
-          <w:hyperlink w:anchor="_Toc242787946" w:history="1">
+          <w:hyperlink w:anchor="_Toc242788275" w:history="1">
             <w:r>
               <w:rPr>
                 <w:rStyle w:val="Hyperlink"/>
@@ -4143,7 +4209,7 @@
               <w:rPr>
                 <w:noProof/>
               </w:rPr>
-              <w:instrText xml:space="preserve"> PAGEREF _Toc242787946 \h </w:instrText>
+              <w:instrText xml:space="preserve"> PAGEREF _Toc242788275 \h </w:instrText>
             </w:r>
             <w:r>
               <w:rPr>
@@ -4160,7 +4226,7 @@
               <w:rPr>
                 <w:noProof/>
               </w:rPr>
-              <w:t>46</w:t>
+              <w:t>48</w:t>
             </w:r>
             <w:r>
               <w:rPr>
@@ -4185,7 +4251,7 @@
               <w14:ligatures w14:val="standardContextual"/>
             </w:rPr>
           </w:pPr>
-          <w:hyperlink w:anchor="_Toc242787947" w:history="1">
+          <w:hyperlink w:anchor="_Toc242788276" w:history="1">
             <w:r>
               <w:rPr>
                 <w:rStyle w:val="Hyperlink"/>
@@ -4209,7 +4275,7 @@
               <w:rPr>
                 <w:noProof/>
               </w:rPr>
-              <w:instrText xml:space="preserve"> PAGEREF _Toc242787947 \h </w:instrText>
+              <w:instrText xml:space="preserve"> PAGEREF _Toc242788276 \h </w:instrText>
             </w:r>
             <w:r>
               <w:rPr>
@@ -4226,7 +4292,7 @@
               <w:rPr>
                 <w:noProof/>
               </w:rPr>
-              <w:t>46</w:t>
+              <w:t>48</w:t>
             </w:r>
             <w:r>
               <w:rPr>
@@ -4251,7 +4317,7 @@
               <w14:ligatures w14:val="standardContextual"/>
             </w:rPr>
           </w:pPr>
-          <w:hyperlink w:anchor="_Toc242787948" w:history="1">
+          <w:hyperlink w:anchor="_Toc242788277" w:history="1">
             <w:r>
               <w:rPr>
                 <w:rStyle w:val="Hyperlink"/>
@@ -4275,7 +4341,7 @@
               <w:rPr>
                 <w:noProof/>
               </w:rPr>
-              <w:instrText xml:space="preserve"> PAGEREF _Toc242787948 \h </w:instrText>
+              <w:instrText xml:space="preserve"> PAGEREF _Toc242788277 \h </w:instrText>
             </w:r>
             <w:r>
               <w:rPr>
@@ -4292,7 +4358,7 @@
               <w:rPr>
                 <w:noProof/>
               </w:rPr>
-              <w:t>46</w:t>
+              <w:t>48</w:t>
             </w:r>
             <w:r>
               <w:rPr>
@@ -4317,7 +4383,7 @@
               <w14:ligatures w14:val="standardContextual"/>
             </w:rPr>
           </w:pPr>
-          <w:hyperlink w:anchor="_Toc242787949" w:history="1">
+          <w:hyperlink w:anchor="_Toc242788278" w:history="1">
             <w:r>
               <w:rPr>
                 <w:rStyle w:val="Hyperlink"/>
@@ -4341,7 +4407,7 @@
               <w:rPr>
                 <w:noProof/>
               </w:rPr>
-              <w:instrText xml:space="preserve"> PAGEREF _Toc242787949 \h </w:instrText>
+              <w:instrText xml:space="preserve"> PAGEREF _Toc242788278 \h </w:instrText>
             </w:r>
             <w:r>
               <w:rPr>
@@ -4358,7 +4424,7 @@
               <w:rPr>
                 <w:noProof/>
               </w:rPr>
-              <w:t>46</w:t>
+              <w:t>48</w:t>
             </w:r>
             <w:r>
               <w:rPr>
@@ -4383,7 +4449,7 @@
               <w14:ligatures w14:val="standardContextual"/>
             </w:rPr>
           </w:pPr>
-          <w:hyperlink w:anchor="_Toc242787950" w:history="1">
+          <w:hyperlink w:anchor="_Toc242788279" w:history="1">
             <w:r>
               <w:rPr>
                 <w:rStyle w:val="Hyperlink"/>
@@ -4407,7 +4473,7 @@
               <w:rPr>
                 <w:noProof/>
               </w:rPr>
-              <w:instrText xml:space="preserve"> PAGEREF _Toc242787950 \h </w:instrText>
+              <w:instrText xml:space="preserve"> PAGEREF _Toc242788279 \h </w:instrText>
             </w:r>
             <w:r>
               <w:rPr>
@@ -4424,7 +4490,7 @@
               <w:rPr>
                 <w:noProof/>
               </w:rPr>
-              <w:t>47</w:t>
+              <w:t>49</w:t>
             </w:r>
             <w:r>
               <w:rPr>
@@ -4449,7 +4515,7 @@
               <w14:ligatures w14:val="standardContextual"/>
             </w:rPr>
           </w:pPr>
-          <w:hyperlink w:anchor="_Toc242787951" w:history="1">
+          <w:hyperlink w:anchor="_Toc242788280" w:history="1">
             <w:r>
               <w:rPr>
                 <w:rStyle w:val="Hyperlink"/>
@@ -4473,7 +4539,7 @@
               <w:rPr>
                 <w:noProof/>
               </w:rPr>
-              <w:instrText xml:space="preserve"> PAGEREF _Toc242787951 \h </w:instrText>
+              <w:instrText xml:space="preserve"> PAGEREF _Toc242788280 \h </w:instrText>
             </w:r>
             <w:r>
               <w:rPr>
@@ -4490,7 +4556,7 @@
               <w:rPr>
                 <w:noProof/>
               </w:rPr>
-              <w:t>48</w:t>
+              <w:t>51</w:t>
             </w:r>
             <w:r>
               <w:rPr>
@@ -4516,6 +4582,7 @@
           <w:sz w:val="18"/>
           <w:szCs w:val="18"/>
         </w:rPr>
+        <w:lastRenderedPageBreak/>
         <w:t>Si el índice aparece vacío, haz clic derecho sobre él y elige “Actualizar campos”.</w:t>
       </w:r>
     </w:p>
@@ -4524,7 +4591,7 @@
         <w:pStyle w:val="Heading1"/>
         <w:pageBreakBefore/>
       </w:pPr>
-      <w:bookmarkStart w:id="0" w:name="_Toc242787886"/>
+      <w:bookmarkStart w:id="0" w:name="_Toc242788214"/>
       <w:r>
         <w:lastRenderedPageBreak/>
         <w:t>1. Resumen ejecutivo</w:t>
@@ -4536,7 +4603,7 @@
         <w:spacing w:after="120"/>
       </w:pPr>
       <w:r>
-        <w:t>Este proyecto es un conjunto de herramientas para transmisiones en vivo de TikTok, inspirado en TikFinity. Permite poner en pantalla, mediante OBS Studio o TikTok LIVE Studio, elementos que reaccionan a lo que hace el público durante el LIVE: una ruleta que gira cuando alguien envía un regalo (con una segunda ruleta premium), barras de meta que se llenan con likes, seguidores, compartidos o monedas, alertas animadas, una carrera de regalos entre integrantes con reloj por rondas , una batalla de regalos (tira y afloja) entre dos equipos, un jefe del LIVE (un reto cooperativo en el que el chat le quita vida a un jefe antes de que se acabe el tiempo) y un reloj de subathon al que el público le suma tiempo. Además incluye un panel para ver la actividad del LIVE en tiempo real y un catálogo de regalos con su código (ID).</w:t>
+        <w:t>Este proyecto es un conjunto de herramientas para transmisiones en vivo de TikTok, inspirado en TikFinity. Permite poner en pantalla, mediante OBS Studio o TikTok LIVE Studio, elementos que reaccionan a lo que hace el público durante el LIVE: una ruleta que gira cuando alguien envía un regalo (con una segunda ruleta premium), barras de meta que se llenan con likes, seguidores, compartidos o monedas, alertas animadas, una carrera de regalos entre integrantes con reloj por rondas , una batalla de regalos (tira y afloja) entre dos equipos, un jefe del LIVE (un reto cooperativo en el que el chat le quita vida a un jefe antes de que se acabe el tiempo), un reloj de subathon al que el público le suma tiempo y una bóveda dorada que revela un premio secreto al llegar a una meta de monedas. Además incluye un panel para ver la actividad del LIVE en tiempo real y un catálogo de regalos con su código (ID).</w:t>
       </w:r>
     </w:p>
     <w:p>
@@ -4578,7 +4645,7 @@
         <w:pStyle w:val="Heading1"/>
         <w:pageBreakBefore/>
       </w:pPr>
-      <w:bookmarkStart w:id="1" w:name="_Toc242787887"/>
+      <w:bookmarkStart w:id="1" w:name="_Toc242788215"/>
       <w:r>
         <w:lastRenderedPageBreak/>
         <w:t>2. Conceptos y glosario</w:t>
@@ -4776,7 +4843,7 @@
               <w:spacing w:after="20"/>
             </w:pPr>
             <w:r>
-              <w:t>Una página web pequeña (por ejemplo ruleta.html) con fondo transparente que se pone encima de la cámara en OBS. En el proyecto hay siete: ruleta (normal y premium), meta, alertas, carrera de regalos, batalla de regalos, jefe del LIVE y subathon.</w:t>
+              <w:t>Una página web pequeña (por ejemplo ruleta.html) con fondo transparente que se pone encima de la cámara en OBS. En el proyecto hay ocho: ruleta (normal y premium), meta, alertas, carrera de regalos, batalla de regalos, jefe del LIVE, subathon y bóveda dorada.</w:t>
             </w:r>
           </w:p>
         </w:tc>
@@ -6013,7 +6080,7 @@
         <w:pStyle w:val="Heading1"/>
         <w:pageBreakBefore/>
       </w:pPr>
-      <w:bookmarkStart w:id="2" w:name="_Toc242787888"/>
+      <w:bookmarkStart w:id="2" w:name="_Toc242788216"/>
       <w:r>
         <w:lastRenderedPageBreak/>
         <w:t>3. Arquitectura general</w:t>
@@ -6024,7 +6091,7 @@
       <w:pPr>
         <w:pStyle w:val="Heading2"/>
       </w:pPr>
-      <w:bookmarkStart w:id="3" w:name="_Toc242787889"/>
+      <w:bookmarkStart w:id="3" w:name="_Toc242788217"/>
       <w:r>
         <w:t>3.1 Piezas del sistema</w:t>
       </w:r>
@@ -6585,7 +6652,7 @@
               <w:spacing w:after="20"/>
             </w:pPr>
             <w:r>
-              <w:t>Widgets (ruleta.html, meta.html, alertas.html, carrera.html, batalla.html, jefe.html, subathon.html)</w:t>
+              <w:t>Widgets (ruleta.html, meta.html, alertas.html, carrera.html, batalla.html, jefe.html, subathon.html, boveda.html)</w:t>
             </w:r>
           </w:p>
         </w:tc>
@@ -6650,7 +6717,7 @@
       <w:pPr>
         <w:pStyle w:val="Heading2"/>
       </w:pPr>
-      <w:bookmarkStart w:id="4" w:name="_Toc242787890"/>
+      <w:bookmarkStart w:id="4" w:name="_Toc242788218"/>
       <w:r>
         <w:t>3.2 Flujo de datos</w:t>
       </w:r>
@@ -6837,6 +6904,7 @@
           <w:sz w:val="18"/>
           <w:szCs w:val="18"/>
         </w:rPr>
+        <w:lastRenderedPageBreak/>
         <w:t xml:space="preserve">   Panel ──(eventos de prueba por postMessage)──► vista previa (iframe del widget)</w:t>
       </w:r>
     </w:p>
@@ -6850,7 +6918,6 @@
         <w:spacing w:after="60"/>
       </w:pPr>
       <w:r>
-        <w:lastRenderedPageBreak/>
         <w:t>La persona configura un widget en el panel. El panel guarda la configuración en Supabase y construye una URL fija con el usuario, la API key y el identificador del widget, codificados después de #c=.</w:t>
       </w:r>
     </w:p>
@@ -6903,7 +6970,7 @@
         <w:spacing w:after="60"/>
       </w:pPr>
       <w:r>
-        <w:t>El widget convierte cada evento a un formato simple (evento normalizado) y reacciona: gira la ruleta, llena la barra, muestra una alerta, suma puntos a un integrante de la carrera, empuja la barra de la batalla, le quita vida al jefe o le suma tiempo al subathon.</w:t>
+        <w:t>El widget convierte cada evento a un formato simple (evento normalizado) y reacciona: gira la ruleta, llena la barra, muestra una alerta, suma puntos a un integrante de la carrera, empuja la barra de la batalla, le quita vida al jefe, le suma tiempo al subathon o acerca la bóveda a su meta.</w:t>
       </w:r>
     </w:p>
     <w:p>
@@ -6945,7 +7012,7 @@
         <w:pStyle w:val="Heading1"/>
         <w:pageBreakBefore/>
       </w:pPr>
-      <w:bookmarkStart w:id="5" w:name="_Toc242787891"/>
+      <w:bookmarkStart w:id="5" w:name="_Toc242788219"/>
       <w:r>
         <w:lastRenderedPageBreak/>
         <w:t>4. Servicios externos</w:t>
@@ -6956,7 +7023,7 @@
       <w:pPr>
         <w:pStyle w:val="Heading2"/>
       </w:pPr>
-      <w:bookmarkStart w:id="6" w:name="_Toc242787892"/>
+      <w:bookmarkStart w:id="6" w:name="_Toc242788220"/>
       <w:r>
         <w:t>4.1 TikTok LIVE</w:t>
       </w:r>
@@ -7715,7 +7782,7 @@
       <w:pPr>
         <w:pStyle w:val="Heading2"/>
       </w:pPr>
-      <w:bookmarkStart w:id="7" w:name="_Toc242787893"/>
+      <w:bookmarkStart w:id="7" w:name="_Toc242788221"/>
       <w:r>
         <w:t>4.2 Euler Stream</w:t>
       </w:r>
@@ -9007,7 +9074,7 @@
       <w:pPr>
         <w:pStyle w:val="Heading2"/>
       </w:pPr>
-      <w:bookmarkStart w:id="8" w:name="_Toc242787894"/>
+      <w:bookmarkStart w:id="8" w:name="_Toc242788222"/>
       <w:r>
         <w:t>4.3 GitHub, GitHub Actions y GitHub Pages</w:t>
       </w:r>
@@ -9211,7 +9278,7 @@
       <w:pPr>
         <w:pStyle w:val="Heading2"/>
       </w:pPr>
-      <w:bookmarkStart w:id="9" w:name="_Toc242787895"/>
+      <w:bookmarkStart w:id="9" w:name="_Toc242788223"/>
       <w:r>
         <w:t>4.4 Google Fonts</w:t>
       </w:r>
@@ -9241,7 +9308,7 @@
       <w:pPr>
         <w:pStyle w:val="Heading2"/>
       </w:pPr>
-      <w:bookmarkStart w:id="10" w:name="_Toc242787896"/>
+      <w:bookmarkStart w:id="10" w:name="_Toc242788224"/>
       <w:r>
         <w:lastRenderedPageBreak/>
         <w:t>4.5 Supabase (cambios en vivo)</w:t>
@@ -9497,7 +9564,7 @@
         <w:pStyle w:val="Heading1"/>
         <w:pageBreakBefore/>
       </w:pPr>
-      <w:bookmarkStart w:id="11" w:name="_Toc242787897"/>
+      <w:bookmarkStart w:id="11" w:name="_Toc242788225"/>
       <w:r>
         <w:lastRenderedPageBreak/>
         <w:t>5. Estructura de archivos</w:t>
@@ -9652,6 +9719,17 @@
         <w:ind w:left="200" w:right="200"/>
       </w:pPr>
       <w:r>
+        <w:t>│   ├── boveda.html                 widget bóveda dorada (caja sorpresa)</w:t>
+      </w:r>
+    </w:p>
+    <w:p>
+      <w:pPr>
+        <w:keepLines/>
+        <w:shd w:val="clear" w:color="auto" w:fill="F2F2F2"/>
+        <w:spacing w:line="260" w:lineRule="auto"/>
+        <w:ind w:left="200" w:right="200"/>
+      </w:pPr>
+      <w:r>
         <w:rPr>
           <w:rFonts w:ascii="Consolas" w:eastAsia="Consolas" w:hAnsi="Consolas" w:cs="Consolas"/>
           <w:sz w:val="18"/>
@@ -9716,7 +9794,7 @@
           <w:sz w:val="18"/>
           <w:szCs w:val="18"/>
         </w:rPr>
-        <w:t>│   │   └── widgets/ruleta.css · meta.css · alertas.css · carrera.css · batalla.css · jefe.css · subathon.css</w:t>
+        <w:t>│   │   └── widgets/ruleta.css · meta.css · alertas.css · carrera.css · batalla.css · jefe.css · subathon.css · boveda.css</w:t>
       </w:r>
     </w:p>
     <w:p>
@@ -9807,7 +9885,7 @@
           <w:sz w:val="18"/>
           <w:szCs w:val="18"/>
         </w:rPr>
-        <w:t>│       ├── widgets/ruleta.js · meta.js · alertas.js · carrera.js · batalla.js · jefe.js · subathon.js</w:t>
+        <w:t>│       ├── widgets/ruleta.js · meta.js · alertas.js · carrera.js · batalla.js · jefe.js · subathon.js · boveda.js</w:t>
       </w:r>
     </w:p>
     <w:p>
@@ -9946,7 +10024,7 @@
           <w:sz w:val="18"/>
           <w:szCs w:val="18"/>
         </w:rPr>
-        <w:t>│           └── vistas/ruleta.js · metas.js · alertas.js · carrera.js · batalla.js · jefe.js · subathon.js · actividad.js · regalos.js · conexion.js</w:t>
+        <w:t>│           └── vistas/ruleta.js · metas.js · alertas.js · carrera.js · batalla.js · jefe.js · subathon.js · boveda.js · actividad.js · regalos.js · conexion.js</w:t>
       </w:r>
     </w:p>
     <w:p>
@@ -10100,7 +10178,7 @@
         <w:pStyle w:val="Heading1"/>
         <w:pageBreakBefore/>
       </w:pPr>
-      <w:bookmarkStart w:id="12" w:name="_Toc242787898"/>
+      <w:bookmarkStart w:id="12" w:name="_Toc242788226"/>
       <w:r>
         <w:lastRenderedPageBreak/>
         <w:t>6. Frontend: el módulo compartido comun.js</w:t>
@@ -10128,7 +10206,7 @@
       <w:pPr>
         <w:pStyle w:val="Heading2"/>
       </w:pPr>
-      <w:bookmarkStart w:id="13" w:name="_Toc242787899"/>
+      <w:bookmarkStart w:id="13" w:name="_Toc242788227"/>
       <w:r>
         <w:t>6.1 Configuración en la URL</w:t>
       </w:r>
@@ -10599,7 +10677,7 @@
       <w:pPr>
         <w:pStyle w:val="Heading2"/>
       </w:pPr>
-      <w:bookmarkStart w:id="14" w:name="_Toc242787900"/>
+      <w:bookmarkStart w:id="14" w:name="_Toc242788228"/>
       <w:r>
         <w:t>6.2 Eventos normalizados</w:t>
       </w:r>
@@ -11385,7 +11463,7 @@
       <w:pPr>
         <w:pStyle w:val="Heading2"/>
       </w:pPr>
-      <w:bookmarkStart w:id="15" w:name="_Toc242787901"/>
+      <w:bookmarkStart w:id="15" w:name="_Toc242788229"/>
       <w:r>
         <w:t>6.3 Rastreador de regalos (combos y regalos sueltos)</w:t>
       </w:r>
@@ -12115,7 +12193,7 @@
       <w:pPr>
         <w:pStyle w:val="Heading2"/>
       </w:pPr>
-      <w:bookmarkStart w:id="16" w:name="_Toc242787902"/>
+      <w:bookmarkStart w:id="16" w:name="_Toc242788230"/>
       <w:r>
         <w:t>6.4 Conexión con TikTok (conectarTikTok)</w:t>
       </w:r>
@@ -12236,7 +12314,7 @@
       <w:pPr>
         <w:pStyle w:val="Heading2"/>
       </w:pPr>
-      <w:bookmarkStart w:id="17" w:name="_Toc242787903"/>
+      <w:bookmarkStart w:id="17" w:name="_Toc242788231"/>
       <w:r>
         <w:t>6.5 Arranque de widgets (iniciarWidget)</w:t>
       </w:r>
@@ -12462,7 +12540,7 @@
       <w:pPr>
         <w:pStyle w:val="Heading2"/>
       </w:pPr>
-      <w:bookmarkStart w:id="18" w:name="_Toc242787904"/>
+      <w:bookmarkStart w:id="18" w:name="_Toc242788232"/>
       <w:r>
         <w:t>6.6 Utilidades</w:t>
       </w:r>
@@ -12528,7 +12606,7 @@
       <w:pPr>
         <w:pStyle w:val="Heading2"/>
       </w:pPr>
-      <w:bookmarkStart w:id="19" w:name="_Toc242787905"/>
+      <w:bookmarkStart w:id="19" w:name="_Toc242788233"/>
       <w:r>
         <w:lastRenderedPageBreak/>
         <w:t>6.7 Cambios en vivo (nube.js)</w:t>
@@ -12608,7 +12686,7 @@
         <w:pStyle w:val="Heading1"/>
         <w:pageBreakBefore/>
       </w:pPr>
-      <w:bookmarkStart w:id="20" w:name="_Toc242787906"/>
+      <w:bookmarkStart w:id="20" w:name="_Toc242788234"/>
       <w:r>
         <w:lastRenderedPageBreak/>
         <w:t>7. Frontend: los widgets</w:t>
@@ -12651,7 +12729,7 @@
       <w:pPr>
         <w:pStyle w:val="Heading2"/>
       </w:pPr>
-      <w:bookmarkStart w:id="21" w:name="_Toc242787907"/>
+      <w:bookmarkStart w:id="21" w:name="_Toc242788235"/>
       <w:r>
         <w:t>7.1 Ruleta de regalos (ruleta.html)</w:t>
       </w:r>
@@ -13746,7 +13824,7 @@
       <w:pPr>
         <w:pStyle w:val="Heading2"/>
       </w:pPr>
-      <w:bookmarkStart w:id="22" w:name="_Toc242787908"/>
+      <w:bookmarkStart w:id="22" w:name="_Toc242788236"/>
       <w:r>
         <w:t>7.2 Meta (meta.html)</w:t>
       </w:r>
@@ -14356,7 +14434,7 @@
       <w:pPr>
         <w:pStyle w:val="Heading2"/>
       </w:pPr>
-      <w:bookmarkStart w:id="23" w:name="_Toc242787909"/>
+      <w:bookmarkStart w:id="23" w:name="_Toc242788237"/>
       <w:r>
         <w:t>7.3 Alertas (alertas.html)</w:t>
       </w:r>
@@ -14723,7 +14801,7 @@
       <w:pPr>
         <w:pStyle w:val="Heading2"/>
       </w:pPr>
-      <w:bookmarkStart w:id="24" w:name="_Toc242787910"/>
+      <w:bookmarkStart w:id="24" w:name="_Toc242788238"/>
       <w:r>
         <w:t>7.4 Carrera de regalos (carrera.html)</w:t>
       </w:r>
@@ -16089,7 +16167,7 @@
       <w:pPr>
         <w:pStyle w:val="Heading2"/>
       </w:pPr>
-      <w:bookmarkStart w:id="25" w:name="_Toc242787911"/>
+      <w:bookmarkStart w:id="25" w:name="_Toc242788239"/>
       <w:r>
         <w:t>7.5 Batalla de regalos (batalla.html)</w:t>
       </w:r>
@@ -16745,7 +16823,7 @@
       <w:pPr>
         <w:pStyle w:val="Heading2"/>
       </w:pPr>
-      <w:bookmarkStart w:id="26" w:name="_Toc242787912"/>
+      <w:bookmarkStart w:id="26" w:name="_Toc242788240"/>
       <w:r>
         <w:t>7.6 Jefe del LIVE (jefe.html)</w:t>
       </w:r>
@@ -17881,7 +17959,7 @@
       <w:pPr>
         <w:pStyle w:val="Heading2"/>
       </w:pPr>
-      <w:bookmarkStart w:id="27" w:name="_Toc242787913"/>
+      <w:bookmarkStart w:id="27" w:name="_Toc242788241"/>
       <w:r>
         <w:lastRenderedPageBreak/>
         <w:t>7.7 Subathon (subathon.html)</w:t>
@@ -19039,25 +19117,964 @@
     </w:p>
     <w:p>
       <w:pPr>
+        <w:pStyle w:val="Heading2"/>
+      </w:pPr>
+      <w:bookmarkStart w:id="28" w:name="_Toc242788242"/>
+      <w:r>
+        <w:t>7.8 Bóveda dorada (boveda.html)</w:t>
+      </w:r>
+      <w:bookmarkEnd w:id="28"/>
+    </w:p>
+    <w:p>
+      <w:pPr>
+        <w:spacing w:after="120"/>
+      </w:pPr>
+      <w:r>
+        <w:t>Una caja sorpresa: los regalos llenan una barra hacia una meta de monedas. Mientras tanto se ve el porcentaje, pero el premio queda oculto. Al llegar a la meta, el candado se abre y aparece el texto secreto (por ejemplo “K-pop dance solo”) en letras de oro. Fuente de OBS de 1200 × 400 recomendada.</w:t>
+      </w:r>
+    </w:p>
+    <w:p>
+      <w:pPr>
+        <w:pStyle w:val="Heading3"/>
+      </w:pPr>
+      <w:r>
+        <w:t>Estructura</w:t>
+      </w:r>
+    </w:p>
+    <w:p>
+      <w:pPr>
+        <w:spacing w:after="120"/>
+      </w:pPr>
+      <w:r>
+        <w:t>Una tarjeta de cristal en dos columnas. A la izquierda, el candado: un SVG de trazo (arco, cuerpo y bocallave) cuyo degradado toma sus colores del estilo del widget con CSS (</w:t>
+      </w:r>
+      <w:r>
+        <w:rPr>
+          <w:rFonts w:ascii="Consolas" w:eastAsia="Consolas" w:hAnsi="Consolas" w:cs="Consolas"/>
+          <w:color w:val="7A1F33"/>
+          <w:sz w:val="19"/>
+          <w:szCs w:val="19"/>
+        </w:rPr>
+        <w:t>stop-color: var(--activo)</w:t>
+      </w:r>
+      <w:r>
+        <w:t xml:space="preserve"> y </w:t>
+      </w:r>
+      <w:r>
+        <w:rPr>
+          <w:rFonts w:ascii="Consolas" w:eastAsia="Consolas" w:hAnsi="Consolas" w:cs="Consolas"/>
+          <w:color w:val="7A1F33"/>
+          <w:sz w:val="19"/>
+          <w:szCs w:val="19"/>
+        </w:rPr>
+        <w:t>var(--borde-color)</w:t>
+      </w:r>
+      <w:r>
+        <w:t>). A la derecha, el título, el bloque del secreto y la barra de progreso (</w:t>
+      </w:r>
+      <w:r>
+        <w:rPr>
+          <w:rFonts w:ascii="Consolas" w:eastAsia="Consolas" w:hAnsi="Consolas" w:cs="Consolas"/>
+          <w:color w:val="7A1F33"/>
+          <w:sz w:val="19"/>
+          <w:szCs w:val="19"/>
+        </w:rPr>
+        <w:t>.filo-oro</w:t>
+      </w:r>
+      <w:r>
+        <w:t xml:space="preserve">) con el porcentaje y “640 / 1.000 monedas”. El bloque del secreto tiene tres capas en el mismo lugar: la pista (“Premio secreto”), el secreto tapado (puntos desenfocados) y </w:t>
+      </w:r>
+      <w:r>
+        <w:rPr>
+          <w:rFonts w:ascii="Consolas" w:eastAsia="Consolas" w:hAnsi="Consolas" w:cs="Consolas"/>
+          <w:color w:val="7A1F33"/>
+          <w:sz w:val="19"/>
+          <w:szCs w:val="19"/>
+        </w:rPr>
+        <w:t>#revelado</w:t>
+      </w:r>
+      <w:r>
+        <w:t xml:space="preserve">, el texto secreto. El estado va en </w:t>
+      </w:r>
+      <w:r>
+        <w:rPr>
+          <w:rFonts w:ascii="Consolas" w:eastAsia="Consolas" w:hAnsi="Consolas" w:cs="Consolas"/>
+          <w:color w:val="7A1F33"/>
+          <w:sz w:val="19"/>
+          <w:szCs w:val="19"/>
+        </w:rPr>
+        <w:t>data-estado</w:t>
+      </w:r>
+      <w:r>
+        <w:t>: cerrada o abierta.</w:t>
+      </w:r>
+    </w:p>
+    <w:p>
+      <w:pPr>
+        <w:pStyle w:val="Heading3"/>
+      </w:pPr>
+      <w:r>
+        <w:t>Configuración</w:t>
+      </w:r>
+    </w:p>
+    <w:tbl>
+      <w:tblPr>
+        <w:tblW w:w="9360" w:type="dxa"/>
+        <w:tblBorders>
+          <w:top w:val="single" w:sz="4" w:space="0" w:color="auto"/>
+          <w:left w:val="single" w:sz="4" w:space="0" w:color="auto"/>
+          <w:bottom w:val="single" w:sz="4" w:space="0" w:color="auto"/>
+          <w:right w:val="single" w:sz="4" w:space="0" w:color="auto"/>
+          <w:insideH w:val="single" w:sz="4" w:space="0" w:color="auto"/>
+          <w:insideV w:val="single" w:sz="4" w:space="0" w:color="auto"/>
+        </w:tblBorders>
+        <w:tblLook w:val="04A0" w:firstRow="1" w:lastRow="0" w:firstColumn="1" w:lastColumn="0" w:noHBand="0" w:noVBand="1"/>
+      </w:tblPr>
+      <w:tblGrid>
+        <w:gridCol w:w="1497"/>
+        <w:gridCol w:w="7863"/>
+      </w:tblGrid>
+      <w:tr>
+        <w:trPr>
+          <w:tblHeader/>
+        </w:trPr>
+        <w:tc>
+          <w:tcPr>
+            <w:tcW w:w="1497" w:type="dxa"/>
+            <w:tcBorders>
+              <w:top w:val="single" w:sz="4" w:space="0" w:color="BFBFBF"/>
+              <w:left w:val="single" w:sz="4" w:space="0" w:color="BFBFBF"/>
+              <w:bottom w:val="single" w:sz="4" w:space="0" w:color="BFBFBF"/>
+              <w:right w:val="single" w:sz="4" w:space="0" w:color="BFBFBF"/>
+            </w:tcBorders>
+            <w:shd w:val="clear" w:color="auto" w:fill="1F4E79"/>
+            <w:tcMar>
+              <w:top w:w="60" w:type="dxa"/>
+              <w:left w:w="100" w:type="dxa"/>
+              <w:bottom w:w="60" w:type="dxa"/>
+              <w:right w:w="100" w:type="dxa"/>
+            </w:tcMar>
+          </w:tcPr>
+          <w:p>
+            <w:pPr>
+              <w:spacing w:after="20"/>
+            </w:pPr>
+            <w:r>
+              <w:rPr>
+                <w:b/>
+                <w:bCs/>
+                <w:color w:val="FFFFFF"/>
+              </w:rPr>
+              <w:t>Clave</w:t>
+            </w:r>
+          </w:p>
+        </w:tc>
+        <w:tc>
+          <w:tcPr>
+            <w:tcW w:w="7863" w:type="dxa"/>
+            <w:tcBorders>
+              <w:top w:val="single" w:sz="4" w:space="0" w:color="BFBFBF"/>
+              <w:left w:val="single" w:sz="4" w:space="0" w:color="BFBFBF"/>
+              <w:bottom w:val="single" w:sz="4" w:space="0" w:color="BFBFBF"/>
+              <w:right w:val="single" w:sz="4" w:space="0" w:color="BFBFBF"/>
+            </w:tcBorders>
+            <w:shd w:val="clear" w:color="auto" w:fill="1F4E79"/>
+            <w:tcMar>
+              <w:top w:w="60" w:type="dxa"/>
+              <w:left w:w="100" w:type="dxa"/>
+              <w:bottom w:w="60" w:type="dxa"/>
+              <w:right w:w="100" w:type="dxa"/>
+            </w:tcMar>
+          </w:tcPr>
+          <w:p>
+            <w:pPr>
+              <w:spacing w:after="20"/>
+            </w:pPr>
+            <w:r>
+              <w:rPr>
+                <w:b/>
+                <w:bCs/>
+                <w:color w:val="FFFFFF"/>
+              </w:rPr>
+              <w:t>Significado</w:t>
+            </w:r>
+          </w:p>
+        </w:tc>
+      </w:tr>
+      <w:tr>
+        <w:tc>
+          <w:tcPr>
+            <w:tcW w:w="1497" w:type="dxa"/>
+            <w:tcBorders>
+              <w:top w:val="single" w:sz="4" w:space="0" w:color="BFBFBF"/>
+              <w:left w:val="single" w:sz="4" w:space="0" w:color="BFBFBF"/>
+              <w:bottom w:val="single" w:sz="4" w:space="0" w:color="BFBFBF"/>
+              <w:right w:val="single" w:sz="4" w:space="0" w:color="BFBFBF"/>
+            </w:tcBorders>
+            <w:tcMar>
+              <w:top w:w="60" w:type="dxa"/>
+              <w:left w:w="100" w:type="dxa"/>
+              <w:bottom w:w="60" w:type="dxa"/>
+              <w:right w:w="100" w:type="dxa"/>
+            </w:tcMar>
+          </w:tcPr>
+          <w:p>
+            <w:pPr>
+              <w:spacing w:after="20"/>
+            </w:pPr>
+            <w:r>
+              <w:rPr>
+                <w:rFonts w:ascii="Consolas" w:eastAsia="Consolas" w:hAnsi="Consolas" w:cs="Consolas"/>
+                <w:color w:val="7A1F33"/>
+                <w:sz w:val="19"/>
+                <w:szCs w:val="19"/>
+              </w:rPr>
+              <w:t>u, k, w</w:t>
+            </w:r>
+          </w:p>
+        </w:tc>
+        <w:tc>
+          <w:tcPr>
+            <w:tcW w:w="7863" w:type="dxa"/>
+            <w:tcBorders>
+              <w:top w:val="single" w:sz="4" w:space="0" w:color="BFBFBF"/>
+              <w:left w:val="single" w:sz="4" w:space="0" w:color="BFBFBF"/>
+              <w:bottom w:val="single" w:sz="4" w:space="0" w:color="BFBFBF"/>
+              <w:right w:val="single" w:sz="4" w:space="0" w:color="BFBFBF"/>
+            </w:tcBorders>
+            <w:tcMar>
+              <w:top w:w="60" w:type="dxa"/>
+              <w:left w:w="100" w:type="dxa"/>
+              <w:bottom w:w="60" w:type="dxa"/>
+              <w:right w:w="100" w:type="dxa"/>
+            </w:tcMar>
+          </w:tcPr>
+          <w:p>
+            <w:pPr>
+              <w:spacing w:after="20"/>
+            </w:pPr>
+            <w:r>
+              <w:t>Usuario de TikTok, API key e identificador del widget (van siempre en la URL)</w:t>
+            </w:r>
+          </w:p>
+        </w:tc>
+      </w:tr>
+      <w:tr>
+        <w:tc>
+          <w:tcPr>
+            <w:tcW w:w="1497" w:type="dxa"/>
+            <w:tcBorders>
+              <w:top w:val="single" w:sz="4" w:space="0" w:color="BFBFBF"/>
+              <w:left w:val="single" w:sz="4" w:space="0" w:color="BFBFBF"/>
+              <w:bottom w:val="single" w:sz="4" w:space="0" w:color="BFBFBF"/>
+              <w:right w:val="single" w:sz="4" w:space="0" w:color="BFBFBF"/>
+            </w:tcBorders>
+            <w:tcMar>
+              <w:top w:w="60" w:type="dxa"/>
+              <w:left w:w="100" w:type="dxa"/>
+              <w:bottom w:w="60" w:type="dxa"/>
+              <w:right w:w="100" w:type="dxa"/>
+            </w:tcMar>
+          </w:tcPr>
+          <w:p>
+            <w:pPr>
+              <w:spacing w:after="20"/>
+            </w:pPr>
+            <w:r>
+              <w:rPr>
+                <w:rFonts w:ascii="Consolas" w:eastAsia="Consolas" w:hAnsi="Consolas" w:cs="Consolas"/>
+                <w:color w:val="7A1F33"/>
+                <w:sz w:val="19"/>
+                <w:szCs w:val="19"/>
+              </w:rPr>
+              <w:t>ti</w:t>
+            </w:r>
+          </w:p>
+        </w:tc>
+        <w:tc>
+          <w:tcPr>
+            <w:tcW w:w="7863" w:type="dxa"/>
+            <w:tcBorders>
+              <w:top w:val="single" w:sz="4" w:space="0" w:color="BFBFBF"/>
+              <w:left w:val="single" w:sz="4" w:space="0" w:color="BFBFBF"/>
+              <w:bottom w:val="single" w:sz="4" w:space="0" w:color="BFBFBF"/>
+              <w:right w:val="single" w:sz="4" w:space="0" w:color="BFBFBF"/>
+            </w:tcBorders>
+            <w:tcMar>
+              <w:top w:w="60" w:type="dxa"/>
+              <w:left w:w="100" w:type="dxa"/>
+              <w:bottom w:w="60" w:type="dxa"/>
+              <w:right w:w="100" w:type="dxa"/>
+            </w:tcMar>
+          </w:tcPr>
+          <w:p>
+            <w:pPr>
+              <w:spacing w:after="20"/>
+            </w:pPr>
+            <w:r>
+              <w:t>Título (por defecto “Bóveda dorada”)</w:t>
+            </w:r>
+          </w:p>
+        </w:tc>
+      </w:tr>
+      <w:tr>
+        <w:tc>
+          <w:tcPr>
+            <w:tcW w:w="1497" w:type="dxa"/>
+            <w:tcBorders>
+              <w:top w:val="single" w:sz="4" w:space="0" w:color="BFBFBF"/>
+              <w:left w:val="single" w:sz="4" w:space="0" w:color="BFBFBF"/>
+              <w:bottom w:val="single" w:sz="4" w:space="0" w:color="BFBFBF"/>
+              <w:right w:val="single" w:sz="4" w:space="0" w:color="BFBFBF"/>
+            </w:tcBorders>
+            <w:tcMar>
+              <w:top w:w="60" w:type="dxa"/>
+              <w:left w:w="100" w:type="dxa"/>
+              <w:bottom w:w="60" w:type="dxa"/>
+              <w:right w:w="100" w:type="dxa"/>
+            </w:tcMar>
+          </w:tcPr>
+          <w:p>
+            <w:pPr>
+              <w:spacing w:after="20"/>
+            </w:pPr>
+            <w:r>
+              <w:rPr>
+                <w:rFonts w:ascii="Consolas" w:eastAsia="Consolas" w:hAnsi="Consolas" w:cs="Consolas"/>
+                <w:color w:val="7A1F33"/>
+                <w:sz w:val="19"/>
+                <w:szCs w:val="19"/>
+              </w:rPr>
+              <w:t>pi</w:t>
+            </w:r>
+          </w:p>
+        </w:tc>
+        <w:tc>
+          <w:tcPr>
+            <w:tcW w:w="7863" w:type="dxa"/>
+            <w:tcBorders>
+              <w:top w:val="single" w:sz="4" w:space="0" w:color="BFBFBF"/>
+              <w:left w:val="single" w:sz="4" w:space="0" w:color="BFBFBF"/>
+              <w:bottom w:val="single" w:sz="4" w:space="0" w:color="BFBFBF"/>
+              <w:right w:val="single" w:sz="4" w:space="0" w:color="BFBFBF"/>
+            </w:tcBorders>
+            <w:tcMar>
+              <w:top w:w="60" w:type="dxa"/>
+              <w:left w:w="100" w:type="dxa"/>
+              <w:bottom w:w="60" w:type="dxa"/>
+              <w:right w:w="100" w:type="dxa"/>
+            </w:tcMar>
+          </w:tcPr>
+          <w:p>
+            <w:pPr>
+              <w:spacing w:after="20"/>
+            </w:pPr>
+            <w:r>
+              <w:t>Pista: lo que se ve mientras está cerrada (por defecto “Premio secreto”)</w:t>
+            </w:r>
+          </w:p>
+        </w:tc>
+      </w:tr>
+      <w:tr>
+        <w:tc>
+          <w:tcPr>
+            <w:tcW w:w="1497" w:type="dxa"/>
+            <w:tcBorders>
+              <w:top w:val="single" w:sz="4" w:space="0" w:color="BFBFBF"/>
+              <w:left w:val="single" w:sz="4" w:space="0" w:color="BFBFBF"/>
+              <w:bottom w:val="single" w:sz="4" w:space="0" w:color="BFBFBF"/>
+              <w:right w:val="single" w:sz="4" w:space="0" w:color="BFBFBF"/>
+            </w:tcBorders>
+            <w:tcMar>
+              <w:top w:w="60" w:type="dxa"/>
+              <w:left w:w="100" w:type="dxa"/>
+              <w:bottom w:w="60" w:type="dxa"/>
+              <w:right w:w="100" w:type="dxa"/>
+            </w:tcMar>
+          </w:tcPr>
+          <w:p>
+            <w:pPr>
+              <w:spacing w:after="20"/>
+            </w:pPr>
+            <w:r>
+              <w:rPr>
+                <w:rFonts w:ascii="Consolas" w:eastAsia="Consolas" w:hAnsi="Consolas" w:cs="Consolas"/>
+                <w:color w:val="7A1F33"/>
+                <w:sz w:val="19"/>
+                <w:szCs w:val="19"/>
+              </w:rPr>
+              <w:t>sec</w:t>
+            </w:r>
+          </w:p>
+        </w:tc>
+        <w:tc>
+          <w:tcPr>
+            <w:tcW w:w="7863" w:type="dxa"/>
+            <w:tcBorders>
+              <w:top w:val="single" w:sz="4" w:space="0" w:color="BFBFBF"/>
+              <w:left w:val="single" w:sz="4" w:space="0" w:color="BFBFBF"/>
+              <w:bottom w:val="single" w:sz="4" w:space="0" w:color="BFBFBF"/>
+              <w:right w:val="single" w:sz="4" w:space="0" w:color="BFBFBF"/>
+            </w:tcBorders>
+            <w:tcMar>
+              <w:top w:w="60" w:type="dxa"/>
+              <w:left w:w="100" w:type="dxa"/>
+              <w:bottom w:w="60" w:type="dxa"/>
+              <w:right w:w="100" w:type="dxa"/>
+            </w:tcMar>
+          </w:tcPr>
+          <w:p>
+            <w:pPr>
+              <w:spacing w:after="20"/>
+            </w:pPr>
+            <w:r>
+              <w:t>Texto secreto que se revela al abrirse</w:t>
+            </w:r>
+          </w:p>
+        </w:tc>
+      </w:tr>
+      <w:tr>
+        <w:tc>
+          <w:tcPr>
+            <w:tcW w:w="1497" w:type="dxa"/>
+            <w:tcBorders>
+              <w:top w:val="single" w:sz="4" w:space="0" w:color="BFBFBF"/>
+              <w:left w:val="single" w:sz="4" w:space="0" w:color="BFBFBF"/>
+              <w:bottom w:val="single" w:sz="4" w:space="0" w:color="BFBFBF"/>
+              <w:right w:val="single" w:sz="4" w:space="0" w:color="BFBFBF"/>
+            </w:tcBorders>
+            <w:tcMar>
+              <w:top w:w="60" w:type="dxa"/>
+              <w:left w:w="100" w:type="dxa"/>
+              <w:bottom w:w="60" w:type="dxa"/>
+              <w:right w:w="100" w:type="dxa"/>
+            </w:tcMar>
+          </w:tcPr>
+          <w:p>
+            <w:pPr>
+              <w:spacing w:after="20"/>
+            </w:pPr>
+            <w:r>
+              <w:rPr>
+                <w:rFonts w:ascii="Consolas" w:eastAsia="Consolas" w:hAnsi="Consolas" w:cs="Consolas"/>
+                <w:color w:val="7A1F33"/>
+                <w:sz w:val="19"/>
+                <w:szCs w:val="19"/>
+              </w:rPr>
+              <w:t>o</w:t>
+            </w:r>
+          </w:p>
+        </w:tc>
+        <w:tc>
+          <w:tcPr>
+            <w:tcW w:w="7863" w:type="dxa"/>
+            <w:tcBorders>
+              <w:top w:val="single" w:sz="4" w:space="0" w:color="BFBFBF"/>
+              <w:left w:val="single" w:sz="4" w:space="0" w:color="BFBFBF"/>
+              <w:bottom w:val="single" w:sz="4" w:space="0" w:color="BFBFBF"/>
+              <w:right w:val="single" w:sz="4" w:space="0" w:color="BFBFBF"/>
+            </w:tcBorders>
+            <w:tcMar>
+              <w:top w:w="60" w:type="dxa"/>
+              <w:left w:w="100" w:type="dxa"/>
+              <w:bottom w:w="60" w:type="dxa"/>
+              <w:right w:w="100" w:type="dxa"/>
+            </w:tcMar>
+          </w:tcPr>
+          <w:p>
+            <w:pPr>
+              <w:spacing w:after="20"/>
+            </w:pPr>
+            <w:r>
+              <w:t>Meta en monedas</w:t>
+            </w:r>
+          </w:p>
+        </w:tc>
+      </w:tr>
+      <w:tr>
+        <w:tc>
+          <w:tcPr>
+            <w:tcW w:w="1497" w:type="dxa"/>
+            <w:tcBorders>
+              <w:top w:val="single" w:sz="4" w:space="0" w:color="BFBFBF"/>
+              <w:left w:val="single" w:sz="4" w:space="0" w:color="BFBFBF"/>
+              <w:bottom w:val="single" w:sz="4" w:space="0" w:color="BFBFBF"/>
+              <w:right w:val="single" w:sz="4" w:space="0" w:color="BFBFBF"/>
+            </w:tcBorders>
+            <w:tcMar>
+              <w:top w:w="60" w:type="dxa"/>
+              <w:left w:w="100" w:type="dxa"/>
+              <w:bottom w:w="60" w:type="dxa"/>
+              <w:right w:w="100" w:type="dxa"/>
+            </w:tcMar>
+          </w:tcPr>
+          <w:p>
+            <w:pPr>
+              <w:spacing w:after="20"/>
+            </w:pPr>
+            <w:r>
+              <w:rPr>
+                <w:rFonts w:ascii="Consolas" w:eastAsia="Consolas" w:hAnsi="Consolas" w:cs="Consolas"/>
+                <w:color w:val="7A1F33"/>
+                <w:sz w:val="19"/>
+                <w:szCs w:val="19"/>
+              </w:rPr>
+              <w:t>v</w:t>
+            </w:r>
+          </w:p>
+        </w:tc>
+        <w:tc>
+          <w:tcPr>
+            <w:tcW w:w="7863" w:type="dxa"/>
+            <w:tcBorders>
+              <w:top w:val="single" w:sz="4" w:space="0" w:color="BFBFBF"/>
+              <w:left w:val="single" w:sz="4" w:space="0" w:color="BFBFBF"/>
+              <w:bottom w:val="single" w:sz="4" w:space="0" w:color="BFBFBF"/>
+              <w:right w:val="single" w:sz="4" w:space="0" w:color="BFBFBF"/>
+            </w:tcBorders>
+            <w:tcMar>
+              <w:top w:w="60" w:type="dxa"/>
+              <w:left w:w="100" w:type="dxa"/>
+              <w:bottom w:w="60" w:type="dxa"/>
+              <w:right w:w="100" w:type="dxa"/>
+            </w:tcMar>
+          </w:tcPr>
+          <w:p>
+            <w:pPr>
+              <w:spacing w:after="20"/>
+            </w:pPr>
+            <w:r>
+              <w:t>Monedas de un regalo cuando TikTok no manda el precio (por defecto 1)</w:t>
+            </w:r>
+          </w:p>
+        </w:tc>
+      </w:tr>
+      <w:tr>
+        <w:tc>
+          <w:tcPr>
+            <w:tcW w:w="1497" w:type="dxa"/>
+            <w:tcBorders>
+              <w:top w:val="single" w:sz="4" w:space="0" w:color="BFBFBF"/>
+              <w:left w:val="single" w:sz="4" w:space="0" w:color="BFBFBF"/>
+              <w:bottom w:val="single" w:sz="4" w:space="0" w:color="BFBFBF"/>
+              <w:right w:val="single" w:sz="4" w:space="0" w:color="BFBFBF"/>
+            </w:tcBorders>
+            <w:tcMar>
+              <w:top w:w="60" w:type="dxa"/>
+              <w:left w:w="100" w:type="dxa"/>
+              <w:bottom w:w="60" w:type="dxa"/>
+              <w:right w:w="100" w:type="dxa"/>
+            </w:tcMar>
+          </w:tcPr>
+          <w:p>
+            <w:pPr>
+              <w:spacing w:after="20"/>
+            </w:pPr>
+            <w:r>
+              <w:rPr>
+                <w:rFonts w:ascii="Consolas" w:eastAsia="Consolas" w:hAnsi="Consolas" w:cs="Consolas"/>
+                <w:color w:val="7A1F33"/>
+                <w:sz w:val="19"/>
+                <w:szCs w:val="19"/>
+              </w:rPr>
+              <w:lastRenderedPageBreak/>
+              <w:t>ro</w:t>
+            </w:r>
+          </w:p>
+        </w:tc>
+        <w:tc>
+          <w:tcPr>
+            <w:tcW w:w="7863" w:type="dxa"/>
+            <w:tcBorders>
+              <w:top w:val="single" w:sz="4" w:space="0" w:color="BFBFBF"/>
+              <w:left w:val="single" w:sz="4" w:space="0" w:color="BFBFBF"/>
+              <w:bottom w:val="single" w:sz="4" w:space="0" w:color="BFBFBF"/>
+              <w:right w:val="single" w:sz="4" w:space="0" w:color="BFBFBF"/>
+            </w:tcBorders>
+            <w:tcMar>
+              <w:top w:w="60" w:type="dxa"/>
+              <w:left w:w="100" w:type="dxa"/>
+              <w:bottom w:w="60" w:type="dxa"/>
+              <w:right w:w="100" w:type="dxa"/>
+            </w:tcMar>
+          </w:tcPr>
+          <w:p>
+            <w:pPr>
+              <w:spacing w:after="20"/>
+            </w:pPr>
+            <w:r>
+              <w:t>Ronda: cambia con “Cerrar y reiniciar”. Cuando cambia, la bóveda se cierra y el progreso vuelve a 0</w:t>
+            </w:r>
+          </w:p>
+        </w:tc>
+      </w:tr>
+      <w:tr>
+        <w:tc>
+          <w:tcPr>
+            <w:tcW w:w="1497" w:type="dxa"/>
+            <w:tcBorders>
+              <w:top w:val="single" w:sz="4" w:space="0" w:color="BFBFBF"/>
+              <w:left w:val="single" w:sz="4" w:space="0" w:color="BFBFBF"/>
+              <w:bottom w:val="single" w:sz="4" w:space="0" w:color="BFBFBF"/>
+              <w:right w:val="single" w:sz="4" w:space="0" w:color="BFBFBF"/>
+            </w:tcBorders>
+            <w:tcMar>
+              <w:top w:w="60" w:type="dxa"/>
+              <w:left w:w="100" w:type="dxa"/>
+              <w:bottom w:w="60" w:type="dxa"/>
+              <w:right w:w="100" w:type="dxa"/>
+            </w:tcMar>
+          </w:tcPr>
+          <w:p>
+            <w:pPr>
+              <w:spacing w:after="20"/>
+            </w:pPr>
+            <w:r>
+              <w:rPr>
+                <w:rFonts w:ascii="Consolas" w:eastAsia="Consolas" w:hAnsi="Consolas" w:cs="Consolas"/>
+                <w:color w:val="7A1F33"/>
+                <w:sz w:val="19"/>
+                <w:szCs w:val="19"/>
+              </w:rPr>
+              <w:t>ab</w:t>
+            </w:r>
+          </w:p>
+        </w:tc>
+        <w:tc>
+          <w:tcPr>
+            <w:tcW w:w="7863" w:type="dxa"/>
+            <w:tcBorders>
+              <w:top w:val="single" w:sz="4" w:space="0" w:color="BFBFBF"/>
+              <w:left w:val="single" w:sz="4" w:space="0" w:color="BFBFBF"/>
+              <w:bottom w:val="single" w:sz="4" w:space="0" w:color="BFBFBF"/>
+              <w:right w:val="single" w:sz="4" w:space="0" w:color="BFBFBF"/>
+            </w:tcBorders>
+            <w:tcMar>
+              <w:top w:w="60" w:type="dxa"/>
+              <w:left w:w="100" w:type="dxa"/>
+              <w:bottom w:w="60" w:type="dxa"/>
+              <w:right w:w="100" w:type="dxa"/>
+            </w:tcMar>
+          </w:tcPr>
+          <w:p>
+            <w:pPr>
+              <w:spacing w:after="20"/>
+            </w:pPr>
+            <w:r>
+              <w:t>1 = “Abrir ahora”: se abre aunque no se haya llegado a la meta (vuelve a 0 al cerrar y reiniciar)</w:t>
+            </w:r>
+          </w:p>
+        </w:tc>
+      </w:tr>
+      <w:tr>
+        <w:tc>
+          <w:tcPr>
+            <w:tcW w:w="1497" w:type="dxa"/>
+            <w:tcBorders>
+              <w:top w:val="single" w:sz="4" w:space="0" w:color="BFBFBF"/>
+              <w:left w:val="single" w:sz="4" w:space="0" w:color="BFBFBF"/>
+              <w:bottom w:val="single" w:sz="4" w:space="0" w:color="BFBFBF"/>
+              <w:right w:val="single" w:sz="4" w:space="0" w:color="BFBFBF"/>
+            </w:tcBorders>
+            <w:tcMar>
+              <w:top w:w="60" w:type="dxa"/>
+              <w:left w:w="100" w:type="dxa"/>
+              <w:bottom w:w="60" w:type="dxa"/>
+              <w:right w:w="100" w:type="dxa"/>
+            </w:tcMar>
+          </w:tcPr>
+          <w:p>
+            <w:pPr>
+              <w:spacing w:after="20"/>
+            </w:pPr>
+            <w:r>
+              <w:rPr>
+                <w:rFonts w:ascii="Consolas" w:eastAsia="Consolas" w:hAnsi="Consolas" w:cs="Consolas"/>
+                <w:color w:val="7A1F33"/>
+                <w:sz w:val="19"/>
+                <w:szCs w:val="19"/>
+              </w:rPr>
+              <w:t>s</w:t>
+            </w:r>
+          </w:p>
+        </w:tc>
+        <w:tc>
+          <w:tcPr>
+            <w:tcW w:w="7863" w:type="dxa"/>
+            <w:tcBorders>
+              <w:top w:val="single" w:sz="4" w:space="0" w:color="BFBFBF"/>
+              <w:left w:val="single" w:sz="4" w:space="0" w:color="BFBFBF"/>
+              <w:bottom w:val="single" w:sz="4" w:space="0" w:color="BFBFBF"/>
+              <w:right w:val="single" w:sz="4" w:space="0" w:color="BFBFBF"/>
+            </w:tcBorders>
+            <w:tcMar>
+              <w:top w:w="60" w:type="dxa"/>
+              <w:left w:w="100" w:type="dxa"/>
+              <w:bottom w:w="60" w:type="dxa"/>
+              <w:right w:w="100" w:type="dxa"/>
+            </w:tcMar>
+          </w:tcPr>
+          <w:p>
+            <w:pPr>
+              <w:spacing w:after="20"/>
+            </w:pPr>
+            <w:r>
+              <w:t>Sonido (1 o 0): dos notas ascendentes al abrirse</w:t>
+            </w:r>
+          </w:p>
+        </w:tc>
+      </w:tr>
+      <w:tr>
+        <w:tc>
+          <w:tcPr>
+            <w:tcW w:w="1497" w:type="dxa"/>
+            <w:tcBorders>
+              <w:top w:val="single" w:sz="4" w:space="0" w:color="BFBFBF"/>
+              <w:left w:val="single" w:sz="4" w:space="0" w:color="BFBFBF"/>
+              <w:bottom w:val="single" w:sz="4" w:space="0" w:color="BFBFBF"/>
+              <w:right w:val="single" w:sz="4" w:space="0" w:color="BFBFBF"/>
+            </w:tcBorders>
+            <w:tcMar>
+              <w:top w:w="60" w:type="dxa"/>
+              <w:left w:w="100" w:type="dxa"/>
+              <w:bottom w:w="60" w:type="dxa"/>
+              <w:right w:w="100" w:type="dxa"/>
+            </w:tcMar>
+          </w:tcPr>
+          <w:p>
+            <w:pPr>
+              <w:spacing w:after="20"/>
+            </w:pPr>
+            <w:r>
+              <w:rPr>
+                <w:rFonts w:ascii="Consolas" w:eastAsia="Consolas" w:hAnsi="Consolas" w:cs="Consolas"/>
+                <w:color w:val="7A1F33"/>
+                <w:sz w:val="19"/>
+                <w:szCs w:val="19"/>
+              </w:rPr>
+              <w:t>est</w:t>
+            </w:r>
+          </w:p>
+        </w:tc>
+        <w:tc>
+          <w:tcPr>
+            <w:tcW w:w="7863" w:type="dxa"/>
+            <w:tcBorders>
+              <w:top w:val="single" w:sz="4" w:space="0" w:color="BFBFBF"/>
+              <w:left w:val="single" w:sz="4" w:space="0" w:color="BFBFBF"/>
+              <w:bottom w:val="single" w:sz="4" w:space="0" w:color="BFBFBF"/>
+              <w:right w:val="single" w:sz="4" w:space="0" w:color="BFBFBF"/>
+            </w:tcBorders>
+            <w:tcMar>
+              <w:top w:w="60" w:type="dxa"/>
+              <w:left w:w="100" w:type="dxa"/>
+              <w:bottom w:w="60" w:type="dxa"/>
+              <w:right w:w="100" w:type="dxa"/>
+            </w:tcMar>
+          </w:tcPr>
+          <w:p>
+            <w:pPr>
+              <w:spacing w:after="20"/>
+            </w:pPr>
+            <w:r>
+              <w:t>Estilo visual (lo aplica comun.js, igual que en los demás widgets)</w:t>
+            </w:r>
+          </w:p>
+        </w:tc>
+      </w:tr>
+    </w:tbl>
+    <w:p>
+      <w:pPr>
+        <w:spacing w:after="120"/>
+      </w:pPr>
+    </w:p>
+    <w:p>
+      <w:pPr>
+        <w:pStyle w:val="Heading3"/>
+      </w:pPr>
+      <w:r>
+        <w:t>Funcionamiento</w:t>
+      </w:r>
+    </w:p>
+    <w:p>
+      <w:pPr>
+        <w:pStyle w:val="ListParagraph"/>
+        <w:numPr>
+          <w:ilvl w:val="0"/>
+          <w:numId w:val="3"/>
+        </w:numPr>
+        <w:spacing w:after="60"/>
+      </w:pPr>
+      <w:r>
+        <w:t xml:space="preserve">Cada </w:t>
+      </w:r>
+      <w:r>
+        <w:rPr>
+          <w:rFonts w:ascii="Consolas" w:eastAsia="Consolas" w:hAnsi="Consolas" w:cs="Consolas"/>
+          <w:color w:val="7A1F33"/>
+          <w:sz w:val="19"/>
+          <w:szCs w:val="19"/>
+        </w:rPr>
+        <w:t>regalo</w:t>
+      </w:r>
+      <w:r>
+        <w:t xml:space="preserve"> suma </w:t>
+      </w:r>
+      <w:r>
+        <w:rPr>
+          <w:rFonts w:ascii="Consolas" w:eastAsia="Consolas" w:hAnsi="Consolas" w:cs="Consolas"/>
+          <w:color w:val="7A1F33"/>
+          <w:sz w:val="19"/>
+          <w:szCs w:val="19"/>
+        </w:rPr>
+        <w:t>diamantes × cantidad</w:t>
+      </w:r>
+      <w:r>
+        <w:t xml:space="preserve"> monedas (si el precio llega en 0, se usa </w:t>
+      </w:r>
+      <w:r>
+        <w:rPr>
+          <w:rFonts w:ascii="Consolas" w:eastAsia="Consolas" w:hAnsi="Consolas" w:cs="Consolas"/>
+          <w:color w:val="7A1F33"/>
+          <w:sz w:val="19"/>
+          <w:szCs w:val="19"/>
+        </w:rPr>
+        <w:t>v</w:t>
+      </w:r>
+      <w:r>
+        <w:t>). Los demás eventos no cuentan. Cada regalo da un pequeño destello a la tarjeta.</w:t>
+      </w:r>
+    </w:p>
+    <w:p>
+      <w:pPr>
+        <w:pStyle w:val="ListParagraph"/>
+        <w:numPr>
+          <w:ilvl w:val="0"/>
+          <w:numId w:val="3"/>
+        </w:numPr>
+        <w:spacing w:after="60"/>
+      </w:pPr>
+      <w:r>
+        <w:t xml:space="preserve">Al llegar a la meta (o con </w:t>
+      </w:r>
+      <w:r>
+        <w:rPr>
+          <w:rFonts w:ascii="Consolas" w:eastAsia="Consolas" w:hAnsi="Consolas" w:cs="Consolas"/>
+          <w:color w:val="7A1F33"/>
+          <w:sz w:val="19"/>
+          <w:szCs w:val="19"/>
+        </w:rPr>
+        <w:t>ab = 1</w:t>
+      </w:r>
+      <w:r>
+        <w:t>), la bóveda se abre: el arco del candado sube y gira, el candado brilla y se desvanece, la tarjeta se ensancha con un destello y el secreto aparece pasando de desenfocado y espaciado a nítido. Todo con opacidad, desenfoque y transformaciones suaves, sin 3D.</w:t>
+      </w:r>
+    </w:p>
+    <w:p>
+      <w:pPr>
+        <w:pStyle w:val="ListParagraph"/>
+        <w:numPr>
+          <w:ilvl w:val="0"/>
+          <w:numId w:val="3"/>
+        </w:numPr>
+        <w:spacing w:after="60"/>
+      </w:pPr>
+      <w:r>
+        <w:t>Ya abierta, los regalos siguientes no cuentan y la barra queda en 100 %. Si la meta baja hasta lo ya juntado, se abre sola.</w:t>
+      </w:r>
+    </w:p>
+    <w:p>
+      <w:pPr>
+        <w:pStyle w:val="ListParagraph"/>
+        <w:numPr>
+          <w:ilvl w:val="0"/>
+          <w:numId w:val="3"/>
+        </w:numPr>
+        <w:spacing w:after="60"/>
+      </w:pPr>
+      <w:r>
+        <w:t>El texto secreto no se escribe en la página hasta que la bóveda se abre.</w:t>
+      </w:r>
+    </w:p>
+    <w:p>
+      <w:pPr>
+        <w:pStyle w:val="ListParagraph"/>
+        <w:numPr>
+          <w:ilvl w:val="0"/>
+          <w:numId w:val="3"/>
+        </w:numPr>
+        <w:spacing w:after="60"/>
+      </w:pPr>
+      <w:r>
+        <w:t>El progreso y si está abierta se guardan en el navegador de OBS (</w:t>
+      </w:r>
+      <w:r>
+        <w:rPr>
+          <w:rFonts w:ascii="Consolas" w:eastAsia="Consolas" w:hAnsi="Consolas" w:cs="Consolas"/>
+          <w:color w:val="7A1F33"/>
+          <w:sz w:val="19"/>
+          <w:szCs w:val="19"/>
+        </w:rPr>
+        <w:t>localStorage</w:t>
+      </w:r>
+      <w:r>
+        <w:t xml:space="preserve">, clave </w:t>
+      </w:r>
+      <w:r>
+        <w:rPr>
+          <w:rFonts w:ascii="Consolas" w:eastAsia="Consolas" w:hAnsi="Consolas" w:cs="Consolas"/>
+          <w:color w:val="7A1F33"/>
+          <w:sz w:val="19"/>
+          <w:szCs w:val="19"/>
+        </w:rPr>
+        <w:t>live-tools:boveda:&lt;w&gt;</w:t>
+      </w:r>
+      <w:r>
+        <w:t>) con la ronda: si OBS recarga la fuente, sigue igual.</w:t>
+      </w:r>
+    </w:p>
+    <w:p>
+      <w:pPr>
+        <w:pBdr>
+          <w:left w:val="single" w:sz="18" w:space="8" w:color="E5304F"/>
+        </w:pBdr>
+        <w:shd w:val="clear" w:color="auto" w:fill="FDECEF"/>
+        <w:spacing w:before="120" w:after="160"/>
+        <w:ind w:left="200" w:right="200"/>
+      </w:pPr>
+      <w:r>
+        <w:rPr>
+          <w:b/>
+          <w:bCs/>
+          <w:color w:val="E5304F"/>
+        </w:rPr>
+        <w:t xml:space="preserve">Limitación: </w:t>
+      </w:r>
+      <w:r>
+        <w:t>El secreto viaja en la configuración del widget (en Supabase y, sin Supabase, en la URL): está oculto en pantalla, pero quien tenga la URL del widget podría leerlo. Además, el panel no ve el progreso, porque lo cuenta el widget en OBS.</w:t>
+      </w:r>
+    </w:p>
+    <w:p>
+      <w:pPr>
         <w:pStyle w:val="Heading1"/>
         <w:pageBreakBefore/>
       </w:pPr>
-      <w:bookmarkStart w:id="28" w:name="_Toc242787914"/>
+      <w:bookmarkStart w:id="29" w:name="_Toc242788243"/>
       <w:r>
         <w:lastRenderedPageBreak/>
         <w:t>8. Frontend: el panel</w:t>
       </w:r>
-      <w:bookmarkEnd w:id="28"/>
+      <w:bookmarkEnd w:id="29"/>
     </w:p>
     <w:p>
       <w:pPr>
         <w:pStyle w:val="Heading2"/>
       </w:pPr>
-      <w:bookmarkStart w:id="29" w:name="_Toc242787915"/>
+      <w:bookmarkStart w:id="30" w:name="_Toc242788244"/>
       <w:r>
         <w:t>8.1 Estructura de la página (index.html)</w:t>
       </w:r>
-      <w:bookmarkEnd w:id="29"/>
+      <w:bookmarkEnd w:id="30"/>
     </w:p>
     <w:p>
       <w:pPr>
@@ -19546,11 +20563,11 @@
       <w:pPr>
         <w:pStyle w:val="Heading2"/>
       </w:pPr>
-      <w:bookmarkStart w:id="30" w:name="_Toc242787916"/>
+      <w:bookmarkStart w:id="31" w:name="_Toc242788245"/>
       <w:r>
         <w:t>8.2 Navegación y ciclo de vida (app.js)</w:t>
       </w:r>
-      <w:bookmarkEnd w:id="30"/>
+      <w:bookmarkEnd w:id="31"/>
     </w:p>
     <w:p>
       <w:pPr>
@@ -19727,11 +20744,11 @@
       <w:pPr>
         <w:pStyle w:val="Heading2"/>
       </w:pPr>
-      <w:bookmarkStart w:id="31" w:name="_Toc242787917"/>
+      <w:bookmarkStart w:id="32" w:name="_Toc242788246"/>
       <w:r>
         <w:t>8.3 Mapa del panel (registro.js)</w:t>
       </w:r>
-      <w:bookmarkEnd w:id="31"/>
+      <w:bookmarkEnd w:id="32"/>
     </w:p>
     <w:p>
       <w:pPr>
@@ -20233,7 +21250,7 @@
               <w:spacing w:after="20"/>
             </w:pPr>
             <w:r>
-              <w:t>Carrera de regalos (carrera), Batalla de regalos (batalla), Jefe del LIVE (jefe), Subathon (subathon)</w:t>
+              <w:t>Carrera de regalos (carrera), Batalla de regalos (batalla), Jefe del LIVE (jefe), Subathon (subathon), Bóveda dorada (boveda)</w:t>
             </w:r>
           </w:p>
         </w:tc>
@@ -20260,6 +21277,7 @@
               <w:spacing w:after="20"/>
             </w:pPr>
             <w:r>
+              <w:lastRenderedPageBreak/>
               <w:t>Actividad</w:t>
             </w:r>
           </w:p>
@@ -20512,11 +21530,11 @@
       <w:pPr>
         <w:pStyle w:val="Heading2"/>
       </w:pPr>
-      <w:bookmarkStart w:id="32" w:name="_Toc242787918"/>
+      <w:bookmarkStart w:id="33" w:name="_Toc242788247"/>
       <w:r>
         <w:t>8.4 Datos guardados (almacen.js)</w:t>
       </w:r>
-      <w:bookmarkEnd w:id="32"/>
+      <w:bookmarkEnd w:id="33"/>
     </w:p>
     <w:p>
       <w:pPr>
@@ -21311,11 +22329,11 @@
       <w:pPr>
         <w:pStyle w:val="Heading2"/>
       </w:pPr>
-      <w:bookmarkStart w:id="33" w:name="_Toc242787919"/>
+      <w:bookmarkStart w:id="34" w:name="_Toc242788248"/>
       <w:r>
         <w:t>8.5 Conexión del panel al LIVE (envivo.js)</w:t>
       </w:r>
-      <w:bookmarkEnd w:id="33"/>
+      <w:bookmarkEnd w:id="34"/>
     </w:p>
     <w:p>
       <w:pPr>
@@ -21361,6 +22379,7 @@
         <w:spacing w:after="60"/>
       </w:pPr>
       <w:r>
+        <w:lastRenderedPageBreak/>
         <w:t>Los regalos de la sesión, y además envía cada regalo al catálogo permanente del almacén.</w:t>
       </w:r>
     </w:p>
@@ -21376,12 +22395,11 @@
       <w:pPr>
         <w:pStyle w:val="Heading2"/>
       </w:pPr>
-      <w:bookmarkStart w:id="34" w:name="_Toc242787920"/>
-      <w:r>
-        <w:lastRenderedPageBreak/>
+      <w:bookmarkStart w:id="35" w:name="_Toc242788249"/>
+      <w:r>
         <w:t>8.6 Componentes de interfaz (ui.js)</w:t>
       </w:r>
-      <w:bookmarkEnd w:id="34"/>
+      <w:bookmarkEnd w:id="35"/>
     </w:p>
     <w:tbl>
       <w:tblPr>
@@ -21885,11 +22903,11 @@
       <w:pPr>
         <w:pStyle w:val="Heading2"/>
       </w:pPr>
-      <w:bookmarkStart w:id="35" w:name="_Toc242787921"/>
+      <w:bookmarkStart w:id="36" w:name="_Toc242788250"/>
       <w:r>
         <w:t>8.7 Las vistas</w:t>
       </w:r>
-      <w:bookmarkEnd w:id="35"/>
+      <w:bookmarkEnd w:id="36"/>
     </w:p>
     <w:p>
       <w:pPr>
@@ -21952,11 +22970,11 @@
         <w:spacing w:after="120"/>
       </w:pPr>
       <w:r>
-        <w:t xml:space="preserve">Tres tarjetas. La del widget tiene el título sobre el reloj y, en Personalizar, “Contar regalos solo con el reloj en marcha”, sonidos y el estilo visual; sus pruebas son “Regalo al azar”, “Combo ×10 al azar” y “Combo ×50 al primero”. Reloj de la ronda: el tiempo en grande con su estado, los botones Iniciar (Reanudar en pausa, Nueva ronda al terminar), Pausar y Reiniciar, y la duración en segundos. Integrantes (1 a 6): una fila por integrante con color, nombre, ID del regalo (con sugerencias del Buscador de regalos), nombre del regalo, monedas por regalo y meta. Al escribir un ID que ya está en el catálogo se completan solos el nombre y el precio, y la imagen viaja al widget. Un integrante sin regalo o </w:t>
+        <w:t xml:space="preserve">Tres tarjetas. La del widget tiene el título sobre el reloj y, en Personalizar, “Contar regalos solo con el reloj en marcha”, sonidos y el estilo visual; sus pruebas son “Regalo al azar”, “Combo ×10 al azar” y “Combo ×50 al primero”. Reloj de la ronda: el tiempo en grande con su estado, los botones Iniciar (Reanudar en pausa, Nueva ronda al terminar), Pausar y Reiniciar, y la duración en segundos. </w:t>
       </w:r>
       <w:r>
         <w:lastRenderedPageBreak/>
-        <w:t>dos con el mismo regalo se avisan en rojo, pero no bloquean el envío: si bloquearan, el reloj tampoco llegaría a OBS.</w:t>
+        <w:t>Integrantes (1 a 6): una fila por integrante con color, nombre, ID del regalo (con sugerencias del Buscador de regalos), nombre del regalo, monedas por regalo y meta. Al escribir un ID que ya está en el catálogo se completan solos el nombre y el precio, y la imagen viaja al widget. Un integrante sin regalo o dos con el mismo regalo se avisan en rojo, pero no bloquean el envío: si bloquearan, el reloj tampoco llegaría a OBS.</w:t>
       </w:r>
     </w:p>
     <w:p>
@@ -22005,6 +23023,46 @@
       </w:pPr>
       <w:r>
         <w:t>La tarjeta del widget tiene el título, el tiempo inicial y el tope en minutos; en Personalizar, los sonidos y el estilo. Sus pruebas: “+100 likes”, “Rosa”, “Regalo de 30” y “Regalo de 1.000”. La tarjeta Reloj muestra el tiempo base (con los “+5 min”, sin lo que sume el chat) y los botones Iniciar (Reanudar en pausa), Pausar, +5 min y Reiniciar, que se suben a Supabase al instante. La tarjeta Tiempo que suma el chat tiene los segundos por 100 likes, los segundos por moneda y las monedas de un regalo sin precio, y muestra ejemplos (“una rosa suma 0:10; un regalo de 100 monedas, 16:40”).</w:t>
+      </w:r>
+    </w:p>
+    <w:p>
+      <w:pPr>
+        <w:pStyle w:val="Heading3"/>
+      </w:pPr>
+      <w:r>
+        <w:t>Bóveda dorada</w:t>
+      </w:r>
+    </w:p>
+    <w:p>
+      <w:pPr>
+        <w:spacing w:after="120"/>
+      </w:pPr>
+      <w:r>
+        <w:t xml:space="preserve">La tarjeta del widget tiene la meta en monedas, el texto secreto, el título y la pista; en Personalizar, las monedas de un regalo sin precio, el sonido y el estilo. Sus pruebas: “Regalo de 100”, “Rosa ×10” y “Regalo de 1.000”. La tarjeta Bóveda dice si está cerrada o abierta a la fuerza y tiene los botones Cerrar y reiniciar (nueva ronda, </w:t>
+      </w:r>
+      <w:r>
+        <w:rPr>
+          <w:rFonts w:ascii="Consolas" w:eastAsia="Consolas" w:hAnsi="Consolas" w:cs="Consolas"/>
+          <w:color w:val="7A1F33"/>
+          <w:sz w:val="19"/>
+          <w:szCs w:val="19"/>
+        </w:rPr>
+        <w:t>abierta</w:t>
+      </w:r>
+      <w:r>
+        <w:t xml:space="preserve"> en falso) y Abrir ahora (</w:t>
+      </w:r>
+      <w:r>
+        <w:rPr>
+          <w:rFonts w:ascii="Consolas" w:eastAsia="Consolas" w:hAnsi="Consolas" w:cs="Consolas"/>
+          <w:color w:val="7A1F33"/>
+          <w:sz w:val="19"/>
+          <w:szCs w:val="19"/>
+        </w:rPr>
+        <w:t>abierta</w:t>
+      </w:r>
+      <w:r>
+        <w:t xml:space="preserve"> en verdadero), que se suben a Supabase al instante.</w:t>
       </w:r>
     </w:p>
     <w:p>
@@ -22040,6 +23098,7 @@
         <w:pStyle w:val="Heading3"/>
       </w:pPr>
       <w:r>
+        <w:lastRenderedPageBreak/>
         <w:t>Buscador de regalos</w:t>
       </w:r>
     </w:p>
@@ -22121,12 +23180,11 @@
       <w:pPr>
         <w:pStyle w:val="Heading2"/>
       </w:pPr>
-      <w:bookmarkStart w:id="36" w:name="_Toc242787922"/>
-      <w:r>
-        <w:lastRenderedPageBreak/>
+      <w:bookmarkStart w:id="37" w:name="_Toc242788251"/>
+      <w:r>
         <w:t>8.8 Vista previa y pruebas</w:t>
       </w:r>
-      <w:bookmarkEnd w:id="36"/>
+      <w:bookmarkEnd w:id="37"/>
     </w:p>
     <w:p>
       <w:pPr>
@@ -22187,18 +23245,18 @@
         <w:spacing w:after="120"/>
       </w:pPr>
       <w:r>
-        <w:t>Un cambio de estilo se le pasa a la vista previa por mensaje ({ tipo: "tema" }) sin recargarla; el resto de la configuración la reinicia 400 ms después. La excepción son las claves de sinRecargar: la carrera y el jefe mandan el reloj y la ronda, la batalla la ronda y el subathon además los “+5 min”, con { tipo: "config" }, así Iniciar, Pausar o Reiniciar batalla no borran los puntos de prueba.</w:t>
+        <w:t>Un cambio de estilo se le pasa a la vista previa por mensaje ({ tipo: "tema" }) sin recargarla; el resto de la configuración la reinicia 400 ms después. La excepción son las claves de sinRecargar: la carrera y el jefe mandan el reloj y la ronda, la batalla la ronda, el subathon además los “+5 min” y la bóveda la ronda y “abrir ahora”, con { tipo: "config" }, así Iniciar, Pausar o Reiniciar batalla no borran los puntos de prueba.</w:t>
       </w:r>
     </w:p>
     <w:p>
       <w:pPr>
         <w:pStyle w:val="Heading2"/>
       </w:pPr>
-      <w:bookmarkStart w:id="37" w:name="_Toc242787923"/>
+      <w:bookmarkStart w:id="38" w:name="_Toc242788252"/>
       <w:r>
         <w:t>8.9 Cambios en vivo en el panel (sincronizar.js)</w:t>
       </w:r>
-      <w:bookmarkEnd w:id="37"/>
+      <w:bookmarkEnd w:id="38"/>
     </w:p>
     <w:p>
       <w:pPr>
@@ -22262,7 +23320,7 @@
         <w:spacing w:after="60"/>
       </w:pPr>
       <w:r>
-        <w:t>Los botones del reloj de la carrera, del jefe y del subathon (Iniciar, Pausar, Reiniciar, +5 min) y Reiniciar batalla guardan y llaman sincronizar.subir(id) de inmediato, sin la espera de 0,6 s. La validación de la carrera solo bloquea si no hay integrantes; la de la batalla nunca bloquea.</w:t>
+        <w:t>Los botones del reloj de la carrera, del jefe y del subathon (Iniciar, Pausar, Reiniciar, +5 min) , Reiniciar batalla y las órdenes de la bóveda guardan y llaman sincronizar.subir(id) de inmediato, sin la espera de 0,6 s. La validación de la carrera solo bloquea si no hay integrantes; la de la batalla nunca bloquea.</w:t>
       </w:r>
     </w:p>
     <w:p>
@@ -22283,22 +23341,22 @@
         <w:pStyle w:val="Heading1"/>
         <w:pageBreakBefore/>
       </w:pPr>
-      <w:bookmarkStart w:id="38" w:name="_Toc242787924"/>
+      <w:bookmarkStart w:id="39" w:name="_Toc242788253"/>
       <w:r>
         <w:lastRenderedPageBreak/>
         <w:t>9. Flujos completos paso a paso</w:t>
       </w:r>
-      <w:bookmarkEnd w:id="38"/>
+      <w:bookmarkEnd w:id="39"/>
     </w:p>
     <w:p>
       <w:pPr>
         <w:pStyle w:val="Heading2"/>
       </w:pPr>
-      <w:bookmarkStart w:id="39" w:name="_Toc242787925"/>
+      <w:bookmarkStart w:id="40" w:name="_Toc242788254"/>
       <w:r>
         <w:t>9.1 Configurar un widget y ponerlo en OBS</w:t>
       </w:r>
-      <w:bookmarkEnd w:id="39"/>
+      <w:bookmarkEnd w:id="40"/>
     </w:p>
     <w:p>
       <w:pPr>
@@ -22477,11 +23535,11 @@
       <w:pPr>
         <w:pStyle w:val="Heading2"/>
       </w:pPr>
-      <w:bookmarkStart w:id="40" w:name="_Toc242787926"/>
+      <w:bookmarkStart w:id="41" w:name="_Toc242788255"/>
       <w:r>
         <w:t>9.2 Llega un regalo y gira la ruleta</w:t>
       </w:r>
-      <w:bookmarkEnd w:id="40"/>
+      <w:bookmarkEnd w:id="41"/>
     </w:p>
     <w:p>
       <w:pPr>
@@ -22618,11 +23676,11 @@
       <w:pPr>
         <w:pStyle w:val="Heading2"/>
       </w:pPr>
-      <w:bookmarkStart w:id="41" w:name="_Toc242787927"/>
+      <w:bookmarkStart w:id="42" w:name="_Toc242788256"/>
       <w:r>
         <w:t>9.3 Probar sin estar en vivo</w:t>
       </w:r>
-      <w:bookmarkEnd w:id="41"/>
+      <w:bookmarkEnd w:id="42"/>
     </w:p>
     <w:p>
       <w:pPr>
@@ -22713,12 +23771,12 @@
       <w:pPr>
         <w:pStyle w:val="Heading2"/>
       </w:pPr>
-      <w:bookmarkStart w:id="42" w:name="_Toc242787928"/>
+      <w:bookmarkStart w:id="43" w:name="_Toc242788257"/>
       <w:r>
         <w:lastRenderedPageBreak/>
         <w:t>9.4 Un regalo cambia de código</w:t>
       </w:r>
-      <w:bookmarkEnd w:id="42"/>
+      <w:bookmarkEnd w:id="43"/>
     </w:p>
     <w:p>
       <w:pPr>
@@ -23082,11 +24140,11 @@
       <w:pPr>
         <w:pStyle w:val="Heading2"/>
       </w:pPr>
-      <w:bookmarkStart w:id="43" w:name="_Toc242787929"/>
+      <w:bookmarkStart w:id="44" w:name="_Toc242788258"/>
       <w:r>
         <w:t>9.5 Cambiar la configuración durante el LIVE</w:t>
       </w:r>
-      <w:bookmarkEnd w:id="43"/>
+      <w:bookmarkEnd w:id="44"/>
     </w:p>
     <w:p>
       <w:pPr>
@@ -23144,11 +24202,11 @@
       <w:pPr>
         <w:pStyle w:val="Heading2"/>
       </w:pPr>
-      <w:bookmarkStart w:id="44" w:name="_Toc242787930"/>
+      <w:bookmarkStart w:id="45" w:name="_Toc242788259"/>
       <w:r>
         <w:t>9.6 Una ronda de la carrera de regalos</w:t>
       </w:r>
-      <w:bookmarkEnd w:id="44"/>
+      <w:bookmarkEnd w:id="45"/>
     </w:p>
     <w:p>
       <w:pPr>
@@ -23258,22 +24316,22 @@
         <w:pStyle w:val="Heading1"/>
         <w:pageBreakBefore/>
       </w:pPr>
-      <w:bookmarkStart w:id="45" w:name="_Toc242787931"/>
+      <w:bookmarkStart w:id="46" w:name="_Toc242788260"/>
       <w:r>
         <w:lastRenderedPageBreak/>
         <w:t>10. Diseño visual</w:t>
       </w:r>
-      <w:bookmarkEnd w:id="45"/>
+      <w:bookmarkEnd w:id="46"/>
     </w:p>
     <w:p>
       <w:pPr>
         <w:pStyle w:val="Heading2"/>
       </w:pPr>
-      <w:bookmarkStart w:id="46" w:name="_Toc242787932"/>
+      <w:bookmarkStart w:id="47" w:name="_Toc242788261"/>
       <w:r>
         <w:t>10.1 Panel</w:t>
       </w:r>
-      <w:bookmarkEnd w:id="46"/>
+      <w:bookmarkEnd w:id="47"/>
     </w:p>
     <w:p>
       <w:pPr>
@@ -24078,11 +25136,11 @@
       <w:pPr>
         <w:pStyle w:val="Heading2"/>
       </w:pPr>
-      <w:bookmarkStart w:id="47" w:name="_Toc242787933"/>
+      <w:bookmarkStart w:id="48" w:name="_Toc242788262"/>
       <w:r>
         <w:t>10.2 Widgets</w:t>
       </w:r>
-      <w:bookmarkEnd w:id="47"/>
+      <w:bookmarkEnd w:id="48"/>
     </w:p>
     <w:p>
       <w:pPr>
@@ -24640,12 +25698,12 @@
         <w:pStyle w:val="Heading1"/>
         <w:pageBreakBefore/>
       </w:pPr>
-      <w:bookmarkStart w:id="48" w:name="_Toc242787934"/>
+      <w:bookmarkStart w:id="49" w:name="_Toc242788263"/>
       <w:r>
         <w:lastRenderedPageBreak/>
         <w:t>11. Seguridad y privacidad</w:t>
       </w:r>
-      <w:bookmarkEnd w:id="48"/>
+      <w:bookmarkEnd w:id="49"/>
     </w:p>
     <w:tbl>
       <w:tblPr>
@@ -25158,12 +26216,12 @@
         <w:pStyle w:val="Heading1"/>
         <w:pageBreakBefore/>
       </w:pPr>
-      <w:bookmarkStart w:id="49" w:name="_Toc242787935"/>
+      <w:bookmarkStart w:id="50" w:name="_Toc242788264"/>
       <w:r>
         <w:lastRenderedPageBreak/>
         <w:t>12. Limitaciones actuales</w:t>
       </w:r>
-      <w:bookmarkEnd w:id="49"/>
+      <w:bookmarkEnd w:id="50"/>
     </w:p>
     <w:tbl>
       <w:tblPr>
@@ -25901,7 +26959,7 @@
               <w:spacing w:after="20"/>
             </w:pPr>
             <w:r>
-              <w:t>Si OBS recarga la fuente, se pierde el conteo (la carrera, la batalla, el jefe y el subathon sí conservan su progreso)</w:t>
+              <w:t>Si OBS recarga la fuente, se pierde el conteo (los juegos sí conservan su progreso)</w:t>
             </w:r>
           </w:p>
         </w:tc>
@@ -26609,6 +27667,83 @@
           </w:p>
         </w:tc>
       </w:tr>
+      <w:tr>
+        <w:tc>
+          <w:tcPr>
+            <w:tcW w:w="2808" w:type="dxa"/>
+            <w:tcBorders>
+              <w:top w:val="single" w:sz="4" w:space="0" w:color="BFBFBF"/>
+              <w:left w:val="single" w:sz="4" w:space="0" w:color="BFBFBF"/>
+              <w:bottom w:val="single" w:sz="4" w:space="0" w:color="BFBFBF"/>
+              <w:right w:val="single" w:sz="4" w:space="0" w:color="BFBFBF"/>
+            </w:tcBorders>
+            <w:tcMar>
+              <w:top w:w="60" w:type="dxa"/>
+              <w:left w:w="100" w:type="dxa"/>
+              <w:bottom w:w="60" w:type="dxa"/>
+              <w:right w:w="100" w:type="dxa"/>
+            </w:tcMar>
+          </w:tcPr>
+          <w:p>
+            <w:pPr>
+              <w:spacing w:after="20"/>
+            </w:pPr>
+            <w:r>
+              <w:t>El secreto de la bóveda no es secreto para quien tenga la URL</w:t>
+            </w:r>
+          </w:p>
+        </w:tc>
+        <w:tc>
+          <w:tcPr>
+            <w:tcW w:w="2808" w:type="dxa"/>
+            <w:tcBorders>
+              <w:top w:val="single" w:sz="4" w:space="0" w:color="BFBFBF"/>
+              <w:left w:val="single" w:sz="4" w:space="0" w:color="BFBFBF"/>
+              <w:bottom w:val="single" w:sz="4" w:space="0" w:color="BFBFBF"/>
+              <w:right w:val="single" w:sz="4" w:space="0" w:color="BFBFBF"/>
+            </w:tcBorders>
+            <w:tcMar>
+              <w:top w:w="60" w:type="dxa"/>
+              <w:left w:w="100" w:type="dxa"/>
+              <w:bottom w:w="60" w:type="dxa"/>
+              <w:right w:w="100" w:type="dxa"/>
+            </w:tcMar>
+          </w:tcPr>
+          <w:p>
+            <w:pPr>
+              <w:spacing w:after="20"/>
+            </w:pPr>
+            <w:r>
+              <w:t>Viaja en la configuración del widget</w:t>
+            </w:r>
+          </w:p>
+        </w:tc>
+        <w:tc>
+          <w:tcPr>
+            <w:tcW w:w="3744" w:type="dxa"/>
+            <w:tcBorders>
+              <w:top w:val="single" w:sz="4" w:space="0" w:color="BFBFBF"/>
+              <w:left w:val="single" w:sz="4" w:space="0" w:color="BFBFBF"/>
+              <w:bottom w:val="single" w:sz="4" w:space="0" w:color="BFBFBF"/>
+              <w:right w:val="single" w:sz="4" w:space="0" w:color="BFBFBF"/>
+            </w:tcBorders>
+            <w:tcMar>
+              <w:top w:w="60" w:type="dxa"/>
+              <w:left w:w="100" w:type="dxa"/>
+              <w:bottom w:w="60" w:type="dxa"/>
+              <w:right w:w="100" w:type="dxa"/>
+            </w:tcMar>
+          </w:tcPr>
+          <w:p>
+            <w:pPr>
+              <w:spacing w:after="20"/>
+            </w:pPr>
+            <w:r>
+              <w:t>Solo está oculto en pantalla; no compartir la URL del widget</w:t>
+            </w:r>
+          </w:p>
+        </w:tc>
+      </w:tr>
     </w:tbl>
     <w:p>
       <w:pPr>
@@ -26620,12 +27755,12 @@
         <w:pStyle w:val="Heading1"/>
         <w:pageBreakBefore/>
       </w:pPr>
-      <w:bookmarkStart w:id="50" w:name="_Toc242787936"/>
+      <w:bookmarkStart w:id="51" w:name="_Toc242788265"/>
       <w:r>
         <w:lastRenderedPageBreak/>
         <w:t>13. Hacia una versión final montada en un servidor</w:t>
       </w:r>
-      <w:bookmarkEnd w:id="50"/>
+      <w:bookmarkEnd w:id="51"/>
     </w:p>
     <w:p>
       <w:pPr>
@@ -26649,11 +27784,11 @@
       <w:pPr>
         <w:pStyle w:val="Heading2"/>
       </w:pPr>
-      <w:bookmarkStart w:id="51" w:name="_Toc242787937"/>
+      <w:bookmarkStart w:id="52" w:name="_Toc242788266"/>
       <w:r>
         <w:t>13.1 Objetivos de la versión final</w:t>
       </w:r>
-      <w:bookmarkEnd w:id="51"/>
+      <w:bookmarkEnd w:id="52"/>
     </w:p>
     <w:p>
       <w:pPr>
@@ -26811,11 +27946,11 @@
       <w:pPr>
         <w:pStyle w:val="Heading2"/>
       </w:pPr>
-      <w:bookmarkStart w:id="52" w:name="_Toc242787938"/>
+      <w:bookmarkStart w:id="53" w:name="_Toc242788267"/>
       <w:r>
         <w:t>13.2 Arquitectura propuesta</w:t>
       </w:r>
-      <w:bookmarkEnd w:id="52"/>
+      <w:bookmarkEnd w:id="53"/>
     </w:p>
     <w:p>
       <w:pPr>
@@ -27644,11 +28779,11 @@
       <w:pPr>
         <w:pStyle w:val="Heading2"/>
       </w:pPr>
-      <w:bookmarkStart w:id="53" w:name="_Toc242787939"/>
+      <w:bookmarkStart w:id="54" w:name="_Toc242788268"/>
       <w:r>
         <w:t>13.3 Modelo de datos sugerido</w:t>
       </w:r>
-      <w:bookmarkEnd w:id="53"/>
+      <w:bookmarkEnd w:id="54"/>
     </w:p>
     <w:tbl>
       <w:tblPr>
@@ -28355,12 +29490,12 @@
       <w:pPr>
         <w:pStyle w:val="Heading2"/>
       </w:pPr>
-      <w:bookmarkStart w:id="54" w:name="_Toc242787940"/>
+      <w:bookmarkStart w:id="55" w:name="_Toc242788269"/>
       <w:r>
         <w:lastRenderedPageBreak/>
         <w:t>13.4 Seguridad en la versión final</w:t>
       </w:r>
-      <w:bookmarkEnd w:id="54"/>
+      <w:bookmarkEnd w:id="55"/>
     </w:p>
     <w:p>
       <w:pPr>
@@ -28594,11 +29729,11 @@
       <w:pPr>
         <w:pStyle w:val="Heading2"/>
       </w:pPr>
-      <w:bookmarkStart w:id="55" w:name="_Toc242787941"/>
+      <w:bookmarkStart w:id="56" w:name="_Toc242788270"/>
       <w:r>
         <w:t>13.5 Dónde alojarlo</w:t>
       </w:r>
-      <w:bookmarkEnd w:id="55"/>
+      <w:bookmarkEnd w:id="56"/>
     </w:p>
     <w:tbl>
       <w:tblPr>
@@ -29203,11 +30338,11 @@
       <w:pPr>
         <w:pStyle w:val="Heading2"/>
       </w:pPr>
-      <w:bookmarkStart w:id="56" w:name="_Toc242787942"/>
+      <w:bookmarkStart w:id="57" w:name="_Toc242788271"/>
       <w:r>
         <w:t>13.6 Qué se reutiliza y qué cambia del código actual</w:t>
       </w:r>
-      <w:bookmarkEnd w:id="56"/>
+      <w:bookmarkEnd w:id="57"/>
     </w:p>
     <w:tbl>
       <w:tblPr>
@@ -29573,7 +30708,7 @@
               <w:spacing w:after="20"/>
             </w:pPr>
             <w:r>
-              <w:t>Widgets (ruleta.js, meta.js, alertas.js, carrera.js, batalla.js, jefe.js, subathon.js)</w:t>
+              <w:t>Widgets (ruleta.js, meta.js, alertas.js y los cinco juegos)</w:t>
             </w:r>
           </w:p>
         </w:tc>
@@ -30015,12 +31150,12 @@
       <w:pPr>
         <w:pStyle w:val="Heading2"/>
       </w:pPr>
-      <w:bookmarkStart w:id="57" w:name="_Toc242787943"/>
+      <w:bookmarkStart w:id="58" w:name="_Toc242788272"/>
       <w:r>
         <w:lastRenderedPageBreak/>
         <w:t>13.7 Mejoras técnicas recomendadas</w:t>
       </w:r>
-      <w:bookmarkEnd w:id="57"/>
+      <w:bookmarkEnd w:id="58"/>
     </w:p>
     <w:p>
       <w:pPr>
@@ -30206,11 +31341,11 @@
       <w:pPr>
         <w:pStyle w:val="Heading2"/>
       </w:pPr>
-      <w:bookmarkStart w:id="58" w:name="_Toc242787944"/>
+      <w:bookmarkStart w:id="59" w:name="_Toc242788273"/>
       <w:r>
         <w:t>13.8 Nuevas funciones que habilita un servidor</w:t>
       </w:r>
-      <w:bookmarkEnd w:id="58"/>
+      <w:bookmarkEnd w:id="59"/>
     </w:p>
     <w:p>
       <w:pPr>
@@ -30307,11 +31442,11 @@
       <w:pPr>
         <w:pStyle w:val="Heading2"/>
       </w:pPr>
-      <w:bookmarkStart w:id="59" w:name="_Toc242787945"/>
+      <w:bookmarkStart w:id="60" w:name="_Toc242788274"/>
       <w:r>
         <w:t>13.9 Hoja de ruta por fases</w:t>
       </w:r>
-      <w:bookmarkEnd w:id="59"/>
+      <w:bookmarkEnd w:id="60"/>
     </w:p>
     <w:tbl>
       <w:tblPr>
@@ -30791,22 +31926,22 @@
         <w:pStyle w:val="Heading1"/>
         <w:pageBreakBefore/>
       </w:pPr>
-      <w:bookmarkStart w:id="60" w:name="_Toc242787946"/>
+      <w:bookmarkStart w:id="61" w:name="_Toc242788275"/>
       <w:r>
         <w:lastRenderedPageBreak/>
         <w:t>14. Operación y mantenimiento actual</w:t>
       </w:r>
-      <w:bookmarkEnd w:id="60"/>
+      <w:bookmarkEnd w:id="61"/>
     </w:p>
     <w:p>
       <w:pPr>
         <w:pStyle w:val="Heading2"/>
       </w:pPr>
-      <w:bookmarkStart w:id="61" w:name="_Toc242787947"/>
+      <w:bookmarkStart w:id="62" w:name="_Toc242788276"/>
       <w:r>
         <w:t>14.1 Publicar un cambio</w:t>
       </w:r>
-      <w:bookmarkEnd w:id="61"/>
+      <w:bookmarkEnd w:id="62"/>
     </w:p>
     <w:p>
       <w:pPr>
@@ -30868,11 +32003,11 @@
       <w:pPr>
         <w:pStyle w:val="Heading2"/>
       </w:pPr>
-      <w:bookmarkStart w:id="62" w:name="_Toc242787948"/>
+      <w:bookmarkStart w:id="63" w:name="_Toc242788277"/>
       <w:r>
         <w:t>14.2 Agregar una función nueva</w:t>
       </w:r>
-      <w:bookmarkEnd w:id="62"/>
+      <w:bookmarkEnd w:id="63"/>
     </w:p>
     <w:p>
       <w:pPr>
@@ -30929,11 +32064,11 @@
       <w:pPr>
         <w:pStyle w:val="Heading2"/>
       </w:pPr>
-      <w:bookmarkStart w:id="63" w:name="_Toc242787949"/>
+      <w:bookmarkStart w:id="64" w:name="_Toc242788278"/>
       <w:r>
         <w:t>14.3 Probar</w:t>
       </w:r>
-      <w:bookmarkEnd w:id="63"/>
+      <w:bookmarkEnd w:id="64"/>
     </w:p>
     <w:p>
       <w:pPr>
@@ -31061,6 +32196,20 @@
         <w:spacing w:after="60"/>
       </w:pPr>
       <w:r>
+        <w:t>Bóveda dorada: “Regalo de 1.000” o Abrir ahora muestran la apertura; Cerrar y reiniciar la vuelve a cerrar en 0, sin recargar. Con la URL del widget abierta en otra pestaña, las órdenes llegan en menos de un segundo.</w:t>
+      </w:r>
+    </w:p>
+    <w:p>
+      <w:pPr>
+        <w:pStyle w:val="ListParagraph"/>
+        <w:numPr>
+          <w:ilvl w:val="0"/>
+          <w:numId w:val="3"/>
+        </w:numPr>
+        <w:spacing w:after="60"/>
+      </w:pPr>
+      <w:r>
+        <w:lastRenderedPageBreak/>
         <w:t>Servidor estático local: python -m http.server 8080 -d public y abrir http://localhost:8080 (con doble clic no funciona: los módulos JavaScript necesitan http://).</w:t>
       </w:r>
     </w:p>
@@ -31068,12 +32217,11 @@
       <w:pPr>
         <w:pStyle w:val="Heading2"/>
       </w:pPr>
-      <w:bookmarkStart w:id="64" w:name="_Toc242787950"/>
-      <w:r>
-        <w:lastRenderedPageBreak/>
+      <w:bookmarkStart w:id="65" w:name="_Toc242788279"/>
+      <w:r>
         <w:t>14.4 Solución de problemas</w:t>
       </w:r>
-      <w:bookmarkEnd w:id="64"/>
+      <w:bookmarkEnd w:id="65"/>
     </w:p>
     <w:tbl>
       <w:tblPr>
@@ -32115,6 +33263,84 @@
           </w:p>
         </w:tc>
       </w:tr>
+      <w:tr>
+        <w:tc>
+          <w:tcPr>
+            <w:tcW w:w="2808" w:type="dxa"/>
+            <w:tcBorders>
+              <w:top w:val="single" w:sz="4" w:space="0" w:color="BFBFBF"/>
+              <w:left w:val="single" w:sz="4" w:space="0" w:color="BFBFBF"/>
+              <w:bottom w:val="single" w:sz="4" w:space="0" w:color="BFBFBF"/>
+              <w:right w:val="single" w:sz="4" w:space="0" w:color="BFBFBF"/>
+            </w:tcBorders>
+            <w:tcMar>
+              <w:top w:w="60" w:type="dxa"/>
+              <w:left w:w="100" w:type="dxa"/>
+              <w:bottom w:w="60" w:type="dxa"/>
+              <w:right w:w="100" w:type="dxa"/>
+            </w:tcMar>
+          </w:tcPr>
+          <w:p>
+            <w:pPr>
+              <w:spacing w:after="20"/>
+            </w:pPr>
+            <w:r>
+              <w:lastRenderedPageBreak/>
+              <w:t>La bóveda no avanza</w:t>
+            </w:r>
+          </w:p>
+        </w:tc>
+        <w:tc>
+          <w:tcPr>
+            <w:tcW w:w="2995" w:type="dxa"/>
+            <w:tcBorders>
+              <w:top w:val="single" w:sz="4" w:space="0" w:color="BFBFBF"/>
+              <w:left w:val="single" w:sz="4" w:space="0" w:color="BFBFBF"/>
+              <w:bottom w:val="single" w:sz="4" w:space="0" w:color="BFBFBF"/>
+              <w:right w:val="single" w:sz="4" w:space="0" w:color="BFBFBF"/>
+            </w:tcBorders>
+            <w:tcMar>
+              <w:top w:w="60" w:type="dxa"/>
+              <w:left w:w="100" w:type="dxa"/>
+              <w:bottom w:w="60" w:type="dxa"/>
+              <w:right w:w="100" w:type="dxa"/>
+            </w:tcMar>
+          </w:tcPr>
+          <w:p>
+            <w:pPr>
+              <w:spacing w:after="20"/>
+            </w:pPr>
+            <w:r>
+              <w:t>Ya está abierta (los regalos ya no cuentan) o las monedas de un regalo sin precio están en 0</w:t>
+            </w:r>
+          </w:p>
+        </w:tc>
+        <w:tc>
+          <w:tcPr>
+            <w:tcW w:w="3557" w:type="dxa"/>
+            <w:tcBorders>
+              <w:top w:val="single" w:sz="4" w:space="0" w:color="BFBFBF"/>
+              <w:left w:val="single" w:sz="4" w:space="0" w:color="BFBFBF"/>
+              <w:bottom w:val="single" w:sz="4" w:space="0" w:color="BFBFBF"/>
+              <w:right w:val="single" w:sz="4" w:space="0" w:color="BFBFBF"/>
+            </w:tcBorders>
+            <w:tcMar>
+              <w:top w:w="60" w:type="dxa"/>
+              <w:left w:w="100" w:type="dxa"/>
+              <w:bottom w:w="60" w:type="dxa"/>
+              <w:right w:w="100" w:type="dxa"/>
+            </w:tcMar>
+          </w:tcPr>
+          <w:p>
+            <w:pPr>
+              <w:spacing w:after="20"/>
+            </w:pPr>
+            <w:r>
+              <w:t>Cerrar y reiniciar, y revisar Personalizar</w:t>
+            </w:r>
+          </w:p>
+        </w:tc>
+      </w:tr>
     </w:tbl>
     <w:p>
       <w:pPr>
@@ -32126,12 +33352,12 @@
         <w:pStyle w:val="Heading1"/>
         <w:pageBreakBefore/>
       </w:pPr>
-      <w:bookmarkStart w:id="65" w:name="_Toc242787951"/>
+      <w:bookmarkStart w:id="66" w:name="_Toc242788280"/>
       <w:r>
         <w:lastRenderedPageBreak/>
         <w:t>15. Anexo: historial de decisiones y correcciones</w:t>
       </w:r>
-      <w:bookmarkEnd w:id="65"/>
+      <w:bookmarkEnd w:id="66"/>
     </w:p>
     <w:tbl>
       <w:tblPr>
@@ -34556,6 +35782,160 @@
             </w:pPr>
             <w:r>
               <w:t>Los “+0:10” y “+0:30” se encimaban</w:t>
+            </w:r>
+          </w:p>
+        </w:tc>
+      </w:tr>
+      <w:tr>
+        <w:tc>
+          <w:tcPr>
+            <w:tcW w:w="2246" w:type="dxa"/>
+            <w:tcBorders>
+              <w:top w:val="single" w:sz="4" w:space="0" w:color="BFBFBF"/>
+              <w:left w:val="single" w:sz="4" w:space="0" w:color="BFBFBF"/>
+              <w:bottom w:val="single" w:sz="4" w:space="0" w:color="BFBFBF"/>
+              <w:right w:val="single" w:sz="4" w:space="0" w:color="BFBFBF"/>
+            </w:tcBorders>
+            <w:tcMar>
+              <w:top w:w="60" w:type="dxa"/>
+              <w:left w:w="100" w:type="dxa"/>
+              <w:bottom w:w="60" w:type="dxa"/>
+              <w:right w:w="100" w:type="dxa"/>
+            </w:tcMar>
+          </w:tcPr>
+          <w:p>
+            <w:pPr>
+              <w:spacing w:after="20"/>
+            </w:pPr>
+            <w:r>
+              <w:t>Texto secreto de la bóveda</w:t>
+            </w:r>
+          </w:p>
+        </w:tc>
+        <w:tc>
+          <w:tcPr>
+            <w:tcW w:w="3744" w:type="dxa"/>
+            <w:tcBorders>
+              <w:top w:val="single" w:sz="4" w:space="0" w:color="BFBFBF"/>
+              <w:left w:val="single" w:sz="4" w:space="0" w:color="BFBFBF"/>
+              <w:bottom w:val="single" w:sz="4" w:space="0" w:color="BFBFBF"/>
+              <w:right w:val="single" w:sz="4" w:space="0" w:color="BFBFBF"/>
+            </w:tcBorders>
+            <w:tcMar>
+              <w:top w:w="60" w:type="dxa"/>
+              <w:left w:w="100" w:type="dxa"/>
+              <w:bottom w:w="60" w:type="dxa"/>
+              <w:right w:w="100" w:type="dxa"/>
+            </w:tcMar>
+          </w:tcPr>
+          <w:p>
+            <w:pPr>
+              <w:spacing w:after="20"/>
+            </w:pPr>
+            <w:r>
+              <w:t>No se escribe en la página hasta que se abre</w:t>
+            </w:r>
+          </w:p>
+        </w:tc>
+        <w:tc>
+          <w:tcPr>
+            <w:tcW w:w="3370" w:type="dxa"/>
+            <w:tcBorders>
+              <w:top w:val="single" w:sz="4" w:space="0" w:color="BFBFBF"/>
+              <w:left w:val="single" w:sz="4" w:space="0" w:color="BFBFBF"/>
+              <w:bottom w:val="single" w:sz="4" w:space="0" w:color="BFBFBF"/>
+              <w:right w:val="single" w:sz="4" w:space="0" w:color="BFBFBF"/>
+            </w:tcBorders>
+            <w:tcMar>
+              <w:top w:w="60" w:type="dxa"/>
+              <w:left w:w="100" w:type="dxa"/>
+              <w:bottom w:w="60" w:type="dxa"/>
+              <w:right w:w="100" w:type="dxa"/>
+            </w:tcMar>
+          </w:tcPr>
+          <w:p>
+            <w:pPr>
+              <w:spacing w:after="20"/>
+            </w:pPr>
+            <w:r>
+              <w:t>Que no aparezca por error (por ejemplo, con un fallo de estilos)</w:t>
+            </w:r>
+          </w:p>
+        </w:tc>
+      </w:tr>
+      <w:tr>
+        <w:tc>
+          <w:tcPr>
+            <w:tcW w:w="2246" w:type="dxa"/>
+            <w:tcBorders>
+              <w:top w:val="single" w:sz="4" w:space="0" w:color="BFBFBF"/>
+              <w:left w:val="single" w:sz="4" w:space="0" w:color="BFBFBF"/>
+              <w:bottom w:val="single" w:sz="4" w:space="0" w:color="BFBFBF"/>
+              <w:right w:val="single" w:sz="4" w:space="0" w:color="BFBFBF"/>
+            </w:tcBorders>
+            <w:tcMar>
+              <w:top w:w="60" w:type="dxa"/>
+              <w:left w:w="100" w:type="dxa"/>
+              <w:bottom w:w="60" w:type="dxa"/>
+              <w:right w:w="100" w:type="dxa"/>
+            </w:tcMar>
+          </w:tcPr>
+          <w:p>
+            <w:pPr>
+              <w:spacing w:after="20"/>
+            </w:pPr>
+            <w:r>
+              <w:t>Colores del candado</w:t>
+            </w:r>
+          </w:p>
+        </w:tc>
+        <w:tc>
+          <w:tcPr>
+            <w:tcW w:w="3744" w:type="dxa"/>
+            <w:tcBorders>
+              <w:top w:val="single" w:sz="4" w:space="0" w:color="BFBFBF"/>
+              <w:left w:val="single" w:sz="4" w:space="0" w:color="BFBFBF"/>
+              <w:bottom w:val="single" w:sz="4" w:space="0" w:color="BFBFBF"/>
+              <w:right w:val="single" w:sz="4" w:space="0" w:color="BFBFBF"/>
+            </w:tcBorders>
+            <w:tcMar>
+              <w:top w:w="60" w:type="dxa"/>
+              <w:left w:w="100" w:type="dxa"/>
+              <w:bottom w:w="60" w:type="dxa"/>
+              <w:right w:w="100" w:type="dxa"/>
+            </w:tcMar>
+          </w:tcPr>
+          <w:p>
+            <w:pPr>
+              <w:spacing w:after="20"/>
+            </w:pPr>
+            <w:r>
+              <w:t>Degradado SVG con stop-color de las variables del estilo</w:t>
+            </w:r>
+          </w:p>
+        </w:tc>
+        <w:tc>
+          <w:tcPr>
+            <w:tcW w:w="3370" w:type="dxa"/>
+            <w:tcBorders>
+              <w:top w:val="single" w:sz="4" w:space="0" w:color="BFBFBF"/>
+              <w:left w:val="single" w:sz="4" w:space="0" w:color="BFBFBF"/>
+              <w:bottom w:val="single" w:sz="4" w:space="0" w:color="BFBFBF"/>
+              <w:right w:val="single" w:sz="4" w:space="0" w:color="BFBFBF"/>
+            </w:tcBorders>
+            <w:tcMar>
+              <w:top w:w="60" w:type="dxa"/>
+              <w:left w:w="100" w:type="dxa"/>
+              <w:bottom w:w="60" w:type="dxa"/>
+              <w:right w:w="100" w:type="dxa"/>
+            </w:tcMar>
+          </w:tcPr>
+          <w:p>
+            <w:pPr>
+              <w:spacing w:after="20"/>
+            </w:pPr>
+            <w:r>
+              <w:t>Que el candado siga el estilo elegido en Personalizar</w:t>
             </w:r>
           </w:p>
         </w:tc>

</xml_diff>

<commit_message>
Trono: el rey del LIVE (top supporter)
- trono.html + js/widgets/trono.js + css/widgets/trono.css: insignia de
  cristal con corona SVG en oro del estilo, título espaciado, nombre y monedas
  del rey, aviso de desafío y transición al cambiar de rey. Jugadas de 3 s por
  persona para contar el combo completo; modos combo y total; medidas con --u
  para caber en cualquier tamaño de fuente.
- Vista Superposiciones → Juegos → Trono: modo, título, mínimo y Reiniciar
  trono en vivo.
- README y documentación Word (sección 7.9 y menciones).

Co-Authored-By: Claude Opus 5.5 <noreply@anthropic.com>
</commit_message>
<xml_diff>
--- a/Documentacion-Live-Tools.docx
+++ b/Documentacion-Live-Tools.docx
@@ -42,7 +42,7 @@
         <w:jc w:val="center"/>
       </w:pPr>
       <w:r>
-        <w:t>Ruleta · Metas · Alertas · Juegos (Carrera, Batalla, Jefe, Subathon, Bóveda) · Actividad · Buscador de regalos</w:t>
+        <w:t>Ruleta · Metas · Alertas · Juegos (Carrera, Batalla, Jefe, Subathon, Bóveda, Trono) · Actividad · Buscador de regalos</w:t>
       </w:r>
     </w:p>
     <w:p>
@@ -159,7 +159,7 @@
           <w:r>
             <w:fldChar w:fldCharType="separate"/>
           </w:r>
-          <w:hyperlink w:anchor="_Toc242788214" w:history="1">
+          <w:hyperlink w:anchor="_Toc242788695" w:history="1">
             <w:r>
               <w:rPr>
                 <w:rStyle w:val="Hyperlink"/>
@@ -183,7 +183,7 @@
               <w:rPr>
                 <w:noProof/>
               </w:rPr>
-              <w:instrText xml:space="preserve"> PAGEREF _Toc242788214 \h </w:instrText>
+              <w:instrText xml:space="preserve"> PAGEREF _Toc242788695 \h </w:instrText>
             </w:r>
             <w:r>
               <w:rPr>
@@ -225,7 +225,7 @@
               <w14:ligatures w14:val="standardContextual"/>
             </w:rPr>
           </w:pPr>
-          <w:hyperlink w:anchor="_Toc242788215" w:history="1">
+          <w:hyperlink w:anchor="_Toc242788696" w:history="1">
             <w:r>
               <w:rPr>
                 <w:rStyle w:val="Hyperlink"/>
@@ -249,7 +249,7 @@
               <w:rPr>
                 <w:noProof/>
               </w:rPr>
-              <w:instrText xml:space="preserve"> PAGEREF _Toc242788215 \h </w:instrText>
+              <w:instrText xml:space="preserve"> PAGEREF _Toc242788696 \h </w:instrText>
             </w:r>
             <w:r>
               <w:rPr>
@@ -291,7 +291,7 @@
               <w14:ligatures w14:val="standardContextual"/>
             </w:rPr>
           </w:pPr>
-          <w:hyperlink w:anchor="_Toc242788216" w:history="1">
+          <w:hyperlink w:anchor="_Toc242788697" w:history="1">
             <w:r>
               <w:rPr>
                 <w:rStyle w:val="Hyperlink"/>
@@ -315,7 +315,7 @@
               <w:rPr>
                 <w:noProof/>
               </w:rPr>
-              <w:instrText xml:space="preserve"> PAGEREF _Toc242788216 \h </w:instrText>
+              <w:instrText xml:space="preserve"> PAGEREF _Toc242788697 \h </w:instrText>
             </w:r>
             <w:r>
               <w:rPr>
@@ -357,7 +357,7 @@
               <w14:ligatures w14:val="standardContextual"/>
             </w:rPr>
           </w:pPr>
-          <w:hyperlink w:anchor="_Toc242788217" w:history="1">
+          <w:hyperlink w:anchor="_Toc242788698" w:history="1">
             <w:r>
               <w:rPr>
                 <w:rStyle w:val="Hyperlink"/>
@@ -381,7 +381,7 @@
               <w:rPr>
                 <w:noProof/>
               </w:rPr>
-              <w:instrText xml:space="preserve"> PAGEREF _Toc242788217 \h </w:instrText>
+              <w:instrText xml:space="preserve"> PAGEREF _Toc242788698 \h </w:instrText>
             </w:r>
             <w:r>
               <w:rPr>
@@ -423,7 +423,7 @@
               <w14:ligatures w14:val="standardContextual"/>
             </w:rPr>
           </w:pPr>
-          <w:hyperlink w:anchor="_Toc242788218" w:history="1">
+          <w:hyperlink w:anchor="_Toc242788699" w:history="1">
             <w:r>
               <w:rPr>
                 <w:rStyle w:val="Hyperlink"/>
@@ -447,7 +447,7 @@
               <w:rPr>
                 <w:noProof/>
               </w:rPr>
-              <w:instrText xml:space="preserve"> PAGEREF _Toc242788218 \h </w:instrText>
+              <w:instrText xml:space="preserve"> PAGEREF _Toc242788699 \h </w:instrText>
             </w:r>
             <w:r>
               <w:rPr>
@@ -489,7 +489,7 @@
               <w14:ligatures w14:val="standardContextual"/>
             </w:rPr>
           </w:pPr>
-          <w:hyperlink w:anchor="_Toc242788219" w:history="1">
+          <w:hyperlink w:anchor="_Toc242788700" w:history="1">
             <w:r>
               <w:rPr>
                 <w:rStyle w:val="Hyperlink"/>
@@ -513,7 +513,7 @@
               <w:rPr>
                 <w:noProof/>
               </w:rPr>
-              <w:instrText xml:space="preserve"> PAGEREF _Toc242788219 \h </w:instrText>
+              <w:instrText xml:space="preserve"> PAGEREF _Toc242788700 \h </w:instrText>
             </w:r>
             <w:r>
               <w:rPr>
@@ -555,7 +555,7 @@
               <w14:ligatures w14:val="standardContextual"/>
             </w:rPr>
           </w:pPr>
-          <w:hyperlink w:anchor="_Toc242788220" w:history="1">
+          <w:hyperlink w:anchor="_Toc242788701" w:history="1">
             <w:r>
               <w:rPr>
                 <w:rStyle w:val="Hyperlink"/>
@@ -579,7 +579,7 @@
               <w:rPr>
                 <w:noProof/>
               </w:rPr>
-              <w:instrText xml:space="preserve"> PAGEREF _Toc242788220 \h </w:instrText>
+              <w:instrText xml:space="preserve"> PAGEREF _Toc242788701 \h </w:instrText>
             </w:r>
             <w:r>
               <w:rPr>
@@ -621,7 +621,7 @@
               <w14:ligatures w14:val="standardContextual"/>
             </w:rPr>
           </w:pPr>
-          <w:hyperlink w:anchor="_Toc242788221" w:history="1">
+          <w:hyperlink w:anchor="_Toc242788702" w:history="1">
             <w:r>
               <w:rPr>
                 <w:rStyle w:val="Hyperlink"/>
@@ -645,7 +645,7 @@
               <w:rPr>
                 <w:noProof/>
               </w:rPr>
-              <w:instrText xml:space="preserve"> PAGEREF _Toc242788221 \h </w:instrText>
+              <w:instrText xml:space="preserve"> PAGEREF _Toc242788702 \h </w:instrText>
             </w:r>
             <w:r>
               <w:rPr>
@@ -687,7 +687,7 @@
               <w14:ligatures w14:val="standardContextual"/>
             </w:rPr>
           </w:pPr>
-          <w:hyperlink w:anchor="_Toc242788222" w:history="1">
+          <w:hyperlink w:anchor="_Toc242788703" w:history="1">
             <w:r>
               <w:rPr>
                 <w:rStyle w:val="Hyperlink"/>
@@ -711,7 +711,7 @@
               <w:rPr>
                 <w:noProof/>
               </w:rPr>
-              <w:instrText xml:space="preserve"> PAGEREF _Toc242788222 \h </w:instrText>
+              <w:instrText xml:space="preserve"> PAGEREF _Toc242788703 \h </w:instrText>
             </w:r>
             <w:r>
               <w:rPr>
@@ -753,7 +753,7 @@
               <w14:ligatures w14:val="standardContextual"/>
             </w:rPr>
           </w:pPr>
-          <w:hyperlink w:anchor="_Toc242788223" w:history="1">
+          <w:hyperlink w:anchor="_Toc242788704" w:history="1">
             <w:r>
               <w:rPr>
                 <w:rStyle w:val="Hyperlink"/>
@@ -777,7 +777,7 @@
               <w:rPr>
                 <w:noProof/>
               </w:rPr>
-              <w:instrText xml:space="preserve"> PAGEREF _Toc242788223 \h </w:instrText>
+              <w:instrText xml:space="preserve"> PAGEREF _Toc242788704 \h </w:instrText>
             </w:r>
             <w:r>
               <w:rPr>
@@ -819,7 +819,7 @@
               <w14:ligatures w14:val="standardContextual"/>
             </w:rPr>
           </w:pPr>
-          <w:hyperlink w:anchor="_Toc242788224" w:history="1">
+          <w:hyperlink w:anchor="_Toc242788705" w:history="1">
             <w:r>
               <w:rPr>
                 <w:rStyle w:val="Hyperlink"/>
@@ -843,7 +843,7 @@
               <w:rPr>
                 <w:noProof/>
               </w:rPr>
-              <w:instrText xml:space="preserve"> PAGEREF _Toc242788224 \h </w:instrText>
+              <w:instrText xml:space="preserve"> PAGEREF _Toc242788705 \h </w:instrText>
             </w:r>
             <w:r>
               <w:rPr>
@@ -885,7 +885,7 @@
               <w14:ligatures w14:val="standardContextual"/>
             </w:rPr>
           </w:pPr>
-          <w:hyperlink w:anchor="_Toc242788225" w:history="1">
+          <w:hyperlink w:anchor="_Toc242788706" w:history="1">
             <w:r>
               <w:rPr>
                 <w:rStyle w:val="Hyperlink"/>
@@ -909,7 +909,7 @@
               <w:rPr>
                 <w:noProof/>
               </w:rPr>
-              <w:instrText xml:space="preserve"> PAGEREF _Toc242788225 \h </w:instrText>
+              <w:instrText xml:space="preserve"> PAGEREF _Toc242788706 \h </w:instrText>
             </w:r>
             <w:r>
               <w:rPr>
@@ -951,7 +951,7 @@
               <w14:ligatures w14:val="standardContextual"/>
             </w:rPr>
           </w:pPr>
-          <w:hyperlink w:anchor="_Toc242788226" w:history="1">
+          <w:hyperlink w:anchor="_Toc242788707" w:history="1">
             <w:r>
               <w:rPr>
                 <w:rStyle w:val="Hyperlink"/>
@@ -975,7 +975,7 @@
               <w:rPr>
                 <w:noProof/>
               </w:rPr>
-              <w:instrText xml:space="preserve"> PAGEREF _Toc242788226 \h </w:instrText>
+              <w:instrText xml:space="preserve"> PAGEREF _Toc242788707 \h </w:instrText>
             </w:r>
             <w:r>
               <w:rPr>
@@ -1017,7 +1017,7 @@
               <w14:ligatures w14:val="standardContextual"/>
             </w:rPr>
           </w:pPr>
-          <w:hyperlink w:anchor="_Toc242788227" w:history="1">
+          <w:hyperlink w:anchor="_Toc242788708" w:history="1">
             <w:r>
               <w:rPr>
                 <w:rStyle w:val="Hyperlink"/>
@@ -1041,7 +1041,7 @@
               <w:rPr>
                 <w:noProof/>
               </w:rPr>
-              <w:instrText xml:space="preserve"> PAGEREF _Toc242788227 \h </w:instrText>
+              <w:instrText xml:space="preserve"> PAGEREF _Toc242788708 \h </w:instrText>
             </w:r>
             <w:r>
               <w:rPr>
@@ -1083,7 +1083,7 @@
               <w14:ligatures w14:val="standardContextual"/>
             </w:rPr>
           </w:pPr>
-          <w:hyperlink w:anchor="_Toc242788228" w:history="1">
+          <w:hyperlink w:anchor="_Toc242788709" w:history="1">
             <w:r>
               <w:rPr>
                 <w:rStyle w:val="Hyperlink"/>
@@ -1107,7 +1107,7 @@
               <w:rPr>
                 <w:noProof/>
               </w:rPr>
-              <w:instrText xml:space="preserve"> PAGEREF _Toc242788228 \h </w:instrText>
+              <w:instrText xml:space="preserve"> PAGEREF _Toc242788709 \h </w:instrText>
             </w:r>
             <w:r>
               <w:rPr>
@@ -1149,7 +1149,7 @@
               <w14:ligatures w14:val="standardContextual"/>
             </w:rPr>
           </w:pPr>
-          <w:hyperlink w:anchor="_Toc242788229" w:history="1">
+          <w:hyperlink w:anchor="_Toc242788710" w:history="1">
             <w:r>
               <w:rPr>
                 <w:rStyle w:val="Hyperlink"/>
@@ -1173,7 +1173,7 @@
               <w:rPr>
                 <w:noProof/>
               </w:rPr>
-              <w:instrText xml:space="preserve"> PAGEREF _Toc242788229 \h </w:instrText>
+              <w:instrText xml:space="preserve"> PAGEREF _Toc242788710 \h </w:instrText>
             </w:r>
             <w:r>
               <w:rPr>
@@ -1215,7 +1215,7 @@
               <w14:ligatures w14:val="standardContextual"/>
             </w:rPr>
           </w:pPr>
-          <w:hyperlink w:anchor="_Toc242788230" w:history="1">
+          <w:hyperlink w:anchor="_Toc242788711" w:history="1">
             <w:r>
               <w:rPr>
                 <w:rStyle w:val="Hyperlink"/>
@@ -1239,7 +1239,7 @@
               <w:rPr>
                 <w:noProof/>
               </w:rPr>
-              <w:instrText xml:space="preserve"> PAGEREF _Toc242788230 \h </w:instrText>
+              <w:instrText xml:space="preserve"> PAGEREF _Toc242788711 \h </w:instrText>
             </w:r>
             <w:r>
               <w:rPr>
@@ -1281,7 +1281,7 @@
               <w14:ligatures w14:val="standardContextual"/>
             </w:rPr>
           </w:pPr>
-          <w:hyperlink w:anchor="_Toc242788231" w:history="1">
+          <w:hyperlink w:anchor="_Toc242788712" w:history="1">
             <w:r>
               <w:rPr>
                 <w:rStyle w:val="Hyperlink"/>
@@ -1305,7 +1305,7 @@
               <w:rPr>
                 <w:noProof/>
               </w:rPr>
-              <w:instrText xml:space="preserve"> PAGEREF _Toc242788231 \h </w:instrText>
+              <w:instrText xml:space="preserve"> PAGEREF _Toc242788712 \h </w:instrText>
             </w:r>
             <w:r>
               <w:rPr>
@@ -1347,7 +1347,7 @@
               <w14:ligatures w14:val="standardContextual"/>
             </w:rPr>
           </w:pPr>
-          <w:hyperlink w:anchor="_Toc242788232" w:history="1">
+          <w:hyperlink w:anchor="_Toc242788713" w:history="1">
             <w:r>
               <w:rPr>
                 <w:rStyle w:val="Hyperlink"/>
@@ -1371,7 +1371,7 @@
               <w:rPr>
                 <w:noProof/>
               </w:rPr>
-              <w:instrText xml:space="preserve"> PAGEREF _Toc242788232 \h </w:instrText>
+              <w:instrText xml:space="preserve"> PAGEREF _Toc242788713 \h </w:instrText>
             </w:r>
             <w:r>
               <w:rPr>
@@ -1413,7 +1413,7 @@
               <w14:ligatures w14:val="standardContextual"/>
             </w:rPr>
           </w:pPr>
-          <w:hyperlink w:anchor="_Toc242788233" w:history="1">
+          <w:hyperlink w:anchor="_Toc242788714" w:history="1">
             <w:r>
               <w:rPr>
                 <w:rStyle w:val="Hyperlink"/>
@@ -1437,7 +1437,7 @@
               <w:rPr>
                 <w:noProof/>
               </w:rPr>
-              <w:instrText xml:space="preserve"> PAGEREF _Toc242788233 \h </w:instrText>
+              <w:instrText xml:space="preserve"> PAGEREF _Toc242788714 \h </w:instrText>
             </w:r>
             <w:r>
               <w:rPr>
@@ -1479,7 +1479,7 @@
               <w14:ligatures w14:val="standardContextual"/>
             </w:rPr>
           </w:pPr>
-          <w:hyperlink w:anchor="_Toc242788234" w:history="1">
+          <w:hyperlink w:anchor="_Toc242788715" w:history="1">
             <w:r>
               <w:rPr>
                 <w:rStyle w:val="Hyperlink"/>
@@ -1503,7 +1503,7 @@
               <w:rPr>
                 <w:noProof/>
               </w:rPr>
-              <w:instrText xml:space="preserve"> PAGEREF _Toc242788234 \h </w:instrText>
+              <w:instrText xml:space="preserve"> PAGEREF _Toc242788715 \h </w:instrText>
             </w:r>
             <w:r>
               <w:rPr>
@@ -1545,7 +1545,7 @@
               <w14:ligatures w14:val="standardContextual"/>
             </w:rPr>
           </w:pPr>
-          <w:hyperlink w:anchor="_Toc242788235" w:history="1">
+          <w:hyperlink w:anchor="_Toc242788716" w:history="1">
             <w:r>
               <w:rPr>
                 <w:rStyle w:val="Hyperlink"/>
@@ -1569,7 +1569,7 @@
               <w:rPr>
                 <w:noProof/>
               </w:rPr>
-              <w:instrText xml:space="preserve"> PAGEREF _Toc242788235 \h </w:instrText>
+              <w:instrText xml:space="preserve"> PAGEREF _Toc242788716 \h </w:instrText>
             </w:r>
             <w:r>
               <w:rPr>
@@ -1611,7 +1611,7 @@
               <w14:ligatures w14:val="standardContextual"/>
             </w:rPr>
           </w:pPr>
-          <w:hyperlink w:anchor="_Toc242788236" w:history="1">
+          <w:hyperlink w:anchor="_Toc242788717" w:history="1">
             <w:r>
               <w:rPr>
                 <w:rStyle w:val="Hyperlink"/>
@@ -1635,7 +1635,7 @@
               <w:rPr>
                 <w:noProof/>
               </w:rPr>
-              <w:instrText xml:space="preserve"> PAGEREF _Toc242788236 \h </w:instrText>
+              <w:instrText xml:space="preserve"> PAGEREF _Toc242788717 \h </w:instrText>
             </w:r>
             <w:r>
               <w:rPr>
@@ -1677,7 +1677,7 @@
               <w14:ligatures w14:val="standardContextual"/>
             </w:rPr>
           </w:pPr>
-          <w:hyperlink w:anchor="_Toc242788237" w:history="1">
+          <w:hyperlink w:anchor="_Toc242788718" w:history="1">
             <w:r>
               <w:rPr>
                 <w:rStyle w:val="Hyperlink"/>
@@ -1701,7 +1701,7 @@
               <w:rPr>
                 <w:noProof/>
               </w:rPr>
-              <w:instrText xml:space="preserve"> PAGEREF _Toc242788237 \h </w:instrText>
+              <w:instrText xml:space="preserve"> PAGEREF _Toc242788718 \h </w:instrText>
             </w:r>
             <w:r>
               <w:rPr>
@@ -1743,7 +1743,7 @@
               <w14:ligatures w14:val="standardContextual"/>
             </w:rPr>
           </w:pPr>
-          <w:hyperlink w:anchor="_Toc242788238" w:history="1">
+          <w:hyperlink w:anchor="_Toc242788719" w:history="1">
             <w:r>
               <w:rPr>
                 <w:rStyle w:val="Hyperlink"/>
@@ -1767,7 +1767,7 @@
               <w:rPr>
                 <w:noProof/>
               </w:rPr>
-              <w:instrText xml:space="preserve"> PAGEREF _Toc242788238 \h </w:instrText>
+              <w:instrText xml:space="preserve"> PAGEREF _Toc242788719 \h </w:instrText>
             </w:r>
             <w:r>
               <w:rPr>
@@ -1809,7 +1809,7 @@
               <w14:ligatures w14:val="standardContextual"/>
             </w:rPr>
           </w:pPr>
-          <w:hyperlink w:anchor="_Toc242788239" w:history="1">
+          <w:hyperlink w:anchor="_Toc242788720" w:history="1">
             <w:r>
               <w:rPr>
                 <w:rStyle w:val="Hyperlink"/>
@@ -1833,7 +1833,7 @@
               <w:rPr>
                 <w:noProof/>
               </w:rPr>
-              <w:instrText xml:space="preserve"> PAGEREF _Toc242788239 \h </w:instrText>
+              <w:instrText xml:space="preserve"> PAGEREF _Toc242788720 \h </w:instrText>
             </w:r>
             <w:r>
               <w:rPr>
@@ -1875,7 +1875,7 @@
               <w14:ligatures w14:val="standardContextual"/>
             </w:rPr>
           </w:pPr>
-          <w:hyperlink w:anchor="_Toc242788240" w:history="1">
+          <w:hyperlink w:anchor="_Toc242788721" w:history="1">
             <w:r>
               <w:rPr>
                 <w:rStyle w:val="Hyperlink"/>
@@ -1899,7 +1899,7 @@
               <w:rPr>
                 <w:noProof/>
               </w:rPr>
-              <w:instrText xml:space="preserve"> PAGEREF _Toc242788240 \h </w:instrText>
+              <w:instrText xml:space="preserve"> PAGEREF _Toc242788721 \h </w:instrText>
             </w:r>
             <w:r>
               <w:rPr>
@@ -1941,7 +1941,7 @@
               <w14:ligatures w14:val="standardContextual"/>
             </w:rPr>
           </w:pPr>
-          <w:hyperlink w:anchor="_Toc242788241" w:history="1">
+          <w:hyperlink w:anchor="_Toc242788722" w:history="1">
             <w:r>
               <w:rPr>
                 <w:rStyle w:val="Hyperlink"/>
@@ -1965,7 +1965,7 @@
               <w:rPr>
                 <w:noProof/>
               </w:rPr>
-              <w:instrText xml:space="preserve"> PAGEREF _Toc242788241 \h </w:instrText>
+              <w:instrText xml:space="preserve"> PAGEREF _Toc242788722 \h </w:instrText>
             </w:r>
             <w:r>
               <w:rPr>
@@ -2007,7 +2007,7 @@
               <w14:ligatures w14:val="standardContextual"/>
             </w:rPr>
           </w:pPr>
-          <w:hyperlink w:anchor="_Toc242788242" w:history="1">
+          <w:hyperlink w:anchor="_Toc242788723" w:history="1">
             <w:r>
               <w:rPr>
                 <w:rStyle w:val="Hyperlink"/>
@@ -2031,7 +2031,7 @@
               <w:rPr>
                 <w:noProof/>
               </w:rPr>
-              <w:instrText xml:space="preserve"> PAGEREF _Toc242788242 \h </w:instrText>
+              <w:instrText xml:space="preserve"> PAGEREF _Toc242788723 \h </w:instrText>
             </w:r>
             <w:r>
               <w:rPr>
@@ -2049,6 +2049,72 @@
                 <w:noProof/>
               </w:rPr>
               <w:t>27</w:t>
+            </w:r>
+            <w:r>
+              <w:rPr>
+                <w:noProof/>
+              </w:rPr>
+              <w:fldChar w:fldCharType="end"/>
+            </w:r>
+          </w:hyperlink>
+        </w:p>
+        <w:p>
+          <w:pPr>
+            <w:pStyle w:val="TOC2"/>
+            <w:tabs>
+              <w:tab w:val="right" w:leader="dot" w:pos="9350"/>
+            </w:tabs>
+            <w:rPr>
+              <w:rFonts w:asciiTheme="minorHAnsi" w:eastAsiaTheme="minorEastAsia" w:hAnsiTheme="minorHAnsi" w:cstheme="minorBidi"/>
+              <w:noProof/>
+              <w:kern w:val="2"/>
+              <w:sz w:val="24"/>
+              <w:szCs w:val="24"/>
+              <w14:ligatures w14:val="standardContextual"/>
+            </w:rPr>
+          </w:pPr>
+          <w:hyperlink w:anchor="_Toc242788724" w:history="1">
+            <w:r>
+              <w:rPr>
+                <w:rStyle w:val="Hyperlink"/>
+                <w:noProof/>
+              </w:rPr>
+              <w:t>7.9 Trono (trono.html)</w:t>
+            </w:r>
+            <w:r>
+              <w:rPr>
+                <w:noProof/>
+              </w:rPr>
+              <w:tab/>
+            </w:r>
+            <w:r>
+              <w:rPr>
+                <w:noProof/>
+              </w:rPr>
+              <w:fldChar w:fldCharType="begin"/>
+            </w:r>
+            <w:r>
+              <w:rPr>
+                <w:noProof/>
+              </w:rPr>
+              <w:instrText xml:space="preserve"> PAGEREF _Toc242788724 \h </w:instrText>
+            </w:r>
+            <w:r>
+              <w:rPr>
+                <w:noProof/>
+              </w:rPr>
+            </w:r>
+            <w:r>
+              <w:rPr>
+                <w:noProof/>
+              </w:rPr>
+              <w:fldChar w:fldCharType="separate"/>
+            </w:r>
+            <w:r>
+              <w:rPr>
+                <w:noProof/>
+              </w:rPr>
+              <w:t>28</w:t>
             </w:r>
             <w:r>
               <w:rPr>
@@ -2073,7 +2139,7 @@
               <w14:ligatures w14:val="standardContextual"/>
             </w:rPr>
           </w:pPr>
-          <w:hyperlink w:anchor="_Toc242788243" w:history="1">
+          <w:hyperlink w:anchor="_Toc242788725" w:history="1">
             <w:r>
               <w:rPr>
                 <w:rStyle w:val="Hyperlink"/>
@@ -2097,7 +2163,7 @@
               <w:rPr>
                 <w:noProof/>
               </w:rPr>
-              <w:instrText xml:space="preserve"> PAGEREF _Toc242788243 \h </w:instrText>
+              <w:instrText xml:space="preserve"> PAGEREF _Toc242788725 \h </w:instrText>
             </w:r>
             <w:r>
               <w:rPr>
@@ -2114,7 +2180,7 @@
               <w:rPr>
                 <w:noProof/>
               </w:rPr>
-              <w:t>29</w:t>
+              <w:t>30</w:t>
             </w:r>
             <w:r>
               <w:rPr>
@@ -2139,7 +2205,7 @@
               <w14:ligatures w14:val="standardContextual"/>
             </w:rPr>
           </w:pPr>
-          <w:hyperlink w:anchor="_Toc242788244" w:history="1">
+          <w:hyperlink w:anchor="_Toc242788726" w:history="1">
             <w:r>
               <w:rPr>
                 <w:rStyle w:val="Hyperlink"/>
@@ -2163,7 +2229,7 @@
               <w:rPr>
                 <w:noProof/>
               </w:rPr>
-              <w:instrText xml:space="preserve"> PAGEREF _Toc242788244 \h </w:instrText>
+              <w:instrText xml:space="preserve"> PAGEREF _Toc242788726 \h </w:instrText>
             </w:r>
             <w:r>
               <w:rPr>
@@ -2180,7 +2246,7 @@
               <w:rPr>
                 <w:noProof/>
               </w:rPr>
-              <w:t>29</w:t>
+              <w:t>30</w:t>
             </w:r>
             <w:r>
               <w:rPr>
@@ -2205,7 +2271,7 @@
               <w14:ligatures w14:val="standardContextual"/>
             </w:rPr>
           </w:pPr>
-          <w:hyperlink w:anchor="_Toc242788245" w:history="1">
+          <w:hyperlink w:anchor="_Toc242788727" w:history="1">
             <w:r>
               <w:rPr>
                 <w:rStyle w:val="Hyperlink"/>
@@ -2229,7 +2295,7 @@
               <w:rPr>
                 <w:noProof/>
               </w:rPr>
-              <w:instrText xml:space="preserve"> PAGEREF _Toc242788245 \h </w:instrText>
+              <w:instrText xml:space="preserve"> PAGEREF _Toc242788727 \h </w:instrText>
             </w:r>
             <w:r>
               <w:rPr>
@@ -2246,7 +2312,7 @@
               <w:rPr>
                 <w:noProof/>
               </w:rPr>
-              <w:t>29</w:t>
+              <w:t>30</w:t>
             </w:r>
             <w:r>
               <w:rPr>
@@ -2271,7 +2337,7 @@
               <w14:ligatures w14:val="standardContextual"/>
             </w:rPr>
           </w:pPr>
-          <w:hyperlink w:anchor="_Toc242788246" w:history="1">
+          <w:hyperlink w:anchor="_Toc242788728" w:history="1">
             <w:r>
               <w:rPr>
                 <w:rStyle w:val="Hyperlink"/>
@@ -2295,7 +2361,7 @@
               <w:rPr>
                 <w:noProof/>
               </w:rPr>
-              <w:instrText xml:space="preserve"> PAGEREF _Toc242788246 \h </w:instrText>
+              <w:instrText xml:space="preserve"> PAGEREF _Toc242788728 \h </w:instrText>
             </w:r>
             <w:r>
               <w:rPr>
@@ -2312,7 +2378,7 @@
               <w:rPr>
                 <w:noProof/>
               </w:rPr>
-              <w:t>29</w:t>
+              <w:t>30</w:t>
             </w:r>
             <w:r>
               <w:rPr>
@@ -2337,7 +2403,7 @@
               <w14:ligatures w14:val="standardContextual"/>
             </w:rPr>
           </w:pPr>
-          <w:hyperlink w:anchor="_Toc242788247" w:history="1">
+          <w:hyperlink w:anchor="_Toc242788729" w:history="1">
             <w:r>
               <w:rPr>
                 <w:rStyle w:val="Hyperlink"/>
@@ -2361,7 +2427,7 @@
               <w:rPr>
                 <w:noProof/>
               </w:rPr>
-              <w:instrText xml:space="preserve"> PAGEREF _Toc242788247 \h </w:instrText>
+              <w:instrText xml:space="preserve"> PAGEREF _Toc242788729 \h </w:instrText>
             </w:r>
             <w:r>
               <w:rPr>
@@ -2378,7 +2444,7 @@
               <w:rPr>
                 <w:noProof/>
               </w:rPr>
-              <w:t>30</w:t>
+              <w:t>31</w:t>
             </w:r>
             <w:r>
               <w:rPr>
@@ -2403,7 +2469,7 @@
               <w14:ligatures w14:val="standardContextual"/>
             </w:rPr>
           </w:pPr>
-          <w:hyperlink w:anchor="_Toc242788248" w:history="1">
+          <w:hyperlink w:anchor="_Toc242788730" w:history="1">
             <w:r>
               <w:rPr>
                 <w:rStyle w:val="Hyperlink"/>
@@ -2427,7 +2493,7 @@
               <w:rPr>
                 <w:noProof/>
               </w:rPr>
-              <w:instrText xml:space="preserve"> PAGEREF _Toc242788248 \h </w:instrText>
+              <w:instrText xml:space="preserve"> PAGEREF _Toc242788730 \h </w:instrText>
             </w:r>
             <w:r>
               <w:rPr>
@@ -2444,7 +2510,7 @@
               <w:rPr>
                 <w:noProof/>
               </w:rPr>
-              <w:t>30</w:t>
+              <w:t>31</w:t>
             </w:r>
             <w:r>
               <w:rPr>
@@ -2469,7 +2535,7 @@
               <w14:ligatures w14:val="standardContextual"/>
             </w:rPr>
           </w:pPr>
-          <w:hyperlink w:anchor="_Toc242788249" w:history="1">
+          <w:hyperlink w:anchor="_Toc242788731" w:history="1">
             <w:r>
               <w:rPr>
                 <w:rStyle w:val="Hyperlink"/>
@@ -2493,7 +2559,7 @@
               <w:rPr>
                 <w:noProof/>
               </w:rPr>
-              <w:instrText xml:space="preserve"> PAGEREF _Toc242788249 \h </w:instrText>
+              <w:instrText xml:space="preserve"> PAGEREF _Toc242788731 \h </w:instrText>
             </w:r>
             <w:r>
               <w:rPr>
@@ -2510,7 +2576,7 @@
               <w:rPr>
                 <w:noProof/>
               </w:rPr>
-              <w:t>31</w:t>
+              <w:t>32</w:t>
             </w:r>
             <w:r>
               <w:rPr>
@@ -2535,7 +2601,7 @@
               <w14:ligatures w14:val="standardContextual"/>
             </w:rPr>
           </w:pPr>
-          <w:hyperlink w:anchor="_Toc242788250" w:history="1">
+          <w:hyperlink w:anchor="_Toc242788732" w:history="1">
             <w:r>
               <w:rPr>
                 <w:rStyle w:val="Hyperlink"/>
@@ -2559,7 +2625,7 @@
               <w:rPr>
                 <w:noProof/>
               </w:rPr>
-              <w:instrText xml:space="preserve"> PAGEREF _Toc242788250 \h </w:instrText>
+              <w:instrText xml:space="preserve"> PAGEREF _Toc242788732 \h </w:instrText>
             </w:r>
             <w:r>
               <w:rPr>
@@ -2576,7 +2642,7 @@
               <w:rPr>
                 <w:noProof/>
               </w:rPr>
-              <w:t>31</w:t>
+              <w:t>32</w:t>
             </w:r>
             <w:r>
               <w:rPr>
@@ -2601,7 +2667,7 @@
               <w14:ligatures w14:val="standardContextual"/>
             </w:rPr>
           </w:pPr>
-          <w:hyperlink w:anchor="_Toc242788251" w:history="1">
+          <w:hyperlink w:anchor="_Toc242788733" w:history="1">
             <w:r>
               <w:rPr>
                 <w:rStyle w:val="Hyperlink"/>
@@ -2625,7 +2691,7 @@
               <w:rPr>
                 <w:noProof/>
               </w:rPr>
-              <w:instrText xml:space="preserve"> PAGEREF _Toc242788251 \h </w:instrText>
+              <w:instrText xml:space="preserve"> PAGEREF _Toc242788733 \h </w:instrText>
             </w:r>
             <w:r>
               <w:rPr>
@@ -2642,7 +2708,7 @@
               <w:rPr>
                 <w:noProof/>
               </w:rPr>
-              <w:t>33</w:t>
+              <w:t>34</w:t>
             </w:r>
             <w:r>
               <w:rPr>
@@ -2667,7 +2733,7 @@
               <w14:ligatures w14:val="standardContextual"/>
             </w:rPr>
           </w:pPr>
-          <w:hyperlink w:anchor="_Toc242788252" w:history="1">
+          <w:hyperlink w:anchor="_Toc242788734" w:history="1">
             <w:r>
               <w:rPr>
                 <w:rStyle w:val="Hyperlink"/>
@@ -2691,7 +2757,7 @@
               <w:rPr>
                 <w:noProof/>
               </w:rPr>
-              <w:instrText xml:space="preserve"> PAGEREF _Toc242788252 \h </w:instrText>
+              <w:instrText xml:space="preserve"> PAGEREF _Toc242788734 \h </w:instrText>
             </w:r>
             <w:r>
               <w:rPr>
@@ -2708,7 +2774,7 @@
               <w:rPr>
                 <w:noProof/>
               </w:rPr>
-              <w:t>33</w:t>
+              <w:t>34</w:t>
             </w:r>
             <w:r>
               <w:rPr>
@@ -2733,7 +2799,7 @@
               <w14:ligatures w14:val="standardContextual"/>
             </w:rPr>
           </w:pPr>
-          <w:hyperlink w:anchor="_Toc242788253" w:history="1">
+          <w:hyperlink w:anchor="_Toc242788735" w:history="1">
             <w:r>
               <w:rPr>
                 <w:rStyle w:val="Hyperlink"/>
@@ -2757,7 +2823,7 @@
               <w:rPr>
                 <w:noProof/>
               </w:rPr>
-              <w:instrText xml:space="preserve"> PAGEREF _Toc242788253 \h </w:instrText>
+              <w:instrText xml:space="preserve"> PAGEREF _Toc242788735 \h </w:instrText>
             </w:r>
             <w:r>
               <w:rPr>
@@ -2774,7 +2840,7 @@
               <w:rPr>
                 <w:noProof/>
               </w:rPr>
-              <w:t>34</w:t>
+              <w:t>35</w:t>
             </w:r>
             <w:r>
               <w:rPr>
@@ -2799,7 +2865,7 @@
               <w14:ligatures w14:val="standardContextual"/>
             </w:rPr>
           </w:pPr>
-          <w:hyperlink w:anchor="_Toc242788254" w:history="1">
+          <w:hyperlink w:anchor="_Toc242788736" w:history="1">
             <w:r>
               <w:rPr>
                 <w:rStyle w:val="Hyperlink"/>
@@ -2823,7 +2889,7 @@
               <w:rPr>
                 <w:noProof/>
               </w:rPr>
-              <w:instrText xml:space="preserve"> PAGEREF _Toc242788254 \h </w:instrText>
+              <w:instrText xml:space="preserve"> PAGEREF _Toc242788736 \h </w:instrText>
             </w:r>
             <w:r>
               <w:rPr>
@@ -2840,7 +2906,7 @@
               <w:rPr>
                 <w:noProof/>
               </w:rPr>
-              <w:t>34</w:t>
+              <w:t>35</w:t>
             </w:r>
             <w:r>
               <w:rPr>
@@ -2865,7 +2931,7 @@
               <w14:ligatures w14:val="standardContextual"/>
             </w:rPr>
           </w:pPr>
-          <w:hyperlink w:anchor="_Toc242788255" w:history="1">
+          <w:hyperlink w:anchor="_Toc242788737" w:history="1">
             <w:r>
               <w:rPr>
                 <w:rStyle w:val="Hyperlink"/>
@@ -2889,7 +2955,7 @@
               <w:rPr>
                 <w:noProof/>
               </w:rPr>
-              <w:instrText xml:space="preserve"> PAGEREF _Toc242788255 \h </w:instrText>
+              <w:instrText xml:space="preserve"> PAGEREF _Toc242788737 \h </w:instrText>
             </w:r>
             <w:r>
               <w:rPr>
@@ -2906,7 +2972,7 @@
               <w:rPr>
                 <w:noProof/>
               </w:rPr>
-              <w:t>34</w:t>
+              <w:t>35</w:t>
             </w:r>
             <w:r>
               <w:rPr>
@@ -2931,7 +2997,7 @@
               <w14:ligatures w14:val="standardContextual"/>
             </w:rPr>
           </w:pPr>
-          <w:hyperlink w:anchor="_Toc242788256" w:history="1">
+          <w:hyperlink w:anchor="_Toc242788738" w:history="1">
             <w:r>
               <w:rPr>
                 <w:rStyle w:val="Hyperlink"/>
@@ -2955,7 +3021,7 @@
               <w:rPr>
                 <w:noProof/>
               </w:rPr>
-              <w:instrText xml:space="preserve"> PAGEREF _Toc242788256 \h </w:instrText>
+              <w:instrText xml:space="preserve"> PAGEREF _Toc242788738 \h </w:instrText>
             </w:r>
             <w:r>
               <w:rPr>
@@ -2972,7 +3038,7 @@
               <w:rPr>
                 <w:noProof/>
               </w:rPr>
-              <w:t>34</w:t>
+              <w:t>35</w:t>
             </w:r>
             <w:r>
               <w:rPr>
@@ -2997,7 +3063,7 @@
               <w14:ligatures w14:val="standardContextual"/>
             </w:rPr>
           </w:pPr>
-          <w:hyperlink w:anchor="_Toc242788257" w:history="1">
+          <w:hyperlink w:anchor="_Toc242788739" w:history="1">
             <w:r>
               <w:rPr>
                 <w:rStyle w:val="Hyperlink"/>
@@ -3021,7 +3087,7 @@
               <w:rPr>
                 <w:noProof/>
               </w:rPr>
-              <w:instrText xml:space="preserve"> PAGEREF _Toc242788257 \h </w:instrText>
+              <w:instrText xml:space="preserve"> PAGEREF _Toc242788739 \h </w:instrText>
             </w:r>
             <w:r>
               <w:rPr>
@@ -3038,7 +3104,7 @@
               <w:rPr>
                 <w:noProof/>
               </w:rPr>
-              <w:t>35</w:t>
+              <w:t>36</w:t>
             </w:r>
             <w:r>
               <w:rPr>
@@ -3063,7 +3129,7 @@
               <w14:ligatures w14:val="standardContextual"/>
             </w:rPr>
           </w:pPr>
-          <w:hyperlink w:anchor="_Toc242788258" w:history="1">
+          <w:hyperlink w:anchor="_Toc242788740" w:history="1">
             <w:r>
               <w:rPr>
                 <w:rStyle w:val="Hyperlink"/>
@@ -3087,7 +3153,7 @@
               <w:rPr>
                 <w:noProof/>
               </w:rPr>
-              <w:instrText xml:space="preserve"> PAGEREF _Toc242788258 \h </w:instrText>
+              <w:instrText xml:space="preserve"> PAGEREF _Toc242788740 \h </w:instrText>
             </w:r>
             <w:r>
               <w:rPr>
@@ -3104,7 +3170,7 @@
               <w:rPr>
                 <w:noProof/>
               </w:rPr>
-              <w:t>35</w:t>
+              <w:t>36</w:t>
             </w:r>
             <w:r>
               <w:rPr>
@@ -3129,7 +3195,7 @@
               <w14:ligatures w14:val="standardContextual"/>
             </w:rPr>
           </w:pPr>
-          <w:hyperlink w:anchor="_Toc242788259" w:history="1">
+          <w:hyperlink w:anchor="_Toc242788741" w:history="1">
             <w:r>
               <w:rPr>
                 <w:rStyle w:val="Hyperlink"/>
@@ -3153,7 +3219,7 @@
               <w:rPr>
                 <w:noProof/>
               </w:rPr>
-              <w:instrText xml:space="preserve"> PAGEREF _Toc242788259 \h </w:instrText>
+              <w:instrText xml:space="preserve"> PAGEREF _Toc242788741 \h </w:instrText>
             </w:r>
             <w:r>
               <w:rPr>
@@ -3170,7 +3236,7 @@
               <w:rPr>
                 <w:noProof/>
               </w:rPr>
-              <w:t>35</w:t>
+              <w:t>36</w:t>
             </w:r>
             <w:r>
               <w:rPr>
@@ -3195,7 +3261,7 @@
               <w14:ligatures w14:val="standardContextual"/>
             </w:rPr>
           </w:pPr>
-          <w:hyperlink w:anchor="_Toc242788260" w:history="1">
+          <w:hyperlink w:anchor="_Toc242788742" w:history="1">
             <w:r>
               <w:rPr>
                 <w:rStyle w:val="Hyperlink"/>
@@ -3219,7 +3285,7 @@
               <w:rPr>
                 <w:noProof/>
               </w:rPr>
-              <w:instrText xml:space="preserve"> PAGEREF _Toc242788260 \h </w:instrText>
+              <w:instrText xml:space="preserve"> PAGEREF _Toc242788742 \h </w:instrText>
             </w:r>
             <w:r>
               <w:rPr>
@@ -3236,7 +3302,7 @@
               <w:rPr>
                 <w:noProof/>
               </w:rPr>
-              <w:t>37</w:t>
+              <w:t>38</w:t>
             </w:r>
             <w:r>
               <w:rPr>
@@ -3261,7 +3327,7 @@
               <w14:ligatures w14:val="standardContextual"/>
             </w:rPr>
           </w:pPr>
-          <w:hyperlink w:anchor="_Toc242788261" w:history="1">
+          <w:hyperlink w:anchor="_Toc242788743" w:history="1">
             <w:r>
               <w:rPr>
                 <w:rStyle w:val="Hyperlink"/>
@@ -3285,7 +3351,7 @@
               <w:rPr>
                 <w:noProof/>
               </w:rPr>
-              <w:instrText xml:space="preserve"> PAGEREF _Toc242788261 \h </w:instrText>
+              <w:instrText xml:space="preserve"> PAGEREF _Toc242788743 \h </w:instrText>
             </w:r>
             <w:r>
               <w:rPr>
@@ -3302,7 +3368,7 @@
               <w:rPr>
                 <w:noProof/>
               </w:rPr>
-              <w:t>37</w:t>
+              <w:t>38</w:t>
             </w:r>
             <w:r>
               <w:rPr>
@@ -3327,7 +3393,7 @@
               <w14:ligatures w14:val="standardContextual"/>
             </w:rPr>
           </w:pPr>
-          <w:hyperlink w:anchor="_Toc242788262" w:history="1">
+          <w:hyperlink w:anchor="_Toc242788744" w:history="1">
             <w:r>
               <w:rPr>
                 <w:rStyle w:val="Hyperlink"/>
@@ -3351,7 +3417,7 @@
               <w:rPr>
                 <w:noProof/>
               </w:rPr>
-              <w:instrText xml:space="preserve"> PAGEREF _Toc242788262 \h </w:instrText>
+              <w:instrText xml:space="preserve"> PAGEREF _Toc242788744 \h </w:instrText>
             </w:r>
             <w:r>
               <w:rPr>
@@ -3368,7 +3434,7 @@
               <w:rPr>
                 <w:noProof/>
               </w:rPr>
-              <w:t>37</w:t>
+              <w:t>38</w:t>
             </w:r>
             <w:r>
               <w:rPr>
@@ -3393,7 +3459,7 @@
               <w14:ligatures w14:val="standardContextual"/>
             </w:rPr>
           </w:pPr>
-          <w:hyperlink w:anchor="_Toc242788263" w:history="1">
+          <w:hyperlink w:anchor="_Toc242788745" w:history="1">
             <w:r>
               <w:rPr>
                 <w:rStyle w:val="Hyperlink"/>
@@ -3417,7 +3483,7 @@
               <w:rPr>
                 <w:noProof/>
               </w:rPr>
-              <w:instrText xml:space="preserve"> PAGEREF _Toc242788263 \h </w:instrText>
+              <w:instrText xml:space="preserve"> PAGEREF _Toc242788745 \h </w:instrText>
             </w:r>
             <w:r>
               <w:rPr>
@@ -3434,7 +3500,7 @@
               <w:rPr>
                 <w:noProof/>
               </w:rPr>
-              <w:t>39</w:t>
+              <w:t>40</w:t>
             </w:r>
             <w:r>
               <w:rPr>
@@ -3459,7 +3525,7 @@
               <w14:ligatures w14:val="standardContextual"/>
             </w:rPr>
           </w:pPr>
-          <w:hyperlink w:anchor="_Toc242788264" w:history="1">
+          <w:hyperlink w:anchor="_Toc242788746" w:history="1">
             <w:r>
               <w:rPr>
                 <w:rStyle w:val="Hyperlink"/>
@@ -3483,7 +3549,7 @@
               <w:rPr>
                 <w:noProof/>
               </w:rPr>
-              <w:instrText xml:space="preserve"> PAGEREF _Toc242788264 \h </w:instrText>
+              <w:instrText xml:space="preserve"> PAGEREF _Toc242788746 \h </w:instrText>
             </w:r>
             <w:r>
               <w:rPr>
@@ -3500,7 +3566,7 @@
               <w:rPr>
                 <w:noProof/>
               </w:rPr>
-              <w:t>40</w:t>
+              <w:t>41</w:t>
             </w:r>
             <w:r>
               <w:rPr>
@@ -3525,7 +3591,7 @@
               <w14:ligatures w14:val="standardContextual"/>
             </w:rPr>
           </w:pPr>
-          <w:hyperlink w:anchor="_Toc242788265" w:history="1">
+          <w:hyperlink w:anchor="_Toc242788747" w:history="1">
             <w:r>
               <w:rPr>
                 <w:rStyle w:val="Hyperlink"/>
@@ -3549,7 +3615,7 @@
               <w:rPr>
                 <w:noProof/>
               </w:rPr>
-              <w:instrText xml:space="preserve"> PAGEREF _Toc242788265 \h </w:instrText>
+              <w:instrText xml:space="preserve"> PAGEREF _Toc242788747 \h </w:instrText>
             </w:r>
             <w:r>
               <w:rPr>
@@ -3566,7 +3632,7 @@
               <w:rPr>
                 <w:noProof/>
               </w:rPr>
-              <w:t>42</w:t>
+              <w:t>43</w:t>
             </w:r>
             <w:r>
               <w:rPr>
@@ -3591,7 +3657,7 @@
               <w14:ligatures w14:val="standardContextual"/>
             </w:rPr>
           </w:pPr>
-          <w:hyperlink w:anchor="_Toc242788266" w:history="1">
+          <w:hyperlink w:anchor="_Toc242788748" w:history="1">
             <w:r>
               <w:rPr>
                 <w:rStyle w:val="Hyperlink"/>
@@ -3615,7 +3681,7 @@
               <w:rPr>
                 <w:noProof/>
               </w:rPr>
-              <w:instrText xml:space="preserve"> PAGEREF _Toc242788266 \h </w:instrText>
+              <w:instrText xml:space="preserve"> PAGEREF _Toc242788748 \h </w:instrText>
             </w:r>
             <w:r>
               <w:rPr>
@@ -3632,7 +3698,7 @@
               <w:rPr>
                 <w:noProof/>
               </w:rPr>
-              <w:t>42</w:t>
+              <w:t>43</w:t>
             </w:r>
             <w:r>
               <w:rPr>
@@ -3657,7 +3723,7 @@
               <w14:ligatures w14:val="standardContextual"/>
             </w:rPr>
           </w:pPr>
-          <w:hyperlink w:anchor="_Toc242788267" w:history="1">
+          <w:hyperlink w:anchor="_Toc242788749" w:history="1">
             <w:r>
               <w:rPr>
                 <w:rStyle w:val="Hyperlink"/>
@@ -3681,7 +3747,7 @@
               <w:rPr>
                 <w:noProof/>
               </w:rPr>
-              <w:instrText xml:space="preserve"> PAGEREF _Toc242788267 \h </w:instrText>
+              <w:instrText xml:space="preserve"> PAGEREF _Toc242788749 \h </w:instrText>
             </w:r>
             <w:r>
               <w:rPr>
@@ -3698,7 +3764,7 @@
               <w:rPr>
                 <w:noProof/>
               </w:rPr>
-              <w:t>42</w:t>
+              <w:t>43</w:t>
             </w:r>
             <w:r>
               <w:rPr>
@@ -3723,7 +3789,7 @@
               <w14:ligatures w14:val="standardContextual"/>
             </w:rPr>
           </w:pPr>
-          <w:hyperlink w:anchor="_Toc242788268" w:history="1">
+          <w:hyperlink w:anchor="_Toc242788750" w:history="1">
             <w:r>
               <w:rPr>
                 <w:rStyle w:val="Hyperlink"/>
@@ -3747,7 +3813,7 @@
               <w:rPr>
                 <w:noProof/>
               </w:rPr>
-              <w:instrText xml:space="preserve"> PAGEREF _Toc242788268 \h </w:instrText>
+              <w:instrText xml:space="preserve"> PAGEREF _Toc242788750 \h </w:instrText>
             </w:r>
             <w:r>
               <w:rPr>
@@ -3764,7 +3830,7 @@
               <w:rPr>
                 <w:noProof/>
               </w:rPr>
-              <w:t>43</w:t>
+              <w:t>44</w:t>
             </w:r>
             <w:r>
               <w:rPr>
@@ -3789,7 +3855,7 @@
               <w14:ligatures w14:val="standardContextual"/>
             </w:rPr>
           </w:pPr>
-          <w:hyperlink w:anchor="_Toc242788269" w:history="1">
+          <w:hyperlink w:anchor="_Toc242788751" w:history="1">
             <w:r>
               <w:rPr>
                 <w:rStyle w:val="Hyperlink"/>
@@ -3813,7 +3879,7 @@
               <w:rPr>
                 <w:noProof/>
               </w:rPr>
-              <w:instrText xml:space="preserve"> PAGEREF _Toc242788269 \h </w:instrText>
+              <w:instrText xml:space="preserve"> PAGEREF _Toc242788751 \h </w:instrText>
             </w:r>
             <w:r>
               <w:rPr>
@@ -3830,7 +3896,7 @@
               <w:rPr>
                 <w:noProof/>
               </w:rPr>
-              <w:t>44</w:t>
+              <w:t>45</w:t>
             </w:r>
             <w:r>
               <w:rPr>
@@ -3855,7 +3921,7 @@
               <w14:ligatures w14:val="standardContextual"/>
             </w:rPr>
           </w:pPr>
-          <w:hyperlink w:anchor="_Toc242788270" w:history="1">
+          <w:hyperlink w:anchor="_Toc242788752" w:history="1">
             <w:r>
               <w:rPr>
                 <w:rStyle w:val="Hyperlink"/>
@@ -3879,7 +3945,7 @@
               <w:rPr>
                 <w:noProof/>
               </w:rPr>
-              <w:instrText xml:space="preserve"> PAGEREF _Toc242788270 \h </w:instrText>
+              <w:instrText xml:space="preserve"> PAGEREF _Toc242788752 \h </w:instrText>
             </w:r>
             <w:r>
               <w:rPr>
@@ -3896,7 +3962,7 @@
               <w:rPr>
                 <w:noProof/>
               </w:rPr>
-              <w:t>44</w:t>
+              <w:t>45</w:t>
             </w:r>
             <w:r>
               <w:rPr>
@@ -3921,7 +3987,7 @@
               <w14:ligatures w14:val="standardContextual"/>
             </w:rPr>
           </w:pPr>
-          <w:hyperlink w:anchor="_Toc242788271" w:history="1">
+          <w:hyperlink w:anchor="_Toc242788753" w:history="1">
             <w:r>
               <w:rPr>
                 <w:rStyle w:val="Hyperlink"/>
@@ -3945,7 +4011,7 @@
               <w:rPr>
                 <w:noProof/>
               </w:rPr>
-              <w:instrText xml:space="preserve"> PAGEREF _Toc242788271 \h </w:instrText>
+              <w:instrText xml:space="preserve"> PAGEREF _Toc242788753 \h </w:instrText>
             </w:r>
             <w:r>
               <w:rPr>
@@ -3962,7 +4028,7 @@
               <w:rPr>
                 <w:noProof/>
               </w:rPr>
-              <w:t>45</w:t>
+              <w:t>46</w:t>
             </w:r>
             <w:r>
               <w:rPr>
@@ -3987,7 +4053,7 @@
               <w14:ligatures w14:val="standardContextual"/>
             </w:rPr>
           </w:pPr>
-          <w:hyperlink w:anchor="_Toc242788272" w:history="1">
+          <w:hyperlink w:anchor="_Toc242788754" w:history="1">
             <w:r>
               <w:rPr>
                 <w:rStyle w:val="Hyperlink"/>
@@ -4011,7 +4077,7 @@
               <w:rPr>
                 <w:noProof/>
               </w:rPr>
-              <w:instrText xml:space="preserve"> PAGEREF _Toc242788272 \h </w:instrText>
+              <w:instrText xml:space="preserve"> PAGEREF _Toc242788754 \h </w:instrText>
             </w:r>
             <w:r>
               <w:rPr>
@@ -4028,7 +4094,7 @@
               <w:rPr>
                 <w:noProof/>
               </w:rPr>
-              <w:t>46</w:t>
+              <w:t>47</w:t>
             </w:r>
             <w:r>
               <w:rPr>
@@ -4053,7 +4119,7 @@
               <w14:ligatures w14:val="standardContextual"/>
             </w:rPr>
           </w:pPr>
-          <w:hyperlink w:anchor="_Toc242788273" w:history="1">
+          <w:hyperlink w:anchor="_Toc242788755" w:history="1">
             <w:r>
               <w:rPr>
                 <w:rStyle w:val="Hyperlink"/>
@@ -4077,7 +4143,7 @@
               <w:rPr>
                 <w:noProof/>
               </w:rPr>
-              <w:instrText xml:space="preserve"> PAGEREF _Toc242788273 \h </w:instrText>
+              <w:instrText xml:space="preserve"> PAGEREF _Toc242788755 \h </w:instrText>
             </w:r>
             <w:r>
               <w:rPr>
@@ -4094,7 +4160,7 @@
               <w:rPr>
                 <w:noProof/>
               </w:rPr>
-              <w:t>46</w:t>
+              <w:t>47</w:t>
             </w:r>
             <w:r>
               <w:rPr>
@@ -4119,7 +4185,7 @@
               <w14:ligatures w14:val="standardContextual"/>
             </w:rPr>
           </w:pPr>
-          <w:hyperlink w:anchor="_Toc242788274" w:history="1">
+          <w:hyperlink w:anchor="_Toc242788756" w:history="1">
             <w:r>
               <w:rPr>
                 <w:rStyle w:val="Hyperlink"/>
@@ -4143,7 +4209,7 @@
               <w:rPr>
                 <w:noProof/>
               </w:rPr>
-              <w:instrText xml:space="preserve"> PAGEREF _Toc242788274 \h </w:instrText>
+              <w:instrText xml:space="preserve"> PAGEREF _Toc242788756 \h </w:instrText>
             </w:r>
             <w:r>
               <w:rPr>
@@ -4160,7 +4226,7 @@
               <w:rPr>
                 <w:noProof/>
               </w:rPr>
-              <w:t>46</w:t>
+              <w:t>47</w:t>
             </w:r>
             <w:r>
               <w:rPr>
@@ -4185,7 +4251,7 @@
               <w14:ligatures w14:val="standardContextual"/>
             </w:rPr>
           </w:pPr>
-          <w:hyperlink w:anchor="_Toc242788275" w:history="1">
+          <w:hyperlink w:anchor="_Toc242788757" w:history="1">
             <w:r>
               <w:rPr>
                 <w:rStyle w:val="Hyperlink"/>
@@ -4209,7 +4275,7 @@
               <w:rPr>
                 <w:noProof/>
               </w:rPr>
-              <w:instrText xml:space="preserve"> PAGEREF _Toc242788275 \h </w:instrText>
+              <w:instrText xml:space="preserve"> PAGEREF _Toc242788757 \h </w:instrText>
             </w:r>
             <w:r>
               <w:rPr>
@@ -4226,7 +4292,7 @@
               <w:rPr>
                 <w:noProof/>
               </w:rPr>
-              <w:t>48</w:t>
+              <w:t>49</w:t>
             </w:r>
             <w:r>
               <w:rPr>
@@ -4251,7 +4317,7 @@
               <w14:ligatures w14:val="standardContextual"/>
             </w:rPr>
           </w:pPr>
-          <w:hyperlink w:anchor="_Toc242788276" w:history="1">
+          <w:hyperlink w:anchor="_Toc242788758" w:history="1">
             <w:r>
               <w:rPr>
                 <w:rStyle w:val="Hyperlink"/>
@@ -4275,7 +4341,7 @@
               <w:rPr>
                 <w:noProof/>
               </w:rPr>
-              <w:instrText xml:space="preserve"> PAGEREF _Toc242788276 \h </w:instrText>
+              <w:instrText xml:space="preserve"> PAGEREF _Toc242788758 \h </w:instrText>
             </w:r>
             <w:r>
               <w:rPr>
@@ -4292,7 +4358,7 @@
               <w:rPr>
                 <w:noProof/>
               </w:rPr>
-              <w:t>48</w:t>
+              <w:t>49</w:t>
             </w:r>
             <w:r>
               <w:rPr>
@@ -4317,7 +4383,7 @@
               <w14:ligatures w14:val="standardContextual"/>
             </w:rPr>
           </w:pPr>
-          <w:hyperlink w:anchor="_Toc242788277" w:history="1">
+          <w:hyperlink w:anchor="_Toc242788759" w:history="1">
             <w:r>
               <w:rPr>
                 <w:rStyle w:val="Hyperlink"/>
@@ -4341,7 +4407,7 @@
               <w:rPr>
                 <w:noProof/>
               </w:rPr>
-              <w:instrText xml:space="preserve"> PAGEREF _Toc242788277 \h </w:instrText>
+              <w:instrText xml:space="preserve"> PAGEREF _Toc242788759 \h </w:instrText>
             </w:r>
             <w:r>
               <w:rPr>
@@ -4358,7 +4424,7 @@
               <w:rPr>
                 <w:noProof/>
               </w:rPr>
-              <w:t>48</w:t>
+              <w:t>49</w:t>
             </w:r>
             <w:r>
               <w:rPr>
@@ -4383,7 +4449,7 @@
               <w14:ligatures w14:val="standardContextual"/>
             </w:rPr>
           </w:pPr>
-          <w:hyperlink w:anchor="_Toc242788278" w:history="1">
+          <w:hyperlink w:anchor="_Toc242788760" w:history="1">
             <w:r>
               <w:rPr>
                 <w:rStyle w:val="Hyperlink"/>
@@ -4407,7 +4473,7 @@
               <w:rPr>
                 <w:noProof/>
               </w:rPr>
-              <w:instrText xml:space="preserve"> PAGEREF _Toc242788278 \h </w:instrText>
+              <w:instrText xml:space="preserve"> PAGEREF _Toc242788760 \h </w:instrText>
             </w:r>
             <w:r>
               <w:rPr>
@@ -4424,7 +4490,7 @@
               <w:rPr>
                 <w:noProof/>
               </w:rPr>
-              <w:t>48</w:t>
+              <w:t>49</w:t>
             </w:r>
             <w:r>
               <w:rPr>
@@ -4449,7 +4515,7 @@
               <w14:ligatures w14:val="standardContextual"/>
             </w:rPr>
           </w:pPr>
-          <w:hyperlink w:anchor="_Toc242788279" w:history="1">
+          <w:hyperlink w:anchor="_Toc242788761" w:history="1">
             <w:r>
               <w:rPr>
                 <w:rStyle w:val="Hyperlink"/>
@@ -4473,7 +4539,7 @@
               <w:rPr>
                 <w:noProof/>
               </w:rPr>
-              <w:instrText xml:space="preserve"> PAGEREF _Toc242788279 \h </w:instrText>
+              <w:instrText xml:space="preserve"> PAGEREF _Toc242788761 \h </w:instrText>
             </w:r>
             <w:r>
               <w:rPr>
@@ -4490,7 +4556,7 @@
               <w:rPr>
                 <w:noProof/>
               </w:rPr>
-              <w:t>49</w:t>
+              <w:t>50</w:t>
             </w:r>
             <w:r>
               <w:rPr>
@@ -4515,7 +4581,7 @@
               <w14:ligatures w14:val="standardContextual"/>
             </w:rPr>
           </w:pPr>
-          <w:hyperlink w:anchor="_Toc242788280" w:history="1">
+          <w:hyperlink w:anchor="_Toc242788762" w:history="1">
             <w:r>
               <w:rPr>
                 <w:rStyle w:val="Hyperlink"/>
@@ -4539,7 +4605,7 @@
               <w:rPr>
                 <w:noProof/>
               </w:rPr>
-              <w:instrText xml:space="preserve"> PAGEREF _Toc242788280 \h </w:instrText>
+              <w:instrText xml:space="preserve"> PAGEREF _Toc242788762 \h </w:instrText>
             </w:r>
             <w:r>
               <w:rPr>
@@ -4556,7 +4622,7 @@
               <w:rPr>
                 <w:noProof/>
               </w:rPr>
-              <w:t>51</w:t>
+              <w:t>52</w:t>
             </w:r>
             <w:r>
               <w:rPr>
@@ -4568,6 +4634,7 @@
         </w:p>
         <w:p>
           <w:r>
+            <w:lastRenderedPageBreak/>
             <w:fldChar w:fldCharType="end"/>
           </w:r>
         </w:p>
@@ -4582,7 +4649,6 @@
           <w:sz w:val="18"/>
           <w:szCs w:val="18"/>
         </w:rPr>
-        <w:lastRenderedPageBreak/>
         <w:t>Si el índice aparece vacío, haz clic derecho sobre él y elige “Actualizar campos”.</w:t>
       </w:r>
     </w:p>
@@ -4591,7 +4657,7 @@
         <w:pStyle w:val="Heading1"/>
         <w:pageBreakBefore/>
       </w:pPr>
-      <w:bookmarkStart w:id="0" w:name="_Toc242788214"/>
+      <w:bookmarkStart w:id="0" w:name="_Toc242788695"/>
       <w:r>
         <w:lastRenderedPageBreak/>
         <w:t>1. Resumen ejecutivo</w:t>
@@ -4603,7 +4669,7 @@
         <w:spacing w:after="120"/>
       </w:pPr>
       <w:r>
-        <w:t>Este proyecto es un conjunto de herramientas para transmisiones en vivo de TikTok, inspirado en TikFinity. Permite poner en pantalla, mediante OBS Studio o TikTok LIVE Studio, elementos que reaccionan a lo que hace el público durante el LIVE: una ruleta que gira cuando alguien envía un regalo (con una segunda ruleta premium), barras de meta que se llenan con likes, seguidores, compartidos o monedas, alertas animadas, una carrera de regalos entre integrantes con reloj por rondas , una batalla de regalos (tira y afloja) entre dos equipos, un jefe del LIVE (un reto cooperativo en el que el chat le quita vida a un jefe antes de que se acabe el tiempo), un reloj de subathon al que el público le suma tiempo y una bóveda dorada que revela un premio secreto al llegar a una meta de monedas. Además incluye un panel para ver la actividad del LIVE en tiempo real y un catálogo de regalos con su código (ID).</w:t>
+        <w:t>Este proyecto es un conjunto de herramientas para transmisiones en vivo de TikTok, inspirado en TikFinity. Permite poner en pantalla, mediante OBS Studio o TikTok LIVE Studio, elementos que reaccionan a lo que hace el público durante el LIVE: una ruleta que gira cuando alguien envía un regalo (con una segunda ruleta premium), barras de meta que se llenan con likes, seguidores, compartidos o monedas, alertas animadas, una carrera de regalos entre integrantes con reloj por rondas , una batalla de regalos (tira y afloja) entre dos equipos, un jefe del LIVE (un reto cooperativo en el que el chat le quita vida a un jefe antes de que se acabe el tiempo), un reloj de subathon al que el público le suma tiempo, una bóveda dorada que revela un premio secreto al llegar a una meta de monedas y un trono con el rey del LIVE, quien más ha dado. Además incluye un panel para ver la actividad del LIVE en tiempo real y un catálogo de regalos con su código (ID).</w:t>
       </w:r>
     </w:p>
     <w:p>
@@ -4645,7 +4711,7 @@
         <w:pStyle w:val="Heading1"/>
         <w:pageBreakBefore/>
       </w:pPr>
-      <w:bookmarkStart w:id="1" w:name="_Toc242788215"/>
+      <w:bookmarkStart w:id="1" w:name="_Toc242788696"/>
       <w:r>
         <w:lastRenderedPageBreak/>
         <w:t>2. Conceptos y glosario</w:t>
@@ -4843,7 +4909,7 @@
               <w:spacing w:after="20"/>
             </w:pPr>
             <w:r>
-              <w:t>Una página web pequeña (por ejemplo ruleta.html) con fondo transparente que se pone encima de la cámara en OBS. En el proyecto hay ocho: ruleta (normal y premium), meta, alertas, carrera de regalos, batalla de regalos, jefe del LIVE, subathon y bóveda dorada.</w:t>
+              <w:t>Una página web pequeña (por ejemplo ruleta.html) con fondo transparente que se pone encima de la cámara en OBS. En el proyecto hay nueve: ruleta (normal y premium), meta, alertas, carrera de regalos, batalla de regalos, jefe del LIVE, subathon, bóveda dorada y trono.</w:t>
             </w:r>
           </w:p>
         </w:tc>
@@ -6080,7 +6146,7 @@
         <w:pStyle w:val="Heading1"/>
         <w:pageBreakBefore/>
       </w:pPr>
-      <w:bookmarkStart w:id="2" w:name="_Toc242788216"/>
+      <w:bookmarkStart w:id="2" w:name="_Toc242788697"/>
       <w:r>
         <w:lastRenderedPageBreak/>
         <w:t>3. Arquitectura general</w:t>
@@ -6091,7 +6157,7 @@
       <w:pPr>
         <w:pStyle w:val="Heading2"/>
       </w:pPr>
-      <w:bookmarkStart w:id="3" w:name="_Toc242788217"/>
+      <w:bookmarkStart w:id="3" w:name="_Toc242788698"/>
       <w:r>
         <w:t>3.1 Piezas del sistema</w:t>
       </w:r>
@@ -6652,7 +6718,7 @@
               <w:spacing w:after="20"/>
             </w:pPr>
             <w:r>
-              <w:t>Widgets (ruleta.html, meta.html, alertas.html, carrera.html, batalla.html, jefe.html, subathon.html, boveda.html)</w:t>
+              <w:t>Widgets (ruleta.html, meta.html, alertas.html y los juegos: carrera, batalla, jefe, subathon, boveda y trono)</w:t>
             </w:r>
           </w:p>
         </w:tc>
@@ -6717,7 +6783,7 @@
       <w:pPr>
         <w:pStyle w:val="Heading2"/>
       </w:pPr>
-      <w:bookmarkStart w:id="4" w:name="_Toc242788218"/>
+      <w:bookmarkStart w:id="4" w:name="_Toc242788699"/>
       <w:r>
         <w:t>3.2 Flujo de datos</w:t>
       </w:r>
@@ -6904,7 +6970,6 @@
           <w:sz w:val="18"/>
           <w:szCs w:val="18"/>
         </w:rPr>
-        <w:lastRenderedPageBreak/>
         <w:t xml:space="preserve">   Panel ──(eventos de prueba por postMessage)──► vista previa (iframe del widget)</w:t>
       </w:r>
     </w:p>
@@ -6918,6 +6983,7 @@
         <w:spacing w:after="60"/>
       </w:pPr>
       <w:r>
+        <w:lastRenderedPageBreak/>
         <w:t>La persona configura un widget en el panel. El panel guarda la configuración en Supabase y construye una URL fija con el usuario, la API key y el identificador del widget, codificados después de #c=.</w:t>
       </w:r>
     </w:p>
@@ -6970,7 +7036,7 @@
         <w:spacing w:after="60"/>
       </w:pPr>
       <w:r>
-        <w:t>El widget convierte cada evento a un formato simple (evento normalizado) y reacciona: gira la ruleta, llena la barra, muestra una alerta, suma puntos a un integrante de la carrera, empuja la barra de la batalla, le quita vida al jefe, le suma tiempo al subathon o acerca la bóveda a su meta.</w:t>
+        <w:t>El widget convierte cada evento a un formato simple (evento normalizado) y reacciona: gira la ruleta, llena la barra, muestra una alerta, suma puntos a un integrante de la carrera, empuja la barra de la batalla, le quita vida al jefe, le suma tiempo al subathon, acerca la bóveda a su meta o corona a un nuevo rey.</w:t>
       </w:r>
     </w:p>
     <w:p>
@@ -7012,7 +7078,7 @@
         <w:pStyle w:val="Heading1"/>
         <w:pageBreakBefore/>
       </w:pPr>
-      <w:bookmarkStart w:id="5" w:name="_Toc242788219"/>
+      <w:bookmarkStart w:id="5" w:name="_Toc242788700"/>
       <w:r>
         <w:lastRenderedPageBreak/>
         <w:t>4. Servicios externos</w:t>
@@ -7023,7 +7089,7 @@
       <w:pPr>
         <w:pStyle w:val="Heading2"/>
       </w:pPr>
-      <w:bookmarkStart w:id="6" w:name="_Toc242788220"/>
+      <w:bookmarkStart w:id="6" w:name="_Toc242788701"/>
       <w:r>
         <w:t>4.1 TikTok LIVE</w:t>
       </w:r>
@@ -7782,7 +7848,7 @@
       <w:pPr>
         <w:pStyle w:val="Heading2"/>
       </w:pPr>
-      <w:bookmarkStart w:id="7" w:name="_Toc242788221"/>
+      <w:bookmarkStart w:id="7" w:name="_Toc242788702"/>
       <w:r>
         <w:t>4.2 Euler Stream</w:t>
       </w:r>
@@ -9074,7 +9140,7 @@
       <w:pPr>
         <w:pStyle w:val="Heading2"/>
       </w:pPr>
-      <w:bookmarkStart w:id="8" w:name="_Toc242788222"/>
+      <w:bookmarkStart w:id="8" w:name="_Toc242788703"/>
       <w:r>
         <w:t>4.3 GitHub, GitHub Actions y GitHub Pages</w:t>
       </w:r>
@@ -9278,7 +9344,7 @@
       <w:pPr>
         <w:pStyle w:val="Heading2"/>
       </w:pPr>
-      <w:bookmarkStart w:id="9" w:name="_Toc242788223"/>
+      <w:bookmarkStart w:id="9" w:name="_Toc242788704"/>
       <w:r>
         <w:t>4.4 Google Fonts</w:t>
       </w:r>
@@ -9308,7 +9374,7 @@
       <w:pPr>
         <w:pStyle w:val="Heading2"/>
       </w:pPr>
-      <w:bookmarkStart w:id="10" w:name="_Toc242788224"/>
+      <w:bookmarkStart w:id="10" w:name="_Toc242788705"/>
       <w:r>
         <w:lastRenderedPageBreak/>
         <w:t>4.5 Supabase (cambios en vivo)</w:t>
@@ -9564,7 +9630,7 @@
         <w:pStyle w:val="Heading1"/>
         <w:pageBreakBefore/>
       </w:pPr>
-      <w:bookmarkStart w:id="11" w:name="_Toc242788225"/>
+      <w:bookmarkStart w:id="11" w:name="_Toc242788706"/>
       <w:r>
         <w:lastRenderedPageBreak/>
         <w:t>5. Estructura de archivos</w:t>
@@ -9730,6 +9796,17 @@
         <w:ind w:left="200" w:right="200"/>
       </w:pPr>
       <w:r>
+        <w:t>│   ├── trono.html                  widget trono (rey del LIVE)</w:t>
+      </w:r>
+    </w:p>
+    <w:p>
+      <w:pPr>
+        <w:keepLines/>
+        <w:shd w:val="clear" w:color="auto" w:fill="F2F2F2"/>
+        <w:spacing w:line="260" w:lineRule="auto"/>
+        <w:ind w:left="200" w:right="200"/>
+      </w:pPr>
+      <w:r>
         <w:rPr>
           <w:rFonts w:ascii="Consolas" w:eastAsia="Consolas" w:hAnsi="Consolas" w:cs="Consolas"/>
           <w:sz w:val="18"/>
@@ -9794,7 +9871,7 @@
           <w:sz w:val="18"/>
           <w:szCs w:val="18"/>
         </w:rPr>
-        <w:t>│   │   └── widgets/ruleta.css · meta.css · alertas.css · carrera.css · batalla.css · jefe.css · subathon.css · boveda.css</w:t>
+        <w:t>│   │   └── widgets/ruleta.css · meta.css · alertas.css · carrera.css · batalla.css · jefe.css · subathon.css · boveda.css · trono.css</w:t>
       </w:r>
     </w:p>
     <w:p>
@@ -9885,7 +9962,7 @@
           <w:sz w:val="18"/>
           <w:szCs w:val="18"/>
         </w:rPr>
-        <w:t>│       ├── widgets/ruleta.js · meta.js · alertas.js · carrera.js · batalla.js · jefe.js · subathon.js · boveda.js</w:t>
+        <w:t>│       ├── widgets/ruleta.js · meta.js · alertas.js · carrera.js · batalla.js · jefe.js · subathon.js · boveda.js · trono.js</w:t>
       </w:r>
     </w:p>
     <w:p>
@@ -10024,7 +10101,7 @@
           <w:sz w:val="18"/>
           <w:szCs w:val="18"/>
         </w:rPr>
-        <w:t>│           └── vistas/ruleta.js · metas.js · alertas.js · carrera.js · batalla.js · jefe.js · subathon.js · boveda.js · actividad.js · regalos.js · conexion.js</w:t>
+        <w:t>│           └── vistas/ruleta.js · metas.js · alertas.js · carrera.js · batalla.js · jefe.js · subathon.js · boveda.js · trono.js · actividad.js · regalos.js · conexion.js</w:t>
       </w:r>
     </w:p>
     <w:p>
@@ -10178,7 +10255,7 @@
         <w:pStyle w:val="Heading1"/>
         <w:pageBreakBefore/>
       </w:pPr>
-      <w:bookmarkStart w:id="12" w:name="_Toc242788226"/>
+      <w:bookmarkStart w:id="12" w:name="_Toc242788707"/>
       <w:r>
         <w:lastRenderedPageBreak/>
         <w:t>6. Frontend: el módulo compartido comun.js</w:t>
@@ -10206,7 +10283,7 @@
       <w:pPr>
         <w:pStyle w:val="Heading2"/>
       </w:pPr>
-      <w:bookmarkStart w:id="13" w:name="_Toc242788227"/>
+      <w:bookmarkStart w:id="13" w:name="_Toc242788708"/>
       <w:r>
         <w:t>6.1 Configuración en la URL</w:t>
       </w:r>
@@ -10677,7 +10754,7 @@
       <w:pPr>
         <w:pStyle w:val="Heading2"/>
       </w:pPr>
-      <w:bookmarkStart w:id="14" w:name="_Toc242788228"/>
+      <w:bookmarkStart w:id="14" w:name="_Toc242788709"/>
       <w:r>
         <w:t>6.2 Eventos normalizados</w:t>
       </w:r>
@@ -11463,7 +11540,7 @@
       <w:pPr>
         <w:pStyle w:val="Heading2"/>
       </w:pPr>
-      <w:bookmarkStart w:id="15" w:name="_Toc242788229"/>
+      <w:bookmarkStart w:id="15" w:name="_Toc242788710"/>
       <w:r>
         <w:t>6.3 Rastreador de regalos (combos y regalos sueltos)</w:t>
       </w:r>
@@ -12193,7 +12270,7 @@
       <w:pPr>
         <w:pStyle w:val="Heading2"/>
       </w:pPr>
-      <w:bookmarkStart w:id="16" w:name="_Toc242788230"/>
+      <w:bookmarkStart w:id="16" w:name="_Toc242788711"/>
       <w:r>
         <w:t>6.4 Conexión con TikTok (conectarTikTok)</w:t>
       </w:r>
@@ -12314,7 +12391,7 @@
       <w:pPr>
         <w:pStyle w:val="Heading2"/>
       </w:pPr>
-      <w:bookmarkStart w:id="17" w:name="_Toc242788231"/>
+      <w:bookmarkStart w:id="17" w:name="_Toc242788712"/>
       <w:r>
         <w:t>6.5 Arranque de widgets (iniciarWidget)</w:t>
       </w:r>
@@ -12540,7 +12617,7 @@
       <w:pPr>
         <w:pStyle w:val="Heading2"/>
       </w:pPr>
-      <w:bookmarkStart w:id="18" w:name="_Toc242788232"/>
+      <w:bookmarkStart w:id="18" w:name="_Toc242788713"/>
       <w:r>
         <w:t>6.6 Utilidades</w:t>
       </w:r>
@@ -12606,7 +12683,7 @@
       <w:pPr>
         <w:pStyle w:val="Heading2"/>
       </w:pPr>
-      <w:bookmarkStart w:id="19" w:name="_Toc242788233"/>
+      <w:bookmarkStart w:id="19" w:name="_Toc242788714"/>
       <w:r>
         <w:lastRenderedPageBreak/>
         <w:t>6.7 Cambios en vivo (nube.js)</w:t>
@@ -12686,7 +12763,7 @@
         <w:pStyle w:val="Heading1"/>
         <w:pageBreakBefore/>
       </w:pPr>
-      <w:bookmarkStart w:id="20" w:name="_Toc242788234"/>
+      <w:bookmarkStart w:id="20" w:name="_Toc242788715"/>
       <w:r>
         <w:lastRenderedPageBreak/>
         <w:t>7. Frontend: los widgets</w:t>
@@ -12729,7 +12806,7 @@
       <w:pPr>
         <w:pStyle w:val="Heading2"/>
       </w:pPr>
-      <w:bookmarkStart w:id="21" w:name="_Toc242788235"/>
+      <w:bookmarkStart w:id="21" w:name="_Toc242788716"/>
       <w:r>
         <w:t>7.1 Ruleta de regalos (ruleta.html)</w:t>
       </w:r>
@@ -13824,7 +13901,7 @@
       <w:pPr>
         <w:pStyle w:val="Heading2"/>
       </w:pPr>
-      <w:bookmarkStart w:id="22" w:name="_Toc242788236"/>
+      <w:bookmarkStart w:id="22" w:name="_Toc242788717"/>
       <w:r>
         <w:t>7.2 Meta (meta.html)</w:t>
       </w:r>
@@ -14434,7 +14511,7 @@
       <w:pPr>
         <w:pStyle w:val="Heading2"/>
       </w:pPr>
-      <w:bookmarkStart w:id="23" w:name="_Toc242788237"/>
+      <w:bookmarkStart w:id="23" w:name="_Toc242788718"/>
       <w:r>
         <w:t>7.3 Alertas (alertas.html)</w:t>
       </w:r>
@@ -14801,7 +14878,7 @@
       <w:pPr>
         <w:pStyle w:val="Heading2"/>
       </w:pPr>
-      <w:bookmarkStart w:id="24" w:name="_Toc242788238"/>
+      <w:bookmarkStart w:id="24" w:name="_Toc242788719"/>
       <w:r>
         <w:t>7.4 Carrera de regalos (carrera.html)</w:t>
       </w:r>
@@ -16167,7 +16244,7 @@
       <w:pPr>
         <w:pStyle w:val="Heading2"/>
       </w:pPr>
-      <w:bookmarkStart w:id="25" w:name="_Toc242788239"/>
+      <w:bookmarkStart w:id="25" w:name="_Toc242788720"/>
       <w:r>
         <w:t>7.5 Batalla de regalos (batalla.html)</w:t>
       </w:r>
@@ -16823,7 +16900,7 @@
       <w:pPr>
         <w:pStyle w:val="Heading2"/>
       </w:pPr>
-      <w:bookmarkStart w:id="26" w:name="_Toc242788240"/>
+      <w:bookmarkStart w:id="26" w:name="_Toc242788721"/>
       <w:r>
         <w:t>7.6 Jefe del LIVE (jefe.html)</w:t>
       </w:r>
@@ -17959,7 +18036,7 @@
       <w:pPr>
         <w:pStyle w:val="Heading2"/>
       </w:pPr>
-      <w:bookmarkStart w:id="27" w:name="_Toc242788241"/>
+      <w:bookmarkStart w:id="27" w:name="_Toc242788722"/>
       <w:r>
         <w:lastRenderedPageBreak/>
         <w:t>7.7 Subathon (subathon.html)</w:t>
@@ -19119,7 +19196,7 @@
       <w:pPr>
         <w:pStyle w:val="Heading2"/>
       </w:pPr>
-      <w:bookmarkStart w:id="28" w:name="_Toc242788242"/>
+      <w:bookmarkStart w:id="28" w:name="_Toc242788723"/>
       <w:r>
         <w:t>7.8 Bóveda dorada (boveda.html)</w:t>
       </w:r>
@@ -20056,25 +20133,920 @@
     </w:p>
     <w:p>
       <w:pPr>
+        <w:pStyle w:val="Heading2"/>
+      </w:pPr>
+      <w:bookmarkStart w:id="29" w:name="_Toc242788724"/>
+      <w:r>
+        <w:t>7.9 Trono (trono.html)</w:t>
+      </w:r>
+      <w:bookmarkEnd w:id="29"/>
+    </w:p>
+    <w:p>
+      <w:pPr>
+        <w:spacing w:after="120"/>
+      </w:pPr>
+      <w:r>
+        <w:t>El rey del LIVE (top supporter): una insignia de cristal flotante que muestra a quien más ha dado y cuántas monedas. Cuando alguien lo supera, toma el trono con una transición. Fuente de OBS de 700 × 320 recomendada.</w:t>
+      </w:r>
+    </w:p>
+    <w:p>
+      <w:pPr>
+        <w:pStyle w:val="Heading3"/>
+      </w:pPr>
+      <w:r>
+        <w:t>Estructura</w:t>
+      </w:r>
+    </w:p>
+    <w:p>
+      <w:pPr>
+        <w:spacing w:after="120"/>
+      </w:pPr>
+      <w:r>
+        <w:t>La insignia (</w:t>
+      </w:r>
+      <w:r>
+        <w:rPr>
+          <w:rFonts w:ascii="Consolas" w:eastAsia="Consolas" w:hAnsi="Consolas" w:cs="Consolas"/>
+          <w:color w:val="7A1F33"/>
+          <w:sz w:val="19"/>
+          <w:szCs w:val="19"/>
+        </w:rPr>
+        <w:t>#trono</w:t>
+      </w:r>
+      <w:r>
+        <w:t xml:space="preserve">, clase </w:t>
+      </w:r>
+      <w:r>
+        <w:rPr>
+          <w:rFonts w:ascii="Consolas" w:eastAsia="Consolas" w:hAnsi="Consolas" w:cs="Consolas"/>
+          <w:color w:val="7A1F33"/>
+          <w:sz w:val="19"/>
+          <w:szCs w:val="19"/>
+        </w:rPr>
+        <w:t>.cristal</w:t>
+      </w:r>
+      <w:r>
+        <w:t xml:space="preserve">) tiene, de arriba abajo: una corona SVG de trazo con degradado de oro metálico (colores del estilo con </w:t>
+      </w:r>
+      <w:r>
+        <w:rPr>
+          <w:rFonts w:ascii="Consolas" w:eastAsia="Consolas" w:hAnsi="Consolas" w:cs="Consolas"/>
+          <w:color w:val="7A1F33"/>
+          <w:sz w:val="19"/>
+          <w:szCs w:val="19"/>
+        </w:rPr>
+        <w:t>stop-color</w:t>
+      </w:r>
+      <w:r>
+        <w:t>, por defecto #D4AF37), el título en mayúsculas muy espaciadas (“Áurea VIP”), el bloque del rey (</w:t>
+      </w:r>
+      <w:r>
+        <w:rPr>
+          <w:rFonts w:ascii="Consolas" w:eastAsia="Consolas" w:hAnsi="Consolas" w:cs="Consolas"/>
+          <w:color w:val="7A1F33"/>
+          <w:sz w:val="19"/>
+          <w:szCs w:val="19"/>
+        </w:rPr>
+        <w:t>#rey</w:t>
+      </w:r>
+      <w:r>
+        <w:t>: nombre en grande y monedas) y una línea (</w:t>
+      </w:r>
+      <w:r>
+        <w:rPr>
+          <w:rFonts w:ascii="Consolas" w:eastAsia="Consolas" w:hAnsi="Consolas" w:cs="Consolas"/>
+          <w:color w:val="7A1F33"/>
+          <w:sz w:val="19"/>
+          <w:szCs w:val="19"/>
+        </w:rPr>
+        <w:t>#linea</w:t>
+      </w:r>
+      <w:r>
+        <w:t xml:space="preserve">) que dice “Destronó a Ana” o “Beto desafía el trono…”. El estado va en </w:t>
+      </w:r>
+      <w:r>
+        <w:rPr>
+          <w:rFonts w:ascii="Consolas" w:eastAsia="Consolas" w:hAnsi="Consolas" w:cs="Consolas"/>
+          <w:color w:val="7A1F33"/>
+          <w:sz w:val="19"/>
+          <w:szCs w:val="19"/>
+        </w:rPr>
+        <w:t>data-estado</w:t>
+      </w:r>
+      <w:r>
+        <w:t xml:space="preserve">: libre u ocupado. Las medidas usan </w:t>
+      </w:r>
+      <w:r>
+        <w:rPr>
+          <w:rFonts w:ascii="Consolas" w:eastAsia="Consolas" w:hAnsi="Consolas" w:cs="Consolas"/>
+          <w:color w:val="7A1F33"/>
+          <w:sz w:val="19"/>
+          <w:szCs w:val="19"/>
+        </w:rPr>
+        <w:t>--u</w:t>
+      </w:r>
+      <w:r>
+        <w:t>, el menor entre 1 % del ancho y 2,2 % del alto, para que la insignia quepa entera en cualquier tamaño de fuente.</w:t>
+      </w:r>
+    </w:p>
+    <w:p>
+      <w:pPr>
+        <w:pStyle w:val="Heading3"/>
+      </w:pPr>
+      <w:r>
+        <w:t>Configuración</w:t>
+      </w:r>
+    </w:p>
+    <w:tbl>
+      <w:tblPr>
+        <w:tblW w:w="9360" w:type="dxa"/>
+        <w:tblBorders>
+          <w:top w:val="single" w:sz="4" w:space="0" w:color="auto"/>
+          <w:left w:val="single" w:sz="4" w:space="0" w:color="auto"/>
+          <w:bottom w:val="single" w:sz="4" w:space="0" w:color="auto"/>
+          <w:right w:val="single" w:sz="4" w:space="0" w:color="auto"/>
+          <w:insideH w:val="single" w:sz="4" w:space="0" w:color="auto"/>
+          <w:insideV w:val="single" w:sz="4" w:space="0" w:color="auto"/>
+        </w:tblBorders>
+        <w:tblLook w:val="04A0" w:firstRow="1" w:lastRow="0" w:firstColumn="1" w:lastColumn="0" w:noHBand="0" w:noVBand="1"/>
+      </w:tblPr>
+      <w:tblGrid>
+        <w:gridCol w:w="1497"/>
+        <w:gridCol w:w="7863"/>
+      </w:tblGrid>
+      <w:tr>
+        <w:trPr>
+          <w:tblHeader/>
+        </w:trPr>
+        <w:tc>
+          <w:tcPr>
+            <w:tcW w:w="1497" w:type="dxa"/>
+            <w:tcBorders>
+              <w:top w:val="single" w:sz="4" w:space="0" w:color="BFBFBF"/>
+              <w:left w:val="single" w:sz="4" w:space="0" w:color="BFBFBF"/>
+              <w:bottom w:val="single" w:sz="4" w:space="0" w:color="BFBFBF"/>
+              <w:right w:val="single" w:sz="4" w:space="0" w:color="BFBFBF"/>
+            </w:tcBorders>
+            <w:shd w:val="clear" w:color="auto" w:fill="1F4E79"/>
+            <w:tcMar>
+              <w:top w:w="60" w:type="dxa"/>
+              <w:left w:w="100" w:type="dxa"/>
+              <w:bottom w:w="60" w:type="dxa"/>
+              <w:right w:w="100" w:type="dxa"/>
+            </w:tcMar>
+          </w:tcPr>
+          <w:p>
+            <w:pPr>
+              <w:spacing w:after="20"/>
+            </w:pPr>
+            <w:r>
+              <w:rPr>
+                <w:b/>
+                <w:bCs/>
+                <w:color w:val="FFFFFF"/>
+              </w:rPr>
+              <w:t>Clave</w:t>
+            </w:r>
+          </w:p>
+        </w:tc>
+        <w:tc>
+          <w:tcPr>
+            <w:tcW w:w="7863" w:type="dxa"/>
+            <w:tcBorders>
+              <w:top w:val="single" w:sz="4" w:space="0" w:color="BFBFBF"/>
+              <w:left w:val="single" w:sz="4" w:space="0" w:color="BFBFBF"/>
+              <w:bottom w:val="single" w:sz="4" w:space="0" w:color="BFBFBF"/>
+              <w:right w:val="single" w:sz="4" w:space="0" w:color="BFBFBF"/>
+            </w:tcBorders>
+            <w:shd w:val="clear" w:color="auto" w:fill="1F4E79"/>
+            <w:tcMar>
+              <w:top w:w="60" w:type="dxa"/>
+              <w:left w:w="100" w:type="dxa"/>
+              <w:bottom w:w="60" w:type="dxa"/>
+              <w:right w:w="100" w:type="dxa"/>
+            </w:tcMar>
+          </w:tcPr>
+          <w:p>
+            <w:pPr>
+              <w:spacing w:after="20"/>
+            </w:pPr>
+            <w:r>
+              <w:rPr>
+                <w:b/>
+                <w:bCs/>
+                <w:color w:val="FFFFFF"/>
+              </w:rPr>
+              <w:t>Significado</w:t>
+            </w:r>
+          </w:p>
+        </w:tc>
+      </w:tr>
+      <w:tr>
+        <w:tc>
+          <w:tcPr>
+            <w:tcW w:w="1497" w:type="dxa"/>
+            <w:tcBorders>
+              <w:top w:val="single" w:sz="4" w:space="0" w:color="BFBFBF"/>
+              <w:left w:val="single" w:sz="4" w:space="0" w:color="BFBFBF"/>
+              <w:bottom w:val="single" w:sz="4" w:space="0" w:color="BFBFBF"/>
+              <w:right w:val="single" w:sz="4" w:space="0" w:color="BFBFBF"/>
+            </w:tcBorders>
+            <w:tcMar>
+              <w:top w:w="60" w:type="dxa"/>
+              <w:left w:w="100" w:type="dxa"/>
+              <w:bottom w:w="60" w:type="dxa"/>
+              <w:right w:w="100" w:type="dxa"/>
+            </w:tcMar>
+          </w:tcPr>
+          <w:p>
+            <w:pPr>
+              <w:spacing w:after="20"/>
+            </w:pPr>
+            <w:r>
+              <w:rPr>
+                <w:rFonts w:ascii="Consolas" w:eastAsia="Consolas" w:hAnsi="Consolas" w:cs="Consolas"/>
+                <w:color w:val="7A1F33"/>
+                <w:sz w:val="19"/>
+                <w:szCs w:val="19"/>
+              </w:rPr>
+              <w:t>u, k, w</w:t>
+            </w:r>
+          </w:p>
+        </w:tc>
+        <w:tc>
+          <w:tcPr>
+            <w:tcW w:w="7863" w:type="dxa"/>
+            <w:tcBorders>
+              <w:top w:val="single" w:sz="4" w:space="0" w:color="BFBFBF"/>
+              <w:left w:val="single" w:sz="4" w:space="0" w:color="BFBFBF"/>
+              <w:bottom w:val="single" w:sz="4" w:space="0" w:color="BFBFBF"/>
+              <w:right w:val="single" w:sz="4" w:space="0" w:color="BFBFBF"/>
+            </w:tcBorders>
+            <w:tcMar>
+              <w:top w:w="60" w:type="dxa"/>
+              <w:left w:w="100" w:type="dxa"/>
+              <w:bottom w:w="60" w:type="dxa"/>
+              <w:right w:w="100" w:type="dxa"/>
+            </w:tcMar>
+          </w:tcPr>
+          <w:p>
+            <w:pPr>
+              <w:spacing w:after="20"/>
+            </w:pPr>
+            <w:r>
+              <w:t>Usuario de TikTok, API key e identificador del widget (van siempre en la URL)</w:t>
+            </w:r>
+          </w:p>
+        </w:tc>
+      </w:tr>
+      <w:tr>
+        <w:tc>
+          <w:tcPr>
+            <w:tcW w:w="1497" w:type="dxa"/>
+            <w:tcBorders>
+              <w:top w:val="single" w:sz="4" w:space="0" w:color="BFBFBF"/>
+              <w:left w:val="single" w:sz="4" w:space="0" w:color="BFBFBF"/>
+              <w:bottom w:val="single" w:sz="4" w:space="0" w:color="BFBFBF"/>
+              <w:right w:val="single" w:sz="4" w:space="0" w:color="BFBFBF"/>
+            </w:tcBorders>
+            <w:tcMar>
+              <w:top w:w="60" w:type="dxa"/>
+              <w:left w:w="100" w:type="dxa"/>
+              <w:bottom w:w="60" w:type="dxa"/>
+              <w:right w:w="100" w:type="dxa"/>
+            </w:tcMar>
+          </w:tcPr>
+          <w:p>
+            <w:pPr>
+              <w:spacing w:after="20"/>
+            </w:pPr>
+            <w:r>
+              <w:rPr>
+                <w:rFonts w:ascii="Consolas" w:eastAsia="Consolas" w:hAnsi="Consolas" w:cs="Consolas"/>
+                <w:color w:val="7A1F33"/>
+                <w:sz w:val="19"/>
+                <w:szCs w:val="19"/>
+              </w:rPr>
+              <w:lastRenderedPageBreak/>
+              <w:t>ti</w:t>
+            </w:r>
+          </w:p>
+        </w:tc>
+        <w:tc>
+          <w:tcPr>
+            <w:tcW w:w="7863" w:type="dxa"/>
+            <w:tcBorders>
+              <w:top w:val="single" w:sz="4" w:space="0" w:color="BFBFBF"/>
+              <w:left w:val="single" w:sz="4" w:space="0" w:color="BFBFBF"/>
+              <w:bottom w:val="single" w:sz="4" w:space="0" w:color="BFBFBF"/>
+              <w:right w:val="single" w:sz="4" w:space="0" w:color="BFBFBF"/>
+            </w:tcBorders>
+            <w:tcMar>
+              <w:top w:w="60" w:type="dxa"/>
+              <w:left w:w="100" w:type="dxa"/>
+              <w:bottom w:w="60" w:type="dxa"/>
+              <w:right w:w="100" w:type="dxa"/>
+            </w:tcMar>
+          </w:tcPr>
+          <w:p>
+            <w:pPr>
+              <w:spacing w:after="20"/>
+            </w:pPr>
+            <w:r>
+              <w:t>Título (por defecto “Áurea VIP”)</w:t>
+            </w:r>
+          </w:p>
+        </w:tc>
+      </w:tr>
+      <w:tr>
+        <w:tc>
+          <w:tcPr>
+            <w:tcW w:w="1497" w:type="dxa"/>
+            <w:tcBorders>
+              <w:top w:val="single" w:sz="4" w:space="0" w:color="BFBFBF"/>
+              <w:left w:val="single" w:sz="4" w:space="0" w:color="BFBFBF"/>
+              <w:bottom w:val="single" w:sz="4" w:space="0" w:color="BFBFBF"/>
+              <w:right w:val="single" w:sz="4" w:space="0" w:color="BFBFBF"/>
+            </w:tcBorders>
+            <w:tcMar>
+              <w:top w:w="60" w:type="dxa"/>
+              <w:left w:w="100" w:type="dxa"/>
+              <w:bottom w:w="60" w:type="dxa"/>
+              <w:right w:w="100" w:type="dxa"/>
+            </w:tcMar>
+          </w:tcPr>
+          <w:p>
+            <w:pPr>
+              <w:spacing w:after="20"/>
+            </w:pPr>
+            <w:r>
+              <w:rPr>
+                <w:rFonts w:ascii="Consolas" w:eastAsia="Consolas" w:hAnsi="Consolas" w:cs="Consolas"/>
+                <w:color w:val="7A1F33"/>
+                <w:sz w:val="19"/>
+                <w:szCs w:val="19"/>
+              </w:rPr>
+              <w:t>m</w:t>
+            </w:r>
+          </w:p>
+        </w:tc>
+        <w:tc>
+          <w:tcPr>
+            <w:tcW w:w="7863" w:type="dxa"/>
+            <w:tcBorders>
+              <w:top w:val="single" w:sz="4" w:space="0" w:color="BFBFBF"/>
+              <w:left w:val="single" w:sz="4" w:space="0" w:color="BFBFBF"/>
+              <w:bottom w:val="single" w:sz="4" w:space="0" w:color="BFBFBF"/>
+              <w:right w:val="single" w:sz="4" w:space="0" w:color="BFBFBF"/>
+            </w:tcBorders>
+            <w:tcMar>
+              <w:top w:w="60" w:type="dxa"/>
+              <w:left w:w="100" w:type="dxa"/>
+              <w:bottom w:w="60" w:type="dxa"/>
+              <w:right w:w="100" w:type="dxa"/>
+            </w:tcMar>
+          </w:tcPr>
+          <w:p>
+            <w:pPr>
+              <w:spacing w:after="20"/>
+            </w:pPr>
+            <w:r>
+              <w:t xml:space="preserve">Modo: </w:t>
+            </w:r>
+            <w:r>
+              <w:rPr>
+                <w:rFonts w:ascii="Consolas" w:eastAsia="Consolas" w:hAnsi="Consolas" w:cs="Consolas"/>
+                <w:color w:val="7A1F33"/>
+                <w:sz w:val="19"/>
+                <w:szCs w:val="19"/>
+              </w:rPr>
+              <w:t>combo</w:t>
+            </w:r>
+            <w:r>
+              <w:t xml:space="preserve"> (el regalo o combo más grande de una vez) o </w:t>
+            </w:r>
+            <w:r>
+              <w:rPr>
+                <w:rFonts w:ascii="Consolas" w:eastAsia="Consolas" w:hAnsi="Consolas" w:cs="Consolas"/>
+                <w:color w:val="7A1F33"/>
+                <w:sz w:val="19"/>
+                <w:szCs w:val="19"/>
+              </w:rPr>
+              <w:t>total</w:t>
+            </w:r>
+            <w:r>
+              <w:t xml:space="preserve"> (lo más acumulado por una persona en la sesión)</w:t>
+            </w:r>
+          </w:p>
+        </w:tc>
+      </w:tr>
+      <w:tr>
+        <w:tc>
+          <w:tcPr>
+            <w:tcW w:w="1497" w:type="dxa"/>
+            <w:tcBorders>
+              <w:top w:val="single" w:sz="4" w:space="0" w:color="BFBFBF"/>
+              <w:left w:val="single" w:sz="4" w:space="0" w:color="BFBFBF"/>
+              <w:bottom w:val="single" w:sz="4" w:space="0" w:color="BFBFBF"/>
+              <w:right w:val="single" w:sz="4" w:space="0" w:color="BFBFBF"/>
+            </w:tcBorders>
+            <w:tcMar>
+              <w:top w:w="60" w:type="dxa"/>
+              <w:left w:w="100" w:type="dxa"/>
+              <w:bottom w:w="60" w:type="dxa"/>
+              <w:right w:w="100" w:type="dxa"/>
+            </w:tcMar>
+          </w:tcPr>
+          <w:p>
+            <w:pPr>
+              <w:spacing w:after="20"/>
+            </w:pPr>
+            <w:r>
+              <w:rPr>
+                <w:rFonts w:ascii="Consolas" w:eastAsia="Consolas" w:hAnsi="Consolas" w:cs="Consolas"/>
+                <w:color w:val="7A1F33"/>
+                <w:sz w:val="19"/>
+                <w:szCs w:val="19"/>
+              </w:rPr>
+              <w:t>min</w:t>
+            </w:r>
+          </w:p>
+        </w:tc>
+        <w:tc>
+          <w:tcPr>
+            <w:tcW w:w="7863" w:type="dxa"/>
+            <w:tcBorders>
+              <w:top w:val="single" w:sz="4" w:space="0" w:color="BFBFBF"/>
+              <w:left w:val="single" w:sz="4" w:space="0" w:color="BFBFBF"/>
+              <w:bottom w:val="single" w:sz="4" w:space="0" w:color="BFBFBF"/>
+              <w:right w:val="single" w:sz="4" w:space="0" w:color="BFBFBF"/>
+            </w:tcBorders>
+            <w:tcMar>
+              <w:top w:w="60" w:type="dxa"/>
+              <w:left w:w="100" w:type="dxa"/>
+              <w:bottom w:w="60" w:type="dxa"/>
+              <w:right w:w="100" w:type="dxa"/>
+            </w:tcMar>
+          </w:tcPr>
+          <w:p>
+            <w:pPr>
+              <w:spacing w:after="20"/>
+            </w:pPr>
+            <w:r>
+              <w:t>Monedas mínimas para reinar (por defecto 1)</w:t>
+            </w:r>
+          </w:p>
+        </w:tc>
+      </w:tr>
+      <w:tr>
+        <w:tc>
+          <w:tcPr>
+            <w:tcW w:w="1497" w:type="dxa"/>
+            <w:tcBorders>
+              <w:top w:val="single" w:sz="4" w:space="0" w:color="BFBFBF"/>
+              <w:left w:val="single" w:sz="4" w:space="0" w:color="BFBFBF"/>
+              <w:bottom w:val="single" w:sz="4" w:space="0" w:color="BFBFBF"/>
+              <w:right w:val="single" w:sz="4" w:space="0" w:color="BFBFBF"/>
+            </w:tcBorders>
+            <w:tcMar>
+              <w:top w:w="60" w:type="dxa"/>
+              <w:left w:w="100" w:type="dxa"/>
+              <w:bottom w:w="60" w:type="dxa"/>
+              <w:right w:w="100" w:type="dxa"/>
+            </w:tcMar>
+          </w:tcPr>
+          <w:p>
+            <w:pPr>
+              <w:spacing w:after="20"/>
+            </w:pPr>
+            <w:r>
+              <w:rPr>
+                <w:rFonts w:ascii="Consolas" w:eastAsia="Consolas" w:hAnsi="Consolas" w:cs="Consolas"/>
+                <w:color w:val="7A1F33"/>
+                <w:sz w:val="19"/>
+                <w:szCs w:val="19"/>
+              </w:rPr>
+              <w:t>v</w:t>
+            </w:r>
+          </w:p>
+        </w:tc>
+        <w:tc>
+          <w:tcPr>
+            <w:tcW w:w="7863" w:type="dxa"/>
+            <w:tcBorders>
+              <w:top w:val="single" w:sz="4" w:space="0" w:color="BFBFBF"/>
+              <w:left w:val="single" w:sz="4" w:space="0" w:color="BFBFBF"/>
+              <w:bottom w:val="single" w:sz="4" w:space="0" w:color="BFBFBF"/>
+              <w:right w:val="single" w:sz="4" w:space="0" w:color="BFBFBF"/>
+            </w:tcBorders>
+            <w:tcMar>
+              <w:top w:w="60" w:type="dxa"/>
+              <w:left w:w="100" w:type="dxa"/>
+              <w:bottom w:w="60" w:type="dxa"/>
+              <w:right w:w="100" w:type="dxa"/>
+            </w:tcMar>
+          </w:tcPr>
+          <w:p>
+            <w:pPr>
+              <w:spacing w:after="20"/>
+            </w:pPr>
+            <w:r>
+              <w:t>Monedas de un regalo cuando TikTok no manda el precio (por defecto 1)</w:t>
+            </w:r>
+          </w:p>
+        </w:tc>
+      </w:tr>
+      <w:tr>
+        <w:tc>
+          <w:tcPr>
+            <w:tcW w:w="1497" w:type="dxa"/>
+            <w:tcBorders>
+              <w:top w:val="single" w:sz="4" w:space="0" w:color="BFBFBF"/>
+              <w:left w:val="single" w:sz="4" w:space="0" w:color="BFBFBF"/>
+              <w:bottom w:val="single" w:sz="4" w:space="0" w:color="BFBFBF"/>
+              <w:right w:val="single" w:sz="4" w:space="0" w:color="BFBFBF"/>
+            </w:tcBorders>
+            <w:tcMar>
+              <w:top w:w="60" w:type="dxa"/>
+              <w:left w:w="100" w:type="dxa"/>
+              <w:bottom w:w="60" w:type="dxa"/>
+              <w:right w:w="100" w:type="dxa"/>
+            </w:tcMar>
+          </w:tcPr>
+          <w:p>
+            <w:pPr>
+              <w:spacing w:after="20"/>
+            </w:pPr>
+            <w:r>
+              <w:rPr>
+                <w:rFonts w:ascii="Consolas" w:eastAsia="Consolas" w:hAnsi="Consolas" w:cs="Consolas"/>
+                <w:color w:val="7A1F33"/>
+                <w:sz w:val="19"/>
+                <w:szCs w:val="19"/>
+              </w:rPr>
+              <w:t>ro</w:t>
+            </w:r>
+          </w:p>
+        </w:tc>
+        <w:tc>
+          <w:tcPr>
+            <w:tcW w:w="7863" w:type="dxa"/>
+            <w:tcBorders>
+              <w:top w:val="single" w:sz="4" w:space="0" w:color="BFBFBF"/>
+              <w:left w:val="single" w:sz="4" w:space="0" w:color="BFBFBF"/>
+              <w:bottom w:val="single" w:sz="4" w:space="0" w:color="BFBFBF"/>
+              <w:right w:val="single" w:sz="4" w:space="0" w:color="BFBFBF"/>
+            </w:tcBorders>
+            <w:tcMar>
+              <w:top w:w="60" w:type="dxa"/>
+              <w:left w:w="100" w:type="dxa"/>
+              <w:bottom w:w="60" w:type="dxa"/>
+              <w:right w:w="100" w:type="dxa"/>
+            </w:tcMar>
+          </w:tcPr>
+          <w:p>
+            <w:pPr>
+              <w:spacing w:after="20"/>
+            </w:pPr>
+            <w:r>
+              <w:t>Ronda: cambia con “Reiniciar trono”. Cuando cambia, el trono queda libre y se borran los totales</w:t>
+            </w:r>
+          </w:p>
+        </w:tc>
+      </w:tr>
+      <w:tr>
+        <w:tc>
+          <w:tcPr>
+            <w:tcW w:w="1497" w:type="dxa"/>
+            <w:tcBorders>
+              <w:top w:val="single" w:sz="4" w:space="0" w:color="BFBFBF"/>
+              <w:left w:val="single" w:sz="4" w:space="0" w:color="BFBFBF"/>
+              <w:bottom w:val="single" w:sz="4" w:space="0" w:color="BFBFBF"/>
+              <w:right w:val="single" w:sz="4" w:space="0" w:color="BFBFBF"/>
+            </w:tcBorders>
+            <w:tcMar>
+              <w:top w:w="60" w:type="dxa"/>
+              <w:left w:w="100" w:type="dxa"/>
+              <w:bottom w:w="60" w:type="dxa"/>
+              <w:right w:w="100" w:type="dxa"/>
+            </w:tcMar>
+          </w:tcPr>
+          <w:p>
+            <w:pPr>
+              <w:spacing w:after="20"/>
+            </w:pPr>
+            <w:r>
+              <w:rPr>
+                <w:rFonts w:ascii="Consolas" w:eastAsia="Consolas" w:hAnsi="Consolas" w:cs="Consolas"/>
+                <w:color w:val="7A1F33"/>
+                <w:sz w:val="19"/>
+                <w:szCs w:val="19"/>
+              </w:rPr>
+              <w:t>s</w:t>
+            </w:r>
+          </w:p>
+        </w:tc>
+        <w:tc>
+          <w:tcPr>
+            <w:tcW w:w="7863" w:type="dxa"/>
+            <w:tcBorders>
+              <w:top w:val="single" w:sz="4" w:space="0" w:color="BFBFBF"/>
+              <w:left w:val="single" w:sz="4" w:space="0" w:color="BFBFBF"/>
+              <w:bottom w:val="single" w:sz="4" w:space="0" w:color="BFBFBF"/>
+              <w:right w:val="single" w:sz="4" w:space="0" w:color="BFBFBF"/>
+            </w:tcBorders>
+            <w:tcMar>
+              <w:top w:w="60" w:type="dxa"/>
+              <w:left w:w="100" w:type="dxa"/>
+              <w:bottom w:w="60" w:type="dxa"/>
+              <w:right w:w="100" w:type="dxa"/>
+            </w:tcMar>
+          </w:tcPr>
+          <w:p>
+            <w:pPr>
+              <w:spacing w:after="20"/>
+            </w:pPr>
+            <w:r>
+              <w:t>Sonido (1 o 0) al cambiar de rey</w:t>
+            </w:r>
+          </w:p>
+        </w:tc>
+      </w:tr>
+      <w:tr>
+        <w:tc>
+          <w:tcPr>
+            <w:tcW w:w="1497" w:type="dxa"/>
+            <w:tcBorders>
+              <w:top w:val="single" w:sz="4" w:space="0" w:color="BFBFBF"/>
+              <w:left w:val="single" w:sz="4" w:space="0" w:color="BFBFBF"/>
+              <w:bottom w:val="single" w:sz="4" w:space="0" w:color="BFBFBF"/>
+              <w:right w:val="single" w:sz="4" w:space="0" w:color="BFBFBF"/>
+            </w:tcBorders>
+            <w:tcMar>
+              <w:top w:w="60" w:type="dxa"/>
+              <w:left w:w="100" w:type="dxa"/>
+              <w:bottom w:w="60" w:type="dxa"/>
+              <w:right w:w="100" w:type="dxa"/>
+            </w:tcMar>
+          </w:tcPr>
+          <w:p>
+            <w:pPr>
+              <w:spacing w:after="20"/>
+            </w:pPr>
+            <w:r>
+              <w:rPr>
+                <w:rFonts w:ascii="Consolas" w:eastAsia="Consolas" w:hAnsi="Consolas" w:cs="Consolas"/>
+                <w:color w:val="7A1F33"/>
+                <w:sz w:val="19"/>
+                <w:szCs w:val="19"/>
+              </w:rPr>
+              <w:t>est</w:t>
+            </w:r>
+          </w:p>
+        </w:tc>
+        <w:tc>
+          <w:tcPr>
+            <w:tcW w:w="7863" w:type="dxa"/>
+            <w:tcBorders>
+              <w:top w:val="single" w:sz="4" w:space="0" w:color="BFBFBF"/>
+              <w:left w:val="single" w:sz="4" w:space="0" w:color="BFBFBF"/>
+              <w:bottom w:val="single" w:sz="4" w:space="0" w:color="BFBFBF"/>
+              <w:right w:val="single" w:sz="4" w:space="0" w:color="BFBFBF"/>
+            </w:tcBorders>
+            <w:tcMar>
+              <w:top w:w="60" w:type="dxa"/>
+              <w:left w:w="100" w:type="dxa"/>
+              <w:bottom w:w="60" w:type="dxa"/>
+              <w:right w:w="100" w:type="dxa"/>
+            </w:tcMar>
+          </w:tcPr>
+          <w:p>
+            <w:pPr>
+              <w:spacing w:after="20"/>
+            </w:pPr>
+            <w:r>
+              <w:t>Estilo visual (lo aplica comun.js, igual que en los demás widgets)</w:t>
+            </w:r>
+          </w:p>
+        </w:tc>
+      </w:tr>
+    </w:tbl>
+    <w:p>
+      <w:pPr>
+        <w:spacing w:after="120"/>
+      </w:pPr>
+    </w:p>
+    <w:p>
+      <w:pPr>
+        <w:pStyle w:val="Heading3"/>
+      </w:pPr>
+      <w:r>
+        <w:t>Funcionamiento</w:t>
+      </w:r>
+    </w:p>
+    <w:p>
+      <w:pPr>
+        <w:pStyle w:val="ListParagraph"/>
+        <w:numPr>
+          <w:ilvl w:val="0"/>
+          <w:numId w:val="3"/>
+        </w:numPr>
+        <w:spacing w:after="60"/>
+      </w:pPr>
+      <w:r>
+        <w:t xml:space="preserve">Cada </w:t>
+      </w:r>
+      <w:r>
+        <w:rPr>
+          <w:rFonts w:ascii="Consolas" w:eastAsia="Consolas" w:hAnsi="Consolas" w:cs="Consolas"/>
+          <w:color w:val="7A1F33"/>
+          <w:sz w:val="19"/>
+          <w:szCs w:val="19"/>
+        </w:rPr>
+        <w:t>regalo</w:t>
+      </w:r>
+      <w:r>
+        <w:t xml:space="preserve"> vale </w:t>
+      </w:r>
+      <w:r>
+        <w:rPr>
+          <w:rFonts w:ascii="Consolas" w:eastAsia="Consolas" w:hAnsi="Consolas" w:cs="Consolas"/>
+          <w:color w:val="7A1F33"/>
+          <w:sz w:val="19"/>
+          <w:szCs w:val="19"/>
+        </w:rPr>
+        <w:t>diamantes × cantidad</w:t>
+      </w:r>
+      <w:r>
+        <w:t xml:space="preserve"> monedas (si el precio llega en 0, se usa </w:t>
+      </w:r>
+      <w:r>
+        <w:rPr>
+          <w:rFonts w:ascii="Consolas" w:eastAsia="Consolas" w:hAnsi="Consolas" w:cs="Consolas"/>
+          <w:color w:val="7A1F33"/>
+          <w:sz w:val="19"/>
+          <w:szCs w:val="19"/>
+        </w:rPr>
+        <w:t>v</w:t>
+      </w:r>
+      <w:r>
+        <w:t>).</w:t>
+      </w:r>
+    </w:p>
+    <w:p>
+      <w:pPr>
+        <w:pStyle w:val="ListParagraph"/>
+        <w:numPr>
+          <w:ilvl w:val="0"/>
+          <w:numId w:val="3"/>
+        </w:numPr>
+        <w:spacing w:after="60"/>
+      </w:pPr>
+      <w:r>
+        <w:t>Jugadas: cada persona tiene una jugada abierta que suma sus regalos y se cierra tras 3 segundos sin regalos suyos. Recién entonces se compara con el rey. Así se cuenta el combo completo aunque el rastreador de comun.js lo entregue en dos partes (lo que llevaba a los 2 s y lo que faltaba al final).</w:t>
+      </w:r>
+    </w:p>
+    <w:p>
+      <w:pPr>
+        <w:pStyle w:val="ListParagraph"/>
+        <w:numPr>
+          <w:ilvl w:val="0"/>
+          <w:numId w:val="3"/>
+        </w:numPr>
+        <w:spacing w:after="60"/>
+      </w:pPr>
+      <w:r>
+        <w:t xml:space="preserve">En modo </w:t>
+      </w:r>
+      <w:r>
+        <w:rPr>
+          <w:rFonts w:ascii="Consolas" w:eastAsia="Consolas" w:hAnsi="Consolas" w:cs="Consolas"/>
+          <w:color w:val="7A1F33"/>
+          <w:sz w:val="19"/>
+          <w:szCs w:val="19"/>
+        </w:rPr>
+        <w:t>combo</w:t>
+      </w:r>
+      <w:r>
+        <w:t xml:space="preserve"> vale la jugada; en modo </w:t>
+      </w:r>
+      <w:r>
+        <w:rPr>
+          <w:rFonts w:ascii="Consolas" w:eastAsia="Consolas" w:hAnsi="Consolas" w:cs="Consolas"/>
+          <w:color w:val="7A1F33"/>
+          <w:sz w:val="19"/>
+          <w:szCs w:val="19"/>
+        </w:rPr>
+        <w:t>total</w:t>
+      </w:r>
+      <w:r>
+        <w:t xml:space="preserve">, lo que esa persona lleva en la sesión más la jugada. Para reinar hay que superar al rey (empatar no basta) y llegar a </w:t>
+      </w:r>
+      <w:r>
+        <w:rPr>
+          <w:rFonts w:ascii="Consolas" w:eastAsia="Consolas" w:hAnsi="Consolas" w:cs="Consolas"/>
+          <w:color w:val="7A1F33"/>
+          <w:sz w:val="19"/>
+          <w:szCs w:val="19"/>
+        </w:rPr>
+        <w:t>min</w:t>
+      </w:r>
+      <w:r>
+        <w:t>. Si el rey supera su propia marca, solo suben sus monedas con un brillo.</w:t>
+      </w:r>
+    </w:p>
+    <w:p>
+      <w:pPr>
+        <w:pStyle w:val="ListParagraph"/>
+        <w:numPr>
+          <w:ilvl w:val="0"/>
+          <w:numId w:val="3"/>
+        </w:numPr>
+        <w:spacing w:after="60"/>
+      </w:pPr>
+      <w:r>
+        <w:t>Mientras una jugada abierta ya supera al rey, la línea dice “Fulano desafía el trono…”. Al coronar, el rey anterior sube y se desvanece, el nuevo entra desde abajo, la corona brilla y la línea dice “Destronó a …”. Si dos jugadas se cierran casi juntas, se hace un solo cambio (sin doble sonido).</w:t>
+      </w:r>
+    </w:p>
+    <w:p>
+      <w:pPr>
+        <w:pStyle w:val="ListParagraph"/>
+        <w:numPr>
+          <w:ilvl w:val="0"/>
+          <w:numId w:val="3"/>
+        </w:numPr>
+        <w:spacing w:after="60"/>
+      </w:pPr>
+      <w:r>
+        <w:t>El rey, a quién destronó y los totales se guardan en el navegador de OBS (</w:t>
+      </w:r>
+      <w:r>
+        <w:rPr>
+          <w:rFonts w:ascii="Consolas" w:eastAsia="Consolas" w:hAnsi="Consolas" w:cs="Consolas"/>
+          <w:color w:val="7A1F33"/>
+          <w:sz w:val="19"/>
+          <w:szCs w:val="19"/>
+        </w:rPr>
+        <w:t>localStorage</w:t>
+      </w:r>
+      <w:r>
+        <w:t xml:space="preserve">, clave </w:t>
+      </w:r>
+      <w:r>
+        <w:rPr>
+          <w:rFonts w:ascii="Consolas" w:eastAsia="Consolas" w:hAnsi="Consolas" w:cs="Consolas"/>
+          <w:color w:val="7A1F33"/>
+          <w:sz w:val="19"/>
+          <w:szCs w:val="19"/>
+        </w:rPr>
+        <w:t>live-tools:trono:&lt;w&gt;</w:t>
+      </w:r>
+      <w:r>
+        <w:t>) con la ronda y el modo. Cambiar de modo deja el trono libre.</w:t>
+      </w:r>
+    </w:p>
+    <w:p>
+      <w:pPr>
+        <w:pBdr>
+          <w:left w:val="single" w:sz="18" w:space="8" w:color="E5304F"/>
+        </w:pBdr>
+        <w:shd w:val="clear" w:color="auto" w:fill="FDECEF"/>
+        <w:spacing w:before="120" w:after="160"/>
+        <w:ind w:left="200" w:right="200"/>
+      </w:pPr>
+      <w:r>
+        <w:rPr>
+          <w:b/>
+          <w:bCs/>
+          <w:color w:val="E5304F"/>
+        </w:rPr>
+        <w:t xml:space="preserve">Limitación: </w:t>
+      </w:r>
+      <w:r>
+        <w:t>Las personas se distinguen por su nombre visible en TikTok (el evento normalizado no trae otro dato): dos personas con el mismo nombre suman juntas en el modo total. El panel no ve quién reina.</w:t>
+      </w:r>
+    </w:p>
+    <w:p>
+      <w:pPr>
         <w:pStyle w:val="Heading1"/>
         <w:pageBreakBefore/>
       </w:pPr>
-      <w:bookmarkStart w:id="29" w:name="_Toc242788243"/>
+      <w:bookmarkStart w:id="30" w:name="_Toc242788725"/>
       <w:r>
         <w:lastRenderedPageBreak/>
         <w:t>8. Frontend: el panel</w:t>
       </w:r>
-      <w:bookmarkEnd w:id="29"/>
+      <w:bookmarkEnd w:id="30"/>
     </w:p>
     <w:p>
       <w:pPr>
         <w:pStyle w:val="Heading2"/>
       </w:pPr>
-      <w:bookmarkStart w:id="30" w:name="_Toc242788244"/>
+      <w:bookmarkStart w:id="31" w:name="_Toc242788726"/>
       <w:r>
         <w:t>8.1 Estructura de la página (index.html)</w:t>
       </w:r>
-      <w:bookmarkEnd w:id="30"/>
+      <w:bookmarkEnd w:id="31"/>
     </w:p>
     <w:p>
       <w:pPr>
@@ -20563,11 +21535,11 @@
       <w:pPr>
         <w:pStyle w:val="Heading2"/>
       </w:pPr>
-      <w:bookmarkStart w:id="31" w:name="_Toc242788245"/>
+      <w:bookmarkStart w:id="32" w:name="_Toc242788727"/>
       <w:r>
         <w:t>8.2 Navegación y ciclo de vida (app.js)</w:t>
       </w:r>
-      <w:bookmarkEnd w:id="31"/>
+      <w:bookmarkEnd w:id="32"/>
     </w:p>
     <w:p>
       <w:pPr>
@@ -20744,11 +21716,11 @@
       <w:pPr>
         <w:pStyle w:val="Heading2"/>
       </w:pPr>
-      <w:bookmarkStart w:id="32" w:name="_Toc242788246"/>
+      <w:bookmarkStart w:id="33" w:name="_Toc242788728"/>
       <w:r>
         <w:t>8.3 Mapa del panel (registro.js)</w:t>
       </w:r>
-      <w:bookmarkEnd w:id="32"/>
+      <w:bookmarkEnd w:id="33"/>
     </w:p>
     <w:p>
       <w:pPr>
@@ -21250,7 +22222,7 @@
               <w:spacing w:after="20"/>
             </w:pPr>
             <w:r>
-              <w:t>Carrera de regalos (carrera), Batalla de regalos (batalla), Jefe del LIVE (jefe), Subathon (subathon), Bóveda dorada (boveda)</w:t>
+              <w:t>Carrera de regalos (carrera), Batalla de regalos (batalla), Jefe del LIVE (jefe), Subathon (subathon), Bóveda dorada (boveda), Trono (trono)</w:t>
             </w:r>
           </w:p>
         </w:tc>
@@ -21530,11 +22502,11 @@
       <w:pPr>
         <w:pStyle w:val="Heading2"/>
       </w:pPr>
-      <w:bookmarkStart w:id="33" w:name="_Toc242788247"/>
+      <w:bookmarkStart w:id="34" w:name="_Toc242788729"/>
       <w:r>
         <w:t>8.4 Datos guardados (almacen.js)</w:t>
       </w:r>
-      <w:bookmarkEnd w:id="33"/>
+      <w:bookmarkEnd w:id="34"/>
     </w:p>
     <w:p>
       <w:pPr>
@@ -22329,11 +23301,11 @@
       <w:pPr>
         <w:pStyle w:val="Heading2"/>
       </w:pPr>
-      <w:bookmarkStart w:id="34" w:name="_Toc242788248"/>
+      <w:bookmarkStart w:id="35" w:name="_Toc242788730"/>
       <w:r>
         <w:t>8.5 Conexión del panel al LIVE (envivo.js)</w:t>
       </w:r>
-      <w:bookmarkEnd w:id="34"/>
+      <w:bookmarkEnd w:id="35"/>
     </w:p>
     <w:p>
       <w:pPr>
@@ -22395,11 +23367,11 @@
       <w:pPr>
         <w:pStyle w:val="Heading2"/>
       </w:pPr>
-      <w:bookmarkStart w:id="35" w:name="_Toc242788249"/>
+      <w:bookmarkStart w:id="36" w:name="_Toc242788731"/>
       <w:r>
         <w:t>8.6 Componentes de interfaz (ui.js)</w:t>
       </w:r>
-      <w:bookmarkEnd w:id="35"/>
+      <w:bookmarkEnd w:id="36"/>
     </w:p>
     <w:tbl>
       <w:tblPr>
@@ -22903,11 +23875,11 @@
       <w:pPr>
         <w:pStyle w:val="Heading2"/>
       </w:pPr>
-      <w:bookmarkStart w:id="36" w:name="_Toc242788250"/>
+      <w:bookmarkStart w:id="37" w:name="_Toc242788732"/>
       <w:r>
         <w:t>8.7 Las vistas</w:t>
       </w:r>
-      <w:bookmarkEnd w:id="36"/>
+      <w:bookmarkEnd w:id="37"/>
     </w:p>
     <w:p>
       <w:pPr>
@@ -23070,6 +24042,23 @@
         <w:pStyle w:val="Heading3"/>
       </w:pPr>
       <w:r>
+        <w:t>Trono</w:t>
+      </w:r>
+    </w:p>
+    <w:p>
+      <w:pPr>
+        <w:spacing w:after="120"/>
+      </w:pPr>
+      <w:r>
+        <w:t>La tarjeta del widget tiene el título y las monedas mínimas para reinar; en Personalizar, las monedas de un regalo sin precio, el sonido y el estilo. Sus pruebas usan el nombre de prueba (“Combo ×5”, “Regalo de 100”) y otros espectadores (“Camilo: 250”, “Sofía: 1.000”) para ver el cambio de rey. La tarjeta Trono tiene el selector de modo (Combo más grande / Más acumulado en la sesión) y el botón Reiniciar trono, que se sube a Supabase al instante.</w:t>
+      </w:r>
+    </w:p>
+    <w:p>
+      <w:pPr>
+        <w:pStyle w:val="Heading3"/>
+      </w:pPr>
+      <w:r>
+        <w:lastRenderedPageBreak/>
         <w:t>Eventos en vivo</w:t>
       </w:r>
     </w:p>
@@ -23098,7 +24087,6 @@
         <w:pStyle w:val="Heading3"/>
       </w:pPr>
       <w:r>
-        <w:lastRenderedPageBreak/>
         <w:t>Buscador de regalos</w:t>
       </w:r>
     </w:p>
@@ -23180,11 +24168,11 @@
       <w:pPr>
         <w:pStyle w:val="Heading2"/>
       </w:pPr>
-      <w:bookmarkStart w:id="37" w:name="_Toc242788251"/>
+      <w:bookmarkStart w:id="38" w:name="_Toc242788733"/>
       <w:r>
         <w:t>8.8 Vista previa y pruebas</w:t>
       </w:r>
-      <w:bookmarkEnd w:id="37"/>
+      <w:bookmarkEnd w:id="38"/>
     </w:p>
     <w:p>
       <w:pPr>
@@ -23245,18 +24233,18 @@
         <w:spacing w:after="120"/>
       </w:pPr>
       <w:r>
-        <w:t>Un cambio de estilo se le pasa a la vista previa por mensaje ({ tipo: "tema" }) sin recargarla; el resto de la configuración la reinicia 400 ms después. La excepción son las claves de sinRecargar: la carrera y el jefe mandan el reloj y la ronda, la batalla la ronda, el subathon además los “+5 min” y la bóveda la ronda y “abrir ahora”, con { tipo: "config" }, así Iniciar, Pausar o Reiniciar batalla no borran los puntos de prueba.</w:t>
+        <w:t>Un cambio de estilo se le pasa a la vista previa por mensaje ({ tipo: "tema" }) sin recargarla; el resto de la configuración la reinicia 400 ms después. La excepción son las claves de sinRecargar: la carrera y el jefe mandan el reloj y la ronda, la batalla la ronda, el subathon además los “+5 min” , la bóveda la ronda y “abrir ahora” y el trono la ronda, con { tipo: "config" }, así Iniciar, Pausar o Reiniciar batalla no borran los puntos de prueba.</w:t>
       </w:r>
     </w:p>
     <w:p>
       <w:pPr>
         <w:pStyle w:val="Heading2"/>
       </w:pPr>
-      <w:bookmarkStart w:id="38" w:name="_Toc242788252"/>
+      <w:bookmarkStart w:id="39" w:name="_Toc242788734"/>
       <w:r>
         <w:t>8.9 Cambios en vivo en el panel (sincronizar.js)</w:t>
       </w:r>
-      <w:bookmarkEnd w:id="38"/>
+      <w:bookmarkEnd w:id="39"/>
     </w:p>
     <w:p>
       <w:pPr>
@@ -23320,7 +24308,7 @@
         <w:spacing w:after="60"/>
       </w:pPr>
       <w:r>
-        <w:t>Los botones del reloj de la carrera, del jefe y del subathon (Iniciar, Pausar, Reiniciar, +5 min) , Reiniciar batalla y las órdenes de la bóveda guardan y llaman sincronizar.subir(id) de inmediato, sin la espera de 0,6 s. La validación de la carrera solo bloquea si no hay integrantes; la de la batalla nunca bloquea.</w:t>
+        <w:t>Los botones del reloj de la carrera, del jefe y del subathon (Iniciar, Pausar, Reiniciar, +5 min) , Reiniciar batalla , las órdenes de la bóveda y Reiniciar trono guardan y llaman sincronizar.subir(id) de inmediato, sin la espera de 0,6 s. La validación de la carrera solo bloquea si no hay integrantes; la de la batalla nunca bloquea.</w:t>
       </w:r>
     </w:p>
     <w:p>
@@ -23341,22 +24329,22 @@
         <w:pStyle w:val="Heading1"/>
         <w:pageBreakBefore/>
       </w:pPr>
-      <w:bookmarkStart w:id="39" w:name="_Toc242788253"/>
+      <w:bookmarkStart w:id="40" w:name="_Toc242788735"/>
       <w:r>
         <w:lastRenderedPageBreak/>
         <w:t>9. Flujos completos paso a paso</w:t>
       </w:r>
-      <w:bookmarkEnd w:id="39"/>
+      <w:bookmarkEnd w:id="40"/>
     </w:p>
     <w:p>
       <w:pPr>
         <w:pStyle w:val="Heading2"/>
       </w:pPr>
-      <w:bookmarkStart w:id="40" w:name="_Toc242788254"/>
+      <w:bookmarkStart w:id="41" w:name="_Toc242788736"/>
       <w:r>
         <w:t>9.1 Configurar un widget y ponerlo en OBS</w:t>
       </w:r>
-      <w:bookmarkEnd w:id="40"/>
+      <w:bookmarkEnd w:id="41"/>
     </w:p>
     <w:p>
       <w:pPr>
@@ -23535,11 +24523,11 @@
       <w:pPr>
         <w:pStyle w:val="Heading2"/>
       </w:pPr>
-      <w:bookmarkStart w:id="41" w:name="_Toc242788255"/>
+      <w:bookmarkStart w:id="42" w:name="_Toc242788737"/>
       <w:r>
         <w:t>9.2 Llega un regalo y gira la ruleta</w:t>
       </w:r>
-      <w:bookmarkEnd w:id="41"/>
+      <w:bookmarkEnd w:id="42"/>
     </w:p>
     <w:p>
       <w:pPr>
@@ -23676,11 +24664,11 @@
       <w:pPr>
         <w:pStyle w:val="Heading2"/>
       </w:pPr>
-      <w:bookmarkStart w:id="42" w:name="_Toc242788256"/>
+      <w:bookmarkStart w:id="43" w:name="_Toc242788738"/>
       <w:r>
         <w:t>9.3 Probar sin estar en vivo</w:t>
       </w:r>
-      <w:bookmarkEnd w:id="42"/>
+      <w:bookmarkEnd w:id="43"/>
     </w:p>
     <w:p>
       <w:pPr>
@@ -23771,12 +24759,12 @@
       <w:pPr>
         <w:pStyle w:val="Heading2"/>
       </w:pPr>
-      <w:bookmarkStart w:id="43" w:name="_Toc242788257"/>
+      <w:bookmarkStart w:id="44" w:name="_Toc242788739"/>
       <w:r>
         <w:lastRenderedPageBreak/>
         <w:t>9.4 Un regalo cambia de código</w:t>
       </w:r>
-      <w:bookmarkEnd w:id="43"/>
+      <w:bookmarkEnd w:id="44"/>
     </w:p>
     <w:p>
       <w:pPr>
@@ -24140,11 +25128,11 @@
       <w:pPr>
         <w:pStyle w:val="Heading2"/>
       </w:pPr>
-      <w:bookmarkStart w:id="44" w:name="_Toc242788258"/>
+      <w:bookmarkStart w:id="45" w:name="_Toc242788740"/>
       <w:r>
         <w:t>9.5 Cambiar la configuración durante el LIVE</w:t>
       </w:r>
-      <w:bookmarkEnd w:id="44"/>
+      <w:bookmarkEnd w:id="45"/>
     </w:p>
     <w:p>
       <w:pPr>
@@ -24202,11 +25190,11 @@
       <w:pPr>
         <w:pStyle w:val="Heading2"/>
       </w:pPr>
-      <w:bookmarkStart w:id="45" w:name="_Toc242788259"/>
+      <w:bookmarkStart w:id="46" w:name="_Toc242788741"/>
       <w:r>
         <w:t>9.6 Una ronda de la carrera de regalos</w:t>
       </w:r>
-      <w:bookmarkEnd w:id="45"/>
+      <w:bookmarkEnd w:id="46"/>
     </w:p>
     <w:p>
       <w:pPr>
@@ -24316,22 +25304,22 @@
         <w:pStyle w:val="Heading1"/>
         <w:pageBreakBefore/>
       </w:pPr>
-      <w:bookmarkStart w:id="46" w:name="_Toc242788260"/>
+      <w:bookmarkStart w:id="47" w:name="_Toc242788742"/>
       <w:r>
         <w:lastRenderedPageBreak/>
         <w:t>10. Diseño visual</w:t>
       </w:r>
-      <w:bookmarkEnd w:id="46"/>
+      <w:bookmarkEnd w:id="47"/>
     </w:p>
     <w:p>
       <w:pPr>
         <w:pStyle w:val="Heading2"/>
       </w:pPr>
-      <w:bookmarkStart w:id="47" w:name="_Toc242788261"/>
+      <w:bookmarkStart w:id="48" w:name="_Toc242788743"/>
       <w:r>
         <w:t>10.1 Panel</w:t>
       </w:r>
-      <w:bookmarkEnd w:id="47"/>
+      <w:bookmarkEnd w:id="48"/>
     </w:p>
     <w:p>
       <w:pPr>
@@ -25136,11 +26124,11 @@
       <w:pPr>
         <w:pStyle w:val="Heading2"/>
       </w:pPr>
-      <w:bookmarkStart w:id="48" w:name="_Toc242788262"/>
+      <w:bookmarkStart w:id="49" w:name="_Toc242788744"/>
       <w:r>
         <w:t>10.2 Widgets</w:t>
       </w:r>
-      <w:bookmarkEnd w:id="48"/>
+      <w:bookmarkEnd w:id="49"/>
     </w:p>
     <w:p>
       <w:pPr>
@@ -25698,12 +26686,12 @@
         <w:pStyle w:val="Heading1"/>
         <w:pageBreakBefore/>
       </w:pPr>
-      <w:bookmarkStart w:id="49" w:name="_Toc242788263"/>
+      <w:bookmarkStart w:id="50" w:name="_Toc242788745"/>
       <w:r>
         <w:lastRenderedPageBreak/>
         <w:t>11. Seguridad y privacidad</w:t>
       </w:r>
-      <w:bookmarkEnd w:id="49"/>
+      <w:bookmarkEnd w:id="50"/>
     </w:p>
     <w:tbl>
       <w:tblPr>
@@ -26216,12 +27204,12 @@
         <w:pStyle w:val="Heading1"/>
         <w:pageBreakBefore/>
       </w:pPr>
-      <w:bookmarkStart w:id="50" w:name="_Toc242788264"/>
+      <w:bookmarkStart w:id="51" w:name="_Toc242788746"/>
       <w:r>
         <w:lastRenderedPageBreak/>
         <w:t>12. Limitaciones actuales</w:t>
       </w:r>
-      <w:bookmarkEnd w:id="50"/>
+      <w:bookmarkEnd w:id="51"/>
     </w:p>
     <w:tbl>
       <w:tblPr>
@@ -27744,6 +28732,83 @@
           </w:p>
         </w:tc>
       </w:tr>
+      <w:tr>
+        <w:tc>
+          <w:tcPr>
+            <w:tcW w:w="2808" w:type="dxa"/>
+            <w:tcBorders>
+              <w:top w:val="single" w:sz="4" w:space="0" w:color="BFBFBF"/>
+              <w:left w:val="single" w:sz="4" w:space="0" w:color="BFBFBF"/>
+              <w:bottom w:val="single" w:sz="4" w:space="0" w:color="BFBFBF"/>
+              <w:right w:val="single" w:sz="4" w:space="0" w:color="BFBFBF"/>
+            </w:tcBorders>
+            <w:tcMar>
+              <w:top w:w="60" w:type="dxa"/>
+              <w:left w:w="100" w:type="dxa"/>
+              <w:bottom w:w="60" w:type="dxa"/>
+              <w:right w:w="100" w:type="dxa"/>
+            </w:tcMar>
+          </w:tcPr>
+          <w:p>
+            <w:pPr>
+              <w:spacing w:after="20"/>
+            </w:pPr>
+            <w:r>
+              <w:t>El trono distingue a las personas por su nombre visible</w:t>
+            </w:r>
+          </w:p>
+        </w:tc>
+        <w:tc>
+          <w:tcPr>
+            <w:tcW w:w="2808" w:type="dxa"/>
+            <w:tcBorders>
+              <w:top w:val="single" w:sz="4" w:space="0" w:color="BFBFBF"/>
+              <w:left w:val="single" w:sz="4" w:space="0" w:color="BFBFBF"/>
+              <w:bottom w:val="single" w:sz="4" w:space="0" w:color="BFBFBF"/>
+              <w:right w:val="single" w:sz="4" w:space="0" w:color="BFBFBF"/>
+            </w:tcBorders>
+            <w:tcMar>
+              <w:top w:w="60" w:type="dxa"/>
+              <w:left w:w="100" w:type="dxa"/>
+              <w:bottom w:w="60" w:type="dxa"/>
+              <w:right w:w="100" w:type="dxa"/>
+            </w:tcMar>
+          </w:tcPr>
+          <w:p>
+            <w:pPr>
+              <w:spacing w:after="20"/>
+            </w:pPr>
+            <w:r>
+              <w:t>El evento normalizado no trae un identificador del usuario</w:t>
+            </w:r>
+          </w:p>
+        </w:tc>
+        <w:tc>
+          <w:tcPr>
+            <w:tcW w:w="3744" w:type="dxa"/>
+            <w:tcBorders>
+              <w:top w:val="single" w:sz="4" w:space="0" w:color="BFBFBF"/>
+              <w:left w:val="single" w:sz="4" w:space="0" w:color="BFBFBF"/>
+              <w:bottom w:val="single" w:sz="4" w:space="0" w:color="BFBFBF"/>
+              <w:right w:val="single" w:sz="4" w:space="0" w:color="BFBFBF"/>
+            </w:tcBorders>
+            <w:tcMar>
+              <w:top w:w="60" w:type="dxa"/>
+              <w:left w:w="100" w:type="dxa"/>
+              <w:bottom w:w="60" w:type="dxa"/>
+              <w:right w:w="100" w:type="dxa"/>
+            </w:tcMar>
+          </w:tcPr>
+          <w:p>
+            <w:pPr>
+              <w:spacing w:after="20"/>
+            </w:pPr>
+            <w:r>
+              <w:t>Dos personas con el mismo nombre suman juntas en el modo total</w:t>
+            </w:r>
+          </w:p>
+        </w:tc>
+      </w:tr>
     </w:tbl>
     <w:p>
       <w:pPr>
@@ -27755,12 +28820,12 @@
         <w:pStyle w:val="Heading1"/>
         <w:pageBreakBefore/>
       </w:pPr>
-      <w:bookmarkStart w:id="51" w:name="_Toc242788265"/>
+      <w:bookmarkStart w:id="52" w:name="_Toc242788747"/>
       <w:r>
         <w:lastRenderedPageBreak/>
         <w:t>13. Hacia una versión final montada en un servidor</w:t>
       </w:r>
-      <w:bookmarkEnd w:id="51"/>
+      <w:bookmarkEnd w:id="52"/>
     </w:p>
     <w:p>
       <w:pPr>
@@ -27784,11 +28849,11 @@
       <w:pPr>
         <w:pStyle w:val="Heading2"/>
       </w:pPr>
-      <w:bookmarkStart w:id="52" w:name="_Toc242788266"/>
+      <w:bookmarkStart w:id="53" w:name="_Toc242788748"/>
       <w:r>
         <w:t>13.1 Objetivos de la versión final</w:t>
       </w:r>
-      <w:bookmarkEnd w:id="52"/>
+      <w:bookmarkEnd w:id="53"/>
     </w:p>
     <w:p>
       <w:pPr>
@@ -27946,11 +29011,11 @@
       <w:pPr>
         <w:pStyle w:val="Heading2"/>
       </w:pPr>
-      <w:bookmarkStart w:id="53" w:name="_Toc242788267"/>
+      <w:bookmarkStart w:id="54" w:name="_Toc242788749"/>
       <w:r>
         <w:t>13.2 Arquitectura propuesta</w:t>
       </w:r>
-      <w:bookmarkEnd w:id="53"/>
+      <w:bookmarkEnd w:id="54"/>
     </w:p>
     <w:p>
       <w:pPr>
@@ -28779,11 +29844,11 @@
       <w:pPr>
         <w:pStyle w:val="Heading2"/>
       </w:pPr>
-      <w:bookmarkStart w:id="54" w:name="_Toc242788268"/>
+      <w:bookmarkStart w:id="55" w:name="_Toc242788750"/>
       <w:r>
         <w:t>13.3 Modelo de datos sugerido</w:t>
       </w:r>
-      <w:bookmarkEnd w:id="54"/>
+      <w:bookmarkEnd w:id="55"/>
     </w:p>
     <w:tbl>
       <w:tblPr>
@@ -29490,12 +30555,12 @@
       <w:pPr>
         <w:pStyle w:val="Heading2"/>
       </w:pPr>
-      <w:bookmarkStart w:id="55" w:name="_Toc242788269"/>
+      <w:bookmarkStart w:id="56" w:name="_Toc242788751"/>
       <w:r>
         <w:lastRenderedPageBreak/>
         <w:t>13.4 Seguridad en la versión final</w:t>
       </w:r>
-      <w:bookmarkEnd w:id="55"/>
+      <w:bookmarkEnd w:id="56"/>
     </w:p>
     <w:p>
       <w:pPr>
@@ -29729,11 +30794,11 @@
       <w:pPr>
         <w:pStyle w:val="Heading2"/>
       </w:pPr>
-      <w:bookmarkStart w:id="56" w:name="_Toc242788270"/>
+      <w:bookmarkStart w:id="57" w:name="_Toc242788752"/>
       <w:r>
         <w:t>13.5 Dónde alojarlo</w:t>
       </w:r>
-      <w:bookmarkEnd w:id="56"/>
+      <w:bookmarkEnd w:id="57"/>
     </w:p>
     <w:tbl>
       <w:tblPr>
@@ -30338,11 +31403,11 @@
       <w:pPr>
         <w:pStyle w:val="Heading2"/>
       </w:pPr>
-      <w:bookmarkStart w:id="57" w:name="_Toc242788271"/>
+      <w:bookmarkStart w:id="58" w:name="_Toc242788753"/>
       <w:r>
         <w:t>13.6 Qué se reutiliza y qué cambia del código actual</w:t>
       </w:r>
-      <w:bookmarkEnd w:id="57"/>
+      <w:bookmarkEnd w:id="58"/>
     </w:p>
     <w:tbl>
       <w:tblPr>
@@ -31150,12 +32215,12 @@
       <w:pPr>
         <w:pStyle w:val="Heading2"/>
       </w:pPr>
-      <w:bookmarkStart w:id="58" w:name="_Toc242788272"/>
+      <w:bookmarkStart w:id="59" w:name="_Toc242788754"/>
       <w:r>
         <w:lastRenderedPageBreak/>
         <w:t>13.7 Mejoras técnicas recomendadas</w:t>
       </w:r>
-      <w:bookmarkEnd w:id="58"/>
+      <w:bookmarkEnd w:id="59"/>
     </w:p>
     <w:p>
       <w:pPr>
@@ -31341,11 +32406,11 @@
       <w:pPr>
         <w:pStyle w:val="Heading2"/>
       </w:pPr>
-      <w:bookmarkStart w:id="59" w:name="_Toc242788273"/>
+      <w:bookmarkStart w:id="60" w:name="_Toc242788755"/>
       <w:r>
         <w:t>13.8 Nuevas funciones que habilita un servidor</w:t>
       </w:r>
-      <w:bookmarkEnd w:id="59"/>
+      <w:bookmarkEnd w:id="60"/>
     </w:p>
     <w:p>
       <w:pPr>
@@ -31442,11 +32507,11 @@
       <w:pPr>
         <w:pStyle w:val="Heading2"/>
       </w:pPr>
-      <w:bookmarkStart w:id="60" w:name="_Toc242788274"/>
+      <w:bookmarkStart w:id="61" w:name="_Toc242788756"/>
       <w:r>
         <w:t>13.9 Hoja de ruta por fases</w:t>
       </w:r>
-      <w:bookmarkEnd w:id="60"/>
+      <w:bookmarkEnd w:id="61"/>
     </w:p>
     <w:tbl>
       <w:tblPr>
@@ -31926,22 +32991,22 @@
         <w:pStyle w:val="Heading1"/>
         <w:pageBreakBefore/>
       </w:pPr>
-      <w:bookmarkStart w:id="61" w:name="_Toc242788275"/>
+      <w:bookmarkStart w:id="62" w:name="_Toc242788757"/>
       <w:r>
         <w:lastRenderedPageBreak/>
         <w:t>14. Operación y mantenimiento actual</w:t>
       </w:r>
-      <w:bookmarkEnd w:id="61"/>
+      <w:bookmarkEnd w:id="62"/>
     </w:p>
     <w:p>
       <w:pPr>
         <w:pStyle w:val="Heading2"/>
       </w:pPr>
-      <w:bookmarkStart w:id="62" w:name="_Toc242788276"/>
+      <w:bookmarkStart w:id="63" w:name="_Toc242788758"/>
       <w:r>
         <w:t>14.1 Publicar un cambio</w:t>
       </w:r>
-      <w:bookmarkEnd w:id="62"/>
+      <w:bookmarkEnd w:id="63"/>
     </w:p>
     <w:p>
       <w:pPr>
@@ -32003,11 +33068,11 @@
       <w:pPr>
         <w:pStyle w:val="Heading2"/>
       </w:pPr>
-      <w:bookmarkStart w:id="63" w:name="_Toc242788277"/>
+      <w:bookmarkStart w:id="64" w:name="_Toc242788759"/>
       <w:r>
         <w:t>14.2 Agregar una función nueva</w:t>
       </w:r>
-      <w:bookmarkEnd w:id="63"/>
+      <w:bookmarkEnd w:id="64"/>
     </w:p>
     <w:p>
       <w:pPr>
@@ -32064,11 +33129,11 @@
       <w:pPr>
         <w:pStyle w:val="Heading2"/>
       </w:pPr>
-      <w:bookmarkStart w:id="64" w:name="_Toc242788278"/>
+      <w:bookmarkStart w:id="65" w:name="_Toc242788760"/>
       <w:r>
         <w:t>14.3 Probar</w:t>
       </w:r>
-      <w:bookmarkEnd w:id="64"/>
+      <w:bookmarkEnd w:id="65"/>
     </w:p>
     <w:p>
       <w:pPr>
@@ -32210,6 +33275,19 @@
       </w:pPr>
       <w:r>
         <w:lastRenderedPageBreak/>
+        <w:t>Trono: “Otro espectador: 250” y “…: 1.000” muestran el cambio de rey (tarda 3 s, la espera del combo); Reiniciar trono lo deja libre, sin recargar. Con la URL del widget abierta en otra pestaña, el reinicio llega en menos de un segundo.</w:t>
+      </w:r>
+    </w:p>
+    <w:p>
+      <w:pPr>
+        <w:pStyle w:val="ListParagraph"/>
+        <w:numPr>
+          <w:ilvl w:val="0"/>
+          <w:numId w:val="3"/>
+        </w:numPr>
+        <w:spacing w:after="60"/>
+      </w:pPr>
+      <w:r>
         <w:t>Servidor estático local: python -m http.server 8080 -d public y abrir http://localhost:8080 (con doble clic no funciona: los módulos JavaScript necesitan http://).</w:t>
       </w:r>
     </w:p>
@@ -32217,11 +33295,11 @@
       <w:pPr>
         <w:pStyle w:val="Heading2"/>
       </w:pPr>
-      <w:bookmarkStart w:id="65" w:name="_Toc242788279"/>
+      <w:bookmarkStart w:id="66" w:name="_Toc242788761"/>
       <w:r>
         <w:t>14.4 Solución de problemas</w:t>
       </w:r>
-      <w:bookmarkEnd w:id="65"/>
+      <w:bookmarkEnd w:id="66"/>
     </w:p>
     <w:tbl>
       <w:tblPr>
@@ -33208,6 +34286,7 @@
               <w:spacing w:after="20"/>
             </w:pPr>
             <w:r>
+              <w:lastRenderedPageBreak/>
               <w:t>El subathon no suma tiempo</w:t>
             </w:r>
           </w:p>
@@ -33285,7 +34364,6 @@
               <w:spacing w:after="20"/>
             </w:pPr>
             <w:r>
-              <w:lastRenderedPageBreak/>
               <w:t>La bóveda no avanza</w:t>
             </w:r>
           </w:p>
@@ -33337,6 +34415,83 @@
             </w:pPr>
             <w:r>
               <w:t>Cerrar y reiniciar, y revisar Personalizar</w:t>
+            </w:r>
+          </w:p>
+        </w:tc>
+      </w:tr>
+      <w:tr>
+        <w:tc>
+          <w:tcPr>
+            <w:tcW w:w="2808" w:type="dxa"/>
+            <w:tcBorders>
+              <w:top w:val="single" w:sz="4" w:space="0" w:color="BFBFBF"/>
+              <w:left w:val="single" w:sz="4" w:space="0" w:color="BFBFBF"/>
+              <w:bottom w:val="single" w:sz="4" w:space="0" w:color="BFBFBF"/>
+              <w:right w:val="single" w:sz="4" w:space="0" w:color="BFBFBF"/>
+            </w:tcBorders>
+            <w:tcMar>
+              <w:top w:w="60" w:type="dxa"/>
+              <w:left w:w="100" w:type="dxa"/>
+              <w:bottom w:w="60" w:type="dxa"/>
+              <w:right w:w="100" w:type="dxa"/>
+            </w:tcMar>
+          </w:tcPr>
+          <w:p>
+            <w:pPr>
+              <w:spacing w:after="20"/>
+            </w:pPr>
+            <w:r>
+              <w:t>El trono tarda en cambiar de rey</w:t>
+            </w:r>
+          </w:p>
+        </w:tc>
+        <w:tc>
+          <w:tcPr>
+            <w:tcW w:w="2995" w:type="dxa"/>
+            <w:tcBorders>
+              <w:top w:val="single" w:sz="4" w:space="0" w:color="BFBFBF"/>
+              <w:left w:val="single" w:sz="4" w:space="0" w:color="BFBFBF"/>
+              <w:bottom w:val="single" w:sz="4" w:space="0" w:color="BFBFBF"/>
+              <w:right w:val="single" w:sz="4" w:space="0" w:color="BFBFBF"/>
+            </w:tcBorders>
+            <w:tcMar>
+              <w:top w:w="60" w:type="dxa"/>
+              <w:left w:w="100" w:type="dxa"/>
+              <w:bottom w:w="60" w:type="dxa"/>
+              <w:right w:w="100" w:type="dxa"/>
+            </w:tcMar>
+          </w:tcPr>
+          <w:p>
+            <w:pPr>
+              <w:spacing w:after="20"/>
+            </w:pPr>
+            <w:r>
+              <w:t>Espera 3 s sin regalos de esa persona para contar el combo completo</w:t>
+            </w:r>
+          </w:p>
+        </w:tc>
+        <w:tc>
+          <w:tcPr>
+            <w:tcW w:w="3557" w:type="dxa"/>
+            <w:tcBorders>
+              <w:top w:val="single" w:sz="4" w:space="0" w:color="BFBFBF"/>
+              <w:left w:val="single" w:sz="4" w:space="0" w:color="BFBFBF"/>
+              <w:bottom w:val="single" w:sz="4" w:space="0" w:color="BFBFBF"/>
+              <w:right w:val="single" w:sz="4" w:space="0" w:color="BFBFBF"/>
+            </w:tcBorders>
+            <w:tcMar>
+              <w:top w:w="60" w:type="dxa"/>
+              <w:left w:w="100" w:type="dxa"/>
+              <w:bottom w:w="60" w:type="dxa"/>
+              <w:right w:w="100" w:type="dxa"/>
+            </w:tcMar>
+          </w:tcPr>
+          <w:p>
+            <w:pPr>
+              <w:spacing w:after="20"/>
+            </w:pPr>
+            <w:r>
+              <w:t>Es normal; mientras tanto se ve “Fulano desafía el trono…”</w:t>
             </w:r>
           </w:p>
         </w:tc>
@@ -33352,12 +34507,12 @@
         <w:pStyle w:val="Heading1"/>
         <w:pageBreakBefore/>
       </w:pPr>
-      <w:bookmarkStart w:id="66" w:name="_Toc242788280"/>
+      <w:bookmarkStart w:id="67" w:name="_Toc242788762"/>
       <w:r>
         <w:lastRenderedPageBreak/>
         <w:t>15. Anexo: historial de decisiones y correcciones</w:t>
       </w:r>
-      <w:bookmarkEnd w:id="66"/>
+      <w:bookmarkEnd w:id="67"/>
     </w:p>
     <w:tbl>
       <w:tblPr>
@@ -35936,6 +37091,242 @@
             </w:pPr>
             <w:r>
               <w:t>Que el candado siga el estilo elegido en Personalizar</w:t>
+            </w:r>
+          </w:p>
+        </w:tc>
+      </w:tr>
+      <w:tr>
+        <w:tc>
+          <w:tcPr>
+            <w:tcW w:w="2246" w:type="dxa"/>
+            <w:tcBorders>
+              <w:top w:val="single" w:sz="4" w:space="0" w:color="BFBFBF"/>
+              <w:left w:val="single" w:sz="4" w:space="0" w:color="BFBFBF"/>
+              <w:bottom w:val="single" w:sz="4" w:space="0" w:color="BFBFBF"/>
+              <w:right w:val="single" w:sz="4" w:space="0" w:color="BFBFBF"/>
+            </w:tcBorders>
+            <w:tcMar>
+              <w:top w:w="60" w:type="dxa"/>
+              <w:left w:w="100" w:type="dxa"/>
+              <w:bottom w:w="60" w:type="dxa"/>
+              <w:right w:w="100" w:type="dxa"/>
+            </w:tcMar>
+          </w:tcPr>
+          <w:p>
+            <w:pPr>
+              <w:spacing w:after="20"/>
+            </w:pPr>
+            <w:r>
+              <w:t>Trono: jugadas de 3 s</w:t>
+            </w:r>
+          </w:p>
+        </w:tc>
+        <w:tc>
+          <w:tcPr>
+            <w:tcW w:w="3744" w:type="dxa"/>
+            <w:tcBorders>
+              <w:top w:val="single" w:sz="4" w:space="0" w:color="BFBFBF"/>
+              <w:left w:val="single" w:sz="4" w:space="0" w:color="BFBFBF"/>
+              <w:bottom w:val="single" w:sz="4" w:space="0" w:color="BFBFBF"/>
+              <w:right w:val="single" w:sz="4" w:space="0" w:color="BFBFBF"/>
+            </w:tcBorders>
+            <w:tcMar>
+              <w:top w:w="60" w:type="dxa"/>
+              <w:left w:w="100" w:type="dxa"/>
+              <w:bottom w:w="60" w:type="dxa"/>
+              <w:right w:w="100" w:type="dxa"/>
+            </w:tcMar>
+          </w:tcPr>
+          <w:p>
+            <w:pPr>
+              <w:spacing w:after="20"/>
+            </w:pPr>
+            <w:r>
+              <w:t>Agrupar los regalos de cada persona hasta 3 s de silencio antes de comparar</w:t>
+            </w:r>
+          </w:p>
+        </w:tc>
+        <w:tc>
+          <w:tcPr>
+            <w:tcW w:w="3370" w:type="dxa"/>
+            <w:tcBorders>
+              <w:top w:val="single" w:sz="4" w:space="0" w:color="BFBFBF"/>
+              <w:left w:val="single" w:sz="4" w:space="0" w:color="BFBFBF"/>
+              <w:bottom w:val="single" w:sz="4" w:space="0" w:color="BFBFBF"/>
+              <w:right w:val="single" w:sz="4" w:space="0" w:color="BFBFBF"/>
+            </w:tcBorders>
+            <w:tcMar>
+              <w:top w:w="60" w:type="dxa"/>
+              <w:left w:w="100" w:type="dxa"/>
+              <w:bottom w:w="60" w:type="dxa"/>
+              <w:right w:w="100" w:type="dxa"/>
+            </w:tcMar>
+          </w:tcPr>
+          <w:p>
+            <w:pPr>
+              <w:spacing w:after="20"/>
+            </w:pPr>
+            <w:r>
+              <w:t xml:space="preserve">El rastreador puede entregar un combo en dos partes; comparar </w:t>
+            </w:r>
+            <w:r>
+              <w:lastRenderedPageBreak/>
+              <w:t>cada parte daba totales incompletos</w:t>
+            </w:r>
+          </w:p>
+        </w:tc>
+      </w:tr>
+      <w:tr>
+        <w:tc>
+          <w:tcPr>
+            <w:tcW w:w="2246" w:type="dxa"/>
+            <w:tcBorders>
+              <w:top w:val="single" w:sz="4" w:space="0" w:color="BFBFBF"/>
+              <w:left w:val="single" w:sz="4" w:space="0" w:color="BFBFBF"/>
+              <w:bottom w:val="single" w:sz="4" w:space="0" w:color="BFBFBF"/>
+              <w:right w:val="single" w:sz="4" w:space="0" w:color="BFBFBF"/>
+            </w:tcBorders>
+            <w:tcMar>
+              <w:top w:w="60" w:type="dxa"/>
+              <w:left w:w="100" w:type="dxa"/>
+              <w:bottom w:w="60" w:type="dxa"/>
+              <w:right w:w="100" w:type="dxa"/>
+            </w:tcMar>
+          </w:tcPr>
+          <w:p>
+            <w:pPr>
+              <w:spacing w:after="20"/>
+            </w:pPr>
+            <w:r>
+              <w:lastRenderedPageBreak/>
+              <w:t>Trono: coronaciones simultáneas</w:t>
+            </w:r>
+          </w:p>
+        </w:tc>
+        <w:tc>
+          <w:tcPr>
+            <w:tcW w:w="3744" w:type="dxa"/>
+            <w:tcBorders>
+              <w:top w:val="single" w:sz="4" w:space="0" w:color="BFBFBF"/>
+              <w:left w:val="single" w:sz="4" w:space="0" w:color="BFBFBF"/>
+              <w:bottom w:val="single" w:sz="4" w:space="0" w:color="BFBFBF"/>
+              <w:right w:val="single" w:sz="4" w:space="0" w:color="BFBFBF"/>
+            </w:tcBorders>
+            <w:tcMar>
+              <w:top w:w="60" w:type="dxa"/>
+              <w:left w:w="100" w:type="dxa"/>
+              <w:bottom w:w="60" w:type="dxa"/>
+              <w:right w:w="100" w:type="dxa"/>
+            </w:tcMar>
+          </w:tcPr>
+          <w:p>
+            <w:pPr>
+              <w:spacing w:after="20"/>
+            </w:pPr>
+            <w:r>
+              <w:t>Un solo cambio de rey si otra coronación llega durante la transición</w:t>
+            </w:r>
+          </w:p>
+        </w:tc>
+        <w:tc>
+          <w:tcPr>
+            <w:tcW w:w="3370" w:type="dxa"/>
+            <w:tcBorders>
+              <w:top w:val="single" w:sz="4" w:space="0" w:color="BFBFBF"/>
+              <w:left w:val="single" w:sz="4" w:space="0" w:color="BFBFBF"/>
+              <w:bottom w:val="single" w:sz="4" w:space="0" w:color="BFBFBF"/>
+              <w:right w:val="single" w:sz="4" w:space="0" w:color="BFBFBF"/>
+            </w:tcBorders>
+            <w:tcMar>
+              <w:top w:w="60" w:type="dxa"/>
+              <w:left w:w="100" w:type="dxa"/>
+              <w:bottom w:w="60" w:type="dxa"/>
+              <w:right w:w="100" w:type="dxa"/>
+            </w:tcMar>
+          </w:tcPr>
+          <w:p>
+            <w:pPr>
+              <w:spacing w:after="20"/>
+            </w:pPr>
+            <w:r>
+              <w:t>Hacía dos transiciones y dos sonidos, y decía que destronó a alguien que nunca se vio reinar</w:t>
+            </w:r>
+          </w:p>
+        </w:tc>
+      </w:tr>
+      <w:tr>
+        <w:tc>
+          <w:tcPr>
+            <w:tcW w:w="2246" w:type="dxa"/>
+            <w:tcBorders>
+              <w:top w:val="single" w:sz="4" w:space="0" w:color="BFBFBF"/>
+              <w:left w:val="single" w:sz="4" w:space="0" w:color="BFBFBF"/>
+              <w:bottom w:val="single" w:sz="4" w:space="0" w:color="BFBFBF"/>
+              <w:right w:val="single" w:sz="4" w:space="0" w:color="BFBFBF"/>
+            </w:tcBorders>
+            <w:tcMar>
+              <w:top w:w="60" w:type="dxa"/>
+              <w:left w:w="100" w:type="dxa"/>
+              <w:bottom w:w="60" w:type="dxa"/>
+              <w:right w:w="100" w:type="dxa"/>
+            </w:tcMar>
+          </w:tcPr>
+          <w:p>
+            <w:pPr>
+              <w:spacing w:after="20"/>
+            </w:pPr>
+            <w:r>
+              <w:t>Trono: medidas con --u</w:t>
+            </w:r>
+          </w:p>
+        </w:tc>
+        <w:tc>
+          <w:tcPr>
+            <w:tcW w:w="3744" w:type="dxa"/>
+            <w:tcBorders>
+              <w:top w:val="single" w:sz="4" w:space="0" w:color="BFBFBF"/>
+              <w:left w:val="single" w:sz="4" w:space="0" w:color="BFBFBF"/>
+              <w:bottom w:val="single" w:sz="4" w:space="0" w:color="BFBFBF"/>
+              <w:right w:val="single" w:sz="4" w:space="0" w:color="BFBFBF"/>
+            </w:tcBorders>
+            <w:tcMar>
+              <w:top w:w="60" w:type="dxa"/>
+              <w:left w:w="100" w:type="dxa"/>
+              <w:bottom w:w="60" w:type="dxa"/>
+              <w:right w:w="100" w:type="dxa"/>
+            </w:tcMar>
+          </w:tcPr>
+          <w:p>
+            <w:pPr>
+              <w:spacing w:after="20"/>
+            </w:pPr>
+            <w:r>
+              <w:t>El menor entre 1 % del ancho y 2,2 % del alto</w:t>
+            </w:r>
+          </w:p>
+        </w:tc>
+        <w:tc>
+          <w:tcPr>
+            <w:tcW w:w="3370" w:type="dxa"/>
+            <w:tcBorders>
+              <w:top w:val="single" w:sz="4" w:space="0" w:color="BFBFBF"/>
+              <w:left w:val="single" w:sz="4" w:space="0" w:color="BFBFBF"/>
+              <w:bottom w:val="single" w:sz="4" w:space="0" w:color="BFBFBF"/>
+              <w:right w:val="single" w:sz="4" w:space="0" w:color="BFBFBF"/>
+            </w:tcBorders>
+            <w:tcMar>
+              <w:top w:w="60" w:type="dxa"/>
+              <w:left w:w="100" w:type="dxa"/>
+              <w:bottom w:w="60" w:type="dxa"/>
+              <w:right w:w="100" w:type="dxa"/>
+            </w:tcMar>
+          </w:tcPr>
+          <w:p>
+            <w:pPr>
+              <w:spacing w:after="20"/>
+            </w:pPr>
+            <w:r>
+              <w:t>Con medidas solo en vw, la insignia se cortaba en fuentes más anchas</w:t>
             </w:r>
           </w:p>
         </w:tc>

</xml_diff>

<commit_message>
Marcador: puntajes por integrante con el reloj arriba
- marcador.html + js/widgets/marcador.js + css/widgets/marcador.css: reloj en
  una píldora pequeña arriba y fila de tarjetas de cristal con filo de oro
  (nombre, ícono del regalo y puntaje en oro). Sin barras ni metas; misma
  lógica de regalos y reloj que la carrera; medidas con --u.
- Vista Superposiciones → Juegos → Marcador: integrantes (1 a 6, color
  opcional), reloj Iniciar/Pausar/Reiniciar en vivo.
- README y documentación Word (sección 7.10; corrige espacios antes de comas).

Co-Authored-By: Claude Opus 5.5 <noreply@anthropic.com>
</commit_message>
<xml_diff>
--- a/Documentacion-Live-Tools.docx
+++ b/Documentacion-Live-Tools.docx
@@ -42,7 +42,7 @@
         <w:jc w:val="center"/>
       </w:pPr>
       <w:r>
-        <w:t>Ruleta · Metas · Alertas · Juegos (Carrera, Batalla, Jefe, Subathon, Bóveda, Trono) · Actividad · Buscador de regalos</w:t>
+        <w:t>Ruleta · Metas · Alertas · Juegos (Carrera, Marcador, Batalla, Jefe, Subathon, Bóveda, Trono) · Actividad · Buscador de regalos</w:t>
       </w:r>
     </w:p>
     <w:p>
@@ -159,7 +159,7 @@
           <w:r>
             <w:fldChar w:fldCharType="separate"/>
           </w:r>
-          <w:hyperlink w:anchor="_Toc242788695" w:history="1">
+          <w:hyperlink w:anchor="_Toc242789215" w:history="1">
             <w:r>
               <w:rPr>
                 <w:rStyle w:val="Hyperlink"/>
@@ -183,7 +183,7 @@
               <w:rPr>
                 <w:noProof/>
               </w:rPr>
-              <w:instrText xml:space="preserve"> PAGEREF _Toc242788695 \h </w:instrText>
+              <w:instrText xml:space="preserve"> PAGEREF _Toc242789215 \h </w:instrText>
             </w:r>
             <w:r>
               <w:rPr>
@@ -225,7 +225,7 @@
               <w14:ligatures w14:val="standardContextual"/>
             </w:rPr>
           </w:pPr>
-          <w:hyperlink w:anchor="_Toc242788696" w:history="1">
+          <w:hyperlink w:anchor="_Toc242789216" w:history="1">
             <w:r>
               <w:rPr>
                 <w:rStyle w:val="Hyperlink"/>
@@ -249,7 +249,7 @@
               <w:rPr>
                 <w:noProof/>
               </w:rPr>
-              <w:instrText xml:space="preserve"> PAGEREF _Toc242788696 \h </w:instrText>
+              <w:instrText xml:space="preserve"> PAGEREF _Toc242789216 \h </w:instrText>
             </w:r>
             <w:r>
               <w:rPr>
@@ -291,7 +291,7 @@
               <w14:ligatures w14:val="standardContextual"/>
             </w:rPr>
           </w:pPr>
-          <w:hyperlink w:anchor="_Toc242788697" w:history="1">
+          <w:hyperlink w:anchor="_Toc242789217" w:history="1">
             <w:r>
               <w:rPr>
                 <w:rStyle w:val="Hyperlink"/>
@@ -315,7 +315,7 @@
               <w:rPr>
                 <w:noProof/>
               </w:rPr>
-              <w:instrText xml:space="preserve"> PAGEREF _Toc242788697 \h </w:instrText>
+              <w:instrText xml:space="preserve"> PAGEREF _Toc242789217 \h </w:instrText>
             </w:r>
             <w:r>
               <w:rPr>
@@ -357,7 +357,7 @@
               <w14:ligatures w14:val="standardContextual"/>
             </w:rPr>
           </w:pPr>
-          <w:hyperlink w:anchor="_Toc242788698" w:history="1">
+          <w:hyperlink w:anchor="_Toc242789218" w:history="1">
             <w:r>
               <w:rPr>
                 <w:rStyle w:val="Hyperlink"/>
@@ -381,7 +381,7 @@
               <w:rPr>
                 <w:noProof/>
               </w:rPr>
-              <w:instrText xml:space="preserve"> PAGEREF _Toc242788698 \h </w:instrText>
+              <w:instrText xml:space="preserve"> PAGEREF _Toc242789218 \h </w:instrText>
             </w:r>
             <w:r>
               <w:rPr>
@@ -423,7 +423,7 @@
               <w14:ligatures w14:val="standardContextual"/>
             </w:rPr>
           </w:pPr>
-          <w:hyperlink w:anchor="_Toc242788699" w:history="1">
+          <w:hyperlink w:anchor="_Toc242789219" w:history="1">
             <w:r>
               <w:rPr>
                 <w:rStyle w:val="Hyperlink"/>
@@ -447,7 +447,7 @@
               <w:rPr>
                 <w:noProof/>
               </w:rPr>
-              <w:instrText xml:space="preserve"> PAGEREF _Toc242788699 \h </w:instrText>
+              <w:instrText xml:space="preserve"> PAGEREF _Toc242789219 \h </w:instrText>
             </w:r>
             <w:r>
               <w:rPr>
@@ -489,7 +489,7 @@
               <w14:ligatures w14:val="standardContextual"/>
             </w:rPr>
           </w:pPr>
-          <w:hyperlink w:anchor="_Toc242788700" w:history="1">
+          <w:hyperlink w:anchor="_Toc242789220" w:history="1">
             <w:r>
               <w:rPr>
                 <w:rStyle w:val="Hyperlink"/>
@@ -513,7 +513,7 @@
               <w:rPr>
                 <w:noProof/>
               </w:rPr>
-              <w:instrText xml:space="preserve"> PAGEREF _Toc242788700 \h </w:instrText>
+              <w:instrText xml:space="preserve"> PAGEREF _Toc242789220 \h </w:instrText>
             </w:r>
             <w:r>
               <w:rPr>
@@ -555,7 +555,7 @@
               <w14:ligatures w14:val="standardContextual"/>
             </w:rPr>
           </w:pPr>
-          <w:hyperlink w:anchor="_Toc242788701" w:history="1">
+          <w:hyperlink w:anchor="_Toc242789221" w:history="1">
             <w:r>
               <w:rPr>
                 <w:rStyle w:val="Hyperlink"/>
@@ -579,7 +579,7 @@
               <w:rPr>
                 <w:noProof/>
               </w:rPr>
-              <w:instrText xml:space="preserve"> PAGEREF _Toc242788701 \h </w:instrText>
+              <w:instrText xml:space="preserve"> PAGEREF _Toc242789221 \h </w:instrText>
             </w:r>
             <w:r>
               <w:rPr>
@@ -621,7 +621,7 @@
               <w14:ligatures w14:val="standardContextual"/>
             </w:rPr>
           </w:pPr>
-          <w:hyperlink w:anchor="_Toc242788702" w:history="1">
+          <w:hyperlink w:anchor="_Toc242789222" w:history="1">
             <w:r>
               <w:rPr>
                 <w:rStyle w:val="Hyperlink"/>
@@ -645,7 +645,7 @@
               <w:rPr>
                 <w:noProof/>
               </w:rPr>
-              <w:instrText xml:space="preserve"> PAGEREF _Toc242788702 \h </w:instrText>
+              <w:instrText xml:space="preserve"> PAGEREF _Toc242789222 \h </w:instrText>
             </w:r>
             <w:r>
               <w:rPr>
@@ -687,7 +687,7 @@
               <w14:ligatures w14:val="standardContextual"/>
             </w:rPr>
           </w:pPr>
-          <w:hyperlink w:anchor="_Toc242788703" w:history="1">
+          <w:hyperlink w:anchor="_Toc242789223" w:history="1">
             <w:r>
               <w:rPr>
                 <w:rStyle w:val="Hyperlink"/>
@@ -711,7 +711,7 @@
               <w:rPr>
                 <w:noProof/>
               </w:rPr>
-              <w:instrText xml:space="preserve"> PAGEREF _Toc242788703 \h </w:instrText>
+              <w:instrText xml:space="preserve"> PAGEREF _Toc242789223 \h </w:instrText>
             </w:r>
             <w:r>
               <w:rPr>
@@ -753,7 +753,7 @@
               <w14:ligatures w14:val="standardContextual"/>
             </w:rPr>
           </w:pPr>
-          <w:hyperlink w:anchor="_Toc242788704" w:history="1">
+          <w:hyperlink w:anchor="_Toc242789224" w:history="1">
             <w:r>
               <w:rPr>
                 <w:rStyle w:val="Hyperlink"/>
@@ -777,7 +777,7 @@
               <w:rPr>
                 <w:noProof/>
               </w:rPr>
-              <w:instrText xml:space="preserve"> PAGEREF _Toc242788704 \h </w:instrText>
+              <w:instrText xml:space="preserve"> PAGEREF _Toc242789224 \h </w:instrText>
             </w:r>
             <w:r>
               <w:rPr>
@@ -819,7 +819,7 @@
               <w14:ligatures w14:val="standardContextual"/>
             </w:rPr>
           </w:pPr>
-          <w:hyperlink w:anchor="_Toc242788705" w:history="1">
+          <w:hyperlink w:anchor="_Toc242789225" w:history="1">
             <w:r>
               <w:rPr>
                 <w:rStyle w:val="Hyperlink"/>
@@ -843,7 +843,7 @@
               <w:rPr>
                 <w:noProof/>
               </w:rPr>
-              <w:instrText xml:space="preserve"> PAGEREF _Toc242788705 \h </w:instrText>
+              <w:instrText xml:space="preserve"> PAGEREF _Toc242789225 \h </w:instrText>
             </w:r>
             <w:r>
               <w:rPr>
@@ -885,7 +885,7 @@
               <w14:ligatures w14:val="standardContextual"/>
             </w:rPr>
           </w:pPr>
-          <w:hyperlink w:anchor="_Toc242788706" w:history="1">
+          <w:hyperlink w:anchor="_Toc242789226" w:history="1">
             <w:r>
               <w:rPr>
                 <w:rStyle w:val="Hyperlink"/>
@@ -909,7 +909,7 @@
               <w:rPr>
                 <w:noProof/>
               </w:rPr>
-              <w:instrText xml:space="preserve"> PAGEREF _Toc242788706 \h </w:instrText>
+              <w:instrText xml:space="preserve"> PAGEREF _Toc242789226 \h </w:instrText>
             </w:r>
             <w:r>
               <w:rPr>
@@ -951,7 +951,7 @@
               <w14:ligatures w14:val="standardContextual"/>
             </w:rPr>
           </w:pPr>
-          <w:hyperlink w:anchor="_Toc242788707" w:history="1">
+          <w:hyperlink w:anchor="_Toc242789227" w:history="1">
             <w:r>
               <w:rPr>
                 <w:rStyle w:val="Hyperlink"/>
@@ -975,7 +975,7 @@
               <w:rPr>
                 <w:noProof/>
               </w:rPr>
-              <w:instrText xml:space="preserve"> PAGEREF _Toc242788707 \h </w:instrText>
+              <w:instrText xml:space="preserve"> PAGEREF _Toc242789227 \h </w:instrText>
             </w:r>
             <w:r>
               <w:rPr>
@@ -992,7 +992,7 @@
               <w:rPr>
                 <w:noProof/>
               </w:rPr>
-              <w:t>16</w:t>
+              <w:t>17</w:t>
             </w:r>
             <w:r>
               <w:rPr>
@@ -1017,7 +1017,7 @@
               <w14:ligatures w14:val="standardContextual"/>
             </w:rPr>
           </w:pPr>
-          <w:hyperlink w:anchor="_Toc242788708" w:history="1">
+          <w:hyperlink w:anchor="_Toc242789228" w:history="1">
             <w:r>
               <w:rPr>
                 <w:rStyle w:val="Hyperlink"/>
@@ -1041,7 +1041,7 @@
               <w:rPr>
                 <w:noProof/>
               </w:rPr>
-              <w:instrText xml:space="preserve"> PAGEREF _Toc242788708 \h </w:instrText>
+              <w:instrText xml:space="preserve"> PAGEREF _Toc242789228 \h </w:instrText>
             </w:r>
             <w:r>
               <w:rPr>
@@ -1058,7 +1058,7 @@
               <w:rPr>
                 <w:noProof/>
               </w:rPr>
-              <w:t>16</w:t>
+              <w:t>17</w:t>
             </w:r>
             <w:r>
               <w:rPr>
@@ -1083,7 +1083,7 @@
               <w14:ligatures w14:val="standardContextual"/>
             </w:rPr>
           </w:pPr>
-          <w:hyperlink w:anchor="_Toc242788709" w:history="1">
+          <w:hyperlink w:anchor="_Toc242789229" w:history="1">
             <w:r>
               <w:rPr>
                 <w:rStyle w:val="Hyperlink"/>
@@ -1107,7 +1107,7 @@
               <w:rPr>
                 <w:noProof/>
               </w:rPr>
-              <w:instrText xml:space="preserve"> PAGEREF _Toc242788709 \h </w:instrText>
+              <w:instrText xml:space="preserve"> PAGEREF _Toc242789229 \h </w:instrText>
             </w:r>
             <w:r>
               <w:rPr>
@@ -1124,7 +1124,7 @@
               <w:rPr>
                 <w:noProof/>
               </w:rPr>
-              <w:t>16</w:t>
+              <w:t>17</w:t>
             </w:r>
             <w:r>
               <w:rPr>
@@ -1149,7 +1149,7 @@
               <w14:ligatures w14:val="standardContextual"/>
             </w:rPr>
           </w:pPr>
-          <w:hyperlink w:anchor="_Toc242788710" w:history="1">
+          <w:hyperlink w:anchor="_Toc242789230" w:history="1">
             <w:r>
               <w:rPr>
                 <w:rStyle w:val="Hyperlink"/>
@@ -1173,7 +1173,7 @@
               <w:rPr>
                 <w:noProof/>
               </w:rPr>
-              <w:instrText xml:space="preserve"> PAGEREF _Toc242788710 \h </w:instrText>
+              <w:instrText xml:space="preserve"> PAGEREF _Toc242789230 \h </w:instrText>
             </w:r>
             <w:r>
               <w:rPr>
@@ -1190,7 +1190,7 @@
               <w:rPr>
                 <w:noProof/>
               </w:rPr>
-              <w:t>17</w:t>
+              <w:t>18</w:t>
             </w:r>
             <w:r>
               <w:rPr>
@@ -1215,7 +1215,7 @@
               <w14:ligatures w14:val="standardContextual"/>
             </w:rPr>
           </w:pPr>
-          <w:hyperlink w:anchor="_Toc242788711" w:history="1">
+          <w:hyperlink w:anchor="_Toc242789231" w:history="1">
             <w:r>
               <w:rPr>
                 <w:rStyle w:val="Hyperlink"/>
@@ -1239,7 +1239,7 @@
               <w:rPr>
                 <w:noProof/>
               </w:rPr>
-              <w:instrText xml:space="preserve"> PAGEREF _Toc242788711 \h </w:instrText>
+              <w:instrText xml:space="preserve"> PAGEREF _Toc242789231 \h </w:instrText>
             </w:r>
             <w:r>
               <w:rPr>
@@ -1256,7 +1256,7 @@
               <w:rPr>
                 <w:noProof/>
               </w:rPr>
-              <w:t>18</w:t>
+              <w:t>19</w:t>
             </w:r>
             <w:r>
               <w:rPr>
@@ -1281,7 +1281,7 @@
               <w14:ligatures w14:val="standardContextual"/>
             </w:rPr>
           </w:pPr>
-          <w:hyperlink w:anchor="_Toc242788712" w:history="1">
+          <w:hyperlink w:anchor="_Toc242789232" w:history="1">
             <w:r>
               <w:rPr>
                 <w:rStyle w:val="Hyperlink"/>
@@ -1305,7 +1305,7 @@
               <w:rPr>
                 <w:noProof/>
               </w:rPr>
-              <w:instrText xml:space="preserve"> PAGEREF _Toc242788712 \h </w:instrText>
+              <w:instrText xml:space="preserve"> PAGEREF _Toc242789232 \h </w:instrText>
             </w:r>
             <w:r>
               <w:rPr>
@@ -1322,7 +1322,7 @@
               <w:rPr>
                 <w:noProof/>
               </w:rPr>
-              <w:t>18</w:t>
+              <w:t>19</w:t>
             </w:r>
             <w:r>
               <w:rPr>
@@ -1347,7 +1347,7 @@
               <w14:ligatures w14:val="standardContextual"/>
             </w:rPr>
           </w:pPr>
-          <w:hyperlink w:anchor="_Toc242788713" w:history="1">
+          <w:hyperlink w:anchor="_Toc242789233" w:history="1">
             <w:r>
               <w:rPr>
                 <w:rStyle w:val="Hyperlink"/>
@@ -1371,7 +1371,7 @@
               <w:rPr>
                 <w:noProof/>
               </w:rPr>
-              <w:instrText xml:space="preserve"> PAGEREF _Toc242788713 \h </w:instrText>
+              <w:instrText xml:space="preserve"> PAGEREF _Toc242789233 \h </w:instrText>
             </w:r>
             <w:r>
               <w:rPr>
@@ -1388,7 +1388,7 @@
               <w:rPr>
                 <w:noProof/>
               </w:rPr>
-              <w:t>18</w:t>
+              <w:t>19</w:t>
             </w:r>
             <w:r>
               <w:rPr>
@@ -1413,7 +1413,7 @@
               <w14:ligatures w14:val="standardContextual"/>
             </w:rPr>
           </w:pPr>
-          <w:hyperlink w:anchor="_Toc242788714" w:history="1">
+          <w:hyperlink w:anchor="_Toc242789234" w:history="1">
             <w:r>
               <w:rPr>
                 <w:rStyle w:val="Hyperlink"/>
@@ -1437,7 +1437,7 @@
               <w:rPr>
                 <w:noProof/>
               </w:rPr>
-              <w:instrText xml:space="preserve"> PAGEREF _Toc242788714 \h </w:instrText>
+              <w:instrText xml:space="preserve"> PAGEREF _Toc242789234 \h </w:instrText>
             </w:r>
             <w:r>
               <w:rPr>
@@ -1454,7 +1454,7 @@
               <w:rPr>
                 <w:noProof/>
               </w:rPr>
-              <w:t>19</w:t>
+              <w:t>20</w:t>
             </w:r>
             <w:r>
               <w:rPr>
@@ -1479,7 +1479,7 @@
               <w14:ligatures w14:val="standardContextual"/>
             </w:rPr>
           </w:pPr>
-          <w:hyperlink w:anchor="_Toc242788715" w:history="1">
+          <w:hyperlink w:anchor="_Toc242789235" w:history="1">
             <w:r>
               <w:rPr>
                 <w:rStyle w:val="Hyperlink"/>
@@ -1503,7 +1503,7 @@
               <w:rPr>
                 <w:noProof/>
               </w:rPr>
-              <w:instrText xml:space="preserve"> PAGEREF _Toc242788715 \h </w:instrText>
+              <w:instrText xml:space="preserve"> PAGEREF _Toc242789235 \h </w:instrText>
             </w:r>
             <w:r>
               <w:rPr>
@@ -1520,7 +1520,7 @@
               <w:rPr>
                 <w:noProof/>
               </w:rPr>
-              <w:t>20</w:t>
+              <w:t>21</w:t>
             </w:r>
             <w:r>
               <w:rPr>
@@ -1545,7 +1545,7 @@
               <w14:ligatures w14:val="standardContextual"/>
             </w:rPr>
           </w:pPr>
-          <w:hyperlink w:anchor="_Toc242788716" w:history="1">
+          <w:hyperlink w:anchor="_Toc242789236" w:history="1">
             <w:r>
               <w:rPr>
                 <w:rStyle w:val="Hyperlink"/>
@@ -1569,7 +1569,7 @@
               <w:rPr>
                 <w:noProof/>
               </w:rPr>
-              <w:instrText xml:space="preserve"> PAGEREF _Toc242788716 \h </w:instrText>
+              <w:instrText xml:space="preserve"> PAGEREF _Toc242789236 \h </w:instrText>
             </w:r>
             <w:r>
               <w:rPr>
@@ -1586,7 +1586,7 @@
               <w:rPr>
                 <w:noProof/>
               </w:rPr>
-              <w:t>20</w:t>
+              <w:t>21</w:t>
             </w:r>
             <w:r>
               <w:rPr>
@@ -1611,7 +1611,7 @@
               <w14:ligatures w14:val="standardContextual"/>
             </w:rPr>
           </w:pPr>
-          <w:hyperlink w:anchor="_Toc242788717" w:history="1">
+          <w:hyperlink w:anchor="_Toc242789237" w:history="1">
             <w:r>
               <w:rPr>
                 <w:rStyle w:val="Hyperlink"/>
@@ -1635,7 +1635,7 @@
               <w:rPr>
                 <w:noProof/>
               </w:rPr>
-              <w:instrText xml:space="preserve"> PAGEREF _Toc242788717 \h </w:instrText>
+              <w:instrText xml:space="preserve"> PAGEREF _Toc242789237 \h </w:instrText>
             </w:r>
             <w:r>
               <w:rPr>
@@ -1652,7 +1652,7 @@
               <w:rPr>
                 <w:noProof/>
               </w:rPr>
-              <w:t>21</w:t>
+              <w:t>22</w:t>
             </w:r>
             <w:r>
               <w:rPr>
@@ -1677,7 +1677,7 @@
               <w14:ligatures w14:val="standardContextual"/>
             </w:rPr>
           </w:pPr>
-          <w:hyperlink w:anchor="_Toc242788718" w:history="1">
+          <w:hyperlink w:anchor="_Toc242789238" w:history="1">
             <w:r>
               <w:rPr>
                 <w:rStyle w:val="Hyperlink"/>
@@ -1701,7 +1701,7 @@
               <w:rPr>
                 <w:noProof/>
               </w:rPr>
-              <w:instrText xml:space="preserve"> PAGEREF _Toc242788718 \h </w:instrText>
+              <w:instrText xml:space="preserve"> PAGEREF _Toc242789238 \h </w:instrText>
             </w:r>
             <w:r>
               <w:rPr>
@@ -1718,7 +1718,7 @@
               <w:rPr>
                 <w:noProof/>
               </w:rPr>
-              <w:t>21</w:t>
+              <w:t>22</w:t>
             </w:r>
             <w:r>
               <w:rPr>
@@ -1743,7 +1743,7 @@
               <w14:ligatures w14:val="standardContextual"/>
             </w:rPr>
           </w:pPr>
-          <w:hyperlink w:anchor="_Toc242788719" w:history="1">
+          <w:hyperlink w:anchor="_Toc242789239" w:history="1">
             <w:r>
               <w:rPr>
                 <w:rStyle w:val="Hyperlink"/>
@@ -1767,7 +1767,7 @@
               <w:rPr>
                 <w:noProof/>
               </w:rPr>
-              <w:instrText xml:space="preserve"> PAGEREF _Toc242788719 \h </w:instrText>
+              <w:instrText xml:space="preserve"> PAGEREF _Toc242789239 \h </w:instrText>
             </w:r>
             <w:r>
               <w:rPr>
@@ -1784,7 +1784,7 @@
               <w:rPr>
                 <w:noProof/>
               </w:rPr>
-              <w:t>22</w:t>
+              <w:t>23</w:t>
             </w:r>
             <w:r>
               <w:rPr>
@@ -1809,7 +1809,7 @@
               <w14:ligatures w14:val="standardContextual"/>
             </w:rPr>
           </w:pPr>
-          <w:hyperlink w:anchor="_Toc242788720" w:history="1">
+          <w:hyperlink w:anchor="_Toc242789240" w:history="1">
             <w:r>
               <w:rPr>
                 <w:rStyle w:val="Hyperlink"/>
@@ -1833,7 +1833,7 @@
               <w:rPr>
                 <w:noProof/>
               </w:rPr>
-              <w:instrText xml:space="preserve"> PAGEREF _Toc242788720 \h </w:instrText>
+              <w:instrText xml:space="preserve"> PAGEREF _Toc242789240 \h </w:instrText>
             </w:r>
             <w:r>
               <w:rPr>
@@ -1850,7 +1850,7 @@
               <w:rPr>
                 <w:noProof/>
               </w:rPr>
-              <w:t>23</w:t>
+              <w:t>24</w:t>
             </w:r>
             <w:r>
               <w:rPr>
@@ -1875,7 +1875,7 @@
               <w14:ligatures w14:val="standardContextual"/>
             </w:rPr>
           </w:pPr>
-          <w:hyperlink w:anchor="_Toc242788721" w:history="1">
+          <w:hyperlink w:anchor="_Toc242789241" w:history="1">
             <w:r>
               <w:rPr>
                 <w:rStyle w:val="Hyperlink"/>
@@ -1899,7 +1899,7 @@
               <w:rPr>
                 <w:noProof/>
               </w:rPr>
-              <w:instrText xml:space="preserve"> PAGEREF _Toc242788721 \h </w:instrText>
+              <w:instrText xml:space="preserve"> PAGEREF _Toc242789241 \h </w:instrText>
             </w:r>
             <w:r>
               <w:rPr>
@@ -1916,7 +1916,7 @@
               <w:rPr>
                 <w:noProof/>
               </w:rPr>
-              <w:t>24</w:t>
+              <w:t>25</w:t>
             </w:r>
             <w:r>
               <w:rPr>
@@ -1941,7 +1941,7 @@
               <w14:ligatures w14:val="standardContextual"/>
             </w:rPr>
           </w:pPr>
-          <w:hyperlink w:anchor="_Toc242788722" w:history="1">
+          <w:hyperlink w:anchor="_Toc242789242" w:history="1">
             <w:r>
               <w:rPr>
                 <w:rStyle w:val="Hyperlink"/>
@@ -1965,7 +1965,7 @@
               <w:rPr>
                 <w:noProof/>
               </w:rPr>
-              <w:instrText xml:space="preserve"> PAGEREF _Toc242788722 \h </w:instrText>
+              <w:instrText xml:space="preserve"> PAGEREF _Toc242789242 \h </w:instrText>
             </w:r>
             <w:r>
               <w:rPr>
@@ -1982,7 +1982,7 @@
               <w:rPr>
                 <w:noProof/>
               </w:rPr>
-              <w:t>26</w:t>
+              <w:t>27</w:t>
             </w:r>
             <w:r>
               <w:rPr>
@@ -2007,7 +2007,7 @@
               <w14:ligatures w14:val="standardContextual"/>
             </w:rPr>
           </w:pPr>
-          <w:hyperlink w:anchor="_Toc242788723" w:history="1">
+          <w:hyperlink w:anchor="_Toc242789243" w:history="1">
             <w:r>
               <w:rPr>
                 <w:rStyle w:val="Hyperlink"/>
@@ -2031,7 +2031,7 @@
               <w:rPr>
                 <w:noProof/>
               </w:rPr>
-              <w:instrText xml:space="preserve"> PAGEREF _Toc242788723 \h </w:instrText>
+              <w:instrText xml:space="preserve"> PAGEREF _Toc242789243 \h </w:instrText>
             </w:r>
             <w:r>
               <w:rPr>
@@ -2048,7 +2048,7 @@
               <w:rPr>
                 <w:noProof/>
               </w:rPr>
-              <w:t>27</w:t>
+              <w:t>28</w:t>
             </w:r>
             <w:r>
               <w:rPr>
@@ -2073,7 +2073,7 @@
               <w14:ligatures w14:val="standardContextual"/>
             </w:rPr>
           </w:pPr>
-          <w:hyperlink w:anchor="_Toc242788724" w:history="1">
+          <w:hyperlink w:anchor="_Toc242789244" w:history="1">
             <w:r>
               <w:rPr>
                 <w:rStyle w:val="Hyperlink"/>
@@ -2097,7 +2097,7 @@
               <w:rPr>
                 <w:noProof/>
               </w:rPr>
-              <w:instrText xml:space="preserve"> PAGEREF _Toc242788724 \h </w:instrText>
+              <w:instrText xml:space="preserve"> PAGEREF _Toc242789244 \h </w:instrText>
             </w:r>
             <w:r>
               <w:rPr>
@@ -2114,7 +2114,73 @@
               <w:rPr>
                 <w:noProof/>
               </w:rPr>
-              <w:t>28</w:t>
+              <w:t>29</w:t>
+            </w:r>
+            <w:r>
+              <w:rPr>
+                <w:noProof/>
+              </w:rPr>
+              <w:fldChar w:fldCharType="end"/>
+            </w:r>
+          </w:hyperlink>
+        </w:p>
+        <w:p>
+          <w:pPr>
+            <w:pStyle w:val="TOC2"/>
+            <w:tabs>
+              <w:tab w:val="right" w:leader="dot" w:pos="9350"/>
+            </w:tabs>
+            <w:rPr>
+              <w:rFonts w:asciiTheme="minorHAnsi" w:eastAsiaTheme="minorEastAsia" w:hAnsiTheme="minorHAnsi" w:cstheme="minorBidi"/>
+              <w:noProof/>
+              <w:kern w:val="2"/>
+              <w:sz w:val="24"/>
+              <w:szCs w:val="24"/>
+              <w14:ligatures w14:val="standardContextual"/>
+            </w:rPr>
+          </w:pPr>
+          <w:hyperlink w:anchor="_Toc242789245" w:history="1">
+            <w:r>
+              <w:rPr>
+                <w:rStyle w:val="Hyperlink"/>
+                <w:noProof/>
+              </w:rPr>
+              <w:t>7.10 Marcador (marcador.html)</w:t>
+            </w:r>
+            <w:r>
+              <w:rPr>
+                <w:noProof/>
+              </w:rPr>
+              <w:tab/>
+            </w:r>
+            <w:r>
+              <w:rPr>
+                <w:noProof/>
+              </w:rPr>
+              <w:fldChar w:fldCharType="begin"/>
+            </w:r>
+            <w:r>
+              <w:rPr>
+                <w:noProof/>
+              </w:rPr>
+              <w:instrText xml:space="preserve"> PAGEREF _Toc242789245 \h </w:instrText>
+            </w:r>
+            <w:r>
+              <w:rPr>
+                <w:noProof/>
+              </w:rPr>
+            </w:r>
+            <w:r>
+              <w:rPr>
+                <w:noProof/>
+              </w:rPr>
+              <w:fldChar w:fldCharType="separate"/>
+            </w:r>
+            <w:r>
+              <w:rPr>
+                <w:noProof/>
+              </w:rPr>
+              <w:t>30</w:t>
             </w:r>
             <w:r>
               <w:rPr>
@@ -2139,7 +2205,7 @@
               <w14:ligatures w14:val="standardContextual"/>
             </w:rPr>
           </w:pPr>
-          <w:hyperlink w:anchor="_Toc242788725" w:history="1">
+          <w:hyperlink w:anchor="_Toc242789246" w:history="1">
             <w:r>
               <w:rPr>
                 <w:rStyle w:val="Hyperlink"/>
@@ -2163,7 +2229,7 @@
               <w:rPr>
                 <w:noProof/>
               </w:rPr>
-              <w:instrText xml:space="preserve"> PAGEREF _Toc242788725 \h </w:instrText>
+              <w:instrText xml:space="preserve"> PAGEREF _Toc242789246 \h </w:instrText>
             </w:r>
             <w:r>
               <w:rPr>
@@ -2180,7 +2246,7 @@
               <w:rPr>
                 <w:noProof/>
               </w:rPr>
-              <w:t>30</w:t>
+              <w:t>32</w:t>
             </w:r>
             <w:r>
               <w:rPr>
@@ -2205,7 +2271,7 @@
               <w14:ligatures w14:val="standardContextual"/>
             </w:rPr>
           </w:pPr>
-          <w:hyperlink w:anchor="_Toc242788726" w:history="1">
+          <w:hyperlink w:anchor="_Toc242789247" w:history="1">
             <w:r>
               <w:rPr>
                 <w:rStyle w:val="Hyperlink"/>
@@ -2229,7 +2295,7 @@
               <w:rPr>
                 <w:noProof/>
               </w:rPr>
-              <w:instrText xml:space="preserve"> PAGEREF _Toc242788726 \h </w:instrText>
+              <w:instrText xml:space="preserve"> PAGEREF _Toc242789247 \h </w:instrText>
             </w:r>
             <w:r>
               <w:rPr>
@@ -2246,7 +2312,7 @@
               <w:rPr>
                 <w:noProof/>
               </w:rPr>
-              <w:t>30</w:t>
+              <w:t>32</w:t>
             </w:r>
             <w:r>
               <w:rPr>
@@ -2271,7 +2337,7 @@
               <w14:ligatures w14:val="standardContextual"/>
             </w:rPr>
           </w:pPr>
-          <w:hyperlink w:anchor="_Toc242788727" w:history="1">
+          <w:hyperlink w:anchor="_Toc242789248" w:history="1">
             <w:r>
               <w:rPr>
                 <w:rStyle w:val="Hyperlink"/>
@@ -2295,7 +2361,7 @@
               <w:rPr>
                 <w:noProof/>
               </w:rPr>
-              <w:instrText xml:space="preserve"> PAGEREF _Toc242788727 \h </w:instrText>
+              <w:instrText xml:space="preserve"> PAGEREF _Toc242789248 \h </w:instrText>
             </w:r>
             <w:r>
               <w:rPr>
@@ -2312,7 +2378,7 @@
               <w:rPr>
                 <w:noProof/>
               </w:rPr>
-              <w:t>30</w:t>
+              <w:t>32</w:t>
             </w:r>
             <w:r>
               <w:rPr>
@@ -2337,7 +2403,7 @@
               <w14:ligatures w14:val="standardContextual"/>
             </w:rPr>
           </w:pPr>
-          <w:hyperlink w:anchor="_Toc242788728" w:history="1">
+          <w:hyperlink w:anchor="_Toc242789249" w:history="1">
             <w:r>
               <w:rPr>
                 <w:rStyle w:val="Hyperlink"/>
@@ -2361,7 +2427,7 @@
               <w:rPr>
                 <w:noProof/>
               </w:rPr>
-              <w:instrText xml:space="preserve"> PAGEREF _Toc242788728 \h </w:instrText>
+              <w:instrText xml:space="preserve"> PAGEREF _Toc242789249 \h </w:instrText>
             </w:r>
             <w:r>
               <w:rPr>
@@ -2378,7 +2444,7 @@
               <w:rPr>
                 <w:noProof/>
               </w:rPr>
-              <w:t>30</w:t>
+              <w:t>32</w:t>
             </w:r>
             <w:r>
               <w:rPr>
@@ -2403,7 +2469,7 @@
               <w14:ligatures w14:val="standardContextual"/>
             </w:rPr>
           </w:pPr>
-          <w:hyperlink w:anchor="_Toc242788729" w:history="1">
+          <w:hyperlink w:anchor="_Toc242789250" w:history="1">
             <w:r>
               <w:rPr>
                 <w:rStyle w:val="Hyperlink"/>
@@ -2427,7 +2493,7 @@
               <w:rPr>
                 <w:noProof/>
               </w:rPr>
-              <w:instrText xml:space="preserve"> PAGEREF _Toc242788729 \h </w:instrText>
+              <w:instrText xml:space="preserve"> PAGEREF _Toc242789250 \h </w:instrText>
             </w:r>
             <w:r>
               <w:rPr>
@@ -2444,7 +2510,7 @@
               <w:rPr>
                 <w:noProof/>
               </w:rPr>
-              <w:t>31</w:t>
+              <w:t>33</w:t>
             </w:r>
             <w:r>
               <w:rPr>
@@ -2469,7 +2535,7 @@
               <w14:ligatures w14:val="standardContextual"/>
             </w:rPr>
           </w:pPr>
-          <w:hyperlink w:anchor="_Toc242788730" w:history="1">
+          <w:hyperlink w:anchor="_Toc242789251" w:history="1">
             <w:r>
               <w:rPr>
                 <w:rStyle w:val="Hyperlink"/>
@@ -2493,7 +2559,7 @@
               <w:rPr>
                 <w:noProof/>
               </w:rPr>
-              <w:instrText xml:space="preserve"> PAGEREF _Toc242788730 \h </w:instrText>
+              <w:instrText xml:space="preserve"> PAGEREF _Toc242789251 \h </w:instrText>
             </w:r>
             <w:r>
               <w:rPr>
@@ -2510,7 +2576,7 @@
               <w:rPr>
                 <w:noProof/>
               </w:rPr>
-              <w:t>31</w:t>
+              <w:t>33</w:t>
             </w:r>
             <w:r>
               <w:rPr>
@@ -2535,7 +2601,7 @@
               <w14:ligatures w14:val="standardContextual"/>
             </w:rPr>
           </w:pPr>
-          <w:hyperlink w:anchor="_Toc242788731" w:history="1">
+          <w:hyperlink w:anchor="_Toc242789252" w:history="1">
             <w:r>
               <w:rPr>
                 <w:rStyle w:val="Hyperlink"/>
@@ -2559,7 +2625,7 @@
               <w:rPr>
                 <w:noProof/>
               </w:rPr>
-              <w:instrText xml:space="preserve"> PAGEREF _Toc242788731 \h </w:instrText>
+              <w:instrText xml:space="preserve"> PAGEREF _Toc242789252 \h </w:instrText>
             </w:r>
             <w:r>
               <w:rPr>
@@ -2576,7 +2642,7 @@
               <w:rPr>
                 <w:noProof/>
               </w:rPr>
-              <w:t>32</w:t>
+              <w:t>34</w:t>
             </w:r>
             <w:r>
               <w:rPr>
@@ -2601,7 +2667,7 @@
               <w14:ligatures w14:val="standardContextual"/>
             </w:rPr>
           </w:pPr>
-          <w:hyperlink w:anchor="_Toc242788732" w:history="1">
+          <w:hyperlink w:anchor="_Toc242789253" w:history="1">
             <w:r>
               <w:rPr>
                 <w:rStyle w:val="Hyperlink"/>
@@ -2625,7 +2691,7 @@
               <w:rPr>
                 <w:noProof/>
               </w:rPr>
-              <w:instrText xml:space="preserve"> PAGEREF _Toc242788732 \h </w:instrText>
+              <w:instrText xml:space="preserve"> PAGEREF _Toc242789253 \h </w:instrText>
             </w:r>
             <w:r>
               <w:rPr>
@@ -2642,7 +2708,7 @@
               <w:rPr>
                 <w:noProof/>
               </w:rPr>
-              <w:t>32</w:t>
+              <w:t>34</w:t>
             </w:r>
             <w:r>
               <w:rPr>
@@ -2667,7 +2733,7 @@
               <w14:ligatures w14:val="standardContextual"/>
             </w:rPr>
           </w:pPr>
-          <w:hyperlink w:anchor="_Toc242788733" w:history="1">
+          <w:hyperlink w:anchor="_Toc242789254" w:history="1">
             <w:r>
               <w:rPr>
                 <w:rStyle w:val="Hyperlink"/>
@@ -2691,7 +2757,7 @@
               <w:rPr>
                 <w:noProof/>
               </w:rPr>
-              <w:instrText xml:space="preserve"> PAGEREF _Toc242788733 \h </w:instrText>
+              <w:instrText xml:space="preserve"> PAGEREF _Toc242789254 \h </w:instrText>
             </w:r>
             <w:r>
               <w:rPr>
@@ -2708,7 +2774,7 @@
               <w:rPr>
                 <w:noProof/>
               </w:rPr>
-              <w:t>34</w:t>
+              <w:t>36</w:t>
             </w:r>
             <w:r>
               <w:rPr>
@@ -2733,7 +2799,7 @@
               <w14:ligatures w14:val="standardContextual"/>
             </w:rPr>
           </w:pPr>
-          <w:hyperlink w:anchor="_Toc242788734" w:history="1">
+          <w:hyperlink w:anchor="_Toc242789255" w:history="1">
             <w:r>
               <w:rPr>
                 <w:rStyle w:val="Hyperlink"/>
@@ -2757,7 +2823,7 @@
               <w:rPr>
                 <w:noProof/>
               </w:rPr>
-              <w:instrText xml:space="preserve"> PAGEREF _Toc242788734 \h </w:instrText>
+              <w:instrText xml:space="preserve"> PAGEREF _Toc242789255 \h </w:instrText>
             </w:r>
             <w:r>
               <w:rPr>
@@ -2774,7 +2840,7 @@
               <w:rPr>
                 <w:noProof/>
               </w:rPr>
-              <w:t>34</w:t>
+              <w:t>36</w:t>
             </w:r>
             <w:r>
               <w:rPr>
@@ -2799,7 +2865,7 @@
               <w14:ligatures w14:val="standardContextual"/>
             </w:rPr>
           </w:pPr>
-          <w:hyperlink w:anchor="_Toc242788735" w:history="1">
+          <w:hyperlink w:anchor="_Toc242789256" w:history="1">
             <w:r>
               <w:rPr>
                 <w:rStyle w:val="Hyperlink"/>
@@ -2823,7 +2889,7 @@
               <w:rPr>
                 <w:noProof/>
               </w:rPr>
-              <w:instrText xml:space="preserve"> PAGEREF _Toc242788735 \h </w:instrText>
+              <w:instrText xml:space="preserve"> PAGEREF _Toc242789256 \h </w:instrText>
             </w:r>
             <w:r>
               <w:rPr>
@@ -2840,7 +2906,7 @@
               <w:rPr>
                 <w:noProof/>
               </w:rPr>
-              <w:t>35</w:t>
+              <w:t>38</w:t>
             </w:r>
             <w:r>
               <w:rPr>
@@ -2865,7 +2931,7 @@
               <w14:ligatures w14:val="standardContextual"/>
             </w:rPr>
           </w:pPr>
-          <w:hyperlink w:anchor="_Toc242788736" w:history="1">
+          <w:hyperlink w:anchor="_Toc242789257" w:history="1">
             <w:r>
               <w:rPr>
                 <w:rStyle w:val="Hyperlink"/>
@@ -2889,7 +2955,7 @@
               <w:rPr>
                 <w:noProof/>
               </w:rPr>
-              <w:instrText xml:space="preserve"> PAGEREF _Toc242788736 \h </w:instrText>
+              <w:instrText xml:space="preserve"> PAGEREF _Toc242789257 \h </w:instrText>
             </w:r>
             <w:r>
               <w:rPr>
@@ -2906,7 +2972,7 @@
               <w:rPr>
                 <w:noProof/>
               </w:rPr>
-              <w:t>35</w:t>
+              <w:t>38</w:t>
             </w:r>
             <w:r>
               <w:rPr>
@@ -2931,7 +2997,7 @@
               <w14:ligatures w14:val="standardContextual"/>
             </w:rPr>
           </w:pPr>
-          <w:hyperlink w:anchor="_Toc242788737" w:history="1">
+          <w:hyperlink w:anchor="_Toc242789258" w:history="1">
             <w:r>
               <w:rPr>
                 <w:rStyle w:val="Hyperlink"/>
@@ -2955,7 +3021,7 @@
               <w:rPr>
                 <w:noProof/>
               </w:rPr>
-              <w:instrText xml:space="preserve"> PAGEREF _Toc242788737 \h </w:instrText>
+              <w:instrText xml:space="preserve"> PAGEREF _Toc242789258 \h </w:instrText>
             </w:r>
             <w:r>
               <w:rPr>
@@ -2972,7 +3038,7 @@
               <w:rPr>
                 <w:noProof/>
               </w:rPr>
-              <w:t>35</w:t>
+              <w:t>38</w:t>
             </w:r>
             <w:r>
               <w:rPr>
@@ -2997,7 +3063,7 @@
               <w14:ligatures w14:val="standardContextual"/>
             </w:rPr>
           </w:pPr>
-          <w:hyperlink w:anchor="_Toc242788738" w:history="1">
+          <w:hyperlink w:anchor="_Toc242789259" w:history="1">
             <w:r>
               <w:rPr>
                 <w:rStyle w:val="Hyperlink"/>
@@ -3021,7 +3087,7 @@
               <w:rPr>
                 <w:noProof/>
               </w:rPr>
-              <w:instrText xml:space="preserve"> PAGEREF _Toc242788738 \h </w:instrText>
+              <w:instrText xml:space="preserve"> PAGEREF _Toc242789259 \h </w:instrText>
             </w:r>
             <w:r>
               <w:rPr>
@@ -3038,7 +3104,7 @@
               <w:rPr>
                 <w:noProof/>
               </w:rPr>
-              <w:t>35</w:t>
+              <w:t>38</w:t>
             </w:r>
             <w:r>
               <w:rPr>
@@ -3063,7 +3129,7 @@
               <w14:ligatures w14:val="standardContextual"/>
             </w:rPr>
           </w:pPr>
-          <w:hyperlink w:anchor="_Toc242788739" w:history="1">
+          <w:hyperlink w:anchor="_Toc242789260" w:history="1">
             <w:r>
               <w:rPr>
                 <w:rStyle w:val="Hyperlink"/>
@@ -3087,7 +3153,7 @@
               <w:rPr>
                 <w:noProof/>
               </w:rPr>
-              <w:instrText xml:space="preserve"> PAGEREF _Toc242788739 \h </w:instrText>
+              <w:instrText xml:space="preserve"> PAGEREF _Toc242789260 \h </w:instrText>
             </w:r>
             <w:r>
               <w:rPr>
@@ -3104,7 +3170,7 @@
               <w:rPr>
                 <w:noProof/>
               </w:rPr>
-              <w:t>36</w:t>
+              <w:t>39</w:t>
             </w:r>
             <w:r>
               <w:rPr>
@@ -3129,7 +3195,7 @@
               <w14:ligatures w14:val="standardContextual"/>
             </w:rPr>
           </w:pPr>
-          <w:hyperlink w:anchor="_Toc242788740" w:history="1">
+          <w:hyperlink w:anchor="_Toc242789261" w:history="1">
             <w:r>
               <w:rPr>
                 <w:rStyle w:val="Hyperlink"/>
@@ -3153,7 +3219,7 @@
               <w:rPr>
                 <w:noProof/>
               </w:rPr>
-              <w:instrText xml:space="preserve"> PAGEREF _Toc242788740 \h </w:instrText>
+              <w:instrText xml:space="preserve"> PAGEREF _Toc242789261 \h </w:instrText>
             </w:r>
             <w:r>
               <w:rPr>
@@ -3170,7 +3236,7 @@
               <w:rPr>
                 <w:noProof/>
               </w:rPr>
-              <w:t>36</w:t>
+              <w:t>39</w:t>
             </w:r>
             <w:r>
               <w:rPr>
@@ -3195,7 +3261,7 @@
               <w14:ligatures w14:val="standardContextual"/>
             </w:rPr>
           </w:pPr>
-          <w:hyperlink w:anchor="_Toc242788741" w:history="1">
+          <w:hyperlink w:anchor="_Toc242789262" w:history="1">
             <w:r>
               <w:rPr>
                 <w:rStyle w:val="Hyperlink"/>
@@ -3219,7 +3285,7 @@
               <w:rPr>
                 <w:noProof/>
               </w:rPr>
-              <w:instrText xml:space="preserve"> PAGEREF _Toc242788741 \h </w:instrText>
+              <w:instrText xml:space="preserve"> PAGEREF _Toc242789262 \h </w:instrText>
             </w:r>
             <w:r>
               <w:rPr>
@@ -3236,7 +3302,7 @@
               <w:rPr>
                 <w:noProof/>
               </w:rPr>
-              <w:t>36</w:t>
+              <w:t>39</w:t>
             </w:r>
             <w:r>
               <w:rPr>
@@ -3261,7 +3327,7 @@
               <w14:ligatures w14:val="standardContextual"/>
             </w:rPr>
           </w:pPr>
-          <w:hyperlink w:anchor="_Toc242788742" w:history="1">
+          <w:hyperlink w:anchor="_Toc242789263" w:history="1">
             <w:r>
               <w:rPr>
                 <w:rStyle w:val="Hyperlink"/>
@@ -3285,7 +3351,7 @@
               <w:rPr>
                 <w:noProof/>
               </w:rPr>
-              <w:instrText xml:space="preserve"> PAGEREF _Toc242788742 \h </w:instrText>
+              <w:instrText xml:space="preserve"> PAGEREF _Toc242789263 \h </w:instrText>
             </w:r>
             <w:r>
               <w:rPr>
@@ -3302,7 +3368,7 @@
               <w:rPr>
                 <w:noProof/>
               </w:rPr>
-              <w:t>38</w:t>
+              <w:t>41</w:t>
             </w:r>
             <w:r>
               <w:rPr>
@@ -3327,7 +3393,7 @@
               <w14:ligatures w14:val="standardContextual"/>
             </w:rPr>
           </w:pPr>
-          <w:hyperlink w:anchor="_Toc242788743" w:history="1">
+          <w:hyperlink w:anchor="_Toc242789264" w:history="1">
             <w:r>
               <w:rPr>
                 <w:rStyle w:val="Hyperlink"/>
@@ -3351,7 +3417,7 @@
               <w:rPr>
                 <w:noProof/>
               </w:rPr>
-              <w:instrText xml:space="preserve"> PAGEREF _Toc242788743 \h </w:instrText>
+              <w:instrText xml:space="preserve"> PAGEREF _Toc242789264 \h </w:instrText>
             </w:r>
             <w:r>
               <w:rPr>
@@ -3368,7 +3434,7 @@
               <w:rPr>
                 <w:noProof/>
               </w:rPr>
-              <w:t>38</w:t>
+              <w:t>41</w:t>
             </w:r>
             <w:r>
               <w:rPr>
@@ -3393,7 +3459,7 @@
               <w14:ligatures w14:val="standardContextual"/>
             </w:rPr>
           </w:pPr>
-          <w:hyperlink w:anchor="_Toc242788744" w:history="1">
+          <w:hyperlink w:anchor="_Toc242789265" w:history="1">
             <w:r>
               <w:rPr>
                 <w:rStyle w:val="Hyperlink"/>
@@ -3417,7 +3483,7 @@
               <w:rPr>
                 <w:noProof/>
               </w:rPr>
-              <w:instrText xml:space="preserve"> PAGEREF _Toc242788744 \h </w:instrText>
+              <w:instrText xml:space="preserve"> PAGEREF _Toc242789265 \h </w:instrText>
             </w:r>
             <w:r>
               <w:rPr>
@@ -3434,7 +3500,7 @@
               <w:rPr>
                 <w:noProof/>
               </w:rPr>
-              <w:t>38</w:t>
+              <w:t>41</w:t>
             </w:r>
             <w:r>
               <w:rPr>
@@ -3459,7 +3525,7 @@
               <w14:ligatures w14:val="standardContextual"/>
             </w:rPr>
           </w:pPr>
-          <w:hyperlink w:anchor="_Toc242788745" w:history="1">
+          <w:hyperlink w:anchor="_Toc242789266" w:history="1">
             <w:r>
               <w:rPr>
                 <w:rStyle w:val="Hyperlink"/>
@@ -3483,7 +3549,7 @@
               <w:rPr>
                 <w:noProof/>
               </w:rPr>
-              <w:instrText xml:space="preserve"> PAGEREF _Toc242788745 \h </w:instrText>
+              <w:instrText xml:space="preserve"> PAGEREF _Toc242789266 \h </w:instrText>
             </w:r>
             <w:r>
               <w:rPr>
@@ -3500,7 +3566,7 @@
               <w:rPr>
                 <w:noProof/>
               </w:rPr>
-              <w:t>40</w:t>
+              <w:t>43</w:t>
             </w:r>
             <w:r>
               <w:rPr>
@@ -3525,7 +3591,7 @@
               <w14:ligatures w14:val="standardContextual"/>
             </w:rPr>
           </w:pPr>
-          <w:hyperlink w:anchor="_Toc242788746" w:history="1">
+          <w:hyperlink w:anchor="_Toc242789267" w:history="1">
             <w:r>
               <w:rPr>
                 <w:rStyle w:val="Hyperlink"/>
@@ -3549,7 +3615,7 @@
               <w:rPr>
                 <w:noProof/>
               </w:rPr>
-              <w:instrText xml:space="preserve"> PAGEREF _Toc242788746 \h </w:instrText>
+              <w:instrText xml:space="preserve"> PAGEREF _Toc242789267 \h </w:instrText>
             </w:r>
             <w:r>
               <w:rPr>
@@ -3566,7 +3632,7 @@
               <w:rPr>
                 <w:noProof/>
               </w:rPr>
-              <w:t>41</w:t>
+              <w:t>44</w:t>
             </w:r>
             <w:r>
               <w:rPr>
@@ -3591,7 +3657,7 @@
               <w14:ligatures w14:val="standardContextual"/>
             </w:rPr>
           </w:pPr>
-          <w:hyperlink w:anchor="_Toc242788747" w:history="1">
+          <w:hyperlink w:anchor="_Toc242789268" w:history="1">
             <w:r>
               <w:rPr>
                 <w:rStyle w:val="Hyperlink"/>
@@ -3615,7 +3681,7 @@
               <w:rPr>
                 <w:noProof/>
               </w:rPr>
-              <w:instrText xml:space="preserve"> PAGEREF _Toc242788747 \h </w:instrText>
+              <w:instrText xml:space="preserve"> PAGEREF _Toc242789268 \h </w:instrText>
             </w:r>
             <w:r>
               <w:rPr>
@@ -3632,7 +3698,7 @@
               <w:rPr>
                 <w:noProof/>
               </w:rPr>
-              <w:t>43</w:t>
+              <w:t>46</w:t>
             </w:r>
             <w:r>
               <w:rPr>
@@ -3657,7 +3723,7 @@
               <w14:ligatures w14:val="standardContextual"/>
             </w:rPr>
           </w:pPr>
-          <w:hyperlink w:anchor="_Toc242788748" w:history="1">
+          <w:hyperlink w:anchor="_Toc242789269" w:history="1">
             <w:r>
               <w:rPr>
                 <w:rStyle w:val="Hyperlink"/>
@@ -3681,7 +3747,7 @@
               <w:rPr>
                 <w:noProof/>
               </w:rPr>
-              <w:instrText xml:space="preserve"> PAGEREF _Toc242788748 \h </w:instrText>
+              <w:instrText xml:space="preserve"> PAGEREF _Toc242789269 \h </w:instrText>
             </w:r>
             <w:r>
               <w:rPr>
@@ -3698,7 +3764,7 @@
               <w:rPr>
                 <w:noProof/>
               </w:rPr>
-              <w:t>43</w:t>
+              <w:t>46</w:t>
             </w:r>
             <w:r>
               <w:rPr>
@@ -3723,7 +3789,7 @@
               <w14:ligatures w14:val="standardContextual"/>
             </w:rPr>
           </w:pPr>
-          <w:hyperlink w:anchor="_Toc242788749" w:history="1">
+          <w:hyperlink w:anchor="_Toc242789270" w:history="1">
             <w:r>
               <w:rPr>
                 <w:rStyle w:val="Hyperlink"/>
@@ -3747,7 +3813,7 @@
               <w:rPr>
                 <w:noProof/>
               </w:rPr>
-              <w:instrText xml:space="preserve"> PAGEREF _Toc242788749 \h </w:instrText>
+              <w:instrText xml:space="preserve"> PAGEREF _Toc242789270 \h </w:instrText>
             </w:r>
             <w:r>
               <w:rPr>
@@ -3764,7 +3830,7 @@
               <w:rPr>
                 <w:noProof/>
               </w:rPr>
-              <w:t>43</w:t>
+              <w:t>46</w:t>
             </w:r>
             <w:r>
               <w:rPr>
@@ -3789,7 +3855,7 @@
               <w14:ligatures w14:val="standardContextual"/>
             </w:rPr>
           </w:pPr>
-          <w:hyperlink w:anchor="_Toc242788750" w:history="1">
+          <w:hyperlink w:anchor="_Toc242789271" w:history="1">
             <w:r>
               <w:rPr>
                 <w:rStyle w:val="Hyperlink"/>
@@ -3813,7 +3879,7 @@
               <w:rPr>
                 <w:noProof/>
               </w:rPr>
-              <w:instrText xml:space="preserve"> PAGEREF _Toc242788750 \h </w:instrText>
+              <w:instrText xml:space="preserve"> PAGEREF _Toc242789271 \h </w:instrText>
             </w:r>
             <w:r>
               <w:rPr>
@@ -3830,7 +3896,7 @@
               <w:rPr>
                 <w:noProof/>
               </w:rPr>
-              <w:t>44</w:t>
+              <w:t>47</w:t>
             </w:r>
             <w:r>
               <w:rPr>
@@ -3855,7 +3921,7 @@
               <w14:ligatures w14:val="standardContextual"/>
             </w:rPr>
           </w:pPr>
-          <w:hyperlink w:anchor="_Toc242788751" w:history="1">
+          <w:hyperlink w:anchor="_Toc242789272" w:history="1">
             <w:r>
               <w:rPr>
                 <w:rStyle w:val="Hyperlink"/>
@@ -3879,7 +3945,7 @@
               <w:rPr>
                 <w:noProof/>
               </w:rPr>
-              <w:instrText xml:space="preserve"> PAGEREF _Toc242788751 \h </w:instrText>
+              <w:instrText xml:space="preserve"> PAGEREF _Toc242789272 \h </w:instrText>
             </w:r>
             <w:r>
               <w:rPr>
@@ -3896,7 +3962,7 @@
               <w:rPr>
                 <w:noProof/>
               </w:rPr>
-              <w:t>45</w:t>
+              <w:t>48</w:t>
             </w:r>
             <w:r>
               <w:rPr>
@@ -3921,7 +3987,7 @@
               <w14:ligatures w14:val="standardContextual"/>
             </w:rPr>
           </w:pPr>
-          <w:hyperlink w:anchor="_Toc242788752" w:history="1">
+          <w:hyperlink w:anchor="_Toc242789273" w:history="1">
             <w:r>
               <w:rPr>
                 <w:rStyle w:val="Hyperlink"/>
@@ -3945,7 +4011,7 @@
               <w:rPr>
                 <w:noProof/>
               </w:rPr>
-              <w:instrText xml:space="preserve"> PAGEREF _Toc242788752 \h </w:instrText>
+              <w:instrText xml:space="preserve"> PAGEREF _Toc242789273 \h </w:instrText>
             </w:r>
             <w:r>
               <w:rPr>
@@ -3962,7 +4028,7 @@
               <w:rPr>
                 <w:noProof/>
               </w:rPr>
-              <w:t>45</w:t>
+              <w:t>48</w:t>
             </w:r>
             <w:r>
               <w:rPr>
@@ -3987,7 +4053,7 @@
               <w14:ligatures w14:val="standardContextual"/>
             </w:rPr>
           </w:pPr>
-          <w:hyperlink w:anchor="_Toc242788753" w:history="1">
+          <w:hyperlink w:anchor="_Toc242789274" w:history="1">
             <w:r>
               <w:rPr>
                 <w:rStyle w:val="Hyperlink"/>
@@ -4011,7 +4077,7 @@
               <w:rPr>
                 <w:noProof/>
               </w:rPr>
-              <w:instrText xml:space="preserve"> PAGEREF _Toc242788753 \h </w:instrText>
+              <w:instrText xml:space="preserve"> PAGEREF _Toc242789274 \h </w:instrText>
             </w:r>
             <w:r>
               <w:rPr>
@@ -4028,7 +4094,7 @@
               <w:rPr>
                 <w:noProof/>
               </w:rPr>
-              <w:t>46</w:t>
+              <w:t>49</w:t>
             </w:r>
             <w:r>
               <w:rPr>
@@ -4053,7 +4119,7 @@
               <w14:ligatures w14:val="standardContextual"/>
             </w:rPr>
           </w:pPr>
-          <w:hyperlink w:anchor="_Toc242788754" w:history="1">
+          <w:hyperlink w:anchor="_Toc242789275" w:history="1">
             <w:r>
               <w:rPr>
                 <w:rStyle w:val="Hyperlink"/>
@@ -4077,7 +4143,7 @@
               <w:rPr>
                 <w:noProof/>
               </w:rPr>
-              <w:instrText xml:space="preserve"> PAGEREF _Toc242788754 \h </w:instrText>
+              <w:instrText xml:space="preserve"> PAGEREF _Toc242789275 \h </w:instrText>
             </w:r>
             <w:r>
               <w:rPr>
@@ -4094,7 +4160,7 @@
               <w:rPr>
                 <w:noProof/>
               </w:rPr>
-              <w:t>47</w:t>
+              <w:t>50</w:t>
             </w:r>
             <w:r>
               <w:rPr>
@@ -4119,7 +4185,7 @@
               <w14:ligatures w14:val="standardContextual"/>
             </w:rPr>
           </w:pPr>
-          <w:hyperlink w:anchor="_Toc242788755" w:history="1">
+          <w:hyperlink w:anchor="_Toc242789276" w:history="1">
             <w:r>
               <w:rPr>
                 <w:rStyle w:val="Hyperlink"/>
@@ -4143,7 +4209,7 @@
               <w:rPr>
                 <w:noProof/>
               </w:rPr>
-              <w:instrText xml:space="preserve"> PAGEREF _Toc242788755 \h </w:instrText>
+              <w:instrText xml:space="preserve"> PAGEREF _Toc242789276 \h </w:instrText>
             </w:r>
             <w:r>
               <w:rPr>
@@ -4160,7 +4226,7 @@
               <w:rPr>
                 <w:noProof/>
               </w:rPr>
-              <w:t>47</w:t>
+              <w:t>50</w:t>
             </w:r>
             <w:r>
               <w:rPr>
@@ -4185,7 +4251,7 @@
               <w14:ligatures w14:val="standardContextual"/>
             </w:rPr>
           </w:pPr>
-          <w:hyperlink w:anchor="_Toc242788756" w:history="1">
+          <w:hyperlink w:anchor="_Toc242789277" w:history="1">
             <w:r>
               <w:rPr>
                 <w:rStyle w:val="Hyperlink"/>
@@ -4209,7 +4275,7 @@
               <w:rPr>
                 <w:noProof/>
               </w:rPr>
-              <w:instrText xml:space="preserve"> PAGEREF _Toc242788756 \h </w:instrText>
+              <w:instrText xml:space="preserve"> PAGEREF _Toc242789277 \h </w:instrText>
             </w:r>
             <w:r>
               <w:rPr>
@@ -4226,7 +4292,7 @@
               <w:rPr>
                 <w:noProof/>
               </w:rPr>
-              <w:t>47</w:t>
+              <w:t>50</w:t>
             </w:r>
             <w:r>
               <w:rPr>
@@ -4251,7 +4317,7 @@
               <w14:ligatures w14:val="standardContextual"/>
             </w:rPr>
           </w:pPr>
-          <w:hyperlink w:anchor="_Toc242788757" w:history="1">
+          <w:hyperlink w:anchor="_Toc242789278" w:history="1">
             <w:r>
               <w:rPr>
                 <w:rStyle w:val="Hyperlink"/>
@@ -4275,7 +4341,7 @@
               <w:rPr>
                 <w:noProof/>
               </w:rPr>
-              <w:instrText xml:space="preserve"> PAGEREF _Toc242788757 \h </w:instrText>
+              <w:instrText xml:space="preserve"> PAGEREF _Toc242789278 \h </w:instrText>
             </w:r>
             <w:r>
               <w:rPr>
@@ -4292,7 +4358,7 @@
               <w:rPr>
                 <w:noProof/>
               </w:rPr>
-              <w:t>49</w:t>
+              <w:t>52</w:t>
             </w:r>
             <w:r>
               <w:rPr>
@@ -4317,7 +4383,7 @@
               <w14:ligatures w14:val="standardContextual"/>
             </w:rPr>
           </w:pPr>
-          <w:hyperlink w:anchor="_Toc242788758" w:history="1">
+          <w:hyperlink w:anchor="_Toc242789279" w:history="1">
             <w:r>
               <w:rPr>
                 <w:rStyle w:val="Hyperlink"/>
@@ -4341,7 +4407,7 @@
               <w:rPr>
                 <w:noProof/>
               </w:rPr>
-              <w:instrText xml:space="preserve"> PAGEREF _Toc242788758 \h </w:instrText>
+              <w:instrText xml:space="preserve"> PAGEREF _Toc242789279 \h </w:instrText>
             </w:r>
             <w:r>
               <w:rPr>
@@ -4358,7 +4424,7 @@
               <w:rPr>
                 <w:noProof/>
               </w:rPr>
-              <w:t>49</w:t>
+              <w:t>52</w:t>
             </w:r>
             <w:r>
               <w:rPr>
@@ -4383,7 +4449,7 @@
               <w14:ligatures w14:val="standardContextual"/>
             </w:rPr>
           </w:pPr>
-          <w:hyperlink w:anchor="_Toc242788759" w:history="1">
+          <w:hyperlink w:anchor="_Toc242789280" w:history="1">
             <w:r>
               <w:rPr>
                 <w:rStyle w:val="Hyperlink"/>
@@ -4407,7 +4473,7 @@
               <w:rPr>
                 <w:noProof/>
               </w:rPr>
-              <w:instrText xml:space="preserve"> PAGEREF _Toc242788759 \h </w:instrText>
+              <w:instrText xml:space="preserve"> PAGEREF _Toc242789280 \h </w:instrText>
             </w:r>
             <w:r>
               <w:rPr>
@@ -4424,7 +4490,7 @@
               <w:rPr>
                 <w:noProof/>
               </w:rPr>
-              <w:t>49</w:t>
+              <w:t>52</w:t>
             </w:r>
             <w:r>
               <w:rPr>
@@ -4449,7 +4515,7 @@
               <w14:ligatures w14:val="standardContextual"/>
             </w:rPr>
           </w:pPr>
-          <w:hyperlink w:anchor="_Toc242788760" w:history="1">
+          <w:hyperlink w:anchor="_Toc242789281" w:history="1">
             <w:r>
               <w:rPr>
                 <w:rStyle w:val="Hyperlink"/>
@@ -4473,7 +4539,7 @@
               <w:rPr>
                 <w:noProof/>
               </w:rPr>
-              <w:instrText xml:space="preserve"> PAGEREF _Toc242788760 \h </w:instrText>
+              <w:instrText xml:space="preserve"> PAGEREF _Toc242789281 \h </w:instrText>
             </w:r>
             <w:r>
               <w:rPr>
@@ -4490,7 +4556,7 @@
               <w:rPr>
                 <w:noProof/>
               </w:rPr>
-              <w:t>49</w:t>
+              <w:t>52</w:t>
             </w:r>
             <w:r>
               <w:rPr>
@@ -4515,7 +4581,7 @@
               <w14:ligatures w14:val="standardContextual"/>
             </w:rPr>
           </w:pPr>
-          <w:hyperlink w:anchor="_Toc242788761" w:history="1">
+          <w:hyperlink w:anchor="_Toc242789282" w:history="1">
             <w:r>
               <w:rPr>
                 <w:rStyle w:val="Hyperlink"/>
@@ -4539,7 +4605,7 @@
               <w:rPr>
                 <w:noProof/>
               </w:rPr>
-              <w:instrText xml:space="preserve"> PAGEREF _Toc242788761 \h </w:instrText>
+              <w:instrText xml:space="preserve"> PAGEREF _Toc242789282 \h </w:instrText>
             </w:r>
             <w:r>
               <w:rPr>
@@ -4556,7 +4622,7 @@
               <w:rPr>
                 <w:noProof/>
               </w:rPr>
-              <w:t>50</w:t>
+              <w:t>53</w:t>
             </w:r>
             <w:r>
               <w:rPr>
@@ -4581,7 +4647,7 @@
               <w14:ligatures w14:val="standardContextual"/>
             </w:rPr>
           </w:pPr>
-          <w:hyperlink w:anchor="_Toc242788762" w:history="1">
+          <w:hyperlink w:anchor="_Toc242789283" w:history="1">
             <w:r>
               <w:rPr>
                 <w:rStyle w:val="Hyperlink"/>
@@ -4605,7 +4671,7 @@
               <w:rPr>
                 <w:noProof/>
               </w:rPr>
-              <w:instrText xml:space="preserve"> PAGEREF _Toc242788762 \h </w:instrText>
+              <w:instrText xml:space="preserve"> PAGEREF _Toc242789283 \h </w:instrText>
             </w:r>
             <w:r>
               <w:rPr>
@@ -4622,7 +4688,7 @@
               <w:rPr>
                 <w:noProof/>
               </w:rPr>
-              <w:t>52</w:t>
+              <w:t>55</w:t>
             </w:r>
             <w:r>
               <w:rPr>
@@ -4634,7 +4700,6 @@
         </w:p>
         <w:p>
           <w:r>
-            <w:lastRenderedPageBreak/>
             <w:fldChar w:fldCharType="end"/>
           </w:r>
         </w:p>
@@ -4657,7 +4722,7 @@
         <w:pStyle w:val="Heading1"/>
         <w:pageBreakBefore/>
       </w:pPr>
-      <w:bookmarkStart w:id="0" w:name="_Toc242788695"/>
+      <w:bookmarkStart w:id="0" w:name="_Toc242789215"/>
       <w:r>
         <w:lastRenderedPageBreak/>
         <w:t>1. Resumen ejecutivo</w:t>
@@ -4669,7 +4734,7 @@
         <w:spacing w:after="120"/>
       </w:pPr>
       <w:r>
-        <w:t>Este proyecto es un conjunto de herramientas para transmisiones en vivo de TikTok, inspirado en TikFinity. Permite poner en pantalla, mediante OBS Studio o TikTok LIVE Studio, elementos que reaccionan a lo que hace el público durante el LIVE: una ruleta que gira cuando alguien envía un regalo (con una segunda ruleta premium), barras de meta que se llenan con likes, seguidores, compartidos o monedas, alertas animadas, una carrera de regalos entre integrantes con reloj por rondas , una batalla de regalos (tira y afloja) entre dos equipos, un jefe del LIVE (un reto cooperativo en el que el chat le quita vida a un jefe antes de que se acabe el tiempo), un reloj de subathon al que el público le suma tiempo, una bóveda dorada que revela un premio secreto al llegar a una meta de monedas y un trono con el rey del LIVE, quien más ha dado. Además incluye un panel para ver la actividad del LIVE en tiempo real y un catálogo de regalos con su código (ID).</w:t>
+        <w:t>Este proyecto es un conjunto de herramientas para transmisiones en vivo de TikTok, inspirado en TikFinity. Permite poner en pantalla, mediante OBS Studio o TikTok LIVE Studio, elementos que reaccionan a lo que hace el público durante el LIVE: una ruleta que gira cuando alguien envía un regalo (con una segunda ruleta premium), barras de meta que se llenan con likes, seguidores, compartidos o monedas, alertas animadas, una carrera de regalos entre integrantes con reloj por rondas, un marcador sencillo de puntajes por integrante, una batalla de regalos (tira y afloja) entre dos equipos, un jefe del LIVE (un reto cooperativo en el que el chat le quita vida a un jefe antes de que se acabe el tiempo), un reloj de subathon al que el público le suma tiempo, una bóveda dorada que revela un premio secreto al llegar a una meta de monedas y un trono con el rey del LIVE, quien más ha dado. Además incluye un panel para ver la actividad del LIVE en tiempo real y un catálogo de regalos con su código (ID).</w:t>
       </w:r>
     </w:p>
     <w:p>
@@ -4711,7 +4776,7 @@
         <w:pStyle w:val="Heading1"/>
         <w:pageBreakBefore/>
       </w:pPr>
-      <w:bookmarkStart w:id="1" w:name="_Toc242788696"/>
+      <w:bookmarkStart w:id="1" w:name="_Toc242789216"/>
       <w:r>
         <w:lastRenderedPageBreak/>
         <w:t>2. Conceptos y glosario</w:t>
@@ -4909,7 +4974,7 @@
               <w:spacing w:after="20"/>
             </w:pPr>
             <w:r>
-              <w:t>Una página web pequeña (por ejemplo ruleta.html) con fondo transparente que se pone encima de la cámara en OBS. En el proyecto hay nueve: ruleta (normal y premium), meta, alertas, carrera de regalos, batalla de regalos, jefe del LIVE, subathon, bóveda dorada y trono.</w:t>
+              <w:t>Una página web pequeña (por ejemplo ruleta.html) con fondo transparente que se pone encima de la cámara en OBS. En el proyecto hay diez: ruleta (normal y premium), meta, alertas y siete juegos (carrera de regalos, marcador, batalla de regalos, jefe del LIVE, subathon, bóveda dorada y trono).</w:t>
             </w:r>
           </w:p>
         </w:tc>
@@ -6146,7 +6211,7 @@
         <w:pStyle w:val="Heading1"/>
         <w:pageBreakBefore/>
       </w:pPr>
-      <w:bookmarkStart w:id="2" w:name="_Toc242788697"/>
+      <w:bookmarkStart w:id="2" w:name="_Toc242789217"/>
       <w:r>
         <w:lastRenderedPageBreak/>
         <w:t>3. Arquitectura general</w:t>
@@ -6157,7 +6222,7 @@
       <w:pPr>
         <w:pStyle w:val="Heading2"/>
       </w:pPr>
-      <w:bookmarkStart w:id="3" w:name="_Toc242788698"/>
+      <w:bookmarkStart w:id="3" w:name="_Toc242789218"/>
       <w:r>
         <w:t>3.1 Piezas del sistema</w:t>
       </w:r>
@@ -6718,7 +6783,7 @@
               <w:spacing w:after="20"/>
             </w:pPr>
             <w:r>
-              <w:t>Widgets (ruleta.html, meta.html, alertas.html y los juegos: carrera, batalla, jefe, subathon, boveda y trono)</w:t>
+              <w:t>Widgets (ruleta.html, meta.html, alertas.html y los juegos: carrera, marcador, batalla, jefe, subathon, boveda y trono)</w:t>
             </w:r>
           </w:p>
         </w:tc>
@@ -6783,7 +6848,7 @@
       <w:pPr>
         <w:pStyle w:val="Heading2"/>
       </w:pPr>
-      <w:bookmarkStart w:id="4" w:name="_Toc242788699"/>
+      <w:bookmarkStart w:id="4" w:name="_Toc242789219"/>
       <w:r>
         <w:t>3.2 Flujo de datos</w:t>
       </w:r>
@@ -7078,7 +7143,7 @@
         <w:pStyle w:val="Heading1"/>
         <w:pageBreakBefore/>
       </w:pPr>
-      <w:bookmarkStart w:id="5" w:name="_Toc242788700"/>
+      <w:bookmarkStart w:id="5" w:name="_Toc242789220"/>
       <w:r>
         <w:lastRenderedPageBreak/>
         <w:t>4. Servicios externos</w:t>
@@ -7089,7 +7154,7 @@
       <w:pPr>
         <w:pStyle w:val="Heading2"/>
       </w:pPr>
-      <w:bookmarkStart w:id="6" w:name="_Toc242788701"/>
+      <w:bookmarkStart w:id="6" w:name="_Toc242789221"/>
       <w:r>
         <w:t>4.1 TikTok LIVE</w:t>
       </w:r>
@@ -7848,7 +7913,7 @@
       <w:pPr>
         <w:pStyle w:val="Heading2"/>
       </w:pPr>
-      <w:bookmarkStart w:id="7" w:name="_Toc242788702"/>
+      <w:bookmarkStart w:id="7" w:name="_Toc242789222"/>
       <w:r>
         <w:t>4.2 Euler Stream</w:t>
       </w:r>
@@ -9140,7 +9205,7 @@
       <w:pPr>
         <w:pStyle w:val="Heading2"/>
       </w:pPr>
-      <w:bookmarkStart w:id="8" w:name="_Toc242788703"/>
+      <w:bookmarkStart w:id="8" w:name="_Toc242789223"/>
       <w:r>
         <w:t>4.3 GitHub, GitHub Actions y GitHub Pages</w:t>
       </w:r>
@@ -9344,7 +9409,7 @@
       <w:pPr>
         <w:pStyle w:val="Heading2"/>
       </w:pPr>
-      <w:bookmarkStart w:id="9" w:name="_Toc242788704"/>
+      <w:bookmarkStart w:id="9" w:name="_Toc242789224"/>
       <w:r>
         <w:t>4.4 Google Fonts</w:t>
       </w:r>
@@ -9374,7 +9439,7 @@
       <w:pPr>
         <w:pStyle w:val="Heading2"/>
       </w:pPr>
-      <w:bookmarkStart w:id="10" w:name="_Toc242788705"/>
+      <w:bookmarkStart w:id="10" w:name="_Toc242789225"/>
       <w:r>
         <w:lastRenderedPageBreak/>
         <w:t>4.5 Supabase (cambios en vivo)</w:t>
@@ -9630,7 +9695,7 @@
         <w:pStyle w:val="Heading1"/>
         <w:pageBreakBefore/>
       </w:pPr>
-      <w:bookmarkStart w:id="11" w:name="_Toc242788706"/>
+      <w:bookmarkStart w:id="11" w:name="_Toc242789226"/>
       <w:r>
         <w:lastRenderedPageBreak/>
         <w:t>5. Estructura de archivos</w:t>
@@ -9807,6 +9872,17 @@
         <w:ind w:left="200" w:right="200"/>
       </w:pPr>
       <w:r>
+        <w:t>│   ├── marcador.html               widget marcador (puntajes por integrante)</w:t>
+      </w:r>
+    </w:p>
+    <w:p>
+      <w:pPr>
+        <w:keepLines/>
+        <w:shd w:val="clear" w:color="auto" w:fill="F2F2F2"/>
+        <w:spacing w:line="260" w:lineRule="auto"/>
+        <w:ind w:left="200" w:right="200"/>
+      </w:pPr>
+      <w:r>
         <w:rPr>
           <w:rFonts w:ascii="Consolas" w:eastAsia="Consolas" w:hAnsi="Consolas" w:cs="Consolas"/>
           <w:sz w:val="18"/>
@@ -9871,7 +9947,7 @@
           <w:sz w:val="18"/>
           <w:szCs w:val="18"/>
         </w:rPr>
-        <w:t>│   │   └── widgets/ruleta.css · meta.css · alertas.css · carrera.css · batalla.css · jefe.css · subathon.css · boveda.css · trono.css</w:t>
+        <w:t>│   │   └── widgets/ruleta.css · meta.css · alertas.css · carrera.css · marcador.css · batalla.css · jefe.css · subathon.css · boveda.css · trono.css</w:t>
       </w:r>
     </w:p>
     <w:p>
@@ -9946,7 +10022,7 @@
           <w:sz w:val="18"/>
           <w:szCs w:val="18"/>
         </w:rPr>
-        <w:t>│       ├── reloj.js                reloj por rondas (hora de término): carrera y jefe</w:t>
+        <w:t>│       ├── reloj.js                reloj por rondas (hora de término): carrera, marcador y jefe</w:t>
       </w:r>
     </w:p>
     <w:p>
@@ -9962,7 +10038,7 @@
           <w:sz w:val="18"/>
           <w:szCs w:val="18"/>
         </w:rPr>
-        <w:t>│       ├── widgets/ruleta.js · meta.js · alertas.js · carrera.js · batalla.js · jefe.js · subathon.js · boveda.js · trono.js</w:t>
+        <w:t>│       ├── widgets/ruleta.js · meta.js · alertas.js · carrera.js · marcador.js · batalla.js · jefe.js · subathon.js · boveda.js · trono.js</w:t>
       </w:r>
     </w:p>
     <w:p>
@@ -10101,7 +10177,7 @@
           <w:sz w:val="18"/>
           <w:szCs w:val="18"/>
         </w:rPr>
-        <w:t>│           └── vistas/ruleta.js · metas.js · alertas.js · carrera.js · batalla.js · jefe.js · subathon.js · boveda.js · trono.js · actividad.js · regalos.js · conexion.js</w:t>
+        <w:t>│           └── vistas/ruleta.js · metas.js · alertas.js · carrera.js · marcador.js · batalla.js · jefe.js · subathon.js · boveda.js · trono.js · actividad.js · regalos.js · conexion.js</w:t>
       </w:r>
     </w:p>
     <w:p>
@@ -10234,6 +10310,7 @@
           <w:b/>
           <w:bCs/>
         </w:rPr>
+        <w:lastRenderedPageBreak/>
         <w:t>Sin estilos dentro del JavaScript</w:t>
       </w:r>
       <w:r>
@@ -10255,7 +10332,7 @@
         <w:pStyle w:val="Heading1"/>
         <w:pageBreakBefore/>
       </w:pPr>
-      <w:bookmarkStart w:id="12" w:name="_Toc242788707"/>
+      <w:bookmarkStart w:id="12" w:name="_Toc242789227"/>
       <w:r>
         <w:lastRenderedPageBreak/>
         <w:t>6. Frontend: el módulo compartido comun.js</w:t>
@@ -10283,7 +10360,7 @@
       <w:pPr>
         <w:pStyle w:val="Heading2"/>
       </w:pPr>
-      <w:bookmarkStart w:id="13" w:name="_Toc242788708"/>
+      <w:bookmarkStart w:id="13" w:name="_Toc242789228"/>
       <w:r>
         <w:t>6.1 Configuración en la URL</w:t>
       </w:r>
@@ -10754,7 +10831,7 @@
       <w:pPr>
         <w:pStyle w:val="Heading2"/>
       </w:pPr>
-      <w:bookmarkStart w:id="14" w:name="_Toc242788709"/>
+      <w:bookmarkStart w:id="14" w:name="_Toc242789229"/>
       <w:r>
         <w:t>6.2 Eventos normalizados</w:t>
       </w:r>
@@ -11540,7 +11617,7 @@
       <w:pPr>
         <w:pStyle w:val="Heading2"/>
       </w:pPr>
-      <w:bookmarkStart w:id="15" w:name="_Toc242788710"/>
+      <w:bookmarkStart w:id="15" w:name="_Toc242789230"/>
       <w:r>
         <w:t>6.3 Rastreador de regalos (combos y regalos sueltos)</w:t>
       </w:r>
@@ -12270,7 +12347,7 @@
       <w:pPr>
         <w:pStyle w:val="Heading2"/>
       </w:pPr>
-      <w:bookmarkStart w:id="16" w:name="_Toc242788711"/>
+      <w:bookmarkStart w:id="16" w:name="_Toc242789231"/>
       <w:r>
         <w:t>6.4 Conexión con TikTok (conectarTikTok)</w:t>
       </w:r>
@@ -12391,7 +12468,7 @@
       <w:pPr>
         <w:pStyle w:val="Heading2"/>
       </w:pPr>
-      <w:bookmarkStart w:id="17" w:name="_Toc242788712"/>
+      <w:bookmarkStart w:id="17" w:name="_Toc242789232"/>
       <w:r>
         <w:t>6.5 Arranque de widgets (iniciarWidget)</w:t>
       </w:r>
@@ -12617,7 +12694,7 @@
       <w:pPr>
         <w:pStyle w:val="Heading2"/>
       </w:pPr>
-      <w:bookmarkStart w:id="18" w:name="_Toc242788713"/>
+      <w:bookmarkStart w:id="18" w:name="_Toc242789233"/>
       <w:r>
         <w:t>6.6 Utilidades</w:t>
       </w:r>
@@ -12683,7 +12760,7 @@
       <w:pPr>
         <w:pStyle w:val="Heading2"/>
       </w:pPr>
-      <w:bookmarkStart w:id="19" w:name="_Toc242788714"/>
+      <w:bookmarkStart w:id="19" w:name="_Toc242789234"/>
       <w:r>
         <w:lastRenderedPageBreak/>
         <w:t>6.7 Cambios en vivo (nube.js)</w:t>
@@ -12763,7 +12840,7 @@
         <w:pStyle w:val="Heading1"/>
         <w:pageBreakBefore/>
       </w:pPr>
-      <w:bookmarkStart w:id="20" w:name="_Toc242788715"/>
+      <w:bookmarkStart w:id="20" w:name="_Toc242789235"/>
       <w:r>
         <w:lastRenderedPageBreak/>
         <w:t>7. Frontend: los widgets</w:t>
@@ -12806,7 +12883,7 @@
       <w:pPr>
         <w:pStyle w:val="Heading2"/>
       </w:pPr>
-      <w:bookmarkStart w:id="21" w:name="_Toc242788716"/>
+      <w:bookmarkStart w:id="21" w:name="_Toc242789236"/>
       <w:r>
         <w:t>7.1 Ruleta de regalos (ruleta.html)</w:t>
       </w:r>
@@ -13901,7 +13978,7 @@
       <w:pPr>
         <w:pStyle w:val="Heading2"/>
       </w:pPr>
-      <w:bookmarkStart w:id="22" w:name="_Toc242788717"/>
+      <w:bookmarkStart w:id="22" w:name="_Toc242789237"/>
       <w:r>
         <w:t>7.2 Meta (meta.html)</w:t>
       </w:r>
@@ -14511,7 +14588,7 @@
       <w:pPr>
         <w:pStyle w:val="Heading2"/>
       </w:pPr>
-      <w:bookmarkStart w:id="23" w:name="_Toc242788718"/>
+      <w:bookmarkStart w:id="23" w:name="_Toc242789238"/>
       <w:r>
         <w:t>7.3 Alertas (alertas.html)</w:t>
       </w:r>
@@ -14878,7 +14955,7 @@
       <w:pPr>
         <w:pStyle w:val="Heading2"/>
       </w:pPr>
-      <w:bookmarkStart w:id="24" w:name="_Toc242788719"/>
+      <w:bookmarkStart w:id="24" w:name="_Toc242789239"/>
       <w:r>
         <w:t>7.4 Carrera de regalos (carrera.html)</w:t>
       </w:r>
@@ -15812,7 +15889,7 @@
         <w:spacing w:after="120"/>
       </w:pPr>
       <w:r>
-        <w:t>El reloj no cuenta segundos: guarda la hora en que termina la ronda. Así el panel y OBS muestran lo mismo aunque el cambio tarde un momento en llegar por Supabase, y el widget puede recargarse sin perder la cuenta. js/reloj.js lo usan el panel y los widgets de la carrera y del jefe del LIVE:</w:t>
+        <w:t>El reloj no cuenta segundos: guarda la hora en que termina la ronda. Así el panel y OBS muestran lo mismo aunque el cambio tarde un momento en llegar por Supabase, y el widget puede recargarse sin perder la cuenta. js/reloj.js lo usan el panel y los widgets de la carrera, del marcador y del jefe del LIVE:</w:t>
       </w:r>
     </w:p>
     <w:tbl>
@@ -16244,7 +16321,7 @@
       <w:pPr>
         <w:pStyle w:val="Heading2"/>
       </w:pPr>
-      <w:bookmarkStart w:id="25" w:name="_Toc242788720"/>
+      <w:bookmarkStart w:id="25" w:name="_Toc242789240"/>
       <w:r>
         <w:t>7.5 Batalla de regalos (batalla.html)</w:t>
       </w:r>
@@ -16900,7 +16977,7 @@
       <w:pPr>
         <w:pStyle w:val="Heading2"/>
       </w:pPr>
-      <w:bookmarkStart w:id="26" w:name="_Toc242788721"/>
+      <w:bookmarkStart w:id="26" w:name="_Toc242789241"/>
       <w:r>
         <w:t>7.6 Jefe del LIVE (jefe.html)</w:t>
       </w:r>
@@ -18036,7 +18113,7 @@
       <w:pPr>
         <w:pStyle w:val="Heading2"/>
       </w:pPr>
-      <w:bookmarkStart w:id="27" w:name="_Toc242788722"/>
+      <w:bookmarkStart w:id="27" w:name="_Toc242789242"/>
       <w:r>
         <w:lastRenderedPageBreak/>
         <w:t>7.7 Subathon (subathon.html)</w:t>
@@ -19196,7 +19273,7 @@
       <w:pPr>
         <w:pStyle w:val="Heading2"/>
       </w:pPr>
-      <w:bookmarkStart w:id="28" w:name="_Toc242788723"/>
+      <w:bookmarkStart w:id="28" w:name="_Toc242789243"/>
       <w:r>
         <w:t>7.8 Bóveda dorada (boveda.html)</w:t>
       </w:r>
@@ -20135,7 +20212,7 @@
       <w:pPr>
         <w:pStyle w:val="Heading2"/>
       </w:pPr>
-      <w:bookmarkStart w:id="29" w:name="_Toc242788724"/>
+      <w:bookmarkStart w:id="29" w:name="_Toc242789244"/>
       <w:r>
         <w:t>7.9 Trono (trono.html)</w:t>
       </w:r>
@@ -21028,25 +21105,816 @@
     </w:p>
     <w:p>
       <w:pPr>
+        <w:pStyle w:val="Heading2"/>
+      </w:pPr>
+      <w:bookmarkStart w:id="30" w:name="_Toc242789245"/>
+      <w:r>
+        <w:t>7.10 Marcador (marcador.html)</w:t>
+      </w:r>
+      <w:bookmarkEnd w:id="30"/>
+    </w:p>
+    <w:p>
+      <w:pPr>
+        <w:spacing w:after="120"/>
+      </w:pPr>
+      <w:r>
+        <w:t>Una versión sencilla de la carrera de regalos: de 1 a 6 integrantes, cada uno con su regalo, y cada regalo suma a su puntaje. No hay barras ni metas: el puntaje solo crece hasta que se reinicia la ronda. Fuente de OBS de 1920 × 400, arriba de la escena.</w:t>
+      </w:r>
+    </w:p>
+    <w:p>
+      <w:pPr>
+        <w:pStyle w:val="Heading3"/>
+      </w:pPr>
+      <w:r>
+        <w:t>Estructura</w:t>
+      </w:r>
+    </w:p>
+    <w:p>
+      <w:pPr>
+        <w:spacing w:after="120"/>
+      </w:pPr>
+      <w:r>
+        <w:t>Dos secciones, una encima de la otra. Arriba, el reloj (</w:t>
+      </w:r>
+      <w:r>
+        <w:rPr>
+          <w:rFonts w:ascii="Consolas" w:eastAsia="Consolas" w:hAnsi="Consolas" w:cs="Consolas"/>
+          <w:color w:val="7A1F33"/>
+          <w:sz w:val="19"/>
+          <w:szCs w:val="19"/>
+        </w:rPr>
+        <w:t>#reloj</w:t>
+      </w:r>
+      <w:r>
+        <w:t>) en una píldora de cristal pequeña, más discreta que los puntajes, con el título opcional y el estado (“En pausa”, “Final”). Abajo, la fila de integrantes (</w:t>
+      </w:r>
+      <w:r>
+        <w:rPr>
+          <w:rFonts w:ascii="Consolas" w:eastAsia="Consolas" w:hAnsi="Consolas" w:cs="Consolas"/>
+          <w:color w:val="7A1F33"/>
+          <w:sz w:val="19"/>
+          <w:szCs w:val="19"/>
+        </w:rPr>
+        <w:t>#fila</w:t>
+      </w:r>
+      <w:r>
+        <w:t xml:space="preserve">, flexbox centrado). Cada tarjeta (clases </w:t>
+      </w:r>
+      <w:r>
+        <w:rPr>
+          <w:rFonts w:ascii="Consolas" w:eastAsia="Consolas" w:hAnsi="Consolas" w:cs="Consolas"/>
+          <w:color w:val="7A1F33"/>
+          <w:sz w:val="19"/>
+          <w:szCs w:val="19"/>
+        </w:rPr>
+        <w:t>.cristal</w:t>
+      </w:r>
+      <w:r>
+        <w:t xml:space="preserve"> y </w:t>
+      </w:r>
+      <w:r>
+        <w:rPr>
+          <w:rFonts w:ascii="Consolas" w:eastAsia="Consolas" w:hAnsi="Consolas" w:cs="Consolas"/>
+          <w:color w:val="7A1F33"/>
+          <w:sz w:val="19"/>
+          <w:szCs w:val="19"/>
+        </w:rPr>
+        <w:t>.filo-oro</w:t>
+      </w:r>
+      <w:r>
+        <w:t xml:space="preserve">) apila el nombre en mayúsculas espaciadas, el ícono del regalo pequeño y el puntaje en grande con letras de oro metálico. </w:t>
+      </w:r>
+      <w:r>
+        <w:lastRenderedPageBreak/>
+        <w:t xml:space="preserve">Un filo fino de color arriba de la tarjeta muestra el color propio del integrante (si no tiene, el acento del estilo). Las medidas usan </w:t>
+      </w:r>
+      <w:r>
+        <w:rPr>
+          <w:rFonts w:ascii="Consolas" w:eastAsia="Consolas" w:hAnsi="Consolas" w:cs="Consolas"/>
+          <w:color w:val="7A1F33"/>
+          <w:sz w:val="19"/>
+          <w:szCs w:val="19"/>
+        </w:rPr>
+        <w:t>--u</w:t>
+      </w:r>
+      <w:r>
+        <w:t xml:space="preserve"> (el menor entre 1 % del ancho y 4,5 % del alto), así cabe en cualquier tamaño de fuente.</w:t>
+      </w:r>
+    </w:p>
+    <w:p>
+      <w:pPr>
+        <w:pStyle w:val="Heading3"/>
+      </w:pPr>
+      <w:r>
+        <w:t>Configuración</w:t>
+      </w:r>
+    </w:p>
+    <w:tbl>
+      <w:tblPr>
+        <w:tblW w:w="9360" w:type="dxa"/>
+        <w:tblBorders>
+          <w:top w:val="single" w:sz="4" w:space="0" w:color="auto"/>
+          <w:left w:val="single" w:sz="4" w:space="0" w:color="auto"/>
+          <w:bottom w:val="single" w:sz="4" w:space="0" w:color="auto"/>
+          <w:right w:val="single" w:sz="4" w:space="0" w:color="auto"/>
+          <w:insideH w:val="single" w:sz="4" w:space="0" w:color="auto"/>
+          <w:insideV w:val="single" w:sz="4" w:space="0" w:color="auto"/>
+        </w:tblBorders>
+        <w:tblLook w:val="04A0" w:firstRow="1" w:lastRow="0" w:firstColumn="1" w:lastColumn="0" w:noHBand="0" w:noVBand="1"/>
+      </w:tblPr>
+      <w:tblGrid>
+        <w:gridCol w:w="1497"/>
+        <w:gridCol w:w="7863"/>
+      </w:tblGrid>
+      <w:tr>
+        <w:trPr>
+          <w:tblHeader/>
+        </w:trPr>
+        <w:tc>
+          <w:tcPr>
+            <w:tcW w:w="1497" w:type="dxa"/>
+            <w:tcBorders>
+              <w:top w:val="single" w:sz="4" w:space="0" w:color="BFBFBF"/>
+              <w:left w:val="single" w:sz="4" w:space="0" w:color="BFBFBF"/>
+              <w:bottom w:val="single" w:sz="4" w:space="0" w:color="BFBFBF"/>
+              <w:right w:val="single" w:sz="4" w:space="0" w:color="BFBFBF"/>
+            </w:tcBorders>
+            <w:shd w:val="clear" w:color="auto" w:fill="1F4E79"/>
+            <w:tcMar>
+              <w:top w:w="60" w:type="dxa"/>
+              <w:left w:w="100" w:type="dxa"/>
+              <w:bottom w:w="60" w:type="dxa"/>
+              <w:right w:w="100" w:type="dxa"/>
+            </w:tcMar>
+          </w:tcPr>
+          <w:p>
+            <w:pPr>
+              <w:spacing w:after="20"/>
+            </w:pPr>
+            <w:r>
+              <w:rPr>
+                <w:b/>
+                <w:bCs/>
+                <w:color w:val="FFFFFF"/>
+              </w:rPr>
+              <w:t>Clave</w:t>
+            </w:r>
+          </w:p>
+        </w:tc>
+        <w:tc>
+          <w:tcPr>
+            <w:tcW w:w="7863" w:type="dxa"/>
+            <w:tcBorders>
+              <w:top w:val="single" w:sz="4" w:space="0" w:color="BFBFBF"/>
+              <w:left w:val="single" w:sz="4" w:space="0" w:color="BFBFBF"/>
+              <w:bottom w:val="single" w:sz="4" w:space="0" w:color="BFBFBF"/>
+              <w:right w:val="single" w:sz="4" w:space="0" w:color="BFBFBF"/>
+            </w:tcBorders>
+            <w:shd w:val="clear" w:color="auto" w:fill="1F4E79"/>
+            <w:tcMar>
+              <w:top w:w="60" w:type="dxa"/>
+              <w:left w:w="100" w:type="dxa"/>
+              <w:bottom w:w="60" w:type="dxa"/>
+              <w:right w:w="100" w:type="dxa"/>
+            </w:tcMar>
+          </w:tcPr>
+          <w:p>
+            <w:pPr>
+              <w:spacing w:after="20"/>
+            </w:pPr>
+            <w:r>
+              <w:rPr>
+                <w:b/>
+                <w:bCs/>
+                <w:color w:val="FFFFFF"/>
+              </w:rPr>
+              <w:t>Significado</w:t>
+            </w:r>
+          </w:p>
+        </w:tc>
+      </w:tr>
+      <w:tr>
+        <w:tc>
+          <w:tcPr>
+            <w:tcW w:w="1497" w:type="dxa"/>
+            <w:tcBorders>
+              <w:top w:val="single" w:sz="4" w:space="0" w:color="BFBFBF"/>
+              <w:left w:val="single" w:sz="4" w:space="0" w:color="BFBFBF"/>
+              <w:bottom w:val="single" w:sz="4" w:space="0" w:color="BFBFBF"/>
+              <w:right w:val="single" w:sz="4" w:space="0" w:color="BFBFBF"/>
+            </w:tcBorders>
+            <w:tcMar>
+              <w:top w:w="60" w:type="dxa"/>
+              <w:left w:w="100" w:type="dxa"/>
+              <w:bottom w:w="60" w:type="dxa"/>
+              <w:right w:w="100" w:type="dxa"/>
+            </w:tcMar>
+          </w:tcPr>
+          <w:p>
+            <w:pPr>
+              <w:spacing w:after="20"/>
+            </w:pPr>
+            <w:r>
+              <w:rPr>
+                <w:rFonts w:ascii="Consolas" w:eastAsia="Consolas" w:hAnsi="Consolas" w:cs="Consolas"/>
+                <w:color w:val="7A1F33"/>
+                <w:sz w:val="19"/>
+                <w:szCs w:val="19"/>
+              </w:rPr>
+              <w:t>u, k, w</w:t>
+            </w:r>
+          </w:p>
+        </w:tc>
+        <w:tc>
+          <w:tcPr>
+            <w:tcW w:w="7863" w:type="dxa"/>
+            <w:tcBorders>
+              <w:top w:val="single" w:sz="4" w:space="0" w:color="BFBFBF"/>
+              <w:left w:val="single" w:sz="4" w:space="0" w:color="BFBFBF"/>
+              <w:bottom w:val="single" w:sz="4" w:space="0" w:color="BFBFBF"/>
+              <w:right w:val="single" w:sz="4" w:space="0" w:color="BFBFBF"/>
+            </w:tcBorders>
+            <w:tcMar>
+              <w:top w:w="60" w:type="dxa"/>
+              <w:left w:w="100" w:type="dxa"/>
+              <w:bottom w:w="60" w:type="dxa"/>
+              <w:right w:w="100" w:type="dxa"/>
+            </w:tcMar>
+          </w:tcPr>
+          <w:p>
+            <w:pPr>
+              <w:spacing w:after="20"/>
+            </w:pPr>
+            <w:r>
+              <w:t>Usuario de TikTok, API key e identificador del widget (van siempre en la URL)</w:t>
+            </w:r>
+          </w:p>
+        </w:tc>
+      </w:tr>
+      <w:tr>
+        <w:tc>
+          <w:tcPr>
+            <w:tcW w:w="1497" w:type="dxa"/>
+            <w:tcBorders>
+              <w:top w:val="single" w:sz="4" w:space="0" w:color="BFBFBF"/>
+              <w:left w:val="single" w:sz="4" w:space="0" w:color="BFBFBF"/>
+              <w:bottom w:val="single" w:sz="4" w:space="0" w:color="BFBFBF"/>
+              <w:right w:val="single" w:sz="4" w:space="0" w:color="BFBFBF"/>
+            </w:tcBorders>
+            <w:tcMar>
+              <w:top w:w="60" w:type="dxa"/>
+              <w:left w:w="100" w:type="dxa"/>
+              <w:bottom w:w="60" w:type="dxa"/>
+              <w:right w:w="100" w:type="dxa"/>
+            </w:tcMar>
+          </w:tcPr>
+          <w:p>
+            <w:pPr>
+              <w:spacing w:after="20"/>
+            </w:pPr>
+            <w:r>
+              <w:rPr>
+                <w:rFonts w:ascii="Consolas" w:eastAsia="Consolas" w:hAnsi="Consolas" w:cs="Consolas"/>
+                <w:color w:val="7A1F33"/>
+                <w:sz w:val="19"/>
+                <w:szCs w:val="19"/>
+              </w:rPr>
+              <w:t>ti</w:t>
+            </w:r>
+          </w:p>
+        </w:tc>
+        <w:tc>
+          <w:tcPr>
+            <w:tcW w:w="7863" w:type="dxa"/>
+            <w:tcBorders>
+              <w:top w:val="single" w:sz="4" w:space="0" w:color="BFBFBF"/>
+              <w:left w:val="single" w:sz="4" w:space="0" w:color="BFBFBF"/>
+              <w:bottom w:val="single" w:sz="4" w:space="0" w:color="BFBFBF"/>
+              <w:right w:val="single" w:sz="4" w:space="0" w:color="BFBFBF"/>
+            </w:tcBorders>
+            <w:tcMar>
+              <w:top w:w="60" w:type="dxa"/>
+              <w:left w:w="100" w:type="dxa"/>
+              <w:bottom w:w="60" w:type="dxa"/>
+              <w:right w:w="100" w:type="dxa"/>
+            </w:tcMar>
+          </w:tcPr>
+          <w:p>
+            <w:pPr>
+              <w:spacing w:after="20"/>
+            </w:pPr>
+            <w:r>
+              <w:t>Título junto al reloj (opcional)</w:t>
+            </w:r>
+          </w:p>
+        </w:tc>
+      </w:tr>
+      <w:tr>
+        <w:tc>
+          <w:tcPr>
+            <w:tcW w:w="1497" w:type="dxa"/>
+            <w:tcBorders>
+              <w:top w:val="single" w:sz="4" w:space="0" w:color="BFBFBF"/>
+              <w:left w:val="single" w:sz="4" w:space="0" w:color="BFBFBF"/>
+              <w:bottom w:val="single" w:sz="4" w:space="0" w:color="BFBFBF"/>
+              <w:right w:val="single" w:sz="4" w:space="0" w:color="BFBFBF"/>
+            </w:tcBorders>
+            <w:tcMar>
+              <w:top w:w="60" w:type="dxa"/>
+              <w:left w:w="100" w:type="dxa"/>
+              <w:bottom w:w="60" w:type="dxa"/>
+              <w:right w:w="100" w:type="dxa"/>
+            </w:tcMar>
+          </w:tcPr>
+          <w:p>
+            <w:pPr>
+              <w:spacing w:after="20"/>
+            </w:pPr>
+            <w:r>
+              <w:rPr>
+                <w:rFonts w:ascii="Consolas" w:eastAsia="Consolas" w:hAnsi="Consolas" w:cs="Consolas"/>
+                <w:color w:val="7A1F33"/>
+                <w:sz w:val="19"/>
+                <w:szCs w:val="19"/>
+              </w:rPr>
+              <w:t>j</w:t>
+            </w:r>
+          </w:p>
+        </w:tc>
+        <w:tc>
+          <w:tcPr>
+            <w:tcW w:w="7863" w:type="dxa"/>
+            <w:tcBorders>
+              <w:top w:val="single" w:sz="4" w:space="0" w:color="BFBFBF"/>
+              <w:left w:val="single" w:sz="4" w:space="0" w:color="BFBFBF"/>
+              <w:bottom w:val="single" w:sz="4" w:space="0" w:color="BFBFBF"/>
+              <w:right w:val="single" w:sz="4" w:space="0" w:color="BFBFBF"/>
+            </w:tcBorders>
+            <w:tcMar>
+              <w:top w:w="60" w:type="dxa"/>
+              <w:left w:w="100" w:type="dxa"/>
+              <w:bottom w:w="60" w:type="dxa"/>
+              <w:right w:w="100" w:type="dxa"/>
+            </w:tcMar>
+          </w:tcPr>
+          <w:p>
+            <w:pPr>
+              <w:spacing w:after="20"/>
+            </w:pPr>
+            <w:r>
+              <w:t xml:space="preserve">Integrantes: </w:t>
+            </w:r>
+            <w:r>
+              <w:rPr>
+                <w:rFonts w:ascii="Consolas" w:eastAsia="Consolas" w:hAnsi="Consolas" w:cs="Consolas"/>
+                <w:color w:val="7A1F33"/>
+                <w:sz w:val="19"/>
+                <w:szCs w:val="19"/>
+              </w:rPr>
+              <w:t>[{ i, n, c, g, gn, v, img }]</w:t>
+            </w:r>
+            <w:r>
+              <w:t xml:space="preserve"> = id fijo, nombre, color (vacío = acento del estilo), ID del regalo, nombre del regalo, monedas por regalo (si TikTok no manda el precio) e imagen (sale del Buscador de regalos)</w:t>
+            </w:r>
+          </w:p>
+        </w:tc>
+      </w:tr>
+      <w:tr>
+        <w:tc>
+          <w:tcPr>
+            <w:tcW w:w="1497" w:type="dxa"/>
+            <w:tcBorders>
+              <w:top w:val="single" w:sz="4" w:space="0" w:color="BFBFBF"/>
+              <w:left w:val="single" w:sz="4" w:space="0" w:color="BFBFBF"/>
+              <w:bottom w:val="single" w:sz="4" w:space="0" w:color="BFBFBF"/>
+              <w:right w:val="single" w:sz="4" w:space="0" w:color="BFBFBF"/>
+            </w:tcBorders>
+            <w:tcMar>
+              <w:top w:w="60" w:type="dxa"/>
+              <w:left w:w="100" w:type="dxa"/>
+              <w:bottom w:w="60" w:type="dxa"/>
+              <w:right w:w="100" w:type="dxa"/>
+            </w:tcMar>
+          </w:tcPr>
+          <w:p>
+            <w:pPr>
+              <w:spacing w:after="20"/>
+            </w:pPr>
+            <w:r>
+              <w:rPr>
+                <w:rFonts w:ascii="Consolas" w:eastAsia="Consolas" w:hAnsi="Consolas" w:cs="Consolas"/>
+                <w:color w:val="7A1F33"/>
+                <w:sz w:val="19"/>
+                <w:szCs w:val="19"/>
+              </w:rPr>
+              <w:t>t</w:t>
+            </w:r>
+          </w:p>
+        </w:tc>
+        <w:tc>
+          <w:tcPr>
+            <w:tcW w:w="7863" w:type="dxa"/>
+            <w:tcBorders>
+              <w:top w:val="single" w:sz="4" w:space="0" w:color="BFBFBF"/>
+              <w:left w:val="single" w:sz="4" w:space="0" w:color="BFBFBF"/>
+              <w:bottom w:val="single" w:sz="4" w:space="0" w:color="BFBFBF"/>
+              <w:right w:val="single" w:sz="4" w:space="0" w:color="BFBFBF"/>
+            </w:tcBorders>
+            <w:tcMar>
+              <w:top w:w="60" w:type="dxa"/>
+              <w:left w:w="100" w:type="dxa"/>
+              <w:bottom w:w="60" w:type="dxa"/>
+              <w:right w:w="100" w:type="dxa"/>
+            </w:tcMar>
+          </w:tcPr>
+          <w:p>
+            <w:pPr>
+              <w:spacing w:after="20"/>
+            </w:pPr>
+            <w:r>
+              <w:t xml:space="preserve">Reloj </w:t>
+            </w:r>
+            <w:r>
+              <w:rPr>
+                <w:rFonts w:ascii="Consolas" w:eastAsia="Consolas" w:hAnsi="Consolas" w:cs="Consolas"/>
+                <w:color w:val="7A1F33"/>
+                <w:sz w:val="19"/>
+                <w:szCs w:val="19"/>
+              </w:rPr>
+              <w:t>{ e, d, fin, r }</w:t>
+            </w:r>
+            <w:r>
+              <w:t xml:space="preserve"> (el mismo de la carrera, ver js/reloj.js)</w:t>
+            </w:r>
+          </w:p>
+        </w:tc>
+      </w:tr>
+      <w:tr>
+        <w:tc>
+          <w:tcPr>
+            <w:tcW w:w="1497" w:type="dxa"/>
+            <w:tcBorders>
+              <w:top w:val="single" w:sz="4" w:space="0" w:color="BFBFBF"/>
+              <w:left w:val="single" w:sz="4" w:space="0" w:color="BFBFBF"/>
+              <w:bottom w:val="single" w:sz="4" w:space="0" w:color="BFBFBF"/>
+              <w:right w:val="single" w:sz="4" w:space="0" w:color="BFBFBF"/>
+            </w:tcBorders>
+            <w:tcMar>
+              <w:top w:w="60" w:type="dxa"/>
+              <w:left w:w="100" w:type="dxa"/>
+              <w:bottom w:w="60" w:type="dxa"/>
+              <w:right w:w="100" w:type="dxa"/>
+            </w:tcMar>
+          </w:tcPr>
+          <w:p>
+            <w:pPr>
+              <w:spacing w:after="20"/>
+            </w:pPr>
+            <w:r>
+              <w:rPr>
+                <w:rFonts w:ascii="Consolas" w:eastAsia="Consolas" w:hAnsi="Consolas" w:cs="Consolas"/>
+                <w:color w:val="7A1F33"/>
+                <w:sz w:val="19"/>
+                <w:szCs w:val="19"/>
+              </w:rPr>
+              <w:t>ro</w:t>
+            </w:r>
+          </w:p>
+        </w:tc>
+        <w:tc>
+          <w:tcPr>
+            <w:tcW w:w="7863" w:type="dxa"/>
+            <w:tcBorders>
+              <w:top w:val="single" w:sz="4" w:space="0" w:color="BFBFBF"/>
+              <w:left w:val="single" w:sz="4" w:space="0" w:color="BFBFBF"/>
+              <w:bottom w:val="single" w:sz="4" w:space="0" w:color="BFBFBF"/>
+              <w:right w:val="single" w:sz="4" w:space="0" w:color="BFBFBF"/>
+            </w:tcBorders>
+            <w:tcMar>
+              <w:top w:w="60" w:type="dxa"/>
+              <w:left w:w="100" w:type="dxa"/>
+              <w:bottom w:w="60" w:type="dxa"/>
+              <w:right w:w="100" w:type="dxa"/>
+            </w:tcMar>
+          </w:tcPr>
+          <w:p>
+            <w:pPr>
+              <w:spacing w:after="20"/>
+            </w:pPr>
+            <w:r>
+              <w:t>Ronda: cambia al reiniciar. Cuando cambia, los puntos vuelven a 0</w:t>
+            </w:r>
+          </w:p>
+        </w:tc>
+      </w:tr>
+      <w:tr>
+        <w:tc>
+          <w:tcPr>
+            <w:tcW w:w="1497" w:type="dxa"/>
+            <w:tcBorders>
+              <w:top w:val="single" w:sz="4" w:space="0" w:color="BFBFBF"/>
+              <w:left w:val="single" w:sz="4" w:space="0" w:color="BFBFBF"/>
+              <w:bottom w:val="single" w:sz="4" w:space="0" w:color="BFBFBF"/>
+              <w:right w:val="single" w:sz="4" w:space="0" w:color="BFBFBF"/>
+            </w:tcBorders>
+            <w:tcMar>
+              <w:top w:w="60" w:type="dxa"/>
+              <w:left w:w="100" w:type="dxa"/>
+              <w:bottom w:w="60" w:type="dxa"/>
+              <w:right w:w="100" w:type="dxa"/>
+            </w:tcMar>
+          </w:tcPr>
+          <w:p>
+            <w:pPr>
+              <w:spacing w:after="20"/>
+            </w:pPr>
+            <w:r>
+              <w:rPr>
+                <w:rFonts w:ascii="Consolas" w:eastAsia="Consolas" w:hAnsi="Consolas" w:cs="Consolas"/>
+                <w:color w:val="7A1F33"/>
+                <w:sz w:val="19"/>
+                <w:szCs w:val="19"/>
+              </w:rPr>
+              <w:t>sr</w:t>
+            </w:r>
+          </w:p>
+        </w:tc>
+        <w:tc>
+          <w:tcPr>
+            <w:tcW w:w="7863" w:type="dxa"/>
+            <w:tcBorders>
+              <w:top w:val="single" w:sz="4" w:space="0" w:color="BFBFBF"/>
+              <w:left w:val="single" w:sz="4" w:space="0" w:color="BFBFBF"/>
+              <w:bottom w:val="single" w:sz="4" w:space="0" w:color="BFBFBF"/>
+              <w:right w:val="single" w:sz="4" w:space="0" w:color="BFBFBF"/>
+            </w:tcBorders>
+            <w:tcMar>
+              <w:top w:w="60" w:type="dxa"/>
+              <w:left w:w="100" w:type="dxa"/>
+              <w:bottom w:w="60" w:type="dxa"/>
+              <w:right w:w="100" w:type="dxa"/>
+            </w:tcMar>
+          </w:tcPr>
+          <w:p>
+            <w:pPr>
+              <w:spacing w:after="20"/>
+            </w:pPr>
+            <w:r>
+              <w:t>Contar regalos solo con el reloj en marcha (1 o 0; por defecto 0: suman siempre hasta reiniciar)</w:t>
+            </w:r>
+          </w:p>
+        </w:tc>
+      </w:tr>
+      <w:tr>
+        <w:tc>
+          <w:tcPr>
+            <w:tcW w:w="1497" w:type="dxa"/>
+            <w:tcBorders>
+              <w:top w:val="single" w:sz="4" w:space="0" w:color="BFBFBF"/>
+              <w:left w:val="single" w:sz="4" w:space="0" w:color="BFBFBF"/>
+              <w:bottom w:val="single" w:sz="4" w:space="0" w:color="BFBFBF"/>
+              <w:right w:val="single" w:sz="4" w:space="0" w:color="BFBFBF"/>
+            </w:tcBorders>
+            <w:tcMar>
+              <w:top w:w="60" w:type="dxa"/>
+              <w:left w:w="100" w:type="dxa"/>
+              <w:bottom w:w="60" w:type="dxa"/>
+              <w:right w:w="100" w:type="dxa"/>
+            </w:tcMar>
+          </w:tcPr>
+          <w:p>
+            <w:pPr>
+              <w:spacing w:after="20"/>
+            </w:pPr>
+            <w:r>
+              <w:rPr>
+                <w:rFonts w:ascii="Consolas" w:eastAsia="Consolas" w:hAnsi="Consolas" w:cs="Consolas"/>
+                <w:color w:val="7A1F33"/>
+                <w:sz w:val="19"/>
+                <w:szCs w:val="19"/>
+              </w:rPr>
+              <w:t>s</w:t>
+            </w:r>
+          </w:p>
+        </w:tc>
+        <w:tc>
+          <w:tcPr>
+            <w:tcW w:w="7863" w:type="dxa"/>
+            <w:tcBorders>
+              <w:top w:val="single" w:sz="4" w:space="0" w:color="BFBFBF"/>
+              <w:left w:val="single" w:sz="4" w:space="0" w:color="BFBFBF"/>
+              <w:bottom w:val="single" w:sz="4" w:space="0" w:color="BFBFBF"/>
+              <w:right w:val="single" w:sz="4" w:space="0" w:color="BFBFBF"/>
+            </w:tcBorders>
+            <w:tcMar>
+              <w:top w:w="60" w:type="dxa"/>
+              <w:left w:w="100" w:type="dxa"/>
+              <w:bottom w:w="60" w:type="dxa"/>
+              <w:right w:w="100" w:type="dxa"/>
+            </w:tcMar>
+          </w:tcPr>
+          <w:p>
+            <w:pPr>
+              <w:spacing w:after="20"/>
+            </w:pPr>
+            <w:r>
+              <w:t>Sonido (1 o 0) al terminar el tiempo</w:t>
+            </w:r>
+          </w:p>
+        </w:tc>
+      </w:tr>
+      <w:tr>
+        <w:tc>
+          <w:tcPr>
+            <w:tcW w:w="1497" w:type="dxa"/>
+            <w:tcBorders>
+              <w:top w:val="single" w:sz="4" w:space="0" w:color="BFBFBF"/>
+              <w:left w:val="single" w:sz="4" w:space="0" w:color="BFBFBF"/>
+              <w:bottom w:val="single" w:sz="4" w:space="0" w:color="BFBFBF"/>
+              <w:right w:val="single" w:sz="4" w:space="0" w:color="BFBFBF"/>
+            </w:tcBorders>
+            <w:tcMar>
+              <w:top w:w="60" w:type="dxa"/>
+              <w:left w:w="100" w:type="dxa"/>
+              <w:bottom w:w="60" w:type="dxa"/>
+              <w:right w:w="100" w:type="dxa"/>
+            </w:tcMar>
+          </w:tcPr>
+          <w:p>
+            <w:pPr>
+              <w:spacing w:after="20"/>
+            </w:pPr>
+            <w:r>
+              <w:rPr>
+                <w:rFonts w:ascii="Consolas" w:eastAsia="Consolas" w:hAnsi="Consolas" w:cs="Consolas"/>
+                <w:color w:val="7A1F33"/>
+                <w:sz w:val="19"/>
+                <w:szCs w:val="19"/>
+              </w:rPr>
+              <w:t>est</w:t>
+            </w:r>
+          </w:p>
+        </w:tc>
+        <w:tc>
+          <w:tcPr>
+            <w:tcW w:w="7863" w:type="dxa"/>
+            <w:tcBorders>
+              <w:top w:val="single" w:sz="4" w:space="0" w:color="BFBFBF"/>
+              <w:left w:val="single" w:sz="4" w:space="0" w:color="BFBFBF"/>
+              <w:bottom w:val="single" w:sz="4" w:space="0" w:color="BFBFBF"/>
+              <w:right w:val="single" w:sz="4" w:space="0" w:color="BFBFBF"/>
+            </w:tcBorders>
+            <w:tcMar>
+              <w:top w:w="60" w:type="dxa"/>
+              <w:left w:w="100" w:type="dxa"/>
+              <w:bottom w:w="60" w:type="dxa"/>
+              <w:right w:w="100" w:type="dxa"/>
+            </w:tcMar>
+          </w:tcPr>
+          <w:p>
+            <w:pPr>
+              <w:spacing w:after="20"/>
+            </w:pPr>
+            <w:r>
+              <w:t>Estilo visual (lo aplica comun.js, igual que en los demás widgets)</w:t>
+            </w:r>
+          </w:p>
+        </w:tc>
+      </w:tr>
+    </w:tbl>
+    <w:p>
+      <w:pPr>
+        <w:spacing w:after="120"/>
+      </w:pPr>
+    </w:p>
+    <w:p>
+      <w:pPr>
+        <w:pStyle w:val="Heading3"/>
+      </w:pPr>
+      <w:r>
+        <w:t>Funcionamiento</w:t>
+      </w:r>
+    </w:p>
+    <w:p>
+      <w:pPr>
+        <w:pStyle w:val="ListParagraph"/>
+        <w:numPr>
+          <w:ilvl w:val="0"/>
+          <w:numId w:val="3"/>
+        </w:numPr>
+        <w:spacing w:after="60"/>
+      </w:pPr>
+      <w:r>
+        <w:t xml:space="preserve">Igual que la carrera: busca al integrante por </w:t>
+      </w:r>
+      <w:r>
+        <w:rPr>
+          <w:rFonts w:ascii="Consolas" w:eastAsia="Consolas" w:hAnsi="Consolas" w:cs="Consolas"/>
+          <w:color w:val="7A1F33"/>
+          <w:sz w:val="19"/>
+          <w:szCs w:val="19"/>
+        </w:rPr>
+        <w:t>giftId</w:t>
+      </w:r>
+      <w:r>
+        <w:t xml:space="preserve"> y, si ninguno coincide, por el nombre del regalo; suma </w:t>
+      </w:r>
+      <w:r>
+        <w:rPr>
+          <w:rFonts w:ascii="Consolas" w:eastAsia="Consolas" w:hAnsi="Consolas" w:cs="Consolas"/>
+          <w:color w:val="7A1F33"/>
+          <w:sz w:val="19"/>
+          <w:szCs w:val="19"/>
+        </w:rPr>
+        <w:t>diamantes × cantidad</w:t>
+      </w:r>
+      <w:r>
+        <w:t xml:space="preserve"> (si el precio llega en 0, usa </w:t>
+      </w:r>
+      <w:r>
+        <w:rPr>
+          <w:rFonts w:ascii="Consolas" w:eastAsia="Consolas" w:hAnsi="Consolas" w:cs="Consolas"/>
+          <w:color w:val="7A1F33"/>
+          <w:sz w:val="19"/>
+          <w:szCs w:val="19"/>
+        </w:rPr>
+        <w:t>v</w:t>
+      </w:r>
+      <w:r>
+        <w:t>); las tarjetas se reusan por id, así pausar o cambiar un nombre no reinicia los números.</w:t>
+      </w:r>
+    </w:p>
+    <w:p>
+      <w:pPr>
+        <w:pStyle w:val="ListParagraph"/>
+        <w:numPr>
+          <w:ilvl w:val="0"/>
+          <w:numId w:val="3"/>
+        </w:numPr>
+        <w:spacing w:after="60"/>
+      </w:pPr>
+      <w:r>
+        <w:t>El número sube poco a poco y la tarjeta da un pequeño salto con brillo. Quien va primero tiene un brillo de su color; al terminar el tiempo, los demás quedan atenuados.</w:t>
+      </w:r>
+    </w:p>
+    <w:p>
+      <w:pPr>
+        <w:pStyle w:val="ListParagraph"/>
+        <w:numPr>
+          <w:ilvl w:val="0"/>
+          <w:numId w:val="3"/>
+        </w:numPr>
+        <w:spacing w:after="60"/>
+      </w:pPr>
+      <w:r>
+        <w:t>Los puntos se guardan en el navegador de OBS (</w:t>
+      </w:r>
+      <w:r>
+        <w:rPr>
+          <w:rFonts w:ascii="Consolas" w:eastAsia="Consolas" w:hAnsi="Consolas" w:cs="Consolas"/>
+          <w:color w:val="7A1F33"/>
+          <w:sz w:val="19"/>
+          <w:szCs w:val="19"/>
+        </w:rPr>
+        <w:t>localStorage</w:t>
+      </w:r>
+      <w:r>
+        <w:t xml:space="preserve">, clave </w:t>
+      </w:r>
+      <w:r>
+        <w:rPr>
+          <w:rFonts w:ascii="Consolas" w:eastAsia="Consolas" w:hAnsi="Consolas" w:cs="Consolas"/>
+          <w:color w:val="7A1F33"/>
+          <w:sz w:val="19"/>
+          <w:szCs w:val="19"/>
+        </w:rPr>
+        <w:t>live-tools:marcador:&lt;w&gt;</w:t>
+      </w:r>
+      <w:r>
+        <w:t>) con la ronda: si OBS recarga la fuente, se conservan.</w:t>
+      </w:r>
+    </w:p>
+    <w:p>
+      <w:pPr>
         <w:pStyle w:val="Heading1"/>
         <w:pageBreakBefore/>
       </w:pPr>
-      <w:bookmarkStart w:id="30" w:name="_Toc242788725"/>
+      <w:bookmarkStart w:id="31" w:name="_Toc242789246"/>
       <w:r>
         <w:lastRenderedPageBreak/>
         <w:t>8. Frontend: el panel</w:t>
       </w:r>
-      <w:bookmarkEnd w:id="30"/>
+      <w:bookmarkEnd w:id="31"/>
     </w:p>
     <w:p>
       <w:pPr>
         <w:pStyle w:val="Heading2"/>
       </w:pPr>
-      <w:bookmarkStart w:id="31" w:name="_Toc242788726"/>
+      <w:bookmarkStart w:id="32" w:name="_Toc242789247"/>
       <w:r>
         <w:t>8.1 Estructura de la página (index.html)</w:t>
       </w:r>
-      <w:bookmarkEnd w:id="31"/>
+      <w:bookmarkEnd w:id="32"/>
     </w:p>
     <w:p>
       <w:pPr>
@@ -21535,11 +22403,11 @@
       <w:pPr>
         <w:pStyle w:val="Heading2"/>
       </w:pPr>
-      <w:bookmarkStart w:id="32" w:name="_Toc242788727"/>
+      <w:bookmarkStart w:id="33" w:name="_Toc242789248"/>
       <w:r>
         <w:t>8.2 Navegación y ciclo de vida (app.js)</w:t>
       </w:r>
-      <w:bookmarkEnd w:id="32"/>
+      <w:bookmarkEnd w:id="33"/>
     </w:p>
     <w:p>
       <w:pPr>
@@ -21716,11 +22584,11 @@
       <w:pPr>
         <w:pStyle w:val="Heading2"/>
       </w:pPr>
-      <w:bookmarkStart w:id="33" w:name="_Toc242788728"/>
+      <w:bookmarkStart w:id="34" w:name="_Toc242789249"/>
       <w:r>
         <w:t>8.3 Mapa del panel (registro.js)</w:t>
       </w:r>
-      <w:bookmarkEnd w:id="33"/>
+      <w:bookmarkEnd w:id="34"/>
     </w:p>
     <w:p>
       <w:pPr>
@@ -22222,7 +23090,7 @@
               <w:spacing w:after="20"/>
             </w:pPr>
             <w:r>
-              <w:t>Carrera de regalos (carrera), Batalla de regalos (batalla), Jefe del LIVE (jefe), Subathon (subathon), Bóveda dorada (boveda), Trono (trono)</w:t>
+              <w:t>Carrera de regalos (carrera), Marcador (marcador), Batalla de regalos (batalla), Jefe del LIVE (jefe), Subathon (subathon), Bóveda dorada (boveda), Trono (trono)</w:t>
             </w:r>
           </w:p>
         </w:tc>
@@ -22502,11 +23370,11 @@
       <w:pPr>
         <w:pStyle w:val="Heading2"/>
       </w:pPr>
-      <w:bookmarkStart w:id="34" w:name="_Toc242788729"/>
+      <w:bookmarkStart w:id="35" w:name="_Toc242789250"/>
       <w:r>
         <w:t>8.4 Datos guardados (almacen.js)</w:t>
       </w:r>
-      <w:bookmarkEnd w:id="34"/>
+      <w:bookmarkEnd w:id="35"/>
     </w:p>
     <w:p>
       <w:pPr>
@@ -23301,11 +24169,11 @@
       <w:pPr>
         <w:pStyle w:val="Heading2"/>
       </w:pPr>
-      <w:bookmarkStart w:id="35" w:name="_Toc242788730"/>
+      <w:bookmarkStart w:id="36" w:name="_Toc242789251"/>
       <w:r>
         <w:t>8.5 Conexión del panel al LIVE (envivo.js)</w:t>
       </w:r>
-      <w:bookmarkEnd w:id="35"/>
+      <w:bookmarkEnd w:id="36"/>
     </w:p>
     <w:p>
       <w:pPr>
@@ -23367,11 +24235,11 @@
       <w:pPr>
         <w:pStyle w:val="Heading2"/>
       </w:pPr>
-      <w:bookmarkStart w:id="36" w:name="_Toc242788731"/>
+      <w:bookmarkStart w:id="37" w:name="_Toc242789252"/>
       <w:r>
         <w:t>8.6 Componentes de interfaz (ui.js)</w:t>
       </w:r>
-      <w:bookmarkEnd w:id="36"/>
+      <w:bookmarkEnd w:id="37"/>
     </w:p>
     <w:tbl>
       <w:tblPr>
@@ -23875,11 +24743,11 @@
       <w:pPr>
         <w:pStyle w:val="Heading2"/>
       </w:pPr>
-      <w:bookmarkStart w:id="37" w:name="_Toc242788732"/>
+      <w:bookmarkStart w:id="38" w:name="_Toc242789253"/>
       <w:r>
         <w:t>8.7 Las vistas</w:t>
       </w:r>
-      <w:bookmarkEnd w:id="37"/>
+      <w:bookmarkEnd w:id="38"/>
     </w:p>
     <w:p>
       <w:pPr>
@@ -23947,6 +24815,22 @@
       <w:r>
         <w:lastRenderedPageBreak/>
         <w:t>Integrantes (1 a 6): una fila por integrante con color, nombre, ID del regalo (con sugerencias del Buscador de regalos), nombre del regalo, monedas por regalo y meta. Al escribir un ID que ya está en el catálogo se completan solos el nombre y el precio, y la imagen viaja al widget. Un integrante sin regalo o dos con el mismo regalo se avisan en rojo, pero no bloquean el envío: si bloquearan, el reloj tampoco llegaría a OBS.</w:t>
+      </w:r>
+    </w:p>
+    <w:p>
+      <w:pPr>
+        <w:pStyle w:val="Heading3"/>
+      </w:pPr>
+      <w:r>
+        <w:t>Marcador</w:t>
+      </w:r>
+    </w:p>
+    <w:p>
+      <w:pPr>
+        <w:spacing w:after="120"/>
+      </w:pPr>
+      <w:r>
+        <w:t>Igual que la carrera, sin la columna de meta: la tarjeta del widget (título opcional; en Personalizar, “Contar regalos solo con el reloj en marcha”, sonido y estilo), el Reloj de la ronda (Iniciar, Pausar, Reiniciar y duración) y los Integrantes (1 a 6) con color, nombre, ID del regalo, nombre del regalo y monedas por regalo. El color es opcional: una casilla junto al selector lo activa; desmarcada, la tarjeta usa el acento del estilo.</w:t>
       </w:r>
     </w:p>
     <w:p>
@@ -24042,6 +24926,7 @@
         <w:pStyle w:val="Heading3"/>
       </w:pPr>
       <w:r>
+        <w:lastRenderedPageBreak/>
         <w:t>Trono</w:t>
       </w:r>
     </w:p>
@@ -24058,7 +24943,6 @@
         <w:pStyle w:val="Heading3"/>
       </w:pPr>
       <w:r>
-        <w:lastRenderedPageBreak/>
         <w:t>Eventos en vivo</w:t>
       </w:r>
     </w:p>
@@ -24168,11 +25052,11 @@
       <w:pPr>
         <w:pStyle w:val="Heading2"/>
       </w:pPr>
-      <w:bookmarkStart w:id="38" w:name="_Toc242788733"/>
+      <w:bookmarkStart w:id="39" w:name="_Toc242789254"/>
       <w:r>
         <w:t>8.8 Vista previa y pruebas</w:t>
       </w:r>
-      <w:bookmarkEnd w:id="38"/>
+      <w:bookmarkEnd w:id="39"/>
     </w:p>
     <w:p>
       <w:pPr>
@@ -24233,18 +25117,54 @@
         <w:spacing w:after="120"/>
       </w:pPr>
       <w:r>
-        <w:t>Un cambio de estilo se le pasa a la vista previa por mensaje ({ tipo: "tema" }) sin recargarla; el resto de la configuración la reinicia 400 ms después. La excepción son las claves de sinRecargar: la carrera y el jefe mandan el reloj y la ronda, la batalla la ronda, el subathon además los “+5 min” , la bóveda la ronda y “abrir ahora” y el trono la ronda, con { tipo: "config" }, así Iniciar, Pausar o Reiniciar batalla no borran los puntos de prueba.</w:t>
+        <w:t>Un cambio de estilo se le pasa a la vista previa por mensaje (</w:t>
+      </w:r>
+      <w:r>
+        <w:rPr>
+          <w:rFonts w:ascii="Consolas" w:eastAsia="Consolas" w:hAnsi="Consolas" w:cs="Consolas"/>
+          <w:color w:val="7A1F33"/>
+          <w:sz w:val="19"/>
+          <w:szCs w:val="19"/>
+        </w:rPr>
+        <w:t>{ tipo: "tema" }</w:t>
+      </w:r>
+      <w:r>
+        <w:t xml:space="preserve">) sin recargarla; el resto de la configuración la reinicia 400 ms después. La excepción son las claves de </w:t>
+      </w:r>
+      <w:r>
+        <w:rPr>
+          <w:rFonts w:ascii="Consolas" w:eastAsia="Consolas" w:hAnsi="Consolas" w:cs="Consolas"/>
+          <w:color w:val="7A1F33"/>
+          <w:sz w:val="19"/>
+          <w:szCs w:val="19"/>
+        </w:rPr>
+        <w:t>sinRecargar</w:t>
+      </w:r>
+      <w:r>
+        <w:t xml:space="preserve">, que llegan con </w:t>
+      </w:r>
+      <w:r>
+        <w:rPr>
+          <w:rFonts w:ascii="Consolas" w:eastAsia="Consolas" w:hAnsi="Consolas" w:cs="Consolas"/>
+          <w:color w:val="7A1F33"/>
+          <w:sz w:val="19"/>
+          <w:szCs w:val="19"/>
+        </w:rPr>
+        <w:t>{ tipo: "config" }</w:t>
+      </w:r>
+      <w:r>
+        <w:t>: la carrera, el marcador y el jefe mandan el reloj y la ronda; la batalla y el trono, la ronda; el subathon, además, los “+5 min”; y la bóveda, la ronda y “abrir ahora”. Así Iniciar, Pausar o Reiniciar no borran los puntos de prueba.</w:t>
       </w:r>
     </w:p>
     <w:p>
       <w:pPr>
         <w:pStyle w:val="Heading2"/>
       </w:pPr>
-      <w:bookmarkStart w:id="39" w:name="_Toc242788734"/>
+      <w:bookmarkStart w:id="40" w:name="_Toc242789255"/>
       <w:r>
         <w:t>8.9 Cambios en vivo en el panel (sincronizar.js)</w:t>
       </w:r>
-      <w:bookmarkEnd w:id="39"/>
+      <w:bookmarkEnd w:id="40"/>
     </w:p>
     <w:p>
       <w:pPr>
@@ -24295,6 +25215,7 @@
         <w:spacing w:after="60"/>
       </w:pPr>
       <w:r>
+        <w:lastRenderedPageBreak/>
         <w:t>Si validar() encuentra un problema (por ejemplo, una ruleta con menos de 2 premios), no se sube y la tarjeta lo explica. Si falla la red, se reintenta con el siguiente cambio.</w:t>
       </w:r>
     </w:p>
@@ -24308,7 +25229,19 @@
         <w:spacing w:after="60"/>
       </w:pPr>
       <w:r>
-        <w:t>Los botones del reloj de la carrera, del jefe y del subathon (Iniciar, Pausar, Reiniciar, +5 min) , Reiniciar batalla , las órdenes de la bóveda y Reiniciar trono guardan y llaman sincronizar.subir(id) de inmediato, sin la espera de 0,6 s. La validación de la carrera solo bloquea si no hay integrantes; la de la batalla nunca bloquea.</w:t>
+        <w:t xml:space="preserve">Los botones del reloj de la carrera, del marcador, del jefe y del subathon (Iniciar, Pausar, Reiniciar, +5 min), Reiniciar batalla, las órdenes de la bóveda y Reiniciar trono guardan y llaman </w:t>
+      </w:r>
+      <w:r>
+        <w:rPr>
+          <w:rFonts w:ascii="Consolas" w:eastAsia="Consolas" w:hAnsi="Consolas" w:cs="Consolas"/>
+          <w:color w:val="7A1F33"/>
+          <w:sz w:val="19"/>
+          <w:szCs w:val="19"/>
+        </w:rPr>
+        <w:t>sincronizar.subir(id)</w:t>
+      </w:r>
+      <w:r>
+        <w:t xml:space="preserve"> de inmediato, sin la espera de 0,6 s. La validación de la carrera y del marcador solo bloquea si no hay integrantes; la de los demás juegos nunca bloquea.</w:t>
       </w:r>
     </w:p>
     <w:p>
@@ -24329,22 +25262,22 @@
         <w:pStyle w:val="Heading1"/>
         <w:pageBreakBefore/>
       </w:pPr>
-      <w:bookmarkStart w:id="40" w:name="_Toc242788735"/>
+      <w:bookmarkStart w:id="41" w:name="_Toc242789256"/>
       <w:r>
         <w:lastRenderedPageBreak/>
         <w:t>9. Flujos completos paso a paso</w:t>
       </w:r>
-      <w:bookmarkEnd w:id="40"/>
+      <w:bookmarkEnd w:id="41"/>
     </w:p>
     <w:p>
       <w:pPr>
         <w:pStyle w:val="Heading2"/>
       </w:pPr>
-      <w:bookmarkStart w:id="41" w:name="_Toc242788736"/>
+      <w:bookmarkStart w:id="42" w:name="_Toc242789257"/>
       <w:r>
         <w:t>9.1 Configurar un widget y ponerlo en OBS</w:t>
       </w:r>
-      <w:bookmarkEnd w:id="41"/>
+      <w:bookmarkEnd w:id="42"/>
     </w:p>
     <w:p>
       <w:pPr>
@@ -24523,11 +25456,11 @@
       <w:pPr>
         <w:pStyle w:val="Heading2"/>
       </w:pPr>
-      <w:bookmarkStart w:id="42" w:name="_Toc242788737"/>
+      <w:bookmarkStart w:id="43" w:name="_Toc242789258"/>
       <w:r>
         <w:t>9.2 Llega un regalo y gira la ruleta</w:t>
       </w:r>
-      <w:bookmarkEnd w:id="42"/>
+      <w:bookmarkEnd w:id="43"/>
     </w:p>
     <w:p>
       <w:pPr>
@@ -24664,11 +25597,11 @@
       <w:pPr>
         <w:pStyle w:val="Heading2"/>
       </w:pPr>
-      <w:bookmarkStart w:id="43" w:name="_Toc242788738"/>
+      <w:bookmarkStart w:id="44" w:name="_Toc242789259"/>
       <w:r>
         <w:t>9.3 Probar sin estar en vivo</w:t>
       </w:r>
-      <w:bookmarkEnd w:id="43"/>
+      <w:bookmarkEnd w:id="44"/>
     </w:p>
     <w:p>
       <w:pPr>
@@ -24759,12 +25692,12 @@
       <w:pPr>
         <w:pStyle w:val="Heading2"/>
       </w:pPr>
-      <w:bookmarkStart w:id="44" w:name="_Toc242788739"/>
+      <w:bookmarkStart w:id="45" w:name="_Toc242789260"/>
       <w:r>
         <w:lastRenderedPageBreak/>
         <w:t>9.4 Un regalo cambia de código</w:t>
       </w:r>
-      <w:bookmarkEnd w:id="44"/>
+      <w:bookmarkEnd w:id="45"/>
     </w:p>
     <w:p>
       <w:pPr>
@@ -25128,11 +26061,11 @@
       <w:pPr>
         <w:pStyle w:val="Heading2"/>
       </w:pPr>
-      <w:bookmarkStart w:id="45" w:name="_Toc242788740"/>
+      <w:bookmarkStart w:id="46" w:name="_Toc242789261"/>
       <w:r>
         <w:t>9.5 Cambiar la configuración durante el LIVE</w:t>
       </w:r>
-      <w:bookmarkEnd w:id="45"/>
+      <w:bookmarkEnd w:id="46"/>
     </w:p>
     <w:p>
       <w:pPr>
@@ -25190,11 +26123,11 @@
       <w:pPr>
         <w:pStyle w:val="Heading2"/>
       </w:pPr>
-      <w:bookmarkStart w:id="46" w:name="_Toc242788741"/>
+      <w:bookmarkStart w:id="47" w:name="_Toc242789262"/>
       <w:r>
         <w:t>9.6 Una ronda de la carrera de regalos</w:t>
       </w:r>
-      <w:bookmarkEnd w:id="46"/>
+      <w:bookmarkEnd w:id="47"/>
     </w:p>
     <w:p>
       <w:pPr>
@@ -25304,22 +26237,22 @@
         <w:pStyle w:val="Heading1"/>
         <w:pageBreakBefore/>
       </w:pPr>
-      <w:bookmarkStart w:id="47" w:name="_Toc242788742"/>
+      <w:bookmarkStart w:id="48" w:name="_Toc242789263"/>
       <w:r>
         <w:lastRenderedPageBreak/>
         <w:t>10. Diseño visual</w:t>
       </w:r>
-      <w:bookmarkEnd w:id="47"/>
+      <w:bookmarkEnd w:id="48"/>
     </w:p>
     <w:p>
       <w:pPr>
         <w:pStyle w:val="Heading2"/>
       </w:pPr>
-      <w:bookmarkStart w:id="48" w:name="_Toc242788743"/>
+      <w:bookmarkStart w:id="49" w:name="_Toc242789264"/>
       <w:r>
         <w:t>10.1 Panel</w:t>
       </w:r>
-      <w:bookmarkEnd w:id="48"/>
+      <w:bookmarkEnd w:id="49"/>
     </w:p>
     <w:p>
       <w:pPr>
@@ -26124,11 +27057,11 @@
       <w:pPr>
         <w:pStyle w:val="Heading2"/>
       </w:pPr>
-      <w:bookmarkStart w:id="49" w:name="_Toc242788744"/>
+      <w:bookmarkStart w:id="50" w:name="_Toc242789265"/>
       <w:r>
         <w:t>10.2 Widgets</w:t>
       </w:r>
-      <w:bookmarkEnd w:id="49"/>
+      <w:bookmarkEnd w:id="50"/>
     </w:p>
     <w:p>
       <w:pPr>
@@ -26686,12 +27619,12 @@
         <w:pStyle w:val="Heading1"/>
         <w:pageBreakBefore/>
       </w:pPr>
-      <w:bookmarkStart w:id="50" w:name="_Toc242788745"/>
+      <w:bookmarkStart w:id="51" w:name="_Toc242789266"/>
       <w:r>
         <w:lastRenderedPageBreak/>
         <w:t>11. Seguridad y privacidad</w:t>
       </w:r>
-      <w:bookmarkEnd w:id="50"/>
+      <w:bookmarkEnd w:id="51"/>
     </w:p>
     <w:tbl>
       <w:tblPr>
@@ -27204,12 +28137,12 @@
         <w:pStyle w:val="Heading1"/>
         <w:pageBreakBefore/>
       </w:pPr>
-      <w:bookmarkStart w:id="51" w:name="_Toc242788746"/>
+      <w:bookmarkStart w:id="52" w:name="_Toc242789267"/>
       <w:r>
         <w:lastRenderedPageBreak/>
         <w:t>12. Limitaciones actuales</w:t>
       </w:r>
-      <w:bookmarkEnd w:id="51"/>
+      <w:bookmarkEnd w:id="52"/>
     </w:p>
     <w:tbl>
       <w:tblPr>
@@ -28368,7 +29301,7 @@
               <w:spacing w:after="20"/>
             </w:pPr>
             <w:r>
-              <w:t>Los relojes de la carrera, el jefe y el subathon dependen de la hora del computador</w:t>
+              <w:t>Los relojes de la carrera, el marcador, el jefe y el subathon dependen de la hora del computador</w:t>
             </w:r>
           </w:p>
         </w:tc>
@@ -28820,12 +29753,12 @@
         <w:pStyle w:val="Heading1"/>
         <w:pageBreakBefore/>
       </w:pPr>
-      <w:bookmarkStart w:id="52" w:name="_Toc242788747"/>
+      <w:bookmarkStart w:id="53" w:name="_Toc242789268"/>
       <w:r>
         <w:lastRenderedPageBreak/>
         <w:t>13. Hacia una versión final montada en un servidor</w:t>
       </w:r>
-      <w:bookmarkEnd w:id="52"/>
+      <w:bookmarkEnd w:id="53"/>
     </w:p>
     <w:p>
       <w:pPr>
@@ -28849,11 +29782,11 @@
       <w:pPr>
         <w:pStyle w:val="Heading2"/>
       </w:pPr>
-      <w:bookmarkStart w:id="53" w:name="_Toc242788748"/>
+      <w:bookmarkStart w:id="54" w:name="_Toc242789269"/>
       <w:r>
         <w:t>13.1 Objetivos de la versión final</w:t>
       </w:r>
-      <w:bookmarkEnd w:id="53"/>
+      <w:bookmarkEnd w:id="54"/>
     </w:p>
     <w:p>
       <w:pPr>
@@ -29011,11 +29944,11 @@
       <w:pPr>
         <w:pStyle w:val="Heading2"/>
       </w:pPr>
-      <w:bookmarkStart w:id="54" w:name="_Toc242788749"/>
+      <w:bookmarkStart w:id="55" w:name="_Toc242789270"/>
       <w:r>
         <w:t>13.2 Arquitectura propuesta</w:t>
       </w:r>
-      <w:bookmarkEnd w:id="54"/>
+      <w:bookmarkEnd w:id="55"/>
     </w:p>
     <w:p>
       <w:pPr>
@@ -29844,11 +30777,11 @@
       <w:pPr>
         <w:pStyle w:val="Heading2"/>
       </w:pPr>
-      <w:bookmarkStart w:id="55" w:name="_Toc242788750"/>
+      <w:bookmarkStart w:id="56" w:name="_Toc242789271"/>
       <w:r>
         <w:t>13.3 Modelo de datos sugerido</w:t>
       </w:r>
-      <w:bookmarkEnd w:id="55"/>
+      <w:bookmarkEnd w:id="56"/>
     </w:p>
     <w:tbl>
       <w:tblPr>
@@ -30555,12 +31488,12 @@
       <w:pPr>
         <w:pStyle w:val="Heading2"/>
       </w:pPr>
-      <w:bookmarkStart w:id="56" w:name="_Toc242788751"/>
+      <w:bookmarkStart w:id="57" w:name="_Toc242789272"/>
       <w:r>
         <w:lastRenderedPageBreak/>
         <w:t>13.4 Seguridad en la versión final</w:t>
       </w:r>
-      <w:bookmarkEnd w:id="56"/>
+      <w:bookmarkEnd w:id="57"/>
     </w:p>
     <w:p>
       <w:pPr>
@@ -30794,11 +31727,11 @@
       <w:pPr>
         <w:pStyle w:val="Heading2"/>
       </w:pPr>
-      <w:bookmarkStart w:id="57" w:name="_Toc242788752"/>
+      <w:bookmarkStart w:id="58" w:name="_Toc242789273"/>
       <w:r>
         <w:t>13.5 Dónde alojarlo</w:t>
       </w:r>
-      <w:bookmarkEnd w:id="57"/>
+      <w:bookmarkEnd w:id="58"/>
     </w:p>
     <w:tbl>
       <w:tblPr>
@@ -31403,11 +32336,11 @@
       <w:pPr>
         <w:pStyle w:val="Heading2"/>
       </w:pPr>
-      <w:bookmarkStart w:id="58" w:name="_Toc242788753"/>
+      <w:bookmarkStart w:id="59" w:name="_Toc242789274"/>
       <w:r>
         <w:t>13.6 Qué se reutiliza y qué cambia del código actual</w:t>
       </w:r>
-      <w:bookmarkEnd w:id="58"/>
+      <w:bookmarkEnd w:id="59"/>
     </w:p>
     <w:tbl>
       <w:tblPr>
@@ -31773,7 +32706,7 @@
               <w:spacing w:after="20"/>
             </w:pPr>
             <w:r>
-              <w:t>Widgets (ruleta.js, meta.js, alertas.js y los cinco juegos)</w:t>
+              <w:t>Widgets (ruleta.js, meta.js, alertas.js y los siete juegos)</w:t>
             </w:r>
           </w:p>
         </w:tc>
@@ -32215,12 +33148,12 @@
       <w:pPr>
         <w:pStyle w:val="Heading2"/>
       </w:pPr>
-      <w:bookmarkStart w:id="59" w:name="_Toc242788754"/>
+      <w:bookmarkStart w:id="60" w:name="_Toc242789275"/>
       <w:r>
         <w:lastRenderedPageBreak/>
         <w:t>13.7 Mejoras técnicas recomendadas</w:t>
       </w:r>
-      <w:bookmarkEnd w:id="59"/>
+      <w:bookmarkEnd w:id="60"/>
     </w:p>
     <w:p>
       <w:pPr>
@@ -32406,11 +33339,11 @@
       <w:pPr>
         <w:pStyle w:val="Heading2"/>
       </w:pPr>
-      <w:bookmarkStart w:id="60" w:name="_Toc242788755"/>
+      <w:bookmarkStart w:id="61" w:name="_Toc242789276"/>
       <w:r>
         <w:t>13.8 Nuevas funciones que habilita un servidor</w:t>
       </w:r>
-      <w:bookmarkEnd w:id="60"/>
+      <w:bookmarkEnd w:id="61"/>
     </w:p>
     <w:p>
       <w:pPr>
@@ -32507,11 +33440,11 @@
       <w:pPr>
         <w:pStyle w:val="Heading2"/>
       </w:pPr>
-      <w:bookmarkStart w:id="61" w:name="_Toc242788756"/>
+      <w:bookmarkStart w:id="62" w:name="_Toc242789277"/>
       <w:r>
         <w:t>13.9 Hoja de ruta por fases</w:t>
       </w:r>
-      <w:bookmarkEnd w:id="61"/>
+      <w:bookmarkEnd w:id="62"/>
     </w:p>
     <w:tbl>
       <w:tblPr>
@@ -32991,22 +33924,22 @@
         <w:pStyle w:val="Heading1"/>
         <w:pageBreakBefore/>
       </w:pPr>
-      <w:bookmarkStart w:id="62" w:name="_Toc242788757"/>
+      <w:bookmarkStart w:id="63" w:name="_Toc242789278"/>
       <w:r>
         <w:lastRenderedPageBreak/>
         <w:t>14. Operación y mantenimiento actual</w:t>
       </w:r>
-      <w:bookmarkEnd w:id="62"/>
+      <w:bookmarkEnd w:id="63"/>
     </w:p>
     <w:p>
       <w:pPr>
         <w:pStyle w:val="Heading2"/>
       </w:pPr>
-      <w:bookmarkStart w:id="63" w:name="_Toc242788758"/>
+      <w:bookmarkStart w:id="64" w:name="_Toc242789279"/>
       <w:r>
         <w:t>14.1 Publicar un cambio</w:t>
       </w:r>
-      <w:bookmarkEnd w:id="63"/>
+      <w:bookmarkEnd w:id="64"/>
     </w:p>
     <w:p>
       <w:pPr>
@@ -33068,11 +34001,11 @@
       <w:pPr>
         <w:pStyle w:val="Heading2"/>
       </w:pPr>
-      <w:bookmarkStart w:id="64" w:name="_Toc242788759"/>
+      <w:bookmarkStart w:id="65" w:name="_Toc242789280"/>
       <w:r>
         <w:t>14.2 Agregar una función nueva</w:t>
       </w:r>
-      <w:bookmarkEnd w:id="64"/>
+      <w:bookmarkEnd w:id="65"/>
     </w:p>
     <w:p>
       <w:pPr>
@@ -33129,11 +34062,11 @@
       <w:pPr>
         <w:pStyle w:val="Heading2"/>
       </w:pPr>
-      <w:bookmarkStart w:id="65" w:name="_Toc242788760"/>
+      <w:bookmarkStart w:id="66" w:name="_Toc242789281"/>
       <w:r>
         <w:t>14.3 Probar</w:t>
       </w:r>
-      <w:bookmarkEnd w:id="65"/>
+      <w:bookmarkEnd w:id="66"/>
     </w:p>
     <w:p>
       <w:pPr>
@@ -33288,6 +34221,19 @@
         <w:spacing w:after="60"/>
       </w:pPr>
       <w:r>
+        <w:t>Marcador: igual que la carrera; en la vista previa los botones de prueba suman aunque el reloj esté detenido.</w:t>
+      </w:r>
+    </w:p>
+    <w:p>
+      <w:pPr>
+        <w:pStyle w:val="ListParagraph"/>
+        <w:numPr>
+          <w:ilvl w:val="0"/>
+          <w:numId w:val="3"/>
+        </w:numPr>
+        <w:spacing w:after="60"/>
+      </w:pPr>
+      <w:r>
         <w:t>Servidor estático local: python -m http.server 8080 -d public y abrir http://localhost:8080 (con doble clic no funciona: los módulos JavaScript necesitan http://).</w:t>
       </w:r>
     </w:p>
@@ -33295,11 +34241,11 @@
       <w:pPr>
         <w:pStyle w:val="Heading2"/>
       </w:pPr>
-      <w:bookmarkStart w:id="66" w:name="_Toc242788761"/>
+      <w:bookmarkStart w:id="67" w:name="_Toc242789282"/>
       <w:r>
         <w:t>14.4 Solución de problemas</w:t>
       </w:r>
-      <w:bookmarkEnd w:id="66"/>
+      <w:bookmarkEnd w:id="67"/>
     </w:p>
     <w:tbl>
       <w:tblPr>
@@ -34234,7 +35180,11 @@
               <w:spacing w:after="20"/>
             </w:pPr>
             <w:r>
-              <w:t>La raid no está iniciada (con “solo con el reloj en marcha”), ya fue vencido, o el daño está en 0</w:t>
+              <w:t xml:space="preserve">La raid no está iniciada (con “solo con el reloj en marcha”), </w:t>
+            </w:r>
+            <w:r>
+              <w:lastRenderedPageBreak/>
+              <w:t>ya fue vencido, o el daño está en 0</w:t>
             </w:r>
           </w:p>
         </w:tc>
@@ -34259,6 +35209,7 @@
               <w:spacing w:after="20"/>
             </w:pPr>
             <w:r>
+              <w:lastRenderedPageBreak/>
               <w:t>Pulsar Iniciar raid (o Nueva raid) y revisar la tarjeta Daño</w:t>
             </w:r>
           </w:p>
@@ -34286,7 +35237,6 @@
               <w:spacing w:after="20"/>
             </w:pPr>
             <w:r>
-              <w:lastRenderedPageBreak/>
               <w:t>El subathon no suma tiempo</w:t>
             </w:r>
           </w:p>
@@ -34507,12 +35457,12 @@
         <w:pStyle w:val="Heading1"/>
         <w:pageBreakBefore/>
       </w:pPr>
-      <w:bookmarkStart w:id="67" w:name="_Toc242788762"/>
+      <w:bookmarkStart w:id="68" w:name="_Toc242789283"/>
       <w:r>
         <w:lastRenderedPageBreak/>
         <w:t>15. Anexo: historial de decisiones y correcciones</w:t>
       </w:r>
-      <w:bookmarkEnd w:id="67"/>
+      <w:bookmarkEnd w:id="68"/>
     </w:p>
     <w:tbl>
       <w:tblPr>
@@ -37327,6 +38277,160 @@
             </w:pPr>
             <w:r>
               <w:t>Con medidas solo en vw, la insignia se cortaba en fuentes más anchas</w:t>
+            </w:r>
+          </w:p>
+        </w:tc>
+      </w:tr>
+      <w:tr>
+        <w:tc>
+          <w:tcPr>
+            <w:tcW w:w="2246" w:type="dxa"/>
+            <w:tcBorders>
+              <w:top w:val="single" w:sz="4" w:space="0" w:color="BFBFBF"/>
+              <w:left w:val="single" w:sz="4" w:space="0" w:color="BFBFBF"/>
+              <w:bottom w:val="single" w:sz="4" w:space="0" w:color="BFBFBF"/>
+              <w:right w:val="single" w:sz="4" w:space="0" w:color="BFBFBF"/>
+            </w:tcBorders>
+            <w:tcMar>
+              <w:top w:w="60" w:type="dxa"/>
+              <w:left w:w="100" w:type="dxa"/>
+              <w:bottom w:w="60" w:type="dxa"/>
+              <w:right w:w="100" w:type="dxa"/>
+            </w:tcMar>
+          </w:tcPr>
+          <w:p>
+            <w:pPr>
+              <w:spacing w:after="20"/>
+            </w:pPr>
+            <w:r>
+              <w:t>Marcador</w:t>
+            </w:r>
+          </w:p>
+        </w:tc>
+        <w:tc>
+          <w:tcPr>
+            <w:tcW w:w="3744" w:type="dxa"/>
+            <w:tcBorders>
+              <w:top w:val="single" w:sz="4" w:space="0" w:color="BFBFBF"/>
+              <w:left w:val="single" w:sz="4" w:space="0" w:color="BFBFBF"/>
+              <w:bottom w:val="single" w:sz="4" w:space="0" w:color="BFBFBF"/>
+              <w:right w:val="single" w:sz="4" w:space="0" w:color="BFBFBF"/>
+            </w:tcBorders>
+            <w:tcMar>
+              <w:top w:w="60" w:type="dxa"/>
+              <w:left w:w="100" w:type="dxa"/>
+              <w:bottom w:w="60" w:type="dxa"/>
+              <w:right w:w="100" w:type="dxa"/>
+            </w:tcMar>
+          </w:tcPr>
+          <w:p>
+            <w:pPr>
+              <w:spacing w:after="20"/>
+            </w:pPr>
+            <w:r>
+              <w:t>Reusar la lógica de la carrera sin metas, con el reloj en una sección aparte y “solo con el reloj en marcha” apagado por defecto</w:t>
+            </w:r>
+          </w:p>
+        </w:tc>
+        <w:tc>
+          <w:tcPr>
+            <w:tcW w:w="3370" w:type="dxa"/>
+            <w:tcBorders>
+              <w:top w:val="single" w:sz="4" w:space="0" w:color="BFBFBF"/>
+              <w:left w:val="single" w:sz="4" w:space="0" w:color="BFBFBF"/>
+              <w:bottom w:val="single" w:sz="4" w:space="0" w:color="BFBFBF"/>
+              <w:right w:val="single" w:sz="4" w:space="0" w:color="BFBFBF"/>
+            </w:tcBorders>
+            <w:tcMar>
+              <w:top w:w="60" w:type="dxa"/>
+              <w:left w:w="100" w:type="dxa"/>
+              <w:bottom w:w="60" w:type="dxa"/>
+              <w:right w:w="100" w:type="dxa"/>
+            </w:tcMar>
+          </w:tcPr>
+          <w:p>
+            <w:pPr>
+              <w:spacing w:after="20"/>
+            </w:pPr>
+            <w:r>
+              <w:t>El puntaje solo crece hasta reiniciar, como se pidió</w:t>
+            </w:r>
+          </w:p>
+        </w:tc>
+      </w:tr>
+      <w:tr>
+        <w:tc>
+          <w:tcPr>
+            <w:tcW w:w="2246" w:type="dxa"/>
+            <w:tcBorders>
+              <w:top w:val="single" w:sz="4" w:space="0" w:color="BFBFBF"/>
+              <w:left w:val="single" w:sz="4" w:space="0" w:color="BFBFBF"/>
+              <w:bottom w:val="single" w:sz="4" w:space="0" w:color="BFBFBF"/>
+              <w:right w:val="single" w:sz="4" w:space="0" w:color="BFBFBF"/>
+            </w:tcBorders>
+            <w:tcMar>
+              <w:top w:w="60" w:type="dxa"/>
+              <w:left w:w="100" w:type="dxa"/>
+              <w:bottom w:w="60" w:type="dxa"/>
+              <w:right w:w="100" w:type="dxa"/>
+            </w:tcMar>
+          </w:tcPr>
+          <w:p>
+            <w:pPr>
+              <w:spacing w:after="20"/>
+            </w:pPr>
+            <w:r>
+              <w:t>Oro de los textos grandes</w:t>
+            </w:r>
+          </w:p>
+        </w:tc>
+        <w:tc>
+          <w:tcPr>
+            <w:tcW w:w="3744" w:type="dxa"/>
+            <w:tcBorders>
+              <w:top w:val="single" w:sz="4" w:space="0" w:color="BFBFBF"/>
+              <w:left w:val="single" w:sz="4" w:space="0" w:color="BFBFBF"/>
+              <w:bottom w:val="single" w:sz="4" w:space="0" w:color="BFBFBF"/>
+              <w:right w:val="single" w:sz="4" w:space="0" w:color="BFBFBF"/>
+            </w:tcBorders>
+            <w:tcMar>
+              <w:top w:w="60" w:type="dxa"/>
+              <w:left w:w="100" w:type="dxa"/>
+              <w:bottom w:w="60" w:type="dxa"/>
+              <w:right w:w="100" w:type="dxa"/>
+            </w:tcMar>
+          </w:tcPr>
+          <w:p>
+            <w:pPr>
+              <w:spacing w:after="20"/>
+            </w:pPr>
+            <w:r>
+              <w:t>Degradado con el color activo del estilo en el centro (bóveda y marcador)</w:t>
+            </w:r>
+          </w:p>
+        </w:tc>
+        <w:tc>
+          <w:tcPr>
+            <w:tcW w:w="3370" w:type="dxa"/>
+            <w:tcBorders>
+              <w:top w:val="single" w:sz="4" w:space="0" w:color="BFBFBF"/>
+              <w:left w:val="single" w:sz="4" w:space="0" w:color="BFBFBF"/>
+              <w:bottom w:val="single" w:sz="4" w:space="0" w:color="BFBFBF"/>
+              <w:right w:val="single" w:sz="4" w:space="0" w:color="BFBFBF"/>
+            </w:tcBorders>
+            <w:tcMar>
+              <w:top w:w="60" w:type="dxa"/>
+              <w:left w:w="100" w:type="dxa"/>
+              <w:bottom w:w="60" w:type="dxa"/>
+              <w:right w:w="100" w:type="dxa"/>
+            </w:tcMar>
+          </w:tcPr>
+          <w:p>
+            <w:pPr>
+              <w:spacing w:after="20"/>
+            </w:pPr>
+            <w:r>
+              <w:t>El degradado del acento solo se veía oscuro en cifras y textos grandes</w:t>
             </w:r>
           </w:p>
         </w:tc>

</xml_diff>

<commit_message>
Documentación: letrero y miniatura de las ruletas al día
- README: la ruleta en la tabla de secciones y en "cambios en vivo" explica
  el letrero «Envía … para girar» y la miniatura; los juegos que guardan su
  progreso en OBS (sección 9); el subathon solo usa formatoReloj.
- Word: 7.1 (estructura, claves in e img, funcionamiento), 8.7, problema
  nuevo en 14.4 e historial; índice actualizado (60 págs.).
- reloj.js: la cabecera nombra todos los widgets que lo usan.

Co-Authored-By: Claude Opus 5.5 <noreply@anthropic.com>
</commit_message>
<xml_diff>
--- a/Documentacion-Live-Tools.docx
+++ b/Documentacion-Live-Tools.docx
@@ -159,7 +159,7 @@
           <w:r>
             <w:fldChar w:fldCharType="separate"/>
           </w:r>
-          <w:hyperlink w:anchor="_Toc242790236" w:history="1">
+          <w:hyperlink w:anchor="_Toc243165703" w:history="1">
             <w:r>
               <w:rPr>
                 <w:rStyle w:val="Hyperlink"/>
@@ -183,7 +183,7 @@
               <w:rPr>
                 <w:noProof/>
               </w:rPr>
-              <w:instrText xml:space="preserve"> PAGEREF _Toc242790236 \h </w:instrText>
+              <w:instrText xml:space="preserve"> PAGEREF _Toc243165703 \h </w:instrText>
             </w:r>
             <w:r>
               <w:rPr>
@@ -225,7 +225,7 @@
               <w14:ligatures w14:val="standardContextual"/>
             </w:rPr>
           </w:pPr>
-          <w:hyperlink w:anchor="_Toc242790237" w:history="1">
+          <w:hyperlink w:anchor="_Toc243165704" w:history="1">
             <w:r>
               <w:rPr>
                 <w:rStyle w:val="Hyperlink"/>
@@ -249,7 +249,7 @@
               <w:rPr>
                 <w:noProof/>
               </w:rPr>
-              <w:instrText xml:space="preserve"> PAGEREF _Toc242790237 \h </w:instrText>
+              <w:instrText xml:space="preserve"> PAGEREF _Toc243165704 \h </w:instrText>
             </w:r>
             <w:r>
               <w:rPr>
@@ -291,7 +291,7 @@
               <w14:ligatures w14:val="standardContextual"/>
             </w:rPr>
           </w:pPr>
-          <w:hyperlink w:anchor="_Toc242790238" w:history="1">
+          <w:hyperlink w:anchor="_Toc243165705" w:history="1">
             <w:r>
               <w:rPr>
                 <w:rStyle w:val="Hyperlink"/>
@@ -315,7 +315,7 @@
               <w:rPr>
                 <w:noProof/>
               </w:rPr>
-              <w:instrText xml:space="preserve"> PAGEREF _Toc242790238 \h </w:instrText>
+              <w:instrText xml:space="preserve"> PAGEREF _Toc243165705 \h </w:instrText>
             </w:r>
             <w:r>
               <w:rPr>
@@ -357,7 +357,7 @@
               <w14:ligatures w14:val="standardContextual"/>
             </w:rPr>
           </w:pPr>
-          <w:hyperlink w:anchor="_Toc242790239" w:history="1">
+          <w:hyperlink w:anchor="_Toc243165706" w:history="1">
             <w:r>
               <w:rPr>
                 <w:rStyle w:val="Hyperlink"/>
@@ -381,7 +381,7 @@
               <w:rPr>
                 <w:noProof/>
               </w:rPr>
-              <w:instrText xml:space="preserve"> PAGEREF _Toc242790239 \h </w:instrText>
+              <w:instrText xml:space="preserve"> PAGEREF _Toc243165706 \h </w:instrText>
             </w:r>
             <w:r>
               <w:rPr>
@@ -423,7 +423,7 @@
               <w14:ligatures w14:val="standardContextual"/>
             </w:rPr>
           </w:pPr>
-          <w:hyperlink w:anchor="_Toc242790240" w:history="1">
+          <w:hyperlink w:anchor="_Toc243165707" w:history="1">
             <w:r>
               <w:rPr>
                 <w:rStyle w:val="Hyperlink"/>
@@ -447,7 +447,7 @@
               <w:rPr>
                 <w:noProof/>
               </w:rPr>
-              <w:instrText xml:space="preserve"> PAGEREF _Toc242790240 \h </w:instrText>
+              <w:instrText xml:space="preserve"> PAGEREF _Toc243165707 \h </w:instrText>
             </w:r>
             <w:r>
               <w:rPr>
@@ -489,7 +489,7 @@
               <w14:ligatures w14:val="standardContextual"/>
             </w:rPr>
           </w:pPr>
-          <w:hyperlink w:anchor="_Toc242790241" w:history="1">
+          <w:hyperlink w:anchor="_Toc243165708" w:history="1">
             <w:r>
               <w:rPr>
                 <w:rStyle w:val="Hyperlink"/>
@@ -513,7 +513,7 @@
               <w:rPr>
                 <w:noProof/>
               </w:rPr>
-              <w:instrText xml:space="preserve"> PAGEREF _Toc242790241 \h </w:instrText>
+              <w:instrText xml:space="preserve"> PAGEREF _Toc243165708 \h </w:instrText>
             </w:r>
             <w:r>
               <w:rPr>
@@ -555,7 +555,7 @@
               <w14:ligatures w14:val="standardContextual"/>
             </w:rPr>
           </w:pPr>
-          <w:hyperlink w:anchor="_Toc242790242" w:history="1">
+          <w:hyperlink w:anchor="_Toc243165709" w:history="1">
             <w:r>
               <w:rPr>
                 <w:rStyle w:val="Hyperlink"/>
@@ -579,7 +579,7 @@
               <w:rPr>
                 <w:noProof/>
               </w:rPr>
-              <w:instrText xml:space="preserve"> PAGEREF _Toc242790242 \h </w:instrText>
+              <w:instrText xml:space="preserve"> PAGEREF _Toc243165709 \h </w:instrText>
             </w:r>
             <w:r>
               <w:rPr>
@@ -621,7 +621,7 @@
               <w14:ligatures w14:val="standardContextual"/>
             </w:rPr>
           </w:pPr>
-          <w:hyperlink w:anchor="_Toc242790243" w:history="1">
+          <w:hyperlink w:anchor="_Toc243165710" w:history="1">
             <w:r>
               <w:rPr>
                 <w:rStyle w:val="Hyperlink"/>
@@ -645,7 +645,7 @@
               <w:rPr>
                 <w:noProof/>
               </w:rPr>
-              <w:instrText xml:space="preserve"> PAGEREF _Toc242790243 \h </w:instrText>
+              <w:instrText xml:space="preserve"> PAGEREF _Toc243165710 \h </w:instrText>
             </w:r>
             <w:r>
               <w:rPr>
@@ -687,7 +687,7 @@
               <w14:ligatures w14:val="standardContextual"/>
             </w:rPr>
           </w:pPr>
-          <w:hyperlink w:anchor="_Toc242790244" w:history="1">
+          <w:hyperlink w:anchor="_Toc243165711" w:history="1">
             <w:r>
               <w:rPr>
                 <w:rStyle w:val="Hyperlink"/>
@@ -711,7 +711,7 @@
               <w:rPr>
                 <w:noProof/>
               </w:rPr>
-              <w:instrText xml:space="preserve"> PAGEREF _Toc242790244 \h </w:instrText>
+              <w:instrText xml:space="preserve"> PAGEREF _Toc243165711 \h </w:instrText>
             </w:r>
             <w:r>
               <w:rPr>
@@ -753,7 +753,7 @@
               <w14:ligatures w14:val="standardContextual"/>
             </w:rPr>
           </w:pPr>
-          <w:hyperlink w:anchor="_Toc242790245" w:history="1">
+          <w:hyperlink w:anchor="_Toc243165712" w:history="1">
             <w:r>
               <w:rPr>
                 <w:rStyle w:val="Hyperlink"/>
@@ -777,7 +777,7 @@
               <w:rPr>
                 <w:noProof/>
               </w:rPr>
-              <w:instrText xml:space="preserve"> PAGEREF _Toc242790245 \h </w:instrText>
+              <w:instrText xml:space="preserve"> PAGEREF _Toc243165712 \h </w:instrText>
             </w:r>
             <w:r>
               <w:rPr>
@@ -819,7 +819,7 @@
               <w14:ligatures w14:val="standardContextual"/>
             </w:rPr>
           </w:pPr>
-          <w:hyperlink w:anchor="_Toc242790246" w:history="1">
+          <w:hyperlink w:anchor="_Toc243165713" w:history="1">
             <w:r>
               <w:rPr>
                 <w:rStyle w:val="Hyperlink"/>
@@ -843,7 +843,7 @@
               <w:rPr>
                 <w:noProof/>
               </w:rPr>
-              <w:instrText xml:space="preserve"> PAGEREF _Toc242790246 \h </w:instrText>
+              <w:instrText xml:space="preserve"> PAGEREF _Toc243165713 \h </w:instrText>
             </w:r>
             <w:r>
               <w:rPr>
@@ -885,7 +885,7 @@
               <w14:ligatures w14:val="standardContextual"/>
             </w:rPr>
           </w:pPr>
-          <w:hyperlink w:anchor="_Toc242790247" w:history="1">
+          <w:hyperlink w:anchor="_Toc243165714" w:history="1">
             <w:r>
               <w:rPr>
                 <w:rStyle w:val="Hyperlink"/>
@@ -909,7 +909,7 @@
               <w:rPr>
                 <w:noProof/>
               </w:rPr>
-              <w:instrText xml:space="preserve"> PAGEREF _Toc242790247 \h </w:instrText>
+              <w:instrText xml:space="preserve"> PAGEREF _Toc243165714 \h </w:instrText>
             </w:r>
             <w:r>
               <w:rPr>
@@ -951,7 +951,7 @@
               <w14:ligatures w14:val="standardContextual"/>
             </w:rPr>
           </w:pPr>
-          <w:hyperlink w:anchor="_Toc242790248" w:history="1">
+          <w:hyperlink w:anchor="_Toc243165715" w:history="1">
             <w:r>
               <w:rPr>
                 <w:rStyle w:val="Hyperlink"/>
@@ -975,7 +975,7 @@
               <w:rPr>
                 <w:noProof/>
               </w:rPr>
-              <w:instrText xml:space="preserve"> PAGEREF _Toc242790248 \h </w:instrText>
+              <w:instrText xml:space="preserve"> PAGEREF _Toc243165715 \h </w:instrText>
             </w:r>
             <w:r>
               <w:rPr>
@@ -1017,7 +1017,7 @@
               <w14:ligatures w14:val="standardContextual"/>
             </w:rPr>
           </w:pPr>
-          <w:hyperlink w:anchor="_Toc242790249" w:history="1">
+          <w:hyperlink w:anchor="_Toc243165716" w:history="1">
             <w:r>
               <w:rPr>
                 <w:rStyle w:val="Hyperlink"/>
@@ -1041,7 +1041,7 @@
               <w:rPr>
                 <w:noProof/>
               </w:rPr>
-              <w:instrText xml:space="preserve"> PAGEREF _Toc242790249 \h </w:instrText>
+              <w:instrText xml:space="preserve"> PAGEREF _Toc243165716 \h </w:instrText>
             </w:r>
             <w:r>
               <w:rPr>
@@ -1083,7 +1083,7 @@
               <w14:ligatures w14:val="standardContextual"/>
             </w:rPr>
           </w:pPr>
-          <w:hyperlink w:anchor="_Toc242790250" w:history="1">
+          <w:hyperlink w:anchor="_Toc243165717" w:history="1">
             <w:r>
               <w:rPr>
                 <w:rStyle w:val="Hyperlink"/>
@@ -1107,7 +1107,7 @@
               <w:rPr>
                 <w:noProof/>
               </w:rPr>
-              <w:instrText xml:space="preserve"> PAGEREF _Toc242790250 \h </w:instrText>
+              <w:instrText xml:space="preserve"> PAGEREF _Toc243165717 \h </w:instrText>
             </w:r>
             <w:r>
               <w:rPr>
@@ -1149,7 +1149,7 @@
               <w14:ligatures w14:val="standardContextual"/>
             </w:rPr>
           </w:pPr>
-          <w:hyperlink w:anchor="_Toc242790251" w:history="1">
+          <w:hyperlink w:anchor="_Toc243165718" w:history="1">
             <w:r>
               <w:rPr>
                 <w:rStyle w:val="Hyperlink"/>
@@ -1173,7 +1173,7 @@
               <w:rPr>
                 <w:noProof/>
               </w:rPr>
-              <w:instrText xml:space="preserve"> PAGEREF _Toc242790251 \h </w:instrText>
+              <w:instrText xml:space="preserve"> PAGEREF _Toc243165718 \h </w:instrText>
             </w:r>
             <w:r>
               <w:rPr>
@@ -1215,7 +1215,7 @@
               <w14:ligatures w14:val="standardContextual"/>
             </w:rPr>
           </w:pPr>
-          <w:hyperlink w:anchor="_Toc242790252" w:history="1">
+          <w:hyperlink w:anchor="_Toc243165719" w:history="1">
             <w:r>
               <w:rPr>
                 <w:rStyle w:val="Hyperlink"/>
@@ -1239,7 +1239,7 @@
               <w:rPr>
                 <w:noProof/>
               </w:rPr>
-              <w:instrText xml:space="preserve"> PAGEREF _Toc242790252 \h </w:instrText>
+              <w:instrText xml:space="preserve"> PAGEREF _Toc243165719 \h </w:instrText>
             </w:r>
             <w:r>
               <w:rPr>
@@ -1281,7 +1281,7 @@
               <w14:ligatures w14:val="standardContextual"/>
             </w:rPr>
           </w:pPr>
-          <w:hyperlink w:anchor="_Toc242790253" w:history="1">
+          <w:hyperlink w:anchor="_Toc243165720" w:history="1">
             <w:r>
               <w:rPr>
                 <w:rStyle w:val="Hyperlink"/>
@@ -1305,7 +1305,7 @@
               <w:rPr>
                 <w:noProof/>
               </w:rPr>
-              <w:instrText xml:space="preserve"> PAGEREF _Toc242790253 \h </w:instrText>
+              <w:instrText xml:space="preserve"> PAGEREF _Toc243165720 \h </w:instrText>
             </w:r>
             <w:r>
               <w:rPr>
@@ -1347,7 +1347,7 @@
               <w14:ligatures w14:val="standardContextual"/>
             </w:rPr>
           </w:pPr>
-          <w:hyperlink w:anchor="_Toc242790254" w:history="1">
+          <w:hyperlink w:anchor="_Toc243165721" w:history="1">
             <w:r>
               <w:rPr>
                 <w:rStyle w:val="Hyperlink"/>
@@ -1371,7 +1371,7 @@
               <w:rPr>
                 <w:noProof/>
               </w:rPr>
-              <w:instrText xml:space="preserve"> PAGEREF _Toc242790254 \h </w:instrText>
+              <w:instrText xml:space="preserve"> PAGEREF _Toc243165721 \h </w:instrText>
             </w:r>
             <w:r>
               <w:rPr>
@@ -1413,7 +1413,7 @@
               <w14:ligatures w14:val="standardContextual"/>
             </w:rPr>
           </w:pPr>
-          <w:hyperlink w:anchor="_Toc242790255" w:history="1">
+          <w:hyperlink w:anchor="_Toc243165722" w:history="1">
             <w:r>
               <w:rPr>
                 <w:rStyle w:val="Hyperlink"/>
@@ -1437,7 +1437,7 @@
               <w:rPr>
                 <w:noProof/>
               </w:rPr>
-              <w:instrText xml:space="preserve"> PAGEREF _Toc242790255 \h </w:instrText>
+              <w:instrText xml:space="preserve"> PAGEREF _Toc243165722 \h </w:instrText>
             </w:r>
             <w:r>
               <w:rPr>
@@ -1479,7 +1479,7 @@
               <w14:ligatures w14:val="standardContextual"/>
             </w:rPr>
           </w:pPr>
-          <w:hyperlink w:anchor="_Toc242790256" w:history="1">
+          <w:hyperlink w:anchor="_Toc243165723" w:history="1">
             <w:r>
               <w:rPr>
                 <w:rStyle w:val="Hyperlink"/>
@@ -1503,7 +1503,7 @@
               <w:rPr>
                 <w:noProof/>
               </w:rPr>
-              <w:instrText xml:space="preserve"> PAGEREF _Toc242790256 \h </w:instrText>
+              <w:instrText xml:space="preserve"> PAGEREF _Toc243165723 \h </w:instrText>
             </w:r>
             <w:r>
               <w:rPr>
@@ -1545,7 +1545,7 @@
               <w14:ligatures w14:val="standardContextual"/>
             </w:rPr>
           </w:pPr>
-          <w:hyperlink w:anchor="_Toc242790257" w:history="1">
+          <w:hyperlink w:anchor="_Toc243165724" w:history="1">
             <w:r>
               <w:rPr>
                 <w:rStyle w:val="Hyperlink"/>
@@ -1569,7 +1569,7 @@
               <w:rPr>
                 <w:noProof/>
               </w:rPr>
-              <w:instrText xml:space="preserve"> PAGEREF _Toc242790257 \h </w:instrText>
+              <w:instrText xml:space="preserve"> PAGEREF _Toc243165724 \h </w:instrText>
             </w:r>
             <w:r>
               <w:rPr>
@@ -1611,7 +1611,7 @@
               <w14:ligatures w14:val="standardContextual"/>
             </w:rPr>
           </w:pPr>
-          <w:hyperlink w:anchor="_Toc242790258" w:history="1">
+          <w:hyperlink w:anchor="_Toc243165725" w:history="1">
             <w:r>
               <w:rPr>
                 <w:rStyle w:val="Hyperlink"/>
@@ -1635,7 +1635,7 @@
               <w:rPr>
                 <w:noProof/>
               </w:rPr>
-              <w:instrText xml:space="preserve"> PAGEREF _Toc242790258 \h </w:instrText>
+              <w:instrText xml:space="preserve"> PAGEREF _Toc243165725 \h </w:instrText>
             </w:r>
             <w:r>
               <w:rPr>
@@ -1677,7 +1677,7 @@
               <w14:ligatures w14:val="standardContextual"/>
             </w:rPr>
           </w:pPr>
-          <w:hyperlink w:anchor="_Toc242790259" w:history="1">
+          <w:hyperlink w:anchor="_Toc243165726" w:history="1">
             <w:r>
               <w:rPr>
                 <w:rStyle w:val="Hyperlink"/>
@@ -1701,7 +1701,7 @@
               <w:rPr>
                 <w:noProof/>
               </w:rPr>
-              <w:instrText xml:space="preserve"> PAGEREF _Toc242790259 \h </w:instrText>
+              <w:instrText xml:space="preserve"> PAGEREF _Toc243165726 \h </w:instrText>
             </w:r>
             <w:r>
               <w:rPr>
@@ -1718,7 +1718,7 @@
               <w:rPr>
                 <w:noProof/>
               </w:rPr>
-              <w:t>22</w:t>
+              <w:t>23</w:t>
             </w:r>
             <w:r>
               <w:rPr>
@@ -1743,7 +1743,7 @@
               <w14:ligatures w14:val="standardContextual"/>
             </w:rPr>
           </w:pPr>
-          <w:hyperlink w:anchor="_Toc242790260" w:history="1">
+          <w:hyperlink w:anchor="_Toc243165727" w:history="1">
             <w:r>
               <w:rPr>
                 <w:rStyle w:val="Hyperlink"/>
@@ -1767,7 +1767,7 @@
               <w:rPr>
                 <w:noProof/>
               </w:rPr>
-              <w:instrText xml:space="preserve"> PAGEREF _Toc242790260 \h </w:instrText>
+              <w:instrText xml:space="preserve"> PAGEREF _Toc243165727 \h </w:instrText>
             </w:r>
             <w:r>
               <w:rPr>
@@ -1809,7 +1809,7 @@
               <w14:ligatures w14:val="standardContextual"/>
             </w:rPr>
           </w:pPr>
-          <w:hyperlink w:anchor="_Toc242790261" w:history="1">
+          <w:hyperlink w:anchor="_Toc243165728" w:history="1">
             <w:r>
               <w:rPr>
                 <w:rStyle w:val="Hyperlink"/>
@@ -1833,7 +1833,7 @@
               <w:rPr>
                 <w:noProof/>
               </w:rPr>
-              <w:instrText xml:space="preserve"> PAGEREF _Toc242790261 \h </w:instrText>
+              <w:instrText xml:space="preserve"> PAGEREF _Toc243165728 \h </w:instrText>
             </w:r>
             <w:r>
               <w:rPr>
@@ -1850,7 +1850,7 @@
               <w:rPr>
                 <w:noProof/>
               </w:rPr>
-              <w:t>24</w:t>
+              <w:t>25</w:t>
             </w:r>
             <w:r>
               <w:rPr>
@@ -1875,7 +1875,7 @@
               <w14:ligatures w14:val="standardContextual"/>
             </w:rPr>
           </w:pPr>
-          <w:hyperlink w:anchor="_Toc242790262" w:history="1">
+          <w:hyperlink w:anchor="_Toc243165729" w:history="1">
             <w:r>
               <w:rPr>
                 <w:rStyle w:val="Hyperlink"/>
@@ -1899,7 +1899,7 @@
               <w:rPr>
                 <w:noProof/>
               </w:rPr>
-              <w:instrText xml:space="preserve"> PAGEREF _Toc242790262 \h </w:instrText>
+              <w:instrText xml:space="preserve"> PAGEREF _Toc243165729 \h </w:instrText>
             </w:r>
             <w:r>
               <w:rPr>
@@ -1916,7 +1916,7 @@
               <w:rPr>
                 <w:noProof/>
               </w:rPr>
-              <w:t>25</w:t>
+              <w:t>26</w:t>
             </w:r>
             <w:r>
               <w:rPr>
@@ -1941,7 +1941,7 @@
               <w14:ligatures w14:val="standardContextual"/>
             </w:rPr>
           </w:pPr>
-          <w:hyperlink w:anchor="_Toc242790263" w:history="1">
+          <w:hyperlink w:anchor="_Toc243165730" w:history="1">
             <w:r>
               <w:rPr>
                 <w:rStyle w:val="Hyperlink"/>
@@ -1965,7 +1965,7 @@
               <w:rPr>
                 <w:noProof/>
               </w:rPr>
-              <w:instrText xml:space="preserve"> PAGEREF _Toc242790263 \h </w:instrText>
+              <w:instrText xml:space="preserve"> PAGEREF _Toc243165730 \h </w:instrText>
             </w:r>
             <w:r>
               <w:rPr>
@@ -2007,7 +2007,7 @@
               <w14:ligatures w14:val="standardContextual"/>
             </w:rPr>
           </w:pPr>
-          <w:hyperlink w:anchor="_Toc242790264" w:history="1">
+          <w:hyperlink w:anchor="_Toc243165731" w:history="1">
             <w:r>
               <w:rPr>
                 <w:rStyle w:val="Hyperlink"/>
@@ -2031,7 +2031,7 @@
               <w:rPr>
                 <w:noProof/>
               </w:rPr>
-              <w:instrText xml:space="preserve"> PAGEREF _Toc242790264 \h </w:instrText>
+              <w:instrText xml:space="preserve"> PAGEREF _Toc243165731 \h </w:instrText>
             </w:r>
             <w:r>
               <w:rPr>
@@ -2073,7 +2073,7 @@
               <w14:ligatures w14:val="standardContextual"/>
             </w:rPr>
           </w:pPr>
-          <w:hyperlink w:anchor="_Toc242790265" w:history="1">
+          <w:hyperlink w:anchor="_Toc243165732" w:history="1">
             <w:r>
               <w:rPr>
                 <w:rStyle w:val="Hyperlink"/>
@@ -2097,7 +2097,7 @@
               <w:rPr>
                 <w:noProof/>
               </w:rPr>
-              <w:instrText xml:space="preserve"> PAGEREF _Toc242790265 \h </w:instrText>
+              <w:instrText xml:space="preserve"> PAGEREF _Toc243165732 \h </w:instrText>
             </w:r>
             <w:r>
               <w:rPr>
@@ -2139,7 +2139,7 @@
               <w14:ligatures w14:val="standardContextual"/>
             </w:rPr>
           </w:pPr>
-          <w:hyperlink w:anchor="_Toc242790338" w:history="1">
+          <w:hyperlink w:anchor="_Toc243165733" w:history="1">
             <w:r>
               <w:rPr>
                 <w:rStyle w:val="Hyperlink"/>
@@ -2163,7 +2163,7 @@
               <w:rPr>
                 <w:noProof/>
               </w:rPr>
-              <w:instrText xml:space="preserve"> PAGEREF _Toc242790338 \h </w:instrText>
+              <w:instrText xml:space="preserve"> PAGEREF _Toc243165733 \h </w:instrText>
             </w:r>
             <w:r>
               <w:rPr>
@@ -2180,7 +2180,7 @@
               <w:rPr>
                 <w:noProof/>
               </w:rPr>
-              <w:t>30</w:t>
+              <w:t>31</w:t>
             </w:r>
             <w:r>
               <w:rPr>
@@ -2205,7 +2205,7 @@
               <w14:ligatures w14:val="standardContextual"/>
             </w:rPr>
           </w:pPr>
-          <w:hyperlink w:anchor="_Toc242790339" w:history="1">
+          <w:hyperlink w:anchor="_Toc243165734" w:history="1">
             <w:r>
               <w:rPr>
                 <w:rStyle w:val="Hyperlink"/>
@@ -2229,7 +2229,7 @@
               <w:rPr>
                 <w:noProof/>
               </w:rPr>
-              <w:instrText xml:space="preserve"> PAGEREF _Toc242790339 \h </w:instrText>
+              <w:instrText xml:space="preserve"> PAGEREF _Toc243165734 \h </w:instrText>
             </w:r>
             <w:r>
               <w:rPr>
@@ -2246,7 +2246,7 @@
               <w:rPr>
                 <w:noProof/>
               </w:rPr>
-              <w:t>31</w:t>
+              <w:t>32</w:t>
             </w:r>
             <w:r>
               <w:rPr>
@@ -2271,7 +2271,7 @@
               <w14:ligatures w14:val="standardContextual"/>
             </w:rPr>
           </w:pPr>
-          <w:hyperlink w:anchor="_Toc242790340" w:history="1">
+          <w:hyperlink w:anchor="_Toc243165735" w:history="1">
             <w:r>
               <w:rPr>
                 <w:rStyle w:val="Hyperlink"/>
@@ -2295,7 +2295,7 @@
               <w:rPr>
                 <w:noProof/>
               </w:rPr>
-              <w:instrText xml:space="preserve"> PAGEREF _Toc242790340 \h </w:instrText>
+              <w:instrText xml:space="preserve"> PAGEREF _Toc243165735 \h </w:instrText>
             </w:r>
             <w:r>
               <w:rPr>
@@ -2312,7 +2312,7 @@
               <w:rPr>
                 <w:noProof/>
               </w:rPr>
-              <w:t>32</w:t>
+              <w:t>33</w:t>
             </w:r>
             <w:r>
               <w:rPr>
@@ -2337,7 +2337,7 @@
               <w14:ligatures w14:val="standardContextual"/>
             </w:rPr>
           </w:pPr>
-          <w:hyperlink w:anchor="_Toc242790341" w:history="1">
+          <w:hyperlink w:anchor="_Toc243165736" w:history="1">
             <w:r>
               <w:rPr>
                 <w:rStyle w:val="Hyperlink"/>
@@ -2361,7 +2361,7 @@
               <w:rPr>
                 <w:noProof/>
               </w:rPr>
-              <w:instrText xml:space="preserve"> PAGEREF _Toc242790341 \h </w:instrText>
+              <w:instrText xml:space="preserve"> PAGEREF _Toc243165736 \h </w:instrText>
             </w:r>
             <w:r>
               <w:rPr>
@@ -2378,7 +2378,7 @@
               <w:rPr>
                 <w:noProof/>
               </w:rPr>
-              <w:t>33</w:t>
+              <w:t>34</w:t>
             </w:r>
             <w:r>
               <w:rPr>
@@ -2403,7 +2403,7 @@
               <w14:ligatures w14:val="standardContextual"/>
             </w:rPr>
           </w:pPr>
-          <w:hyperlink w:anchor="_Toc242790342" w:history="1">
+          <w:hyperlink w:anchor="_Toc243165737" w:history="1">
             <w:r>
               <w:rPr>
                 <w:rStyle w:val="Hyperlink"/>
@@ -2427,7 +2427,7 @@
               <w:rPr>
                 <w:noProof/>
               </w:rPr>
-              <w:instrText xml:space="preserve"> PAGEREF _Toc242790342 \h </w:instrText>
+              <w:instrText xml:space="preserve"> PAGEREF _Toc243165737 \h </w:instrText>
             </w:r>
             <w:r>
               <w:rPr>
@@ -2469,7 +2469,7 @@
               <w14:ligatures w14:val="standardContextual"/>
             </w:rPr>
           </w:pPr>
-          <w:hyperlink w:anchor="_Toc242790343" w:history="1">
+          <w:hyperlink w:anchor="_Toc243165738" w:history="1">
             <w:r>
               <w:rPr>
                 <w:rStyle w:val="Hyperlink"/>
@@ -2493,7 +2493,7 @@
               <w:rPr>
                 <w:noProof/>
               </w:rPr>
-              <w:instrText xml:space="preserve"> PAGEREF _Toc242790343 \h </w:instrText>
+              <w:instrText xml:space="preserve"> PAGEREF _Toc243165738 \h </w:instrText>
             </w:r>
             <w:r>
               <w:rPr>
@@ -2535,7 +2535,7 @@
               <w14:ligatures w14:val="standardContextual"/>
             </w:rPr>
           </w:pPr>
-          <w:hyperlink w:anchor="_Toc242790344" w:history="1">
+          <w:hyperlink w:anchor="_Toc243165739" w:history="1">
             <w:r>
               <w:rPr>
                 <w:rStyle w:val="Hyperlink"/>
@@ -2559,7 +2559,7 @@
               <w:rPr>
                 <w:noProof/>
               </w:rPr>
-              <w:instrText xml:space="preserve"> PAGEREF _Toc242790344 \h </w:instrText>
+              <w:instrText xml:space="preserve"> PAGEREF _Toc243165739 \h </w:instrText>
             </w:r>
             <w:r>
               <w:rPr>
@@ -2601,7 +2601,7 @@
               <w14:ligatures w14:val="standardContextual"/>
             </w:rPr>
           </w:pPr>
-          <w:hyperlink w:anchor="_Toc242790345" w:history="1">
+          <w:hyperlink w:anchor="_Toc243165740" w:history="1">
             <w:r>
               <w:rPr>
                 <w:rStyle w:val="Hyperlink"/>
@@ -2625,7 +2625,7 @@
               <w:rPr>
                 <w:noProof/>
               </w:rPr>
-              <w:instrText xml:space="preserve"> PAGEREF _Toc242790345 \h </w:instrText>
+              <w:instrText xml:space="preserve"> PAGEREF _Toc243165740 \h </w:instrText>
             </w:r>
             <w:r>
               <w:rPr>
@@ -2667,7 +2667,7 @@
               <w14:ligatures w14:val="standardContextual"/>
             </w:rPr>
           </w:pPr>
-          <w:hyperlink w:anchor="_Toc242790346" w:history="1">
+          <w:hyperlink w:anchor="_Toc243165741" w:history="1">
             <w:r>
               <w:rPr>
                 <w:rStyle w:val="Hyperlink"/>
@@ -2691,7 +2691,7 @@
               <w:rPr>
                 <w:noProof/>
               </w:rPr>
-              <w:instrText xml:space="preserve"> PAGEREF _Toc242790346 \h </w:instrText>
+              <w:instrText xml:space="preserve"> PAGEREF _Toc243165741 \h </w:instrText>
             </w:r>
             <w:r>
               <w:rPr>
@@ -2733,7 +2733,7 @@
               <w14:ligatures w14:val="standardContextual"/>
             </w:rPr>
           </w:pPr>
-          <w:hyperlink w:anchor="_Toc242790347" w:history="1">
+          <w:hyperlink w:anchor="_Toc243165742" w:history="1">
             <w:r>
               <w:rPr>
                 <w:rStyle w:val="Hyperlink"/>
@@ -2757,7 +2757,7 @@
               <w:rPr>
                 <w:noProof/>
               </w:rPr>
-              <w:instrText xml:space="preserve"> PAGEREF _Toc242790347 \h </w:instrText>
+              <w:instrText xml:space="preserve"> PAGEREF _Toc243165742 \h </w:instrText>
             </w:r>
             <w:r>
               <w:rPr>
@@ -2799,7 +2799,7 @@
               <w14:ligatures w14:val="standardContextual"/>
             </w:rPr>
           </w:pPr>
-          <w:hyperlink w:anchor="_Toc242790348" w:history="1">
+          <w:hyperlink w:anchor="_Toc243165743" w:history="1">
             <w:r>
               <w:rPr>
                 <w:rStyle w:val="Hyperlink"/>
@@ -2823,7 +2823,7 @@
               <w:rPr>
                 <w:noProof/>
               </w:rPr>
-              <w:instrText xml:space="preserve"> PAGEREF _Toc242790348 \h </w:instrText>
+              <w:instrText xml:space="preserve"> PAGEREF _Toc243165743 \h </w:instrText>
             </w:r>
             <w:r>
               <w:rPr>
@@ -2865,7 +2865,7 @@
               <w14:ligatures w14:val="standardContextual"/>
             </w:rPr>
           </w:pPr>
-          <w:hyperlink w:anchor="_Toc242790349" w:history="1">
+          <w:hyperlink w:anchor="_Toc243165744" w:history="1">
             <w:r>
               <w:rPr>
                 <w:rStyle w:val="Hyperlink"/>
@@ -2889,7 +2889,7 @@
               <w:rPr>
                 <w:noProof/>
               </w:rPr>
-              <w:instrText xml:space="preserve"> PAGEREF _Toc242790349 \h </w:instrText>
+              <w:instrText xml:space="preserve"> PAGEREF _Toc243165744 \h </w:instrText>
             </w:r>
             <w:r>
               <w:rPr>
@@ -2931,7 +2931,7 @@
               <w14:ligatures w14:val="standardContextual"/>
             </w:rPr>
           </w:pPr>
-          <w:hyperlink w:anchor="_Toc242790350" w:history="1">
+          <w:hyperlink w:anchor="_Toc243165745" w:history="1">
             <w:r>
               <w:rPr>
                 <w:rStyle w:val="Hyperlink"/>
@@ -2955,7 +2955,7 @@
               <w:rPr>
                 <w:noProof/>
               </w:rPr>
-              <w:instrText xml:space="preserve"> PAGEREF _Toc242790350 \h </w:instrText>
+              <w:instrText xml:space="preserve"> PAGEREF _Toc243165745 \h </w:instrText>
             </w:r>
             <w:r>
               <w:rPr>
@@ -2997,7 +2997,7 @@
               <w14:ligatures w14:val="standardContextual"/>
             </w:rPr>
           </w:pPr>
-          <w:hyperlink w:anchor="_Toc242790351" w:history="1">
+          <w:hyperlink w:anchor="_Toc243165746" w:history="1">
             <w:r>
               <w:rPr>
                 <w:rStyle w:val="Hyperlink"/>
@@ -3021,7 +3021,7 @@
               <w:rPr>
                 <w:noProof/>
               </w:rPr>
-              <w:instrText xml:space="preserve"> PAGEREF _Toc242790351 \h </w:instrText>
+              <w:instrText xml:space="preserve"> PAGEREF _Toc243165746 \h </w:instrText>
             </w:r>
             <w:r>
               <w:rPr>
@@ -3063,7 +3063,7 @@
               <w14:ligatures w14:val="standardContextual"/>
             </w:rPr>
           </w:pPr>
-          <w:hyperlink w:anchor="_Toc242790352" w:history="1">
+          <w:hyperlink w:anchor="_Toc243165747" w:history="1">
             <w:r>
               <w:rPr>
                 <w:rStyle w:val="Hyperlink"/>
@@ -3087,7 +3087,7 @@
               <w:rPr>
                 <w:noProof/>
               </w:rPr>
-              <w:instrText xml:space="preserve"> PAGEREF _Toc242790352 \h </w:instrText>
+              <w:instrText xml:space="preserve"> PAGEREF _Toc243165747 \h </w:instrText>
             </w:r>
             <w:r>
               <w:rPr>
@@ -3129,7 +3129,7 @@
               <w14:ligatures w14:val="standardContextual"/>
             </w:rPr>
           </w:pPr>
-          <w:hyperlink w:anchor="_Toc242790353" w:history="1">
+          <w:hyperlink w:anchor="_Toc243165748" w:history="1">
             <w:r>
               <w:rPr>
                 <w:rStyle w:val="Hyperlink"/>
@@ -3153,7 +3153,7 @@
               <w:rPr>
                 <w:noProof/>
               </w:rPr>
-              <w:instrText xml:space="preserve"> PAGEREF _Toc242790353 \h </w:instrText>
+              <w:instrText xml:space="preserve"> PAGEREF _Toc243165748 \h </w:instrText>
             </w:r>
             <w:r>
               <w:rPr>
@@ -3195,7 +3195,7 @@
               <w14:ligatures w14:val="standardContextual"/>
             </w:rPr>
           </w:pPr>
-          <w:hyperlink w:anchor="_Toc242790354" w:history="1">
+          <w:hyperlink w:anchor="_Toc243165749" w:history="1">
             <w:r>
               <w:rPr>
                 <w:rStyle w:val="Hyperlink"/>
@@ -3219,7 +3219,7 @@
               <w:rPr>
                 <w:noProof/>
               </w:rPr>
-              <w:instrText xml:space="preserve"> PAGEREF _Toc242790354 \h </w:instrText>
+              <w:instrText xml:space="preserve"> PAGEREF _Toc243165749 \h </w:instrText>
             </w:r>
             <w:r>
               <w:rPr>
@@ -3261,7 +3261,7 @@
               <w14:ligatures w14:val="standardContextual"/>
             </w:rPr>
           </w:pPr>
-          <w:hyperlink w:anchor="_Toc242790355" w:history="1">
+          <w:hyperlink w:anchor="_Toc243165750" w:history="1">
             <w:r>
               <w:rPr>
                 <w:rStyle w:val="Hyperlink"/>
@@ -3285,7 +3285,7 @@
               <w:rPr>
                 <w:noProof/>
               </w:rPr>
-              <w:instrText xml:space="preserve"> PAGEREF _Toc242790355 \h </w:instrText>
+              <w:instrText xml:space="preserve"> PAGEREF _Toc243165750 \h </w:instrText>
             </w:r>
             <w:r>
               <w:rPr>
@@ -3327,7 +3327,7 @@
               <w14:ligatures w14:val="standardContextual"/>
             </w:rPr>
           </w:pPr>
-          <w:hyperlink w:anchor="_Toc242790356" w:history="1">
+          <w:hyperlink w:anchor="_Toc243165751" w:history="1">
             <w:r>
               <w:rPr>
                 <w:rStyle w:val="Hyperlink"/>
@@ -3351,7 +3351,7 @@
               <w:rPr>
                 <w:noProof/>
               </w:rPr>
-              <w:instrText xml:space="preserve"> PAGEREF _Toc242790356 \h </w:instrText>
+              <w:instrText xml:space="preserve"> PAGEREF _Toc243165751 \h </w:instrText>
             </w:r>
             <w:r>
               <w:rPr>
@@ -3393,7 +3393,7 @@
               <w14:ligatures w14:val="standardContextual"/>
             </w:rPr>
           </w:pPr>
-          <w:hyperlink w:anchor="_Toc242790357" w:history="1">
+          <w:hyperlink w:anchor="_Toc243165752" w:history="1">
             <w:r>
               <w:rPr>
                 <w:rStyle w:val="Hyperlink"/>
@@ -3417,7 +3417,7 @@
               <w:rPr>
                 <w:noProof/>
               </w:rPr>
-              <w:instrText xml:space="preserve"> PAGEREF _Toc242790357 \h </w:instrText>
+              <w:instrText xml:space="preserve"> PAGEREF _Toc243165752 \h </w:instrText>
             </w:r>
             <w:r>
               <w:rPr>
@@ -3459,7 +3459,7 @@
               <w14:ligatures w14:val="standardContextual"/>
             </w:rPr>
           </w:pPr>
-          <w:hyperlink w:anchor="_Toc242790358" w:history="1">
+          <w:hyperlink w:anchor="_Toc243165753" w:history="1">
             <w:r>
               <w:rPr>
                 <w:rStyle w:val="Hyperlink"/>
@@ -3483,7 +3483,7 @@
               <w:rPr>
                 <w:noProof/>
               </w:rPr>
-              <w:instrText xml:space="preserve"> PAGEREF _Toc242790358 \h </w:instrText>
+              <w:instrText xml:space="preserve"> PAGEREF _Toc243165753 \h </w:instrText>
             </w:r>
             <w:r>
               <w:rPr>
@@ -3525,7 +3525,7 @@
               <w14:ligatures w14:val="standardContextual"/>
             </w:rPr>
           </w:pPr>
-          <w:hyperlink w:anchor="_Toc242790359" w:history="1">
+          <w:hyperlink w:anchor="_Toc243165754" w:history="1">
             <w:r>
               <w:rPr>
                 <w:rStyle w:val="Hyperlink"/>
@@ -3549,7 +3549,7 @@
               <w:rPr>
                 <w:noProof/>
               </w:rPr>
-              <w:instrText xml:space="preserve"> PAGEREF _Toc242790359 \h </w:instrText>
+              <w:instrText xml:space="preserve"> PAGEREF _Toc243165754 \h </w:instrText>
             </w:r>
             <w:r>
               <w:rPr>
@@ -3591,7 +3591,7 @@
               <w14:ligatures w14:val="standardContextual"/>
             </w:rPr>
           </w:pPr>
-          <w:hyperlink w:anchor="_Toc242790360" w:history="1">
+          <w:hyperlink w:anchor="_Toc243165755" w:history="1">
             <w:r>
               <w:rPr>
                 <w:rStyle w:val="Hyperlink"/>
@@ -3615,7 +3615,7 @@
               <w:rPr>
                 <w:noProof/>
               </w:rPr>
-              <w:instrText xml:space="preserve"> PAGEREF _Toc242790360 \h </w:instrText>
+              <w:instrText xml:space="preserve"> PAGEREF _Toc243165755 \h </w:instrText>
             </w:r>
             <w:r>
               <w:rPr>
@@ -3657,7 +3657,7 @@
               <w14:ligatures w14:val="standardContextual"/>
             </w:rPr>
           </w:pPr>
-          <w:hyperlink w:anchor="_Toc242790361" w:history="1">
+          <w:hyperlink w:anchor="_Toc243165756" w:history="1">
             <w:r>
               <w:rPr>
                 <w:rStyle w:val="Hyperlink"/>
@@ -3681,7 +3681,7 @@
               <w:rPr>
                 <w:noProof/>
               </w:rPr>
-              <w:instrText xml:space="preserve"> PAGEREF _Toc242790361 \h </w:instrText>
+              <w:instrText xml:space="preserve"> PAGEREF _Toc243165756 \h </w:instrText>
             </w:r>
             <w:r>
               <w:rPr>
@@ -3723,7 +3723,7 @@
               <w14:ligatures w14:val="standardContextual"/>
             </w:rPr>
           </w:pPr>
-          <w:hyperlink w:anchor="_Toc242790362" w:history="1">
+          <w:hyperlink w:anchor="_Toc243165757" w:history="1">
             <w:r>
               <w:rPr>
                 <w:rStyle w:val="Hyperlink"/>
@@ -3747,7 +3747,7 @@
               <w:rPr>
                 <w:noProof/>
               </w:rPr>
-              <w:instrText xml:space="preserve"> PAGEREF _Toc242790362 \h </w:instrText>
+              <w:instrText xml:space="preserve"> PAGEREF _Toc243165757 \h </w:instrText>
             </w:r>
             <w:r>
               <w:rPr>
@@ -3789,7 +3789,7 @@
               <w14:ligatures w14:val="standardContextual"/>
             </w:rPr>
           </w:pPr>
-          <w:hyperlink w:anchor="_Toc242790363" w:history="1">
+          <w:hyperlink w:anchor="_Toc243165758" w:history="1">
             <w:r>
               <w:rPr>
                 <w:rStyle w:val="Hyperlink"/>
@@ -3813,7 +3813,7 @@
               <w:rPr>
                 <w:noProof/>
               </w:rPr>
-              <w:instrText xml:space="preserve"> PAGEREF _Toc242790363 \h </w:instrText>
+              <w:instrText xml:space="preserve"> PAGEREF _Toc243165758 \h </w:instrText>
             </w:r>
             <w:r>
               <w:rPr>
@@ -3855,7 +3855,7 @@
               <w14:ligatures w14:val="standardContextual"/>
             </w:rPr>
           </w:pPr>
-          <w:hyperlink w:anchor="_Toc242790364" w:history="1">
+          <w:hyperlink w:anchor="_Toc243165759" w:history="1">
             <w:r>
               <w:rPr>
                 <w:rStyle w:val="Hyperlink"/>
@@ -3879,7 +3879,7 @@
               <w:rPr>
                 <w:noProof/>
               </w:rPr>
-              <w:instrText xml:space="preserve"> PAGEREF _Toc242790364 \h </w:instrText>
+              <w:instrText xml:space="preserve"> PAGEREF _Toc243165759 \h </w:instrText>
             </w:r>
             <w:r>
               <w:rPr>
@@ -3921,7 +3921,7 @@
               <w14:ligatures w14:val="standardContextual"/>
             </w:rPr>
           </w:pPr>
-          <w:hyperlink w:anchor="_Toc242790365" w:history="1">
+          <w:hyperlink w:anchor="_Toc243165760" w:history="1">
             <w:r>
               <w:rPr>
                 <w:rStyle w:val="Hyperlink"/>
@@ -3945,7 +3945,7 @@
               <w:rPr>
                 <w:noProof/>
               </w:rPr>
-              <w:instrText xml:space="preserve"> PAGEREF _Toc242790365 \h </w:instrText>
+              <w:instrText xml:space="preserve"> PAGEREF _Toc243165760 \h </w:instrText>
             </w:r>
             <w:r>
               <w:rPr>
@@ -3987,7 +3987,7 @@
               <w14:ligatures w14:val="standardContextual"/>
             </w:rPr>
           </w:pPr>
-          <w:hyperlink w:anchor="_Toc242790366" w:history="1">
+          <w:hyperlink w:anchor="_Toc243165761" w:history="1">
             <w:r>
               <w:rPr>
                 <w:rStyle w:val="Hyperlink"/>
@@ -4011,7 +4011,7 @@
               <w:rPr>
                 <w:noProof/>
               </w:rPr>
-              <w:instrText xml:space="preserve"> PAGEREF _Toc242790366 \h </w:instrText>
+              <w:instrText xml:space="preserve"> PAGEREF _Toc243165761 \h </w:instrText>
             </w:r>
             <w:r>
               <w:rPr>
@@ -4053,7 +4053,7 @@
               <w14:ligatures w14:val="standardContextual"/>
             </w:rPr>
           </w:pPr>
-          <w:hyperlink w:anchor="_Toc242790367" w:history="1">
+          <w:hyperlink w:anchor="_Toc243165762" w:history="1">
             <w:r>
               <w:rPr>
                 <w:rStyle w:val="Hyperlink"/>
@@ -4077,7 +4077,7 @@
               <w:rPr>
                 <w:noProof/>
               </w:rPr>
-              <w:instrText xml:space="preserve"> PAGEREF _Toc242790367 \h </w:instrText>
+              <w:instrText xml:space="preserve"> PAGEREF _Toc243165762 \h </w:instrText>
             </w:r>
             <w:r>
               <w:rPr>
@@ -4119,7 +4119,7 @@
               <w14:ligatures w14:val="standardContextual"/>
             </w:rPr>
           </w:pPr>
-          <w:hyperlink w:anchor="_Toc242790368" w:history="1">
+          <w:hyperlink w:anchor="_Toc243165763" w:history="1">
             <w:r>
               <w:rPr>
                 <w:rStyle w:val="Hyperlink"/>
@@ -4143,7 +4143,7 @@
               <w:rPr>
                 <w:noProof/>
               </w:rPr>
-              <w:instrText xml:space="preserve"> PAGEREF _Toc242790368 \h </w:instrText>
+              <w:instrText xml:space="preserve"> PAGEREF _Toc243165763 \h </w:instrText>
             </w:r>
             <w:r>
               <w:rPr>
@@ -4185,7 +4185,7 @@
               <w14:ligatures w14:val="standardContextual"/>
             </w:rPr>
           </w:pPr>
-          <w:hyperlink w:anchor="_Toc242790369" w:history="1">
+          <w:hyperlink w:anchor="_Toc243165764" w:history="1">
             <w:r>
               <w:rPr>
                 <w:rStyle w:val="Hyperlink"/>
@@ -4209,7 +4209,7 @@
               <w:rPr>
                 <w:noProof/>
               </w:rPr>
-              <w:instrText xml:space="preserve"> PAGEREF _Toc242790369 \h </w:instrText>
+              <w:instrText xml:space="preserve"> PAGEREF _Toc243165764 \h </w:instrText>
             </w:r>
             <w:r>
               <w:rPr>
@@ -4251,7 +4251,7 @@
               <w14:ligatures w14:val="standardContextual"/>
             </w:rPr>
           </w:pPr>
-          <w:hyperlink w:anchor="_Toc242790370" w:history="1">
+          <w:hyperlink w:anchor="_Toc243165765" w:history="1">
             <w:r>
               <w:rPr>
                 <w:rStyle w:val="Hyperlink"/>
@@ -4275,7 +4275,7 @@
               <w:rPr>
                 <w:noProof/>
               </w:rPr>
-              <w:instrText xml:space="preserve"> PAGEREF _Toc242790370 \h </w:instrText>
+              <w:instrText xml:space="preserve"> PAGEREF _Toc243165765 \h </w:instrText>
             </w:r>
             <w:r>
               <w:rPr>
@@ -4317,7 +4317,7 @@
               <w14:ligatures w14:val="standardContextual"/>
             </w:rPr>
           </w:pPr>
-          <w:hyperlink w:anchor="_Toc242790371" w:history="1">
+          <w:hyperlink w:anchor="_Toc243165766" w:history="1">
             <w:r>
               <w:rPr>
                 <w:rStyle w:val="Hyperlink"/>
@@ -4341,7 +4341,7 @@
               <w:rPr>
                 <w:noProof/>
               </w:rPr>
-              <w:instrText xml:space="preserve"> PAGEREF _Toc242790371 \h </w:instrText>
+              <w:instrText xml:space="preserve"> PAGEREF _Toc243165766 \h </w:instrText>
             </w:r>
             <w:r>
               <w:rPr>
@@ -4383,7 +4383,7 @@
               <w14:ligatures w14:val="standardContextual"/>
             </w:rPr>
           </w:pPr>
-          <w:hyperlink w:anchor="_Toc242790372" w:history="1">
+          <w:hyperlink w:anchor="_Toc243165767" w:history="1">
             <w:r>
               <w:rPr>
                 <w:rStyle w:val="Hyperlink"/>
@@ -4407,7 +4407,7 @@
               <w:rPr>
                 <w:noProof/>
               </w:rPr>
-              <w:instrText xml:space="preserve"> PAGEREF _Toc242790372 \h </w:instrText>
+              <w:instrText xml:space="preserve"> PAGEREF _Toc243165767 \h </w:instrText>
             </w:r>
             <w:r>
               <w:rPr>
@@ -4449,7 +4449,7 @@
               <w14:ligatures w14:val="standardContextual"/>
             </w:rPr>
           </w:pPr>
-          <w:hyperlink w:anchor="_Toc242790373" w:history="1">
+          <w:hyperlink w:anchor="_Toc243165768" w:history="1">
             <w:r>
               <w:rPr>
                 <w:rStyle w:val="Hyperlink"/>
@@ -4473,7 +4473,7 @@
               <w:rPr>
                 <w:noProof/>
               </w:rPr>
-              <w:instrText xml:space="preserve"> PAGEREF _Toc242790373 \h </w:instrText>
+              <w:instrText xml:space="preserve"> PAGEREF _Toc243165768 \h </w:instrText>
             </w:r>
             <w:r>
               <w:rPr>
@@ -4515,7 +4515,7 @@
               <w14:ligatures w14:val="standardContextual"/>
             </w:rPr>
           </w:pPr>
-          <w:hyperlink w:anchor="_Toc242790374" w:history="1">
+          <w:hyperlink w:anchor="_Toc243165769" w:history="1">
             <w:r>
               <w:rPr>
                 <w:rStyle w:val="Hyperlink"/>
@@ -4539,7 +4539,7 @@
               <w:rPr>
                 <w:noProof/>
               </w:rPr>
-              <w:instrText xml:space="preserve"> PAGEREF _Toc242790374 \h </w:instrText>
+              <w:instrText xml:space="preserve"> PAGEREF _Toc243165769 \h </w:instrText>
             </w:r>
             <w:r>
               <w:rPr>
@@ -4581,7 +4581,7 @@
               <w14:ligatures w14:val="standardContextual"/>
             </w:rPr>
           </w:pPr>
-          <w:hyperlink w:anchor="_Toc242790375" w:history="1">
+          <w:hyperlink w:anchor="_Toc243165770" w:history="1">
             <w:r>
               <w:rPr>
                 <w:rStyle w:val="Hyperlink"/>
@@ -4605,7 +4605,7 @@
               <w:rPr>
                 <w:noProof/>
               </w:rPr>
-              <w:instrText xml:space="preserve"> PAGEREF _Toc242790375 \h </w:instrText>
+              <w:instrText xml:space="preserve"> PAGEREF _Toc243165770 \h </w:instrText>
             </w:r>
             <w:r>
               <w:rPr>
@@ -4647,7 +4647,7 @@
               <w14:ligatures w14:val="standardContextual"/>
             </w:rPr>
           </w:pPr>
-          <w:hyperlink w:anchor="_Toc242790376" w:history="1">
+          <w:hyperlink w:anchor="_Toc243165771" w:history="1">
             <w:r>
               <w:rPr>
                 <w:rStyle w:val="Hyperlink"/>
@@ -4671,7 +4671,7 @@
               <w:rPr>
                 <w:noProof/>
               </w:rPr>
-              <w:instrText xml:space="preserve"> PAGEREF _Toc242790376 \h </w:instrText>
+              <w:instrText xml:space="preserve"> PAGEREF _Toc243165771 \h </w:instrText>
             </w:r>
             <w:r>
               <w:rPr>
@@ -4713,7 +4713,7 @@
               <w14:ligatures w14:val="standardContextual"/>
             </w:rPr>
           </w:pPr>
-          <w:hyperlink w:anchor="_Toc242790377" w:history="1">
+          <w:hyperlink w:anchor="_Toc243165772" w:history="1">
             <w:r>
               <w:rPr>
                 <w:rStyle w:val="Hyperlink"/>
@@ -4737,7 +4737,7 @@
               <w:rPr>
                 <w:noProof/>
               </w:rPr>
-              <w:instrText xml:space="preserve"> PAGEREF _Toc242790377 \h </w:instrText>
+              <w:instrText xml:space="preserve"> PAGEREF _Toc243165772 \h </w:instrText>
             </w:r>
             <w:r>
               <w:rPr>
@@ -4779,7 +4779,7 @@
               <w14:ligatures w14:val="standardContextual"/>
             </w:rPr>
           </w:pPr>
-          <w:hyperlink w:anchor="_Toc242790378" w:history="1">
+          <w:hyperlink w:anchor="_Toc243165773" w:history="1">
             <w:r>
               <w:rPr>
                 <w:rStyle w:val="Hyperlink"/>
@@ -4803,7 +4803,7 @@
               <w:rPr>
                 <w:noProof/>
               </w:rPr>
-              <w:instrText xml:space="preserve"> PAGEREF _Toc242790378 \h </w:instrText>
+              <w:instrText xml:space="preserve"> PAGEREF _Toc243165773 \h </w:instrText>
             </w:r>
             <w:r>
               <w:rPr>
@@ -4845,7 +4845,7 @@
               <w14:ligatures w14:val="standardContextual"/>
             </w:rPr>
           </w:pPr>
-          <w:hyperlink w:anchor="_Toc242790379" w:history="1">
+          <w:hyperlink w:anchor="_Toc243165774" w:history="1">
             <w:r>
               <w:rPr>
                 <w:rStyle w:val="Hyperlink"/>
@@ -4869,7 +4869,7 @@
               <w:rPr>
                 <w:noProof/>
               </w:rPr>
-              <w:instrText xml:space="preserve"> PAGEREF _Toc242790379 \h </w:instrText>
+              <w:instrText xml:space="preserve"> PAGEREF _Toc243165774 \h </w:instrText>
             </w:r>
             <w:r>
               <w:rPr>
@@ -4920,7 +4920,7 @@
         <w:pStyle w:val="Heading1"/>
         <w:pageBreakBefore/>
       </w:pPr>
-      <w:bookmarkStart w:id="0" w:name="_Toc242790236"/>
+      <w:bookmarkStart w:id="0" w:name="_Toc243165703"/>
       <w:r>
         <w:lastRenderedPageBreak/>
         <w:t>1. Resumen ejecutivo</w:t>
@@ -4974,7 +4974,7 @@
         <w:pStyle w:val="Heading1"/>
         <w:pageBreakBefore/>
       </w:pPr>
-      <w:bookmarkStart w:id="1" w:name="_Toc242790237"/>
+      <w:bookmarkStart w:id="1" w:name="_Toc243165704"/>
       <w:r>
         <w:lastRenderedPageBreak/>
         <w:t>2. Conceptos y glosario</w:t>
@@ -6409,7 +6409,7 @@
         <w:pStyle w:val="Heading1"/>
         <w:pageBreakBefore/>
       </w:pPr>
-      <w:bookmarkStart w:id="2" w:name="_Toc242790238"/>
+      <w:bookmarkStart w:id="2" w:name="_Toc243165705"/>
       <w:r>
         <w:lastRenderedPageBreak/>
         <w:t>3. Arquitectura general</w:t>
@@ -6420,7 +6420,7 @@
       <w:pPr>
         <w:pStyle w:val="Heading2"/>
       </w:pPr>
-      <w:bookmarkStart w:id="3" w:name="_Toc242790239"/>
+      <w:bookmarkStart w:id="3" w:name="_Toc243165706"/>
       <w:r>
         <w:t>3.1 Piezas del sistema</w:t>
       </w:r>
@@ -7046,7 +7046,7 @@
       <w:pPr>
         <w:pStyle w:val="Heading2"/>
       </w:pPr>
-      <w:bookmarkStart w:id="4" w:name="_Toc242790240"/>
+      <w:bookmarkStart w:id="4" w:name="_Toc243165707"/>
       <w:r>
         <w:t>3.2 Flujo de datos</w:t>
       </w:r>
@@ -7341,7 +7341,7 @@
         <w:pStyle w:val="Heading1"/>
         <w:pageBreakBefore/>
       </w:pPr>
-      <w:bookmarkStart w:id="5" w:name="_Toc242790241"/>
+      <w:bookmarkStart w:id="5" w:name="_Toc243165708"/>
       <w:r>
         <w:lastRenderedPageBreak/>
         <w:t>4. Servicios externos</w:t>
@@ -7352,7 +7352,7 @@
       <w:pPr>
         <w:pStyle w:val="Heading2"/>
       </w:pPr>
-      <w:bookmarkStart w:id="6" w:name="_Toc242790242"/>
+      <w:bookmarkStart w:id="6" w:name="_Toc243165709"/>
       <w:r>
         <w:t>4.1 TikTok LIVE</w:t>
       </w:r>
@@ -8111,7 +8111,7 @@
       <w:pPr>
         <w:pStyle w:val="Heading2"/>
       </w:pPr>
-      <w:bookmarkStart w:id="7" w:name="_Toc242790243"/>
+      <w:bookmarkStart w:id="7" w:name="_Toc243165710"/>
       <w:r>
         <w:t>4.2 Euler Stream</w:t>
       </w:r>
@@ -9403,7 +9403,7 @@
       <w:pPr>
         <w:pStyle w:val="Heading2"/>
       </w:pPr>
-      <w:bookmarkStart w:id="8" w:name="_Toc242790244"/>
+      <w:bookmarkStart w:id="8" w:name="_Toc243165711"/>
       <w:r>
         <w:t>4.3 GitHub, GitHub Actions y GitHub Pages</w:t>
       </w:r>
@@ -9607,7 +9607,7 @@
       <w:pPr>
         <w:pStyle w:val="Heading2"/>
       </w:pPr>
-      <w:bookmarkStart w:id="9" w:name="_Toc242790245"/>
+      <w:bookmarkStart w:id="9" w:name="_Toc243165712"/>
       <w:r>
         <w:t>4.4 Google Fonts</w:t>
       </w:r>
@@ -9637,7 +9637,7 @@
       <w:pPr>
         <w:pStyle w:val="Heading2"/>
       </w:pPr>
-      <w:bookmarkStart w:id="10" w:name="_Toc242790246"/>
+      <w:bookmarkStart w:id="10" w:name="_Toc243165713"/>
       <w:r>
         <w:lastRenderedPageBreak/>
         <w:t>4.5 Supabase (cambios en vivo)</w:t>
@@ -9893,7 +9893,7 @@
         <w:pStyle w:val="Heading1"/>
         <w:pageBreakBefore/>
       </w:pPr>
-      <w:bookmarkStart w:id="11" w:name="_Toc242790247"/>
+      <w:bookmarkStart w:id="11" w:name="_Toc243165714"/>
       <w:r>
         <w:lastRenderedPageBreak/>
         <w:t>5. Estructura de archivos</w:t>
@@ -10563,7 +10563,7 @@
         <w:pStyle w:val="Heading1"/>
         <w:pageBreakBefore/>
       </w:pPr>
-      <w:bookmarkStart w:id="12" w:name="_Toc242790248"/>
+      <w:bookmarkStart w:id="12" w:name="_Toc243165715"/>
       <w:r>
         <w:lastRenderedPageBreak/>
         <w:t>6. Frontend: el módulo compartido comun.js</w:t>
@@ -10591,7 +10591,7 @@
       <w:pPr>
         <w:pStyle w:val="Heading2"/>
       </w:pPr>
-      <w:bookmarkStart w:id="13" w:name="_Toc242790249"/>
+      <w:bookmarkStart w:id="13" w:name="_Toc243165716"/>
       <w:r>
         <w:t>6.1 Configuración en la URL</w:t>
       </w:r>
@@ -11062,7 +11062,7 @@
       <w:pPr>
         <w:pStyle w:val="Heading2"/>
       </w:pPr>
-      <w:bookmarkStart w:id="14" w:name="_Toc242790250"/>
+      <w:bookmarkStart w:id="14" w:name="_Toc243165717"/>
       <w:r>
         <w:t>6.2 Eventos normalizados</w:t>
       </w:r>
@@ -11848,7 +11848,7 @@
       <w:pPr>
         <w:pStyle w:val="Heading2"/>
       </w:pPr>
-      <w:bookmarkStart w:id="15" w:name="_Toc242790251"/>
+      <w:bookmarkStart w:id="15" w:name="_Toc243165718"/>
       <w:r>
         <w:t>6.3 Rastreador de regalos (combos y regalos sueltos)</w:t>
       </w:r>
@@ -12578,7 +12578,7 @@
       <w:pPr>
         <w:pStyle w:val="Heading2"/>
       </w:pPr>
-      <w:bookmarkStart w:id="16" w:name="_Toc242790252"/>
+      <w:bookmarkStart w:id="16" w:name="_Toc243165719"/>
       <w:r>
         <w:t>6.4 Conexión con TikTok (conectarTikTok)</w:t>
       </w:r>
@@ -12699,7 +12699,7 @@
       <w:pPr>
         <w:pStyle w:val="Heading2"/>
       </w:pPr>
-      <w:bookmarkStart w:id="17" w:name="_Toc242790253"/>
+      <w:bookmarkStart w:id="17" w:name="_Toc243165720"/>
       <w:r>
         <w:t>6.5 Arranque de widgets (iniciarWidget)</w:t>
       </w:r>
@@ -12925,7 +12925,7 @@
       <w:pPr>
         <w:pStyle w:val="Heading2"/>
       </w:pPr>
-      <w:bookmarkStart w:id="18" w:name="_Toc242790254"/>
+      <w:bookmarkStart w:id="18" w:name="_Toc243165721"/>
       <w:r>
         <w:t>6.6 Utilidades</w:t>
       </w:r>
@@ -12991,7 +12991,7 @@
       <w:pPr>
         <w:pStyle w:val="Heading2"/>
       </w:pPr>
-      <w:bookmarkStart w:id="19" w:name="_Toc242790255"/>
+      <w:bookmarkStart w:id="19" w:name="_Toc243165722"/>
       <w:r>
         <w:lastRenderedPageBreak/>
         <w:t>6.7 Cambios en vivo (nube.js)</w:t>
@@ -13071,7 +13071,7 @@
         <w:pStyle w:val="Heading1"/>
         <w:pageBreakBefore/>
       </w:pPr>
-      <w:bookmarkStart w:id="20" w:name="_Toc242790256"/>
+      <w:bookmarkStart w:id="20" w:name="_Toc243165723"/>
       <w:r>
         <w:lastRenderedPageBreak/>
         <w:t>7. Frontend: los widgets</w:t>
@@ -13114,7 +13114,7 @@
       <w:pPr>
         <w:pStyle w:val="Heading2"/>
       </w:pPr>
-      <w:bookmarkStart w:id="21" w:name="_Toc242790257"/>
+      <w:bookmarkStart w:id="21" w:name="_Toc243165724"/>
       <w:r>
         <w:t>7.1 Ruleta de regalos (ruleta.html)</w:t>
       </w:r>
@@ -13133,59 +13133,7 @@
         <w:spacing w:after="120"/>
       </w:pPr>
       <w:r>
-        <w:t xml:space="preserve">El HTML tiene cuatro zonas, de arriba abajo: el </w:t>
-      </w:r>
-      <w:r>
-        <w:rPr>
-          <w:b/>
-          <w:bCs/>
-        </w:rPr>
-        <w:t>aviso</w:t>
-      </w:r>
-      <w:r>
-        <w:t xml:space="preserve"> (“Fulano envió una rosa”), la </w:t>
-      </w:r>
-      <w:r>
-        <w:rPr>
-          <w:b/>
-          <w:bCs/>
-        </w:rPr>
-        <w:t>rueda</w:t>
-      </w:r>
-      <w:r>
-        <w:t xml:space="preserve"> (un </w:t>
-      </w:r>
-      <w:r>
-        <w:rPr>
-          <w:rFonts w:ascii="Consolas" w:eastAsia="Consolas" w:hAnsi="Consolas" w:cs="Consolas"/>
-          <w:color w:val="7A1F33"/>
-          <w:sz w:val="19"/>
-          <w:szCs w:val="19"/>
-        </w:rPr>
-        <w:t>&lt;canvas&gt;</w:t>
-      </w:r>
-      <w:r>
-        <w:t xml:space="preserve"> de 1000 × 1000 px con un puntero SVG en forma de pétalo), el </w:t>
-      </w:r>
-      <w:r>
-        <w:rPr>
-          <w:b/>
-          <w:bCs/>
-        </w:rPr>
-        <w:t>resultado</w:t>
-      </w:r>
-      <w:r>
-        <w:t xml:space="preserve"> (el premio que salió) y la </w:t>
-      </w:r>
-      <w:r>
-        <w:rPr>
-          <w:b/>
-          <w:bCs/>
-        </w:rPr>
-        <w:t>cola</w:t>
-      </w:r>
-      <w:r>
-        <w:t xml:space="preserve"> (“+3 en espera”).</w:t>
+        <w:t>El HTML tiene cuatro zonas, de arriba abajo: el aviso (“Fulano envió una rosa”, con la miniatura del regalo; en reposo se vuelve el letrero “Envía una rosa 🌹 para girar”), la rueda (un &lt;canvas&gt; de 1000 × 1000 px con un puntero SVG en forma de pétalo), el resultado (el premio que salió) y la cola (“+3 en espera”).</w:t>
       </w:r>
     </w:p>
     <w:p>
@@ -13985,6 +13933,172 @@
           </w:p>
         </w:tc>
       </w:tr>
+      <w:tr>
+        <w:tc>
+          <w:tcPr>
+            <w:tcW w:w="1497" w:type="dxa"/>
+            <w:tcBorders>
+              <w:top w:val="single" w:sz="4" w:space="0" w:color="BFBFBF"/>
+              <w:left w:val="single" w:sz="4" w:space="0" w:color="BFBFBF"/>
+              <w:bottom w:val="single" w:sz="4" w:space="0" w:color="BFBFBF"/>
+              <w:right w:val="single" w:sz="4" w:space="0" w:color="BFBFBF"/>
+            </w:tcBorders>
+            <w:tcMar>
+              <w:top w:w="60" w:type="dxa"/>
+              <w:left w:w="100" w:type="dxa"/>
+              <w:bottom w:w="60" w:type="dxa"/>
+              <w:right w:w="100" w:type="dxa"/>
+            </w:tcMar>
+          </w:tcPr>
+          <w:p>
+            <w:pPr>
+              <w:spacing w:after="20"/>
+            </w:pPr>
+            <w:r>
+              <w:rPr>
+                <w:rFonts w:ascii="Consolas" w:eastAsia="Consolas" w:hAnsi="Consolas" w:cs="Consolas"/>
+                <w:color w:val="7A1F33"/>
+                <w:sz w:val="19"/>
+                <w:szCs w:val="19"/>
+              </w:rPr>
+              <w:t>in</w:t>
+            </w:r>
+          </w:p>
+        </w:tc>
+        <w:tc>
+          <w:tcPr>
+            <w:tcW w:w="5054" w:type="dxa"/>
+            <w:tcBorders>
+              <w:top w:val="single" w:sz="4" w:space="0" w:color="BFBFBF"/>
+              <w:left w:val="single" w:sz="4" w:space="0" w:color="BFBFBF"/>
+              <w:bottom w:val="single" w:sz="4" w:space="0" w:color="BFBFBF"/>
+              <w:right w:val="single" w:sz="4" w:space="0" w:color="BFBFBF"/>
+            </w:tcBorders>
+            <w:tcMar>
+              <w:top w:w="60" w:type="dxa"/>
+              <w:left w:w="100" w:type="dxa"/>
+              <w:bottom w:w="60" w:type="dxa"/>
+              <w:right w:w="100" w:type="dxa"/>
+            </w:tcMar>
+          </w:tcPr>
+          <w:p>
+            <w:pPr>
+              <w:spacing w:after="20"/>
+            </w:pPr>
+            <w:r>
+              <w:t>Letrero “Envía … para girar” mientras no hay giros (1 o 0). Sigue a la vista aunque la ruleta se oculte</w:t>
+            </w:r>
+          </w:p>
+        </w:tc>
+        <w:tc>
+          <w:tcPr>
+            <w:tcW w:w="2809" w:type="dxa"/>
+            <w:tcBorders>
+              <w:top w:val="single" w:sz="4" w:space="0" w:color="BFBFBF"/>
+              <w:left w:val="single" w:sz="4" w:space="0" w:color="BFBFBF"/>
+              <w:bottom w:val="single" w:sz="4" w:space="0" w:color="BFBFBF"/>
+              <w:right w:val="single" w:sz="4" w:space="0" w:color="BFBFBF"/>
+            </w:tcBorders>
+            <w:tcMar>
+              <w:top w:w="60" w:type="dxa"/>
+              <w:left w:w="100" w:type="dxa"/>
+              <w:bottom w:w="60" w:type="dxa"/>
+              <w:right w:w="100" w:type="dxa"/>
+            </w:tcMar>
+          </w:tcPr>
+          <w:p>
+            <w:pPr>
+              <w:spacing w:after="20"/>
+            </w:pPr>
+            <w:r>
+              <w:t>activado</w:t>
+            </w:r>
+          </w:p>
+        </w:tc>
+      </w:tr>
+      <w:tr>
+        <w:tc>
+          <w:tcPr>
+            <w:tcW w:w="1497" w:type="dxa"/>
+            <w:tcBorders>
+              <w:top w:val="single" w:sz="4" w:space="0" w:color="BFBFBF"/>
+              <w:left w:val="single" w:sz="4" w:space="0" w:color="BFBFBF"/>
+              <w:bottom w:val="single" w:sz="4" w:space="0" w:color="BFBFBF"/>
+              <w:right w:val="single" w:sz="4" w:space="0" w:color="BFBFBF"/>
+            </w:tcBorders>
+            <w:tcMar>
+              <w:top w:w="60" w:type="dxa"/>
+              <w:left w:w="100" w:type="dxa"/>
+              <w:bottom w:w="60" w:type="dxa"/>
+              <w:right w:w="100" w:type="dxa"/>
+            </w:tcMar>
+          </w:tcPr>
+          <w:p>
+            <w:pPr>
+              <w:spacing w:after="20"/>
+            </w:pPr>
+            <w:r>
+              <w:rPr>
+                <w:rFonts w:ascii="Consolas" w:eastAsia="Consolas" w:hAnsi="Consolas" w:cs="Consolas"/>
+                <w:color w:val="7A1F33"/>
+                <w:sz w:val="19"/>
+                <w:szCs w:val="19"/>
+              </w:rPr>
+              <w:t>img</w:t>
+            </w:r>
+          </w:p>
+        </w:tc>
+        <w:tc>
+          <w:tcPr>
+            <w:tcW w:w="5054" w:type="dxa"/>
+            <w:tcBorders>
+              <w:top w:val="single" w:sz="4" w:space="0" w:color="BFBFBF"/>
+              <w:left w:val="single" w:sz="4" w:space="0" w:color="BFBFBF"/>
+              <w:bottom w:val="single" w:sz="4" w:space="0" w:color="BFBFBF"/>
+              <w:right w:val="single" w:sz="4" w:space="0" w:color="BFBFBF"/>
+            </w:tcBorders>
+            <w:tcMar>
+              <w:top w:w="60" w:type="dxa"/>
+              <w:left w:w="100" w:type="dxa"/>
+              <w:bottom w:w="60" w:type="dxa"/>
+              <w:right w:w="100" w:type="dxa"/>
+            </w:tcMar>
+          </w:tcPr>
+          <w:p>
+            <w:pPr>
+              <w:spacing w:after="20"/>
+            </w:pPr>
+            <w:r>
+              <w:t>Miniatura del regalo, tomada del Buscador de regalos. Si falta, el widget usa la que manda TikTok con el primer regalo</w:t>
+            </w:r>
+          </w:p>
+        </w:tc>
+        <w:tc>
+          <w:tcPr>
+            <w:tcW w:w="2809" w:type="dxa"/>
+            <w:tcBorders>
+              <w:top w:val="single" w:sz="4" w:space="0" w:color="BFBFBF"/>
+              <w:left w:val="single" w:sz="4" w:space="0" w:color="BFBFBF"/>
+              <w:bottom w:val="single" w:sz="4" w:space="0" w:color="BFBFBF"/>
+              <w:right w:val="single" w:sz="4" w:space="0" w:color="BFBFBF"/>
+            </w:tcBorders>
+            <w:tcMar>
+              <w:top w:w="60" w:type="dxa"/>
+              <w:left w:w="100" w:type="dxa"/>
+              <w:bottom w:w="60" w:type="dxa"/>
+              <w:right w:w="100" w:type="dxa"/>
+            </w:tcMar>
+          </w:tcPr>
+          <w:p>
+            <w:pPr>
+              <w:spacing w:after="20"/>
+            </w:pPr>
+            <w:r>
+              <w:t>—</w:t>
+            </w:r>
+          </w:p>
+        </w:tc>
+      </w:tr>
     </w:tbl>
     <w:p>
       <w:pPr>
@@ -14105,6 +14219,7 @@
         <w:spacing w:after="60"/>
       </w:pPr>
       <w:r>
+        <w:lastRenderedPageBreak/>
         <w:t xml:space="preserve">Encola el giro. Una función </w:t>
       </w:r>
       <w:r>
@@ -14168,7 +14283,6 @@
         <w:spacing w:after="60"/>
       </w:pPr>
       <w:r>
-        <w:lastRenderedPageBreak/>
         <w:t xml:space="preserve">Muestra el premio 2,8 segundos y pasa al siguiente giro. Al vaciarse la cola, si </w:t>
       </w:r>
       <w:r>
@@ -14199,6 +14313,112 @@
     </w:p>
     <w:p>
       <w:pPr>
+        <w:pStyle w:val="ListParagraph"/>
+        <w:numPr>
+          <w:ilvl w:val="0"/>
+          <w:numId w:val="7"/>
+        </w:numPr>
+        <w:spacing w:after="60"/>
+      </w:pPr>
+      <w:r>
+        <w:t xml:space="preserve">Sin giros en cola, el aviso se vuelve </w:t>
+      </w:r>
+      <w:r>
+        <w:rPr>
+          <w:b/>
+          <w:bCs/>
+        </w:rPr>
+        <w:t>letrero</w:t>
+      </w:r>
+      <w:r>
+        <w:t xml:space="preserve"> (</w:t>
+      </w:r>
+      <w:r>
+        <w:rPr>
+          <w:rFonts w:ascii="Consolas" w:eastAsia="Consolas" w:hAnsi="Consolas" w:cs="Consolas"/>
+          <w:color w:val="7A1F33"/>
+          <w:sz w:val="19"/>
+          <w:szCs w:val="19"/>
+        </w:rPr>
+        <w:t>in</w:t>
+      </w:r>
+      <w:r>
+        <w:t xml:space="preserve">): “Envía una rosa 🌹 para girar”. Con </w:t>
+      </w:r>
+      <w:r>
+        <w:rPr>
+          <w:rFonts w:ascii="Consolas" w:eastAsia="Consolas" w:hAnsi="Consolas" w:cs="Consolas"/>
+          <w:color w:val="7A1F33"/>
+          <w:sz w:val="19"/>
+          <w:szCs w:val="19"/>
+        </w:rPr>
+        <w:t>oc</w:t>
+      </w:r>
+      <w:r>
+        <w:t xml:space="preserve"> activo la ruleta se desvanece, pero el letrero sigue a la vista (la regla </w:t>
+      </w:r>
+      <w:r>
+        <w:rPr>
+          <w:rFonts w:ascii="Consolas" w:eastAsia="Consolas" w:hAnsi="Consolas" w:cs="Consolas"/>
+          <w:color w:val="7A1F33"/>
+          <w:sz w:val="19"/>
+          <w:szCs w:val="19"/>
+        </w:rPr>
+        <w:t>.escena.oculta &gt; :not(.indicando)</w:t>
+      </w:r>
+      <w:r>
+        <w:t xml:space="preserve"> de </w:t>
+      </w:r>
+      <w:r>
+        <w:rPr>
+          <w:rFonts w:ascii="Consolas" w:eastAsia="Consolas" w:hAnsi="Consolas" w:cs="Consolas"/>
+          <w:color w:val="7A1F33"/>
+          <w:sz w:val="19"/>
+          <w:szCs w:val="19"/>
+        </w:rPr>
+        <w:t>ruleta.css</w:t>
+      </w:r>
+      <w:r>
+        <w:t>). Si llega en vivo la misma configuración, el letrero no repite su animación de entrada.</w:t>
+      </w:r>
+    </w:p>
+    <w:p>
+      <w:pPr>
+        <w:pStyle w:val="ListParagraph"/>
+        <w:numPr>
+          <w:ilvl w:val="0"/>
+          <w:numId w:val="7"/>
+        </w:numPr>
+        <w:spacing w:after="60"/>
+      </w:pPr>
+      <w:r>
+        <w:t xml:space="preserve">La </w:t>
+      </w:r>
+      <w:r>
+        <w:rPr>
+          <w:b/>
+          <w:bCs/>
+        </w:rPr>
+        <w:t>miniatura</w:t>
+      </w:r>
+      <w:r>
+        <w:t xml:space="preserve"> del regalo (</w:t>
+      </w:r>
+      <w:r>
+        <w:rPr>
+          <w:rFonts w:ascii="Consolas" w:eastAsia="Consolas" w:hAnsi="Consolas" w:cs="Consolas"/>
+          <w:color w:val="7A1F33"/>
+          <w:sz w:val="19"/>
+          <w:szCs w:val="19"/>
+        </w:rPr>
+        <w:t>img</w:t>
+      </w:r>
+      <w:r>
+        <w:t>) acompaña al letrero y a cada aviso “Fulano envió…”. La pone el panel desde el Buscador de regalos; si el regalo todavía no está ahí, el widget recuerda la imagen que manda TikTok con el primer regalo que llega (solo si es el regalo configurado).</w:t>
+      </w:r>
+    </w:p>
+    <w:p>
+      <w:pPr>
         <w:spacing w:after="120"/>
       </w:pPr>
       <w:r>
@@ -14209,7 +14429,7 @@
       <w:pPr>
         <w:pStyle w:val="Heading2"/>
       </w:pPr>
-      <w:bookmarkStart w:id="22" w:name="_Toc242790258"/>
+      <w:bookmarkStart w:id="22" w:name="_Toc243165725"/>
       <w:r>
         <w:t>7.2 Meta (meta.html)</w:t>
       </w:r>
@@ -14819,8 +15039,9 @@
       <w:pPr>
         <w:pStyle w:val="Heading2"/>
       </w:pPr>
-      <w:bookmarkStart w:id="23" w:name="_Toc242790259"/>
-      <w:r>
+      <w:bookmarkStart w:id="23" w:name="_Toc243165726"/>
+      <w:r>
+        <w:lastRenderedPageBreak/>
         <w:t>7.3 Alertas (alertas.html)</w:t>
       </w:r>
       <w:bookmarkEnd w:id="23"/>
@@ -15186,7 +15407,7 @@
       <w:pPr>
         <w:pStyle w:val="Heading2"/>
       </w:pPr>
-      <w:bookmarkStart w:id="24" w:name="_Toc242790260"/>
+      <w:bookmarkStart w:id="24" w:name="_Toc243165727"/>
       <w:r>
         <w:t>7.4 Carrera de regalos (carrera.html)</w:t>
       </w:r>
@@ -15850,6 +16071,7 @@
                 <w:sz w:val="19"/>
                 <w:szCs w:val="19"/>
               </w:rPr>
+              <w:lastRenderedPageBreak/>
               <w:t>est</w:t>
             </w:r>
           </w:p>
@@ -15978,7 +16200,6 @@
         <w:spacing w:after="60"/>
       </w:pPr>
       <w:r>
-        <w:lastRenderedPageBreak/>
         <w:t xml:space="preserve">Con </w:t>
       </w:r>
       <w:r>
@@ -16542,6 +16763,7 @@
           <w:bCs/>
           <w:color w:val="E5304F"/>
         </w:rPr>
+        <w:lastRenderedPageBreak/>
         <w:t xml:space="preserve">Limitación: </w:t>
       </w:r>
       <w:r>
@@ -16552,7 +16774,7 @@
       <w:pPr>
         <w:pStyle w:val="Heading2"/>
       </w:pPr>
-      <w:bookmarkStart w:id="25" w:name="_Toc242790261"/>
+      <w:bookmarkStart w:id="25" w:name="_Toc243165728"/>
       <w:r>
         <w:t>7.5 Batalla de regalos (batalla.html)</w:t>
       </w:r>
@@ -16591,11 +16813,7 @@
         <w:t>#lado-a</w:t>
       </w:r>
       <w:r>
-        <w:t xml:space="preserve">) avanza desde la izquierda; </w:t>
-      </w:r>
-      <w:r>
-        <w:lastRenderedPageBreak/>
-        <w:t>donde se encuentran está el frente (</w:t>
+        <w:t>) avanza desde la izquierda; donde se encuentran está el frente (</w:t>
       </w:r>
       <w:r>
         <w:rPr>
@@ -17177,6 +17395,7 @@
         <w:spacing w:after="60"/>
       </w:pPr>
       <w:r>
+        <w:lastRenderedPageBreak/>
         <w:t>Los puntos se guardan en el navegador de OBS (</w:t>
       </w:r>
       <w:r>
@@ -17208,7 +17427,7 @@
       <w:pPr>
         <w:pStyle w:val="Heading2"/>
       </w:pPr>
-      <w:bookmarkStart w:id="26" w:name="_Toc242790262"/>
+      <w:bookmarkStart w:id="26" w:name="_Toc243165729"/>
       <w:r>
         <w:t>7.6 Jefe del LIVE (jefe.html)</w:t>
       </w:r>
@@ -17280,17 +17499,7 @@
           <w:sz w:val="19"/>
           <w:szCs w:val="19"/>
         </w:rPr>
-        <w:t>--</w:t>
-      </w:r>
-      <w:r>
-        <w:rPr>
-          <w:rFonts w:ascii="Consolas" w:eastAsia="Consolas" w:hAnsi="Consolas" w:cs="Consolas"/>
-          <w:color w:val="7A1F33"/>
-          <w:sz w:val="19"/>
-          <w:szCs w:val="19"/>
-        </w:rPr>
-        <w:lastRenderedPageBreak/>
-        <w:t>acento-relleno</w:t>
+        <w:t>--acento-relleno</w:t>
       </w:r>
       <w:r>
         <w:t>) y el rastro (</w:t>
@@ -18229,6 +18438,7 @@
         <w:spacing w:after="60"/>
       </w:pPr>
       <w:r>
+        <w:lastRenderedPageBreak/>
         <w:t>La vida nunca baja de 0. Al llegar a 0 el jefe queda vencido: el reloj del widget se congela en el tiempo que sobró, suena la fanfarria y los ataques siguientes ya no cuentan.</w:t>
       </w:r>
     </w:p>
@@ -18344,9 +18554,8 @@
       <w:pPr>
         <w:pStyle w:val="Heading2"/>
       </w:pPr>
-      <w:bookmarkStart w:id="27" w:name="_Toc242790263"/>
-      <w:r>
-        <w:lastRenderedPageBreak/>
+      <w:bookmarkStart w:id="27" w:name="_Toc243165730"/>
+      <w:r>
         <w:t>7.7 Subathon (subathon.html)</w:t>
       </w:r>
       <w:bookmarkEnd w:id="27"/>
@@ -18914,6 +19123,7 @@
                 <w:sz w:val="19"/>
                 <w:szCs w:val="19"/>
               </w:rPr>
+              <w:lastRenderedPageBreak/>
               <w:t>ex</w:t>
             </w:r>
           </w:p>
@@ -19504,7 +19714,7 @@
       <w:pPr>
         <w:pStyle w:val="Heading2"/>
       </w:pPr>
-      <w:bookmarkStart w:id="28" w:name="_Toc242790264"/>
+      <w:bookmarkStart w:id="28" w:name="_Toc243165731"/>
       <w:r>
         <w:t>7.8 Bóveda dorada (boveda.html)</w:t>
       </w:r>
@@ -19599,6 +19809,7 @@
         <w:pStyle w:val="Heading3"/>
       </w:pPr>
       <w:r>
+        <w:lastRenderedPageBreak/>
         <w:t>Configuración</w:t>
       </w:r>
     </w:p>
@@ -20062,7 +20273,6 @@
                 <w:sz w:val="19"/>
                 <w:szCs w:val="19"/>
               </w:rPr>
-              <w:lastRenderedPageBreak/>
               <w:t>ro</w:t>
             </w:r>
           </w:p>
@@ -20443,7 +20653,7 @@
       <w:pPr>
         <w:pStyle w:val="Heading2"/>
       </w:pPr>
-      <w:bookmarkStart w:id="29" w:name="_Toc242790265"/>
+      <w:bookmarkStart w:id="29" w:name="_Toc243165732"/>
       <w:r>
         <w:t>7.9 Trono (trono.html)</w:t>
       </w:r>
@@ -20462,6 +20672,7 @@
         <w:pStyle w:val="Heading3"/>
       </w:pPr>
       <w:r>
+        <w:lastRenderedPageBreak/>
         <w:t>Estructura</w:t>
       </w:r>
     </w:p>
@@ -20735,7 +20946,6 @@
                 <w:sz w:val="19"/>
                 <w:szCs w:val="19"/>
               </w:rPr>
-              <w:lastRenderedPageBreak/>
               <w:t>ti</w:t>
             </w:r>
           </w:p>
@@ -21338,8 +21548,9 @@
       <w:pPr>
         <w:pStyle w:val="Heading2"/>
       </w:pPr>
-      <w:bookmarkStart w:id="30" w:name="_Toc242790338"/>
-      <w:r>
+      <w:bookmarkStart w:id="30" w:name="_Toc243165733"/>
+      <w:r>
+        <w:lastRenderedPageBreak/>
         <w:t>7.10 Marcador (marcador.html)</w:t>
       </w:r>
       <w:bookmarkEnd w:id="30"/>
@@ -21413,11 +21624,7 @@
         <w:t>.filo-oro</w:t>
       </w:r>
       <w:r>
-        <w:t xml:space="preserve">) apila el nombre en mayúsculas espaciadas, el ícono del regalo pequeño y el puntaje en grande con letras de oro metálico. </w:t>
-      </w:r>
-      <w:r>
-        <w:lastRenderedPageBreak/>
-        <w:t xml:space="preserve">Un filo fino de color arriba de la tarjeta muestra el color propio del integrante (si no tiene, el acento del estilo). Las medidas usan </w:t>
+        <w:t xml:space="preserve">) apila el nombre en mayúsculas espaciadas, el ícono del regalo pequeño y el puntaje en grande con letras de oro metálico. Un filo fino de color arriba de la tarjeta muestra el color propio del integrante (si no tiene, el acento del estilo). Las medidas usan </w:t>
       </w:r>
       <w:r>
         <w:rPr>
@@ -22129,8 +22336,9 @@
       <w:pPr>
         <w:pStyle w:val="Heading2"/>
       </w:pPr>
-      <w:bookmarkStart w:id="31" w:name="_Toc242790339"/>
-      <w:r>
+      <w:bookmarkStart w:id="31" w:name="_Toc243165734"/>
+      <w:r>
+        <w:lastRenderedPageBreak/>
         <w:t>7.11 Repertorio (repertorio.html)</w:t>
       </w:r>
       <w:bookmarkEnd w:id="31"/>
@@ -22212,7 +22420,6 @@
         <w:pStyle w:val="Heading3"/>
       </w:pPr>
       <w:r>
-        <w:lastRenderedPageBreak/>
         <w:t>Configuración</w:t>
       </w:r>
     </w:p>
@@ -23082,8 +23289,9 @@
       <w:pPr>
         <w:pStyle w:val="Heading2"/>
       </w:pPr>
-      <w:bookmarkStart w:id="32" w:name="_Toc242790340"/>
-      <w:r>
+      <w:bookmarkStart w:id="32" w:name="_Toc243165735"/>
+      <w:r>
+        <w:lastRenderedPageBreak/>
         <w:t>7.12 Mensaje VIP destacado (destacado.html)</w:t>
       </w:r>
       <w:bookmarkEnd w:id="32"/>
@@ -23129,7 +23337,6 @@
         <w:pStyle w:val="Heading3"/>
       </w:pPr>
       <w:r>
-        <w:lastRenderedPageBreak/>
         <w:t>Configuración</w:t>
       </w:r>
     </w:p>
@@ -23903,8 +24110,9 @@
       <w:pPr>
         <w:pStyle w:val="Heading2"/>
       </w:pPr>
-      <w:bookmarkStart w:id="33" w:name="_Toc242790341"/>
-      <w:r>
+      <w:bookmarkStart w:id="33" w:name="_Toc243165736"/>
+      <w:r>
+        <w:lastRenderedPageBreak/>
         <w:t>7.13 Tragamonedas (tragamonedas.html)</w:t>
       </w:r>
       <w:bookmarkEnd w:id="33"/>
@@ -23938,7 +24146,6 @@
         <w:pStyle w:val="Heading3"/>
       </w:pPr>
       <w:r>
-        <w:lastRenderedPageBreak/>
         <w:t>Configuración</w:t>
       </w:r>
     </w:p>
@@ -24667,7 +24874,7 @@
         <w:pStyle w:val="Heading1"/>
         <w:pageBreakBefore/>
       </w:pPr>
-      <w:bookmarkStart w:id="34" w:name="_Toc242790342"/>
+      <w:bookmarkStart w:id="34" w:name="_Toc243165737"/>
       <w:r>
         <w:lastRenderedPageBreak/>
         <w:t>8. Frontend: el panel</w:t>
@@ -24678,7 +24885,7 @@
       <w:pPr>
         <w:pStyle w:val="Heading2"/>
       </w:pPr>
-      <w:bookmarkStart w:id="35" w:name="_Toc242790343"/>
+      <w:bookmarkStart w:id="35" w:name="_Toc243165738"/>
       <w:r>
         <w:t>8.1 Estructura de la página (index.html)</w:t>
       </w:r>
@@ -25171,7 +25378,7 @@
       <w:pPr>
         <w:pStyle w:val="Heading2"/>
       </w:pPr>
-      <w:bookmarkStart w:id="36" w:name="_Toc242790344"/>
+      <w:bookmarkStart w:id="36" w:name="_Toc243165739"/>
       <w:r>
         <w:t>8.2 Navegación y ciclo de vida (app.js)</w:t>
       </w:r>
@@ -25352,7 +25559,7 @@
       <w:pPr>
         <w:pStyle w:val="Heading2"/>
       </w:pPr>
-      <w:bookmarkStart w:id="37" w:name="_Toc242790345"/>
+      <w:bookmarkStart w:id="37" w:name="_Toc243165740"/>
       <w:r>
         <w:t>8.3 Mapa del panel (registro.js)</w:t>
       </w:r>
@@ -26200,7 +26407,7 @@
       <w:pPr>
         <w:pStyle w:val="Heading2"/>
       </w:pPr>
-      <w:bookmarkStart w:id="38" w:name="_Toc242790346"/>
+      <w:bookmarkStart w:id="38" w:name="_Toc243165741"/>
       <w:r>
         <w:t>8.4 Datos guardados (almacen.js)</w:t>
       </w:r>
@@ -27000,7 +27207,7 @@
       <w:pPr>
         <w:pStyle w:val="Heading2"/>
       </w:pPr>
-      <w:bookmarkStart w:id="39" w:name="_Toc242790347"/>
+      <w:bookmarkStart w:id="39" w:name="_Toc243165742"/>
       <w:r>
         <w:t>8.5 Conexión del panel al LIVE (envivo.js)</w:t>
       </w:r>
@@ -27065,7 +27272,7 @@
       <w:pPr>
         <w:pStyle w:val="Heading2"/>
       </w:pPr>
-      <w:bookmarkStart w:id="40" w:name="_Toc242790348"/>
+      <w:bookmarkStart w:id="40" w:name="_Toc243165743"/>
       <w:r>
         <w:t>8.6 Componentes de interfaz (ui.js)</w:t>
       </w:r>
@@ -27573,7 +27780,7 @@
       <w:pPr>
         <w:pStyle w:val="Heading2"/>
       </w:pPr>
-      <w:bookmarkStart w:id="41" w:name="_Toc242790349"/>
+      <w:bookmarkStart w:id="41" w:name="_Toc243165744"/>
       <w:r>
         <w:t>8.7 Las vistas</w:t>
       </w:r>
@@ -27592,7 +27799,7 @@
         <w:spacing w:after="120"/>
       </w:pPr>
       <w:r>
-        <w:t>Tarjeta del widget (con opciones de ocultar y sonido), editor de premios con el porcentaje de probabilidad de cada uno (al cambiar un peso solo se actualizan los porcentajes, sin perder el foco del campo) y la tarjeta del regalo que la activa (ID, texto, giros por regalo y tope por combo).</w:t>
+        <w:t>Tarjeta del widget (con opciones de ocultar, sonido y “Mostrar a los espectadores con qué regalo se gira”), editor de premios con el porcentaje de probabilidad de cada uno (al cambiar un peso solo se actualizan los porcentajes, sin perder el foco del campo) y la tarjeta del regalo que la activa (ID con sugerencias del Buscador de regalos, texto, giros por regalo y tope por combo). Esa tarjeta muestra la miniatura, el nombre y el precio del regalo elegido; si el regalo no está en el Buscador, avisa que la miniatura aparecerá cuando llegue una vez al LIVE.</w:t>
       </w:r>
     </w:p>
     <w:p>
@@ -27928,7 +28135,7 @@
       <w:pPr>
         <w:pStyle w:val="Heading2"/>
       </w:pPr>
-      <w:bookmarkStart w:id="42" w:name="_Toc242790350"/>
+      <w:bookmarkStart w:id="42" w:name="_Toc243165745"/>
       <w:r>
         <w:t>8.8 Vista previa y pruebas</w:t>
       </w:r>
@@ -28000,7 +28207,7 @@
       <w:pPr>
         <w:pStyle w:val="Heading2"/>
       </w:pPr>
-      <w:bookmarkStart w:id="43" w:name="_Toc242790351"/>
+      <w:bookmarkStart w:id="43" w:name="_Toc243165746"/>
       <w:r>
         <w:t>8.9 Cambios en vivo en el panel (sincronizar.js)</w:t>
       </w:r>
@@ -28101,7 +28308,7 @@
         <w:pStyle w:val="Heading1"/>
         <w:pageBreakBefore/>
       </w:pPr>
-      <w:bookmarkStart w:id="44" w:name="_Toc242790352"/>
+      <w:bookmarkStart w:id="44" w:name="_Toc243165747"/>
       <w:r>
         <w:lastRenderedPageBreak/>
         <w:t>9. Flujos completos paso a paso</w:t>
@@ -28112,7 +28319,7 @@
       <w:pPr>
         <w:pStyle w:val="Heading2"/>
       </w:pPr>
-      <w:bookmarkStart w:id="45" w:name="_Toc242790353"/>
+      <w:bookmarkStart w:id="45" w:name="_Toc243165748"/>
       <w:r>
         <w:t>9.1 Configurar un widget y ponerlo en OBS</w:t>
       </w:r>
@@ -28295,7 +28502,7 @@
       <w:pPr>
         <w:pStyle w:val="Heading2"/>
       </w:pPr>
-      <w:bookmarkStart w:id="46" w:name="_Toc242790354"/>
+      <w:bookmarkStart w:id="46" w:name="_Toc243165749"/>
       <w:r>
         <w:t>9.2 Llega un regalo y gira la ruleta</w:t>
       </w:r>
@@ -28436,7 +28643,7 @@
       <w:pPr>
         <w:pStyle w:val="Heading2"/>
       </w:pPr>
-      <w:bookmarkStart w:id="47" w:name="_Toc242790355"/>
+      <w:bookmarkStart w:id="47" w:name="_Toc243165750"/>
       <w:r>
         <w:t>9.3 Probar sin estar en vivo</w:t>
       </w:r>
@@ -28531,7 +28738,7 @@
       <w:pPr>
         <w:pStyle w:val="Heading2"/>
       </w:pPr>
-      <w:bookmarkStart w:id="48" w:name="_Toc242790356"/>
+      <w:bookmarkStart w:id="48" w:name="_Toc243165751"/>
       <w:r>
         <w:lastRenderedPageBreak/>
         <w:t>9.4 Un regalo cambia de código</w:t>
@@ -28900,7 +29107,7 @@
       <w:pPr>
         <w:pStyle w:val="Heading2"/>
       </w:pPr>
-      <w:bookmarkStart w:id="49" w:name="_Toc242790357"/>
+      <w:bookmarkStart w:id="49" w:name="_Toc243165752"/>
       <w:r>
         <w:t>9.5 Cambiar la configuración durante el LIVE</w:t>
       </w:r>
@@ -28962,7 +29169,7 @@
       <w:pPr>
         <w:pStyle w:val="Heading2"/>
       </w:pPr>
-      <w:bookmarkStart w:id="50" w:name="_Toc242790358"/>
+      <w:bookmarkStart w:id="50" w:name="_Toc243165753"/>
       <w:r>
         <w:t>9.6 Una ronda de la carrera de regalos</w:t>
       </w:r>
@@ -29076,7 +29283,7 @@
         <w:pStyle w:val="Heading1"/>
         <w:pageBreakBefore/>
       </w:pPr>
-      <w:bookmarkStart w:id="51" w:name="_Toc242790359"/>
+      <w:bookmarkStart w:id="51" w:name="_Toc243165754"/>
       <w:r>
         <w:lastRenderedPageBreak/>
         <w:t>10. Diseño visual</w:t>
@@ -29087,7 +29294,7 @@
       <w:pPr>
         <w:pStyle w:val="Heading2"/>
       </w:pPr>
-      <w:bookmarkStart w:id="52" w:name="_Toc242790360"/>
+      <w:bookmarkStart w:id="52" w:name="_Toc243165755"/>
       <w:r>
         <w:t>10.1 Panel</w:t>
       </w:r>
@@ -29896,7 +30103,7 @@
       <w:pPr>
         <w:pStyle w:val="Heading2"/>
       </w:pPr>
-      <w:bookmarkStart w:id="53" w:name="_Toc242790361"/>
+      <w:bookmarkStart w:id="53" w:name="_Toc243165756"/>
       <w:r>
         <w:t>10.2 Widgets</w:t>
       </w:r>
@@ -30458,7 +30665,7 @@
         <w:pStyle w:val="Heading1"/>
         <w:pageBreakBefore/>
       </w:pPr>
-      <w:bookmarkStart w:id="54" w:name="_Toc242790362"/>
+      <w:bookmarkStart w:id="54" w:name="_Toc243165757"/>
       <w:r>
         <w:lastRenderedPageBreak/>
         <w:t>11. Seguridad y privacidad</w:t>
@@ -30976,7 +31183,7 @@
         <w:pStyle w:val="Heading1"/>
         <w:pageBreakBefore/>
       </w:pPr>
-      <w:bookmarkStart w:id="55" w:name="_Toc242790363"/>
+      <w:bookmarkStart w:id="55" w:name="_Toc243165758"/>
       <w:r>
         <w:lastRenderedPageBreak/>
         <w:t>12. Limitaciones actuales</w:t>
@@ -32592,7 +32799,7 @@
         <w:pStyle w:val="Heading1"/>
         <w:pageBreakBefore/>
       </w:pPr>
-      <w:bookmarkStart w:id="56" w:name="_Toc242790364"/>
+      <w:bookmarkStart w:id="56" w:name="_Toc243165759"/>
       <w:r>
         <w:lastRenderedPageBreak/>
         <w:t>13. Hacia una versión final montada en un servidor</w:t>
@@ -32621,7 +32828,7 @@
       <w:pPr>
         <w:pStyle w:val="Heading2"/>
       </w:pPr>
-      <w:bookmarkStart w:id="57" w:name="_Toc242790365"/>
+      <w:bookmarkStart w:id="57" w:name="_Toc243165760"/>
       <w:r>
         <w:t>13.1 Objetivos de la versión final</w:t>
       </w:r>
@@ -32783,7 +32990,7 @@
       <w:pPr>
         <w:pStyle w:val="Heading2"/>
       </w:pPr>
-      <w:bookmarkStart w:id="58" w:name="_Toc242790366"/>
+      <w:bookmarkStart w:id="58" w:name="_Toc243165761"/>
       <w:r>
         <w:t>13.2 Arquitectura propuesta</w:t>
       </w:r>
@@ -33616,7 +33823,7 @@
       <w:pPr>
         <w:pStyle w:val="Heading2"/>
       </w:pPr>
-      <w:bookmarkStart w:id="59" w:name="_Toc242790367"/>
+      <w:bookmarkStart w:id="59" w:name="_Toc243165762"/>
       <w:r>
         <w:t>13.3 Modelo de datos sugerido</w:t>
       </w:r>
@@ -34327,7 +34534,7 @@
       <w:pPr>
         <w:pStyle w:val="Heading2"/>
       </w:pPr>
-      <w:bookmarkStart w:id="60" w:name="_Toc242790368"/>
+      <w:bookmarkStart w:id="60" w:name="_Toc243165763"/>
       <w:r>
         <w:lastRenderedPageBreak/>
         <w:t>13.4 Seguridad en la versión final</w:t>
@@ -34566,7 +34773,7 @@
       <w:pPr>
         <w:pStyle w:val="Heading2"/>
       </w:pPr>
-      <w:bookmarkStart w:id="61" w:name="_Toc242790369"/>
+      <w:bookmarkStart w:id="61" w:name="_Toc243165764"/>
       <w:r>
         <w:t>13.5 Dónde alojarlo</w:t>
       </w:r>
@@ -35175,7 +35382,7 @@
       <w:pPr>
         <w:pStyle w:val="Heading2"/>
       </w:pPr>
-      <w:bookmarkStart w:id="62" w:name="_Toc242790370"/>
+      <w:bookmarkStart w:id="62" w:name="_Toc243165765"/>
       <w:r>
         <w:t>13.6 Qué se reutiliza y qué cambia del código actual</w:t>
       </w:r>
@@ -35987,7 +36194,7 @@
       <w:pPr>
         <w:pStyle w:val="Heading2"/>
       </w:pPr>
-      <w:bookmarkStart w:id="63" w:name="_Toc242790371"/>
+      <w:bookmarkStart w:id="63" w:name="_Toc243165766"/>
       <w:r>
         <w:lastRenderedPageBreak/>
         <w:t>13.7 Mejoras técnicas recomendadas</w:t>
@@ -36178,7 +36385,7 @@
       <w:pPr>
         <w:pStyle w:val="Heading2"/>
       </w:pPr>
-      <w:bookmarkStart w:id="64" w:name="_Toc242790372"/>
+      <w:bookmarkStart w:id="64" w:name="_Toc243165767"/>
       <w:r>
         <w:t>13.8 Nuevas funciones que habilita un servidor</w:t>
       </w:r>
@@ -36279,7 +36486,7 @@
       <w:pPr>
         <w:pStyle w:val="Heading2"/>
       </w:pPr>
-      <w:bookmarkStart w:id="65" w:name="_Toc242790373"/>
+      <w:bookmarkStart w:id="65" w:name="_Toc243165768"/>
       <w:r>
         <w:t>13.9 Hoja de ruta por fases</w:t>
       </w:r>
@@ -36763,7 +36970,7 @@
         <w:pStyle w:val="Heading1"/>
         <w:pageBreakBefore/>
       </w:pPr>
-      <w:bookmarkStart w:id="66" w:name="_Toc242790374"/>
+      <w:bookmarkStart w:id="66" w:name="_Toc243165769"/>
       <w:r>
         <w:lastRenderedPageBreak/>
         <w:t>14. Operación y mantenimiento actual</w:t>
@@ -36774,7 +36981,7 @@
       <w:pPr>
         <w:pStyle w:val="Heading2"/>
       </w:pPr>
-      <w:bookmarkStart w:id="67" w:name="_Toc242790375"/>
+      <w:bookmarkStart w:id="67" w:name="_Toc243165770"/>
       <w:r>
         <w:t>14.1 Publicar un cambio</w:t>
       </w:r>
@@ -36840,7 +37047,7 @@
       <w:pPr>
         <w:pStyle w:val="Heading2"/>
       </w:pPr>
-      <w:bookmarkStart w:id="68" w:name="_Toc242790376"/>
+      <w:bookmarkStart w:id="68" w:name="_Toc243165771"/>
       <w:r>
         <w:t>14.2 Agregar una función nueva</w:t>
       </w:r>
@@ -36901,7 +37108,7 @@
       <w:pPr>
         <w:pStyle w:val="Heading2"/>
       </w:pPr>
-      <w:bookmarkStart w:id="69" w:name="_Toc242790377"/>
+      <w:bookmarkStart w:id="69" w:name="_Toc243165772"/>
       <w:r>
         <w:t>14.3 Probar</w:t>
       </w:r>
@@ -37093,7 +37300,7 @@
       <w:pPr>
         <w:pStyle w:val="Heading2"/>
       </w:pPr>
-      <w:bookmarkStart w:id="70" w:name="_Toc242790378"/>
+      <w:bookmarkStart w:id="70" w:name="_Toc243165773"/>
       <w:r>
         <w:t>14.4 Solución de problemas</w:t>
       </w:r>
@@ -38448,6 +38655,83 @@
           </w:p>
         </w:tc>
       </w:tr>
+      <w:tr>
+        <w:tc>
+          <w:tcPr>
+            <w:tcW w:w="2808" w:type="dxa"/>
+            <w:tcBorders>
+              <w:top w:val="single" w:sz="4" w:space="0" w:color="BFBFBF"/>
+              <w:left w:val="single" w:sz="4" w:space="0" w:color="BFBFBF"/>
+              <w:bottom w:val="single" w:sz="4" w:space="0" w:color="BFBFBF"/>
+              <w:right w:val="single" w:sz="4" w:space="0" w:color="BFBFBF"/>
+            </w:tcBorders>
+            <w:tcMar>
+              <w:top w:w="60" w:type="dxa"/>
+              <w:left w:w="100" w:type="dxa"/>
+              <w:bottom w:w="60" w:type="dxa"/>
+              <w:right w:w="100" w:type="dxa"/>
+            </w:tcMar>
+          </w:tcPr>
+          <w:p>
+            <w:pPr>
+              <w:spacing w:after="20"/>
+            </w:pPr>
+            <w:r>
+              <w:t>La ruleta no muestra la miniatura del regalo</w:t>
+            </w:r>
+          </w:p>
+        </w:tc>
+        <w:tc>
+          <w:tcPr>
+            <w:tcW w:w="2995" w:type="dxa"/>
+            <w:tcBorders>
+              <w:top w:val="single" w:sz="4" w:space="0" w:color="BFBFBF"/>
+              <w:left w:val="single" w:sz="4" w:space="0" w:color="BFBFBF"/>
+              <w:bottom w:val="single" w:sz="4" w:space="0" w:color="BFBFBF"/>
+              <w:right w:val="single" w:sz="4" w:space="0" w:color="BFBFBF"/>
+            </w:tcBorders>
+            <w:tcMar>
+              <w:top w:w="60" w:type="dxa"/>
+              <w:left w:w="100" w:type="dxa"/>
+              <w:bottom w:w="60" w:type="dxa"/>
+              <w:right w:w="100" w:type="dxa"/>
+            </w:tcMar>
+          </w:tcPr>
+          <w:p>
+            <w:pPr>
+              <w:spacing w:after="20"/>
+            </w:pPr>
+            <w:r>
+              <w:t>El regalo todavía no está en el Buscador de regalos (nunca llegó con el panel conectado)</w:t>
+            </w:r>
+          </w:p>
+        </w:tc>
+        <w:tc>
+          <w:tcPr>
+            <w:tcW w:w="3557" w:type="dxa"/>
+            <w:tcBorders>
+              <w:top w:val="single" w:sz="4" w:space="0" w:color="BFBFBF"/>
+              <w:left w:val="single" w:sz="4" w:space="0" w:color="BFBFBF"/>
+              <w:bottom w:val="single" w:sz="4" w:space="0" w:color="BFBFBF"/>
+              <w:right w:val="single" w:sz="4" w:space="0" w:color="BFBFBF"/>
+            </w:tcBorders>
+            <w:tcMar>
+              <w:top w:w="60" w:type="dxa"/>
+              <w:left w:w="100" w:type="dxa"/>
+              <w:bottom w:w="60" w:type="dxa"/>
+              <w:right w:w="100" w:type="dxa"/>
+            </w:tcMar>
+          </w:tcPr>
+          <w:p>
+            <w:pPr>
+              <w:spacing w:after="20"/>
+            </w:pPr>
+            <w:r>
+              <w:t>Conectar el panel en Actividad y recibir ese regalo una vez; mientras tanto, el widget usa la imagen que mande TikTok</w:t>
+            </w:r>
+          </w:p>
+        </w:tc>
+      </w:tr>
     </w:tbl>
     <w:p>
       <w:pPr>
@@ -38459,7 +38743,7 @@
         <w:pStyle w:val="Heading1"/>
         <w:pageBreakBefore/>
       </w:pPr>
-      <w:bookmarkStart w:id="71" w:name="_Toc242790379"/>
+      <w:bookmarkStart w:id="71" w:name="_Toc243165774"/>
       <w:r>
         <w:lastRenderedPageBreak/>
         <w:t>15. Anexo: historial de decisiones y correcciones</w:t>
@@ -41664,6 +41948,83 @@
             </w:pPr>
             <w:r>
               <w:t>No depende del tamaño de la fuente ni hay que medir las celdas</w:t>
+            </w:r>
+          </w:p>
+        </w:tc>
+      </w:tr>
+      <w:tr>
+        <w:tc>
+          <w:tcPr>
+            <w:tcW w:w="2246" w:type="dxa"/>
+            <w:tcBorders>
+              <w:top w:val="single" w:sz="4" w:space="0" w:color="BFBFBF"/>
+              <w:left w:val="single" w:sz="4" w:space="0" w:color="BFBFBF"/>
+              <w:bottom w:val="single" w:sz="4" w:space="0" w:color="BFBFBF"/>
+              <w:right w:val="single" w:sz="4" w:space="0" w:color="BFBFBF"/>
+            </w:tcBorders>
+            <w:tcMar>
+              <w:top w:w="60" w:type="dxa"/>
+              <w:left w:w="100" w:type="dxa"/>
+              <w:bottom w:w="60" w:type="dxa"/>
+              <w:right w:w="100" w:type="dxa"/>
+            </w:tcMar>
+          </w:tcPr>
+          <w:p>
+            <w:pPr>
+              <w:spacing w:after="20"/>
+            </w:pPr>
+            <w:r>
+              <w:t>Ruletas: letrero y miniatura</w:t>
+            </w:r>
+          </w:p>
+        </w:tc>
+        <w:tc>
+          <w:tcPr>
+            <w:tcW w:w="3744" w:type="dxa"/>
+            <w:tcBorders>
+              <w:top w:val="single" w:sz="4" w:space="0" w:color="BFBFBF"/>
+              <w:left w:val="single" w:sz="4" w:space="0" w:color="BFBFBF"/>
+              <w:bottom w:val="single" w:sz="4" w:space="0" w:color="BFBFBF"/>
+              <w:right w:val="single" w:sz="4" w:space="0" w:color="BFBFBF"/>
+            </w:tcBorders>
+            <w:tcMar>
+              <w:top w:w="60" w:type="dxa"/>
+              <w:left w:w="100" w:type="dxa"/>
+              <w:bottom w:w="60" w:type="dxa"/>
+              <w:right w:w="100" w:type="dxa"/>
+            </w:tcMar>
+          </w:tcPr>
+          <w:p>
+            <w:pPr>
+              <w:spacing w:after="20"/>
+            </w:pPr>
+            <w:r>
+              <w:t>En reposo, letrero “Envía … para girar” con la miniatura del regalo, visible aunque la ruleta se oculte</w:t>
+            </w:r>
+          </w:p>
+        </w:tc>
+        <w:tc>
+          <w:tcPr>
+            <w:tcW w:w="3370" w:type="dxa"/>
+            <w:tcBorders>
+              <w:top w:val="single" w:sz="4" w:space="0" w:color="BFBFBF"/>
+              <w:left w:val="single" w:sz="4" w:space="0" w:color="BFBFBF"/>
+              <w:bottom w:val="single" w:sz="4" w:space="0" w:color="BFBFBF"/>
+              <w:right w:val="single" w:sz="4" w:space="0" w:color="BFBFBF"/>
+            </w:tcBorders>
+            <w:tcMar>
+              <w:top w:w="60" w:type="dxa"/>
+              <w:left w:w="100" w:type="dxa"/>
+              <w:bottom w:w="60" w:type="dxa"/>
+              <w:right w:w="100" w:type="dxa"/>
+            </w:tcMar>
+          </w:tcPr>
+          <w:p>
+            <w:pPr>
+              <w:spacing w:after="20"/>
+            </w:pPr>
+            <w:r>
+              <w:t>Que el público sepa qué regalo hace girar la ruleta sin que ocupe la pantalla</w:t>
             </w:r>
           </w:p>
         </w:tc>

</xml_diff>

<commit_message>
Documentación (Word): likes por total, cambio de cuenta y subathon
- 6.2: crearContadorLikes y el campo propios.
- 6.5, 6.7, 8.5, 8.9 y 11: el usuario viaja por Supabase y gana sobre el de
  la URL; panel y widgets se reconectan solos (la API key sigue solo en la URL).
- 7.7: las sumas de menos de 1 s del subathon se juntan para mostrar el "+".
- 14.4: problemas nuevos (meta de likes, subathon sin sumar, cambio de cuenta)
  e historial; índice actualizado (61 págs.).

Co-Authored-By: Claude Opus 5.5 <noreply@anthropic.com>
</commit_message>
<xml_diff>
--- a/Documentacion-Live-Tools.docx
+++ b/Documentacion-Live-Tools.docx
@@ -159,7 +159,7 @@
           <w:r>
             <w:fldChar w:fldCharType="separate"/>
           </w:r>
-          <w:hyperlink w:anchor="_Toc243165703" w:history="1">
+          <w:hyperlink w:anchor="_Toc243168953" w:history="1">
             <w:r>
               <w:rPr>
                 <w:rStyle w:val="Hyperlink"/>
@@ -183,7 +183,7 @@
               <w:rPr>
                 <w:noProof/>
               </w:rPr>
-              <w:instrText xml:space="preserve"> PAGEREF _Toc243165703 \h </w:instrText>
+              <w:instrText xml:space="preserve"> PAGEREF _Toc243168953 \h </w:instrText>
             </w:r>
             <w:r>
               <w:rPr>
@@ -225,7 +225,7 @@
               <w14:ligatures w14:val="standardContextual"/>
             </w:rPr>
           </w:pPr>
-          <w:hyperlink w:anchor="_Toc243165704" w:history="1">
+          <w:hyperlink w:anchor="_Toc243168954" w:history="1">
             <w:r>
               <w:rPr>
                 <w:rStyle w:val="Hyperlink"/>
@@ -249,7 +249,7 @@
               <w:rPr>
                 <w:noProof/>
               </w:rPr>
-              <w:instrText xml:space="preserve"> PAGEREF _Toc243165704 \h </w:instrText>
+              <w:instrText xml:space="preserve"> PAGEREF _Toc243168954 \h </w:instrText>
             </w:r>
             <w:r>
               <w:rPr>
@@ -291,7 +291,7 @@
               <w14:ligatures w14:val="standardContextual"/>
             </w:rPr>
           </w:pPr>
-          <w:hyperlink w:anchor="_Toc243165705" w:history="1">
+          <w:hyperlink w:anchor="_Toc243168955" w:history="1">
             <w:r>
               <w:rPr>
                 <w:rStyle w:val="Hyperlink"/>
@@ -315,7 +315,7 @@
               <w:rPr>
                 <w:noProof/>
               </w:rPr>
-              <w:instrText xml:space="preserve"> PAGEREF _Toc243165705 \h </w:instrText>
+              <w:instrText xml:space="preserve"> PAGEREF _Toc243168955 \h </w:instrText>
             </w:r>
             <w:r>
               <w:rPr>
@@ -357,7 +357,7 @@
               <w14:ligatures w14:val="standardContextual"/>
             </w:rPr>
           </w:pPr>
-          <w:hyperlink w:anchor="_Toc243165706" w:history="1">
+          <w:hyperlink w:anchor="_Toc243168956" w:history="1">
             <w:r>
               <w:rPr>
                 <w:rStyle w:val="Hyperlink"/>
@@ -381,7 +381,7 @@
               <w:rPr>
                 <w:noProof/>
               </w:rPr>
-              <w:instrText xml:space="preserve"> PAGEREF _Toc243165706 \h </w:instrText>
+              <w:instrText xml:space="preserve"> PAGEREF _Toc243168956 \h </w:instrText>
             </w:r>
             <w:r>
               <w:rPr>
@@ -423,7 +423,7 @@
               <w14:ligatures w14:val="standardContextual"/>
             </w:rPr>
           </w:pPr>
-          <w:hyperlink w:anchor="_Toc243165707" w:history="1">
+          <w:hyperlink w:anchor="_Toc243168957" w:history="1">
             <w:r>
               <w:rPr>
                 <w:rStyle w:val="Hyperlink"/>
@@ -447,7 +447,7 @@
               <w:rPr>
                 <w:noProof/>
               </w:rPr>
-              <w:instrText xml:space="preserve"> PAGEREF _Toc243165707 \h </w:instrText>
+              <w:instrText xml:space="preserve"> PAGEREF _Toc243168957 \h </w:instrText>
             </w:r>
             <w:r>
               <w:rPr>
@@ -489,7 +489,7 @@
               <w14:ligatures w14:val="standardContextual"/>
             </w:rPr>
           </w:pPr>
-          <w:hyperlink w:anchor="_Toc243165708" w:history="1">
+          <w:hyperlink w:anchor="_Toc243168958" w:history="1">
             <w:r>
               <w:rPr>
                 <w:rStyle w:val="Hyperlink"/>
@@ -513,7 +513,7 @@
               <w:rPr>
                 <w:noProof/>
               </w:rPr>
-              <w:instrText xml:space="preserve"> PAGEREF _Toc243165708 \h </w:instrText>
+              <w:instrText xml:space="preserve"> PAGEREF _Toc243168958 \h </w:instrText>
             </w:r>
             <w:r>
               <w:rPr>
@@ -555,7 +555,7 @@
               <w14:ligatures w14:val="standardContextual"/>
             </w:rPr>
           </w:pPr>
-          <w:hyperlink w:anchor="_Toc243165709" w:history="1">
+          <w:hyperlink w:anchor="_Toc243168959" w:history="1">
             <w:r>
               <w:rPr>
                 <w:rStyle w:val="Hyperlink"/>
@@ -579,7 +579,7 @@
               <w:rPr>
                 <w:noProof/>
               </w:rPr>
-              <w:instrText xml:space="preserve"> PAGEREF _Toc243165709 \h </w:instrText>
+              <w:instrText xml:space="preserve"> PAGEREF _Toc243168959 \h </w:instrText>
             </w:r>
             <w:r>
               <w:rPr>
@@ -621,7 +621,7 @@
               <w14:ligatures w14:val="standardContextual"/>
             </w:rPr>
           </w:pPr>
-          <w:hyperlink w:anchor="_Toc243165710" w:history="1">
+          <w:hyperlink w:anchor="_Toc243168960" w:history="1">
             <w:r>
               <w:rPr>
                 <w:rStyle w:val="Hyperlink"/>
@@ -645,7 +645,7 @@
               <w:rPr>
                 <w:noProof/>
               </w:rPr>
-              <w:instrText xml:space="preserve"> PAGEREF _Toc243165710 \h </w:instrText>
+              <w:instrText xml:space="preserve"> PAGEREF _Toc243168960 \h </w:instrText>
             </w:r>
             <w:r>
               <w:rPr>
@@ -687,7 +687,7 @@
               <w14:ligatures w14:val="standardContextual"/>
             </w:rPr>
           </w:pPr>
-          <w:hyperlink w:anchor="_Toc243165711" w:history="1">
+          <w:hyperlink w:anchor="_Toc243168961" w:history="1">
             <w:r>
               <w:rPr>
                 <w:rStyle w:val="Hyperlink"/>
@@ -711,7 +711,7 @@
               <w:rPr>
                 <w:noProof/>
               </w:rPr>
-              <w:instrText xml:space="preserve"> PAGEREF _Toc243165711 \h </w:instrText>
+              <w:instrText xml:space="preserve"> PAGEREF _Toc243168961 \h </w:instrText>
             </w:r>
             <w:r>
               <w:rPr>
@@ -753,7 +753,7 @@
               <w14:ligatures w14:val="standardContextual"/>
             </w:rPr>
           </w:pPr>
-          <w:hyperlink w:anchor="_Toc243165712" w:history="1">
+          <w:hyperlink w:anchor="_Toc243168962" w:history="1">
             <w:r>
               <w:rPr>
                 <w:rStyle w:val="Hyperlink"/>
@@ -777,7 +777,7 @@
               <w:rPr>
                 <w:noProof/>
               </w:rPr>
-              <w:instrText xml:space="preserve"> PAGEREF _Toc243165712 \h </w:instrText>
+              <w:instrText xml:space="preserve"> PAGEREF _Toc243168962 \h </w:instrText>
             </w:r>
             <w:r>
               <w:rPr>
@@ -819,7 +819,7 @@
               <w14:ligatures w14:val="standardContextual"/>
             </w:rPr>
           </w:pPr>
-          <w:hyperlink w:anchor="_Toc243165713" w:history="1">
+          <w:hyperlink w:anchor="_Toc243168963" w:history="1">
             <w:r>
               <w:rPr>
                 <w:rStyle w:val="Hyperlink"/>
@@ -843,7 +843,7 @@
               <w:rPr>
                 <w:noProof/>
               </w:rPr>
-              <w:instrText xml:space="preserve"> PAGEREF _Toc243165713 \h </w:instrText>
+              <w:instrText xml:space="preserve"> PAGEREF _Toc243168963 \h </w:instrText>
             </w:r>
             <w:r>
               <w:rPr>
@@ -885,7 +885,7 @@
               <w14:ligatures w14:val="standardContextual"/>
             </w:rPr>
           </w:pPr>
-          <w:hyperlink w:anchor="_Toc243165714" w:history="1">
+          <w:hyperlink w:anchor="_Toc243168964" w:history="1">
             <w:r>
               <w:rPr>
                 <w:rStyle w:val="Hyperlink"/>
@@ -909,7 +909,7 @@
               <w:rPr>
                 <w:noProof/>
               </w:rPr>
-              <w:instrText xml:space="preserve"> PAGEREF _Toc243165714 \h </w:instrText>
+              <w:instrText xml:space="preserve"> PAGEREF _Toc243168964 \h </w:instrText>
             </w:r>
             <w:r>
               <w:rPr>
@@ -951,7 +951,7 @@
               <w14:ligatures w14:val="standardContextual"/>
             </w:rPr>
           </w:pPr>
-          <w:hyperlink w:anchor="_Toc243165715" w:history="1">
+          <w:hyperlink w:anchor="_Toc243168965" w:history="1">
             <w:r>
               <w:rPr>
                 <w:rStyle w:val="Hyperlink"/>
@@ -975,7 +975,7 @@
               <w:rPr>
                 <w:noProof/>
               </w:rPr>
-              <w:instrText xml:space="preserve"> PAGEREF _Toc243165715 \h </w:instrText>
+              <w:instrText xml:space="preserve"> PAGEREF _Toc243168965 \h </w:instrText>
             </w:r>
             <w:r>
               <w:rPr>
@@ -1017,7 +1017,7 @@
               <w14:ligatures w14:val="standardContextual"/>
             </w:rPr>
           </w:pPr>
-          <w:hyperlink w:anchor="_Toc243165716" w:history="1">
+          <w:hyperlink w:anchor="_Toc243168966" w:history="1">
             <w:r>
               <w:rPr>
                 <w:rStyle w:val="Hyperlink"/>
@@ -1041,7 +1041,7 @@
               <w:rPr>
                 <w:noProof/>
               </w:rPr>
-              <w:instrText xml:space="preserve"> PAGEREF _Toc243165716 \h </w:instrText>
+              <w:instrText xml:space="preserve"> PAGEREF _Toc243168966 \h </w:instrText>
             </w:r>
             <w:r>
               <w:rPr>
@@ -1083,7 +1083,7 @@
               <w14:ligatures w14:val="standardContextual"/>
             </w:rPr>
           </w:pPr>
-          <w:hyperlink w:anchor="_Toc243165717" w:history="1">
+          <w:hyperlink w:anchor="_Toc243168967" w:history="1">
             <w:r>
               <w:rPr>
                 <w:rStyle w:val="Hyperlink"/>
@@ -1107,7 +1107,7 @@
               <w:rPr>
                 <w:noProof/>
               </w:rPr>
-              <w:instrText xml:space="preserve"> PAGEREF _Toc243165717 \h </w:instrText>
+              <w:instrText xml:space="preserve"> PAGEREF _Toc243168967 \h </w:instrText>
             </w:r>
             <w:r>
               <w:rPr>
@@ -1149,7 +1149,7 @@
               <w14:ligatures w14:val="standardContextual"/>
             </w:rPr>
           </w:pPr>
-          <w:hyperlink w:anchor="_Toc243165718" w:history="1">
+          <w:hyperlink w:anchor="_Toc243168968" w:history="1">
             <w:r>
               <w:rPr>
                 <w:rStyle w:val="Hyperlink"/>
@@ -1173,7 +1173,7 @@
               <w:rPr>
                 <w:noProof/>
               </w:rPr>
-              <w:instrText xml:space="preserve"> PAGEREF _Toc243165718 \h </w:instrText>
+              <w:instrText xml:space="preserve"> PAGEREF _Toc243168968 \h </w:instrText>
             </w:r>
             <w:r>
               <w:rPr>
@@ -1215,7 +1215,7 @@
               <w14:ligatures w14:val="standardContextual"/>
             </w:rPr>
           </w:pPr>
-          <w:hyperlink w:anchor="_Toc243165719" w:history="1">
+          <w:hyperlink w:anchor="_Toc243168969" w:history="1">
             <w:r>
               <w:rPr>
                 <w:rStyle w:val="Hyperlink"/>
@@ -1239,7 +1239,7 @@
               <w:rPr>
                 <w:noProof/>
               </w:rPr>
-              <w:instrText xml:space="preserve"> PAGEREF _Toc243165719 \h </w:instrText>
+              <w:instrText xml:space="preserve"> PAGEREF _Toc243168969 \h </w:instrText>
             </w:r>
             <w:r>
               <w:rPr>
@@ -1281,7 +1281,7 @@
               <w14:ligatures w14:val="standardContextual"/>
             </w:rPr>
           </w:pPr>
-          <w:hyperlink w:anchor="_Toc243165720" w:history="1">
+          <w:hyperlink w:anchor="_Toc243168970" w:history="1">
             <w:r>
               <w:rPr>
                 <w:rStyle w:val="Hyperlink"/>
@@ -1305,7 +1305,7 @@
               <w:rPr>
                 <w:noProof/>
               </w:rPr>
-              <w:instrText xml:space="preserve"> PAGEREF _Toc243165720 \h </w:instrText>
+              <w:instrText xml:space="preserve"> PAGEREF _Toc243168970 \h </w:instrText>
             </w:r>
             <w:r>
               <w:rPr>
@@ -1347,7 +1347,7 @@
               <w14:ligatures w14:val="standardContextual"/>
             </w:rPr>
           </w:pPr>
-          <w:hyperlink w:anchor="_Toc243165721" w:history="1">
+          <w:hyperlink w:anchor="_Toc243168971" w:history="1">
             <w:r>
               <w:rPr>
                 <w:rStyle w:val="Hyperlink"/>
@@ -1371,7 +1371,7 @@
               <w:rPr>
                 <w:noProof/>
               </w:rPr>
-              <w:instrText xml:space="preserve"> PAGEREF _Toc243165721 \h </w:instrText>
+              <w:instrText xml:space="preserve"> PAGEREF _Toc243168971 \h </w:instrText>
             </w:r>
             <w:r>
               <w:rPr>
@@ -1388,7 +1388,7 @@
               <w:rPr>
                 <w:noProof/>
               </w:rPr>
-              <w:t>19</w:t>
+              <w:t>20</w:t>
             </w:r>
             <w:r>
               <w:rPr>
@@ -1413,7 +1413,7 @@
               <w14:ligatures w14:val="standardContextual"/>
             </w:rPr>
           </w:pPr>
-          <w:hyperlink w:anchor="_Toc243165722" w:history="1">
+          <w:hyperlink w:anchor="_Toc243168972" w:history="1">
             <w:r>
               <w:rPr>
                 <w:rStyle w:val="Hyperlink"/>
@@ -1437,7 +1437,7 @@
               <w:rPr>
                 <w:noProof/>
               </w:rPr>
-              <w:instrText xml:space="preserve"> PAGEREF _Toc243165722 \h </w:instrText>
+              <w:instrText xml:space="preserve"> PAGEREF _Toc243168972 \h </w:instrText>
             </w:r>
             <w:r>
               <w:rPr>
@@ -1479,7 +1479,7 @@
               <w14:ligatures w14:val="standardContextual"/>
             </w:rPr>
           </w:pPr>
-          <w:hyperlink w:anchor="_Toc243165723" w:history="1">
+          <w:hyperlink w:anchor="_Toc243168973" w:history="1">
             <w:r>
               <w:rPr>
                 <w:rStyle w:val="Hyperlink"/>
@@ -1503,7 +1503,7 @@
               <w:rPr>
                 <w:noProof/>
               </w:rPr>
-              <w:instrText xml:space="preserve"> PAGEREF _Toc243165723 \h </w:instrText>
+              <w:instrText xml:space="preserve"> PAGEREF _Toc243168973 \h </w:instrText>
             </w:r>
             <w:r>
               <w:rPr>
@@ -1545,7 +1545,7 @@
               <w14:ligatures w14:val="standardContextual"/>
             </w:rPr>
           </w:pPr>
-          <w:hyperlink w:anchor="_Toc243165724" w:history="1">
+          <w:hyperlink w:anchor="_Toc243168974" w:history="1">
             <w:r>
               <w:rPr>
                 <w:rStyle w:val="Hyperlink"/>
@@ -1569,7 +1569,7 @@
               <w:rPr>
                 <w:noProof/>
               </w:rPr>
-              <w:instrText xml:space="preserve"> PAGEREF _Toc243165724 \h </w:instrText>
+              <w:instrText xml:space="preserve"> PAGEREF _Toc243168974 \h </w:instrText>
             </w:r>
             <w:r>
               <w:rPr>
@@ -1611,7 +1611,7 @@
               <w14:ligatures w14:val="standardContextual"/>
             </w:rPr>
           </w:pPr>
-          <w:hyperlink w:anchor="_Toc243165725" w:history="1">
+          <w:hyperlink w:anchor="_Toc243168975" w:history="1">
             <w:r>
               <w:rPr>
                 <w:rStyle w:val="Hyperlink"/>
@@ -1635,7 +1635,7 @@
               <w:rPr>
                 <w:noProof/>
               </w:rPr>
-              <w:instrText xml:space="preserve"> PAGEREF _Toc243165725 \h </w:instrText>
+              <w:instrText xml:space="preserve"> PAGEREF _Toc243168975 \h </w:instrText>
             </w:r>
             <w:r>
               <w:rPr>
@@ -1677,7 +1677,7 @@
               <w14:ligatures w14:val="standardContextual"/>
             </w:rPr>
           </w:pPr>
-          <w:hyperlink w:anchor="_Toc243165726" w:history="1">
+          <w:hyperlink w:anchor="_Toc243168976" w:history="1">
             <w:r>
               <w:rPr>
                 <w:rStyle w:val="Hyperlink"/>
@@ -1701,7 +1701,7 @@
               <w:rPr>
                 <w:noProof/>
               </w:rPr>
-              <w:instrText xml:space="preserve"> PAGEREF _Toc243165726 \h </w:instrText>
+              <w:instrText xml:space="preserve"> PAGEREF _Toc243168976 \h </w:instrText>
             </w:r>
             <w:r>
               <w:rPr>
@@ -1743,7 +1743,7 @@
               <w14:ligatures w14:val="standardContextual"/>
             </w:rPr>
           </w:pPr>
-          <w:hyperlink w:anchor="_Toc243165727" w:history="1">
+          <w:hyperlink w:anchor="_Toc243168977" w:history="1">
             <w:r>
               <w:rPr>
                 <w:rStyle w:val="Hyperlink"/>
@@ -1767,7 +1767,7 @@
               <w:rPr>
                 <w:noProof/>
               </w:rPr>
-              <w:instrText xml:space="preserve"> PAGEREF _Toc243165727 \h </w:instrText>
+              <w:instrText xml:space="preserve"> PAGEREF _Toc243168977 \h </w:instrText>
             </w:r>
             <w:r>
               <w:rPr>
@@ -1809,7 +1809,7 @@
               <w14:ligatures w14:val="standardContextual"/>
             </w:rPr>
           </w:pPr>
-          <w:hyperlink w:anchor="_Toc243165728" w:history="1">
+          <w:hyperlink w:anchor="_Toc243168978" w:history="1">
             <w:r>
               <w:rPr>
                 <w:rStyle w:val="Hyperlink"/>
@@ -1833,7 +1833,7 @@
               <w:rPr>
                 <w:noProof/>
               </w:rPr>
-              <w:instrText xml:space="preserve"> PAGEREF _Toc243165728 \h </w:instrText>
+              <w:instrText xml:space="preserve"> PAGEREF _Toc243168978 \h </w:instrText>
             </w:r>
             <w:r>
               <w:rPr>
@@ -1875,7 +1875,7 @@
               <w14:ligatures w14:val="standardContextual"/>
             </w:rPr>
           </w:pPr>
-          <w:hyperlink w:anchor="_Toc243165729" w:history="1">
+          <w:hyperlink w:anchor="_Toc243168979" w:history="1">
             <w:r>
               <w:rPr>
                 <w:rStyle w:val="Hyperlink"/>
@@ -1899,7 +1899,7 @@
               <w:rPr>
                 <w:noProof/>
               </w:rPr>
-              <w:instrText xml:space="preserve"> PAGEREF _Toc243165729 \h </w:instrText>
+              <w:instrText xml:space="preserve"> PAGEREF _Toc243168979 \h </w:instrText>
             </w:r>
             <w:r>
               <w:rPr>
@@ -1941,7 +1941,7 @@
               <w14:ligatures w14:val="standardContextual"/>
             </w:rPr>
           </w:pPr>
-          <w:hyperlink w:anchor="_Toc243165730" w:history="1">
+          <w:hyperlink w:anchor="_Toc243168980" w:history="1">
             <w:r>
               <w:rPr>
                 <w:rStyle w:val="Hyperlink"/>
@@ -1965,7 +1965,7 @@
               <w:rPr>
                 <w:noProof/>
               </w:rPr>
-              <w:instrText xml:space="preserve"> PAGEREF _Toc243165730 \h </w:instrText>
+              <w:instrText xml:space="preserve"> PAGEREF _Toc243168980 \h </w:instrText>
             </w:r>
             <w:r>
               <w:rPr>
@@ -2007,7 +2007,7 @@
               <w14:ligatures w14:val="standardContextual"/>
             </w:rPr>
           </w:pPr>
-          <w:hyperlink w:anchor="_Toc243165731" w:history="1">
+          <w:hyperlink w:anchor="_Toc243168981" w:history="1">
             <w:r>
               <w:rPr>
                 <w:rStyle w:val="Hyperlink"/>
@@ -2031,7 +2031,7 @@
               <w:rPr>
                 <w:noProof/>
               </w:rPr>
-              <w:instrText xml:space="preserve"> PAGEREF _Toc243165731 \h </w:instrText>
+              <w:instrText xml:space="preserve"> PAGEREF _Toc243168981 \h </w:instrText>
             </w:r>
             <w:r>
               <w:rPr>
@@ -2073,7 +2073,7 @@
               <w14:ligatures w14:val="standardContextual"/>
             </w:rPr>
           </w:pPr>
-          <w:hyperlink w:anchor="_Toc243165732" w:history="1">
+          <w:hyperlink w:anchor="_Toc243168982" w:history="1">
             <w:r>
               <w:rPr>
                 <w:rStyle w:val="Hyperlink"/>
@@ -2097,7 +2097,7 @@
               <w:rPr>
                 <w:noProof/>
               </w:rPr>
-              <w:instrText xml:space="preserve"> PAGEREF _Toc243165732 \h </w:instrText>
+              <w:instrText xml:space="preserve"> PAGEREF _Toc243168982 \h </w:instrText>
             </w:r>
             <w:r>
               <w:rPr>
@@ -2139,7 +2139,7 @@
               <w14:ligatures w14:val="standardContextual"/>
             </w:rPr>
           </w:pPr>
-          <w:hyperlink w:anchor="_Toc243165733" w:history="1">
+          <w:hyperlink w:anchor="_Toc243168983" w:history="1">
             <w:r>
               <w:rPr>
                 <w:rStyle w:val="Hyperlink"/>
@@ -2163,7 +2163,7 @@
               <w:rPr>
                 <w:noProof/>
               </w:rPr>
-              <w:instrText xml:space="preserve"> PAGEREF _Toc243165733 \h </w:instrText>
+              <w:instrText xml:space="preserve"> PAGEREF _Toc243168983 \h </w:instrText>
             </w:r>
             <w:r>
               <w:rPr>
@@ -2205,7 +2205,7 @@
               <w14:ligatures w14:val="standardContextual"/>
             </w:rPr>
           </w:pPr>
-          <w:hyperlink w:anchor="_Toc243165734" w:history="1">
+          <w:hyperlink w:anchor="_Toc243168984" w:history="1">
             <w:r>
               <w:rPr>
                 <w:rStyle w:val="Hyperlink"/>
@@ -2229,7 +2229,7 @@
               <w:rPr>
                 <w:noProof/>
               </w:rPr>
-              <w:instrText xml:space="preserve"> PAGEREF _Toc243165734 \h </w:instrText>
+              <w:instrText xml:space="preserve"> PAGEREF _Toc243168984 \h </w:instrText>
             </w:r>
             <w:r>
               <w:rPr>
@@ -2271,7 +2271,7 @@
               <w14:ligatures w14:val="standardContextual"/>
             </w:rPr>
           </w:pPr>
-          <w:hyperlink w:anchor="_Toc243165735" w:history="1">
+          <w:hyperlink w:anchor="_Toc243168985" w:history="1">
             <w:r>
               <w:rPr>
                 <w:rStyle w:val="Hyperlink"/>
@@ -2295,7 +2295,7 @@
               <w:rPr>
                 <w:noProof/>
               </w:rPr>
-              <w:instrText xml:space="preserve"> PAGEREF _Toc243165735 \h </w:instrText>
+              <w:instrText xml:space="preserve"> PAGEREF _Toc243168985 \h </w:instrText>
             </w:r>
             <w:r>
               <w:rPr>
@@ -2337,7 +2337,7 @@
               <w14:ligatures w14:val="standardContextual"/>
             </w:rPr>
           </w:pPr>
-          <w:hyperlink w:anchor="_Toc243165736" w:history="1">
+          <w:hyperlink w:anchor="_Toc243168986" w:history="1">
             <w:r>
               <w:rPr>
                 <w:rStyle w:val="Hyperlink"/>
@@ -2361,7 +2361,7 @@
               <w:rPr>
                 <w:noProof/>
               </w:rPr>
-              <w:instrText xml:space="preserve"> PAGEREF _Toc243165736 \h </w:instrText>
+              <w:instrText xml:space="preserve"> PAGEREF _Toc243168986 \h </w:instrText>
             </w:r>
             <w:r>
               <w:rPr>
@@ -2403,7 +2403,7 @@
               <w14:ligatures w14:val="standardContextual"/>
             </w:rPr>
           </w:pPr>
-          <w:hyperlink w:anchor="_Toc243165737" w:history="1">
+          <w:hyperlink w:anchor="_Toc243168987" w:history="1">
             <w:r>
               <w:rPr>
                 <w:rStyle w:val="Hyperlink"/>
@@ -2427,7 +2427,7 @@
               <w:rPr>
                 <w:noProof/>
               </w:rPr>
-              <w:instrText xml:space="preserve"> PAGEREF _Toc243165737 \h </w:instrText>
+              <w:instrText xml:space="preserve"> PAGEREF _Toc243168987 \h </w:instrText>
             </w:r>
             <w:r>
               <w:rPr>
@@ -2469,7 +2469,7 @@
               <w14:ligatures w14:val="standardContextual"/>
             </w:rPr>
           </w:pPr>
-          <w:hyperlink w:anchor="_Toc243165738" w:history="1">
+          <w:hyperlink w:anchor="_Toc243168988" w:history="1">
             <w:r>
               <w:rPr>
                 <w:rStyle w:val="Hyperlink"/>
@@ -2493,7 +2493,7 @@
               <w:rPr>
                 <w:noProof/>
               </w:rPr>
-              <w:instrText xml:space="preserve"> PAGEREF _Toc243165738 \h </w:instrText>
+              <w:instrText xml:space="preserve"> PAGEREF _Toc243168988 \h </w:instrText>
             </w:r>
             <w:r>
               <w:rPr>
@@ -2535,7 +2535,7 @@
               <w14:ligatures w14:val="standardContextual"/>
             </w:rPr>
           </w:pPr>
-          <w:hyperlink w:anchor="_Toc243165739" w:history="1">
+          <w:hyperlink w:anchor="_Toc243168989" w:history="1">
             <w:r>
               <w:rPr>
                 <w:rStyle w:val="Hyperlink"/>
@@ -2559,7 +2559,7 @@
               <w:rPr>
                 <w:noProof/>
               </w:rPr>
-              <w:instrText xml:space="preserve"> PAGEREF _Toc243165739 \h </w:instrText>
+              <w:instrText xml:space="preserve"> PAGEREF _Toc243168989 \h </w:instrText>
             </w:r>
             <w:r>
               <w:rPr>
@@ -2601,7 +2601,7 @@
               <w14:ligatures w14:val="standardContextual"/>
             </w:rPr>
           </w:pPr>
-          <w:hyperlink w:anchor="_Toc243165740" w:history="1">
+          <w:hyperlink w:anchor="_Toc243168990" w:history="1">
             <w:r>
               <w:rPr>
                 <w:rStyle w:val="Hyperlink"/>
@@ -2625,7 +2625,7 @@
               <w:rPr>
                 <w:noProof/>
               </w:rPr>
-              <w:instrText xml:space="preserve"> PAGEREF _Toc243165740 \h </w:instrText>
+              <w:instrText xml:space="preserve"> PAGEREF _Toc243168990 \h </w:instrText>
             </w:r>
             <w:r>
               <w:rPr>
@@ -2667,7 +2667,7 @@
               <w14:ligatures w14:val="standardContextual"/>
             </w:rPr>
           </w:pPr>
-          <w:hyperlink w:anchor="_Toc243165741" w:history="1">
+          <w:hyperlink w:anchor="_Toc243168991" w:history="1">
             <w:r>
               <w:rPr>
                 <w:rStyle w:val="Hyperlink"/>
@@ -2691,7 +2691,7 @@
               <w:rPr>
                 <w:noProof/>
               </w:rPr>
-              <w:instrText xml:space="preserve"> PAGEREF _Toc243165741 \h </w:instrText>
+              <w:instrText xml:space="preserve"> PAGEREF _Toc243168991 \h </w:instrText>
             </w:r>
             <w:r>
               <w:rPr>
@@ -2733,7 +2733,7 @@
               <w14:ligatures w14:val="standardContextual"/>
             </w:rPr>
           </w:pPr>
-          <w:hyperlink w:anchor="_Toc243165742" w:history="1">
+          <w:hyperlink w:anchor="_Toc243168992" w:history="1">
             <w:r>
               <w:rPr>
                 <w:rStyle w:val="Hyperlink"/>
@@ -2757,7 +2757,7 @@
               <w:rPr>
                 <w:noProof/>
               </w:rPr>
-              <w:instrText xml:space="preserve"> PAGEREF _Toc243165742 \h </w:instrText>
+              <w:instrText xml:space="preserve"> PAGEREF _Toc243168992 \h </w:instrText>
             </w:r>
             <w:r>
               <w:rPr>
@@ -2799,7 +2799,7 @@
               <w14:ligatures w14:val="standardContextual"/>
             </w:rPr>
           </w:pPr>
-          <w:hyperlink w:anchor="_Toc243165743" w:history="1">
+          <w:hyperlink w:anchor="_Toc243168993" w:history="1">
             <w:r>
               <w:rPr>
                 <w:rStyle w:val="Hyperlink"/>
@@ -2823,7 +2823,7 @@
               <w:rPr>
                 <w:noProof/>
               </w:rPr>
-              <w:instrText xml:space="preserve"> PAGEREF _Toc243165743 \h </w:instrText>
+              <w:instrText xml:space="preserve"> PAGEREF _Toc243168993 \h </w:instrText>
             </w:r>
             <w:r>
               <w:rPr>
@@ -2865,7 +2865,7 @@
               <w14:ligatures w14:val="standardContextual"/>
             </w:rPr>
           </w:pPr>
-          <w:hyperlink w:anchor="_Toc243165744" w:history="1">
+          <w:hyperlink w:anchor="_Toc243168994" w:history="1">
             <w:r>
               <w:rPr>
                 <w:rStyle w:val="Hyperlink"/>
@@ -2889,7 +2889,7 @@
               <w:rPr>
                 <w:noProof/>
               </w:rPr>
-              <w:instrText xml:space="preserve"> PAGEREF _Toc243165744 \h </w:instrText>
+              <w:instrText xml:space="preserve"> PAGEREF _Toc243168994 \h </w:instrText>
             </w:r>
             <w:r>
               <w:rPr>
@@ -2931,7 +2931,7 @@
               <w14:ligatures w14:val="standardContextual"/>
             </w:rPr>
           </w:pPr>
-          <w:hyperlink w:anchor="_Toc243165745" w:history="1">
+          <w:hyperlink w:anchor="_Toc243168995" w:history="1">
             <w:r>
               <w:rPr>
                 <w:rStyle w:val="Hyperlink"/>
@@ -2955,7 +2955,7 @@
               <w:rPr>
                 <w:noProof/>
               </w:rPr>
-              <w:instrText xml:space="preserve"> PAGEREF _Toc243165745 \h </w:instrText>
+              <w:instrText xml:space="preserve"> PAGEREF _Toc243168995 \h </w:instrText>
             </w:r>
             <w:r>
               <w:rPr>
@@ -2997,7 +2997,7 @@
               <w14:ligatures w14:val="standardContextual"/>
             </w:rPr>
           </w:pPr>
-          <w:hyperlink w:anchor="_Toc243165746" w:history="1">
+          <w:hyperlink w:anchor="_Toc243168996" w:history="1">
             <w:r>
               <w:rPr>
                 <w:rStyle w:val="Hyperlink"/>
@@ -3021,7 +3021,7 @@
               <w:rPr>
                 <w:noProof/>
               </w:rPr>
-              <w:instrText xml:space="preserve"> PAGEREF _Toc243165746 \h </w:instrText>
+              <w:instrText xml:space="preserve"> PAGEREF _Toc243168996 \h </w:instrText>
             </w:r>
             <w:r>
               <w:rPr>
@@ -3063,7 +3063,7 @@
               <w14:ligatures w14:val="standardContextual"/>
             </w:rPr>
           </w:pPr>
-          <w:hyperlink w:anchor="_Toc243165747" w:history="1">
+          <w:hyperlink w:anchor="_Toc243168997" w:history="1">
             <w:r>
               <w:rPr>
                 <w:rStyle w:val="Hyperlink"/>
@@ -3087,7 +3087,7 @@
               <w:rPr>
                 <w:noProof/>
               </w:rPr>
-              <w:instrText xml:space="preserve"> PAGEREF _Toc243165747 \h </w:instrText>
+              <w:instrText xml:space="preserve"> PAGEREF _Toc243168997 \h </w:instrText>
             </w:r>
             <w:r>
               <w:rPr>
@@ -3104,7 +3104,7 @@
               <w:rPr>
                 <w:noProof/>
               </w:rPr>
-              <w:t>41</w:t>
+              <w:t>42</w:t>
             </w:r>
             <w:r>
               <w:rPr>
@@ -3129,7 +3129,7 @@
               <w14:ligatures w14:val="standardContextual"/>
             </w:rPr>
           </w:pPr>
-          <w:hyperlink w:anchor="_Toc243165748" w:history="1">
+          <w:hyperlink w:anchor="_Toc243168998" w:history="1">
             <w:r>
               <w:rPr>
                 <w:rStyle w:val="Hyperlink"/>
@@ -3153,7 +3153,7 @@
               <w:rPr>
                 <w:noProof/>
               </w:rPr>
-              <w:instrText xml:space="preserve"> PAGEREF _Toc243165748 \h </w:instrText>
+              <w:instrText xml:space="preserve"> PAGEREF _Toc243168998 \h </w:instrText>
             </w:r>
             <w:r>
               <w:rPr>
@@ -3170,7 +3170,7 @@
               <w:rPr>
                 <w:noProof/>
               </w:rPr>
-              <w:t>41</w:t>
+              <w:t>42</w:t>
             </w:r>
             <w:r>
               <w:rPr>
@@ -3195,7 +3195,7 @@
               <w14:ligatures w14:val="standardContextual"/>
             </w:rPr>
           </w:pPr>
-          <w:hyperlink w:anchor="_Toc243165749" w:history="1">
+          <w:hyperlink w:anchor="_Toc243168999" w:history="1">
             <w:r>
               <w:rPr>
                 <w:rStyle w:val="Hyperlink"/>
@@ -3219,7 +3219,7 @@
               <w:rPr>
                 <w:noProof/>
               </w:rPr>
-              <w:instrText xml:space="preserve"> PAGEREF _Toc243165749 \h </w:instrText>
+              <w:instrText xml:space="preserve"> PAGEREF _Toc243168999 \h </w:instrText>
             </w:r>
             <w:r>
               <w:rPr>
@@ -3236,7 +3236,7 @@
               <w:rPr>
                 <w:noProof/>
               </w:rPr>
-              <w:t>41</w:t>
+              <w:t>42</w:t>
             </w:r>
             <w:r>
               <w:rPr>
@@ -3261,7 +3261,7 @@
               <w14:ligatures w14:val="standardContextual"/>
             </w:rPr>
           </w:pPr>
-          <w:hyperlink w:anchor="_Toc243165750" w:history="1">
+          <w:hyperlink w:anchor="_Toc243169000" w:history="1">
             <w:r>
               <w:rPr>
                 <w:rStyle w:val="Hyperlink"/>
@@ -3285,7 +3285,7 @@
               <w:rPr>
                 <w:noProof/>
               </w:rPr>
-              <w:instrText xml:space="preserve"> PAGEREF _Toc243165750 \h </w:instrText>
+              <w:instrText xml:space="preserve"> PAGEREF _Toc243169000 \h </w:instrText>
             </w:r>
             <w:r>
               <w:rPr>
@@ -3302,7 +3302,7 @@
               <w:rPr>
                 <w:noProof/>
               </w:rPr>
-              <w:t>41</w:t>
+              <w:t>42</w:t>
             </w:r>
             <w:r>
               <w:rPr>
@@ -3327,7 +3327,7 @@
               <w14:ligatures w14:val="standardContextual"/>
             </w:rPr>
           </w:pPr>
-          <w:hyperlink w:anchor="_Toc243165751" w:history="1">
+          <w:hyperlink w:anchor="_Toc243169001" w:history="1">
             <w:r>
               <w:rPr>
                 <w:rStyle w:val="Hyperlink"/>
@@ -3351,7 +3351,7 @@
               <w:rPr>
                 <w:noProof/>
               </w:rPr>
-              <w:instrText xml:space="preserve"> PAGEREF _Toc243165751 \h </w:instrText>
+              <w:instrText xml:space="preserve"> PAGEREF _Toc243169001 \h </w:instrText>
             </w:r>
             <w:r>
               <w:rPr>
@@ -3368,7 +3368,7 @@
               <w:rPr>
                 <w:noProof/>
               </w:rPr>
-              <w:t>42</w:t>
+              <w:t>43</w:t>
             </w:r>
             <w:r>
               <w:rPr>
@@ -3393,7 +3393,7 @@
               <w14:ligatures w14:val="standardContextual"/>
             </w:rPr>
           </w:pPr>
-          <w:hyperlink w:anchor="_Toc243165752" w:history="1">
+          <w:hyperlink w:anchor="_Toc243169002" w:history="1">
             <w:r>
               <w:rPr>
                 <w:rStyle w:val="Hyperlink"/>
@@ -3417,7 +3417,7 @@
               <w:rPr>
                 <w:noProof/>
               </w:rPr>
-              <w:instrText xml:space="preserve"> PAGEREF _Toc243165752 \h </w:instrText>
+              <w:instrText xml:space="preserve"> PAGEREF _Toc243169002 \h </w:instrText>
             </w:r>
             <w:r>
               <w:rPr>
@@ -3434,7 +3434,7 @@
               <w:rPr>
                 <w:noProof/>
               </w:rPr>
-              <w:t>42</w:t>
+              <w:t>43</w:t>
             </w:r>
             <w:r>
               <w:rPr>
@@ -3459,7 +3459,7 @@
               <w14:ligatures w14:val="standardContextual"/>
             </w:rPr>
           </w:pPr>
-          <w:hyperlink w:anchor="_Toc243165753" w:history="1">
+          <w:hyperlink w:anchor="_Toc243169003" w:history="1">
             <w:r>
               <w:rPr>
                 <w:rStyle w:val="Hyperlink"/>
@@ -3483,7 +3483,7 @@
               <w:rPr>
                 <w:noProof/>
               </w:rPr>
-              <w:instrText xml:space="preserve"> PAGEREF _Toc243165753 \h </w:instrText>
+              <w:instrText xml:space="preserve"> PAGEREF _Toc243169003 \h </w:instrText>
             </w:r>
             <w:r>
               <w:rPr>
@@ -3500,7 +3500,7 @@
               <w:rPr>
                 <w:noProof/>
               </w:rPr>
-              <w:t>42</w:t>
+              <w:t>43</w:t>
             </w:r>
             <w:r>
               <w:rPr>
@@ -3525,7 +3525,7 @@
               <w14:ligatures w14:val="standardContextual"/>
             </w:rPr>
           </w:pPr>
-          <w:hyperlink w:anchor="_Toc243165754" w:history="1">
+          <w:hyperlink w:anchor="_Toc243169004" w:history="1">
             <w:r>
               <w:rPr>
                 <w:rStyle w:val="Hyperlink"/>
@@ -3549,7 +3549,7 @@
               <w:rPr>
                 <w:noProof/>
               </w:rPr>
-              <w:instrText xml:space="preserve"> PAGEREF _Toc243165754 \h </w:instrText>
+              <w:instrText xml:space="preserve"> PAGEREF _Toc243169004 \h </w:instrText>
             </w:r>
             <w:r>
               <w:rPr>
@@ -3566,7 +3566,7 @@
               <w:rPr>
                 <w:noProof/>
               </w:rPr>
-              <w:t>44</w:t>
+              <w:t>45</w:t>
             </w:r>
             <w:r>
               <w:rPr>
@@ -3591,7 +3591,7 @@
               <w14:ligatures w14:val="standardContextual"/>
             </w:rPr>
           </w:pPr>
-          <w:hyperlink w:anchor="_Toc243165755" w:history="1">
+          <w:hyperlink w:anchor="_Toc243169005" w:history="1">
             <w:r>
               <w:rPr>
                 <w:rStyle w:val="Hyperlink"/>
@@ -3615,7 +3615,7 @@
               <w:rPr>
                 <w:noProof/>
               </w:rPr>
-              <w:instrText xml:space="preserve"> PAGEREF _Toc243165755 \h </w:instrText>
+              <w:instrText xml:space="preserve"> PAGEREF _Toc243169005 \h </w:instrText>
             </w:r>
             <w:r>
               <w:rPr>
@@ -3632,7 +3632,7 @@
               <w:rPr>
                 <w:noProof/>
               </w:rPr>
-              <w:t>44</w:t>
+              <w:t>45</w:t>
             </w:r>
             <w:r>
               <w:rPr>
@@ -3657,7 +3657,7 @@
               <w14:ligatures w14:val="standardContextual"/>
             </w:rPr>
           </w:pPr>
-          <w:hyperlink w:anchor="_Toc243165756" w:history="1">
+          <w:hyperlink w:anchor="_Toc243169006" w:history="1">
             <w:r>
               <w:rPr>
                 <w:rStyle w:val="Hyperlink"/>
@@ -3681,7 +3681,7 @@
               <w:rPr>
                 <w:noProof/>
               </w:rPr>
-              <w:instrText xml:space="preserve"> PAGEREF _Toc243165756 \h </w:instrText>
+              <w:instrText xml:space="preserve"> PAGEREF _Toc243169006 \h </w:instrText>
             </w:r>
             <w:r>
               <w:rPr>
@@ -3698,7 +3698,7 @@
               <w:rPr>
                 <w:noProof/>
               </w:rPr>
-              <w:t>44</w:t>
+              <w:t>45</w:t>
             </w:r>
             <w:r>
               <w:rPr>
@@ -3723,7 +3723,7 @@
               <w14:ligatures w14:val="standardContextual"/>
             </w:rPr>
           </w:pPr>
-          <w:hyperlink w:anchor="_Toc243165757" w:history="1">
+          <w:hyperlink w:anchor="_Toc243169007" w:history="1">
             <w:r>
               <w:rPr>
                 <w:rStyle w:val="Hyperlink"/>
@@ -3747,7 +3747,7 @@
               <w:rPr>
                 <w:noProof/>
               </w:rPr>
-              <w:instrText xml:space="preserve"> PAGEREF _Toc243165757 \h </w:instrText>
+              <w:instrText xml:space="preserve"> PAGEREF _Toc243169007 \h </w:instrText>
             </w:r>
             <w:r>
               <w:rPr>
@@ -3764,7 +3764,7 @@
               <w:rPr>
                 <w:noProof/>
               </w:rPr>
-              <w:t>46</w:t>
+              <w:t>47</w:t>
             </w:r>
             <w:r>
               <w:rPr>
@@ -3789,7 +3789,7 @@
               <w14:ligatures w14:val="standardContextual"/>
             </w:rPr>
           </w:pPr>
-          <w:hyperlink w:anchor="_Toc243165758" w:history="1">
+          <w:hyperlink w:anchor="_Toc243169008" w:history="1">
             <w:r>
               <w:rPr>
                 <w:rStyle w:val="Hyperlink"/>
@@ -3813,7 +3813,7 @@
               <w:rPr>
                 <w:noProof/>
               </w:rPr>
-              <w:instrText xml:space="preserve"> PAGEREF _Toc243165758 \h </w:instrText>
+              <w:instrText xml:space="preserve"> PAGEREF _Toc243169008 \h </w:instrText>
             </w:r>
             <w:r>
               <w:rPr>
@@ -3830,7 +3830,7 @@
               <w:rPr>
                 <w:noProof/>
               </w:rPr>
-              <w:t>47</w:t>
+              <w:t>48</w:t>
             </w:r>
             <w:r>
               <w:rPr>
@@ -3855,7 +3855,7 @@
               <w14:ligatures w14:val="standardContextual"/>
             </w:rPr>
           </w:pPr>
-          <w:hyperlink w:anchor="_Toc243165759" w:history="1">
+          <w:hyperlink w:anchor="_Toc243169009" w:history="1">
             <w:r>
               <w:rPr>
                 <w:rStyle w:val="Hyperlink"/>
@@ -3879,7 +3879,7 @@
               <w:rPr>
                 <w:noProof/>
               </w:rPr>
-              <w:instrText xml:space="preserve"> PAGEREF _Toc243165759 \h </w:instrText>
+              <w:instrText xml:space="preserve"> PAGEREF _Toc243169009 \h </w:instrText>
             </w:r>
             <w:r>
               <w:rPr>
@@ -3896,7 +3896,7 @@
               <w:rPr>
                 <w:noProof/>
               </w:rPr>
-              <w:t>49</w:t>
+              <w:t>50</w:t>
             </w:r>
             <w:r>
               <w:rPr>
@@ -3921,7 +3921,7 @@
               <w14:ligatures w14:val="standardContextual"/>
             </w:rPr>
           </w:pPr>
-          <w:hyperlink w:anchor="_Toc243165760" w:history="1">
+          <w:hyperlink w:anchor="_Toc243169010" w:history="1">
             <w:r>
               <w:rPr>
                 <w:rStyle w:val="Hyperlink"/>
@@ -3945,7 +3945,7 @@
               <w:rPr>
                 <w:noProof/>
               </w:rPr>
-              <w:instrText xml:space="preserve"> PAGEREF _Toc243165760 \h </w:instrText>
+              <w:instrText xml:space="preserve"> PAGEREF _Toc243169010 \h </w:instrText>
             </w:r>
             <w:r>
               <w:rPr>
@@ -3962,7 +3962,7 @@
               <w:rPr>
                 <w:noProof/>
               </w:rPr>
-              <w:t>49</w:t>
+              <w:t>50</w:t>
             </w:r>
             <w:r>
               <w:rPr>
@@ -3987,7 +3987,7 @@
               <w14:ligatures w14:val="standardContextual"/>
             </w:rPr>
           </w:pPr>
-          <w:hyperlink w:anchor="_Toc243165761" w:history="1">
+          <w:hyperlink w:anchor="_Toc243169011" w:history="1">
             <w:r>
               <w:rPr>
                 <w:rStyle w:val="Hyperlink"/>
@@ -4011,7 +4011,7 @@
               <w:rPr>
                 <w:noProof/>
               </w:rPr>
-              <w:instrText xml:space="preserve"> PAGEREF _Toc243165761 \h </w:instrText>
+              <w:instrText xml:space="preserve"> PAGEREF _Toc243169011 \h </w:instrText>
             </w:r>
             <w:r>
               <w:rPr>
@@ -4028,7 +4028,7 @@
               <w:rPr>
                 <w:noProof/>
               </w:rPr>
-              <w:t>49</w:t>
+              <w:t>50</w:t>
             </w:r>
             <w:r>
               <w:rPr>
@@ -4053,7 +4053,7 @@
               <w14:ligatures w14:val="standardContextual"/>
             </w:rPr>
           </w:pPr>
-          <w:hyperlink w:anchor="_Toc243165762" w:history="1">
+          <w:hyperlink w:anchor="_Toc243169012" w:history="1">
             <w:r>
               <w:rPr>
                 <w:rStyle w:val="Hyperlink"/>
@@ -4077,7 +4077,7 @@
               <w:rPr>
                 <w:noProof/>
               </w:rPr>
-              <w:instrText xml:space="preserve"> PAGEREF _Toc243165762 \h </w:instrText>
+              <w:instrText xml:space="preserve"> PAGEREF _Toc243169012 \h </w:instrText>
             </w:r>
             <w:r>
               <w:rPr>
@@ -4094,7 +4094,7 @@
               <w:rPr>
                 <w:noProof/>
               </w:rPr>
-              <w:t>50</w:t>
+              <w:t>51</w:t>
             </w:r>
             <w:r>
               <w:rPr>
@@ -4119,7 +4119,7 @@
               <w14:ligatures w14:val="standardContextual"/>
             </w:rPr>
           </w:pPr>
-          <w:hyperlink w:anchor="_Toc243165763" w:history="1">
+          <w:hyperlink w:anchor="_Toc243169013" w:history="1">
             <w:r>
               <w:rPr>
                 <w:rStyle w:val="Hyperlink"/>
@@ -4143,7 +4143,7 @@
               <w:rPr>
                 <w:noProof/>
               </w:rPr>
-              <w:instrText xml:space="preserve"> PAGEREF _Toc243165763 \h </w:instrText>
+              <w:instrText xml:space="preserve"> PAGEREF _Toc243169013 \h </w:instrText>
             </w:r>
             <w:r>
               <w:rPr>
@@ -4160,7 +4160,7 @@
               <w:rPr>
                 <w:noProof/>
               </w:rPr>
-              <w:t>51</w:t>
+              <w:t>52</w:t>
             </w:r>
             <w:r>
               <w:rPr>
@@ -4185,7 +4185,7 @@
               <w14:ligatures w14:val="standardContextual"/>
             </w:rPr>
           </w:pPr>
-          <w:hyperlink w:anchor="_Toc243165764" w:history="1">
+          <w:hyperlink w:anchor="_Toc243169014" w:history="1">
             <w:r>
               <w:rPr>
                 <w:rStyle w:val="Hyperlink"/>
@@ -4209,7 +4209,7 @@
               <w:rPr>
                 <w:noProof/>
               </w:rPr>
-              <w:instrText xml:space="preserve"> PAGEREF _Toc243165764 \h </w:instrText>
+              <w:instrText xml:space="preserve"> PAGEREF _Toc243169014 \h </w:instrText>
             </w:r>
             <w:r>
               <w:rPr>
@@ -4226,7 +4226,7 @@
               <w:rPr>
                 <w:noProof/>
               </w:rPr>
-              <w:t>51</w:t>
+              <w:t>52</w:t>
             </w:r>
             <w:r>
               <w:rPr>
@@ -4251,7 +4251,7 @@
               <w14:ligatures w14:val="standardContextual"/>
             </w:rPr>
           </w:pPr>
-          <w:hyperlink w:anchor="_Toc243165765" w:history="1">
+          <w:hyperlink w:anchor="_Toc243169015" w:history="1">
             <w:r>
               <w:rPr>
                 <w:rStyle w:val="Hyperlink"/>
@@ -4275,7 +4275,7 @@
               <w:rPr>
                 <w:noProof/>
               </w:rPr>
-              <w:instrText xml:space="preserve"> PAGEREF _Toc243165765 \h </w:instrText>
+              <w:instrText xml:space="preserve"> PAGEREF _Toc243169015 \h </w:instrText>
             </w:r>
             <w:r>
               <w:rPr>
@@ -4292,7 +4292,7 @@
               <w:rPr>
                 <w:noProof/>
               </w:rPr>
-              <w:t>52</w:t>
+              <w:t>53</w:t>
             </w:r>
             <w:r>
               <w:rPr>
@@ -4317,7 +4317,7 @@
               <w14:ligatures w14:val="standardContextual"/>
             </w:rPr>
           </w:pPr>
-          <w:hyperlink w:anchor="_Toc243165766" w:history="1">
+          <w:hyperlink w:anchor="_Toc243169016" w:history="1">
             <w:r>
               <w:rPr>
                 <w:rStyle w:val="Hyperlink"/>
@@ -4341,7 +4341,7 @@
               <w:rPr>
                 <w:noProof/>
               </w:rPr>
-              <w:instrText xml:space="preserve"> PAGEREF _Toc243165766 \h </w:instrText>
+              <w:instrText xml:space="preserve"> PAGEREF _Toc243169016 \h </w:instrText>
             </w:r>
             <w:r>
               <w:rPr>
@@ -4358,7 +4358,7 @@
               <w:rPr>
                 <w:noProof/>
               </w:rPr>
-              <w:t>53</w:t>
+              <w:t>54</w:t>
             </w:r>
             <w:r>
               <w:rPr>
@@ -4383,7 +4383,7 @@
               <w14:ligatures w14:val="standardContextual"/>
             </w:rPr>
           </w:pPr>
-          <w:hyperlink w:anchor="_Toc243165767" w:history="1">
+          <w:hyperlink w:anchor="_Toc243169017" w:history="1">
             <w:r>
               <w:rPr>
                 <w:rStyle w:val="Hyperlink"/>
@@ -4407,7 +4407,7 @@
               <w:rPr>
                 <w:noProof/>
               </w:rPr>
-              <w:instrText xml:space="preserve"> PAGEREF _Toc243165767 \h </w:instrText>
+              <w:instrText xml:space="preserve"> PAGEREF _Toc243169017 \h </w:instrText>
             </w:r>
             <w:r>
               <w:rPr>
@@ -4424,7 +4424,7 @@
               <w:rPr>
                 <w:noProof/>
               </w:rPr>
-              <w:t>53</w:t>
+              <w:t>54</w:t>
             </w:r>
             <w:r>
               <w:rPr>
@@ -4449,7 +4449,7 @@
               <w14:ligatures w14:val="standardContextual"/>
             </w:rPr>
           </w:pPr>
-          <w:hyperlink w:anchor="_Toc243165768" w:history="1">
+          <w:hyperlink w:anchor="_Toc243169018" w:history="1">
             <w:r>
               <w:rPr>
                 <w:rStyle w:val="Hyperlink"/>
@@ -4473,7 +4473,7 @@
               <w:rPr>
                 <w:noProof/>
               </w:rPr>
-              <w:instrText xml:space="preserve"> PAGEREF _Toc243165768 \h </w:instrText>
+              <w:instrText xml:space="preserve"> PAGEREF _Toc243169018 \h </w:instrText>
             </w:r>
             <w:r>
               <w:rPr>
@@ -4490,7 +4490,7 @@
               <w:rPr>
                 <w:noProof/>
               </w:rPr>
-              <w:t>53</w:t>
+              <w:t>54</w:t>
             </w:r>
             <w:r>
               <w:rPr>
@@ -4515,7 +4515,7 @@
               <w14:ligatures w14:val="standardContextual"/>
             </w:rPr>
           </w:pPr>
-          <w:hyperlink w:anchor="_Toc243165769" w:history="1">
+          <w:hyperlink w:anchor="_Toc243169019" w:history="1">
             <w:r>
               <w:rPr>
                 <w:rStyle w:val="Hyperlink"/>
@@ -4539,7 +4539,7 @@
               <w:rPr>
                 <w:noProof/>
               </w:rPr>
-              <w:instrText xml:space="preserve"> PAGEREF _Toc243165769 \h </w:instrText>
+              <w:instrText xml:space="preserve"> PAGEREF _Toc243169019 \h </w:instrText>
             </w:r>
             <w:r>
               <w:rPr>
@@ -4556,7 +4556,7 @@
               <w:rPr>
                 <w:noProof/>
               </w:rPr>
-              <w:t>55</w:t>
+              <w:t>56</w:t>
             </w:r>
             <w:r>
               <w:rPr>
@@ -4581,7 +4581,7 @@
               <w14:ligatures w14:val="standardContextual"/>
             </w:rPr>
           </w:pPr>
-          <w:hyperlink w:anchor="_Toc243165770" w:history="1">
+          <w:hyperlink w:anchor="_Toc243169020" w:history="1">
             <w:r>
               <w:rPr>
                 <w:rStyle w:val="Hyperlink"/>
@@ -4605,7 +4605,7 @@
               <w:rPr>
                 <w:noProof/>
               </w:rPr>
-              <w:instrText xml:space="preserve"> PAGEREF _Toc243165770 \h </w:instrText>
+              <w:instrText xml:space="preserve"> PAGEREF _Toc243169020 \h </w:instrText>
             </w:r>
             <w:r>
               <w:rPr>
@@ -4622,7 +4622,7 @@
               <w:rPr>
                 <w:noProof/>
               </w:rPr>
-              <w:t>55</w:t>
+              <w:t>56</w:t>
             </w:r>
             <w:r>
               <w:rPr>
@@ -4647,7 +4647,7 @@
               <w14:ligatures w14:val="standardContextual"/>
             </w:rPr>
           </w:pPr>
-          <w:hyperlink w:anchor="_Toc243165771" w:history="1">
+          <w:hyperlink w:anchor="_Toc243169021" w:history="1">
             <w:r>
               <w:rPr>
                 <w:rStyle w:val="Hyperlink"/>
@@ -4671,7 +4671,7 @@
               <w:rPr>
                 <w:noProof/>
               </w:rPr>
-              <w:instrText xml:space="preserve"> PAGEREF _Toc243165771 \h </w:instrText>
+              <w:instrText xml:space="preserve"> PAGEREF _Toc243169021 \h </w:instrText>
             </w:r>
             <w:r>
               <w:rPr>
@@ -4688,7 +4688,7 @@
               <w:rPr>
                 <w:noProof/>
               </w:rPr>
-              <w:t>55</w:t>
+              <w:t>56</w:t>
             </w:r>
             <w:r>
               <w:rPr>
@@ -4713,7 +4713,7 @@
               <w14:ligatures w14:val="standardContextual"/>
             </w:rPr>
           </w:pPr>
-          <w:hyperlink w:anchor="_Toc243165772" w:history="1">
+          <w:hyperlink w:anchor="_Toc243169022" w:history="1">
             <w:r>
               <w:rPr>
                 <w:rStyle w:val="Hyperlink"/>
@@ -4737,7 +4737,7 @@
               <w:rPr>
                 <w:noProof/>
               </w:rPr>
-              <w:instrText xml:space="preserve"> PAGEREF _Toc243165772 \h </w:instrText>
+              <w:instrText xml:space="preserve"> PAGEREF _Toc243169022 \h </w:instrText>
             </w:r>
             <w:r>
               <w:rPr>
@@ -4754,7 +4754,7 @@
               <w:rPr>
                 <w:noProof/>
               </w:rPr>
-              <w:t>55</w:t>
+              <w:t>56</w:t>
             </w:r>
             <w:r>
               <w:rPr>
@@ -4779,7 +4779,7 @@
               <w14:ligatures w14:val="standardContextual"/>
             </w:rPr>
           </w:pPr>
-          <w:hyperlink w:anchor="_Toc243165773" w:history="1">
+          <w:hyperlink w:anchor="_Toc243169023" w:history="1">
             <w:r>
               <w:rPr>
                 <w:rStyle w:val="Hyperlink"/>
@@ -4803,7 +4803,7 @@
               <w:rPr>
                 <w:noProof/>
               </w:rPr>
-              <w:instrText xml:space="preserve"> PAGEREF _Toc243165773 \h </w:instrText>
+              <w:instrText xml:space="preserve"> PAGEREF _Toc243169023 \h </w:instrText>
             </w:r>
             <w:r>
               <w:rPr>
@@ -4820,7 +4820,7 @@
               <w:rPr>
                 <w:noProof/>
               </w:rPr>
-              <w:t>56</w:t>
+              <w:t>57</w:t>
             </w:r>
             <w:r>
               <w:rPr>
@@ -4845,7 +4845,7 @@
               <w14:ligatures w14:val="standardContextual"/>
             </w:rPr>
           </w:pPr>
-          <w:hyperlink w:anchor="_Toc243165774" w:history="1">
+          <w:hyperlink w:anchor="_Toc243169024" w:history="1">
             <w:r>
               <w:rPr>
                 <w:rStyle w:val="Hyperlink"/>
@@ -4869,7 +4869,7 @@
               <w:rPr>
                 <w:noProof/>
               </w:rPr>
-              <w:instrText xml:space="preserve"> PAGEREF _Toc243165774 \h </w:instrText>
+              <w:instrText xml:space="preserve"> PAGEREF _Toc243169024 \h </w:instrText>
             </w:r>
             <w:r>
               <w:rPr>
@@ -4886,7 +4886,7 @@
               <w:rPr>
                 <w:noProof/>
               </w:rPr>
-              <w:t>58</w:t>
+              <w:t>59</w:t>
             </w:r>
             <w:r>
               <w:rPr>
@@ -4920,7 +4920,7 @@
         <w:pStyle w:val="Heading1"/>
         <w:pageBreakBefore/>
       </w:pPr>
-      <w:bookmarkStart w:id="0" w:name="_Toc243165703"/>
+      <w:bookmarkStart w:id="0" w:name="_Toc243168953"/>
       <w:r>
         <w:lastRenderedPageBreak/>
         <w:t>1. Resumen ejecutivo</w:t>
@@ -4974,7 +4974,7 @@
         <w:pStyle w:val="Heading1"/>
         <w:pageBreakBefore/>
       </w:pPr>
-      <w:bookmarkStart w:id="1" w:name="_Toc243165704"/>
+      <w:bookmarkStart w:id="1" w:name="_Toc243168954"/>
       <w:r>
         <w:lastRenderedPageBreak/>
         <w:t>2. Conceptos y glosario</w:t>
@@ -6409,7 +6409,7 @@
         <w:pStyle w:val="Heading1"/>
         <w:pageBreakBefore/>
       </w:pPr>
-      <w:bookmarkStart w:id="2" w:name="_Toc243165705"/>
+      <w:bookmarkStart w:id="2" w:name="_Toc243168955"/>
       <w:r>
         <w:lastRenderedPageBreak/>
         <w:t>3. Arquitectura general</w:t>
@@ -6420,7 +6420,7 @@
       <w:pPr>
         <w:pStyle w:val="Heading2"/>
       </w:pPr>
-      <w:bookmarkStart w:id="3" w:name="_Toc243165706"/>
+      <w:bookmarkStart w:id="3" w:name="_Toc243168956"/>
       <w:r>
         <w:t>3.1 Piezas del sistema</w:t>
       </w:r>
@@ -7046,7 +7046,7 @@
       <w:pPr>
         <w:pStyle w:val="Heading2"/>
       </w:pPr>
-      <w:bookmarkStart w:id="4" w:name="_Toc243165707"/>
+      <w:bookmarkStart w:id="4" w:name="_Toc243168957"/>
       <w:r>
         <w:t>3.2 Flujo de datos</w:t>
       </w:r>
@@ -7341,7 +7341,7 @@
         <w:pStyle w:val="Heading1"/>
         <w:pageBreakBefore/>
       </w:pPr>
-      <w:bookmarkStart w:id="5" w:name="_Toc243165708"/>
+      <w:bookmarkStart w:id="5" w:name="_Toc243168958"/>
       <w:r>
         <w:lastRenderedPageBreak/>
         <w:t>4. Servicios externos</w:t>
@@ -7352,7 +7352,7 @@
       <w:pPr>
         <w:pStyle w:val="Heading2"/>
       </w:pPr>
-      <w:bookmarkStart w:id="6" w:name="_Toc243165709"/>
+      <w:bookmarkStart w:id="6" w:name="_Toc243168959"/>
       <w:r>
         <w:t>4.1 TikTok LIVE</w:t>
       </w:r>
@@ -8111,7 +8111,7 @@
       <w:pPr>
         <w:pStyle w:val="Heading2"/>
       </w:pPr>
-      <w:bookmarkStart w:id="7" w:name="_Toc243165710"/>
+      <w:bookmarkStart w:id="7" w:name="_Toc243168960"/>
       <w:r>
         <w:t>4.2 Euler Stream</w:t>
       </w:r>
@@ -9403,7 +9403,7 @@
       <w:pPr>
         <w:pStyle w:val="Heading2"/>
       </w:pPr>
-      <w:bookmarkStart w:id="8" w:name="_Toc243165711"/>
+      <w:bookmarkStart w:id="8" w:name="_Toc243168961"/>
       <w:r>
         <w:t>4.3 GitHub, GitHub Actions y GitHub Pages</w:t>
       </w:r>
@@ -9607,7 +9607,7 @@
       <w:pPr>
         <w:pStyle w:val="Heading2"/>
       </w:pPr>
-      <w:bookmarkStart w:id="9" w:name="_Toc243165712"/>
+      <w:bookmarkStart w:id="9" w:name="_Toc243168962"/>
       <w:r>
         <w:t>4.4 Google Fonts</w:t>
       </w:r>
@@ -9637,7 +9637,7 @@
       <w:pPr>
         <w:pStyle w:val="Heading2"/>
       </w:pPr>
-      <w:bookmarkStart w:id="10" w:name="_Toc243165713"/>
+      <w:bookmarkStart w:id="10" w:name="_Toc243168963"/>
       <w:r>
         <w:lastRenderedPageBreak/>
         <w:t>4.5 Supabase (cambios en vivo)</w:t>
@@ -9893,7 +9893,7 @@
         <w:pStyle w:val="Heading1"/>
         <w:pageBreakBefore/>
       </w:pPr>
-      <w:bookmarkStart w:id="11" w:name="_Toc243165714"/>
+      <w:bookmarkStart w:id="11" w:name="_Toc243168964"/>
       <w:r>
         <w:lastRenderedPageBreak/>
         <w:t>5. Estructura de archivos</w:t>
@@ -10563,7 +10563,7 @@
         <w:pStyle w:val="Heading1"/>
         <w:pageBreakBefore/>
       </w:pPr>
-      <w:bookmarkStart w:id="12" w:name="_Toc243165715"/>
+      <w:bookmarkStart w:id="12" w:name="_Toc243168965"/>
       <w:r>
         <w:lastRenderedPageBreak/>
         <w:t>6. Frontend: el módulo compartido comun.js</w:t>
@@ -10591,7 +10591,7 @@
       <w:pPr>
         <w:pStyle w:val="Heading2"/>
       </w:pPr>
-      <w:bookmarkStart w:id="13" w:name="_Toc243165716"/>
+      <w:bookmarkStart w:id="13" w:name="_Toc243168966"/>
       <w:r>
         <w:t>6.1 Configuración en la URL</w:t>
       </w:r>
@@ -11062,7 +11062,7 @@
       <w:pPr>
         <w:pStyle w:val="Heading2"/>
       </w:pPr>
-      <w:bookmarkStart w:id="14" w:name="_Toc243165717"/>
+      <w:bookmarkStart w:id="14" w:name="_Toc243168967"/>
       <w:r>
         <w:t>6.2 Eventos normalizados</w:t>
       </w:r>
@@ -11371,7 +11371,7 @@
                 <w:sz w:val="19"/>
                 <w:szCs w:val="19"/>
               </w:rPr>
-              <w:t>usuario, cantidad, total</w:t>
+              <w:t>usuario, cantidad, total, propios</w:t>
             </w:r>
           </w:p>
         </w:tc>
@@ -11846,9 +11846,96 @@
     </w:p>
     <w:p>
       <w:pPr>
+        <w:spacing w:after="120"/>
+      </w:pPr>
+      <w:r>
+        <w:rPr>
+          <w:b/>
+          <w:bCs/>
+        </w:rPr>
+        <w:t>Likes:</w:t>
+      </w:r>
+      <w:r>
+        <w:t xml:space="preserve"> TikTok no entrega todos los mensajes de likes; cuando llegan muchos, manda solo una parte, y sumar </w:t>
+      </w:r>
+      <w:r>
+        <w:rPr>
+          <w:rFonts w:ascii="Consolas" w:eastAsia="Consolas" w:hAnsi="Consolas" w:cs="Consolas"/>
+          <w:color w:val="7A1F33"/>
+          <w:sz w:val="19"/>
+          <w:szCs w:val="19"/>
+        </w:rPr>
+        <w:t>likeCount</w:t>
+      </w:r>
+      <w:r>
+        <w:t xml:space="preserve"> se quedaba corto (una meta de 5.000 se llenaba con 13.000 likes en TikTok). Cada mensaje trae </w:t>
+      </w:r>
+      <w:r>
+        <w:rPr>
+          <w:rFonts w:ascii="Consolas" w:eastAsia="Consolas" w:hAnsi="Consolas" w:cs="Consolas"/>
+          <w:color w:val="7A1F33"/>
+          <w:sz w:val="19"/>
+          <w:szCs w:val="19"/>
+        </w:rPr>
+        <w:t>totalLikeCount</w:t>
+      </w:r>
+      <w:r>
+        <w:t xml:space="preserve">, el contador que se ve en TikTok, así que </w:t>
+      </w:r>
+      <w:r>
+        <w:rPr>
+          <w:rFonts w:ascii="Consolas" w:eastAsia="Consolas" w:hAnsi="Consolas" w:cs="Consolas"/>
+          <w:color w:val="7A1F33"/>
+          <w:sz w:val="19"/>
+          <w:szCs w:val="19"/>
+        </w:rPr>
+        <w:t>crearContadorLikes</w:t>
+      </w:r>
+      <w:r>
+        <w:t xml:space="preserve"> pone en </w:t>
+      </w:r>
+      <w:r>
+        <w:rPr>
+          <w:rFonts w:ascii="Consolas" w:eastAsia="Consolas" w:hAnsi="Consolas" w:cs="Consolas"/>
+          <w:color w:val="7A1F33"/>
+          <w:sz w:val="19"/>
+          <w:szCs w:val="19"/>
+        </w:rPr>
+        <w:t>cantidad</w:t>
+      </w:r>
+      <w:r>
+        <w:t xml:space="preserve"> lo que subió ese total desde el mensaje anterior: cuenta también los likes que no llegaron y los de un corte de conexión. El primer mensaje solo cuenta su </w:t>
+      </w:r>
+      <w:r>
+        <w:rPr>
+          <w:rFonts w:ascii="Consolas" w:eastAsia="Consolas" w:hAnsi="Consolas" w:cs="Consolas"/>
+          <w:color w:val="7A1F33"/>
+          <w:sz w:val="19"/>
+          <w:szCs w:val="19"/>
+        </w:rPr>
+        <w:t>likeCount</w:t>
+      </w:r>
+      <w:r>
+        <w:t xml:space="preserve"> (el total incluye los likes de antes de abrir el widget); tras reconectar, un total menor significa un LIVE nuevo; un total viejo (mensajes desordenados) da 0. </w:t>
+      </w:r>
+      <w:r>
+        <w:rPr>
+          <w:rFonts w:ascii="Consolas" w:eastAsia="Consolas" w:hAnsi="Consolas" w:cs="Consolas"/>
+          <w:color w:val="7A1F33"/>
+          <w:sz w:val="19"/>
+          <w:szCs w:val="19"/>
+        </w:rPr>
+        <w:t>propios</w:t>
+      </w:r>
+      <w:r>
+        <w:t xml:space="preserve"> guarda lo que dio esa persona, para la lista de Actividad.</w:t>
+      </w:r>
+    </w:p>
+    <w:p>
+      <w:pPr>
         <w:pStyle w:val="Heading2"/>
       </w:pPr>
-      <w:bookmarkStart w:id="15" w:name="_Toc243165718"/>
+      <w:bookmarkStart w:id="15" w:name="_Toc243168968"/>
       <w:r>
         <w:t>6.3 Rastreador de regalos (combos y regalos sueltos)</w:t>
       </w:r>
@@ -12374,6 +12461,7 @@
               <w:spacing w:after="20"/>
             </w:pPr>
             <w:r>
+              <w:lastRenderedPageBreak/>
               <w:t>Combo con pausa larga (2,5 s) y luego fin</w:t>
             </w:r>
           </w:p>
@@ -12578,7 +12666,7 @@
       <w:pPr>
         <w:pStyle w:val="Heading2"/>
       </w:pPr>
-      <w:bookmarkStart w:id="16" w:name="_Toc243165719"/>
+      <w:bookmarkStart w:id="16" w:name="_Toc243168969"/>
       <w:r>
         <w:t>6.4 Conexión con TikTok (conectarTikTok)</w:t>
       </w:r>
@@ -12699,7 +12787,7 @@
       <w:pPr>
         <w:pStyle w:val="Heading2"/>
       </w:pPr>
-      <w:bookmarkStart w:id="17" w:name="_Toc243165720"/>
+      <w:bookmarkStart w:id="17" w:name="_Toc243168970"/>
       <w:r>
         <w:t>6.5 Arranque de widgets (iniciarWidget)</w:t>
       </w:r>
@@ -12868,7 +12956,7 @@
         <w:spacing w:after="60"/>
       </w:pPr>
       <w:r>
-        <w:t xml:space="preserve">Valida la configuración (dañada, modo prueba o falta de usuario o clave) y, si todo está bien, llama </w:t>
+        <w:t xml:space="preserve">Valida la configuración (dañada, modo prueba o falta de usuario o clave) y, si todo está bien, se conecta con </w:t>
       </w:r>
       <w:r>
         <w:rPr>
@@ -12880,7 +12968,31 @@
         <w:t>conectarTikTok</w:t>
       </w:r>
       <w:r>
-        <w:t>.</w:t>
+        <w:t>. Si después llega por Supabase otro usuario (</w:t>
+      </w:r>
+      <w:r>
+        <w:rPr>
+          <w:rFonts w:ascii="Consolas" w:eastAsia="Consolas" w:hAnsi="Consolas" w:cs="Consolas"/>
+          <w:color w:val="7A1F33"/>
+          <w:sz w:val="19"/>
+          <w:szCs w:val="19"/>
+        </w:rPr>
+        <w:t>u</w:t>
+      </w:r>
+      <w:r>
+        <w:t>), espera 2 s sin cambios (</w:t>
+      </w:r>
+      <w:r>
+        <w:rPr>
+          <w:rFonts w:ascii="Consolas" w:eastAsia="Consolas" w:hAnsi="Consolas" w:cs="Consolas"/>
+          <w:color w:val="7A1F33"/>
+          <w:sz w:val="19"/>
+          <w:szCs w:val="19"/>
+        </w:rPr>
+        <w:t>ESPERA_CAMBIO_USUARIO_MS</w:t>
+      </w:r>
+      <w:r>
+        <w:t>), cierra la conexión anterior y se conecta a la cuenta nueva.</w:t>
       </w:r>
     </w:p>
     <w:p>
@@ -12906,6 +13018,7 @@
         <w:spacing w:after="60"/>
       </w:pPr>
       <w:r>
+        <w:lastRenderedPageBreak/>
         <w:t>Informa cada cambio de estado a la página que lo contiene (</w:t>
       </w:r>
       <w:r>
@@ -12925,7 +13038,7 @@
       <w:pPr>
         <w:pStyle w:val="Heading2"/>
       </w:pPr>
-      <w:bookmarkStart w:id="18" w:name="_Toc243165721"/>
+      <w:bookmarkStart w:id="18" w:name="_Toc243168971"/>
       <w:r>
         <w:t>6.6 Utilidades</w:t>
       </w:r>
@@ -12991,9 +13104,8 @@
       <w:pPr>
         <w:pStyle w:val="Heading2"/>
       </w:pPr>
-      <w:bookmarkStart w:id="19" w:name="_Toc243165722"/>
-      <w:r>
-        <w:lastRenderedPageBreak/>
+      <w:bookmarkStart w:id="19" w:name="_Toc243168972"/>
+      <w:r>
         <w:t>6.7 Cambios en vivo (nube.js)</w:t>
       </w:r>
       <w:bookmarkEnd w:id="19"/>
@@ -13068,10 +13180,42 @@
     </w:p>
     <w:p>
       <w:pPr>
+        <w:spacing w:after="120"/>
+      </w:pPr>
+      <w:r>
+        <w:t>El usuario de TikTok (</w:t>
+      </w:r>
+      <w:r>
+        <w:rPr>
+          <w:rFonts w:ascii="Consolas" w:eastAsia="Consolas" w:hAnsi="Consolas" w:cs="Consolas"/>
+          <w:color w:val="7A1F33"/>
+          <w:sz w:val="19"/>
+          <w:szCs w:val="19"/>
+        </w:rPr>
+        <w:t>u</w:t>
+      </w:r>
+      <w:r>
+        <w:t>) que llega de Supabase gana sobre el de la URL: así, si se cambia la cuenta en Ajustes → Conexión, los widgets en OBS se pasan solos a la nueva, sin volver a copiar la URL. La clave (</w:t>
+      </w:r>
+      <w:r>
+        <w:rPr>
+          <w:rFonts w:ascii="Consolas" w:eastAsia="Consolas" w:hAnsi="Consolas" w:cs="Consolas"/>
+          <w:color w:val="7A1F33"/>
+          <w:sz w:val="19"/>
+          <w:szCs w:val="19"/>
+        </w:rPr>
+        <w:t>k</w:t>
+      </w:r>
+      <w:r>
+        <w:t>) sale siempre de la URL: nunca se guarda en Supabase.</w:t>
+      </w:r>
+    </w:p>
+    <w:p>
+      <w:pPr>
         <w:pStyle w:val="Heading1"/>
         <w:pageBreakBefore/>
       </w:pPr>
-      <w:bookmarkStart w:id="20" w:name="_Toc243165723"/>
+      <w:bookmarkStart w:id="20" w:name="_Toc243168973"/>
       <w:r>
         <w:lastRenderedPageBreak/>
         <w:t>7. Frontend: los widgets</w:t>
@@ -13114,7 +13258,7 @@
       <w:pPr>
         <w:pStyle w:val="Heading2"/>
       </w:pPr>
-      <w:bookmarkStart w:id="21" w:name="_Toc243165724"/>
+      <w:bookmarkStart w:id="21" w:name="_Toc243168974"/>
       <w:r>
         <w:t>7.1 Ruleta de regalos (ruleta.html)</w:t>
       </w:r>
@@ -14429,7 +14573,7 @@
       <w:pPr>
         <w:pStyle w:val="Heading2"/>
       </w:pPr>
-      <w:bookmarkStart w:id="22" w:name="_Toc243165725"/>
+      <w:bookmarkStart w:id="22" w:name="_Toc243168975"/>
       <w:r>
         <w:t>7.2 Meta (meta.html)</w:t>
       </w:r>
@@ -15039,7 +15183,7 @@
       <w:pPr>
         <w:pStyle w:val="Heading2"/>
       </w:pPr>
-      <w:bookmarkStart w:id="23" w:name="_Toc243165726"/>
+      <w:bookmarkStart w:id="23" w:name="_Toc243168976"/>
       <w:r>
         <w:lastRenderedPageBreak/>
         <w:t>7.3 Alertas (alertas.html)</w:t>
@@ -15407,7 +15551,7 @@
       <w:pPr>
         <w:pStyle w:val="Heading2"/>
       </w:pPr>
-      <w:bookmarkStart w:id="24" w:name="_Toc243165727"/>
+      <w:bookmarkStart w:id="24" w:name="_Toc243168977"/>
       <w:r>
         <w:t>7.4 Carrera de regalos (carrera.html)</w:t>
       </w:r>
@@ -16774,7 +16918,7 @@
       <w:pPr>
         <w:pStyle w:val="Heading2"/>
       </w:pPr>
-      <w:bookmarkStart w:id="25" w:name="_Toc243165728"/>
+      <w:bookmarkStart w:id="25" w:name="_Toc243168978"/>
       <w:r>
         <w:t>7.5 Batalla de regalos (batalla.html)</w:t>
       </w:r>
@@ -17427,7 +17571,7 @@
       <w:pPr>
         <w:pStyle w:val="Heading2"/>
       </w:pPr>
-      <w:bookmarkStart w:id="26" w:name="_Toc243165729"/>
+      <w:bookmarkStart w:id="26" w:name="_Toc243168979"/>
       <w:r>
         <w:t>7.6 Jefe del LIVE (jefe.html)</w:t>
       </w:r>
@@ -18554,7 +18698,7 @@
       <w:pPr>
         <w:pStyle w:val="Heading2"/>
       </w:pPr>
-      <w:bookmarkStart w:id="27" w:name="_Toc243165730"/>
+      <w:bookmarkStart w:id="27" w:name="_Toc243168980"/>
       <w:r>
         <w:t>7.7 Subathon (subathon.html)</w:t>
       </w:r>
@@ -19625,19 +19769,7 @@
         <w:spacing w:after="60"/>
       </w:pPr>
       <w:r>
-        <w:t>Al sumarse tiempo, la píldora late con un pulso dorado, las cifras destellan y sube un “+1:30”. Si llegan varias sumas seguidas, se acumulan en el mismo “+”. Con menos de 1 minuto, las cifras toman el color de alerta (</w:t>
-      </w:r>
-      <w:r>
-        <w:rPr>
-          <w:rFonts w:ascii="Consolas" w:eastAsia="Consolas" w:hAnsi="Consolas" w:cs="Consolas"/>
-          <w:color w:val="7A1F33"/>
-          <w:sz w:val="19"/>
-          <w:szCs w:val="19"/>
-        </w:rPr>
-        <w:t>--mal</w:t>
-      </w:r>
-      <w:r>
-        <w:t>) con brillo y laten.</w:t>
+        <w:t>Al sumarse tiempo, la píldora late con un pulso dorado, las cifras destellan y sube un “+1:30”. Si llegan varias sumas seguidas, se acumulan en el mismo “+”. Las sumas de menos de 1 s (cada like suma una fracción de segundo) se juntan hasta llegar a 1 s y entonces se muestra el “+”. Con menos de 1 minuto, las cifras toman el color de alerta (--mal) con brillo y laten.</w:t>
       </w:r>
     </w:p>
     <w:p>
@@ -19714,7 +19846,7 @@
       <w:pPr>
         <w:pStyle w:val="Heading2"/>
       </w:pPr>
-      <w:bookmarkStart w:id="28" w:name="_Toc243165731"/>
+      <w:bookmarkStart w:id="28" w:name="_Toc243168981"/>
       <w:r>
         <w:t>7.8 Bóveda dorada (boveda.html)</w:t>
       </w:r>
@@ -19777,7 +19909,11 @@
         <w:t>.filo-oro</w:t>
       </w:r>
       <w:r>
-        <w:t xml:space="preserve">) con el porcentaje y “640 / 1.000 monedas”. El bloque del secreto tiene tres capas en el mismo lugar: la pista (“Premio secreto”), el secreto tapado (puntos desenfocados) y </w:t>
+        <w:t xml:space="preserve">) con el porcentaje y “640 / 1.000 monedas”. El bloque del secreto tiene tres capas en el mismo lugar: la </w:t>
+      </w:r>
+      <w:r>
+        <w:lastRenderedPageBreak/>
+        <w:t xml:space="preserve">pista (“Premio secreto”), el secreto tapado (puntos desenfocados) y </w:t>
       </w:r>
       <w:r>
         <w:rPr>
@@ -19809,7 +19945,6 @@
         <w:pStyle w:val="Heading3"/>
       </w:pPr>
       <w:r>
-        <w:lastRenderedPageBreak/>
         <w:t>Configuración</w:t>
       </w:r>
     </w:p>
@@ -20653,7 +20788,7 @@
       <w:pPr>
         <w:pStyle w:val="Heading2"/>
       </w:pPr>
-      <w:bookmarkStart w:id="29" w:name="_Toc243165732"/>
+      <w:bookmarkStart w:id="29" w:name="_Toc243168982"/>
       <w:r>
         <w:t>7.9 Trono (trono.html)</w:t>
       </w:r>
@@ -21548,7 +21683,7 @@
       <w:pPr>
         <w:pStyle w:val="Heading2"/>
       </w:pPr>
-      <w:bookmarkStart w:id="30" w:name="_Toc243165733"/>
+      <w:bookmarkStart w:id="30" w:name="_Toc243168983"/>
       <w:r>
         <w:lastRenderedPageBreak/>
         <w:t>7.10 Marcador (marcador.html)</w:t>
@@ -22336,7 +22471,7 @@
       <w:pPr>
         <w:pStyle w:val="Heading2"/>
       </w:pPr>
-      <w:bookmarkStart w:id="31" w:name="_Toc243165734"/>
+      <w:bookmarkStart w:id="31" w:name="_Toc243168984"/>
       <w:r>
         <w:lastRenderedPageBreak/>
         <w:t>7.11 Repertorio (repertorio.html)</w:t>
@@ -23289,7 +23424,7 @@
       <w:pPr>
         <w:pStyle w:val="Heading2"/>
       </w:pPr>
-      <w:bookmarkStart w:id="32" w:name="_Toc243165735"/>
+      <w:bookmarkStart w:id="32" w:name="_Toc243168985"/>
       <w:r>
         <w:lastRenderedPageBreak/>
         <w:t>7.12 Mensaje VIP destacado (destacado.html)</w:t>
@@ -24110,7 +24245,7 @@
       <w:pPr>
         <w:pStyle w:val="Heading2"/>
       </w:pPr>
-      <w:bookmarkStart w:id="33" w:name="_Toc243165736"/>
+      <w:bookmarkStart w:id="33" w:name="_Toc243168986"/>
       <w:r>
         <w:lastRenderedPageBreak/>
         <w:t>7.13 Tragamonedas (tragamonedas.html)</w:t>
@@ -24874,7 +25009,7 @@
         <w:pStyle w:val="Heading1"/>
         <w:pageBreakBefore/>
       </w:pPr>
-      <w:bookmarkStart w:id="34" w:name="_Toc243165737"/>
+      <w:bookmarkStart w:id="34" w:name="_Toc243168987"/>
       <w:r>
         <w:lastRenderedPageBreak/>
         <w:t>8. Frontend: el panel</w:t>
@@ -24885,7 +25020,7 @@
       <w:pPr>
         <w:pStyle w:val="Heading2"/>
       </w:pPr>
-      <w:bookmarkStart w:id="35" w:name="_Toc243165738"/>
+      <w:bookmarkStart w:id="35" w:name="_Toc243168988"/>
       <w:r>
         <w:t>8.1 Estructura de la página (index.html)</w:t>
       </w:r>
@@ -25378,7 +25513,7 @@
       <w:pPr>
         <w:pStyle w:val="Heading2"/>
       </w:pPr>
-      <w:bookmarkStart w:id="36" w:name="_Toc243165739"/>
+      <w:bookmarkStart w:id="36" w:name="_Toc243168989"/>
       <w:r>
         <w:t>8.2 Navegación y ciclo de vida (app.js)</w:t>
       </w:r>
@@ -25559,7 +25694,7 @@
       <w:pPr>
         <w:pStyle w:val="Heading2"/>
       </w:pPr>
-      <w:bookmarkStart w:id="37" w:name="_Toc243165740"/>
+      <w:bookmarkStart w:id="37" w:name="_Toc243168990"/>
       <w:r>
         <w:t>8.3 Mapa del panel (registro.js)</w:t>
       </w:r>
@@ -26407,7 +26542,7 @@
       <w:pPr>
         <w:pStyle w:val="Heading2"/>
       </w:pPr>
-      <w:bookmarkStart w:id="38" w:name="_Toc243165741"/>
+      <w:bookmarkStart w:id="38" w:name="_Toc243168991"/>
       <w:r>
         <w:t>8.4 Datos guardados (almacen.js)</w:t>
       </w:r>
@@ -27207,7 +27342,7 @@
       <w:pPr>
         <w:pStyle w:val="Heading2"/>
       </w:pPr>
-      <w:bookmarkStart w:id="39" w:name="_Toc243165742"/>
+      <w:bookmarkStart w:id="39" w:name="_Toc243168992"/>
       <w:r>
         <w:t>8.5 Conexión del panel al LIVE (envivo.js)</w:t>
       </w:r>
@@ -27270,9 +27405,17 @@
     </w:p>
     <w:p>
       <w:pPr>
+        <w:spacing w:after="120"/>
+      </w:pPr>
+      <w:r>
+        <w:t>Si se cambian el usuario o la clave en Ajustes → Conexión con la conexión activa (o reintentando porque la cuenta no está en vivo), espera 1,5 s sin cambios, para no abrir una conexión por cada tecla, y se reconecta con los datos nuevos. Con otra cuenta, los contadores de la sesión vuelven a 0.</w:t>
+      </w:r>
+    </w:p>
+    <w:p>
+      <w:pPr>
         <w:pStyle w:val="Heading2"/>
       </w:pPr>
-      <w:bookmarkStart w:id="40" w:name="_Toc243165743"/>
+      <w:bookmarkStart w:id="40" w:name="_Toc243168993"/>
       <w:r>
         <w:t>8.6 Componentes de interfaz (ui.js)</w:t>
       </w:r>
@@ -27780,7 +27923,7 @@
       <w:pPr>
         <w:pStyle w:val="Heading2"/>
       </w:pPr>
-      <w:bookmarkStart w:id="41" w:name="_Toc243165744"/>
+      <w:bookmarkStart w:id="41" w:name="_Toc243168994"/>
       <w:r>
         <w:t>8.7 Las vistas</w:t>
       </w:r>
@@ -27799,7 +27942,11 @@
         <w:spacing w:after="120"/>
       </w:pPr>
       <w:r>
-        <w:t>Tarjeta del widget (con opciones de ocultar, sonido y “Mostrar a los espectadores con qué regalo se gira”), editor de premios con el porcentaje de probabilidad de cada uno (al cambiar un peso solo se actualizan los porcentajes, sin perder el foco del campo) y la tarjeta del regalo que la activa (ID con sugerencias del Buscador de regalos, texto, giros por regalo y tope por combo). Esa tarjeta muestra la miniatura, el nombre y el precio del regalo elegido; si el regalo no está en el Buscador, avisa que la miniatura aparecerá cuando llegue una vez al LIVE.</w:t>
+        <w:t xml:space="preserve">Tarjeta del widget (con opciones de ocultar, sonido y “Mostrar a los espectadores con qué regalo se gira”), editor de premios con el porcentaje de probabilidad de cada uno (al cambiar un peso solo se actualizan los porcentajes, sin perder el foco del campo) y la tarjeta del regalo que la activa (ID con </w:t>
+      </w:r>
+      <w:r>
+        <w:lastRenderedPageBreak/>
+        <w:t>sugerencias del Buscador de regalos, texto, giros por regalo y tope por combo). Esa tarjeta muestra la miniatura, el nombre y el precio del regalo elegido; si el regalo no está en el Buscador, avisa que la miniatura aparecerá cuando llegue una vez al LIVE.</w:t>
       </w:r>
     </w:p>
     <w:p>
@@ -27807,16 +27954,115 @@
         <w:pStyle w:val="Heading3"/>
       </w:pPr>
       <w:r>
+        <w:t>Metas (4 vistas)</w:t>
+      </w:r>
+    </w:p>
+    <w:p>
+      <w:pPr>
+        <w:spacing w:after="120"/>
+      </w:pPr>
+      <w:r>
+        <w:t>Las cuatro se generan con la misma función a partir de una tabla de tipos. Cada una tiene meta, título, acción al alcanzar, color y sonido, con botones de prueba propios (“+50 likes”, “+1 seguidor”…).</w:t>
+      </w:r>
+    </w:p>
+    <w:p>
+      <w:pPr>
+        <w:pStyle w:val="Heading3"/>
+      </w:pPr>
+      <w:r>
+        <w:t>Alertas de eventos</w:t>
+      </w:r>
+    </w:p>
+    <w:p>
+      <w:pPr>
+        <w:spacing w:after="120"/>
+      </w:pPr>
+      <w:r>
+        <w:t>Casillas para regalos, seguidores y compartidos; en Personalizar: monedas mínimas, segundos en pantalla y sonido.</w:t>
+      </w:r>
+    </w:p>
+    <w:p>
+      <w:pPr>
+        <w:pStyle w:val="Heading3"/>
+      </w:pPr>
+      <w:r>
+        <w:t>Carrera de regalos</w:t>
+      </w:r>
+    </w:p>
+    <w:p>
+      <w:pPr>
+        <w:spacing w:after="120"/>
+      </w:pPr>
+      <w:r>
+        <w:t>Tres tarjetas. La del widget tiene el título sobre el reloj y, en Personalizar, “Contar regalos solo con el reloj en marcha”, sonidos y el estilo visual; sus pruebas son “Regalo al azar”, “Combo ×10 al azar” y “Combo ×50 al primero”. Reloj de la ronda: el tiempo en grande con su estado, los botones Iniciar (Reanudar en pausa, Nueva ronda al terminar), Pausar y Reiniciar, y la duración en segundos. Integrantes (1 a 6): una fila por integrante con color, nombre, ID del regalo (con sugerencias del Buscador de regalos), nombre del regalo, monedas por regalo y meta. Al escribir un ID que ya está en el catálogo se completan solos el nombre y el precio, y la imagen viaja al widget. Un integrante sin regalo o dos con el mismo regalo se avisan en rojo, pero no bloquean el envío: si bloquearan, el reloj tampoco llegaría a OBS.</w:t>
+      </w:r>
+    </w:p>
+    <w:p>
+      <w:pPr>
+        <w:pStyle w:val="Heading3"/>
+      </w:pPr>
+      <w:r>
+        <w:t>Marcador</w:t>
+      </w:r>
+    </w:p>
+    <w:p>
+      <w:pPr>
+        <w:spacing w:after="120"/>
+      </w:pPr>
+      <w:r>
+        <w:t>Igual que la carrera, sin la columna de meta: la tarjeta del widget (título opcional; en Personalizar, “Contar regalos solo con el reloj en marcha”, sonido y estilo), el Reloj de la ronda (Iniciar, Pausar, Reiniciar y duración) y los Integrantes (1 a 6) con color, nombre, ID del regalo, nombre del regalo y monedas por regalo. El color es opcional: una casilla junto al selector lo activa; desmarcada, la tarjeta usa el acento del estilo.</w:t>
+      </w:r>
+    </w:p>
+    <w:p>
+      <w:pPr>
+        <w:pStyle w:val="Heading3"/>
+      </w:pPr>
+      <w:r>
+        <w:t>Repertorio</w:t>
+      </w:r>
+    </w:p>
+    <w:p>
+      <w:pPr>
+        <w:spacing w:after="120"/>
+      </w:pPr>
+      <w:r>
+        <w:t>La tarjeta del widget tiene el título y cuántas canciones se ven (3 a 5); en Personalizar, las monedas de un regalo sin precio, el sonido y el estilo. La tarjeta Canciones tiene los botones “Hecha y siguiente” (marca la activa como hecha y activa la siguiente pendiente) y “Reiniciar repertorio”, y una fila por canción con su estado (Activa, Pendiente o Hecha), nombre, meta y los botones Activar, Hecha (o Deshacer), subir, bajar y quitar. Hasta 10 canciones. Todas las órdenes se suben a Supabase al instante.</w:t>
+      </w:r>
+    </w:p>
+    <w:p>
+      <w:pPr>
+        <w:pStyle w:val="Heading3"/>
+      </w:pPr>
+      <w:r>
+        <w:t>Mensaje VIP destacado</w:t>
+      </w:r>
+    </w:p>
+    <w:p>
+      <w:pPr>
+        <w:spacing w:after="120"/>
+      </w:pPr>
+      <w:r>
+        <w:t>La tarjeta del widget tiene el umbral VIP y los segundos en pantalla; en Personalizar, la etiqueta, el agradecimiento, las monedas de un regalo sin precio, el sonido y el estilo. Pruebas: “1. Escribir en el chat” y “2. Regalo VIP” (con el nombre de prueba), “Regalo VIP sin chat” y “Regalo pequeño”. La tarjeta Mensaje en pantalla tiene “Quitar el mensaje actual” y “Probar en OBS”.</w:t>
+      </w:r>
+    </w:p>
+    <w:p>
+      <w:pPr>
+        <w:pStyle w:val="Heading3"/>
+      </w:pPr>
+      <w:r>
+        <w:t>Tragamonedas</w:t>
+      </w:r>
+    </w:p>
+    <w:p>
+      <w:pPr>
+        <w:spacing w:after="120"/>
+      </w:pPr>
+      <w:r>
+        <w:t xml:space="preserve">La tarjeta del widget tiene, en Personalizar, ocultar sin giros, sonidos y estilo; pruebas “Probar giro” y “Combo de 3”. Debajo: la tarjeta Giros con “Probar en OBS”, una tarjeta por rodillo (título y textos, con </w:t>
+      </w:r>
+      <w:r>
         <w:lastRenderedPageBreak/>
-        <w:t>Metas (4 vistas)</w:t>
-      </w:r>
-    </w:p>
-    <w:p>
-      <w:pPr>
-        <w:spacing w:after="120"/>
-      </w:pPr>
-      <w:r>
-        <w:t>Las cuatro se generan con la misma función a partir de una tabla de tipos. Cada una tiene meta, título, acción al alcanzar, color y sonido, con botones de prueba propios (“+50 likes”, “+1 seguidor”…).</w:t>
+        <w:t>agregar y quitar; al menos uno por rodillo) y la del regalo que activa la máquina (ID, texto en pantalla y tope por combo).</w:t>
       </w:r>
     </w:p>
     <w:p>
@@ -27824,103 +28070,6 @@
         <w:pStyle w:val="Heading3"/>
       </w:pPr>
       <w:r>
-        <w:t>Alertas de eventos</w:t>
-      </w:r>
-    </w:p>
-    <w:p>
-      <w:pPr>
-        <w:spacing w:after="120"/>
-      </w:pPr>
-      <w:r>
-        <w:t>Casillas para regalos, seguidores y compartidos; en Personalizar: monedas mínimas, segundos en pantalla y sonido.</w:t>
-      </w:r>
-    </w:p>
-    <w:p>
-      <w:pPr>
-        <w:pStyle w:val="Heading3"/>
-      </w:pPr>
-      <w:r>
-        <w:t>Carrera de regalos</w:t>
-      </w:r>
-    </w:p>
-    <w:p>
-      <w:pPr>
-        <w:spacing w:after="120"/>
-      </w:pPr>
-      <w:r>
-        <w:t>Tres tarjetas. La del widget tiene el título sobre el reloj y, en Personalizar, “Contar regalos solo con el reloj en marcha”, sonidos y el estilo visual; sus pruebas son “Regalo al azar”, “Combo ×10 al azar” y “Combo ×50 al primero”. Reloj de la ronda: el tiempo en grande con su estado, los botones Iniciar (Reanudar en pausa, Nueva ronda al terminar), Pausar y Reiniciar, y la duración en segundos. Integrantes (1 a 6): una fila por integrante con color, nombre, ID del regalo (con sugerencias del Buscador de regalos), nombre del regalo, monedas por regalo y meta. Al escribir un ID que ya está en el catálogo se completan solos el nombre y el precio, y la imagen viaja al widget. Un integrante sin regalo o dos con el mismo regalo se avisan en rojo, pero no bloquean el envío: si bloquearan, el reloj tampoco llegaría a OBS.</w:t>
-      </w:r>
-    </w:p>
-    <w:p>
-      <w:pPr>
-        <w:pStyle w:val="Heading3"/>
-      </w:pPr>
-      <w:r>
-        <w:t>Marcador</w:t>
-      </w:r>
-    </w:p>
-    <w:p>
-      <w:pPr>
-        <w:spacing w:after="120"/>
-      </w:pPr>
-      <w:r>
-        <w:t>Igual que la carrera, sin la columna de meta: la tarjeta del widget (título opcional; en Personalizar, “Contar regalos solo con el reloj en marcha”, sonido y estilo), el Reloj de la ronda (Iniciar, Pausar, Reiniciar y duración) y los Integrantes (1 a 6) con color, nombre, ID del regalo, nombre del regalo y monedas por regalo. El color es opcional: una casilla junto al selector lo activa; desmarcada, la tarjeta usa el acento del estilo.</w:t>
-      </w:r>
-    </w:p>
-    <w:p>
-      <w:pPr>
-        <w:pStyle w:val="Heading3"/>
-      </w:pPr>
-      <w:r>
-        <w:t>Repertorio</w:t>
-      </w:r>
-    </w:p>
-    <w:p>
-      <w:pPr>
-        <w:spacing w:after="120"/>
-      </w:pPr>
-      <w:r>
-        <w:t>La tarjeta del widget tiene el título y cuántas canciones se ven (3 a 5); en Personalizar, las monedas de un regalo sin precio, el sonido y el estilo. La tarjeta Canciones tiene los botones “Hecha y siguiente” (marca la activa como hecha y activa la siguiente pendiente) y “Reiniciar repertorio”, y una fila por canción con su estado (Activa, Pendiente o Hecha), nombre, meta y los botones Activar, Hecha (o Deshacer), subir, bajar y quitar. Hasta 10 canciones. Todas las órdenes se suben a Supabase al instante.</w:t>
-      </w:r>
-    </w:p>
-    <w:p>
-      <w:pPr>
-        <w:pStyle w:val="Heading3"/>
-      </w:pPr>
-      <w:r>
-        <w:t>Mensaje VIP destacado</w:t>
-      </w:r>
-    </w:p>
-    <w:p>
-      <w:pPr>
-        <w:spacing w:after="120"/>
-      </w:pPr>
-      <w:r>
-        <w:t>La tarjeta del widget tiene el umbral VIP y los segundos en pantalla; en Personalizar, la etiqueta, el agradecimiento, las monedas de un regalo sin precio, el sonido y el estilo. Pruebas: “1. Escribir en el chat” y “2. Regalo VIP” (con el nombre de prueba), “Regalo VIP sin chat” y “Regalo pequeño”. La tarjeta Mensaje en pantalla tiene “Quitar el mensaje actual” y “Probar en OBS”.</w:t>
-      </w:r>
-    </w:p>
-    <w:p>
-      <w:pPr>
-        <w:pStyle w:val="Heading3"/>
-      </w:pPr>
-      <w:r>
-        <w:t>Tragamonedas</w:t>
-      </w:r>
-    </w:p>
-    <w:p>
-      <w:pPr>
-        <w:spacing w:after="120"/>
-      </w:pPr>
-      <w:r>
-        <w:t>La tarjeta del widget tiene, en Personalizar, ocultar sin giros, sonidos y estilo; pruebas “Probar giro” y “Combo de 3”. Debajo: la tarjeta Giros con “Probar en OBS”, una tarjeta por rodillo (título y textos, con agregar y quitar; al menos uno por rodillo) y la del regalo que activa la máquina (ID, texto en pantalla y tope por combo).</w:t>
-      </w:r>
-    </w:p>
-    <w:p>
-      <w:pPr>
-        <w:pStyle w:val="Heading3"/>
-      </w:pPr>
-      <w:r>
-        <w:lastRenderedPageBreak/>
         <w:t>Batalla de regalos</w:t>
       </w:r>
     </w:p>
@@ -28045,7 +28194,11 @@
         <w:t>requestAnimationFrame</w:t>
       </w:r>
       <w:r>
-        <w:t>, porque este último se congela cuando la pestaña está en segundo plano (problema detectado y corregido durante el desarrollo). Los regalos se muestran con el nombre del Buscador de regalos: el propio, si la persona le puso uno, o el de TikTok.</w:t>
+        <w:t xml:space="preserve">, porque este último se congela cuando la pestaña </w:t>
+      </w:r>
+      <w:r>
+        <w:lastRenderedPageBreak/>
+        <w:t>está en segundo plano (problema detectado y corregido durante el desarrollo). Los regalos se muestran con el nombre del Buscador de regalos: el propio, si la persona le puso uno, o el de TikTok.</w:t>
       </w:r>
     </w:p>
     <w:p>
@@ -28053,7 +28206,6 @@
         <w:pStyle w:val="Heading3"/>
       </w:pPr>
       <w:r>
-        <w:lastRenderedPageBreak/>
         <w:t>Buscador de regalos</w:t>
       </w:r>
     </w:p>
@@ -28135,7 +28287,7 @@
       <w:pPr>
         <w:pStyle w:val="Heading2"/>
       </w:pPr>
-      <w:bookmarkStart w:id="42" w:name="_Toc243165745"/>
+      <w:bookmarkStart w:id="42" w:name="_Toc243168995"/>
       <w:r>
         <w:t>8.8 Vista previa y pruebas</w:t>
       </w:r>
@@ -28207,7 +28359,7 @@
       <w:pPr>
         <w:pStyle w:val="Heading2"/>
       </w:pPr>
-      <w:bookmarkStart w:id="43" w:name="_Toc243165746"/>
+      <w:bookmarkStart w:id="43" w:name="_Toc243168996"/>
       <w:r>
         <w:t>8.9 Cambios en vivo en el panel (sincronizar.js)</w:t>
       </w:r>
@@ -28250,6 +28402,31 @@
       </w:pPr>
       <w:r>
         <w:t>Las subidas de un mismo widget van en fila, para que siempre gane la última.</w:t>
+      </w:r>
+    </w:p>
+    <w:p>
+      <w:pPr>
+        <w:pStyle w:val="ListParagraph"/>
+        <w:numPr>
+          <w:ilvl w:val="0"/>
+          <w:numId w:val="3"/>
+        </w:numPr>
+        <w:spacing w:after="60"/>
+      </w:pPr>
+      <w:r>
+        <w:t xml:space="preserve">A lo que sube cada widget se le agrega </w:t>
+      </w:r>
+      <w:r>
+        <w:rPr>
+          <w:rFonts w:ascii="Consolas" w:eastAsia="Consolas" w:hAnsi="Consolas" w:cs="Consolas"/>
+          <w:color w:val="7A1F33"/>
+          <w:sz w:val="19"/>
+          <w:szCs w:val="19"/>
+        </w:rPr>
+        <w:t>u</w:t>
+      </w:r>
+      <w:r>
+        <w:t>, el usuario de Ajustes → Conexión. La API key no se sube.</w:t>
       </w:r>
     </w:p>
     <w:p>
@@ -28300,6 +28477,7 @@
         <w:spacing w:after="60"/>
       </w:pPr>
       <w:r>
+        <w:lastRenderedPageBreak/>
         <w:t>El identificador de un widget se crea la primera vez que se muestra su URL; los widgets que nunca se abrieron no crean filas en Supabase.</w:t>
       </w:r>
     </w:p>
@@ -28308,7 +28486,7 @@
         <w:pStyle w:val="Heading1"/>
         <w:pageBreakBefore/>
       </w:pPr>
-      <w:bookmarkStart w:id="44" w:name="_Toc243165747"/>
+      <w:bookmarkStart w:id="44" w:name="_Toc243168997"/>
       <w:r>
         <w:lastRenderedPageBreak/>
         <w:t>9. Flujos completos paso a paso</w:t>
@@ -28319,7 +28497,7 @@
       <w:pPr>
         <w:pStyle w:val="Heading2"/>
       </w:pPr>
-      <w:bookmarkStart w:id="45" w:name="_Toc243165748"/>
+      <w:bookmarkStart w:id="45" w:name="_Toc243168998"/>
       <w:r>
         <w:t>9.1 Configurar un widget y ponerlo en OBS</w:t>
       </w:r>
@@ -28502,7 +28680,7 @@
       <w:pPr>
         <w:pStyle w:val="Heading2"/>
       </w:pPr>
-      <w:bookmarkStart w:id="46" w:name="_Toc243165749"/>
+      <w:bookmarkStart w:id="46" w:name="_Toc243168999"/>
       <w:r>
         <w:t>9.2 Llega un regalo y gira la ruleta</w:t>
       </w:r>
@@ -28643,7 +28821,7 @@
       <w:pPr>
         <w:pStyle w:val="Heading2"/>
       </w:pPr>
-      <w:bookmarkStart w:id="47" w:name="_Toc243165750"/>
+      <w:bookmarkStart w:id="47" w:name="_Toc243169000"/>
       <w:r>
         <w:t>9.3 Probar sin estar en vivo</w:t>
       </w:r>
@@ -28738,7 +28916,7 @@
       <w:pPr>
         <w:pStyle w:val="Heading2"/>
       </w:pPr>
-      <w:bookmarkStart w:id="48" w:name="_Toc243165751"/>
+      <w:bookmarkStart w:id="48" w:name="_Toc243169001"/>
       <w:r>
         <w:lastRenderedPageBreak/>
         <w:t>9.4 Un regalo cambia de código</w:t>
@@ -29107,7 +29285,7 @@
       <w:pPr>
         <w:pStyle w:val="Heading2"/>
       </w:pPr>
-      <w:bookmarkStart w:id="49" w:name="_Toc243165752"/>
+      <w:bookmarkStart w:id="49" w:name="_Toc243169002"/>
       <w:r>
         <w:t>9.5 Cambiar la configuración durante el LIVE</w:t>
       </w:r>
@@ -29169,7 +29347,7 @@
       <w:pPr>
         <w:pStyle w:val="Heading2"/>
       </w:pPr>
-      <w:bookmarkStart w:id="50" w:name="_Toc243165753"/>
+      <w:bookmarkStart w:id="50" w:name="_Toc243169003"/>
       <w:r>
         <w:t>9.6 Una ronda de la carrera de regalos</w:t>
       </w:r>
@@ -29283,7 +29461,7 @@
         <w:pStyle w:val="Heading1"/>
         <w:pageBreakBefore/>
       </w:pPr>
-      <w:bookmarkStart w:id="51" w:name="_Toc243165754"/>
+      <w:bookmarkStart w:id="51" w:name="_Toc243169004"/>
       <w:r>
         <w:lastRenderedPageBreak/>
         <w:t>10. Diseño visual</w:t>
@@ -29294,7 +29472,7 @@
       <w:pPr>
         <w:pStyle w:val="Heading2"/>
       </w:pPr>
-      <w:bookmarkStart w:id="52" w:name="_Toc243165755"/>
+      <w:bookmarkStart w:id="52" w:name="_Toc243169005"/>
       <w:r>
         <w:t>10.1 Panel</w:t>
       </w:r>
@@ -30103,7 +30281,7 @@
       <w:pPr>
         <w:pStyle w:val="Heading2"/>
       </w:pPr>
-      <w:bookmarkStart w:id="53" w:name="_Toc243165756"/>
+      <w:bookmarkStart w:id="53" w:name="_Toc243169006"/>
       <w:r>
         <w:t>10.2 Widgets</w:t>
       </w:r>
@@ -30665,7 +30843,7 @@
         <w:pStyle w:val="Heading1"/>
         <w:pageBreakBefore/>
       </w:pPr>
-      <w:bookmarkStart w:id="54" w:name="_Toc243165757"/>
+      <w:bookmarkStart w:id="54" w:name="_Toc243169007"/>
       <w:r>
         <w:lastRenderedPageBreak/>
         <w:t>11. Seguridad y privacidad</w:t>
@@ -30877,7 +31055,7 @@
               <w:spacing w:after="20"/>
             </w:pPr>
             <w:r>
-              <w:t>Se guardan en el navegador (localStorage), incluido el secreto de Supabase. En Supabase solo queda la configuración de los widgets (premios, títulos, colores), nunca la API key de Euler.</w:t>
+              <w:t>Se guardan en el navegador (localStorage), incluido el secreto de Supabase. En Supabase solo queda la configuración de los widgets (premios, títulos, colores) y el usuario de TikTok, que es público; nunca la API key de Euler.</w:t>
             </w:r>
           </w:p>
         </w:tc>
@@ -31183,7 +31361,7 @@
         <w:pStyle w:val="Heading1"/>
         <w:pageBreakBefore/>
       </w:pPr>
-      <w:bookmarkStart w:id="55" w:name="_Toc243165758"/>
+      <w:bookmarkStart w:id="55" w:name="_Toc243169008"/>
       <w:r>
         <w:lastRenderedPageBreak/>
         <w:t>12. Limitaciones actuales</w:t>
@@ -32799,7 +32977,7 @@
         <w:pStyle w:val="Heading1"/>
         <w:pageBreakBefore/>
       </w:pPr>
-      <w:bookmarkStart w:id="56" w:name="_Toc243165759"/>
+      <w:bookmarkStart w:id="56" w:name="_Toc243169009"/>
       <w:r>
         <w:lastRenderedPageBreak/>
         <w:t>13. Hacia una versión final montada en un servidor</w:t>
@@ -32828,7 +33006,7 @@
       <w:pPr>
         <w:pStyle w:val="Heading2"/>
       </w:pPr>
-      <w:bookmarkStart w:id="57" w:name="_Toc243165760"/>
+      <w:bookmarkStart w:id="57" w:name="_Toc243169010"/>
       <w:r>
         <w:t>13.1 Objetivos de la versión final</w:t>
       </w:r>
@@ -32990,7 +33168,7 @@
       <w:pPr>
         <w:pStyle w:val="Heading2"/>
       </w:pPr>
-      <w:bookmarkStart w:id="58" w:name="_Toc243165761"/>
+      <w:bookmarkStart w:id="58" w:name="_Toc243169011"/>
       <w:r>
         <w:t>13.2 Arquitectura propuesta</w:t>
       </w:r>
@@ -33823,7 +34001,7 @@
       <w:pPr>
         <w:pStyle w:val="Heading2"/>
       </w:pPr>
-      <w:bookmarkStart w:id="59" w:name="_Toc243165762"/>
+      <w:bookmarkStart w:id="59" w:name="_Toc243169012"/>
       <w:r>
         <w:t>13.3 Modelo de datos sugerido</w:t>
       </w:r>
@@ -34534,7 +34712,7 @@
       <w:pPr>
         <w:pStyle w:val="Heading2"/>
       </w:pPr>
-      <w:bookmarkStart w:id="60" w:name="_Toc243165763"/>
+      <w:bookmarkStart w:id="60" w:name="_Toc243169013"/>
       <w:r>
         <w:lastRenderedPageBreak/>
         <w:t>13.4 Seguridad en la versión final</w:t>
@@ -34773,7 +34951,7 @@
       <w:pPr>
         <w:pStyle w:val="Heading2"/>
       </w:pPr>
-      <w:bookmarkStart w:id="61" w:name="_Toc243165764"/>
+      <w:bookmarkStart w:id="61" w:name="_Toc243169014"/>
       <w:r>
         <w:t>13.5 Dónde alojarlo</w:t>
       </w:r>
@@ -35382,7 +35560,7 @@
       <w:pPr>
         <w:pStyle w:val="Heading2"/>
       </w:pPr>
-      <w:bookmarkStart w:id="62" w:name="_Toc243165765"/>
+      <w:bookmarkStart w:id="62" w:name="_Toc243169015"/>
       <w:r>
         <w:t>13.6 Qué se reutiliza y qué cambia del código actual</w:t>
       </w:r>
@@ -36194,7 +36372,7 @@
       <w:pPr>
         <w:pStyle w:val="Heading2"/>
       </w:pPr>
-      <w:bookmarkStart w:id="63" w:name="_Toc243165766"/>
+      <w:bookmarkStart w:id="63" w:name="_Toc243169016"/>
       <w:r>
         <w:lastRenderedPageBreak/>
         <w:t>13.7 Mejoras técnicas recomendadas</w:t>
@@ -36385,7 +36563,7 @@
       <w:pPr>
         <w:pStyle w:val="Heading2"/>
       </w:pPr>
-      <w:bookmarkStart w:id="64" w:name="_Toc243165767"/>
+      <w:bookmarkStart w:id="64" w:name="_Toc243169017"/>
       <w:r>
         <w:t>13.8 Nuevas funciones que habilita un servidor</w:t>
       </w:r>
@@ -36486,7 +36664,7 @@
       <w:pPr>
         <w:pStyle w:val="Heading2"/>
       </w:pPr>
-      <w:bookmarkStart w:id="65" w:name="_Toc243165768"/>
+      <w:bookmarkStart w:id="65" w:name="_Toc243169018"/>
       <w:r>
         <w:t>13.9 Hoja de ruta por fases</w:t>
       </w:r>
@@ -36970,7 +37148,7 @@
         <w:pStyle w:val="Heading1"/>
         <w:pageBreakBefore/>
       </w:pPr>
-      <w:bookmarkStart w:id="66" w:name="_Toc243165769"/>
+      <w:bookmarkStart w:id="66" w:name="_Toc243169019"/>
       <w:r>
         <w:lastRenderedPageBreak/>
         <w:t>14. Operación y mantenimiento actual</w:t>
@@ -36981,7 +37159,7 @@
       <w:pPr>
         <w:pStyle w:val="Heading2"/>
       </w:pPr>
-      <w:bookmarkStart w:id="67" w:name="_Toc243165770"/>
+      <w:bookmarkStart w:id="67" w:name="_Toc243169020"/>
       <w:r>
         <w:t>14.1 Publicar un cambio</w:t>
       </w:r>
@@ -37047,7 +37225,7 @@
       <w:pPr>
         <w:pStyle w:val="Heading2"/>
       </w:pPr>
-      <w:bookmarkStart w:id="68" w:name="_Toc243165771"/>
+      <w:bookmarkStart w:id="68" w:name="_Toc243169021"/>
       <w:r>
         <w:t>14.2 Agregar una función nueva</w:t>
       </w:r>
@@ -37108,7 +37286,7 @@
       <w:pPr>
         <w:pStyle w:val="Heading2"/>
       </w:pPr>
-      <w:bookmarkStart w:id="69" w:name="_Toc243165772"/>
+      <w:bookmarkStart w:id="69" w:name="_Toc243169022"/>
       <w:r>
         <w:t>14.3 Probar</w:t>
       </w:r>
@@ -37300,7 +37478,7 @@
       <w:pPr>
         <w:pStyle w:val="Heading2"/>
       </w:pPr>
-      <w:bookmarkStart w:id="70" w:name="_Toc243165773"/>
+      <w:bookmarkStart w:id="70" w:name="_Toc243169023"/>
       <w:r>
         <w:t>14.4 Solución de problemas</w:t>
       </w:r>
@@ -38732,6 +38910,237 @@
           </w:p>
         </w:tc>
       </w:tr>
+      <w:tr>
+        <w:tc>
+          <w:tcPr>
+            <w:tcW w:w="2808" w:type="dxa"/>
+            <w:tcBorders>
+              <w:top w:val="single" w:sz="4" w:space="0" w:color="BFBFBF"/>
+              <w:left w:val="single" w:sz="4" w:space="0" w:color="BFBFBF"/>
+              <w:bottom w:val="single" w:sz="4" w:space="0" w:color="BFBFBF"/>
+              <w:right w:val="single" w:sz="4" w:space="0" w:color="BFBFBF"/>
+            </w:tcBorders>
+            <w:tcMar>
+              <w:top w:w="60" w:type="dxa"/>
+              <w:left w:w="100" w:type="dxa"/>
+              <w:bottom w:w="60" w:type="dxa"/>
+              <w:right w:w="100" w:type="dxa"/>
+            </w:tcMar>
+          </w:tcPr>
+          <w:p>
+            <w:pPr>
+              <w:spacing w:after="20"/>
+            </w:pPr>
+            <w:r>
+              <w:t>La meta de likes va por detrás del contador de TikTok</w:t>
+            </w:r>
+          </w:p>
+        </w:tc>
+        <w:tc>
+          <w:tcPr>
+            <w:tcW w:w="2995" w:type="dxa"/>
+            <w:tcBorders>
+              <w:top w:val="single" w:sz="4" w:space="0" w:color="BFBFBF"/>
+              <w:left w:val="single" w:sz="4" w:space="0" w:color="BFBFBF"/>
+              <w:bottom w:val="single" w:sz="4" w:space="0" w:color="BFBFBF"/>
+              <w:right w:val="single" w:sz="4" w:space="0" w:color="BFBFBF"/>
+            </w:tcBorders>
+            <w:tcMar>
+              <w:top w:w="60" w:type="dxa"/>
+              <w:left w:w="100" w:type="dxa"/>
+              <w:bottom w:w="60" w:type="dxa"/>
+              <w:right w:w="100" w:type="dxa"/>
+            </w:tcMar>
+          </w:tcPr>
+          <w:p>
+            <w:pPr>
+              <w:spacing w:after="20"/>
+            </w:pPr>
+            <w:r>
+              <w:t>La meta empezó a contar cuando se abrió la fuente en OBS (los likes de antes no cuentan)</w:t>
+            </w:r>
+          </w:p>
+        </w:tc>
+        <w:tc>
+          <w:tcPr>
+            <w:tcW w:w="3557" w:type="dxa"/>
+            <w:tcBorders>
+              <w:top w:val="single" w:sz="4" w:space="0" w:color="BFBFBF"/>
+              <w:left w:val="single" w:sz="4" w:space="0" w:color="BFBFBF"/>
+              <w:bottom w:val="single" w:sz="4" w:space="0" w:color="BFBFBF"/>
+              <w:right w:val="single" w:sz="4" w:space="0" w:color="BFBFBF"/>
+            </w:tcBorders>
+            <w:tcMar>
+              <w:top w:w="60" w:type="dxa"/>
+              <w:left w:w="100" w:type="dxa"/>
+              <w:bottom w:w="60" w:type="dxa"/>
+              <w:right w:w="100" w:type="dxa"/>
+            </w:tcMar>
+          </w:tcPr>
+          <w:p>
+            <w:pPr>
+              <w:spacing w:after="20"/>
+            </w:pPr>
+            <w:r>
+              <w:t>Abrir o recargar la fuente al empezar el LIVE. Desde la corrección de octubre de 2026 ya no se pierden likes por el camino</w:t>
+            </w:r>
+          </w:p>
+        </w:tc>
+      </w:tr>
+      <w:tr>
+        <w:tc>
+          <w:tcPr>
+            <w:tcW w:w="2808" w:type="dxa"/>
+            <w:tcBorders>
+              <w:top w:val="single" w:sz="4" w:space="0" w:color="BFBFBF"/>
+              <w:left w:val="single" w:sz="4" w:space="0" w:color="BFBFBF"/>
+              <w:bottom w:val="single" w:sz="4" w:space="0" w:color="BFBFBF"/>
+              <w:right w:val="single" w:sz="4" w:space="0" w:color="BFBFBF"/>
+            </w:tcBorders>
+            <w:tcMar>
+              <w:top w:w="60" w:type="dxa"/>
+              <w:left w:w="100" w:type="dxa"/>
+              <w:bottom w:w="60" w:type="dxa"/>
+              <w:right w:w="100" w:type="dxa"/>
+            </w:tcMar>
+          </w:tcPr>
+          <w:p>
+            <w:pPr>
+              <w:spacing w:after="20"/>
+            </w:pPr>
+            <w:r>
+              <w:t>El subathon no suma tiempo con likes ni regalos</w:t>
+            </w:r>
+          </w:p>
+        </w:tc>
+        <w:tc>
+          <w:tcPr>
+            <w:tcW w:w="2995" w:type="dxa"/>
+            <w:tcBorders>
+              <w:top w:val="single" w:sz="4" w:space="0" w:color="BFBFBF"/>
+              <w:left w:val="single" w:sz="4" w:space="0" w:color="BFBFBF"/>
+              <w:bottom w:val="single" w:sz="4" w:space="0" w:color="BFBFBF"/>
+              <w:right w:val="single" w:sz="4" w:space="0" w:color="BFBFBF"/>
+            </w:tcBorders>
+            <w:tcMar>
+              <w:top w:w="60" w:type="dxa"/>
+              <w:left w:w="100" w:type="dxa"/>
+              <w:bottom w:w="60" w:type="dxa"/>
+              <w:right w:w="100" w:type="dxa"/>
+            </w:tcMar>
+          </w:tcPr>
+          <w:p>
+            <w:pPr>
+              <w:spacing w:after="20"/>
+            </w:pPr>
+            <w:r>
+              <w:t>El reloj no está iniciado en ese widget (bajo el reloj dice “Listo para empezar”): no se pulsó Iniciar o la URL de OBS se copió desde el panel de otro navegador</w:t>
+            </w:r>
+          </w:p>
+        </w:tc>
+        <w:tc>
+          <w:tcPr>
+            <w:tcW w:w="3557" w:type="dxa"/>
+            <w:tcBorders>
+              <w:top w:val="single" w:sz="4" w:space="0" w:color="BFBFBF"/>
+              <w:left w:val="single" w:sz="4" w:space="0" w:color="BFBFBF"/>
+              <w:bottom w:val="single" w:sz="4" w:space="0" w:color="BFBFBF"/>
+              <w:right w:val="single" w:sz="4" w:space="0" w:color="BFBFBF"/>
+            </w:tcBorders>
+            <w:tcMar>
+              <w:top w:w="60" w:type="dxa"/>
+              <w:left w:w="100" w:type="dxa"/>
+              <w:bottom w:w="60" w:type="dxa"/>
+              <w:right w:w="100" w:type="dxa"/>
+            </w:tcMar>
+          </w:tcPr>
+          <w:p>
+            <w:pPr>
+              <w:spacing w:after="20"/>
+            </w:pPr>
+            <w:r>
+              <w:t>Pulsar Iniciar en el panel; si el widget no cambia, copiar de nuevo la URL desde el panel que se usa y pegarla en OBS</w:t>
+            </w:r>
+          </w:p>
+        </w:tc>
+      </w:tr>
+      <w:tr>
+        <w:tc>
+          <w:tcPr>
+            <w:tcW w:w="2808" w:type="dxa"/>
+            <w:tcBorders>
+              <w:top w:val="single" w:sz="4" w:space="0" w:color="BFBFBF"/>
+              <w:left w:val="single" w:sz="4" w:space="0" w:color="BFBFBF"/>
+              <w:bottom w:val="single" w:sz="4" w:space="0" w:color="BFBFBF"/>
+              <w:right w:val="single" w:sz="4" w:space="0" w:color="BFBFBF"/>
+            </w:tcBorders>
+            <w:tcMar>
+              <w:top w:w="60" w:type="dxa"/>
+              <w:left w:w="100" w:type="dxa"/>
+              <w:bottom w:w="60" w:type="dxa"/>
+              <w:right w:w="100" w:type="dxa"/>
+            </w:tcMar>
+          </w:tcPr>
+          <w:p>
+            <w:pPr>
+              <w:spacing w:after="20"/>
+            </w:pPr>
+            <w:r>
+              <w:t>Al cambiar de cuenta, todo sigue conectado a la anterior</w:t>
+            </w:r>
+          </w:p>
+        </w:tc>
+        <w:tc>
+          <w:tcPr>
+            <w:tcW w:w="2995" w:type="dxa"/>
+            <w:tcBorders>
+              <w:top w:val="single" w:sz="4" w:space="0" w:color="BFBFBF"/>
+              <w:left w:val="single" w:sz="4" w:space="0" w:color="BFBFBF"/>
+              <w:bottom w:val="single" w:sz="4" w:space="0" w:color="BFBFBF"/>
+              <w:right w:val="single" w:sz="4" w:space="0" w:color="BFBFBF"/>
+            </w:tcBorders>
+            <w:tcMar>
+              <w:top w:w="60" w:type="dxa"/>
+              <w:left w:w="100" w:type="dxa"/>
+              <w:bottom w:w="60" w:type="dxa"/>
+              <w:right w:w="100" w:type="dxa"/>
+            </w:tcMar>
+          </w:tcPr>
+          <w:p>
+            <w:pPr>
+              <w:spacing w:after="20"/>
+            </w:pPr>
+            <w:r>
+              <w:t>Versión antigua en la caché de OBS o del navegador</w:t>
+            </w:r>
+          </w:p>
+        </w:tc>
+        <w:tc>
+          <w:tcPr>
+            <w:tcW w:w="3557" w:type="dxa"/>
+            <w:tcBorders>
+              <w:top w:val="single" w:sz="4" w:space="0" w:color="BFBFBF"/>
+              <w:left w:val="single" w:sz="4" w:space="0" w:color="BFBFBF"/>
+              <w:bottom w:val="single" w:sz="4" w:space="0" w:color="BFBFBF"/>
+              <w:right w:val="single" w:sz="4" w:space="0" w:color="BFBFBF"/>
+            </w:tcBorders>
+            <w:tcMar>
+              <w:top w:w="60" w:type="dxa"/>
+              <w:left w:w="100" w:type="dxa"/>
+              <w:bottom w:w="60" w:type="dxa"/>
+              <w:right w:w="100" w:type="dxa"/>
+            </w:tcMar>
+          </w:tcPr>
+          <w:p>
+            <w:pPr>
+              <w:spacing w:after="20"/>
+            </w:pPr>
+            <w:r>
+              <w:t>Actualizar la caché de la fuente en OBS y recargar el panel; desde octubre de 2026 el cambio de usuario llega solo</w:t>
+            </w:r>
+          </w:p>
+        </w:tc>
+      </w:tr>
     </w:tbl>
     <w:p>
       <w:pPr>
@@ -38743,7 +39152,7 @@
         <w:pStyle w:val="Heading1"/>
         <w:pageBreakBefore/>
       </w:pPr>
-      <w:bookmarkStart w:id="71" w:name="_Toc243165774"/>
+      <w:bookmarkStart w:id="71" w:name="_Toc243169024"/>
       <w:r>
         <w:lastRenderedPageBreak/>
         <w:t>15. Anexo: historial de decisiones y correcciones</w:t>
@@ -42025,6 +42434,237 @@
             </w:pPr>
             <w:r>
               <w:t>Que el público sepa qué regalo hace girar la ruleta sin que ocupe la pantalla</w:t>
+            </w:r>
+          </w:p>
+        </w:tc>
+      </w:tr>
+      <w:tr>
+        <w:tc>
+          <w:tcPr>
+            <w:tcW w:w="2246" w:type="dxa"/>
+            <w:tcBorders>
+              <w:top w:val="single" w:sz="4" w:space="0" w:color="BFBFBF"/>
+              <w:left w:val="single" w:sz="4" w:space="0" w:color="BFBFBF"/>
+              <w:bottom w:val="single" w:sz="4" w:space="0" w:color="BFBFBF"/>
+              <w:right w:val="single" w:sz="4" w:space="0" w:color="BFBFBF"/>
+            </w:tcBorders>
+            <w:tcMar>
+              <w:top w:w="60" w:type="dxa"/>
+              <w:left w:w="100" w:type="dxa"/>
+              <w:bottom w:w="60" w:type="dxa"/>
+              <w:right w:w="100" w:type="dxa"/>
+            </w:tcMar>
+          </w:tcPr>
+          <w:p>
+            <w:pPr>
+              <w:spacing w:after="20"/>
+            </w:pPr>
+            <w:r>
+              <w:t>Conteo de likes</w:t>
+            </w:r>
+          </w:p>
+        </w:tc>
+        <w:tc>
+          <w:tcPr>
+            <w:tcW w:w="3744" w:type="dxa"/>
+            <w:tcBorders>
+              <w:top w:val="single" w:sz="4" w:space="0" w:color="BFBFBF"/>
+              <w:left w:val="single" w:sz="4" w:space="0" w:color="BFBFBF"/>
+              <w:bottom w:val="single" w:sz="4" w:space="0" w:color="BFBFBF"/>
+              <w:right w:val="single" w:sz="4" w:space="0" w:color="BFBFBF"/>
+            </w:tcBorders>
+            <w:tcMar>
+              <w:top w:w="60" w:type="dxa"/>
+              <w:left w:w="100" w:type="dxa"/>
+              <w:bottom w:w="60" w:type="dxa"/>
+              <w:right w:w="100" w:type="dxa"/>
+            </w:tcMar>
+          </w:tcPr>
+          <w:p>
+            <w:pPr>
+              <w:spacing w:after="20"/>
+            </w:pPr>
+            <w:r>
+              <w:t>Contar lo que sube totalLikeCount entre mensajes, no la suma de likeCount</w:t>
+            </w:r>
+          </w:p>
+        </w:tc>
+        <w:tc>
+          <w:tcPr>
+            <w:tcW w:w="3370" w:type="dxa"/>
+            <w:tcBorders>
+              <w:top w:val="single" w:sz="4" w:space="0" w:color="BFBFBF"/>
+              <w:left w:val="single" w:sz="4" w:space="0" w:color="BFBFBF"/>
+              <w:bottom w:val="single" w:sz="4" w:space="0" w:color="BFBFBF"/>
+              <w:right w:val="single" w:sz="4" w:space="0" w:color="BFBFBF"/>
+            </w:tcBorders>
+            <w:tcMar>
+              <w:top w:w="60" w:type="dxa"/>
+              <w:left w:w="100" w:type="dxa"/>
+              <w:bottom w:w="60" w:type="dxa"/>
+              <w:right w:w="100" w:type="dxa"/>
+            </w:tcMar>
+          </w:tcPr>
+          <w:p>
+            <w:pPr>
+              <w:spacing w:after="20"/>
+            </w:pPr>
+            <w:r>
+              <w:t>TikTok entrega solo una parte de los mensajes de likes: una meta de 5.000 se llenaba con 13.000 likes en TikTok</w:t>
+            </w:r>
+          </w:p>
+        </w:tc>
+      </w:tr>
+      <w:tr>
+        <w:tc>
+          <w:tcPr>
+            <w:tcW w:w="2246" w:type="dxa"/>
+            <w:tcBorders>
+              <w:top w:val="single" w:sz="4" w:space="0" w:color="BFBFBF"/>
+              <w:left w:val="single" w:sz="4" w:space="0" w:color="BFBFBF"/>
+              <w:bottom w:val="single" w:sz="4" w:space="0" w:color="BFBFBF"/>
+              <w:right w:val="single" w:sz="4" w:space="0" w:color="BFBFBF"/>
+            </w:tcBorders>
+            <w:tcMar>
+              <w:top w:w="60" w:type="dxa"/>
+              <w:left w:w="100" w:type="dxa"/>
+              <w:bottom w:w="60" w:type="dxa"/>
+              <w:right w:w="100" w:type="dxa"/>
+            </w:tcMar>
+          </w:tcPr>
+          <w:p>
+            <w:pPr>
+              <w:spacing w:after="20"/>
+            </w:pPr>
+            <w:r>
+              <w:t>Cambio de cuenta de TikTok</w:t>
+            </w:r>
+          </w:p>
+        </w:tc>
+        <w:tc>
+          <w:tcPr>
+            <w:tcW w:w="3744" w:type="dxa"/>
+            <w:tcBorders>
+              <w:top w:val="single" w:sz="4" w:space="0" w:color="BFBFBF"/>
+              <w:left w:val="single" w:sz="4" w:space="0" w:color="BFBFBF"/>
+              <w:bottom w:val="single" w:sz="4" w:space="0" w:color="BFBFBF"/>
+              <w:right w:val="single" w:sz="4" w:space="0" w:color="BFBFBF"/>
+            </w:tcBorders>
+            <w:tcMar>
+              <w:top w:w="60" w:type="dxa"/>
+              <w:left w:w="100" w:type="dxa"/>
+              <w:bottom w:w="60" w:type="dxa"/>
+              <w:right w:w="100" w:type="dxa"/>
+            </w:tcMar>
+          </w:tcPr>
+          <w:p>
+            <w:pPr>
+              <w:spacing w:after="20"/>
+            </w:pPr>
+            <w:r>
+              <w:t>El usuario viaja por Supabase y gana sobre el de la URL; panel y widgets se reconectan solos tras una pausa</w:t>
+            </w:r>
+          </w:p>
+        </w:tc>
+        <w:tc>
+          <w:tcPr>
+            <w:tcW w:w="3370" w:type="dxa"/>
+            <w:tcBorders>
+              <w:top w:val="single" w:sz="4" w:space="0" w:color="BFBFBF"/>
+              <w:left w:val="single" w:sz="4" w:space="0" w:color="BFBFBF"/>
+              <w:bottom w:val="single" w:sz="4" w:space="0" w:color="BFBFBF"/>
+              <w:right w:val="single" w:sz="4" w:space="0" w:color="BFBFBF"/>
+            </w:tcBorders>
+            <w:tcMar>
+              <w:top w:w="60" w:type="dxa"/>
+              <w:left w:w="100" w:type="dxa"/>
+              <w:bottom w:w="60" w:type="dxa"/>
+              <w:right w:w="100" w:type="dxa"/>
+            </w:tcMar>
+          </w:tcPr>
+          <w:p>
+            <w:pPr>
+              <w:spacing w:after="20"/>
+            </w:pPr>
+            <w:r>
+              <w:t>Al cambiar de usuario todo seguía reintentando con la cuenta anterior y había que copiar de nuevo cada URL</w:t>
+            </w:r>
+          </w:p>
+        </w:tc>
+      </w:tr>
+      <w:tr>
+        <w:tc>
+          <w:tcPr>
+            <w:tcW w:w="2246" w:type="dxa"/>
+            <w:tcBorders>
+              <w:top w:val="single" w:sz="4" w:space="0" w:color="BFBFBF"/>
+              <w:left w:val="single" w:sz="4" w:space="0" w:color="BFBFBF"/>
+              <w:bottom w:val="single" w:sz="4" w:space="0" w:color="BFBFBF"/>
+              <w:right w:val="single" w:sz="4" w:space="0" w:color="BFBFBF"/>
+            </w:tcBorders>
+            <w:tcMar>
+              <w:top w:w="60" w:type="dxa"/>
+              <w:left w:w="100" w:type="dxa"/>
+              <w:bottom w:w="60" w:type="dxa"/>
+              <w:right w:w="100" w:type="dxa"/>
+            </w:tcMar>
+          </w:tcPr>
+          <w:p>
+            <w:pPr>
+              <w:spacing w:after="20"/>
+            </w:pPr>
+            <w:r>
+              <w:t>Subathon: “+” de los likes</w:t>
+            </w:r>
+          </w:p>
+        </w:tc>
+        <w:tc>
+          <w:tcPr>
+            <w:tcW w:w="3744" w:type="dxa"/>
+            <w:tcBorders>
+              <w:top w:val="single" w:sz="4" w:space="0" w:color="BFBFBF"/>
+              <w:left w:val="single" w:sz="4" w:space="0" w:color="BFBFBF"/>
+              <w:bottom w:val="single" w:sz="4" w:space="0" w:color="BFBFBF"/>
+              <w:right w:val="single" w:sz="4" w:space="0" w:color="BFBFBF"/>
+            </w:tcBorders>
+            <w:tcMar>
+              <w:top w:w="60" w:type="dxa"/>
+              <w:left w:w="100" w:type="dxa"/>
+              <w:bottom w:w="60" w:type="dxa"/>
+              <w:right w:w="100" w:type="dxa"/>
+            </w:tcMar>
+          </w:tcPr>
+          <w:p>
+            <w:pPr>
+              <w:spacing w:after="20"/>
+            </w:pPr>
+            <w:r>
+              <w:t>Juntar las sumas de menos de 1 s hasta llegar a 1 s</w:t>
+            </w:r>
+          </w:p>
+        </w:tc>
+        <w:tc>
+          <w:tcPr>
+            <w:tcW w:w="3370" w:type="dxa"/>
+            <w:tcBorders>
+              <w:top w:val="single" w:sz="4" w:space="0" w:color="BFBFBF"/>
+              <w:left w:val="single" w:sz="4" w:space="0" w:color="BFBFBF"/>
+              <w:bottom w:val="single" w:sz="4" w:space="0" w:color="BFBFBF"/>
+              <w:right w:val="single" w:sz="4" w:space="0" w:color="BFBFBF"/>
+            </w:tcBorders>
+            <w:tcMar>
+              <w:top w:w="60" w:type="dxa"/>
+              <w:left w:w="100" w:type="dxa"/>
+              <w:bottom w:w="60" w:type="dxa"/>
+              <w:right w:w="100" w:type="dxa"/>
+            </w:tcMar>
+          </w:tcPr>
+          <w:p>
+            <w:pPr>
+              <w:spacing w:after="20"/>
+            </w:pPr>
+            <w:r>
+              <w:t>Cada like suma una fracción de segundo; sin juntarlas, los likes nunca mostraban su “+”</w:t>
             </w:r>
           </w:p>
         </w:tc>

</xml_diff>

<commit_message>
Documentación: solución de problemas de las fuentes en OBS / LIVE Studio
- README: sección 12 nueva (diagnóstico con ?fondo=1, reloj que corre sin
  sumar por una fuente conectada a otra cuenta, subathon detenido, URLs de
  otro navegador, límites de Euler y cómo leer las URLs en los registros de
  LIVE Studio sin mostrar la clave); la vista previa es más permisiva que el
  LIVE (4.7); una fuente abierta sigue con el código viejo (7).
- Word: los mismos puntos en 8.8, 14.1, 14.4 y el historial (63 págs.).

Co-Authored-By: Claude Opus 5.5 <noreply@anthropic.com>
</commit_message>
<xml_diff>
--- a/Documentacion-Live-Tools.docx
+++ b/Documentacion-Live-Tools.docx
@@ -159,7 +159,7 @@
           <w:r>
             <w:fldChar w:fldCharType="separate"/>
           </w:r>
-          <w:hyperlink w:anchor="_Toc243168953" w:history="1">
+          <w:hyperlink w:anchor="_Toc243173232" w:history="1">
             <w:r>
               <w:rPr>
                 <w:rStyle w:val="Hyperlink"/>
@@ -183,7 +183,7 @@
               <w:rPr>
                 <w:noProof/>
               </w:rPr>
-              <w:instrText xml:space="preserve"> PAGEREF _Toc243168953 \h </w:instrText>
+              <w:instrText xml:space="preserve"> PAGEREF _Toc243173232 \h </w:instrText>
             </w:r>
             <w:r>
               <w:rPr>
@@ -225,7 +225,7 @@
               <w14:ligatures w14:val="standardContextual"/>
             </w:rPr>
           </w:pPr>
-          <w:hyperlink w:anchor="_Toc243168954" w:history="1">
+          <w:hyperlink w:anchor="_Toc243173233" w:history="1">
             <w:r>
               <w:rPr>
                 <w:rStyle w:val="Hyperlink"/>
@@ -249,7 +249,7 @@
               <w:rPr>
                 <w:noProof/>
               </w:rPr>
-              <w:instrText xml:space="preserve"> PAGEREF _Toc243168954 \h </w:instrText>
+              <w:instrText xml:space="preserve"> PAGEREF _Toc243173233 \h </w:instrText>
             </w:r>
             <w:r>
               <w:rPr>
@@ -291,7 +291,7 @@
               <w14:ligatures w14:val="standardContextual"/>
             </w:rPr>
           </w:pPr>
-          <w:hyperlink w:anchor="_Toc243168955" w:history="1">
+          <w:hyperlink w:anchor="_Toc243173234" w:history="1">
             <w:r>
               <w:rPr>
                 <w:rStyle w:val="Hyperlink"/>
@@ -315,7 +315,7 @@
               <w:rPr>
                 <w:noProof/>
               </w:rPr>
-              <w:instrText xml:space="preserve"> PAGEREF _Toc243168955 \h </w:instrText>
+              <w:instrText xml:space="preserve"> PAGEREF _Toc243173234 \h </w:instrText>
             </w:r>
             <w:r>
               <w:rPr>
@@ -357,7 +357,7 @@
               <w14:ligatures w14:val="standardContextual"/>
             </w:rPr>
           </w:pPr>
-          <w:hyperlink w:anchor="_Toc243168956" w:history="1">
+          <w:hyperlink w:anchor="_Toc243173235" w:history="1">
             <w:r>
               <w:rPr>
                 <w:rStyle w:val="Hyperlink"/>
@@ -381,7 +381,7 @@
               <w:rPr>
                 <w:noProof/>
               </w:rPr>
-              <w:instrText xml:space="preserve"> PAGEREF _Toc243168956 \h </w:instrText>
+              <w:instrText xml:space="preserve"> PAGEREF _Toc243173235 \h </w:instrText>
             </w:r>
             <w:r>
               <w:rPr>
@@ -423,7 +423,7 @@
               <w14:ligatures w14:val="standardContextual"/>
             </w:rPr>
           </w:pPr>
-          <w:hyperlink w:anchor="_Toc243168957" w:history="1">
+          <w:hyperlink w:anchor="_Toc243173236" w:history="1">
             <w:r>
               <w:rPr>
                 <w:rStyle w:val="Hyperlink"/>
@@ -447,7 +447,7 @@
               <w:rPr>
                 <w:noProof/>
               </w:rPr>
-              <w:instrText xml:space="preserve"> PAGEREF _Toc243168957 \h </w:instrText>
+              <w:instrText xml:space="preserve"> PAGEREF _Toc243173236 \h </w:instrText>
             </w:r>
             <w:r>
               <w:rPr>
@@ -489,7 +489,7 @@
               <w14:ligatures w14:val="standardContextual"/>
             </w:rPr>
           </w:pPr>
-          <w:hyperlink w:anchor="_Toc243168958" w:history="1">
+          <w:hyperlink w:anchor="_Toc243173237" w:history="1">
             <w:r>
               <w:rPr>
                 <w:rStyle w:val="Hyperlink"/>
@@ -513,7 +513,7 @@
               <w:rPr>
                 <w:noProof/>
               </w:rPr>
-              <w:instrText xml:space="preserve"> PAGEREF _Toc243168958 \h </w:instrText>
+              <w:instrText xml:space="preserve"> PAGEREF _Toc243173237 \h </w:instrText>
             </w:r>
             <w:r>
               <w:rPr>
@@ -555,7 +555,7 @@
               <w14:ligatures w14:val="standardContextual"/>
             </w:rPr>
           </w:pPr>
-          <w:hyperlink w:anchor="_Toc243168959" w:history="1">
+          <w:hyperlink w:anchor="_Toc243173238" w:history="1">
             <w:r>
               <w:rPr>
                 <w:rStyle w:val="Hyperlink"/>
@@ -579,7 +579,7 @@
               <w:rPr>
                 <w:noProof/>
               </w:rPr>
-              <w:instrText xml:space="preserve"> PAGEREF _Toc243168959 \h </w:instrText>
+              <w:instrText xml:space="preserve"> PAGEREF _Toc243173238 \h </w:instrText>
             </w:r>
             <w:r>
               <w:rPr>
@@ -621,7 +621,7 @@
               <w14:ligatures w14:val="standardContextual"/>
             </w:rPr>
           </w:pPr>
-          <w:hyperlink w:anchor="_Toc243168960" w:history="1">
+          <w:hyperlink w:anchor="_Toc243173239" w:history="1">
             <w:r>
               <w:rPr>
                 <w:rStyle w:val="Hyperlink"/>
@@ -645,7 +645,7 @@
               <w:rPr>
                 <w:noProof/>
               </w:rPr>
-              <w:instrText xml:space="preserve"> PAGEREF _Toc243168960 \h </w:instrText>
+              <w:instrText xml:space="preserve"> PAGEREF _Toc243173239 \h </w:instrText>
             </w:r>
             <w:r>
               <w:rPr>
@@ -687,7 +687,7 @@
               <w14:ligatures w14:val="standardContextual"/>
             </w:rPr>
           </w:pPr>
-          <w:hyperlink w:anchor="_Toc243168961" w:history="1">
+          <w:hyperlink w:anchor="_Toc243173240" w:history="1">
             <w:r>
               <w:rPr>
                 <w:rStyle w:val="Hyperlink"/>
@@ -711,7 +711,7 @@
               <w:rPr>
                 <w:noProof/>
               </w:rPr>
-              <w:instrText xml:space="preserve"> PAGEREF _Toc243168961 \h </w:instrText>
+              <w:instrText xml:space="preserve"> PAGEREF _Toc243173240 \h </w:instrText>
             </w:r>
             <w:r>
               <w:rPr>
@@ -753,7 +753,7 @@
               <w14:ligatures w14:val="standardContextual"/>
             </w:rPr>
           </w:pPr>
-          <w:hyperlink w:anchor="_Toc243168962" w:history="1">
+          <w:hyperlink w:anchor="_Toc243173241" w:history="1">
             <w:r>
               <w:rPr>
                 <w:rStyle w:val="Hyperlink"/>
@@ -777,7 +777,7 @@
               <w:rPr>
                 <w:noProof/>
               </w:rPr>
-              <w:instrText xml:space="preserve"> PAGEREF _Toc243168962 \h </w:instrText>
+              <w:instrText xml:space="preserve"> PAGEREF _Toc243173241 \h </w:instrText>
             </w:r>
             <w:r>
               <w:rPr>
@@ -819,7 +819,7 @@
               <w14:ligatures w14:val="standardContextual"/>
             </w:rPr>
           </w:pPr>
-          <w:hyperlink w:anchor="_Toc243168963" w:history="1">
+          <w:hyperlink w:anchor="_Toc243173242" w:history="1">
             <w:r>
               <w:rPr>
                 <w:rStyle w:val="Hyperlink"/>
@@ -843,7 +843,7 @@
               <w:rPr>
                 <w:noProof/>
               </w:rPr>
-              <w:instrText xml:space="preserve"> PAGEREF _Toc243168963 \h </w:instrText>
+              <w:instrText xml:space="preserve"> PAGEREF _Toc243173242 \h </w:instrText>
             </w:r>
             <w:r>
               <w:rPr>
@@ -885,7 +885,7 @@
               <w14:ligatures w14:val="standardContextual"/>
             </w:rPr>
           </w:pPr>
-          <w:hyperlink w:anchor="_Toc243168964" w:history="1">
+          <w:hyperlink w:anchor="_Toc243173243" w:history="1">
             <w:r>
               <w:rPr>
                 <w:rStyle w:val="Hyperlink"/>
@@ -909,7 +909,7 @@
               <w:rPr>
                 <w:noProof/>
               </w:rPr>
-              <w:instrText xml:space="preserve"> PAGEREF _Toc243168964 \h </w:instrText>
+              <w:instrText xml:space="preserve"> PAGEREF _Toc243173243 \h </w:instrText>
             </w:r>
             <w:r>
               <w:rPr>
@@ -951,7 +951,7 @@
               <w14:ligatures w14:val="standardContextual"/>
             </w:rPr>
           </w:pPr>
-          <w:hyperlink w:anchor="_Toc243168965" w:history="1">
+          <w:hyperlink w:anchor="_Toc243173244" w:history="1">
             <w:r>
               <w:rPr>
                 <w:rStyle w:val="Hyperlink"/>
@@ -975,7 +975,7 @@
               <w:rPr>
                 <w:noProof/>
               </w:rPr>
-              <w:instrText xml:space="preserve"> PAGEREF _Toc243168965 \h </w:instrText>
+              <w:instrText xml:space="preserve"> PAGEREF _Toc243173244 \h </w:instrText>
             </w:r>
             <w:r>
               <w:rPr>
@@ -1017,7 +1017,7 @@
               <w14:ligatures w14:val="standardContextual"/>
             </w:rPr>
           </w:pPr>
-          <w:hyperlink w:anchor="_Toc243168966" w:history="1">
+          <w:hyperlink w:anchor="_Toc243173245" w:history="1">
             <w:r>
               <w:rPr>
                 <w:rStyle w:val="Hyperlink"/>
@@ -1041,7 +1041,7 @@
               <w:rPr>
                 <w:noProof/>
               </w:rPr>
-              <w:instrText xml:space="preserve"> PAGEREF _Toc243168966 \h </w:instrText>
+              <w:instrText xml:space="preserve"> PAGEREF _Toc243173245 \h </w:instrText>
             </w:r>
             <w:r>
               <w:rPr>
@@ -1083,7 +1083,7 @@
               <w14:ligatures w14:val="standardContextual"/>
             </w:rPr>
           </w:pPr>
-          <w:hyperlink w:anchor="_Toc243168967" w:history="1">
+          <w:hyperlink w:anchor="_Toc243173246" w:history="1">
             <w:r>
               <w:rPr>
                 <w:rStyle w:val="Hyperlink"/>
@@ -1107,7 +1107,7 @@
               <w:rPr>
                 <w:noProof/>
               </w:rPr>
-              <w:instrText xml:space="preserve"> PAGEREF _Toc243168967 \h </w:instrText>
+              <w:instrText xml:space="preserve"> PAGEREF _Toc243173246 \h </w:instrText>
             </w:r>
             <w:r>
               <w:rPr>
@@ -1149,7 +1149,7 @@
               <w14:ligatures w14:val="standardContextual"/>
             </w:rPr>
           </w:pPr>
-          <w:hyperlink w:anchor="_Toc243168968" w:history="1">
+          <w:hyperlink w:anchor="_Toc243173247" w:history="1">
             <w:r>
               <w:rPr>
                 <w:rStyle w:val="Hyperlink"/>
@@ -1173,7 +1173,7 @@
               <w:rPr>
                 <w:noProof/>
               </w:rPr>
-              <w:instrText xml:space="preserve"> PAGEREF _Toc243168968 \h </w:instrText>
+              <w:instrText xml:space="preserve"> PAGEREF _Toc243173247 \h </w:instrText>
             </w:r>
             <w:r>
               <w:rPr>
@@ -1215,7 +1215,7 @@
               <w14:ligatures w14:val="standardContextual"/>
             </w:rPr>
           </w:pPr>
-          <w:hyperlink w:anchor="_Toc243168969" w:history="1">
+          <w:hyperlink w:anchor="_Toc243173248" w:history="1">
             <w:r>
               <w:rPr>
                 <w:rStyle w:val="Hyperlink"/>
@@ -1239,7 +1239,7 @@
               <w:rPr>
                 <w:noProof/>
               </w:rPr>
-              <w:instrText xml:space="preserve"> PAGEREF _Toc243168969 \h </w:instrText>
+              <w:instrText xml:space="preserve"> PAGEREF _Toc243173248 \h </w:instrText>
             </w:r>
             <w:r>
               <w:rPr>
@@ -1281,7 +1281,7 @@
               <w14:ligatures w14:val="standardContextual"/>
             </w:rPr>
           </w:pPr>
-          <w:hyperlink w:anchor="_Toc243168970" w:history="1">
+          <w:hyperlink w:anchor="_Toc243173249" w:history="1">
             <w:r>
               <w:rPr>
                 <w:rStyle w:val="Hyperlink"/>
@@ -1305,7 +1305,7 @@
               <w:rPr>
                 <w:noProof/>
               </w:rPr>
-              <w:instrText xml:space="preserve"> PAGEREF _Toc243168970 \h </w:instrText>
+              <w:instrText xml:space="preserve"> PAGEREF _Toc243173249 \h </w:instrText>
             </w:r>
             <w:r>
               <w:rPr>
@@ -1347,7 +1347,7 @@
               <w14:ligatures w14:val="standardContextual"/>
             </w:rPr>
           </w:pPr>
-          <w:hyperlink w:anchor="_Toc243168971" w:history="1">
+          <w:hyperlink w:anchor="_Toc243173250" w:history="1">
             <w:r>
               <w:rPr>
                 <w:rStyle w:val="Hyperlink"/>
@@ -1371,7 +1371,7 @@
               <w:rPr>
                 <w:noProof/>
               </w:rPr>
-              <w:instrText xml:space="preserve"> PAGEREF _Toc243168971 \h </w:instrText>
+              <w:instrText xml:space="preserve"> PAGEREF _Toc243173250 \h </w:instrText>
             </w:r>
             <w:r>
               <w:rPr>
@@ -1413,7 +1413,7 @@
               <w14:ligatures w14:val="standardContextual"/>
             </w:rPr>
           </w:pPr>
-          <w:hyperlink w:anchor="_Toc243168972" w:history="1">
+          <w:hyperlink w:anchor="_Toc243173251" w:history="1">
             <w:r>
               <w:rPr>
                 <w:rStyle w:val="Hyperlink"/>
@@ -1437,7 +1437,7 @@
               <w:rPr>
                 <w:noProof/>
               </w:rPr>
-              <w:instrText xml:space="preserve"> PAGEREF _Toc243168972 \h </w:instrText>
+              <w:instrText xml:space="preserve"> PAGEREF _Toc243173251 \h </w:instrText>
             </w:r>
             <w:r>
               <w:rPr>
@@ -1479,7 +1479,7 @@
               <w14:ligatures w14:val="standardContextual"/>
             </w:rPr>
           </w:pPr>
-          <w:hyperlink w:anchor="_Toc243168973" w:history="1">
+          <w:hyperlink w:anchor="_Toc243173252" w:history="1">
             <w:r>
               <w:rPr>
                 <w:rStyle w:val="Hyperlink"/>
@@ -1503,7 +1503,7 @@
               <w:rPr>
                 <w:noProof/>
               </w:rPr>
-              <w:instrText xml:space="preserve"> PAGEREF _Toc243168973 \h </w:instrText>
+              <w:instrText xml:space="preserve"> PAGEREF _Toc243173252 \h </w:instrText>
             </w:r>
             <w:r>
               <w:rPr>
@@ -1545,7 +1545,7 @@
               <w14:ligatures w14:val="standardContextual"/>
             </w:rPr>
           </w:pPr>
-          <w:hyperlink w:anchor="_Toc243168974" w:history="1">
+          <w:hyperlink w:anchor="_Toc243173253" w:history="1">
             <w:r>
               <w:rPr>
                 <w:rStyle w:val="Hyperlink"/>
@@ -1569,7 +1569,7 @@
               <w:rPr>
                 <w:noProof/>
               </w:rPr>
-              <w:instrText xml:space="preserve"> PAGEREF _Toc243168974 \h </w:instrText>
+              <w:instrText xml:space="preserve"> PAGEREF _Toc243173253 \h </w:instrText>
             </w:r>
             <w:r>
               <w:rPr>
@@ -1611,7 +1611,7 @@
               <w14:ligatures w14:val="standardContextual"/>
             </w:rPr>
           </w:pPr>
-          <w:hyperlink w:anchor="_Toc243168975" w:history="1">
+          <w:hyperlink w:anchor="_Toc243173254" w:history="1">
             <w:r>
               <w:rPr>
                 <w:rStyle w:val="Hyperlink"/>
@@ -1635,7 +1635,7 @@
               <w:rPr>
                 <w:noProof/>
               </w:rPr>
-              <w:instrText xml:space="preserve"> PAGEREF _Toc243168975 \h </w:instrText>
+              <w:instrText xml:space="preserve"> PAGEREF _Toc243173254 \h </w:instrText>
             </w:r>
             <w:r>
               <w:rPr>
@@ -1677,7 +1677,7 @@
               <w14:ligatures w14:val="standardContextual"/>
             </w:rPr>
           </w:pPr>
-          <w:hyperlink w:anchor="_Toc243168976" w:history="1">
+          <w:hyperlink w:anchor="_Toc243173255" w:history="1">
             <w:r>
               <w:rPr>
                 <w:rStyle w:val="Hyperlink"/>
@@ -1701,7 +1701,7 @@
               <w:rPr>
                 <w:noProof/>
               </w:rPr>
-              <w:instrText xml:space="preserve"> PAGEREF _Toc243168976 \h </w:instrText>
+              <w:instrText xml:space="preserve"> PAGEREF _Toc243173255 \h </w:instrText>
             </w:r>
             <w:r>
               <w:rPr>
@@ -1743,7 +1743,7 @@
               <w14:ligatures w14:val="standardContextual"/>
             </w:rPr>
           </w:pPr>
-          <w:hyperlink w:anchor="_Toc243168977" w:history="1">
+          <w:hyperlink w:anchor="_Toc243173256" w:history="1">
             <w:r>
               <w:rPr>
                 <w:rStyle w:val="Hyperlink"/>
@@ -1767,7 +1767,7 @@
               <w:rPr>
                 <w:noProof/>
               </w:rPr>
-              <w:instrText xml:space="preserve"> PAGEREF _Toc243168977 \h </w:instrText>
+              <w:instrText xml:space="preserve"> PAGEREF _Toc243173256 \h </w:instrText>
             </w:r>
             <w:r>
               <w:rPr>
@@ -1809,7 +1809,7 @@
               <w14:ligatures w14:val="standardContextual"/>
             </w:rPr>
           </w:pPr>
-          <w:hyperlink w:anchor="_Toc243168978" w:history="1">
+          <w:hyperlink w:anchor="_Toc243173257" w:history="1">
             <w:r>
               <w:rPr>
                 <w:rStyle w:val="Hyperlink"/>
@@ -1833,7 +1833,7 @@
               <w:rPr>
                 <w:noProof/>
               </w:rPr>
-              <w:instrText xml:space="preserve"> PAGEREF _Toc243168978 \h </w:instrText>
+              <w:instrText xml:space="preserve"> PAGEREF _Toc243173257 \h </w:instrText>
             </w:r>
             <w:r>
               <w:rPr>
@@ -1875,7 +1875,7 @@
               <w14:ligatures w14:val="standardContextual"/>
             </w:rPr>
           </w:pPr>
-          <w:hyperlink w:anchor="_Toc243168979" w:history="1">
+          <w:hyperlink w:anchor="_Toc243173258" w:history="1">
             <w:r>
               <w:rPr>
                 <w:rStyle w:val="Hyperlink"/>
@@ -1899,7 +1899,7 @@
               <w:rPr>
                 <w:noProof/>
               </w:rPr>
-              <w:instrText xml:space="preserve"> PAGEREF _Toc243168979 \h </w:instrText>
+              <w:instrText xml:space="preserve"> PAGEREF _Toc243173258 \h </w:instrText>
             </w:r>
             <w:r>
               <w:rPr>
@@ -1941,7 +1941,7 @@
               <w14:ligatures w14:val="standardContextual"/>
             </w:rPr>
           </w:pPr>
-          <w:hyperlink w:anchor="_Toc243168980" w:history="1">
+          <w:hyperlink w:anchor="_Toc243173259" w:history="1">
             <w:r>
               <w:rPr>
                 <w:rStyle w:val="Hyperlink"/>
@@ -1965,7 +1965,7 @@
               <w:rPr>
                 <w:noProof/>
               </w:rPr>
-              <w:instrText xml:space="preserve"> PAGEREF _Toc243168980 \h </w:instrText>
+              <w:instrText xml:space="preserve"> PAGEREF _Toc243173259 \h </w:instrText>
             </w:r>
             <w:r>
               <w:rPr>
@@ -2007,7 +2007,7 @@
               <w14:ligatures w14:val="standardContextual"/>
             </w:rPr>
           </w:pPr>
-          <w:hyperlink w:anchor="_Toc243168981" w:history="1">
+          <w:hyperlink w:anchor="_Toc243173260" w:history="1">
             <w:r>
               <w:rPr>
                 <w:rStyle w:val="Hyperlink"/>
@@ -2031,7 +2031,7 @@
               <w:rPr>
                 <w:noProof/>
               </w:rPr>
-              <w:instrText xml:space="preserve"> PAGEREF _Toc243168981 \h </w:instrText>
+              <w:instrText xml:space="preserve"> PAGEREF _Toc243173260 \h </w:instrText>
             </w:r>
             <w:r>
               <w:rPr>
@@ -2073,7 +2073,7 @@
               <w14:ligatures w14:val="standardContextual"/>
             </w:rPr>
           </w:pPr>
-          <w:hyperlink w:anchor="_Toc243168982" w:history="1">
+          <w:hyperlink w:anchor="_Toc243173261" w:history="1">
             <w:r>
               <w:rPr>
                 <w:rStyle w:val="Hyperlink"/>
@@ -2097,7 +2097,7 @@
               <w:rPr>
                 <w:noProof/>
               </w:rPr>
-              <w:instrText xml:space="preserve"> PAGEREF _Toc243168982 \h </w:instrText>
+              <w:instrText xml:space="preserve"> PAGEREF _Toc243173261 \h </w:instrText>
             </w:r>
             <w:r>
               <w:rPr>
@@ -2139,7 +2139,7 @@
               <w14:ligatures w14:val="standardContextual"/>
             </w:rPr>
           </w:pPr>
-          <w:hyperlink w:anchor="_Toc243168983" w:history="1">
+          <w:hyperlink w:anchor="_Toc243173262" w:history="1">
             <w:r>
               <w:rPr>
                 <w:rStyle w:val="Hyperlink"/>
@@ -2163,7 +2163,7 @@
               <w:rPr>
                 <w:noProof/>
               </w:rPr>
-              <w:instrText xml:space="preserve"> PAGEREF _Toc243168983 \h </w:instrText>
+              <w:instrText xml:space="preserve"> PAGEREF _Toc243173262 \h </w:instrText>
             </w:r>
             <w:r>
               <w:rPr>
@@ -2205,7 +2205,7 @@
               <w14:ligatures w14:val="standardContextual"/>
             </w:rPr>
           </w:pPr>
-          <w:hyperlink w:anchor="_Toc243168984" w:history="1">
+          <w:hyperlink w:anchor="_Toc243173263" w:history="1">
             <w:r>
               <w:rPr>
                 <w:rStyle w:val="Hyperlink"/>
@@ -2229,7 +2229,7 @@
               <w:rPr>
                 <w:noProof/>
               </w:rPr>
-              <w:instrText xml:space="preserve"> PAGEREF _Toc243168984 \h </w:instrText>
+              <w:instrText xml:space="preserve"> PAGEREF _Toc243173263 \h </w:instrText>
             </w:r>
             <w:r>
               <w:rPr>
@@ -2271,7 +2271,7 @@
               <w14:ligatures w14:val="standardContextual"/>
             </w:rPr>
           </w:pPr>
-          <w:hyperlink w:anchor="_Toc243168985" w:history="1">
+          <w:hyperlink w:anchor="_Toc243173264" w:history="1">
             <w:r>
               <w:rPr>
                 <w:rStyle w:val="Hyperlink"/>
@@ -2295,7 +2295,7 @@
               <w:rPr>
                 <w:noProof/>
               </w:rPr>
-              <w:instrText xml:space="preserve"> PAGEREF _Toc243168985 \h </w:instrText>
+              <w:instrText xml:space="preserve"> PAGEREF _Toc243173264 \h </w:instrText>
             </w:r>
             <w:r>
               <w:rPr>
@@ -2337,7 +2337,7 @@
               <w14:ligatures w14:val="standardContextual"/>
             </w:rPr>
           </w:pPr>
-          <w:hyperlink w:anchor="_Toc243168986" w:history="1">
+          <w:hyperlink w:anchor="_Toc243173265" w:history="1">
             <w:r>
               <w:rPr>
                 <w:rStyle w:val="Hyperlink"/>
@@ -2361,7 +2361,7 @@
               <w:rPr>
                 <w:noProof/>
               </w:rPr>
-              <w:instrText xml:space="preserve"> PAGEREF _Toc243168986 \h </w:instrText>
+              <w:instrText xml:space="preserve"> PAGEREF _Toc243173265 \h </w:instrText>
             </w:r>
             <w:r>
               <w:rPr>
@@ -2403,7 +2403,7 @@
               <w14:ligatures w14:val="standardContextual"/>
             </w:rPr>
           </w:pPr>
-          <w:hyperlink w:anchor="_Toc243168987" w:history="1">
+          <w:hyperlink w:anchor="_Toc243173266" w:history="1">
             <w:r>
               <w:rPr>
                 <w:rStyle w:val="Hyperlink"/>
@@ -2427,7 +2427,7 @@
               <w:rPr>
                 <w:noProof/>
               </w:rPr>
-              <w:instrText xml:space="preserve"> PAGEREF _Toc243168987 \h </w:instrText>
+              <w:instrText xml:space="preserve"> PAGEREF _Toc243173266 \h </w:instrText>
             </w:r>
             <w:r>
               <w:rPr>
@@ -2469,7 +2469,7 @@
               <w14:ligatures w14:val="standardContextual"/>
             </w:rPr>
           </w:pPr>
-          <w:hyperlink w:anchor="_Toc243168988" w:history="1">
+          <w:hyperlink w:anchor="_Toc243173267" w:history="1">
             <w:r>
               <w:rPr>
                 <w:rStyle w:val="Hyperlink"/>
@@ -2493,7 +2493,7 @@
               <w:rPr>
                 <w:noProof/>
               </w:rPr>
-              <w:instrText xml:space="preserve"> PAGEREF _Toc243168988 \h </w:instrText>
+              <w:instrText xml:space="preserve"> PAGEREF _Toc243173267 \h </w:instrText>
             </w:r>
             <w:r>
               <w:rPr>
@@ -2535,7 +2535,7 @@
               <w14:ligatures w14:val="standardContextual"/>
             </w:rPr>
           </w:pPr>
-          <w:hyperlink w:anchor="_Toc243168989" w:history="1">
+          <w:hyperlink w:anchor="_Toc243173268" w:history="1">
             <w:r>
               <w:rPr>
                 <w:rStyle w:val="Hyperlink"/>
@@ -2559,7 +2559,7 @@
               <w:rPr>
                 <w:noProof/>
               </w:rPr>
-              <w:instrText xml:space="preserve"> PAGEREF _Toc243168989 \h </w:instrText>
+              <w:instrText xml:space="preserve"> PAGEREF _Toc243173268 \h </w:instrText>
             </w:r>
             <w:r>
               <w:rPr>
@@ -2601,7 +2601,7 @@
               <w14:ligatures w14:val="standardContextual"/>
             </w:rPr>
           </w:pPr>
-          <w:hyperlink w:anchor="_Toc243168990" w:history="1">
+          <w:hyperlink w:anchor="_Toc243173269" w:history="1">
             <w:r>
               <w:rPr>
                 <w:rStyle w:val="Hyperlink"/>
@@ -2625,7 +2625,7 @@
               <w:rPr>
                 <w:noProof/>
               </w:rPr>
-              <w:instrText xml:space="preserve"> PAGEREF _Toc243168990 \h </w:instrText>
+              <w:instrText xml:space="preserve"> PAGEREF _Toc243173269 \h </w:instrText>
             </w:r>
             <w:r>
               <w:rPr>
@@ -2667,7 +2667,7 @@
               <w14:ligatures w14:val="standardContextual"/>
             </w:rPr>
           </w:pPr>
-          <w:hyperlink w:anchor="_Toc243168991" w:history="1">
+          <w:hyperlink w:anchor="_Toc243173270" w:history="1">
             <w:r>
               <w:rPr>
                 <w:rStyle w:val="Hyperlink"/>
@@ -2691,7 +2691,7 @@
               <w:rPr>
                 <w:noProof/>
               </w:rPr>
-              <w:instrText xml:space="preserve"> PAGEREF _Toc243168991 \h </w:instrText>
+              <w:instrText xml:space="preserve"> PAGEREF _Toc243173270 \h </w:instrText>
             </w:r>
             <w:r>
               <w:rPr>
@@ -2733,7 +2733,7 @@
               <w14:ligatures w14:val="standardContextual"/>
             </w:rPr>
           </w:pPr>
-          <w:hyperlink w:anchor="_Toc243168992" w:history="1">
+          <w:hyperlink w:anchor="_Toc243173271" w:history="1">
             <w:r>
               <w:rPr>
                 <w:rStyle w:val="Hyperlink"/>
@@ -2757,7 +2757,7 @@
               <w:rPr>
                 <w:noProof/>
               </w:rPr>
-              <w:instrText xml:space="preserve"> PAGEREF _Toc243168992 \h </w:instrText>
+              <w:instrText xml:space="preserve"> PAGEREF _Toc243173271 \h </w:instrText>
             </w:r>
             <w:r>
               <w:rPr>
@@ -2799,7 +2799,7 @@
               <w14:ligatures w14:val="standardContextual"/>
             </w:rPr>
           </w:pPr>
-          <w:hyperlink w:anchor="_Toc243168993" w:history="1">
+          <w:hyperlink w:anchor="_Toc243173272" w:history="1">
             <w:r>
               <w:rPr>
                 <w:rStyle w:val="Hyperlink"/>
@@ -2823,7 +2823,7 @@
               <w:rPr>
                 <w:noProof/>
               </w:rPr>
-              <w:instrText xml:space="preserve"> PAGEREF _Toc243168993 \h </w:instrText>
+              <w:instrText xml:space="preserve"> PAGEREF _Toc243173272 \h </w:instrText>
             </w:r>
             <w:r>
               <w:rPr>
@@ -2865,7 +2865,7 @@
               <w14:ligatures w14:val="standardContextual"/>
             </w:rPr>
           </w:pPr>
-          <w:hyperlink w:anchor="_Toc243168994" w:history="1">
+          <w:hyperlink w:anchor="_Toc243173273" w:history="1">
             <w:r>
               <w:rPr>
                 <w:rStyle w:val="Hyperlink"/>
@@ -2889,7 +2889,7 @@
               <w:rPr>
                 <w:noProof/>
               </w:rPr>
-              <w:instrText xml:space="preserve"> PAGEREF _Toc243168994 \h </w:instrText>
+              <w:instrText xml:space="preserve"> PAGEREF _Toc243173273 \h </w:instrText>
             </w:r>
             <w:r>
               <w:rPr>
@@ -2931,7 +2931,7 @@
               <w14:ligatures w14:val="standardContextual"/>
             </w:rPr>
           </w:pPr>
-          <w:hyperlink w:anchor="_Toc243168995" w:history="1">
+          <w:hyperlink w:anchor="_Toc243173274" w:history="1">
             <w:r>
               <w:rPr>
                 <w:rStyle w:val="Hyperlink"/>
@@ -2955,7 +2955,7 @@
               <w:rPr>
                 <w:noProof/>
               </w:rPr>
-              <w:instrText xml:space="preserve"> PAGEREF _Toc243168995 \h </w:instrText>
+              <w:instrText xml:space="preserve"> PAGEREF _Toc243173274 \h </w:instrText>
             </w:r>
             <w:r>
               <w:rPr>
@@ -2997,7 +2997,7 @@
               <w14:ligatures w14:val="standardContextual"/>
             </w:rPr>
           </w:pPr>
-          <w:hyperlink w:anchor="_Toc243168996" w:history="1">
+          <w:hyperlink w:anchor="_Toc243173275" w:history="1">
             <w:r>
               <w:rPr>
                 <w:rStyle w:val="Hyperlink"/>
@@ -3021,7 +3021,7 @@
               <w:rPr>
                 <w:noProof/>
               </w:rPr>
-              <w:instrText xml:space="preserve"> PAGEREF _Toc243168996 \h </w:instrText>
+              <w:instrText xml:space="preserve"> PAGEREF _Toc243173275 \h </w:instrText>
             </w:r>
             <w:r>
               <w:rPr>
@@ -3063,7 +3063,7 @@
               <w14:ligatures w14:val="standardContextual"/>
             </w:rPr>
           </w:pPr>
-          <w:hyperlink w:anchor="_Toc243168997" w:history="1">
+          <w:hyperlink w:anchor="_Toc243173276" w:history="1">
             <w:r>
               <w:rPr>
                 <w:rStyle w:val="Hyperlink"/>
@@ -3087,7 +3087,7 @@
               <w:rPr>
                 <w:noProof/>
               </w:rPr>
-              <w:instrText xml:space="preserve"> PAGEREF _Toc243168997 \h </w:instrText>
+              <w:instrText xml:space="preserve"> PAGEREF _Toc243173276 \h </w:instrText>
             </w:r>
             <w:r>
               <w:rPr>
@@ -3129,7 +3129,7 @@
               <w14:ligatures w14:val="standardContextual"/>
             </w:rPr>
           </w:pPr>
-          <w:hyperlink w:anchor="_Toc243168998" w:history="1">
+          <w:hyperlink w:anchor="_Toc243173277" w:history="1">
             <w:r>
               <w:rPr>
                 <w:rStyle w:val="Hyperlink"/>
@@ -3153,7 +3153,7 @@
               <w:rPr>
                 <w:noProof/>
               </w:rPr>
-              <w:instrText xml:space="preserve"> PAGEREF _Toc243168998 \h </w:instrText>
+              <w:instrText xml:space="preserve"> PAGEREF _Toc243173277 \h </w:instrText>
             </w:r>
             <w:r>
               <w:rPr>
@@ -3195,7 +3195,7 @@
               <w14:ligatures w14:val="standardContextual"/>
             </w:rPr>
           </w:pPr>
-          <w:hyperlink w:anchor="_Toc243168999" w:history="1">
+          <w:hyperlink w:anchor="_Toc243173278" w:history="1">
             <w:r>
               <w:rPr>
                 <w:rStyle w:val="Hyperlink"/>
@@ -3219,7 +3219,7 @@
               <w:rPr>
                 <w:noProof/>
               </w:rPr>
-              <w:instrText xml:space="preserve"> PAGEREF _Toc243168999 \h </w:instrText>
+              <w:instrText xml:space="preserve"> PAGEREF _Toc243173278 \h </w:instrText>
             </w:r>
             <w:r>
               <w:rPr>
@@ -3261,7 +3261,7 @@
               <w14:ligatures w14:val="standardContextual"/>
             </w:rPr>
           </w:pPr>
-          <w:hyperlink w:anchor="_Toc243169000" w:history="1">
+          <w:hyperlink w:anchor="_Toc243173279" w:history="1">
             <w:r>
               <w:rPr>
                 <w:rStyle w:val="Hyperlink"/>
@@ -3285,7 +3285,7 @@
               <w:rPr>
                 <w:noProof/>
               </w:rPr>
-              <w:instrText xml:space="preserve"> PAGEREF _Toc243169000 \h </w:instrText>
+              <w:instrText xml:space="preserve"> PAGEREF _Toc243173279 \h </w:instrText>
             </w:r>
             <w:r>
               <w:rPr>
@@ -3327,7 +3327,7 @@
               <w14:ligatures w14:val="standardContextual"/>
             </w:rPr>
           </w:pPr>
-          <w:hyperlink w:anchor="_Toc243169001" w:history="1">
+          <w:hyperlink w:anchor="_Toc243173280" w:history="1">
             <w:r>
               <w:rPr>
                 <w:rStyle w:val="Hyperlink"/>
@@ -3351,7 +3351,7 @@
               <w:rPr>
                 <w:noProof/>
               </w:rPr>
-              <w:instrText xml:space="preserve"> PAGEREF _Toc243169001 \h </w:instrText>
+              <w:instrText xml:space="preserve"> PAGEREF _Toc243173280 \h </w:instrText>
             </w:r>
             <w:r>
               <w:rPr>
@@ -3393,7 +3393,7 @@
               <w14:ligatures w14:val="standardContextual"/>
             </w:rPr>
           </w:pPr>
-          <w:hyperlink w:anchor="_Toc243169002" w:history="1">
+          <w:hyperlink w:anchor="_Toc243173281" w:history="1">
             <w:r>
               <w:rPr>
                 <w:rStyle w:val="Hyperlink"/>
@@ -3417,7 +3417,7 @@
               <w:rPr>
                 <w:noProof/>
               </w:rPr>
-              <w:instrText xml:space="preserve"> PAGEREF _Toc243169002 \h </w:instrText>
+              <w:instrText xml:space="preserve"> PAGEREF _Toc243173281 \h </w:instrText>
             </w:r>
             <w:r>
               <w:rPr>
@@ -3459,7 +3459,7 @@
               <w14:ligatures w14:val="standardContextual"/>
             </w:rPr>
           </w:pPr>
-          <w:hyperlink w:anchor="_Toc243169003" w:history="1">
+          <w:hyperlink w:anchor="_Toc243173282" w:history="1">
             <w:r>
               <w:rPr>
                 <w:rStyle w:val="Hyperlink"/>
@@ -3483,7 +3483,7 @@
               <w:rPr>
                 <w:noProof/>
               </w:rPr>
-              <w:instrText xml:space="preserve"> PAGEREF _Toc243169003 \h </w:instrText>
+              <w:instrText xml:space="preserve"> PAGEREF _Toc243173282 \h </w:instrText>
             </w:r>
             <w:r>
               <w:rPr>
@@ -3525,7 +3525,7 @@
               <w14:ligatures w14:val="standardContextual"/>
             </w:rPr>
           </w:pPr>
-          <w:hyperlink w:anchor="_Toc243169004" w:history="1">
+          <w:hyperlink w:anchor="_Toc243173283" w:history="1">
             <w:r>
               <w:rPr>
                 <w:rStyle w:val="Hyperlink"/>
@@ -3549,7 +3549,7 @@
               <w:rPr>
                 <w:noProof/>
               </w:rPr>
-              <w:instrText xml:space="preserve"> PAGEREF _Toc243169004 \h </w:instrText>
+              <w:instrText xml:space="preserve"> PAGEREF _Toc243173283 \h </w:instrText>
             </w:r>
             <w:r>
               <w:rPr>
@@ -3591,7 +3591,7 @@
               <w14:ligatures w14:val="standardContextual"/>
             </w:rPr>
           </w:pPr>
-          <w:hyperlink w:anchor="_Toc243169005" w:history="1">
+          <w:hyperlink w:anchor="_Toc243173284" w:history="1">
             <w:r>
               <w:rPr>
                 <w:rStyle w:val="Hyperlink"/>
@@ -3615,7 +3615,7 @@
               <w:rPr>
                 <w:noProof/>
               </w:rPr>
-              <w:instrText xml:space="preserve"> PAGEREF _Toc243169005 \h </w:instrText>
+              <w:instrText xml:space="preserve"> PAGEREF _Toc243173284 \h </w:instrText>
             </w:r>
             <w:r>
               <w:rPr>
@@ -3657,7 +3657,7 @@
               <w14:ligatures w14:val="standardContextual"/>
             </w:rPr>
           </w:pPr>
-          <w:hyperlink w:anchor="_Toc243169006" w:history="1">
+          <w:hyperlink w:anchor="_Toc243173285" w:history="1">
             <w:r>
               <w:rPr>
                 <w:rStyle w:val="Hyperlink"/>
@@ -3681,7 +3681,7 @@
               <w:rPr>
                 <w:noProof/>
               </w:rPr>
-              <w:instrText xml:space="preserve"> PAGEREF _Toc243169006 \h </w:instrText>
+              <w:instrText xml:space="preserve"> PAGEREF _Toc243173285 \h </w:instrText>
             </w:r>
             <w:r>
               <w:rPr>
@@ -3723,7 +3723,7 @@
               <w14:ligatures w14:val="standardContextual"/>
             </w:rPr>
           </w:pPr>
-          <w:hyperlink w:anchor="_Toc243169007" w:history="1">
+          <w:hyperlink w:anchor="_Toc243173286" w:history="1">
             <w:r>
               <w:rPr>
                 <w:rStyle w:val="Hyperlink"/>
@@ -3747,7 +3747,7 @@
               <w:rPr>
                 <w:noProof/>
               </w:rPr>
-              <w:instrText xml:space="preserve"> PAGEREF _Toc243169007 \h </w:instrText>
+              <w:instrText xml:space="preserve"> PAGEREF _Toc243173286 \h </w:instrText>
             </w:r>
             <w:r>
               <w:rPr>
@@ -3789,7 +3789,7 @@
               <w14:ligatures w14:val="standardContextual"/>
             </w:rPr>
           </w:pPr>
-          <w:hyperlink w:anchor="_Toc243169008" w:history="1">
+          <w:hyperlink w:anchor="_Toc243173287" w:history="1">
             <w:r>
               <w:rPr>
                 <w:rStyle w:val="Hyperlink"/>
@@ -3813,7 +3813,7 @@
               <w:rPr>
                 <w:noProof/>
               </w:rPr>
-              <w:instrText xml:space="preserve"> PAGEREF _Toc243169008 \h </w:instrText>
+              <w:instrText xml:space="preserve"> PAGEREF _Toc243173287 \h </w:instrText>
             </w:r>
             <w:r>
               <w:rPr>
@@ -3855,7 +3855,7 @@
               <w14:ligatures w14:val="standardContextual"/>
             </w:rPr>
           </w:pPr>
-          <w:hyperlink w:anchor="_Toc243169009" w:history="1">
+          <w:hyperlink w:anchor="_Toc243173288" w:history="1">
             <w:r>
               <w:rPr>
                 <w:rStyle w:val="Hyperlink"/>
@@ -3879,7 +3879,7 @@
               <w:rPr>
                 <w:noProof/>
               </w:rPr>
-              <w:instrText xml:space="preserve"> PAGEREF _Toc243169009 \h </w:instrText>
+              <w:instrText xml:space="preserve"> PAGEREF _Toc243173288 \h </w:instrText>
             </w:r>
             <w:r>
               <w:rPr>
@@ -3921,7 +3921,7 @@
               <w14:ligatures w14:val="standardContextual"/>
             </w:rPr>
           </w:pPr>
-          <w:hyperlink w:anchor="_Toc243169010" w:history="1">
+          <w:hyperlink w:anchor="_Toc243173289" w:history="1">
             <w:r>
               <w:rPr>
                 <w:rStyle w:val="Hyperlink"/>
@@ -3945,7 +3945,7 @@
               <w:rPr>
                 <w:noProof/>
               </w:rPr>
-              <w:instrText xml:space="preserve"> PAGEREF _Toc243169010 \h </w:instrText>
+              <w:instrText xml:space="preserve"> PAGEREF _Toc243173289 \h </w:instrText>
             </w:r>
             <w:r>
               <w:rPr>
@@ -3987,7 +3987,7 @@
               <w14:ligatures w14:val="standardContextual"/>
             </w:rPr>
           </w:pPr>
-          <w:hyperlink w:anchor="_Toc243169011" w:history="1">
+          <w:hyperlink w:anchor="_Toc243173290" w:history="1">
             <w:r>
               <w:rPr>
                 <w:rStyle w:val="Hyperlink"/>
@@ -4011,7 +4011,7 @@
               <w:rPr>
                 <w:noProof/>
               </w:rPr>
-              <w:instrText xml:space="preserve"> PAGEREF _Toc243169011 \h </w:instrText>
+              <w:instrText xml:space="preserve"> PAGEREF _Toc243173290 \h </w:instrText>
             </w:r>
             <w:r>
               <w:rPr>
@@ -4053,7 +4053,7 @@
               <w14:ligatures w14:val="standardContextual"/>
             </w:rPr>
           </w:pPr>
-          <w:hyperlink w:anchor="_Toc243169012" w:history="1">
+          <w:hyperlink w:anchor="_Toc243173291" w:history="1">
             <w:r>
               <w:rPr>
                 <w:rStyle w:val="Hyperlink"/>
@@ -4077,7 +4077,7 @@
               <w:rPr>
                 <w:noProof/>
               </w:rPr>
-              <w:instrText xml:space="preserve"> PAGEREF _Toc243169012 \h </w:instrText>
+              <w:instrText xml:space="preserve"> PAGEREF _Toc243173291 \h </w:instrText>
             </w:r>
             <w:r>
               <w:rPr>
@@ -4119,7 +4119,7 @@
               <w14:ligatures w14:val="standardContextual"/>
             </w:rPr>
           </w:pPr>
-          <w:hyperlink w:anchor="_Toc243169013" w:history="1">
+          <w:hyperlink w:anchor="_Toc243173292" w:history="1">
             <w:r>
               <w:rPr>
                 <w:rStyle w:val="Hyperlink"/>
@@ -4143,7 +4143,7 @@
               <w:rPr>
                 <w:noProof/>
               </w:rPr>
-              <w:instrText xml:space="preserve"> PAGEREF _Toc243169013 \h </w:instrText>
+              <w:instrText xml:space="preserve"> PAGEREF _Toc243173292 \h </w:instrText>
             </w:r>
             <w:r>
               <w:rPr>
@@ -4185,7 +4185,7 @@
               <w14:ligatures w14:val="standardContextual"/>
             </w:rPr>
           </w:pPr>
-          <w:hyperlink w:anchor="_Toc243169014" w:history="1">
+          <w:hyperlink w:anchor="_Toc243173293" w:history="1">
             <w:r>
               <w:rPr>
                 <w:rStyle w:val="Hyperlink"/>
@@ -4209,7 +4209,7 @@
               <w:rPr>
                 <w:noProof/>
               </w:rPr>
-              <w:instrText xml:space="preserve"> PAGEREF _Toc243169014 \h </w:instrText>
+              <w:instrText xml:space="preserve"> PAGEREF _Toc243173293 \h </w:instrText>
             </w:r>
             <w:r>
               <w:rPr>
@@ -4251,7 +4251,7 @@
               <w14:ligatures w14:val="standardContextual"/>
             </w:rPr>
           </w:pPr>
-          <w:hyperlink w:anchor="_Toc243169015" w:history="1">
+          <w:hyperlink w:anchor="_Toc243173294" w:history="1">
             <w:r>
               <w:rPr>
                 <w:rStyle w:val="Hyperlink"/>
@@ -4275,7 +4275,7 @@
               <w:rPr>
                 <w:noProof/>
               </w:rPr>
-              <w:instrText xml:space="preserve"> PAGEREF _Toc243169015 \h </w:instrText>
+              <w:instrText xml:space="preserve"> PAGEREF _Toc243173294 \h </w:instrText>
             </w:r>
             <w:r>
               <w:rPr>
@@ -4317,7 +4317,7 @@
               <w14:ligatures w14:val="standardContextual"/>
             </w:rPr>
           </w:pPr>
-          <w:hyperlink w:anchor="_Toc243169016" w:history="1">
+          <w:hyperlink w:anchor="_Toc243173295" w:history="1">
             <w:r>
               <w:rPr>
                 <w:rStyle w:val="Hyperlink"/>
@@ -4341,7 +4341,7 @@
               <w:rPr>
                 <w:noProof/>
               </w:rPr>
-              <w:instrText xml:space="preserve"> PAGEREF _Toc243169016 \h </w:instrText>
+              <w:instrText xml:space="preserve"> PAGEREF _Toc243173295 \h </w:instrText>
             </w:r>
             <w:r>
               <w:rPr>
@@ -4383,7 +4383,7 @@
               <w14:ligatures w14:val="standardContextual"/>
             </w:rPr>
           </w:pPr>
-          <w:hyperlink w:anchor="_Toc243169017" w:history="1">
+          <w:hyperlink w:anchor="_Toc243173296" w:history="1">
             <w:r>
               <w:rPr>
                 <w:rStyle w:val="Hyperlink"/>
@@ -4407,7 +4407,7 @@
               <w:rPr>
                 <w:noProof/>
               </w:rPr>
-              <w:instrText xml:space="preserve"> PAGEREF _Toc243169017 \h </w:instrText>
+              <w:instrText xml:space="preserve"> PAGEREF _Toc243173296 \h </w:instrText>
             </w:r>
             <w:r>
               <w:rPr>
@@ -4449,7 +4449,7 @@
               <w14:ligatures w14:val="standardContextual"/>
             </w:rPr>
           </w:pPr>
-          <w:hyperlink w:anchor="_Toc243169018" w:history="1">
+          <w:hyperlink w:anchor="_Toc243173297" w:history="1">
             <w:r>
               <w:rPr>
                 <w:rStyle w:val="Hyperlink"/>
@@ -4473,7 +4473,7 @@
               <w:rPr>
                 <w:noProof/>
               </w:rPr>
-              <w:instrText xml:space="preserve"> PAGEREF _Toc243169018 \h </w:instrText>
+              <w:instrText xml:space="preserve"> PAGEREF _Toc243173297 \h </w:instrText>
             </w:r>
             <w:r>
               <w:rPr>
@@ -4515,7 +4515,7 @@
               <w14:ligatures w14:val="standardContextual"/>
             </w:rPr>
           </w:pPr>
-          <w:hyperlink w:anchor="_Toc243169019" w:history="1">
+          <w:hyperlink w:anchor="_Toc243173298" w:history="1">
             <w:r>
               <w:rPr>
                 <w:rStyle w:val="Hyperlink"/>
@@ -4539,7 +4539,7 @@
               <w:rPr>
                 <w:noProof/>
               </w:rPr>
-              <w:instrText xml:space="preserve"> PAGEREF _Toc243169019 \h </w:instrText>
+              <w:instrText xml:space="preserve"> PAGEREF _Toc243173298 \h </w:instrText>
             </w:r>
             <w:r>
               <w:rPr>
@@ -4581,7 +4581,7 @@
               <w14:ligatures w14:val="standardContextual"/>
             </w:rPr>
           </w:pPr>
-          <w:hyperlink w:anchor="_Toc243169020" w:history="1">
+          <w:hyperlink w:anchor="_Toc243173299" w:history="1">
             <w:r>
               <w:rPr>
                 <w:rStyle w:val="Hyperlink"/>
@@ -4605,7 +4605,7 @@
               <w:rPr>
                 <w:noProof/>
               </w:rPr>
-              <w:instrText xml:space="preserve"> PAGEREF _Toc243169020 \h </w:instrText>
+              <w:instrText xml:space="preserve"> PAGEREF _Toc243173299 \h </w:instrText>
             </w:r>
             <w:r>
               <w:rPr>
@@ -4647,7 +4647,7 @@
               <w14:ligatures w14:val="standardContextual"/>
             </w:rPr>
           </w:pPr>
-          <w:hyperlink w:anchor="_Toc243169021" w:history="1">
+          <w:hyperlink w:anchor="_Toc243173300" w:history="1">
             <w:r>
               <w:rPr>
                 <w:rStyle w:val="Hyperlink"/>
@@ -4671,7 +4671,7 @@
               <w:rPr>
                 <w:noProof/>
               </w:rPr>
-              <w:instrText xml:space="preserve"> PAGEREF _Toc243169021 \h </w:instrText>
+              <w:instrText xml:space="preserve"> PAGEREF _Toc243173300 \h </w:instrText>
             </w:r>
             <w:r>
               <w:rPr>
@@ -4713,7 +4713,7 @@
               <w14:ligatures w14:val="standardContextual"/>
             </w:rPr>
           </w:pPr>
-          <w:hyperlink w:anchor="_Toc243169022" w:history="1">
+          <w:hyperlink w:anchor="_Toc243173301" w:history="1">
             <w:r>
               <w:rPr>
                 <w:rStyle w:val="Hyperlink"/>
@@ -4737,7 +4737,7 @@
               <w:rPr>
                 <w:noProof/>
               </w:rPr>
-              <w:instrText xml:space="preserve"> PAGEREF _Toc243169022 \h </w:instrText>
+              <w:instrText xml:space="preserve"> PAGEREF _Toc243173301 \h </w:instrText>
             </w:r>
             <w:r>
               <w:rPr>
@@ -4779,7 +4779,7 @@
               <w14:ligatures w14:val="standardContextual"/>
             </w:rPr>
           </w:pPr>
-          <w:hyperlink w:anchor="_Toc243169023" w:history="1">
+          <w:hyperlink w:anchor="_Toc243173302" w:history="1">
             <w:r>
               <w:rPr>
                 <w:rStyle w:val="Hyperlink"/>
@@ -4803,7 +4803,7 @@
               <w:rPr>
                 <w:noProof/>
               </w:rPr>
-              <w:instrText xml:space="preserve"> PAGEREF _Toc243169023 \h </w:instrText>
+              <w:instrText xml:space="preserve"> PAGEREF _Toc243173302 \h </w:instrText>
             </w:r>
             <w:r>
               <w:rPr>
@@ -4845,7 +4845,7 @@
               <w14:ligatures w14:val="standardContextual"/>
             </w:rPr>
           </w:pPr>
-          <w:hyperlink w:anchor="_Toc243169024" w:history="1">
+          <w:hyperlink w:anchor="_Toc243173303" w:history="1">
             <w:r>
               <w:rPr>
                 <w:rStyle w:val="Hyperlink"/>
@@ -4869,7 +4869,7 @@
               <w:rPr>
                 <w:noProof/>
               </w:rPr>
-              <w:instrText xml:space="preserve"> PAGEREF _Toc243169024 \h </w:instrText>
+              <w:instrText xml:space="preserve"> PAGEREF _Toc243173303 \h </w:instrText>
             </w:r>
             <w:r>
               <w:rPr>
@@ -4886,7 +4886,7 @@
               <w:rPr>
                 <w:noProof/>
               </w:rPr>
-              <w:t>59</w:t>
+              <w:t>60</w:t>
             </w:r>
             <w:r>
               <w:rPr>
@@ -4920,7 +4920,7 @@
         <w:pStyle w:val="Heading1"/>
         <w:pageBreakBefore/>
       </w:pPr>
-      <w:bookmarkStart w:id="0" w:name="_Toc243168953"/>
+      <w:bookmarkStart w:id="0" w:name="_Toc243173232"/>
       <w:r>
         <w:lastRenderedPageBreak/>
         <w:t>1. Resumen ejecutivo</w:t>
@@ -4974,7 +4974,7 @@
         <w:pStyle w:val="Heading1"/>
         <w:pageBreakBefore/>
       </w:pPr>
-      <w:bookmarkStart w:id="1" w:name="_Toc243168954"/>
+      <w:bookmarkStart w:id="1" w:name="_Toc243173233"/>
       <w:r>
         <w:lastRenderedPageBreak/>
         <w:t>2. Conceptos y glosario</w:t>
@@ -6409,7 +6409,7 @@
         <w:pStyle w:val="Heading1"/>
         <w:pageBreakBefore/>
       </w:pPr>
-      <w:bookmarkStart w:id="2" w:name="_Toc243168955"/>
+      <w:bookmarkStart w:id="2" w:name="_Toc243173234"/>
       <w:r>
         <w:lastRenderedPageBreak/>
         <w:t>3. Arquitectura general</w:t>
@@ -6420,7 +6420,7 @@
       <w:pPr>
         <w:pStyle w:val="Heading2"/>
       </w:pPr>
-      <w:bookmarkStart w:id="3" w:name="_Toc243168956"/>
+      <w:bookmarkStart w:id="3" w:name="_Toc243173235"/>
       <w:r>
         <w:t>3.1 Piezas del sistema</w:t>
       </w:r>
@@ -7046,7 +7046,7 @@
       <w:pPr>
         <w:pStyle w:val="Heading2"/>
       </w:pPr>
-      <w:bookmarkStart w:id="4" w:name="_Toc243168957"/>
+      <w:bookmarkStart w:id="4" w:name="_Toc243173236"/>
       <w:r>
         <w:t>3.2 Flujo de datos</w:t>
       </w:r>
@@ -7341,7 +7341,7 @@
         <w:pStyle w:val="Heading1"/>
         <w:pageBreakBefore/>
       </w:pPr>
-      <w:bookmarkStart w:id="5" w:name="_Toc243168958"/>
+      <w:bookmarkStart w:id="5" w:name="_Toc243173237"/>
       <w:r>
         <w:lastRenderedPageBreak/>
         <w:t>4. Servicios externos</w:t>
@@ -7352,7 +7352,7 @@
       <w:pPr>
         <w:pStyle w:val="Heading2"/>
       </w:pPr>
-      <w:bookmarkStart w:id="6" w:name="_Toc243168959"/>
+      <w:bookmarkStart w:id="6" w:name="_Toc243173238"/>
       <w:r>
         <w:t>4.1 TikTok LIVE</w:t>
       </w:r>
@@ -8111,7 +8111,7 @@
       <w:pPr>
         <w:pStyle w:val="Heading2"/>
       </w:pPr>
-      <w:bookmarkStart w:id="7" w:name="_Toc243168960"/>
+      <w:bookmarkStart w:id="7" w:name="_Toc243173239"/>
       <w:r>
         <w:t>4.2 Euler Stream</w:t>
       </w:r>
@@ -9403,7 +9403,7 @@
       <w:pPr>
         <w:pStyle w:val="Heading2"/>
       </w:pPr>
-      <w:bookmarkStart w:id="8" w:name="_Toc243168961"/>
+      <w:bookmarkStart w:id="8" w:name="_Toc243173240"/>
       <w:r>
         <w:t>4.3 GitHub, GitHub Actions y GitHub Pages</w:t>
       </w:r>
@@ -9607,7 +9607,7 @@
       <w:pPr>
         <w:pStyle w:val="Heading2"/>
       </w:pPr>
-      <w:bookmarkStart w:id="9" w:name="_Toc243168962"/>
+      <w:bookmarkStart w:id="9" w:name="_Toc243173241"/>
       <w:r>
         <w:t>4.4 Google Fonts</w:t>
       </w:r>
@@ -9637,7 +9637,7 @@
       <w:pPr>
         <w:pStyle w:val="Heading2"/>
       </w:pPr>
-      <w:bookmarkStart w:id="10" w:name="_Toc243168963"/>
+      <w:bookmarkStart w:id="10" w:name="_Toc243173242"/>
       <w:r>
         <w:lastRenderedPageBreak/>
         <w:t>4.5 Supabase (cambios en vivo)</w:t>
@@ -9893,7 +9893,7 @@
         <w:pStyle w:val="Heading1"/>
         <w:pageBreakBefore/>
       </w:pPr>
-      <w:bookmarkStart w:id="11" w:name="_Toc243168964"/>
+      <w:bookmarkStart w:id="11" w:name="_Toc243173243"/>
       <w:r>
         <w:lastRenderedPageBreak/>
         <w:t>5. Estructura de archivos</w:t>
@@ -10563,7 +10563,7 @@
         <w:pStyle w:val="Heading1"/>
         <w:pageBreakBefore/>
       </w:pPr>
-      <w:bookmarkStart w:id="12" w:name="_Toc243168965"/>
+      <w:bookmarkStart w:id="12" w:name="_Toc243173244"/>
       <w:r>
         <w:lastRenderedPageBreak/>
         <w:t>6. Frontend: el módulo compartido comun.js</w:t>
@@ -10591,7 +10591,7 @@
       <w:pPr>
         <w:pStyle w:val="Heading2"/>
       </w:pPr>
-      <w:bookmarkStart w:id="13" w:name="_Toc243168966"/>
+      <w:bookmarkStart w:id="13" w:name="_Toc243173245"/>
       <w:r>
         <w:t>6.1 Configuración en la URL</w:t>
       </w:r>
@@ -11062,7 +11062,7 @@
       <w:pPr>
         <w:pStyle w:val="Heading2"/>
       </w:pPr>
-      <w:bookmarkStart w:id="14" w:name="_Toc243168967"/>
+      <w:bookmarkStart w:id="14" w:name="_Toc243173246"/>
       <w:r>
         <w:t>6.2 Eventos normalizados</w:t>
       </w:r>
@@ -11935,7 +11935,7 @@
       <w:pPr>
         <w:pStyle w:val="Heading2"/>
       </w:pPr>
-      <w:bookmarkStart w:id="15" w:name="_Toc243168968"/>
+      <w:bookmarkStart w:id="15" w:name="_Toc243173247"/>
       <w:r>
         <w:t>6.3 Rastreador de regalos (combos y regalos sueltos)</w:t>
       </w:r>
@@ -12666,7 +12666,7 @@
       <w:pPr>
         <w:pStyle w:val="Heading2"/>
       </w:pPr>
-      <w:bookmarkStart w:id="16" w:name="_Toc243168969"/>
+      <w:bookmarkStart w:id="16" w:name="_Toc243173248"/>
       <w:r>
         <w:t>6.4 Conexión con TikTok (conectarTikTok)</w:t>
       </w:r>
@@ -12787,7 +12787,7 @@
       <w:pPr>
         <w:pStyle w:val="Heading2"/>
       </w:pPr>
-      <w:bookmarkStart w:id="17" w:name="_Toc243168970"/>
+      <w:bookmarkStart w:id="17" w:name="_Toc243173249"/>
       <w:r>
         <w:t>6.5 Arranque de widgets (iniciarWidget)</w:t>
       </w:r>
@@ -13038,7 +13038,7 @@
       <w:pPr>
         <w:pStyle w:val="Heading2"/>
       </w:pPr>
-      <w:bookmarkStart w:id="18" w:name="_Toc243168971"/>
+      <w:bookmarkStart w:id="18" w:name="_Toc243173250"/>
       <w:r>
         <w:t>6.6 Utilidades</w:t>
       </w:r>
@@ -13104,7 +13104,7 @@
       <w:pPr>
         <w:pStyle w:val="Heading2"/>
       </w:pPr>
-      <w:bookmarkStart w:id="19" w:name="_Toc243168972"/>
+      <w:bookmarkStart w:id="19" w:name="_Toc243173251"/>
       <w:r>
         <w:t>6.7 Cambios en vivo (nube.js)</w:t>
       </w:r>
@@ -13215,7 +13215,7 @@
         <w:pStyle w:val="Heading1"/>
         <w:pageBreakBefore/>
       </w:pPr>
-      <w:bookmarkStart w:id="20" w:name="_Toc243168973"/>
+      <w:bookmarkStart w:id="20" w:name="_Toc243173252"/>
       <w:r>
         <w:lastRenderedPageBreak/>
         <w:t>7. Frontend: los widgets</w:t>
@@ -13258,7 +13258,7 @@
       <w:pPr>
         <w:pStyle w:val="Heading2"/>
       </w:pPr>
-      <w:bookmarkStart w:id="21" w:name="_Toc243168974"/>
+      <w:bookmarkStart w:id="21" w:name="_Toc243173253"/>
       <w:r>
         <w:t>7.1 Ruleta de regalos (ruleta.html)</w:t>
       </w:r>
@@ -14573,7 +14573,7 @@
       <w:pPr>
         <w:pStyle w:val="Heading2"/>
       </w:pPr>
-      <w:bookmarkStart w:id="22" w:name="_Toc243168975"/>
+      <w:bookmarkStart w:id="22" w:name="_Toc243173254"/>
       <w:r>
         <w:t>7.2 Meta (meta.html)</w:t>
       </w:r>
@@ -15183,7 +15183,7 @@
       <w:pPr>
         <w:pStyle w:val="Heading2"/>
       </w:pPr>
-      <w:bookmarkStart w:id="23" w:name="_Toc243168976"/>
+      <w:bookmarkStart w:id="23" w:name="_Toc243173255"/>
       <w:r>
         <w:lastRenderedPageBreak/>
         <w:t>7.3 Alertas (alertas.html)</w:t>
@@ -15551,7 +15551,7 @@
       <w:pPr>
         <w:pStyle w:val="Heading2"/>
       </w:pPr>
-      <w:bookmarkStart w:id="24" w:name="_Toc243168977"/>
+      <w:bookmarkStart w:id="24" w:name="_Toc243173256"/>
       <w:r>
         <w:t>7.4 Carrera de regalos (carrera.html)</w:t>
       </w:r>
@@ -16918,7 +16918,7 @@
       <w:pPr>
         <w:pStyle w:val="Heading2"/>
       </w:pPr>
-      <w:bookmarkStart w:id="25" w:name="_Toc243168978"/>
+      <w:bookmarkStart w:id="25" w:name="_Toc243173257"/>
       <w:r>
         <w:t>7.5 Batalla de regalos (batalla.html)</w:t>
       </w:r>
@@ -17571,7 +17571,7 @@
       <w:pPr>
         <w:pStyle w:val="Heading2"/>
       </w:pPr>
-      <w:bookmarkStart w:id="26" w:name="_Toc243168979"/>
+      <w:bookmarkStart w:id="26" w:name="_Toc243173258"/>
       <w:r>
         <w:t>7.6 Jefe del LIVE (jefe.html)</w:t>
       </w:r>
@@ -18698,7 +18698,7 @@
       <w:pPr>
         <w:pStyle w:val="Heading2"/>
       </w:pPr>
-      <w:bookmarkStart w:id="27" w:name="_Toc243168980"/>
+      <w:bookmarkStart w:id="27" w:name="_Toc243173259"/>
       <w:r>
         <w:t>7.7 Subathon (subathon.html)</w:t>
       </w:r>
@@ -19846,7 +19846,7 @@
       <w:pPr>
         <w:pStyle w:val="Heading2"/>
       </w:pPr>
-      <w:bookmarkStart w:id="28" w:name="_Toc243168981"/>
+      <w:bookmarkStart w:id="28" w:name="_Toc243173260"/>
       <w:r>
         <w:t>7.8 Bóveda dorada (boveda.html)</w:t>
       </w:r>
@@ -20788,7 +20788,7 @@
       <w:pPr>
         <w:pStyle w:val="Heading2"/>
       </w:pPr>
-      <w:bookmarkStart w:id="29" w:name="_Toc243168982"/>
+      <w:bookmarkStart w:id="29" w:name="_Toc243173261"/>
       <w:r>
         <w:t>7.9 Trono (trono.html)</w:t>
       </w:r>
@@ -21683,7 +21683,7 @@
       <w:pPr>
         <w:pStyle w:val="Heading2"/>
       </w:pPr>
-      <w:bookmarkStart w:id="30" w:name="_Toc243168983"/>
+      <w:bookmarkStart w:id="30" w:name="_Toc243173262"/>
       <w:r>
         <w:lastRenderedPageBreak/>
         <w:t>7.10 Marcador (marcador.html)</w:t>
@@ -22471,7 +22471,7 @@
       <w:pPr>
         <w:pStyle w:val="Heading2"/>
       </w:pPr>
-      <w:bookmarkStart w:id="31" w:name="_Toc243168984"/>
+      <w:bookmarkStart w:id="31" w:name="_Toc243173263"/>
       <w:r>
         <w:lastRenderedPageBreak/>
         <w:t>7.11 Repertorio (repertorio.html)</w:t>
@@ -23424,7 +23424,7 @@
       <w:pPr>
         <w:pStyle w:val="Heading2"/>
       </w:pPr>
-      <w:bookmarkStart w:id="32" w:name="_Toc243168985"/>
+      <w:bookmarkStart w:id="32" w:name="_Toc243173264"/>
       <w:r>
         <w:lastRenderedPageBreak/>
         <w:t>7.12 Mensaje VIP destacado (destacado.html)</w:t>
@@ -24245,7 +24245,7 @@
       <w:pPr>
         <w:pStyle w:val="Heading2"/>
       </w:pPr>
-      <w:bookmarkStart w:id="33" w:name="_Toc243168986"/>
+      <w:bookmarkStart w:id="33" w:name="_Toc243173265"/>
       <w:r>
         <w:lastRenderedPageBreak/>
         <w:t>7.13 Tragamonedas (tragamonedas.html)</w:t>
@@ -25009,7 +25009,7 @@
         <w:pStyle w:val="Heading1"/>
         <w:pageBreakBefore/>
       </w:pPr>
-      <w:bookmarkStart w:id="34" w:name="_Toc243168987"/>
+      <w:bookmarkStart w:id="34" w:name="_Toc243173266"/>
       <w:r>
         <w:lastRenderedPageBreak/>
         <w:t>8. Frontend: el panel</w:t>
@@ -25020,7 +25020,7 @@
       <w:pPr>
         <w:pStyle w:val="Heading2"/>
       </w:pPr>
-      <w:bookmarkStart w:id="35" w:name="_Toc243168988"/>
+      <w:bookmarkStart w:id="35" w:name="_Toc243173267"/>
       <w:r>
         <w:t>8.1 Estructura de la página (index.html)</w:t>
       </w:r>
@@ -25513,7 +25513,7 @@
       <w:pPr>
         <w:pStyle w:val="Heading2"/>
       </w:pPr>
-      <w:bookmarkStart w:id="36" w:name="_Toc243168989"/>
+      <w:bookmarkStart w:id="36" w:name="_Toc243173268"/>
       <w:r>
         <w:t>8.2 Navegación y ciclo de vida (app.js)</w:t>
       </w:r>
@@ -25694,7 +25694,7 @@
       <w:pPr>
         <w:pStyle w:val="Heading2"/>
       </w:pPr>
-      <w:bookmarkStart w:id="37" w:name="_Toc243168990"/>
+      <w:bookmarkStart w:id="37" w:name="_Toc243173269"/>
       <w:r>
         <w:t>8.3 Mapa del panel (registro.js)</w:t>
       </w:r>
@@ -26542,7 +26542,7 @@
       <w:pPr>
         <w:pStyle w:val="Heading2"/>
       </w:pPr>
-      <w:bookmarkStart w:id="38" w:name="_Toc243168991"/>
+      <w:bookmarkStart w:id="38" w:name="_Toc243173270"/>
       <w:r>
         <w:t>8.4 Datos guardados (almacen.js)</w:t>
       </w:r>
@@ -27342,7 +27342,7 @@
       <w:pPr>
         <w:pStyle w:val="Heading2"/>
       </w:pPr>
-      <w:bookmarkStart w:id="39" w:name="_Toc243168992"/>
+      <w:bookmarkStart w:id="39" w:name="_Toc243173271"/>
       <w:r>
         <w:t>8.5 Conexión del panel al LIVE (envivo.js)</w:t>
       </w:r>
@@ -27415,7 +27415,7 @@
       <w:pPr>
         <w:pStyle w:val="Heading2"/>
       </w:pPr>
-      <w:bookmarkStart w:id="40" w:name="_Toc243168993"/>
+      <w:bookmarkStart w:id="40" w:name="_Toc243173272"/>
       <w:r>
         <w:t>8.6 Componentes de interfaz (ui.js)</w:t>
       </w:r>
@@ -27923,7 +27923,7 @@
       <w:pPr>
         <w:pStyle w:val="Heading2"/>
       </w:pPr>
-      <w:bookmarkStart w:id="41" w:name="_Toc243168994"/>
+      <w:bookmarkStart w:id="41" w:name="_Toc243173273"/>
       <w:r>
         <w:t>8.7 Las vistas</w:t>
       </w:r>
@@ -28287,7 +28287,7 @@
       <w:pPr>
         <w:pStyle w:val="Heading2"/>
       </w:pPr>
-      <w:bookmarkStart w:id="42" w:name="_Toc243168995"/>
+      <w:bookmarkStart w:id="42" w:name="_Toc243173274"/>
       <w:r>
         <w:t>8.8 Vista previa y pruebas</w:t>
       </w:r>
@@ -28357,9 +28357,30 @@
     </w:p>
     <w:p>
       <w:pPr>
+        <w:pBdr>
+          <w:left w:val="single" w:sz="18" w:space="8" w:color="E5304F"/>
+        </w:pBdr>
+        <w:shd w:val="clear" w:color="auto" w:fill="FDECEF"/>
+        <w:spacing w:before="120" w:after="160"/>
+        <w:ind w:left="200" w:right="200"/>
+      </w:pPr>
+      <w:r>
+        <w:rPr>
+          <w:b/>
+          <w:bCs/>
+          <w:color w:val="E5304F"/>
+        </w:rPr>
+        <w:t xml:space="preserve">Ojo: </w:t>
+      </w:r>
+      <w:r>
+        <w:t>la vista previa es más permisiva que el LIVE. En modo prueba, el subathon, la carrera, el marcador y el jefe cuentan los eventos aunque el reloj esté detenido, y nunca se conectan a TikTok. Que una prueba funcione confirma la lógica del widget, pero no la conexión de la fuente en OBS o LIVE Studio (cuenta, clave y versión cargada).</w:t>
+      </w:r>
+    </w:p>
+    <w:p>
+      <w:pPr>
         <w:pStyle w:val="Heading2"/>
       </w:pPr>
-      <w:bookmarkStart w:id="43" w:name="_Toc243168996"/>
+      <w:bookmarkStart w:id="43" w:name="_Toc243173275"/>
       <w:r>
         <w:t>8.9 Cambios en vivo en el panel (sincronizar.js)</w:t>
       </w:r>
@@ -28464,7 +28485,11 @@
         <w:t>sincronizar.subir(id)</w:t>
       </w:r>
       <w:r>
-        <w:t xml:space="preserve"> de inmediato, sin la espera de 0,6 s. La validación de la carrera y del marcador solo bloquea si no hay integrantes; la del repertorio, si no hay canciones; la de la tragamonedas, si un rodillo se queda sin textos; la de los demás nunca bloquea.</w:t>
+        <w:t xml:space="preserve"> de inmediato, sin la espera de 0,6 s. </w:t>
+      </w:r>
+      <w:r>
+        <w:lastRenderedPageBreak/>
+        <w:t>La validación de la carrera y del marcador solo bloquea si no hay integrantes; la del repertorio, si no hay canciones; la de la tragamonedas, si un rodillo se queda sin textos; la de los demás nunca bloquea.</w:t>
       </w:r>
     </w:p>
     <w:p>
@@ -28477,7 +28502,6 @@
         <w:spacing w:after="60"/>
       </w:pPr>
       <w:r>
-        <w:lastRenderedPageBreak/>
         <w:t>El identificador de un widget se crea la primera vez que se muestra su URL; los widgets que nunca se abrieron no crean filas en Supabase.</w:t>
       </w:r>
     </w:p>
@@ -28486,7 +28510,7 @@
         <w:pStyle w:val="Heading1"/>
         <w:pageBreakBefore/>
       </w:pPr>
-      <w:bookmarkStart w:id="44" w:name="_Toc243168997"/>
+      <w:bookmarkStart w:id="44" w:name="_Toc243173276"/>
       <w:r>
         <w:lastRenderedPageBreak/>
         <w:t>9. Flujos completos paso a paso</w:t>
@@ -28497,7 +28521,7 @@
       <w:pPr>
         <w:pStyle w:val="Heading2"/>
       </w:pPr>
-      <w:bookmarkStart w:id="45" w:name="_Toc243168998"/>
+      <w:bookmarkStart w:id="45" w:name="_Toc243173277"/>
       <w:r>
         <w:t>9.1 Configurar un widget y ponerlo en OBS</w:t>
       </w:r>
@@ -28680,7 +28704,7 @@
       <w:pPr>
         <w:pStyle w:val="Heading2"/>
       </w:pPr>
-      <w:bookmarkStart w:id="46" w:name="_Toc243168999"/>
+      <w:bookmarkStart w:id="46" w:name="_Toc243173278"/>
       <w:r>
         <w:t>9.2 Llega un regalo y gira la ruleta</w:t>
       </w:r>
@@ -28821,7 +28845,7 @@
       <w:pPr>
         <w:pStyle w:val="Heading2"/>
       </w:pPr>
-      <w:bookmarkStart w:id="47" w:name="_Toc243169000"/>
+      <w:bookmarkStart w:id="47" w:name="_Toc243173279"/>
       <w:r>
         <w:t>9.3 Probar sin estar en vivo</w:t>
       </w:r>
@@ -28916,7 +28940,7 @@
       <w:pPr>
         <w:pStyle w:val="Heading2"/>
       </w:pPr>
-      <w:bookmarkStart w:id="48" w:name="_Toc243169001"/>
+      <w:bookmarkStart w:id="48" w:name="_Toc243173280"/>
       <w:r>
         <w:lastRenderedPageBreak/>
         <w:t>9.4 Un regalo cambia de código</w:t>
@@ -29285,7 +29309,7 @@
       <w:pPr>
         <w:pStyle w:val="Heading2"/>
       </w:pPr>
-      <w:bookmarkStart w:id="49" w:name="_Toc243169002"/>
+      <w:bookmarkStart w:id="49" w:name="_Toc243173281"/>
       <w:r>
         <w:t>9.5 Cambiar la configuración durante el LIVE</w:t>
       </w:r>
@@ -29347,7 +29371,7 @@
       <w:pPr>
         <w:pStyle w:val="Heading2"/>
       </w:pPr>
-      <w:bookmarkStart w:id="50" w:name="_Toc243169003"/>
+      <w:bookmarkStart w:id="50" w:name="_Toc243173282"/>
       <w:r>
         <w:t>9.6 Una ronda de la carrera de regalos</w:t>
       </w:r>
@@ -29461,7 +29485,7 @@
         <w:pStyle w:val="Heading1"/>
         <w:pageBreakBefore/>
       </w:pPr>
-      <w:bookmarkStart w:id="51" w:name="_Toc243169004"/>
+      <w:bookmarkStart w:id="51" w:name="_Toc243173283"/>
       <w:r>
         <w:lastRenderedPageBreak/>
         <w:t>10. Diseño visual</w:t>
@@ -29472,7 +29496,7 @@
       <w:pPr>
         <w:pStyle w:val="Heading2"/>
       </w:pPr>
-      <w:bookmarkStart w:id="52" w:name="_Toc243169005"/>
+      <w:bookmarkStart w:id="52" w:name="_Toc243173284"/>
       <w:r>
         <w:t>10.1 Panel</w:t>
       </w:r>
@@ -30281,7 +30305,7 @@
       <w:pPr>
         <w:pStyle w:val="Heading2"/>
       </w:pPr>
-      <w:bookmarkStart w:id="53" w:name="_Toc243169006"/>
+      <w:bookmarkStart w:id="53" w:name="_Toc243173285"/>
       <w:r>
         <w:t>10.2 Widgets</w:t>
       </w:r>
@@ -30843,7 +30867,7 @@
         <w:pStyle w:val="Heading1"/>
         <w:pageBreakBefore/>
       </w:pPr>
-      <w:bookmarkStart w:id="54" w:name="_Toc243169007"/>
+      <w:bookmarkStart w:id="54" w:name="_Toc243173286"/>
       <w:r>
         <w:lastRenderedPageBreak/>
         <w:t>11. Seguridad y privacidad</w:t>
@@ -31361,7 +31385,7 @@
         <w:pStyle w:val="Heading1"/>
         <w:pageBreakBefore/>
       </w:pPr>
-      <w:bookmarkStart w:id="55" w:name="_Toc243169008"/>
+      <w:bookmarkStart w:id="55" w:name="_Toc243173287"/>
       <w:r>
         <w:lastRenderedPageBreak/>
         <w:t>12. Limitaciones actuales</w:t>
@@ -32977,7 +33001,7 @@
         <w:pStyle w:val="Heading1"/>
         <w:pageBreakBefore/>
       </w:pPr>
-      <w:bookmarkStart w:id="56" w:name="_Toc243169009"/>
+      <w:bookmarkStart w:id="56" w:name="_Toc243173288"/>
       <w:r>
         <w:lastRenderedPageBreak/>
         <w:t>13. Hacia una versión final montada en un servidor</w:t>
@@ -33006,7 +33030,7 @@
       <w:pPr>
         <w:pStyle w:val="Heading2"/>
       </w:pPr>
-      <w:bookmarkStart w:id="57" w:name="_Toc243169010"/>
+      <w:bookmarkStart w:id="57" w:name="_Toc243173289"/>
       <w:r>
         <w:t>13.1 Objetivos de la versión final</w:t>
       </w:r>
@@ -33168,7 +33192,7 @@
       <w:pPr>
         <w:pStyle w:val="Heading2"/>
       </w:pPr>
-      <w:bookmarkStart w:id="58" w:name="_Toc243169011"/>
+      <w:bookmarkStart w:id="58" w:name="_Toc243173290"/>
       <w:r>
         <w:t>13.2 Arquitectura propuesta</w:t>
       </w:r>
@@ -34001,7 +34025,7 @@
       <w:pPr>
         <w:pStyle w:val="Heading2"/>
       </w:pPr>
-      <w:bookmarkStart w:id="59" w:name="_Toc243169012"/>
+      <w:bookmarkStart w:id="59" w:name="_Toc243173291"/>
       <w:r>
         <w:t>13.3 Modelo de datos sugerido</w:t>
       </w:r>
@@ -34712,7 +34736,7 @@
       <w:pPr>
         <w:pStyle w:val="Heading2"/>
       </w:pPr>
-      <w:bookmarkStart w:id="60" w:name="_Toc243169013"/>
+      <w:bookmarkStart w:id="60" w:name="_Toc243173292"/>
       <w:r>
         <w:lastRenderedPageBreak/>
         <w:t>13.4 Seguridad en la versión final</w:t>
@@ -34951,7 +34975,7 @@
       <w:pPr>
         <w:pStyle w:val="Heading2"/>
       </w:pPr>
-      <w:bookmarkStart w:id="61" w:name="_Toc243169014"/>
+      <w:bookmarkStart w:id="61" w:name="_Toc243173293"/>
       <w:r>
         <w:t>13.5 Dónde alojarlo</w:t>
       </w:r>
@@ -35560,7 +35584,7 @@
       <w:pPr>
         <w:pStyle w:val="Heading2"/>
       </w:pPr>
-      <w:bookmarkStart w:id="62" w:name="_Toc243169015"/>
+      <w:bookmarkStart w:id="62" w:name="_Toc243173294"/>
       <w:r>
         <w:t>13.6 Qué se reutiliza y qué cambia del código actual</w:t>
       </w:r>
@@ -36372,7 +36396,7 @@
       <w:pPr>
         <w:pStyle w:val="Heading2"/>
       </w:pPr>
-      <w:bookmarkStart w:id="63" w:name="_Toc243169016"/>
+      <w:bookmarkStart w:id="63" w:name="_Toc243173295"/>
       <w:r>
         <w:lastRenderedPageBreak/>
         <w:t>13.7 Mejoras técnicas recomendadas</w:t>
@@ -36563,7 +36587,7 @@
       <w:pPr>
         <w:pStyle w:val="Heading2"/>
       </w:pPr>
-      <w:bookmarkStart w:id="64" w:name="_Toc243169017"/>
+      <w:bookmarkStart w:id="64" w:name="_Toc243173296"/>
       <w:r>
         <w:t>13.8 Nuevas funciones que habilita un servidor</w:t>
       </w:r>
@@ -36664,7 +36688,7 @@
       <w:pPr>
         <w:pStyle w:val="Heading2"/>
       </w:pPr>
-      <w:bookmarkStart w:id="65" w:name="_Toc243169018"/>
+      <w:bookmarkStart w:id="65" w:name="_Toc243173297"/>
       <w:r>
         <w:t>13.9 Hoja de ruta por fases</w:t>
       </w:r>
@@ -37148,7 +37172,7 @@
         <w:pStyle w:val="Heading1"/>
         <w:pageBreakBefore/>
       </w:pPr>
-      <w:bookmarkStart w:id="66" w:name="_Toc243169019"/>
+      <w:bookmarkStart w:id="66" w:name="_Toc243173298"/>
       <w:r>
         <w:lastRenderedPageBreak/>
         <w:t>14. Operación y mantenimiento actual</w:t>
@@ -37159,7 +37183,7 @@
       <w:pPr>
         <w:pStyle w:val="Heading2"/>
       </w:pPr>
-      <w:bookmarkStart w:id="67" w:name="_Toc243169020"/>
+      <w:bookmarkStart w:id="67" w:name="_Toc243173299"/>
       <w:r>
         <w:t>14.1 Publicar un cambio</w:t>
       </w:r>
@@ -37218,14 +37242,14 @@
         <w:spacing w:after="120"/>
       </w:pPr>
       <w:r>
-        <w:t>GitHub Actions publica en uno o dos minutos. Luego, en OBS: propiedades de la fuente → “Actualizar la caché de la página actual”.</w:t>
+        <w:t>GitHub Actions publica en uno o dos minutos. Una fuente abierta sigue con el código viejo hasta que se recarga: en OBS, propiedades de la fuente → “Actualizar la caché de la página actual”; en TikTok LIVE Studio, editar la fuente de enlace y volver a pegar la URL (o borrarla y crearla de nuevo).</w:t>
       </w:r>
     </w:p>
     <w:p>
       <w:pPr>
         <w:pStyle w:val="Heading2"/>
       </w:pPr>
-      <w:bookmarkStart w:id="68" w:name="_Toc243169021"/>
+      <w:bookmarkStart w:id="68" w:name="_Toc243173300"/>
       <w:r>
         <w:t>14.2 Agregar una función nueva</w:t>
       </w:r>
@@ -37286,7 +37310,7 @@
       <w:pPr>
         <w:pStyle w:val="Heading2"/>
       </w:pPr>
-      <w:bookmarkStart w:id="69" w:name="_Toc243169022"/>
+      <w:bookmarkStart w:id="69" w:name="_Toc243173301"/>
       <w:r>
         <w:t>14.3 Probar</w:t>
       </w:r>
@@ -37478,7 +37502,7 @@
       <w:pPr>
         <w:pStyle w:val="Heading2"/>
       </w:pPr>
-      <w:bookmarkStart w:id="70" w:name="_Toc243169023"/>
+      <w:bookmarkStart w:id="70" w:name="_Toc243173302"/>
       <w:r>
         <w:t>14.4 Solución de problemas</w:t>
       </w:r>
@@ -39034,7 +39058,7 @@
               <w:spacing w:after="20"/>
             </w:pPr>
             <w:r>
-              <w:t>El reloj no está iniciado en ese widget (bajo el reloj dice “Listo para empezar”): no se pulsó Iniciar o la URL de OBS se copió desde el panel de otro navegador</w:t>
+              <w:t>El reloj no está iniciado o terminó (bajo el reloj dice “Listo para empezar” o “Terminó”), o la fuente está conectada a otra cuenta (ver la fila siguiente). En la vista previa suma siempre, por eso ahí sí funciona</w:t>
             </w:r>
           </w:p>
         </w:tc>
@@ -39059,7 +39083,7 @@
               <w:spacing w:after="20"/>
             </w:pPr>
             <w:r>
-              <w:t>Pulsar Iniciar en el panel; si el widget no cambia, copiar de nuevo la URL desde el panel que se usa y pegarla en OBS</w:t>
+              <w:t>Pulsar Iniciar (o +5 min si llegó a 0). Si el reloj ya corre en OBS o LIVE Studio, revisar la conexión de la fuente con ?fondo=1</w:t>
             </w:r>
           </w:p>
         </w:tc>
@@ -39111,7 +39135,7 @@
               <w:spacing w:after="20"/>
             </w:pPr>
             <w:r>
-              <w:t>Versión antigua en la caché de OBS o del navegador</w:t>
+              <w:t>Panel o fuentes abiertos con código de antes de la corrección (las fuentes no se recargan solas)</w:t>
             </w:r>
           </w:p>
         </w:tc>
@@ -39136,7 +39160,162 @@
               <w:spacing w:after="20"/>
             </w:pPr>
             <w:r>
-              <w:t>Actualizar la caché de la fuente en OBS y recargar el panel; desde octubre de 2026 el cambio de usuario llega solo</w:t>
+              <w:t>Recargar el panel y las fuentes (en LIVE Studio, volver a pegar la URL); desde entonces el usuario llega solo</w:t>
+            </w:r>
+          </w:p>
+        </w:tc>
+      </w:tr>
+      <w:tr>
+        <w:tc>
+          <w:tcPr>
+            <w:tcW w:w="2808" w:type="dxa"/>
+            <w:tcBorders>
+              <w:top w:val="single" w:sz="4" w:space="0" w:color="BFBFBF"/>
+              <w:left w:val="single" w:sz="4" w:space="0" w:color="BFBFBF"/>
+              <w:bottom w:val="single" w:sz="4" w:space="0" w:color="BFBFBF"/>
+              <w:right w:val="single" w:sz="4" w:space="0" w:color="BFBFBF"/>
+            </w:tcBorders>
+            <w:tcMar>
+              <w:top w:w="60" w:type="dxa"/>
+              <w:left w:w="100" w:type="dxa"/>
+              <w:bottom w:w="60" w:type="dxa"/>
+              <w:right w:w="100" w:type="dxa"/>
+            </w:tcMar>
+          </w:tcPr>
+          <w:p>
+            <w:pPr>
+              <w:spacing w:after="20"/>
+            </w:pPr>
+            <w:r>
+              <w:lastRenderedPageBreak/>
+              <w:t>El reloj de un juego corre, pero los regalos y likes no suman</w:t>
+            </w:r>
+          </w:p>
+        </w:tc>
+        <w:tc>
+          <w:tcPr>
+            <w:tcW w:w="2995" w:type="dxa"/>
+            <w:tcBorders>
+              <w:top w:val="single" w:sz="4" w:space="0" w:color="BFBFBF"/>
+              <w:left w:val="single" w:sz="4" w:space="0" w:color="BFBFBF"/>
+              <w:bottom w:val="single" w:sz="4" w:space="0" w:color="BFBFBF"/>
+              <w:right w:val="single" w:sz="4" w:space="0" w:color="BFBFBF"/>
+            </w:tcBorders>
+            <w:tcMar>
+              <w:top w:w="60" w:type="dxa"/>
+              <w:left w:w="100" w:type="dxa"/>
+              <w:bottom w:w="60" w:type="dxa"/>
+              <w:right w:w="100" w:type="dxa"/>
+            </w:tcMar>
+          </w:tcPr>
+          <w:p>
+            <w:pPr>
+              <w:spacing w:after="20"/>
+            </w:pPr>
+            <w:r>
+              <w:t>La fuente está conectada a otra cuenta: su URL se copió con el usuario anterior y la fuente quedó abierta con código viejo. El reloj llega por Supabase y los eventos por Euler: por eso uno funciona y el otro no</w:t>
+            </w:r>
+          </w:p>
+        </w:tc>
+        <w:tc>
+          <w:tcPr>
+            <w:tcW w:w="3557" w:type="dxa"/>
+            <w:tcBorders>
+              <w:top w:val="single" w:sz="4" w:space="0" w:color="BFBFBF"/>
+              <w:left w:val="single" w:sz="4" w:space="0" w:color="BFBFBF"/>
+              <w:bottom w:val="single" w:sz="4" w:space="0" w:color="BFBFBF"/>
+              <w:right w:val="single" w:sz="4" w:space="0" w:color="BFBFBF"/>
+            </w:tcBorders>
+            <w:tcMar>
+              <w:top w:w="60" w:type="dxa"/>
+              <w:left w:w="100" w:type="dxa"/>
+              <w:bottom w:w="60" w:type="dxa"/>
+              <w:right w:w="100" w:type="dxa"/>
+            </w:tcMar>
+          </w:tcPr>
+          <w:p>
+            <w:pPr>
+              <w:spacing w:after="20"/>
+            </w:pPr>
+            <w:r>
+              <w:t>Copiar de nuevo la URL (Copy URL) y reemplazarla en la fuente</w:t>
+            </w:r>
+          </w:p>
+        </w:tc>
+      </w:tr>
+      <w:tr>
+        <w:tc>
+          <w:tcPr>
+            <w:tcW w:w="2808" w:type="dxa"/>
+            <w:tcBorders>
+              <w:top w:val="single" w:sz="4" w:space="0" w:color="BFBFBF"/>
+              <w:left w:val="single" w:sz="4" w:space="0" w:color="BFBFBF"/>
+              <w:bottom w:val="single" w:sz="4" w:space="0" w:color="BFBFBF"/>
+              <w:right w:val="single" w:sz="4" w:space="0" w:color="BFBFBF"/>
+            </w:tcBorders>
+            <w:tcMar>
+              <w:top w:w="60" w:type="dxa"/>
+              <w:left w:w="100" w:type="dxa"/>
+              <w:bottom w:w="60" w:type="dxa"/>
+              <w:right w:w="100" w:type="dxa"/>
+            </w:tcMar>
+          </w:tcPr>
+          <w:p>
+            <w:pPr>
+              <w:spacing w:after="20"/>
+            </w:pPr>
+            <w:r>
+              <w:t>Un widget no reacciona en el LIVE y no se sabe por qué</w:t>
+            </w:r>
+          </w:p>
+        </w:tc>
+        <w:tc>
+          <w:tcPr>
+            <w:tcW w:w="2995" w:type="dxa"/>
+            <w:tcBorders>
+              <w:top w:val="single" w:sz="4" w:space="0" w:color="BFBFBF"/>
+              <w:left w:val="single" w:sz="4" w:space="0" w:color="BFBFBF"/>
+              <w:bottom w:val="single" w:sz="4" w:space="0" w:color="BFBFBF"/>
+              <w:right w:val="single" w:sz="4" w:space="0" w:color="BFBFBF"/>
+            </w:tcBorders>
+            <w:tcMar>
+              <w:top w:w="60" w:type="dxa"/>
+              <w:left w:w="100" w:type="dxa"/>
+              <w:bottom w:w="60" w:type="dxa"/>
+              <w:right w:w="100" w:type="dxa"/>
+            </w:tcMar>
+          </w:tcPr>
+          <w:p>
+            <w:pPr>
+              <w:spacing w:after="20"/>
+            </w:pPr>
+            <w:r>
+              <w:t>Problema de conexión de esa fuente: cuenta, clave, límite de Euler o LIVE no iniciado</w:t>
+            </w:r>
+          </w:p>
+        </w:tc>
+        <w:tc>
+          <w:tcPr>
+            <w:tcW w:w="3557" w:type="dxa"/>
+            <w:tcBorders>
+              <w:top w:val="single" w:sz="4" w:space="0" w:color="BFBFBF"/>
+              <w:left w:val="single" w:sz="4" w:space="0" w:color="BFBFBF"/>
+              <w:bottom w:val="single" w:sz="4" w:space="0" w:color="BFBFBF"/>
+              <w:right w:val="single" w:sz="4" w:space="0" w:color="BFBFBF"/>
+            </w:tcBorders>
+            <w:tcMar>
+              <w:top w:w="60" w:type="dxa"/>
+              <w:left w:w="100" w:type="dxa"/>
+              <w:bottom w:w="60" w:type="dxa"/>
+              <w:right w:w="100" w:type="dxa"/>
+            </w:tcMar>
+          </w:tcPr>
+          <w:p>
+            <w:pPr>
+              <w:spacing w:after="20"/>
+            </w:pPr>
+            <w:r>
+              <w:t>Agregar ?fondo=1 antes del # de su URL: aparece la píldora con el estado (“Conectado al LIVE de @cuenta”, “no está en vivo”, “Demasiadas conexiones”, “clave no válida”). Quitarlo al terminar</w:t>
             </w:r>
           </w:p>
         </w:tc>
@@ -39146,13 +39325,100 @@
       <w:pPr>
         <w:spacing w:after="120"/>
       </w:pPr>
+      <w:r>
+        <w:rPr>
+          <w:b/>
+          <w:bCs/>
+        </w:rPr>
+        <w:t>Qué cuenta usa cada fuente de TikTok LIVE Studio:</w:t>
+      </w:r>
+      <w:r>
+        <w:t xml:space="preserve"> los registros de LIVE Studio (</w:t>
+      </w:r>
+      <w:r>
+        <w:rPr>
+          <w:rFonts w:ascii="Consolas" w:eastAsia="Consolas" w:hAnsi="Consolas" w:cs="Consolas"/>
+          <w:color w:val="7A1F33"/>
+          <w:sz w:val="19"/>
+          <w:szCs w:val="19"/>
+        </w:rPr>
+        <w:t>%APPDATA%\TikTok LIVE Studio\logs\LS-main.&lt;fecha&gt;*.log</w:t>
+      </w:r>
+      <w:r>
+        <w:t xml:space="preserve">) guardan la URL de cada fuente. En </w:t>
+      </w:r>
+      <w:r>
+        <w:rPr>
+          <w:rFonts w:ascii="Consolas" w:eastAsia="Consolas" w:hAnsi="Consolas" w:cs="Consolas"/>
+          <w:color w:val="7A1F33"/>
+          <w:sz w:val="19"/>
+          <w:szCs w:val="19"/>
+        </w:rPr>
+        <w:t>#c=</w:t>
+      </w:r>
+      <w:r>
+        <w:t xml:space="preserve"> va un JSON en base64 url-safe con </w:t>
+      </w:r>
+      <w:r>
+        <w:rPr>
+          <w:rFonts w:ascii="Consolas" w:eastAsia="Consolas" w:hAnsi="Consolas" w:cs="Consolas"/>
+          <w:color w:val="7A1F33"/>
+          <w:sz w:val="19"/>
+          <w:szCs w:val="19"/>
+        </w:rPr>
+        <w:t>u</w:t>
+      </w:r>
+      <w:r>
+        <w:t xml:space="preserve"> (cuenta), </w:t>
+      </w:r>
+      <w:r>
+        <w:rPr>
+          <w:rFonts w:ascii="Consolas" w:eastAsia="Consolas" w:hAnsi="Consolas" w:cs="Consolas"/>
+          <w:color w:val="7A1F33"/>
+          <w:sz w:val="19"/>
+          <w:szCs w:val="19"/>
+        </w:rPr>
+        <w:t>k</w:t>
+      </w:r>
+      <w:r>
+        <w:t xml:space="preserve"> (API key) y </w:t>
+      </w:r>
+      <w:r>
+        <w:rPr>
+          <w:rFonts w:ascii="Consolas" w:eastAsia="Consolas" w:hAnsi="Consolas" w:cs="Consolas"/>
+          <w:color w:val="7A1F33"/>
+          <w:sz w:val="19"/>
+          <w:szCs w:val="19"/>
+        </w:rPr>
+        <w:t>w</w:t>
+      </w:r>
+      <w:r>
+        <w:t xml:space="preserve"> (identificador). Así se encontró en octubre de 2026 un subathon que seguía conectado a la cuenta anterior. Al revisarlos, no se debe compartir ni mostrar </w:t>
+      </w:r>
+      <w:r>
+        <w:rPr>
+          <w:rFonts w:ascii="Consolas" w:eastAsia="Consolas" w:hAnsi="Consolas" w:cs="Consolas"/>
+          <w:color w:val="7A1F33"/>
+          <w:sz w:val="19"/>
+          <w:szCs w:val="19"/>
+        </w:rPr>
+        <w:t>k</w:t>
+      </w:r>
+      <w:r>
+        <w:t>.</w:t>
+      </w:r>
+    </w:p>
+    <w:p>
+      <w:pPr>
+        <w:spacing w:after="120"/>
+      </w:pPr>
     </w:p>
     <w:p>
       <w:pPr>
         <w:pStyle w:val="Heading1"/>
         <w:pageBreakBefore/>
       </w:pPr>
-      <w:bookmarkStart w:id="71" w:name="_Toc243169024"/>
+      <w:bookmarkStart w:id="71" w:name="_Toc243173303"/>
       <w:r>
         <w:lastRenderedPageBreak/>
         <w:t>15. Anexo: historial de decisiones y correcciones</w:t>
@@ -42665,6 +42931,87 @@
             </w:pPr>
             <w:r>
               <w:t>Cada like suma una fracción de segundo; sin juntarlas, los likes nunca mostraban su “+”</w:t>
+            </w:r>
+          </w:p>
+        </w:tc>
+      </w:tr>
+      <w:tr>
+        <w:tc>
+          <w:tcPr>
+            <w:tcW w:w="2246" w:type="dxa"/>
+            <w:tcBorders>
+              <w:top w:val="single" w:sz="4" w:space="0" w:color="BFBFBF"/>
+              <w:left w:val="single" w:sz="4" w:space="0" w:color="BFBFBF"/>
+              <w:bottom w:val="single" w:sz="4" w:space="0" w:color="BFBFBF"/>
+              <w:right w:val="single" w:sz="4" w:space="0" w:color="BFBFBF"/>
+            </w:tcBorders>
+            <w:tcMar>
+              <w:top w:w="60" w:type="dxa"/>
+              <w:left w:w="100" w:type="dxa"/>
+              <w:bottom w:w="60" w:type="dxa"/>
+              <w:right w:w="100" w:type="dxa"/>
+            </w:tcMar>
+          </w:tcPr>
+          <w:p>
+            <w:pPr>
+              <w:spacing w:after="20"/>
+            </w:pPr>
+            <w:r>
+              <w:t>Diagnóstico de fuentes</w:t>
+            </w:r>
+          </w:p>
+        </w:tc>
+        <w:tc>
+          <w:tcPr>
+            <w:tcW w:w="3744" w:type="dxa"/>
+            <w:tcBorders>
+              <w:top w:val="single" w:sz="4" w:space="0" w:color="BFBFBF"/>
+              <w:left w:val="single" w:sz="4" w:space="0" w:color="BFBFBF"/>
+              <w:bottom w:val="single" w:sz="4" w:space="0" w:color="BFBFBF"/>
+              <w:right w:val="single" w:sz="4" w:space="0" w:color="BFBFBF"/>
+            </w:tcBorders>
+            <w:tcMar>
+              <w:top w:w="60" w:type="dxa"/>
+              <w:left w:w="100" w:type="dxa"/>
+              <w:bottom w:w="60" w:type="dxa"/>
+              <w:right w:w="100" w:type="dxa"/>
+            </w:tcMar>
+          </w:tcPr>
+          <w:p>
+            <w:pPr>
+              <w:spacing w:after="20"/>
+            </w:pPr>
+            <w:r>
+              <w:t>Revisar la conexión con ?fondo=1 y las URLs en los registros de LIVE Studio</w:t>
+            </w:r>
+          </w:p>
+        </w:tc>
+        <w:tc>
+          <w:tcPr>
+            <w:tcW w:w="3370" w:type="dxa"/>
+            <w:tcBorders>
+              <w:top w:val="single" w:sz="4" w:space="0" w:color="BFBFBF"/>
+              <w:left w:val="single" w:sz="4" w:space="0" w:color="BFBFBF"/>
+              <w:bottom w:val="single" w:sz="4" w:space="0" w:color="BFBFBF"/>
+              <w:right w:val="single" w:sz="4" w:space="0" w:color="BFBFBF"/>
+            </w:tcBorders>
+            <w:tcMar>
+              <w:top w:w="60" w:type="dxa"/>
+              <w:left w:w="100" w:type="dxa"/>
+              <w:bottom w:w="60" w:type="dxa"/>
+              <w:right w:w="100" w:type="dxa"/>
+            </w:tcMar>
+          </w:tcPr>
+          <w:p>
+            <w:pPr>
+              <w:spacing w:after="20"/>
+            </w:pPr>
+            <w:r>
+              <w:t xml:space="preserve">El reloj de un subathon corría (Supabase) pero no sumaba: la </w:t>
+            </w:r>
+            <w:r>
+              <w:lastRenderedPageBreak/>
+              <w:t>fuente seguía conectada a la cuenta anterior (Euler)</w:t>
             </w:r>
           </w:p>
         </w:tc>

</xml_diff>